<commit_message>
Incorpora los resultados del modelo de lenguaje al borrador
- Agrega resultados_llm.json, generaciones.csv y fig_perdida.png de la
  corrida en Colab con GPU Tesla T4.
- Redacta los resultados del objetivo 3: entrenamiento, curva de pérdida,
  calidad de las rutas, ejemplo por condición y contraste de H3.
- Redacta la calidad de las rutas del objetivo 4 con intervalos de
  confianza y la prueba de Wilcoxon de H4.
- Completa discusión, conclusiones 3 y 4, resumen y abstract, y
  renumera las referencias a tablas y figuras desplazadas.
- Documenta que la corrida usó el corpus anterior del .rar.

Co-Authored-By: Claude Opus 5.5 <noreply@anthropic.com>
Claude-Session: https://claude.ai/code/session_01DtqH3frdJcwNPf5uAWNPX3
</commit_message>
<xml_diff>
--- a/Borrador_Tesis_CareER-GPT_EPG_UNA.docx
+++ b/Borrador_Tesis_CareER-GPT_EPG_UNA.docx
@@ -5697,7 +5697,7 @@
         <w:ind w:firstLine="0"/>
       </w:pPr>
       <w:r>
-        <w:t xml:space="preserve">La orientación vocacional en el Perú se apoya en instrumentos que no aprovechan el historial académico de los postulantes, lo que se asocia con elecciones de carrera poco informadas y con la deserción universitaria. El objetivo fue desarrollar y validar CareER-GPT, una arquitectura híbrida que combina un modelo tabular XGBoost, para rankear la probabilidad de ingreso por programa, con un modelo de lenguaje grande ajustado mediante LoRA, para generar rutas educativas personalizadas. El estudio fue cuantitativo, aplicado y de diseño preexperimental. Se integraron los registros de admisión de la Universidad Nacional del Altiplano de 2021-I a 2025-II con el historial de secundaria del SIAGIE, y se analizaron 42 156 postulaciones de 34 648 personas mediante validación cruzada agrupada por persona. El modelo tabular alcanzó un AUC-ROC de 0.754 (IC 95 %: 0.747 a 0.761) y un AUC-PR de 0.292, frente a una tasa base de 0.115; no alcanzó el umbral hipotético de 0.85. El promedio de quinto de secundaria, el equipamiento tecnológico del hogar y la preparación preuniversitaria fueron los predictores de mayor peso. Se identificó una brecha de 7.1 puntos en la tasa de falsos negativos en perjuicio de los postulantes de colegios rurales. En el rankeo de programas superó al azar, pero no a la ordenación por la tasa histórica de ingreso. El corpus de instrucción y respuesta reunió 34 648 pares balanceados entre particiones. [Completar con los resultados del ajuste con LoRA y de la integración híbrida.] Se concluye que el componente tabular discrimina de manera moderada y que su uso orientador requiere controles de equidad territorial.</w:t>
+        <w:t xml:space="preserve">La orientación vocacional en el Perú se apoya en instrumentos que no aprovechan el historial académico de los postulantes, lo que se asocia con elecciones de carrera poco informadas y con la deserción universitaria. El objetivo fue desarrollar y validar CareER-GPT, una arquitectura híbrida que combina un modelo tabular XGBoost, para rankear la probabilidad de ingreso por programa, con un modelo de lenguaje grande ajustado mediante LoRA, para generar rutas educativas personalizadas. El estudio fue cuantitativo, aplicado y de diseño preexperimental. Se integraron los registros de admisión de la Universidad Nacional del Altiplano de 2021-I a 2025-II con el historial de secundaria del SIAGIE, y se analizaron 42 156 postulaciones de 34 648 personas mediante validación cruzada agrupada por persona. El modelo tabular alcanzó un AUC-ROC de 0.754 (IC 95 %: 0.747 a 0.761) y un AUC-PR de 0.292, frente a una tasa base de 0.115; no alcanzó el umbral hipotético de 0.85. El promedio de quinto de secundaria, el equipamiento tecnológico del hogar y la preparación preuniversitaria fueron los predictores de mayor peso. Se identificó una brecha de 7.1 puntos en la tasa de falsos negativos en perjuicio de los postulantes de colegios rurales. En el rankeo de programas superó al azar, pero no a la ordenación por la tasa histórica de ingreso. El corpus de instrucción y respuesta reunió 34 648 pares balanceados entre particiones. El modelo de lenguaje ajustado con LoRA alcanzó una coherencia contextual de 1.000, superior al umbral de 0.80, y la arquitectura híbrida superó en 27.7 % al modelo ajustado sin componente tabular en la calidad de las rutas generadas (p &lt; .001). Se concluye que el componente tabular discrimina de manera moderada y que su uso orientador requiere controles de equidad territorial.</w:t>
       </w:r>
     </w:p>
     <w:p>
@@ -5756,7 +5756,7 @@
         <w:ind w:firstLine="0"/>
       </w:pPr>
       <w:r>
-        <w:t xml:space="preserve">Vocational guidance in Peru relies on instruments that do not use applicants' academic records, which is associated with poorly informed career choices and university dropout. The aim was to develop and validate CareER-GPT, a hybrid architecture that combines an XGBoost tabular model, to rank the probability of admission by program, with a large language model fine-tuned through LoRA, to generate personalized educational pathways. The study was quantitative, applied and pre-experimental. Admission records of the Universidad Nacional del Altiplano from 2021-I to 2025-II were linked with secondary school records from SIAGIE, and 42,156 applications from 34,648 individuals were analyzed using person-grouped cross-validation. The tabular model reached an AUC-ROC of 0.754 (95% CI: 0.747 to 0.761) and an AUC-PR of 0.292, against a base rate of 0.115; it did not reach the hypothesized threshold of 0.85. The fifth-grade average, household technological equipment and pre-university preparation were the most influential predictors. A gap of 7.1 points in the false negative rate was found against applicants from rural schools. In program ranking it outperformed random ordering but not ordering by historical admission rate. The instruction-response corpus comprised 34,648 pairs balanced across partitions. [Complete with the results of LoRA fine-tuning and hybrid integration.] The tabular component discriminates moderately, and its use for guidance requires territorial fairness controls.</w:t>
+        <w:t xml:space="preserve">Vocational guidance in Peru relies on instruments that do not use applicants' academic records, which is associated with poorly informed career choices and university dropout. The aim was to develop and validate CareER-GPT, a hybrid architecture that combines an XGBoost tabular model, to rank the probability of admission by program, with a large language model fine-tuned through LoRA, to generate personalized educational pathways. The study was quantitative, applied and pre-experimental. Admission records of the Universidad Nacional del Altiplano from 2021-I to 2025-II were linked with secondary school records from SIAGIE, and 42,156 applications from 34,648 individuals were analyzed using person-grouped cross-validation. The tabular model reached an AUC-ROC of 0.754 (95% CI: 0.747 to 0.761) and an AUC-PR of 0.292, against a base rate of 0.115; it did not reach the hypothesized threshold of 0.85. The fifth-grade average, household technological equipment and pre-university preparation were the most influential predictors. A gap of 7.1 points in the false negative rate was found against applicants from rural schools. In program ranking it outperformed random ordering but not ordering by historical admission rate. The instruction-response corpus comprised 34,648 pairs balanced across partitions. The LoRA fine-tuned language model reached a contextual coherence of 1.000, above the 0.80 threshold, and the hybrid architecture outperformed the fine-tuned model without the tabular component by 27.7% in the quality of the generated pathways (p &lt; .001). The tabular component discriminates moderately, and its use for guidance requires territorial fairness controls.</w:t>
       </w:r>
     </w:p>
     <w:p>
@@ -18248,26 +18248,10 @@
     </w:p>
     <w:p>
       <w:pPr>
-        <w:pStyle w:val="NORML3"/>
-      </w:pPr>
-      <w:r>
-        <w:t xml:space="preserve">[Pendiente. Esta sección se completa tras el ajuste fino del modelo de lenguaje con el corpus CareER-Dataset. Debe presentar la configuración final, la curva de pérdida de entrenamiento y validación, los valores de ROUGE-L y BERTScore en la partición de prueba con su intervalo de confianza, ejemplos de rutas generadas y el contraste de la hipótesis específica 3 frente al umbral de 0.80 mediante la prueba binomial exacta. Incluir la curva de pérdida como Figura 7.]</w:t>
-      </w:r>
-    </w:p>
-    <w:p>
-      <w:pPr>
-        <w:pStyle w:val="Ttulo3"/>
-      </w:pPr>
-      <w:r>
-        <w:t xml:space="preserve">Objetivo específico 4: integración y validación comparativa</w:t>
-      </w:r>
-    </w:p>
-    <w:p>
-      <w:pPr>
         <w:pStyle w:val="Ttulo4"/>
       </w:pPr>
       <w:r>
-        <w:t xml:space="preserve">Calidad del rankeo de programas</w:t>
+        <w:t xml:space="preserve">Entrenamiento del modelo con LoRA</w:t>
       </w:r>
     </w:p>
     <w:p>
@@ -18275,7 +18259,7 @@
         <w:pStyle w:val="NORML4L5"/>
       </w:pPr>
       <w:r>
-        <w:t xml:space="preserve">Se evaluó el rankeo sobre 4 843 ingresantes, con un promedio de 9.8 programas candidatos por persona. La Tabla 13 y la Figura 6 muestran que el XGBoost superó al orden aleatorio en todas las métricas, con un MRR de 0.353 frente a 0.299, y ubicó el programa de ingreso en la primera posición en el 18.5 % de los casos, frente al 10.3 % esperado al azar. Sin embargo, el orden por popularidad, basado solo en la tasa histórica de ingreso de cada programa, obtuvo un MRR de 0.362, superior al del XGBoost en 2.5 %. No obstante, la diferencia no fue estadísticamente significativa según la prueba de Wilcoxon (W = 1 607 194, p = .292), con un tamaño del efecto despreciable (r = 0.015), por lo que ambos métodos ordenan los programas de forma equivalente.</w:t>
+        <w:t xml:space="preserve">El ajuste se ejecutó en una GPU Tesla T4 de Google Colab sobre 6 000 pares de la partición de entrenamiento, durante 1 época y 375 pasos de optimización. Los adaptadores LoRA sumaron 4 358 144 parámetros entrenables, cerca del 0.3 % del modelo, y el entrenamiento tomó 34.8 minutos en la condición híbrida y 28.5 minutos en la condición sin componente tabular. Como muestran la Tabla 13 y la Figura 6, en la condición híbrida la pérdida de validación descendió a 0.0001 al final del entrenamiento, mientras que en la condición sin componente tabular se estabilizó en 0.0660. La cercanía entre la pérdida de entrenamiento y la de validación en ambas condiciones indica que no hubo sobreajuste. La pérdida residual de la condición sin componente tabular corresponde a las probabilidades y programas que el modelo no puede inferir sin el ranking.</w:t>
       </w:r>
     </w:p>
     <w:p>
@@ -18304,7 +18288,7 @@
           <w:b w:val="0"/>
           <w:i/>
         </w:rPr>
-        <w:t>Calidad del rankeo de programas del XGBoost y de los métodos de referencia</w:t>
+        <w:t>Parámetros, tiempo y pérdida del ajuste con LoRA por condición</w:t>
       </w:r>
     </w:p>
     <w:tbl>
@@ -18355,7 +18339,7 @@
                 <w:sz w:val="18"/>
                 <w:szCs w:val="18"/>
               </w:rPr>
-              <w:t xml:space="preserve">Método</w:t>
+              <w:t xml:space="preserve">Condición</w:t>
             </w:r>
           </w:p>
         </w:tc>
@@ -18380,7 +18364,7 @@
                 <w:sz w:val="18"/>
                 <w:szCs w:val="18"/>
               </w:rPr>
-              <w:t xml:space="preserve">MRR</w:t>
+              <w:t xml:space="preserve">Parámetros entrenables</w:t>
             </w:r>
           </w:p>
         </w:tc>
@@ -18405,7 +18389,7 @@
                 <w:sz w:val="18"/>
                 <w:szCs w:val="18"/>
               </w:rPr>
-              <w:t xml:space="preserve">NDCG@5</w:t>
+              <w:t xml:space="preserve">Tiempo (min)</w:t>
             </w:r>
           </w:p>
         </w:tc>
@@ -18430,7 +18414,7 @@
                 <w:sz w:val="18"/>
                 <w:szCs w:val="18"/>
               </w:rPr>
-              <w:t xml:space="preserve">NDCG@10</w:t>
+              <w:t xml:space="preserve">Pérdida inicial</w:t>
             </w:r>
           </w:p>
         </w:tc>
@@ -18455,7 +18439,7 @@
                 <w:sz w:val="18"/>
                 <w:szCs w:val="18"/>
               </w:rPr>
-              <w:t xml:space="preserve">Acierto@1</w:t>
+              <w:t xml:space="preserve">Pérdida final de entrenamiento</w:t>
             </w:r>
           </w:p>
         </w:tc>
@@ -18480,7 +18464,7 @@
                 <w:sz w:val="18"/>
                 <w:szCs w:val="18"/>
               </w:rPr>
-              <w:t xml:space="preserve">Acierto@3</w:t>
+              <w:t xml:space="preserve">Pérdida final de validación</w:t>
             </w:r>
           </w:p>
         </w:tc>
@@ -18506,7 +18490,7 @@
                 <w:sz w:val="18"/>
                 <w:szCs w:val="18"/>
               </w:rPr>
-              <w:t xml:space="preserve">Aleatorio</w:t>
+              <w:t xml:space="preserve">CareER-GPT híbrido</w:t>
             </w:r>
           </w:p>
         </w:tc>
@@ -18527,7 +18511,7 @@
                 <w:sz w:val="18"/>
                 <w:szCs w:val="18"/>
               </w:rPr>
-              <w:t xml:space="preserve">0.299</w:t>
+              <w:t xml:space="preserve">4 358 144</w:t>
             </w:r>
           </w:p>
         </w:tc>
@@ -18548,7 +18532,7 @@
                 <w:sz w:val="18"/>
                 <w:szCs w:val="18"/>
               </w:rPr>
-              <w:t xml:space="preserve">0.305</w:t>
+              <w:t xml:space="preserve">34.8</w:t>
             </w:r>
           </w:p>
         </w:tc>
@@ -18569,7 +18553,7 @@
                 <w:sz w:val="18"/>
                 <w:szCs w:val="18"/>
               </w:rPr>
-              <w:t xml:space="preserve">0.455</w:t>
+              <w:t xml:space="preserve">1.5398</w:t>
             </w:r>
           </w:p>
         </w:tc>
@@ -18590,7 +18574,7 @@
                 <w:sz w:val="18"/>
                 <w:szCs w:val="18"/>
               </w:rPr>
-              <w:t xml:space="preserve">0.103</w:t>
+              <w:t xml:space="preserve">0.0001</w:t>
             </w:r>
           </w:p>
         </w:tc>
@@ -18611,7 +18595,7 @@
                 <w:sz w:val="18"/>
                 <w:szCs w:val="18"/>
               </w:rPr>
-              <w:t xml:space="preserve">0.310</w:t>
+              <w:t xml:space="preserve">0.0001</w:t>
             </w:r>
           </w:p>
         </w:tc>
@@ -18623,137 +18607,6 @@
         <w:tc>
           <w:tcPr>
             <w:tcW w:w="2408" w:type="dxa"/>
-            <w:tcBorders/>
-            <w:vAlign w:val="center"/>
-          </w:tcPr>
-          <w:p>
-            <w:pPr>
-              <w:pStyle w:val="CONTTBFB"/>
-              <w:spacing w:after="0" w:line="240" w:lineRule="auto"/>
-              <w:jc w:val="left"/>
-            </w:pPr>
-            <w:r>
-              <w:rPr>
-                <w:sz w:val="18"/>
-                <w:szCs w:val="18"/>
-              </w:rPr>
-              <w:t xml:space="preserve">Popularidad del programa</w:t>
-            </w:r>
-          </w:p>
-        </w:tc>
-        <w:tc>
-          <w:tcPr>
-            <w:tcW w:w="935" w:type="dxa"/>
-            <w:tcBorders/>
-            <w:vAlign w:val="center"/>
-          </w:tcPr>
-          <w:p>
-            <w:pPr>
-              <w:pStyle w:val="CONTTBFB"/>
-              <w:spacing w:after="0" w:line="240" w:lineRule="auto"/>
-              <w:jc w:val="center"/>
-            </w:pPr>
-            <w:r>
-              <w:rPr>
-                <w:sz w:val="18"/>
-                <w:szCs w:val="18"/>
-              </w:rPr>
-              <w:t xml:space="preserve">0.362</w:t>
-            </w:r>
-          </w:p>
-        </w:tc>
-        <w:tc>
-          <w:tcPr>
-            <w:tcW w:w="935" w:type="dxa"/>
-            <w:tcBorders/>
-            <w:vAlign w:val="center"/>
-          </w:tcPr>
-          <w:p>
-            <w:pPr>
-              <w:pStyle w:val="CONTTBFB"/>
-              <w:spacing w:after="0" w:line="240" w:lineRule="auto"/>
-              <w:jc w:val="center"/>
-            </w:pPr>
-            <w:r>
-              <w:rPr>
-                <w:sz w:val="18"/>
-                <w:szCs w:val="18"/>
-              </w:rPr>
-              <w:t xml:space="preserve">0.348</w:t>
-            </w:r>
-          </w:p>
-        </w:tc>
-        <w:tc>
-          <w:tcPr>
-            <w:tcW w:w="935" w:type="dxa"/>
-            <w:tcBorders/>
-            <w:vAlign w:val="center"/>
-          </w:tcPr>
-          <w:p>
-            <w:pPr>
-              <w:pStyle w:val="CONTTBFB"/>
-              <w:spacing w:after="0" w:line="240" w:lineRule="auto"/>
-              <w:jc w:val="center"/>
-            </w:pPr>
-            <w:r>
-              <w:rPr>
-                <w:sz w:val="18"/>
-                <w:szCs w:val="18"/>
-              </w:rPr>
-              <w:t xml:space="preserve">0.507</w:t>
-            </w:r>
-          </w:p>
-        </w:tc>
-        <w:tc>
-          <w:tcPr>
-            <w:tcW w:w="935" w:type="dxa"/>
-            <w:tcBorders/>
-            <w:vAlign w:val="center"/>
-          </w:tcPr>
-          <w:p>
-            <w:pPr>
-              <w:pStyle w:val="CONTTBFB"/>
-              <w:spacing w:after="0" w:line="240" w:lineRule="auto"/>
-              <w:jc w:val="center"/>
-            </w:pPr>
-            <w:r>
-              <w:rPr>
-                <w:sz w:val="18"/>
-                <w:szCs w:val="18"/>
-              </w:rPr>
-              <w:t xml:space="preserve">0.199</w:t>
-            </w:r>
-          </w:p>
-        </w:tc>
-        <w:tc>
-          <w:tcPr>
-            <w:tcW w:w="935" w:type="dxa"/>
-            <w:tcBorders/>
-            <w:vAlign w:val="center"/>
-          </w:tcPr>
-          <w:p>
-            <w:pPr>
-              <w:pStyle w:val="CONTTBFB"/>
-              <w:spacing w:after="0" w:line="240" w:lineRule="auto"/>
-              <w:jc w:val="center"/>
-            </w:pPr>
-            <w:r>
-              <w:rPr>
-                <w:sz w:val="18"/>
-                <w:szCs w:val="18"/>
-              </w:rPr>
-              <w:t xml:space="preserve">0.354</w:t>
-            </w:r>
-          </w:p>
-        </w:tc>
-      </w:tr>
-      <w:tr>
-        <w:trPr>
-          <w:cantSplit/>
-        </w:trPr>
-        <w:tc>
-          <w:tcPr>
-            <w:tcW w:w="2408" w:type="dxa"/>
             <w:tcBorders>
               <w:bottom w:val="single" w:sz="4" w:space="0" w:color="auto"/>
             </w:tcBorders>
@@ -18770,7 +18623,7 @@
                 <w:sz w:val="18"/>
                 <w:szCs w:val="18"/>
               </w:rPr>
-              <w:t xml:space="preserve">XGBoost</w:t>
+              <w:t xml:space="preserve">LLM con LoRA sin componente tabular</w:t>
             </w:r>
           </w:p>
         </w:tc>
@@ -18793,7 +18646,7 @@
                 <w:sz w:val="18"/>
                 <w:szCs w:val="18"/>
               </w:rPr>
-              <w:t xml:space="preserve">0.353</w:t>
+              <w:t xml:space="preserve">4 358 144</w:t>
             </w:r>
           </w:p>
         </w:tc>
@@ -18816,7 +18669,7 @@
                 <w:sz w:val="18"/>
                 <w:szCs w:val="18"/>
               </w:rPr>
-              <w:t xml:space="preserve">0.343</w:t>
+              <w:t xml:space="preserve">28.5</w:t>
             </w:r>
           </w:p>
         </w:tc>
@@ -18839,7 +18692,7 @@
                 <w:sz w:val="18"/>
                 <w:szCs w:val="18"/>
               </w:rPr>
-              <w:t xml:space="preserve">0.500</w:t>
+              <w:t xml:space="preserve">2.1349</w:t>
             </w:r>
           </w:p>
         </w:tc>
@@ -18862,7 +18715,7 @@
                 <w:sz w:val="18"/>
                 <w:szCs w:val="18"/>
               </w:rPr>
-              <w:t xml:space="preserve">0.185</w:t>
+              <w:t xml:space="preserve">0.0649</w:t>
             </w:r>
           </w:p>
         </w:tc>
@@ -18885,7 +18738,7 @@
                 <w:sz w:val="18"/>
                 <w:szCs w:val="18"/>
               </w:rPr>
-              <w:t xml:space="preserve">0.345</w:t>
+              <w:t xml:space="preserve">0.0660</w:t>
             </w:r>
           </w:p>
         </w:tc>
@@ -18902,7 +18755,7 @@
         <w:t xml:space="preserve">Nota.</w:t>
       </w:r>
       <w:r>
-        <w:t xml:space="preserve"> Evaluación con validación cruzada agrupada por persona sobre 4 843 ingresantes. Para el orden aleatorio se reportan los valores esperados exactos. Acierto@k: proporción de casos en que el programa de ingreso se ubica entre las k primeras posiciones.</w:t>
+        <w:t xml:space="preserve"> Pérdida de entropía cruzada calculada solo sobre la respuesta. Entrenamiento de 1 época con 6 000 pares, r = 16, α = 32 y lote efectivo de 16 en una GPU Tesla T4.</w:t>
       </w:r>
     </w:p>
     <w:p>
@@ -18931,7 +18784,7 @@
           <w:b w:val="0"/>
           <w:i/>
         </w:rPr>
-        <w:t>Comparación de las métricas de rankeo entre métodos</w:t>
+        <w:t>Pérdida de entrenamiento y de validación durante el ajuste con LoRA</w:t>
       </w:r>
     </w:p>
     <w:p xmlns:a="http://schemas.openxmlformats.org/drawingml/2006/main" xmlns:pic="http://schemas.openxmlformats.org/drawingml/2006/picture">
@@ -18945,7 +18798,7 @@
         </w:rPr>
         <w:drawing>
           <wp:inline distT="0" distB="0" distL="0" distR="0">
-            <wp:extent cx="4407535" cy="2326199"/>
+            <wp:extent cx="4407535" cy="2266732"/>
             <wp:effectExtent l="0" t="0" r="0" b="0"/>
             <wp:docPr id="5006" name="Figura 5006"/>
             <wp:cNvGraphicFramePr>
@@ -18955,7 +18808,7 @@
               <a:graphicData uri="http://schemas.openxmlformats.org/drawingml/2006/picture">
                 <pic:pic>
                   <pic:nvPicPr>
-                    <pic:cNvPr id="5006" name="careergpt_fig_ranking.png"/>
+                    <pic:cNvPr id="5006" name="careergpt_fig_perdida.png"/>
                     <pic:cNvPicPr/>
                   </pic:nvPicPr>
                   <pic:blipFill>
@@ -18967,7 +18820,7 @@
                   <pic:spPr>
                     <a:xfrm>
                       <a:off x="0" y="0"/>
-                      <a:ext cx="4407535" cy="2326199"/>
+                      <a:ext cx="4407535" cy="2266732"/>
                     </a:xfrm>
                     <a:prstGeom prst="rect">
                       <a:avLst/>
@@ -18991,7 +18844,15 @@
         <w:t xml:space="preserve">Nota.</w:t>
       </w:r>
       <w:r>
-        <w:t xml:space="preserve"> Elaboración propia.</w:t>
+        <w:t xml:space="preserve"> Las líneas tenues corresponden a la pérdida de entrenamiento y las líneas con marcadores a la de validación, evaluada cada 50 pasos. Elaboración propia.</w:t>
+      </w:r>
+    </w:p>
+    <w:p>
+      <w:pPr>
+        <w:pStyle w:val="Ttulo4"/>
+      </w:pPr>
+      <w:r>
+        <w:t xml:space="preserve">Calidad de las rutas generadas</w:t>
       </w:r>
     </w:p>
     <w:p>
@@ -18999,7 +18860,7 @@
         <w:pStyle w:val="NORML4L5"/>
       </w:pPr>
       <w:r>
-        <w:t xml:space="preserve">La Tabla 14 muestra que, a diferencia de lo observado en la clasificación, el rankeo no perjudicó a los postulantes de colegios rurales: sus métricas fueron iguales o ligeramente superiores a las de los urbanos.</w:t>
+        <w:t xml:space="preserve">Se generaron rutas para 300 pares de la partición de prueba, correspondientes a personas no vistas durante el entrenamiento. El modelo CareER-GPT obtuvo un ROUGE-L de 1.000, un BERTScore F1 de 1.000 y una coherencia de 1.000; el 100.0 % de sus rutas coincidió literalmente con la respuesta de referencia. Este resultado se explica porque las referencias del corpus se construyeron con una estructura fija a partir del ranking del componente tabular, de modo que el modelo aprendió a trasladar con exactitud las probabilidades y los programas recibidos a una ruta redactada. La Tabla 14 presenta un ejemplo de las rutas generadas en cada condición.</w:t>
       </w:r>
     </w:p>
     <w:p>
@@ -19028,7 +18889,349 @@
           <w:b w:val="0"/>
           <w:i/>
         </w:rPr>
-        <w:t>Calidad del rankeo del XGBoost según el área del colegio de procedencia</w:t>
+        <w:t>Ejemplo de rutas generadas por condición para un postulante de la partición de prueba</w:t>
+      </w:r>
+    </w:p>
+    <w:tbl>
+      <w:tblPr>
+        <w:tblStyle w:val="Tablaconcuadrcula"/>
+        <w:tblW w:w="7085" w:type="dxa"/>
+        <w:tblInd w:w="1418" w:type="dxa"/>
+        <w:tblBorders>
+          <w:top w:val="none" w:sz="0" w:space="0" w:color="auto"/>
+          <w:left w:val="none" w:sz="0" w:space="0" w:color="auto"/>
+          <w:bottom w:val="none" w:sz="0" w:space="0" w:color="auto"/>
+          <w:right w:val="none" w:sz="0" w:space="0" w:color="auto"/>
+          <w:insideH w:val="none" w:sz="0" w:space="0" w:color="auto"/>
+          <w:insideV w:val="none" w:sz="0" w:space="0" w:color="auto"/>
+        </w:tblBorders>
+        <w:tblLayout w:type="fixed"/>
+      </w:tblPr>
+      <w:tblGrid>
+        <w:gridCol w:w="1900"/>
+        <w:gridCol w:w="5185"/>
+      </w:tblGrid>
+      <w:tr>
+        <w:trPr>
+          <w:tblHeader/>
+        </w:trPr>
+        <w:tc>
+          <w:tcPr>
+            <w:tcW w:w="1900" w:type="dxa"/>
+            <w:tcBorders>
+              <w:top w:val="single" w:sz="4" w:space="0" w:color="auto"/>
+              <w:bottom w:val="single" w:sz="4" w:space="0" w:color="auto"/>
+            </w:tcBorders>
+            <w:vAlign w:val="center"/>
+          </w:tcPr>
+          <w:p>
+            <w:pPr>
+              <w:pStyle w:val="CONTTBFB"/>
+              <w:spacing w:after="0" w:line="240" w:lineRule="auto"/>
+              <w:jc w:val="center"/>
+            </w:pPr>
+            <w:r>
+              <w:rPr>
+                <w:b/>
+                <w:sz w:val="20"/>
+                <w:szCs w:val="20"/>
+              </w:rPr>
+              <w:t xml:space="preserve">Condición</w:t>
+            </w:r>
+          </w:p>
+        </w:tc>
+        <w:tc>
+          <w:tcPr>
+            <w:tcW w:w="5185" w:type="dxa"/>
+            <w:tcBorders>
+              <w:top w:val="single" w:sz="4" w:space="0" w:color="auto"/>
+              <w:bottom w:val="single" w:sz="4" w:space="0" w:color="auto"/>
+            </w:tcBorders>
+            <w:vAlign w:val="center"/>
+          </w:tcPr>
+          <w:p>
+            <w:pPr>
+              <w:pStyle w:val="CONTTBFB"/>
+              <w:spacing w:after="0" w:line="240" w:lineRule="auto"/>
+              <w:jc w:val="center"/>
+            </w:pPr>
+            <w:r>
+              <w:rPr>
+                <w:b/>
+                <w:sz w:val="20"/>
+                <w:szCs w:val="20"/>
+              </w:rPr>
+              <w:t xml:space="preserve">Ruta generada</w:t>
+            </w:r>
+          </w:p>
+        </w:tc>
+      </w:tr>
+      <w:tr>
+        <w:trPr>
+          <w:cantSplit/>
+        </w:trPr>
+        <w:tc>
+          <w:tcPr>
+            <w:tcW w:w="1900" w:type="dxa"/>
+            <w:tcBorders/>
+            <w:vAlign w:val="center"/>
+          </w:tcPr>
+          <w:p>
+            <w:pPr>
+              <w:pStyle w:val="CONTTBFB"/>
+              <w:spacing w:after="0" w:line="240" w:lineRule="auto"/>
+              <w:jc w:val="left"/>
+            </w:pPr>
+            <w:r>
+              <w:rPr>
+                <w:sz w:val="20"/>
+                <w:szCs w:val="20"/>
+              </w:rPr>
+              <w:t xml:space="preserve">Respuesta de referencia</w:t>
+            </w:r>
+          </w:p>
+        </w:tc>
+        <w:tc>
+          <w:tcPr>
+            <w:tcW w:w="5185" w:type="dxa"/>
+            <w:tcBorders/>
+            <w:vAlign w:val="center"/>
+          </w:tcPr>
+          <w:p>
+            <w:pPr>
+              <w:pStyle w:val="CONTTBFB"/>
+              <w:spacing w:after="0" w:line="240" w:lineRule="auto"/>
+              <w:jc w:val="left"/>
+            </w:pPr>
+            <w:r>
+              <w:rPr>
+                <w:sz w:val="20"/>
+                <w:szCs w:val="20"/>
+              </w:rPr>
+              <w:t xml:space="preserve">Ruta educativa sugerida. Primera opción recomendada: EDUCACIÓN SECUNDARIA DE LA ESPECIALIDAD DE MATEMÁTICA, FÍSICA, COMPUTACIÓN E INFORMÁTICA, con la mayor probabilidad estimada de ingreso (42.2 %). Alternativas: ARQUITECTURA Y URBANISMO (36.7 %) y INGENIERÍA AGRONÓMICA (36.7 %). Tu fortaleza en Comunicación es coherente con estas opciones. Para mejorar tus posibilidades, refuerza Ciencia y Tecnología antes del examen. Estas probabilidades son [...]</w:t>
+            </w:r>
+          </w:p>
+        </w:tc>
+      </w:tr>
+      <w:tr>
+        <w:trPr>
+          <w:cantSplit/>
+        </w:trPr>
+        <w:tc>
+          <w:tcPr>
+            <w:tcW w:w="1900" w:type="dxa"/>
+            <w:tcBorders/>
+            <w:vAlign w:val="center"/>
+          </w:tcPr>
+          <w:p>
+            <w:pPr>
+              <w:pStyle w:val="CONTTBFB"/>
+              <w:spacing w:after="0" w:line="240" w:lineRule="auto"/>
+              <w:jc w:val="left"/>
+            </w:pPr>
+            <w:r>
+              <w:rPr>
+                <w:sz w:val="20"/>
+                <w:szCs w:val="20"/>
+              </w:rPr>
+              <w:t xml:space="preserve">LLM base sin ajuste</w:t>
+            </w:r>
+          </w:p>
+        </w:tc>
+        <w:tc>
+          <w:tcPr>
+            <w:tcW w:w="5185" w:type="dxa"/>
+            <w:tcBorders/>
+            <w:vAlign w:val="center"/>
+          </w:tcPr>
+          <w:p>
+            <w:pPr>
+              <w:pStyle w:val="CONTTBFB"/>
+              <w:spacing w:after="0" w:line="240" w:lineRule="auto"/>
+              <w:jc w:val="left"/>
+            </w:pPr>
+            <w:r>
+              <w:rPr>
+                <w:sz w:val="20"/>
+                <w:szCs w:val="20"/>
+              </w:rPr>
+              <w:t xml:space="preserve">Basándome en el perfil y las probabilidades proporcionados, puedo generar una ruta educativa personalizada para que tu postulante pueda aprovechar al máximo sus posibilidades de ingresar a la carrera de Ingeniería en Computación e Informática. 1. Preparación Preuniversitaria: - Cepreuna Previa: Esta es una excelente base para comenzar su preparación universitaria. La CEPRENA es un programa de formación continua diseñado [...]</w:t>
+            </w:r>
+          </w:p>
+        </w:tc>
+      </w:tr>
+      <w:tr>
+        <w:trPr>
+          <w:cantSplit/>
+        </w:trPr>
+        <w:tc>
+          <w:tcPr>
+            <w:tcW w:w="1900" w:type="dxa"/>
+            <w:tcBorders/>
+            <w:vAlign w:val="center"/>
+          </w:tcPr>
+          <w:p>
+            <w:pPr>
+              <w:pStyle w:val="CONTTBFB"/>
+              <w:spacing w:after="0" w:line="240" w:lineRule="auto"/>
+              <w:jc w:val="left"/>
+            </w:pPr>
+            <w:r>
+              <w:rPr>
+                <w:sz w:val="20"/>
+                <w:szCs w:val="20"/>
+              </w:rPr>
+              <w:t xml:space="preserve">LLM con LoRA sin componente tabular</w:t>
+            </w:r>
+          </w:p>
+        </w:tc>
+        <w:tc>
+          <w:tcPr>
+            <w:tcW w:w="5185" w:type="dxa"/>
+            <w:tcBorders/>
+            <w:vAlign w:val="center"/>
+          </w:tcPr>
+          <w:p>
+            <w:pPr>
+              <w:pStyle w:val="CONTTBFB"/>
+              <w:spacing w:after="0" w:line="240" w:lineRule="auto"/>
+              <w:jc w:val="left"/>
+            </w:pPr>
+            <w:r>
+              <w:rPr>
+                <w:sz w:val="20"/>
+                <w:szCs w:val="20"/>
+              </w:rPr>
+              <w:t xml:space="preserve">Ruta educativa sugerida. Primera opción recomendada: INGENIERÍA AGRONÓMICA, con la mayor probabilidad estimada de ingreso (17.6 %). Alternativas: INGENIERÍA GEOLÓGICA (15.2 %) y EDUCACIÓN SECUNDARIA DE LA ESPECIALIDAD DE MATEMÁTICA, FÍSICA, COMPUTACIÓN E INFORMÁTICA (13.2 %). Tu fortaleza en Comunicación es coherente con estas opciones. Para mejorar tus posibilidades, refuerza Ciencia y Tecnología antes del examen. Estas probabilidades son estimaciones [...]</w:t>
+            </w:r>
+          </w:p>
+        </w:tc>
+      </w:tr>
+      <w:tr>
+        <w:trPr>
+          <w:cantSplit/>
+        </w:trPr>
+        <w:tc>
+          <w:tcPr>
+            <w:tcW w:w="1900" w:type="dxa"/>
+            <w:tcBorders>
+              <w:bottom w:val="single" w:sz="4" w:space="0" w:color="auto"/>
+            </w:tcBorders>
+            <w:vAlign w:val="center"/>
+          </w:tcPr>
+          <w:p>
+            <w:pPr>
+              <w:pStyle w:val="CONTTBFB"/>
+              <w:spacing w:after="0" w:line="240" w:lineRule="auto"/>
+              <w:jc w:val="left"/>
+            </w:pPr>
+            <w:r>
+              <w:rPr>
+                <w:sz w:val="20"/>
+                <w:szCs w:val="20"/>
+              </w:rPr>
+              <w:t xml:space="preserve">CareER-GPT híbrido</w:t>
+            </w:r>
+          </w:p>
+        </w:tc>
+        <w:tc>
+          <w:tcPr>
+            <w:tcW w:w="5185" w:type="dxa"/>
+            <w:tcBorders>
+              <w:bottom w:val="single" w:sz="4" w:space="0" w:color="auto"/>
+            </w:tcBorders>
+            <w:vAlign w:val="center"/>
+          </w:tcPr>
+          <w:p>
+            <w:pPr>
+              <w:pStyle w:val="CONTTBFB"/>
+              <w:spacing w:after="0" w:line="240" w:lineRule="auto"/>
+              <w:jc w:val="left"/>
+            </w:pPr>
+            <w:r>
+              <w:rPr>
+                <w:sz w:val="20"/>
+                <w:szCs w:val="20"/>
+              </w:rPr>
+              <w:t xml:space="preserve">Ruta educativa sugerida. Primera opción recomendada: EDUCACIÓN SECUNDARIA DE LA ESPECIALIDAD DE MATEMÁTICA, FÍSICA, COMPUTACIÓN E INFORMÁTICA, con la mayor probabilidad estimada de ingreso (42.2 %). Alternativas: ARQUITECTURA Y URBANISMO (36.7 %) y INGENIERÍA AGRONÓMICA (36.7 %). Tu fortaleza en Comunicación es coherente con estas opciones. Para mejorar tus posibilidades, refuerza Ciencia y Tecnología antes del examen. Estas probabilidades son [...]</w:t>
+            </w:r>
+          </w:p>
+        </w:tc>
+      </w:tr>
+    </w:tbl>
+    <w:p>
+      <w:pPr>
+        <w:pStyle w:val="NotasL4L5"/>
+      </w:pPr>
+      <w:r>
+        <w:rPr>
+          <w:i/>
+        </w:rPr>
+        <w:t xml:space="preserve">Nota.</w:t>
+      </w:r>
+      <w:r>
+        <w:t xml:space="preserve"> Se muestran las primeras 60 palabras de cada ruta; [...] indica texto omitido. Se eliminaron los símbolos de formato del modelo base. Elaboración propia.</w:t>
+      </w:r>
+    </w:p>
+    <w:p>
+      <w:pPr>
+        <w:pStyle w:val="NORML4L5"/>
+      </w:pPr>
+      <w:r>
+        <w:t xml:space="preserve">Contraste de la hipótesis específica 3. La coherencia contextual del modelo ajustado con LoRA en la arquitectura híbrida fue de 1.000, con 300 de 300 rutas coherentes, valor superior al umbral de 0.80 según la prueba binomial exacta unilateral (p &lt; .001). En consecuencia, se acepta la hipótesis específica 3. Cabe precisar que el modelo ajustado sin el componente tabular alcanzó una coherencia de 0.540, lo que muestra que la coherencia depende de que el modelo reciba el ranking.</w:t>
+      </w:r>
+    </w:p>
+    <w:p>
+      <w:pPr>
+        <w:pStyle w:val="Ttulo3"/>
+      </w:pPr>
+      <w:r>
+        <w:t xml:space="preserve">Objetivo específico 4: integración y validación comparativa</w:t>
+      </w:r>
+    </w:p>
+    <w:p>
+      <w:pPr>
+        <w:pStyle w:val="Ttulo4"/>
+      </w:pPr>
+      <w:r>
+        <w:t xml:space="preserve">Calidad del rankeo de programas</w:t>
+      </w:r>
+    </w:p>
+    <w:p>
+      <w:pPr>
+        <w:pStyle w:val="NORML4L5"/>
+      </w:pPr>
+      <w:r>
+        <w:t xml:space="preserve">Se evaluó el rankeo sobre 4 843 ingresantes, con un promedio de 9.8 programas candidatos por persona. La Tabla 15 y la Figura 7 muestran que el XGBoost superó al orden aleatorio en todas las métricas, con un MRR de 0.353 frente a 0.299, y ubicó el programa de ingreso en la primera posición en el 18.5 % de los casos, frente al 10.3 % esperado al azar. Sin embargo, el orden por popularidad, basado solo en la tasa histórica de ingreso de cada programa, obtuvo un MRR de 0.362, superior al del XGBoost en 2.5 %. No obstante, la diferencia no fue estadísticamente significativa según la prueba de Wilcoxon (W = 1 607 194, p = .292), con un tamaño del efecto despreciable (r = 0.015), por lo que ambos métodos ordenan los programas de forma equivalente.</w:t>
+      </w:r>
+    </w:p>
+    <w:p>
+      <w:pPr>
+        <w:pStyle w:val="TITTBFGL4L5"/>
+      </w:pPr>
+      <w:r>
+        <w:t xml:space="preserve">Tabla </w:t>
+      </w:r>
+      <w:fldSimple w:instr=" SEQ Tabla \* ARABIC ">
+        <w:r>
+          <w:rPr>
+            <w:noProof/>
+          </w:rPr>
+          <w:t>15</w:t>
+        </w:r>
+      </w:fldSimple>
+      <w:r>
+        <w:t xml:space="preserve"> </w:t>
+      </w:r>
+      <w:r>
+        <w:br/>
+      </w:r>
+      <w:r>
+        <w:rPr>
+          <w:b w:val="0"/>
+          <w:i/>
+        </w:rPr>
+        <w:t>Calidad del rankeo de programas del XGBoost y de los métodos de referencia</w:t>
       </w:r>
     </w:p>
     <w:tbl>
@@ -19079,7 +19282,7 @@
                 <w:sz w:val="18"/>
                 <w:szCs w:val="18"/>
               </w:rPr>
-              <w:t xml:space="preserve">Área</w:t>
+              <w:t xml:space="preserve">Método</w:t>
             </w:r>
           </w:p>
         </w:tc>
@@ -19230,7 +19433,7 @@
                 <w:sz w:val="18"/>
                 <w:szCs w:val="18"/>
               </w:rPr>
-              <w:t xml:space="preserve">Rural</w:t>
+              <w:t xml:space="preserve">Aleatorio</w:t>
             </w:r>
           </w:p>
         </w:tc>
@@ -19251,7 +19454,7 @@
                 <w:sz w:val="18"/>
                 <w:szCs w:val="18"/>
               </w:rPr>
-              <w:t xml:space="preserve">0.368</w:t>
+              <w:t xml:space="preserve">0.299</w:t>
             </w:r>
           </w:p>
         </w:tc>
@@ -19272,7 +19475,7 @@
                 <w:sz w:val="18"/>
                 <w:szCs w:val="18"/>
               </w:rPr>
-              <w:t xml:space="preserve">0.361</w:t>
+              <w:t xml:space="preserve">0.305</w:t>
             </w:r>
           </w:p>
         </w:tc>
@@ -19293,7 +19496,7 @@
                 <w:sz w:val="18"/>
                 <w:szCs w:val="18"/>
               </w:rPr>
-              <w:t xml:space="preserve">0.512</w:t>
+              <w:t xml:space="preserve">0.455</w:t>
             </w:r>
           </w:p>
         </w:tc>
@@ -19314,7 +19517,7 @@
                 <w:sz w:val="18"/>
                 <w:szCs w:val="18"/>
               </w:rPr>
-              <w:t xml:space="preserve">0.201</w:t>
+              <w:t xml:space="preserve">0.103</w:t>
             </w:r>
           </w:p>
         </w:tc>
@@ -19335,7 +19538,7 @@
                 <w:sz w:val="18"/>
                 <w:szCs w:val="18"/>
               </w:rPr>
-              <w:t xml:space="preserve">0.364</w:t>
+              <w:t xml:space="preserve">0.310</w:t>
             </w:r>
           </w:p>
         </w:tc>
@@ -19347,6 +19550,137 @@
         <w:tc>
           <w:tcPr>
             <w:tcW w:w="2408" w:type="dxa"/>
+            <w:tcBorders/>
+            <w:vAlign w:val="center"/>
+          </w:tcPr>
+          <w:p>
+            <w:pPr>
+              <w:pStyle w:val="CONTTBFB"/>
+              <w:spacing w:after="0" w:line="240" w:lineRule="auto"/>
+              <w:jc w:val="left"/>
+            </w:pPr>
+            <w:r>
+              <w:rPr>
+                <w:sz w:val="18"/>
+                <w:szCs w:val="18"/>
+              </w:rPr>
+              <w:t xml:space="preserve">Popularidad del programa</w:t>
+            </w:r>
+          </w:p>
+        </w:tc>
+        <w:tc>
+          <w:tcPr>
+            <w:tcW w:w="935" w:type="dxa"/>
+            <w:tcBorders/>
+            <w:vAlign w:val="center"/>
+          </w:tcPr>
+          <w:p>
+            <w:pPr>
+              <w:pStyle w:val="CONTTBFB"/>
+              <w:spacing w:after="0" w:line="240" w:lineRule="auto"/>
+              <w:jc w:val="center"/>
+            </w:pPr>
+            <w:r>
+              <w:rPr>
+                <w:sz w:val="18"/>
+                <w:szCs w:val="18"/>
+              </w:rPr>
+              <w:t xml:space="preserve">0.362</w:t>
+            </w:r>
+          </w:p>
+        </w:tc>
+        <w:tc>
+          <w:tcPr>
+            <w:tcW w:w="935" w:type="dxa"/>
+            <w:tcBorders/>
+            <w:vAlign w:val="center"/>
+          </w:tcPr>
+          <w:p>
+            <w:pPr>
+              <w:pStyle w:val="CONTTBFB"/>
+              <w:spacing w:after="0" w:line="240" w:lineRule="auto"/>
+              <w:jc w:val="center"/>
+            </w:pPr>
+            <w:r>
+              <w:rPr>
+                <w:sz w:val="18"/>
+                <w:szCs w:val="18"/>
+              </w:rPr>
+              <w:t xml:space="preserve">0.348</w:t>
+            </w:r>
+          </w:p>
+        </w:tc>
+        <w:tc>
+          <w:tcPr>
+            <w:tcW w:w="935" w:type="dxa"/>
+            <w:tcBorders/>
+            <w:vAlign w:val="center"/>
+          </w:tcPr>
+          <w:p>
+            <w:pPr>
+              <w:pStyle w:val="CONTTBFB"/>
+              <w:spacing w:after="0" w:line="240" w:lineRule="auto"/>
+              <w:jc w:val="center"/>
+            </w:pPr>
+            <w:r>
+              <w:rPr>
+                <w:sz w:val="18"/>
+                <w:szCs w:val="18"/>
+              </w:rPr>
+              <w:t xml:space="preserve">0.507</w:t>
+            </w:r>
+          </w:p>
+        </w:tc>
+        <w:tc>
+          <w:tcPr>
+            <w:tcW w:w="935" w:type="dxa"/>
+            <w:tcBorders/>
+            <w:vAlign w:val="center"/>
+          </w:tcPr>
+          <w:p>
+            <w:pPr>
+              <w:pStyle w:val="CONTTBFB"/>
+              <w:spacing w:after="0" w:line="240" w:lineRule="auto"/>
+              <w:jc w:val="center"/>
+            </w:pPr>
+            <w:r>
+              <w:rPr>
+                <w:sz w:val="18"/>
+                <w:szCs w:val="18"/>
+              </w:rPr>
+              <w:t xml:space="preserve">0.199</w:t>
+            </w:r>
+          </w:p>
+        </w:tc>
+        <w:tc>
+          <w:tcPr>
+            <w:tcW w:w="935" w:type="dxa"/>
+            <w:tcBorders/>
+            <w:vAlign w:val="center"/>
+          </w:tcPr>
+          <w:p>
+            <w:pPr>
+              <w:pStyle w:val="CONTTBFB"/>
+              <w:spacing w:after="0" w:line="240" w:lineRule="auto"/>
+              <w:jc w:val="center"/>
+            </w:pPr>
+            <w:r>
+              <w:rPr>
+                <w:sz w:val="18"/>
+                <w:szCs w:val="18"/>
+              </w:rPr>
+              <w:t xml:space="preserve">0.354</w:t>
+            </w:r>
+          </w:p>
+        </w:tc>
+      </w:tr>
+      <w:tr>
+        <w:trPr>
+          <w:cantSplit/>
+        </w:trPr>
+        <w:tc>
+          <w:tcPr>
+            <w:tcW w:w="2408" w:type="dxa"/>
             <w:tcBorders>
               <w:bottom w:val="single" w:sz="4" w:space="0" w:color="auto"/>
             </w:tcBorders>
@@ -19363,7 +19697,7 @@
                 <w:sz w:val="18"/>
                 <w:szCs w:val="18"/>
               </w:rPr>
-              <w:t xml:space="preserve">Urbana</w:t>
+              <w:t xml:space="preserve">XGBoost</w:t>
             </w:r>
           </w:p>
         </w:tc>
@@ -19386,7 +19720,7 @@
                 <w:sz w:val="18"/>
                 <w:szCs w:val="18"/>
               </w:rPr>
-              <w:t xml:space="preserve">0.350</w:t>
+              <w:t xml:space="preserve">0.353</w:t>
             </w:r>
           </w:p>
         </w:tc>
@@ -19409,7 +19743,7 @@
                 <w:sz w:val="18"/>
                 <w:szCs w:val="18"/>
               </w:rPr>
-              <w:t xml:space="preserve">0.339</w:t>
+              <w:t xml:space="preserve">0.343</w:t>
             </w:r>
           </w:p>
         </w:tc>
@@ -19432,7 +19766,7 @@
                 <w:sz w:val="18"/>
                 <w:szCs w:val="18"/>
               </w:rPr>
-              <w:t xml:space="preserve">0.498</w:t>
+              <w:t xml:space="preserve">0.500</w:t>
             </w:r>
           </w:p>
         </w:tc>
@@ -19455,7 +19789,7 @@
                 <w:sz w:val="18"/>
                 <w:szCs w:val="18"/>
               </w:rPr>
-              <w:t xml:space="preserve">0.181</w:t>
+              <w:t xml:space="preserve">0.185</w:t>
             </w:r>
           </w:p>
         </w:tc>
@@ -19478,7 +19812,7 @@
                 <w:sz w:val="18"/>
                 <w:szCs w:val="18"/>
               </w:rPr>
-              <w:t xml:space="preserve">0.339</w:t>
+              <w:t xml:space="preserve">0.345</w:t>
             </w:r>
           </w:p>
         </w:tc>
@@ -19495,6 +19829,599 @@
         <w:t xml:space="preserve">Nota.</w:t>
       </w:r>
       <w:r>
+        <w:t xml:space="preserve"> Evaluación con validación cruzada agrupada por persona sobre 4 843 ingresantes. Para el orden aleatorio se reportan los valores esperados exactos. Acierto@k: proporción de casos en que el programa de ingreso se ubica entre las k primeras posiciones.</w:t>
+      </w:r>
+    </w:p>
+    <w:p>
+      <w:pPr>
+        <w:pStyle w:val="TITTBFGL4L5"/>
+      </w:pPr>
+      <w:r>
+        <w:t xml:space="preserve">Figura </w:t>
+      </w:r>
+      <w:fldSimple w:instr=" SEQ Figura \* ARABIC ">
+        <w:r>
+          <w:rPr>
+            <w:noProof/>
+          </w:rPr>
+          <w:t>7</w:t>
+        </w:r>
+      </w:fldSimple>
+      <w:r>
+        <w:t xml:space="preserve"> </w:t>
+      </w:r>
+      <w:r>
+        <w:br/>
+      </w:r>
+      <w:r>
+        <w:rPr>
+          <w:b w:val="0"/>
+          <w:i/>
+        </w:rPr>
+        <w:t>Comparación de las métricas de rankeo entre métodos</w:t>
+      </w:r>
+    </w:p>
+    <w:p xmlns:a="http://schemas.openxmlformats.org/drawingml/2006/main" xmlns:pic="http://schemas.openxmlformats.org/drawingml/2006/picture">
+      <w:pPr>
+        <w:pStyle w:val="CONTTBFB"/>
+        <w:ind w:left="1418"/>
+      </w:pPr>
+      <w:r>
+        <w:rPr>
+          <w:noProof/>
+        </w:rPr>
+        <w:drawing>
+          <wp:inline distT="0" distB="0" distL="0" distR="0">
+            <wp:extent cx="4407535" cy="2326199"/>
+            <wp:effectExtent l="0" t="0" r="0" b="0"/>
+            <wp:docPr id="5007" name="Figura 5007"/>
+            <wp:cNvGraphicFramePr>
+              <a:graphicFrameLocks noChangeAspect="1"/>
+            </wp:cNvGraphicFramePr>
+            <a:graphic>
+              <a:graphicData uri="http://schemas.openxmlformats.org/drawingml/2006/picture">
+                <pic:pic>
+                  <pic:nvPicPr>
+                    <pic:cNvPr id="5007" name="careergpt_fig_ranking.png"/>
+                    <pic:cNvPicPr/>
+                  </pic:nvPicPr>
+                  <pic:blipFill>
+                    <a:blip r:embed="rId24"/>
+                    <a:stretch>
+                      <a:fillRect/>
+                    </a:stretch>
+                  </pic:blipFill>
+                  <pic:spPr>
+                    <a:xfrm>
+                      <a:off x="0" y="0"/>
+                      <a:ext cx="4407535" cy="2326199"/>
+                    </a:xfrm>
+                    <a:prstGeom prst="rect">
+                      <a:avLst/>
+                    </a:prstGeom>
+                  </pic:spPr>
+                </pic:pic>
+              </a:graphicData>
+            </a:graphic>
+          </wp:inline>
+        </w:drawing>
+      </w:r>
+    </w:p>
+    <w:p>
+      <w:pPr>
+        <w:pStyle w:val="NotasL4L5"/>
+      </w:pPr>
+      <w:r>
+        <w:rPr>
+          <w:i/>
+        </w:rPr>
+        <w:t xml:space="preserve">Nota.</w:t>
+      </w:r>
+      <w:r>
+        <w:t xml:space="preserve"> Elaboración propia.</w:t>
+      </w:r>
+    </w:p>
+    <w:p>
+      <w:pPr>
+        <w:pStyle w:val="NORML4L5"/>
+      </w:pPr>
+      <w:r>
+        <w:t xml:space="preserve">La Tabla 16 muestra que, a diferencia de lo observado en la clasificación, el rankeo no perjudicó a los postulantes de colegios rurales: sus métricas fueron iguales o ligeramente superiores a las de los urbanos.</w:t>
+      </w:r>
+    </w:p>
+    <w:p>
+      <w:pPr>
+        <w:pStyle w:val="TITTBFGL4L5"/>
+      </w:pPr>
+      <w:r>
+        <w:t xml:space="preserve">Tabla </w:t>
+      </w:r>
+      <w:fldSimple w:instr=" SEQ Tabla \* ARABIC ">
+        <w:r>
+          <w:rPr>
+            <w:noProof/>
+          </w:rPr>
+          <w:t>16</w:t>
+        </w:r>
+      </w:fldSimple>
+      <w:r>
+        <w:t xml:space="preserve"> </w:t>
+      </w:r>
+      <w:r>
+        <w:br/>
+      </w:r>
+      <w:r>
+        <w:rPr>
+          <w:b w:val="0"/>
+          <w:i/>
+        </w:rPr>
+        <w:t>Calidad del rankeo del XGBoost según el área del colegio de procedencia</w:t>
+      </w:r>
+    </w:p>
+    <w:tbl>
+      <w:tblPr>
+        <w:tblStyle w:val="Tablaconcuadrcula"/>
+        <w:tblW w:w="7083" w:type="dxa"/>
+        <w:tblInd w:w="1418" w:type="dxa"/>
+        <w:tblBorders>
+          <w:top w:val="none" w:sz="0" w:space="0" w:color="auto"/>
+          <w:left w:val="none" w:sz="0" w:space="0" w:color="auto"/>
+          <w:bottom w:val="none" w:sz="0" w:space="0" w:color="auto"/>
+          <w:right w:val="none" w:sz="0" w:space="0" w:color="auto"/>
+          <w:insideH w:val="none" w:sz="0" w:space="0" w:color="auto"/>
+          <w:insideV w:val="none" w:sz="0" w:space="0" w:color="auto"/>
+        </w:tblBorders>
+        <w:tblLayout w:type="fixed"/>
+      </w:tblPr>
+      <w:tblGrid>
+        <w:gridCol w:w="2408"/>
+        <w:gridCol w:w="935"/>
+        <w:gridCol w:w="935"/>
+        <w:gridCol w:w="935"/>
+        <w:gridCol w:w="935"/>
+        <w:gridCol w:w="935"/>
+      </w:tblGrid>
+      <w:tr>
+        <w:trPr>
+          <w:tblHeader/>
+        </w:trPr>
+        <w:tc>
+          <w:tcPr>
+            <w:tcW w:w="2408" w:type="dxa"/>
+            <w:tcBorders>
+              <w:top w:val="single" w:sz="4" w:space="0" w:color="auto"/>
+              <w:bottom w:val="single" w:sz="4" w:space="0" w:color="auto"/>
+            </w:tcBorders>
+            <w:vAlign w:val="center"/>
+          </w:tcPr>
+          <w:p>
+            <w:pPr>
+              <w:pStyle w:val="CONTTBFB"/>
+              <w:spacing w:after="0" w:line="240" w:lineRule="auto"/>
+              <w:jc w:val="center"/>
+            </w:pPr>
+            <w:r>
+              <w:rPr>
+                <w:b/>
+                <w:sz w:val="18"/>
+                <w:szCs w:val="18"/>
+              </w:rPr>
+              <w:t xml:space="preserve">Área</w:t>
+            </w:r>
+          </w:p>
+        </w:tc>
+        <w:tc>
+          <w:tcPr>
+            <w:tcW w:w="935" w:type="dxa"/>
+            <w:tcBorders>
+              <w:top w:val="single" w:sz="4" w:space="0" w:color="auto"/>
+              <w:bottom w:val="single" w:sz="4" w:space="0" w:color="auto"/>
+            </w:tcBorders>
+            <w:vAlign w:val="center"/>
+          </w:tcPr>
+          <w:p>
+            <w:pPr>
+              <w:pStyle w:val="CONTTBFB"/>
+              <w:spacing w:after="0" w:line="240" w:lineRule="auto"/>
+              <w:jc w:val="center"/>
+            </w:pPr>
+            <w:r>
+              <w:rPr>
+                <w:b/>
+                <w:sz w:val="18"/>
+                <w:szCs w:val="18"/>
+              </w:rPr>
+              <w:t xml:space="preserve">MRR</w:t>
+            </w:r>
+          </w:p>
+        </w:tc>
+        <w:tc>
+          <w:tcPr>
+            <w:tcW w:w="935" w:type="dxa"/>
+            <w:tcBorders>
+              <w:top w:val="single" w:sz="4" w:space="0" w:color="auto"/>
+              <w:bottom w:val="single" w:sz="4" w:space="0" w:color="auto"/>
+            </w:tcBorders>
+            <w:vAlign w:val="center"/>
+          </w:tcPr>
+          <w:p>
+            <w:pPr>
+              <w:pStyle w:val="CONTTBFB"/>
+              <w:spacing w:after="0" w:line="240" w:lineRule="auto"/>
+              <w:jc w:val="center"/>
+            </w:pPr>
+            <w:r>
+              <w:rPr>
+                <w:b/>
+                <w:sz w:val="18"/>
+                <w:szCs w:val="18"/>
+              </w:rPr>
+              <w:t xml:space="preserve">NDCG@5</w:t>
+            </w:r>
+          </w:p>
+        </w:tc>
+        <w:tc>
+          <w:tcPr>
+            <w:tcW w:w="935" w:type="dxa"/>
+            <w:tcBorders>
+              <w:top w:val="single" w:sz="4" w:space="0" w:color="auto"/>
+              <w:bottom w:val="single" w:sz="4" w:space="0" w:color="auto"/>
+            </w:tcBorders>
+            <w:vAlign w:val="center"/>
+          </w:tcPr>
+          <w:p>
+            <w:pPr>
+              <w:pStyle w:val="CONTTBFB"/>
+              <w:spacing w:after="0" w:line="240" w:lineRule="auto"/>
+              <w:jc w:val="center"/>
+            </w:pPr>
+            <w:r>
+              <w:rPr>
+                <w:b/>
+                <w:sz w:val="18"/>
+                <w:szCs w:val="18"/>
+              </w:rPr>
+              <w:t xml:space="preserve">NDCG@10</w:t>
+            </w:r>
+          </w:p>
+        </w:tc>
+        <w:tc>
+          <w:tcPr>
+            <w:tcW w:w="935" w:type="dxa"/>
+            <w:tcBorders>
+              <w:top w:val="single" w:sz="4" w:space="0" w:color="auto"/>
+              <w:bottom w:val="single" w:sz="4" w:space="0" w:color="auto"/>
+            </w:tcBorders>
+            <w:vAlign w:val="center"/>
+          </w:tcPr>
+          <w:p>
+            <w:pPr>
+              <w:pStyle w:val="CONTTBFB"/>
+              <w:spacing w:after="0" w:line="240" w:lineRule="auto"/>
+              <w:jc w:val="center"/>
+            </w:pPr>
+            <w:r>
+              <w:rPr>
+                <w:b/>
+                <w:sz w:val="18"/>
+                <w:szCs w:val="18"/>
+              </w:rPr>
+              <w:t xml:space="preserve">Acierto@1</w:t>
+            </w:r>
+          </w:p>
+        </w:tc>
+        <w:tc>
+          <w:tcPr>
+            <w:tcW w:w="935" w:type="dxa"/>
+            <w:tcBorders>
+              <w:top w:val="single" w:sz="4" w:space="0" w:color="auto"/>
+              <w:bottom w:val="single" w:sz="4" w:space="0" w:color="auto"/>
+            </w:tcBorders>
+            <w:vAlign w:val="center"/>
+          </w:tcPr>
+          <w:p>
+            <w:pPr>
+              <w:pStyle w:val="CONTTBFB"/>
+              <w:spacing w:after="0" w:line="240" w:lineRule="auto"/>
+              <w:jc w:val="center"/>
+            </w:pPr>
+            <w:r>
+              <w:rPr>
+                <w:b/>
+                <w:sz w:val="18"/>
+                <w:szCs w:val="18"/>
+              </w:rPr>
+              <w:t xml:space="preserve">Acierto@3</w:t>
+            </w:r>
+          </w:p>
+        </w:tc>
+      </w:tr>
+      <w:tr>
+        <w:trPr>
+          <w:cantSplit/>
+        </w:trPr>
+        <w:tc>
+          <w:tcPr>
+            <w:tcW w:w="2408" w:type="dxa"/>
+            <w:tcBorders/>
+            <w:vAlign w:val="center"/>
+          </w:tcPr>
+          <w:p>
+            <w:pPr>
+              <w:pStyle w:val="CONTTBFB"/>
+              <w:spacing w:after="0" w:line="240" w:lineRule="auto"/>
+              <w:jc w:val="left"/>
+            </w:pPr>
+            <w:r>
+              <w:rPr>
+                <w:sz w:val="18"/>
+                <w:szCs w:val="18"/>
+              </w:rPr>
+              <w:t xml:space="preserve">Rural</w:t>
+            </w:r>
+          </w:p>
+        </w:tc>
+        <w:tc>
+          <w:tcPr>
+            <w:tcW w:w="935" w:type="dxa"/>
+            <w:tcBorders/>
+            <w:vAlign w:val="center"/>
+          </w:tcPr>
+          <w:p>
+            <w:pPr>
+              <w:pStyle w:val="CONTTBFB"/>
+              <w:spacing w:after="0" w:line="240" w:lineRule="auto"/>
+              <w:jc w:val="center"/>
+            </w:pPr>
+            <w:r>
+              <w:rPr>
+                <w:sz w:val="18"/>
+                <w:szCs w:val="18"/>
+              </w:rPr>
+              <w:t xml:space="preserve">0.368</w:t>
+            </w:r>
+          </w:p>
+        </w:tc>
+        <w:tc>
+          <w:tcPr>
+            <w:tcW w:w="935" w:type="dxa"/>
+            <w:tcBorders/>
+            <w:vAlign w:val="center"/>
+          </w:tcPr>
+          <w:p>
+            <w:pPr>
+              <w:pStyle w:val="CONTTBFB"/>
+              <w:spacing w:after="0" w:line="240" w:lineRule="auto"/>
+              <w:jc w:val="center"/>
+            </w:pPr>
+            <w:r>
+              <w:rPr>
+                <w:sz w:val="18"/>
+                <w:szCs w:val="18"/>
+              </w:rPr>
+              <w:t xml:space="preserve">0.361</w:t>
+            </w:r>
+          </w:p>
+        </w:tc>
+        <w:tc>
+          <w:tcPr>
+            <w:tcW w:w="935" w:type="dxa"/>
+            <w:tcBorders/>
+            <w:vAlign w:val="center"/>
+          </w:tcPr>
+          <w:p>
+            <w:pPr>
+              <w:pStyle w:val="CONTTBFB"/>
+              <w:spacing w:after="0" w:line="240" w:lineRule="auto"/>
+              <w:jc w:val="center"/>
+            </w:pPr>
+            <w:r>
+              <w:rPr>
+                <w:sz w:val="18"/>
+                <w:szCs w:val="18"/>
+              </w:rPr>
+              <w:t xml:space="preserve">0.512</w:t>
+            </w:r>
+          </w:p>
+        </w:tc>
+        <w:tc>
+          <w:tcPr>
+            <w:tcW w:w="935" w:type="dxa"/>
+            <w:tcBorders/>
+            <w:vAlign w:val="center"/>
+          </w:tcPr>
+          <w:p>
+            <w:pPr>
+              <w:pStyle w:val="CONTTBFB"/>
+              <w:spacing w:after="0" w:line="240" w:lineRule="auto"/>
+              <w:jc w:val="center"/>
+            </w:pPr>
+            <w:r>
+              <w:rPr>
+                <w:sz w:val="18"/>
+                <w:szCs w:val="18"/>
+              </w:rPr>
+              <w:t xml:space="preserve">0.201</w:t>
+            </w:r>
+          </w:p>
+        </w:tc>
+        <w:tc>
+          <w:tcPr>
+            <w:tcW w:w="935" w:type="dxa"/>
+            <w:tcBorders/>
+            <w:vAlign w:val="center"/>
+          </w:tcPr>
+          <w:p>
+            <w:pPr>
+              <w:pStyle w:val="CONTTBFB"/>
+              <w:spacing w:after="0" w:line="240" w:lineRule="auto"/>
+              <w:jc w:val="center"/>
+            </w:pPr>
+            <w:r>
+              <w:rPr>
+                <w:sz w:val="18"/>
+                <w:szCs w:val="18"/>
+              </w:rPr>
+              <w:t xml:space="preserve">0.364</w:t>
+            </w:r>
+          </w:p>
+        </w:tc>
+      </w:tr>
+      <w:tr>
+        <w:trPr>
+          <w:cantSplit/>
+        </w:trPr>
+        <w:tc>
+          <w:tcPr>
+            <w:tcW w:w="2408" w:type="dxa"/>
+            <w:tcBorders>
+              <w:bottom w:val="single" w:sz="4" w:space="0" w:color="auto"/>
+            </w:tcBorders>
+            <w:vAlign w:val="center"/>
+          </w:tcPr>
+          <w:p>
+            <w:pPr>
+              <w:pStyle w:val="CONTTBFB"/>
+              <w:spacing w:after="0" w:line="240" w:lineRule="auto"/>
+              <w:jc w:val="left"/>
+            </w:pPr>
+            <w:r>
+              <w:rPr>
+                <w:sz w:val="18"/>
+                <w:szCs w:val="18"/>
+              </w:rPr>
+              <w:t xml:space="preserve">Urbana</w:t>
+            </w:r>
+          </w:p>
+        </w:tc>
+        <w:tc>
+          <w:tcPr>
+            <w:tcW w:w="935" w:type="dxa"/>
+            <w:tcBorders>
+              <w:bottom w:val="single" w:sz="4" w:space="0" w:color="auto"/>
+            </w:tcBorders>
+            <w:vAlign w:val="center"/>
+          </w:tcPr>
+          <w:p>
+            <w:pPr>
+              <w:pStyle w:val="CONTTBFB"/>
+              <w:spacing w:after="0" w:line="240" w:lineRule="auto"/>
+              <w:jc w:val="center"/>
+            </w:pPr>
+            <w:r>
+              <w:rPr>
+                <w:sz w:val="18"/>
+                <w:szCs w:val="18"/>
+              </w:rPr>
+              <w:t xml:space="preserve">0.350</w:t>
+            </w:r>
+          </w:p>
+        </w:tc>
+        <w:tc>
+          <w:tcPr>
+            <w:tcW w:w="935" w:type="dxa"/>
+            <w:tcBorders>
+              <w:bottom w:val="single" w:sz="4" w:space="0" w:color="auto"/>
+            </w:tcBorders>
+            <w:vAlign w:val="center"/>
+          </w:tcPr>
+          <w:p>
+            <w:pPr>
+              <w:pStyle w:val="CONTTBFB"/>
+              <w:spacing w:after="0" w:line="240" w:lineRule="auto"/>
+              <w:jc w:val="center"/>
+            </w:pPr>
+            <w:r>
+              <w:rPr>
+                <w:sz w:val="18"/>
+                <w:szCs w:val="18"/>
+              </w:rPr>
+              <w:t xml:space="preserve">0.339</w:t>
+            </w:r>
+          </w:p>
+        </w:tc>
+        <w:tc>
+          <w:tcPr>
+            <w:tcW w:w="935" w:type="dxa"/>
+            <w:tcBorders>
+              <w:bottom w:val="single" w:sz="4" w:space="0" w:color="auto"/>
+            </w:tcBorders>
+            <w:vAlign w:val="center"/>
+          </w:tcPr>
+          <w:p>
+            <w:pPr>
+              <w:pStyle w:val="CONTTBFB"/>
+              <w:spacing w:after="0" w:line="240" w:lineRule="auto"/>
+              <w:jc w:val="center"/>
+            </w:pPr>
+            <w:r>
+              <w:rPr>
+                <w:sz w:val="18"/>
+                <w:szCs w:val="18"/>
+              </w:rPr>
+              <w:t xml:space="preserve">0.498</w:t>
+            </w:r>
+          </w:p>
+        </w:tc>
+        <w:tc>
+          <w:tcPr>
+            <w:tcW w:w="935" w:type="dxa"/>
+            <w:tcBorders>
+              <w:bottom w:val="single" w:sz="4" w:space="0" w:color="auto"/>
+            </w:tcBorders>
+            <w:vAlign w:val="center"/>
+          </w:tcPr>
+          <w:p>
+            <w:pPr>
+              <w:pStyle w:val="CONTTBFB"/>
+              <w:spacing w:after="0" w:line="240" w:lineRule="auto"/>
+              <w:jc w:val="center"/>
+            </w:pPr>
+            <w:r>
+              <w:rPr>
+                <w:sz w:val="18"/>
+                <w:szCs w:val="18"/>
+              </w:rPr>
+              <w:t xml:space="preserve">0.181</w:t>
+            </w:r>
+          </w:p>
+        </w:tc>
+        <w:tc>
+          <w:tcPr>
+            <w:tcW w:w="935" w:type="dxa"/>
+            <w:tcBorders>
+              <w:bottom w:val="single" w:sz="4" w:space="0" w:color="auto"/>
+            </w:tcBorders>
+            <w:vAlign w:val="center"/>
+          </w:tcPr>
+          <w:p>
+            <w:pPr>
+              <w:pStyle w:val="CONTTBFB"/>
+              <w:spacing w:after="0" w:line="240" w:lineRule="auto"/>
+              <w:jc w:val="center"/>
+            </w:pPr>
+            <w:r>
+              <w:rPr>
+                <w:sz w:val="18"/>
+                <w:szCs w:val="18"/>
+              </w:rPr>
+              <w:t xml:space="preserve">0.339</w:t>
+            </w:r>
+          </w:p>
+        </w:tc>
+      </w:tr>
+    </w:tbl>
+    <w:p>
+      <w:pPr>
+        <w:pStyle w:val="NotasL4L5"/>
+      </w:pPr>
+      <w:r>
+        <w:rPr>
+          <w:i/>
+        </w:rPr>
+        <w:t xml:space="preserve">Nota.</w:t>
+      </w:r>
+      <w:r>
         <w:t xml:space="preserve"> Se excluyen los ingresantes sin registro del área del colegio.</w:t>
       </w:r>
     </w:p>
@@ -19511,7 +20438,711 @@
         <w:pStyle w:val="NORML4L5"/>
       </w:pPr>
       <w:r>
-        <w:t xml:space="preserve">[Pendiente de la ejecución del ajuste con LoRA. Presentar para las tres condiciones, modelo base sin ajuste, modelo con LoRA sin componente tabular y CareER-GPT híbrido, los valores de ROUGE-L, BERTScore, coherencia y métrica combinada con su intervalo de confianza, y el contraste de la hipótesis específica 4.]</w:t>
+        <w:t xml:space="preserve">La Tabla 17 compara las tres condiciones sobre los mismos 300 pares de prueba. El modelo base sin ajuste obtuvo una métrica combinada de 0.342: generó textos extensos, con formato propio y sin respetar el orden del ranking, con una coherencia de 0.253. El modelo ajustado sin el componente tabular alcanzó 0.783; reprodujo la estructura de la ruta, con un ROUGE-L de 0.852, cercano al de 0.836 que comparten referencias de personas distintas, pero al no conocer las probabilidades recomendó un programa distinto o en otro orden en el 46.0 % de los casos. La arquitectura híbrida alcanzó 1.000, con intervalos de confianza que no se superponen con los de las otras condiciones.</w:t>
+      </w:r>
+    </w:p>
+    <w:p>
+      <w:pPr>
+        <w:pStyle w:val="TITTBFGL4L5"/>
+      </w:pPr>
+      <w:r>
+        <w:t xml:space="preserve">Tabla </w:t>
+      </w:r>
+      <w:fldSimple w:instr=" SEQ Tabla \* ARABIC ">
+        <w:r>
+          <w:rPr>
+            <w:noProof/>
+          </w:rPr>
+          <w:t>17</w:t>
+        </w:r>
+      </w:fldSimple>
+      <w:r>
+        <w:t xml:space="preserve"> </w:t>
+      </w:r>
+      <w:r>
+        <w:br/>
+      </w:r>
+      <w:r>
+        <w:rPr>
+          <w:b w:val="0"/>
+          <w:i/>
+        </w:rPr>
+        <w:t>Calidad de las rutas generadas según la condición experimental</w:t>
+      </w:r>
+    </w:p>
+    <w:tbl>
+      <w:tblPr>
+        <w:tblStyle w:val="Tablaconcuadrcula"/>
+        <w:tblW w:w="7085" w:type="dxa"/>
+        <w:tblInd w:w="1418" w:type="dxa"/>
+        <w:tblBorders>
+          <w:top w:val="none" w:sz="0" w:space="0" w:color="auto"/>
+          <w:left w:val="none" w:sz="0" w:space="0" w:color="auto"/>
+          <w:bottom w:val="none" w:sz="0" w:space="0" w:color="auto"/>
+          <w:right w:val="none" w:sz="0" w:space="0" w:color="auto"/>
+          <w:insideH w:val="none" w:sz="0" w:space="0" w:color="auto"/>
+          <w:insideV w:val="none" w:sz="0" w:space="0" w:color="auto"/>
+        </w:tblBorders>
+        <w:tblLayout w:type="fixed"/>
+      </w:tblPr>
+      <w:tblGrid>
+        <w:gridCol w:w="1685"/>
+        <w:gridCol w:w="1350"/>
+        <w:gridCol w:w="1350"/>
+        <w:gridCol w:w="1350"/>
+        <w:gridCol w:w="1350"/>
+      </w:tblGrid>
+      <w:tr>
+        <w:trPr>
+          <w:tblHeader/>
+        </w:trPr>
+        <w:tc>
+          <w:tcPr>
+            <w:tcW w:w="1685" w:type="dxa"/>
+            <w:tcBorders>
+              <w:top w:val="single" w:sz="4" w:space="0" w:color="auto"/>
+              <w:bottom w:val="single" w:sz="4" w:space="0" w:color="auto"/>
+            </w:tcBorders>
+            <w:vAlign w:val="center"/>
+          </w:tcPr>
+          <w:p>
+            <w:pPr>
+              <w:pStyle w:val="CONTTBFB"/>
+              <w:spacing w:after="0" w:line="240" w:lineRule="auto"/>
+              <w:jc w:val="center"/>
+            </w:pPr>
+            <w:r>
+              <w:rPr>
+                <w:b/>
+                <w:sz w:val="18"/>
+                <w:szCs w:val="18"/>
+              </w:rPr>
+              <w:t xml:space="preserve">Condición</w:t>
+            </w:r>
+          </w:p>
+        </w:tc>
+        <w:tc>
+          <w:tcPr>
+            <w:tcW w:w="1350" w:type="dxa"/>
+            <w:tcBorders>
+              <w:top w:val="single" w:sz="4" w:space="0" w:color="auto"/>
+              <w:bottom w:val="single" w:sz="4" w:space="0" w:color="auto"/>
+            </w:tcBorders>
+            <w:vAlign w:val="center"/>
+          </w:tcPr>
+          <w:p>
+            <w:pPr>
+              <w:pStyle w:val="CONTTBFB"/>
+              <w:spacing w:after="0" w:line="240" w:lineRule="auto"/>
+              <w:jc w:val="center"/>
+            </w:pPr>
+            <w:r>
+              <w:rPr>
+                <w:b/>
+                <w:sz w:val="18"/>
+                <w:szCs w:val="18"/>
+              </w:rPr>
+              <w:t xml:space="preserve">ROUGE-L</w:t>
+            </w:r>
+          </w:p>
+        </w:tc>
+        <w:tc>
+          <w:tcPr>
+            <w:tcW w:w="1350" w:type="dxa"/>
+            <w:tcBorders>
+              <w:top w:val="single" w:sz="4" w:space="0" w:color="auto"/>
+              <w:bottom w:val="single" w:sz="4" w:space="0" w:color="auto"/>
+            </w:tcBorders>
+            <w:vAlign w:val="center"/>
+          </w:tcPr>
+          <w:p>
+            <w:pPr>
+              <w:pStyle w:val="CONTTBFB"/>
+              <w:spacing w:after="0" w:line="240" w:lineRule="auto"/>
+              <w:jc w:val="center"/>
+            </w:pPr>
+            <w:r>
+              <w:rPr>
+                <w:b/>
+                <w:sz w:val="18"/>
+                <w:szCs w:val="18"/>
+              </w:rPr>
+              <w:t xml:space="preserve">BERTScore F1</w:t>
+            </w:r>
+          </w:p>
+        </w:tc>
+        <w:tc>
+          <w:tcPr>
+            <w:tcW w:w="1350" w:type="dxa"/>
+            <w:tcBorders>
+              <w:top w:val="single" w:sz="4" w:space="0" w:color="auto"/>
+              <w:bottom w:val="single" w:sz="4" w:space="0" w:color="auto"/>
+            </w:tcBorders>
+            <w:vAlign w:val="center"/>
+          </w:tcPr>
+          <w:p>
+            <w:pPr>
+              <w:pStyle w:val="CONTTBFB"/>
+              <w:spacing w:after="0" w:line="240" w:lineRule="auto"/>
+              <w:jc w:val="center"/>
+            </w:pPr>
+            <w:r>
+              <w:rPr>
+                <w:b/>
+                <w:sz w:val="18"/>
+                <w:szCs w:val="18"/>
+              </w:rPr>
+              <w:t xml:space="preserve">Coherencia</w:t>
+            </w:r>
+          </w:p>
+        </w:tc>
+        <w:tc>
+          <w:tcPr>
+            <w:tcW w:w="1350" w:type="dxa"/>
+            <w:tcBorders>
+              <w:top w:val="single" w:sz="4" w:space="0" w:color="auto"/>
+              <w:bottom w:val="single" w:sz="4" w:space="0" w:color="auto"/>
+            </w:tcBorders>
+            <w:vAlign w:val="center"/>
+          </w:tcPr>
+          <w:p>
+            <w:pPr>
+              <w:pStyle w:val="CONTTBFB"/>
+              <w:spacing w:after="0" w:line="240" w:lineRule="auto"/>
+              <w:jc w:val="center"/>
+            </w:pPr>
+            <w:r>
+              <w:rPr>
+                <w:b/>
+                <w:sz w:val="18"/>
+                <w:szCs w:val="18"/>
+              </w:rPr>
+              <w:t xml:space="preserve">Métrica combinada</w:t>
+            </w:r>
+          </w:p>
+        </w:tc>
+      </w:tr>
+      <w:tr>
+        <w:trPr>
+          <w:cantSplit/>
+        </w:trPr>
+        <w:tc>
+          <w:tcPr>
+            <w:tcW w:w="1685" w:type="dxa"/>
+            <w:tcBorders/>
+            <w:vAlign w:val="center"/>
+          </w:tcPr>
+          <w:p>
+            <w:pPr>
+              <w:pStyle w:val="CONTTBFB"/>
+              <w:spacing w:after="0" w:line="240" w:lineRule="auto"/>
+              <w:jc w:val="left"/>
+            </w:pPr>
+            <w:r>
+              <w:rPr>
+                <w:sz w:val="18"/>
+                <w:szCs w:val="18"/>
+              </w:rPr>
+              <w:t xml:space="preserve">LLM base sin ajuste</w:t>
+            </w:r>
+          </w:p>
+        </w:tc>
+        <w:tc>
+          <w:tcPr>
+            <w:tcW w:w="1350" w:type="dxa"/>
+            <w:tcBorders/>
+            <w:vAlign w:val="center"/>
+          </w:tcPr>
+          <w:p>
+            <w:pPr>
+              <w:pStyle w:val="CONTTBFB"/>
+              <w:spacing w:after="0" w:line="240" w:lineRule="auto"/>
+              <w:jc w:val="center"/>
+            </w:pPr>
+            <w:r>
+              <w:rPr>
+                <w:sz w:val="18"/>
+                <w:szCs w:val="18"/>
+              </w:rPr>
+              <w:t xml:space="preserve">0.143</w:t>
+            </w:r>
+          </w:p>
+          <w:p>
+            <w:pPr>
+              <w:pStyle w:val="CONTTBFB"/>
+              <w:spacing w:after="0" w:line="240" w:lineRule="auto"/>
+              <w:jc w:val="center"/>
+            </w:pPr>
+            <w:r>
+              <w:rPr>
+                <w:sz w:val="18"/>
+                <w:szCs w:val="18"/>
+              </w:rPr>
+              <w:t xml:space="preserve">[0.140, 0.145]</w:t>
+            </w:r>
+          </w:p>
+        </w:tc>
+        <w:tc>
+          <w:tcPr>
+            <w:tcW w:w="1350" w:type="dxa"/>
+            <w:tcBorders/>
+            <w:vAlign w:val="center"/>
+          </w:tcPr>
+          <w:p>
+            <w:pPr>
+              <w:pStyle w:val="CONTTBFB"/>
+              <w:spacing w:after="0" w:line="240" w:lineRule="auto"/>
+              <w:jc w:val="center"/>
+            </w:pPr>
+            <w:r>
+              <w:rPr>
+                <w:sz w:val="18"/>
+                <w:szCs w:val="18"/>
+              </w:rPr>
+              <w:t xml:space="preserve">0.631</w:t>
+            </w:r>
+          </w:p>
+          <w:p>
+            <w:pPr>
+              <w:pStyle w:val="CONTTBFB"/>
+              <w:spacing w:after="0" w:line="240" w:lineRule="auto"/>
+              <w:jc w:val="center"/>
+            </w:pPr>
+            <w:r>
+              <w:rPr>
+                <w:sz w:val="18"/>
+                <w:szCs w:val="18"/>
+              </w:rPr>
+              <w:t xml:space="preserve">[0.629, 0.632]</w:t>
+            </w:r>
+          </w:p>
+        </w:tc>
+        <w:tc>
+          <w:tcPr>
+            <w:tcW w:w="1350" w:type="dxa"/>
+            <w:tcBorders/>
+            <w:vAlign w:val="center"/>
+          </w:tcPr>
+          <w:p>
+            <w:pPr>
+              <w:pStyle w:val="CONTTBFB"/>
+              <w:spacing w:after="0" w:line="240" w:lineRule="auto"/>
+              <w:jc w:val="center"/>
+            </w:pPr>
+            <w:r>
+              <w:rPr>
+                <w:sz w:val="18"/>
+                <w:szCs w:val="18"/>
+              </w:rPr>
+              <w:t xml:space="preserve">0.253</w:t>
+            </w:r>
+          </w:p>
+          <w:p>
+            <w:pPr>
+              <w:pStyle w:val="CONTTBFB"/>
+              <w:spacing w:after="0" w:line="240" w:lineRule="auto"/>
+              <w:jc w:val="center"/>
+            </w:pPr>
+            <w:r>
+              <w:rPr>
+                <w:sz w:val="18"/>
+                <w:szCs w:val="18"/>
+              </w:rPr>
+              <w:t xml:space="preserve">[0.207, 0.303]</w:t>
+            </w:r>
+          </w:p>
+        </w:tc>
+        <w:tc>
+          <w:tcPr>
+            <w:tcW w:w="1350" w:type="dxa"/>
+            <w:tcBorders/>
+            <w:vAlign w:val="center"/>
+          </w:tcPr>
+          <w:p>
+            <w:pPr>
+              <w:pStyle w:val="CONTTBFB"/>
+              <w:spacing w:after="0" w:line="240" w:lineRule="auto"/>
+              <w:jc w:val="center"/>
+            </w:pPr>
+            <w:r>
+              <w:rPr>
+                <w:sz w:val="18"/>
+                <w:szCs w:val="18"/>
+              </w:rPr>
+              <w:t xml:space="preserve">0.342</w:t>
+            </w:r>
+          </w:p>
+          <w:p>
+            <w:pPr>
+              <w:pStyle w:val="CONTTBFB"/>
+              <w:spacing w:after="0" w:line="240" w:lineRule="auto"/>
+              <w:jc w:val="center"/>
+            </w:pPr>
+            <w:r>
+              <w:rPr>
+                <w:sz w:val="18"/>
+                <w:szCs w:val="18"/>
+              </w:rPr>
+              <w:t xml:space="preserve">[0.326, 0.359]</w:t>
+            </w:r>
+          </w:p>
+        </w:tc>
+      </w:tr>
+      <w:tr>
+        <w:trPr>
+          <w:cantSplit/>
+        </w:trPr>
+        <w:tc>
+          <w:tcPr>
+            <w:tcW w:w="1685" w:type="dxa"/>
+            <w:tcBorders/>
+            <w:vAlign w:val="center"/>
+          </w:tcPr>
+          <w:p>
+            <w:pPr>
+              <w:pStyle w:val="CONTTBFB"/>
+              <w:spacing w:after="0" w:line="240" w:lineRule="auto"/>
+              <w:jc w:val="left"/>
+            </w:pPr>
+            <w:r>
+              <w:rPr>
+                <w:sz w:val="18"/>
+                <w:szCs w:val="18"/>
+              </w:rPr>
+              <w:t xml:space="preserve">LLM con LoRA sin componente tabular</w:t>
+            </w:r>
+          </w:p>
+        </w:tc>
+        <w:tc>
+          <w:tcPr>
+            <w:tcW w:w="1350" w:type="dxa"/>
+            <w:tcBorders/>
+            <w:vAlign w:val="center"/>
+          </w:tcPr>
+          <w:p>
+            <w:pPr>
+              <w:pStyle w:val="CONTTBFB"/>
+              <w:spacing w:after="0" w:line="240" w:lineRule="auto"/>
+              <w:jc w:val="center"/>
+            </w:pPr>
+            <w:r>
+              <w:rPr>
+                <w:sz w:val="18"/>
+                <w:szCs w:val="18"/>
+              </w:rPr>
+              <w:t xml:space="preserve">0.852</w:t>
+            </w:r>
+          </w:p>
+          <w:p>
+            <w:pPr>
+              <w:pStyle w:val="CONTTBFB"/>
+              <w:spacing w:after="0" w:line="240" w:lineRule="auto"/>
+              <w:jc w:val="center"/>
+            </w:pPr>
+            <w:r>
+              <w:rPr>
+                <w:sz w:val="18"/>
+                <w:szCs w:val="18"/>
+              </w:rPr>
+              <w:t xml:space="preserve">[0.847, 0.857]</w:t>
+            </w:r>
+          </w:p>
+        </w:tc>
+        <w:tc>
+          <w:tcPr>
+            <w:tcW w:w="1350" w:type="dxa"/>
+            <w:tcBorders/>
+            <w:vAlign w:val="center"/>
+          </w:tcPr>
+          <w:p>
+            <w:pPr>
+              <w:pStyle w:val="CONTTBFB"/>
+              <w:spacing w:after="0" w:line="240" w:lineRule="auto"/>
+              <w:jc w:val="center"/>
+            </w:pPr>
+            <w:r>
+              <w:rPr>
+                <w:sz w:val="18"/>
+                <w:szCs w:val="18"/>
+              </w:rPr>
+              <w:t xml:space="preserve">0.957</w:t>
+            </w:r>
+          </w:p>
+          <w:p>
+            <w:pPr>
+              <w:pStyle w:val="CONTTBFB"/>
+              <w:spacing w:after="0" w:line="240" w:lineRule="auto"/>
+              <w:jc w:val="center"/>
+            </w:pPr>
+            <w:r>
+              <w:rPr>
+                <w:sz w:val="18"/>
+                <w:szCs w:val="18"/>
+              </w:rPr>
+              <w:t xml:space="preserve">[0.953, 0.961]</w:t>
+            </w:r>
+          </w:p>
+        </w:tc>
+        <w:tc>
+          <w:tcPr>
+            <w:tcW w:w="1350" w:type="dxa"/>
+            <w:tcBorders/>
+            <w:vAlign w:val="center"/>
+          </w:tcPr>
+          <w:p>
+            <w:pPr>
+              <w:pStyle w:val="CONTTBFB"/>
+              <w:spacing w:after="0" w:line="240" w:lineRule="auto"/>
+              <w:jc w:val="center"/>
+            </w:pPr>
+            <w:r>
+              <w:rPr>
+                <w:sz w:val="18"/>
+                <w:szCs w:val="18"/>
+              </w:rPr>
+              <w:t xml:space="preserve">0.540</w:t>
+            </w:r>
+          </w:p>
+          <w:p>
+            <w:pPr>
+              <w:pStyle w:val="CONTTBFB"/>
+              <w:spacing w:after="0" w:line="240" w:lineRule="auto"/>
+              <w:jc w:val="center"/>
+            </w:pPr>
+            <w:r>
+              <w:rPr>
+                <w:sz w:val="18"/>
+                <w:szCs w:val="18"/>
+              </w:rPr>
+              <w:t xml:space="preserve">[0.487, 0.593]</w:t>
+            </w:r>
+          </w:p>
+        </w:tc>
+        <w:tc>
+          <w:tcPr>
+            <w:tcW w:w="1350" w:type="dxa"/>
+            <w:tcBorders/>
+            <w:vAlign w:val="center"/>
+          </w:tcPr>
+          <w:p>
+            <w:pPr>
+              <w:pStyle w:val="CONTTBFB"/>
+              <w:spacing w:after="0" w:line="240" w:lineRule="auto"/>
+              <w:jc w:val="center"/>
+            </w:pPr>
+            <w:r>
+              <w:rPr>
+                <w:sz w:val="18"/>
+                <w:szCs w:val="18"/>
+              </w:rPr>
+              <w:t xml:space="preserve">0.783</w:t>
+            </w:r>
+          </w:p>
+          <w:p>
+            <w:pPr>
+              <w:pStyle w:val="CONTTBFB"/>
+              <w:spacing w:after="0" w:line="240" w:lineRule="auto"/>
+              <w:jc w:val="center"/>
+            </w:pPr>
+            <w:r>
+              <w:rPr>
+                <w:sz w:val="18"/>
+                <w:szCs w:val="18"/>
+              </w:rPr>
+              <w:t xml:space="preserve">[0.764, 0.802]</w:t>
+            </w:r>
+          </w:p>
+        </w:tc>
+      </w:tr>
+      <w:tr>
+        <w:trPr>
+          <w:cantSplit/>
+        </w:trPr>
+        <w:tc>
+          <w:tcPr>
+            <w:tcW w:w="1685" w:type="dxa"/>
+            <w:tcBorders>
+              <w:bottom w:val="single" w:sz="4" w:space="0" w:color="auto"/>
+            </w:tcBorders>
+            <w:vAlign w:val="center"/>
+          </w:tcPr>
+          <w:p>
+            <w:pPr>
+              <w:pStyle w:val="CONTTBFB"/>
+              <w:spacing w:after="0" w:line="240" w:lineRule="auto"/>
+              <w:jc w:val="left"/>
+            </w:pPr>
+            <w:r>
+              <w:rPr>
+                <w:sz w:val="18"/>
+                <w:szCs w:val="18"/>
+              </w:rPr>
+              <w:t xml:space="preserve">CareER-GPT híbrido</w:t>
+            </w:r>
+          </w:p>
+        </w:tc>
+        <w:tc>
+          <w:tcPr>
+            <w:tcW w:w="1350" w:type="dxa"/>
+            <w:tcBorders>
+              <w:bottom w:val="single" w:sz="4" w:space="0" w:color="auto"/>
+            </w:tcBorders>
+            <w:vAlign w:val="center"/>
+          </w:tcPr>
+          <w:p>
+            <w:pPr>
+              <w:pStyle w:val="CONTTBFB"/>
+              <w:spacing w:after="0" w:line="240" w:lineRule="auto"/>
+              <w:jc w:val="center"/>
+            </w:pPr>
+            <w:r>
+              <w:rPr>
+                <w:sz w:val="18"/>
+                <w:szCs w:val="18"/>
+              </w:rPr>
+              <w:t xml:space="preserve">1.000</w:t>
+            </w:r>
+          </w:p>
+          <w:p>
+            <w:pPr>
+              <w:pStyle w:val="CONTTBFB"/>
+              <w:spacing w:after="0" w:line="240" w:lineRule="auto"/>
+              <w:jc w:val="center"/>
+            </w:pPr>
+            <w:r>
+              <w:rPr>
+                <w:sz w:val="18"/>
+                <w:szCs w:val="18"/>
+              </w:rPr>
+              <w:t xml:space="preserve">[1.000, 1.000]</w:t>
+            </w:r>
+          </w:p>
+        </w:tc>
+        <w:tc>
+          <w:tcPr>
+            <w:tcW w:w="1350" w:type="dxa"/>
+            <w:tcBorders>
+              <w:bottom w:val="single" w:sz="4" w:space="0" w:color="auto"/>
+            </w:tcBorders>
+            <w:vAlign w:val="center"/>
+          </w:tcPr>
+          <w:p>
+            <w:pPr>
+              <w:pStyle w:val="CONTTBFB"/>
+              <w:spacing w:after="0" w:line="240" w:lineRule="auto"/>
+              <w:jc w:val="center"/>
+            </w:pPr>
+            <w:r>
+              <w:rPr>
+                <w:sz w:val="18"/>
+                <w:szCs w:val="18"/>
+              </w:rPr>
+              <w:t xml:space="preserve">1.000</w:t>
+            </w:r>
+          </w:p>
+          <w:p>
+            <w:pPr>
+              <w:pStyle w:val="CONTTBFB"/>
+              <w:spacing w:after="0" w:line="240" w:lineRule="auto"/>
+              <w:jc w:val="center"/>
+            </w:pPr>
+            <w:r>
+              <w:rPr>
+                <w:sz w:val="18"/>
+                <w:szCs w:val="18"/>
+              </w:rPr>
+              <w:t xml:space="preserve">[1.000, 1.000]</w:t>
+            </w:r>
+          </w:p>
+        </w:tc>
+        <w:tc>
+          <w:tcPr>
+            <w:tcW w:w="1350" w:type="dxa"/>
+            <w:tcBorders>
+              <w:bottom w:val="single" w:sz="4" w:space="0" w:color="auto"/>
+            </w:tcBorders>
+            <w:vAlign w:val="center"/>
+          </w:tcPr>
+          <w:p>
+            <w:pPr>
+              <w:pStyle w:val="CONTTBFB"/>
+              <w:spacing w:after="0" w:line="240" w:lineRule="auto"/>
+              <w:jc w:val="center"/>
+            </w:pPr>
+            <w:r>
+              <w:rPr>
+                <w:sz w:val="18"/>
+                <w:szCs w:val="18"/>
+              </w:rPr>
+              <w:t xml:space="preserve">1.000</w:t>
+            </w:r>
+          </w:p>
+          <w:p>
+            <w:pPr>
+              <w:pStyle w:val="CONTTBFB"/>
+              <w:spacing w:after="0" w:line="240" w:lineRule="auto"/>
+              <w:jc w:val="center"/>
+            </w:pPr>
+            <w:r>
+              <w:rPr>
+                <w:sz w:val="18"/>
+                <w:szCs w:val="18"/>
+              </w:rPr>
+              <w:t xml:space="preserve">[1.000, 1.000]</w:t>
+            </w:r>
+          </w:p>
+        </w:tc>
+        <w:tc>
+          <w:tcPr>
+            <w:tcW w:w="1350" w:type="dxa"/>
+            <w:tcBorders>
+              <w:bottom w:val="single" w:sz="4" w:space="0" w:color="auto"/>
+            </w:tcBorders>
+            <w:vAlign w:val="center"/>
+          </w:tcPr>
+          <w:p>
+            <w:pPr>
+              <w:pStyle w:val="CONTTBFB"/>
+              <w:spacing w:after="0" w:line="240" w:lineRule="auto"/>
+              <w:jc w:val="center"/>
+            </w:pPr>
+            <w:r>
+              <w:rPr>
+                <w:sz w:val="18"/>
+                <w:szCs w:val="18"/>
+              </w:rPr>
+              <w:t xml:space="preserve">1.000</w:t>
+            </w:r>
+          </w:p>
+          <w:p>
+            <w:pPr>
+              <w:pStyle w:val="CONTTBFB"/>
+              <w:spacing w:after="0" w:line="240" w:lineRule="auto"/>
+              <w:jc w:val="center"/>
+            </w:pPr>
+            <w:r>
+              <w:rPr>
+                <w:sz w:val="18"/>
+                <w:szCs w:val="18"/>
+              </w:rPr>
+              <w:t xml:space="preserve">[1.000, 1.000]</w:t>
+            </w:r>
+          </w:p>
+        </w:tc>
+      </w:tr>
+    </w:tbl>
+    <w:p>
+      <w:pPr>
+        <w:pStyle w:val="NotasL4L5"/>
+      </w:pPr>
+      <w:r>
+        <w:rPr>
+          <w:i/>
+        </w:rPr>
+        <w:t xml:space="preserve">Nota.</w:t>
+      </w:r>
+      <w:r>
+        <w:t xml:space="preserve"> Media e intervalo de confianza al 95 % entre corchetes, estimado mediante 1 000 remuestreos bootstrap, sobre 300 pares de la partición de prueba. La métrica combinada es el promedio de ROUGE-L, BERTScore F1 y coherencia.</w:t>
       </w:r>
     </w:p>
     <w:p>
@@ -19519,7 +21150,581 @@
         <w:pStyle w:val="NORML4L5"/>
       </w:pPr>
       <w:r>
-        <w:t xml:space="preserve">Contraste parcial de la hipótesis específica 4. En la dimensión del rankeo, el componente tabular no superó a la referencia por popularidad, por lo que en esta dimensión no se verifica la mejora planteada. El contraste definitivo requiere la comparación de las rutas generadas.</w:t>
+        <w:t xml:space="preserve">La Tabla 18 presenta el contraste de la mejora. Las diferencias por par no siguieron una distribución normal según la prueba de Shapiro-Wilk (p &lt; .001), por lo que se aplicó la prueba de rangos con signo de Wilcoxon unilateral. La arquitectura híbrida superó al modelo base en 192.2 % y al modelo ajustado sin componente tabular en 27.7 %, en ambos casos con p &lt; .001 y un tamaño del efecto grande (r = 0.867).</w:t>
+      </w:r>
+    </w:p>
+    <w:p>
+      <w:pPr>
+        <w:pStyle w:val="TITTBFGL4L5"/>
+      </w:pPr>
+      <w:r>
+        <w:t xml:space="preserve">Tabla </w:t>
+      </w:r>
+      <w:fldSimple w:instr=" SEQ Tabla \* ARABIC ">
+        <w:r>
+          <w:rPr>
+            <w:noProof/>
+          </w:rPr>
+          <w:t>18</w:t>
+        </w:r>
+      </w:fldSimple>
+      <w:r>
+        <w:t xml:space="preserve"> </w:t>
+      </w:r>
+      <w:r>
+        <w:br/>
+      </w:r>
+      <w:r>
+        <w:rPr>
+          <w:b w:val="0"/>
+          <w:i/>
+        </w:rPr>
+        <w:t>Contraste de la mejora de la arquitectura híbrida frente a cada modelo individual</w:t>
+      </w:r>
+    </w:p>
+    <w:tbl>
+      <w:tblPr>
+        <w:tblStyle w:val="Tablaconcuadrcula"/>
+        <w:tblW w:w="7085" w:type="dxa"/>
+        <w:tblInd w:w="1418" w:type="dxa"/>
+        <w:tblBorders>
+          <w:top w:val="none" w:sz="0" w:space="0" w:color="auto"/>
+          <w:left w:val="none" w:sz="0" w:space="0" w:color="auto"/>
+          <w:bottom w:val="none" w:sz="0" w:space="0" w:color="auto"/>
+          <w:right w:val="none" w:sz="0" w:space="0" w:color="auto"/>
+          <w:insideH w:val="none" w:sz="0" w:space="0" w:color="auto"/>
+          <w:insideV w:val="none" w:sz="0" w:space="0" w:color="auto"/>
+        </w:tblBorders>
+        <w:tblLayout w:type="fixed"/>
+      </w:tblPr>
+      <w:tblGrid>
+        <w:gridCol w:w="2085"/>
+        <w:gridCol w:w="850"/>
+        <w:gridCol w:w="800"/>
+        <w:gridCol w:w="900"/>
+        <w:gridCol w:w="900"/>
+        <w:gridCol w:w="800"/>
+        <w:gridCol w:w="750"/>
+      </w:tblGrid>
+      <w:tr>
+        <w:trPr>
+          <w:tblHeader/>
+        </w:trPr>
+        <w:tc>
+          <w:tcPr>
+            <w:tcW w:w="2085" w:type="dxa"/>
+            <w:tcBorders>
+              <w:top w:val="single" w:sz="4" w:space="0" w:color="auto"/>
+              <w:bottom w:val="single" w:sz="4" w:space="0" w:color="auto"/>
+            </w:tcBorders>
+            <w:vAlign w:val="center"/>
+          </w:tcPr>
+          <w:p>
+            <w:pPr>
+              <w:pStyle w:val="CONTTBFB"/>
+              <w:spacing w:after="0" w:line="240" w:lineRule="auto"/>
+              <w:jc w:val="center"/>
+            </w:pPr>
+            <w:r>
+              <w:rPr>
+                <w:b/>
+                <w:sz w:val="18"/>
+                <w:szCs w:val="18"/>
+              </w:rPr>
+              <w:t xml:space="preserve">Comparación frente a</w:t>
+            </w:r>
+          </w:p>
+        </w:tc>
+        <w:tc>
+          <w:tcPr>
+            <w:tcW w:w="850" w:type="dxa"/>
+            <w:tcBorders>
+              <w:top w:val="single" w:sz="4" w:space="0" w:color="auto"/>
+              <w:bottom w:val="single" w:sz="4" w:space="0" w:color="auto"/>
+            </w:tcBorders>
+            <w:vAlign w:val="center"/>
+          </w:tcPr>
+          <w:p>
+            <w:pPr>
+              <w:pStyle w:val="CONTTBFB"/>
+              <w:spacing w:after="0" w:line="240" w:lineRule="auto"/>
+              <w:jc w:val="center"/>
+            </w:pPr>
+            <w:r>
+              <w:rPr>
+                <w:b/>
+                <w:sz w:val="18"/>
+                <w:szCs w:val="18"/>
+              </w:rPr>
+              <w:t xml:space="preserve">Híbrido</w:t>
+            </w:r>
+          </w:p>
+        </w:tc>
+        <w:tc>
+          <w:tcPr>
+            <w:tcW w:w="800" w:type="dxa"/>
+            <w:tcBorders>
+              <w:top w:val="single" w:sz="4" w:space="0" w:color="auto"/>
+              <w:bottom w:val="single" w:sz="4" w:space="0" w:color="auto"/>
+            </w:tcBorders>
+            <w:vAlign w:val="center"/>
+          </w:tcPr>
+          <w:p>
+            <w:pPr>
+              <w:pStyle w:val="CONTTBFB"/>
+              <w:spacing w:after="0" w:line="240" w:lineRule="auto"/>
+              <w:jc w:val="center"/>
+            </w:pPr>
+            <w:r>
+              <w:rPr>
+                <w:b/>
+                <w:sz w:val="18"/>
+                <w:szCs w:val="18"/>
+              </w:rPr>
+              <w:t xml:space="preserve">Rival</w:t>
+            </w:r>
+          </w:p>
+        </w:tc>
+        <w:tc>
+          <w:tcPr>
+            <w:tcW w:w="900" w:type="dxa"/>
+            <w:tcBorders>
+              <w:top w:val="single" w:sz="4" w:space="0" w:color="auto"/>
+              <w:bottom w:val="single" w:sz="4" w:space="0" w:color="auto"/>
+            </w:tcBorders>
+            <w:vAlign w:val="center"/>
+          </w:tcPr>
+          <w:p>
+            <w:pPr>
+              <w:pStyle w:val="CONTTBFB"/>
+              <w:spacing w:after="0" w:line="240" w:lineRule="auto"/>
+              <w:jc w:val="center"/>
+            </w:pPr>
+            <w:r>
+              <w:rPr>
+                <w:b/>
+                <w:sz w:val="18"/>
+                <w:szCs w:val="18"/>
+              </w:rPr>
+              <w:t xml:space="preserve">Mejora (%)</w:t>
+            </w:r>
+          </w:p>
+        </w:tc>
+        <w:tc>
+          <w:tcPr>
+            <w:tcW w:w="900" w:type="dxa"/>
+            <w:tcBorders>
+              <w:top w:val="single" w:sz="4" w:space="0" w:color="auto"/>
+              <w:bottom w:val="single" w:sz="4" w:space="0" w:color="auto"/>
+            </w:tcBorders>
+            <w:vAlign w:val="center"/>
+          </w:tcPr>
+          <w:p>
+            <w:pPr>
+              <w:pStyle w:val="CONTTBFB"/>
+              <w:spacing w:after="0" w:line="240" w:lineRule="auto"/>
+              <w:jc w:val="center"/>
+            </w:pPr>
+            <w:r>
+              <w:rPr>
+                <w:b/>
+                <w:sz w:val="18"/>
+                <w:szCs w:val="18"/>
+              </w:rPr>
+              <w:t xml:space="preserve">W</w:t>
+            </w:r>
+          </w:p>
+        </w:tc>
+        <w:tc>
+          <w:tcPr>
+            <w:tcW w:w="800" w:type="dxa"/>
+            <w:tcBorders>
+              <w:top w:val="single" w:sz="4" w:space="0" w:color="auto"/>
+              <w:bottom w:val="single" w:sz="4" w:space="0" w:color="auto"/>
+            </w:tcBorders>
+            <w:vAlign w:val="center"/>
+          </w:tcPr>
+          <w:p>
+            <w:pPr>
+              <w:pStyle w:val="CONTTBFB"/>
+              <w:spacing w:after="0" w:line="240" w:lineRule="auto"/>
+              <w:jc w:val="center"/>
+            </w:pPr>
+            <w:r>
+              <w:rPr>
+                <w:b/>
+                <w:sz w:val="18"/>
+                <w:szCs w:val="18"/>
+              </w:rPr>
+              <w:t xml:space="preserve">p</w:t>
+            </w:r>
+          </w:p>
+        </w:tc>
+        <w:tc>
+          <w:tcPr>
+            <w:tcW w:w="750" w:type="dxa"/>
+            <w:tcBorders>
+              <w:top w:val="single" w:sz="4" w:space="0" w:color="auto"/>
+              <w:bottom w:val="single" w:sz="4" w:space="0" w:color="auto"/>
+            </w:tcBorders>
+            <w:vAlign w:val="center"/>
+          </w:tcPr>
+          <w:p>
+            <w:pPr>
+              <w:pStyle w:val="CONTTBFB"/>
+              <w:spacing w:after="0" w:line="240" w:lineRule="auto"/>
+              <w:jc w:val="center"/>
+            </w:pPr>
+            <w:r>
+              <w:rPr>
+                <w:b/>
+                <w:sz w:val="18"/>
+                <w:szCs w:val="18"/>
+              </w:rPr>
+              <w:t xml:space="preserve">r</w:t>
+            </w:r>
+          </w:p>
+        </w:tc>
+      </w:tr>
+      <w:tr>
+        <w:trPr>
+          <w:cantSplit/>
+        </w:trPr>
+        <w:tc>
+          <w:tcPr>
+            <w:tcW w:w="2085" w:type="dxa"/>
+            <w:tcBorders/>
+            <w:vAlign w:val="center"/>
+          </w:tcPr>
+          <w:p>
+            <w:pPr>
+              <w:pStyle w:val="CONTTBFB"/>
+              <w:spacing w:after="0" w:line="240" w:lineRule="auto"/>
+              <w:jc w:val="left"/>
+            </w:pPr>
+            <w:r>
+              <w:rPr>
+                <w:sz w:val="18"/>
+                <w:szCs w:val="18"/>
+              </w:rPr>
+              <w:t xml:space="preserve">LLM base sin ajuste</w:t>
+            </w:r>
+          </w:p>
+        </w:tc>
+        <w:tc>
+          <w:tcPr>
+            <w:tcW w:w="850" w:type="dxa"/>
+            <w:tcBorders/>
+            <w:vAlign w:val="center"/>
+          </w:tcPr>
+          <w:p>
+            <w:pPr>
+              <w:pStyle w:val="CONTTBFB"/>
+              <w:spacing w:after="0" w:line="240" w:lineRule="auto"/>
+              <w:jc w:val="center"/>
+            </w:pPr>
+            <w:r>
+              <w:rPr>
+                <w:sz w:val="18"/>
+                <w:szCs w:val="18"/>
+              </w:rPr>
+              <w:t xml:space="preserve">1.000</w:t>
+            </w:r>
+          </w:p>
+        </w:tc>
+        <w:tc>
+          <w:tcPr>
+            <w:tcW w:w="800" w:type="dxa"/>
+            <w:tcBorders/>
+            <w:vAlign w:val="center"/>
+          </w:tcPr>
+          <w:p>
+            <w:pPr>
+              <w:pStyle w:val="CONTTBFB"/>
+              <w:spacing w:after="0" w:line="240" w:lineRule="auto"/>
+              <w:jc w:val="center"/>
+            </w:pPr>
+            <w:r>
+              <w:rPr>
+                <w:sz w:val="18"/>
+                <w:szCs w:val="18"/>
+              </w:rPr>
+              <w:t xml:space="preserve">0.342</w:t>
+            </w:r>
+          </w:p>
+        </w:tc>
+        <w:tc>
+          <w:tcPr>
+            <w:tcW w:w="900" w:type="dxa"/>
+            <w:tcBorders/>
+            <w:vAlign w:val="center"/>
+          </w:tcPr>
+          <w:p>
+            <w:pPr>
+              <w:pStyle w:val="CONTTBFB"/>
+              <w:spacing w:after="0" w:line="240" w:lineRule="auto"/>
+              <w:jc w:val="center"/>
+            </w:pPr>
+            <w:r>
+              <w:rPr>
+                <w:sz w:val="18"/>
+                <w:szCs w:val="18"/>
+              </w:rPr>
+              <w:t xml:space="preserve">192.2</w:t>
+            </w:r>
+          </w:p>
+        </w:tc>
+        <w:tc>
+          <w:tcPr>
+            <w:tcW w:w="900" w:type="dxa"/>
+            <w:tcBorders/>
+            <w:vAlign w:val="center"/>
+          </w:tcPr>
+          <w:p>
+            <w:pPr>
+              <w:pStyle w:val="CONTTBFB"/>
+              <w:spacing w:after="0" w:line="240" w:lineRule="auto"/>
+              <w:jc w:val="center"/>
+            </w:pPr>
+            <w:r>
+              <w:rPr>
+                <w:sz w:val="18"/>
+                <w:szCs w:val="18"/>
+              </w:rPr>
+              <w:t xml:space="preserve">45 150</w:t>
+            </w:r>
+          </w:p>
+        </w:tc>
+        <w:tc>
+          <w:tcPr>
+            <w:tcW w:w="800" w:type="dxa"/>
+            <w:tcBorders/>
+            <w:vAlign w:val="center"/>
+          </w:tcPr>
+          <w:p>
+            <w:pPr>
+              <w:pStyle w:val="CONTTBFB"/>
+              <w:spacing w:after="0" w:line="240" w:lineRule="auto"/>
+              <w:jc w:val="center"/>
+            </w:pPr>
+            <w:r>
+              <w:rPr>
+                <w:sz w:val="18"/>
+                <w:szCs w:val="18"/>
+              </w:rPr>
+              <w:t xml:space="preserve">&lt; .001</w:t>
+            </w:r>
+          </w:p>
+        </w:tc>
+        <w:tc>
+          <w:tcPr>
+            <w:tcW w:w="750" w:type="dxa"/>
+            <w:tcBorders/>
+            <w:vAlign w:val="center"/>
+          </w:tcPr>
+          <w:p>
+            <w:pPr>
+              <w:pStyle w:val="CONTTBFB"/>
+              <w:spacing w:after="0" w:line="240" w:lineRule="auto"/>
+              <w:jc w:val="center"/>
+            </w:pPr>
+            <w:r>
+              <w:rPr>
+                <w:sz w:val="18"/>
+                <w:szCs w:val="18"/>
+              </w:rPr>
+              <w:t xml:space="preserve">0.867</w:t>
+            </w:r>
+          </w:p>
+        </w:tc>
+      </w:tr>
+      <w:tr>
+        <w:trPr>
+          <w:cantSplit/>
+        </w:trPr>
+        <w:tc>
+          <w:tcPr>
+            <w:tcW w:w="2085" w:type="dxa"/>
+            <w:tcBorders>
+              <w:bottom w:val="single" w:sz="4" w:space="0" w:color="auto"/>
+            </w:tcBorders>
+            <w:vAlign w:val="center"/>
+          </w:tcPr>
+          <w:p>
+            <w:pPr>
+              <w:pStyle w:val="CONTTBFB"/>
+              <w:spacing w:after="0" w:line="240" w:lineRule="auto"/>
+              <w:jc w:val="left"/>
+            </w:pPr>
+            <w:r>
+              <w:rPr>
+                <w:sz w:val="18"/>
+                <w:szCs w:val="18"/>
+              </w:rPr>
+              <w:t xml:space="preserve">LLM con LoRA sin componente tabular</w:t>
+            </w:r>
+          </w:p>
+        </w:tc>
+        <w:tc>
+          <w:tcPr>
+            <w:tcW w:w="850" w:type="dxa"/>
+            <w:tcBorders>
+              <w:bottom w:val="single" w:sz="4" w:space="0" w:color="auto"/>
+            </w:tcBorders>
+            <w:vAlign w:val="center"/>
+          </w:tcPr>
+          <w:p>
+            <w:pPr>
+              <w:pStyle w:val="CONTTBFB"/>
+              <w:spacing w:after="0" w:line="240" w:lineRule="auto"/>
+              <w:jc w:val="center"/>
+            </w:pPr>
+            <w:r>
+              <w:rPr>
+                <w:sz w:val="18"/>
+                <w:szCs w:val="18"/>
+              </w:rPr>
+              <w:t xml:space="preserve">1.000</w:t>
+            </w:r>
+          </w:p>
+        </w:tc>
+        <w:tc>
+          <w:tcPr>
+            <w:tcW w:w="800" w:type="dxa"/>
+            <w:tcBorders>
+              <w:bottom w:val="single" w:sz="4" w:space="0" w:color="auto"/>
+            </w:tcBorders>
+            <w:vAlign w:val="center"/>
+          </w:tcPr>
+          <w:p>
+            <w:pPr>
+              <w:pStyle w:val="CONTTBFB"/>
+              <w:spacing w:after="0" w:line="240" w:lineRule="auto"/>
+              <w:jc w:val="center"/>
+            </w:pPr>
+            <w:r>
+              <w:rPr>
+                <w:sz w:val="18"/>
+                <w:szCs w:val="18"/>
+              </w:rPr>
+              <w:t xml:space="preserve">0.783</w:t>
+            </w:r>
+          </w:p>
+        </w:tc>
+        <w:tc>
+          <w:tcPr>
+            <w:tcW w:w="900" w:type="dxa"/>
+            <w:tcBorders>
+              <w:bottom w:val="single" w:sz="4" w:space="0" w:color="auto"/>
+            </w:tcBorders>
+            <w:vAlign w:val="center"/>
+          </w:tcPr>
+          <w:p>
+            <w:pPr>
+              <w:pStyle w:val="CONTTBFB"/>
+              <w:spacing w:after="0" w:line="240" w:lineRule="auto"/>
+              <w:jc w:val="center"/>
+            </w:pPr>
+            <w:r>
+              <w:rPr>
+                <w:sz w:val="18"/>
+                <w:szCs w:val="18"/>
+              </w:rPr>
+              <w:t xml:space="preserve">27.7</w:t>
+            </w:r>
+          </w:p>
+        </w:tc>
+        <w:tc>
+          <w:tcPr>
+            <w:tcW w:w="900" w:type="dxa"/>
+            <w:tcBorders>
+              <w:bottom w:val="single" w:sz="4" w:space="0" w:color="auto"/>
+            </w:tcBorders>
+            <w:vAlign w:val="center"/>
+          </w:tcPr>
+          <w:p>
+            <w:pPr>
+              <w:pStyle w:val="CONTTBFB"/>
+              <w:spacing w:after="0" w:line="240" w:lineRule="auto"/>
+              <w:jc w:val="center"/>
+            </w:pPr>
+            <w:r>
+              <w:rPr>
+                <w:sz w:val="18"/>
+                <w:szCs w:val="18"/>
+              </w:rPr>
+              <w:t xml:space="preserve">45 150</w:t>
+            </w:r>
+          </w:p>
+        </w:tc>
+        <w:tc>
+          <w:tcPr>
+            <w:tcW w:w="800" w:type="dxa"/>
+            <w:tcBorders>
+              <w:bottom w:val="single" w:sz="4" w:space="0" w:color="auto"/>
+            </w:tcBorders>
+            <w:vAlign w:val="center"/>
+          </w:tcPr>
+          <w:p>
+            <w:pPr>
+              <w:pStyle w:val="CONTTBFB"/>
+              <w:spacing w:after="0" w:line="240" w:lineRule="auto"/>
+              <w:jc w:val="center"/>
+            </w:pPr>
+            <w:r>
+              <w:rPr>
+                <w:sz w:val="18"/>
+                <w:szCs w:val="18"/>
+              </w:rPr>
+              <w:t xml:space="preserve">&lt; .001</w:t>
+            </w:r>
+          </w:p>
+        </w:tc>
+        <w:tc>
+          <w:tcPr>
+            <w:tcW w:w="750" w:type="dxa"/>
+            <w:tcBorders>
+              <w:bottom w:val="single" w:sz="4" w:space="0" w:color="auto"/>
+            </w:tcBorders>
+            <w:vAlign w:val="center"/>
+          </w:tcPr>
+          <w:p>
+            <w:pPr>
+              <w:pStyle w:val="CONTTBFB"/>
+              <w:spacing w:after="0" w:line="240" w:lineRule="auto"/>
+              <w:jc w:val="center"/>
+            </w:pPr>
+            <w:r>
+              <w:rPr>
+                <w:sz w:val="18"/>
+                <w:szCs w:val="18"/>
+              </w:rPr>
+              <w:t xml:space="preserve">0.867</w:t>
+            </w:r>
+          </w:p>
+        </w:tc>
+      </w:tr>
+    </w:tbl>
+    <w:p>
+      <w:pPr>
+        <w:pStyle w:val="NotasL4L5"/>
+      </w:pPr>
+      <w:r>
+        <w:rPr>
+          <w:i/>
+        </w:rPr>
+        <w:t xml:space="preserve">Nota.</w:t>
+      </w:r>
+      <w:r>
+        <w:t xml:space="preserve"> Valores medios de la métrica combinada sobre 300 pares. Prueba de rangos con signo de Wilcoxon unilateral para muestras relacionadas, aplicada porque las diferencias no siguieron una distribución normal según la prueba de Shapiro-Wilk (p &lt; .001). r: tamaño del efecto calculado como z dividido entre la raíz cuadrada de n.</w:t>
+      </w:r>
+    </w:p>
+    <w:p>
+      <w:pPr>
+        <w:pStyle w:val="NORML4L5"/>
+      </w:pPr>
+      <w:r>
+        <w:t xml:space="preserve">Contraste de la hipótesis específica 4. En la calidad de las rutas generadas, la arquitectura híbrida superó a cada modelo individual en más del 10 % con diferencias estadísticamente significativas, por lo que se acepta la hipótesis específica 4 en esta dimensión. En la dimensión del rankeo, el ordenamiento que la arquitectura entrega es el del componente tabular, que no superó a la referencia por popularidad; por ello, la ventaja de la integración radica en traducir el ranking a una ruta comprensible y fiel a las probabilidades, y no en mejorar el orden de los programas.</w:t>
       </w:r>
     </w:p>
     <w:p>
@@ -19604,7 +21809,31 @@
         <w:pStyle w:val="NORML12"/>
       </w:pPr>
       <w:r>
-        <w:t xml:space="preserve">Respecto al corpus, la estrategia de traducir variables numéricas a descriptores verbales y construir respuestas de referencia a partir del rankeo sigue la lógica de Armando et al. (2023), que destacaron la calidad del corpus como factor clave del ajuste con LoRA, y de Mena (2023) y Dettmers et al. (2023), que mostraron la viabilidad del ajuste cuantizado con recursos limitados. [Completar la discusión de los objetivos específicos 3 y 4 con los resultados del ajuste y de la integración, contrastándolos con Hu et al. (2021), Mena (2023), Millan (2025) y Martínez Sixto et al. (2025).]</w:t>
+        <w:t xml:space="preserve">Respecto al corpus, la estrategia de traducir variables numéricas a descriptores verbales y construir respuestas de referencia a partir del rankeo sigue la lógica de Armando et al. (2023), que destacaron la calidad del corpus como factor clave del ajuste con LoRA, y de Mena (2023) y Dettmers et al. (2023), que mostraron la viabilidad del ajuste cuantizado con recursos limitados.</w:t>
+      </w:r>
+    </w:p>
+    <w:p>
+      <w:pPr>
+        <w:pStyle w:val="NORML12"/>
+      </w:pPr>
+      <w:r>
+        <w:t xml:space="preserve">El ajuste con LoRA entrenó cerca del 0.3 % de los parámetros de un modelo de 1 500 millones y, en 35 minutos de una GPU Tesla T4, bastó para que el modelo aprendiera a redactar rutas fieles al ranking. Este resultado concuerda con Hu et al. (2021), quienes mostraron que la adaptación de bajo rango es competitiva frente al ajuste fino tradicional con una fracción del costo computacional, y con Dettmers et al. (2023), para quienes la cuantización en 4 bits no degrada el ajuste. A diferencia de Mena (2023), que identificó la memoria de video como una limitación importante al ajustar modelos de 7 mil millones de parámetros, el uso de un modelo de 1 500 millones permitió entrenar en infraestructura gratuita, lo que favorece la replicación en universidades con recursos limitados.</w:t>
+      </w:r>
+    </w:p>
+    <w:p>
+      <w:pPr>
+        <w:pStyle w:val="NORML12"/>
+      </w:pPr>
+      <w:r>
+        <w:t xml:space="preserve">La comparación entre condiciones muestra que el aporte del componente tabular no está en la forma del texto, que el modelo aprendió aun sin probabilidades, con un ROUGE-L de 0.852, sino en su contenido: sin el ranking, la coherencia descendió a 0.540, y con él alcanzó 1.000. Este hallazgo coincide con Martínez Sixto et al. (2025), quienes encontraron que la efectividad de un modelo de lenguaje depende en gran medida de la calidad y relevancia del contexto que recibe, y respalda lo planteado por Millan (2025) sobre la ventaja de los enfoques híbridos. En cambio, matiza lo señalado por Castejon (2025), para quien una ingeniería de instrucciones adecuada elimina las alucinaciones: el modelo base recibió la misma instrucción con el ranking y, aun así, generó textos extensos que no respetaron el orden de los programas, lo que indica que en esta tarea la instrucción por sí sola no bastó y fue necesario el ajuste fino.</w:t>
+      </w:r>
+    </w:p>
+    <w:p>
+      <w:pPr>
+        <w:pStyle w:val="NORML12"/>
+      </w:pPr>
+      <w:r>
+        <w:t xml:space="preserve">Los valores máximos de la arquitectura híbrida, con el 100.0 % de rutas idénticas a la referencia, deben interpretarse con cautela. Las respuestas de referencia se construyeron con una estructura fija a partir del ranking, por lo que el resultado demuestra que el modelo traslada con exactitud la información del componente tabular, pero no mide la calidad pedagógica de la orientación ni su utilidad percibida por los postulantes. Esta es la principal limitación del componente lingüístico y justifica validar las rutas con especialistas en orientación vocacional y con los propios postulantes, y ampliar el corpus con respuestas redactadas por orientadores, en línea con Armando et al. (2023), que destacaron la calidad del corpus como factor clave.</w:t>
       </w:r>
     </w:p>
     <w:p>
@@ -19690,7 +21919,7 @@
         <w:pStyle w:val="CONCLUT1"/>
       </w:pPr>
       <w:r>
-        <w:t xml:space="preserve">[Pendiente de la ejecución del ajuste con LoRA: conclusión del objetivo específico 3 y decisión sobre la hipótesis específica 3.]</w:t>
+        <w:t xml:space="preserve">El ajuste fino con LoRA, que entrenó cerca del 0.3 % de los parámetros del modelo Qwen2.5-1.5B-Instruct, permitió generar rutas educativas con una coherencia contextual de 1.000, superior al umbral de 0.80 (prueba binomial exacta, p &lt; .001), con un ROUGE-L de 1.000 y un BERTScore F1 de 1.000, por lo que se acepta la hipótesis específica 3. La coherencia depende de que el modelo reciba el ranking del componente tabular: sin él, descendió a 0.540.</w:t>
       </w:r>
     </w:p>
     <w:p>
@@ -19698,7 +21927,7 @@
         <w:pStyle w:val="CONCLUT1"/>
       </w:pPr>
       <w:r>
-        <w:t xml:space="preserve">En la validación comparativa, el componente de rankeo superó al orden aleatorio, con un MRR de 0.353 frente a 0.299, pero no al orden por popularidad del programa, que alcanzó 0.362, con el que resultó estadísticamente equivalente, sin generar brecha territorial. [Completar con la comparación de las rutas generadas y la decisión sobre la hipótesis específica 4.]</w:t>
+        <w:t xml:space="preserve">En la validación comparativa, el componente de rankeo superó al orden aleatorio, con un MRR de 0.353 frente a 0.299, pero no al orden por popularidad del programa, que alcanzó 0.362, con el que resultó estadísticamente equivalente, sin generar brecha territorial. En la calidad de las rutas, la arquitectura híbrida alcanzó una métrica combinada de 1.000 y superó en 192.2 % al modelo base y en 27.7 % al modelo ajustado sin componente tabular, con diferencias significativas (Wilcoxon, p &lt; .001), por lo que se acepta la hipótesis específica 4 en la dimensión de generación de rutas, mientras que en la dimensión del rankeo la mejora no se verifica.</w:t>
       </w:r>
     </w:p>
     <w:p>

</xml_diff>

<commit_message>
Completa la referencia de Escobar-Mamani y Cuentas Yupanqui (2024)
- Corrige la cita en el texto a Escobar-Mamani y Cuentas Yupanqui (2024),
  según el artículo publicado en Journal of Humanities Titicaca.
- El cuaderno de Colab usa el nombre real del archivo subido y verifica la
  huella del corpus vigente antes de entrenar.

Co-Authored-By: Claude Opus 5.5 <noreply@anthropic.com>
Claude-Session: https://claude.ai/code/session_01DtqH3frdJcwNPf5uAWNPX3
</commit_message>
<xml_diff>
--- a/Borrador_Tesis_CareER-GPT_EPG_UNA.docx
+++ b/Borrador_Tesis_CareER-GPT_EPG_UNA.docx
@@ -7325,7 +7325,7 @@
         <w:pStyle w:val="NORML12"/>
       </w:pPr>
       <w:r>
-        <w:t xml:space="preserve">En la región de Puno el panorama se intensifica por las desigualdades socioeconómicas y geográficas del Altiplano y por el limitado acceso a información vocacional personalizada. La deserción y el bajo rendimiento representan desafíos críticos para la Universidad Nacional del Altiplano (Cuentas Yupanqui, 2024), institución en la que la inteligencia artificial ha mostrado potencial para mejorar el rendimiento académico (Rodriguez, 2023).</w:t>
+        <w:t xml:space="preserve">En la región de Puno el panorama se intensifica por las desigualdades socioeconómicas y geográficas del Altiplano y por el limitado acceso a información vocacional personalizada. La deserción y el bajo rendimiento representan desafíos críticos para la Universidad Nacional del Altiplano (Escobar-Mamani y Cuentas Yupanqui, 2024), institución en la que la inteligencia artificial ha mostrado potencial para mejorar el rendimiento académico (Rodriguez, 2023).</w:t>
       </w:r>
     </w:p>
     <w:p>
@@ -22141,7 +22141,7 @@
         <w:pStyle w:val="BIBLIOGRAFIA"/>
       </w:pPr>
       <w:r>
-        <w:t xml:space="preserve">Cuentas Yupanqui, [Completar iniciales]. (2024). [Completar referencia: título, fuente y enlace del estudio sobre deserción y rendimiento en la Universidad Nacional del Altiplano.]</w:t>
+        <w:t xml:space="preserve">Dettmers, T., Pagnoni, A., Holtzman, A., y Zettlemoyer, L. (2023). QLoRA: Efficient finetuning of quantized LLMs. En Advances in Neural Information Processing Systems 36. https://doi.org/10.48550/arXiv.2305.14314</w:t>
       </w:r>
     </w:p>
     <w:p>
@@ -22149,7 +22149,7 @@
         <w:pStyle w:val="BIBLIOGRAFIA"/>
       </w:pPr>
       <w:r>
-        <w:t xml:space="preserve">Dettmers, T., Pagnoni, A., Holtzman, A., y Zettlemoyer, L. (2023). QLoRA: Efficient finetuning of quantized LLMs. En Advances in Neural Information Processing Systems 36. https://doi.org/10.48550/arXiv.2305.14314</w:t>
+        <w:t xml:space="preserve">Escalante López, J. I., Medina Valderrama, C. J., y Vásquez Muñoz, A. (2023). La deserción universitaria: un problema no resuelto en el Perú. Hacedor - AIAPÆC, 7(1), 60-72. https://doi.org/10.26495/rch.v7i1.2421</w:t>
       </w:r>
     </w:p>
     <w:p>
@@ -22157,7 +22157,7 @@
         <w:pStyle w:val="BIBLIOGRAFIA"/>
       </w:pPr>
       <w:r>
-        <w:t xml:space="preserve">Escalante López, J. I., Medina Valderrama, C. J., y Vásquez Muñoz, A. (2023). La deserción universitaria: un problema no resuelto en el Perú. Hacedor - AIAPÆC, 7(1), 60-72. https://doi.org/10.26495/rch.v7i1.2421</w:t>
+        <w:t xml:space="preserve">Escobar-Mamani, F., y Cuentas Yupanqui, S. R. (2024). Situación académica de estudiantes con matrícula regular y en riesgo académico en la Universidad Nacional del Altiplano, 2023-II. Journal of Humanities Titicaca, 2(1), 66-88. https://doi.org/10.70123/jht.7</w:t>
       </w:r>
     </w:p>
     <w:p>

</xml_diff>

<commit_message>
Actualiza los resultados del modelo de lenguaje con el corpus vigente
- Reemplaza resultados_llm.json, generaciones.csv y fig_perdida.png por la
  corrida de Colab que usó el CareER_Dataset.jsonl regenerado.
- Calcula el tamaño del efecto de Wilcoxon con el n efectivo, sin pares
  de diferencia nula.
- Ajusta la redacción de H3, conclusiones y discusión a la nueva
  coherencia del modelo sin componente tabular.
- Actualiza CLAUDE.md y retira la advertencia del corpus anterior.

Co-Authored-By: Claude Opus 5.5 <noreply@anthropic.com>
Claude-Session: https://claude.ai/code/session_01DtqH3frdJcwNPf5uAWNPX3
</commit_message>
<xml_diff>
--- a/Borrador_Tesis_CareER-GPT_EPG_UNA.docx
+++ b/Borrador_Tesis_CareER-GPT_EPG_UNA.docx
@@ -5697,7 +5697,7 @@
         <w:ind w:firstLine="0"/>
       </w:pPr>
       <w:r>
-        <w:t xml:space="preserve">La orientación vocacional en el Perú se apoya en instrumentos que no aprovechan el historial académico de los postulantes, lo que se asocia con elecciones de carrera poco informadas y con la deserción universitaria. El objetivo fue desarrollar y validar CareER-GPT, una arquitectura híbrida que combina un modelo tabular XGBoost, para rankear la probabilidad de ingreso por programa, con un modelo de lenguaje grande ajustado mediante LoRA, para generar rutas educativas personalizadas. El estudio fue cuantitativo, aplicado y de diseño preexperimental. Se integraron los registros de admisión de la Universidad Nacional del Altiplano de 2021-I a 2025-II con el historial de secundaria del SIAGIE, y se analizaron 42 156 postulaciones de 34 648 personas mediante validación cruzada agrupada por persona. El modelo tabular alcanzó un AUC-ROC de 0.754 (IC 95 %: 0.747 a 0.761) y un AUC-PR de 0.292, frente a una tasa base de 0.115; no alcanzó el umbral hipotético de 0.85. El promedio de quinto de secundaria, el equipamiento tecnológico del hogar y la preparación preuniversitaria fueron los predictores de mayor peso. Se identificó una brecha de 7.1 puntos en la tasa de falsos negativos en perjuicio de los postulantes de colegios rurales. En el rankeo de programas superó al azar, pero no a la ordenación por la tasa histórica de ingreso. El corpus de instrucción y respuesta reunió 34 648 pares balanceados entre particiones. El modelo de lenguaje ajustado con LoRA alcanzó una coherencia contextual de 1.000, superior al umbral de 0.80, y la arquitectura híbrida superó en 27.7 % al modelo ajustado sin componente tabular en la calidad de las rutas generadas (p &lt; .001). Se concluye que el componente tabular discrimina de manera moderada y que su uso orientador requiere controles de equidad territorial.</w:t>
+        <w:t xml:space="preserve">La orientación vocacional en el Perú se apoya en instrumentos que no aprovechan el historial académico de los postulantes, lo que se asocia con elecciones de carrera poco informadas y con la deserción universitaria. El objetivo fue desarrollar y validar CareER-GPT, una arquitectura híbrida que combina un modelo tabular XGBoost, para rankear la probabilidad de ingreso por programa, con un modelo de lenguaje grande ajustado mediante LoRA, para generar rutas educativas personalizadas. El estudio fue cuantitativo, aplicado y de diseño preexperimental. Se integraron los registros de admisión de la Universidad Nacional del Altiplano de 2021-I a 2025-II con el historial de secundaria del SIAGIE, y se analizaron 42 156 postulaciones de 34 648 personas mediante validación cruzada agrupada por persona. El modelo tabular alcanzó un AUC-ROC de 0.754 (IC 95 %: 0.747 a 0.761) y un AUC-PR de 0.292, frente a una tasa base de 0.115; no alcanzó el umbral hipotético de 0.85. El promedio de quinto de secundaria, el equipamiento tecnológico del hogar y la preparación preuniversitaria fueron los predictores de mayor peso. Se identificó una brecha de 7.1 puntos en la tasa de falsos negativos en perjuicio de los postulantes de colegios rurales. En el rankeo de programas superó al azar, pero no a la ordenación por la tasa histórica de ingreso. El corpus de instrucción y respuesta reunió 34 648 pares balanceados entre particiones. El modelo de lenguaje ajustado con LoRA alcanzó una coherencia contextual de 1.000, superior al umbral de 0.80, y la arquitectura híbrida superó en 12.4 % al modelo ajustado sin componente tabular en la calidad de las rutas generadas (p &lt; .001). Se concluye que el componente tabular discrimina de manera moderada y que su uso orientador requiere controles de equidad territorial.</w:t>
       </w:r>
     </w:p>
     <w:p>
@@ -5756,7 +5756,7 @@
         <w:ind w:firstLine="0"/>
       </w:pPr>
       <w:r>
-        <w:t xml:space="preserve">Vocational guidance in Peru relies on instruments that do not use applicants' academic records, which is associated with poorly informed career choices and university dropout. The aim was to develop and validate CareER-GPT, a hybrid architecture that combines an XGBoost tabular model, to rank the probability of admission by program, with a large language model fine-tuned through LoRA, to generate personalized educational pathways. The study was quantitative, applied and pre-experimental. Admission records of the Universidad Nacional del Altiplano from 2021-I to 2025-II were linked with secondary school records from SIAGIE, and 42,156 applications from 34,648 individuals were analyzed using person-grouped cross-validation. The tabular model reached an AUC-ROC of 0.754 (95% CI: 0.747 to 0.761) and an AUC-PR of 0.292, against a base rate of 0.115; it did not reach the hypothesized threshold of 0.85. The fifth-grade average, household technological equipment and pre-university preparation were the most influential predictors. A gap of 7.1 points in the false negative rate was found against applicants from rural schools. In program ranking it outperformed random ordering but not ordering by historical admission rate. The instruction-response corpus comprised 34,648 pairs balanced across partitions. The LoRA fine-tuned language model reached a contextual coherence of 1.000, above the 0.80 threshold, and the hybrid architecture outperformed the fine-tuned model without the tabular component by 27.7% in the quality of the generated pathways (p &lt; .001). The tabular component discriminates moderately, and its use for guidance requires territorial fairness controls.</w:t>
+        <w:t xml:space="preserve">Vocational guidance in Peru relies on instruments that do not use applicants' academic records, which is associated with poorly informed career choices and university dropout. The aim was to develop and validate CareER-GPT, a hybrid architecture that combines an XGBoost tabular model, to rank the probability of admission by program, with a large language model fine-tuned through LoRA, to generate personalized educational pathways. The study was quantitative, applied and pre-experimental. Admission records of the Universidad Nacional del Altiplano from 2021-I to 2025-II were linked with secondary school records from SIAGIE, and 42,156 applications from 34,648 individuals were analyzed using person-grouped cross-validation. The tabular model reached an AUC-ROC of 0.754 (95% CI: 0.747 to 0.761) and an AUC-PR of 0.292, against a base rate of 0.115; it did not reach the hypothesized threshold of 0.85. The fifth-grade average, household technological equipment and pre-university preparation were the most influential predictors. A gap of 7.1 points in the false negative rate was found against applicants from rural schools. In program ranking it outperformed random ordering but not ordering by historical admission rate. The instruction-response corpus comprised 34,648 pairs balanced across partitions. The LoRA fine-tuned language model reached a contextual coherence of 1.000, above the 0.80 threshold, and the hybrid architecture outperformed the fine-tuned model without the tabular component by 12.4% in the quality of the generated pathways (p &lt; .001). The tabular component discriminates moderately, and its use for guidance requires territorial fairness controls.</w:t>
       </w:r>
     </w:p>
     <w:p>
@@ -18259,7 +18259,7 @@
         <w:pStyle w:val="NORML4L5"/>
       </w:pPr>
       <w:r>
-        <w:t xml:space="preserve">El ajuste se ejecutó en una GPU Tesla T4 de Google Colab sobre 6 000 pares de la partición de entrenamiento, durante 1 época y 375 pasos de optimización. Los adaptadores LoRA sumaron 4 358 144 parámetros entrenables, cerca del 0.3 % del modelo, y el entrenamiento tomó 34.8 minutos en la condición híbrida y 28.5 minutos en la condición sin componente tabular. Como muestran la Tabla 13 y la Figura 6, en la condición híbrida la pérdida de validación descendió a 0.0001 al final del entrenamiento, mientras que en la condición sin componente tabular se estabilizó en 0.0660. La cercanía entre la pérdida de entrenamiento y la de validación en ambas condiciones indica que no hubo sobreajuste. La pérdida residual de la condición sin componente tabular corresponde a las probabilidades y programas que el modelo no puede inferir sin el ranking.</w:t>
+        <w:t xml:space="preserve">El ajuste se ejecutó en una GPU Tesla T4 de Google Colab sobre 6 000 pares de la partición de entrenamiento, durante 1 época y 375 pasos de optimización. Los adaptadores LoRA sumaron 4 358 144 parámetros entrenables, cerca del 0.3 % del modelo, y el entrenamiento tomó 33.6 minutos en la condición híbrida y 27.8 minutos en la condición sin componente tabular. Como muestran la Tabla 13 y la Figura 6, en la condición híbrida la pérdida de validación descendió a 0.0001 al final del entrenamiento, mientras que en la condición sin componente tabular se estabilizó en 0.0595. La cercanía entre la pérdida de entrenamiento y la de validación en ambas condiciones indica que no hubo sobreajuste. La pérdida residual de la condición sin componente tabular corresponde a las probabilidades y programas que el modelo no puede inferir sin el ranking.</w:t>
       </w:r>
     </w:p>
     <w:p>
@@ -18532,7 +18532,7 @@
                 <w:sz w:val="18"/>
                 <w:szCs w:val="18"/>
               </w:rPr>
-              <w:t xml:space="preserve">34.8</w:t>
+              <w:t xml:space="preserve">33.6</w:t>
             </w:r>
           </w:p>
         </w:tc>
@@ -18553,7 +18553,7 @@
                 <w:sz w:val="18"/>
                 <w:szCs w:val="18"/>
               </w:rPr>
-              <w:t xml:space="preserve">1.5398</w:t>
+              <w:t xml:space="preserve">1.5653</w:t>
             </w:r>
           </w:p>
         </w:tc>
@@ -18669,7 +18669,7 @@
                 <w:sz w:val="18"/>
                 <w:szCs w:val="18"/>
               </w:rPr>
-              <w:t xml:space="preserve">28.5</w:t>
+              <w:t xml:space="preserve">27.8</w:t>
             </w:r>
           </w:p>
         </w:tc>
@@ -18692,7 +18692,7 @@
                 <w:sz w:val="18"/>
                 <w:szCs w:val="18"/>
               </w:rPr>
-              <w:t xml:space="preserve">2.1349</w:t>
+              <w:t xml:space="preserve">2.1543</w:t>
             </w:r>
           </w:p>
         </w:tc>
@@ -18715,7 +18715,7 @@
                 <w:sz w:val="18"/>
                 <w:szCs w:val="18"/>
               </w:rPr>
-              <w:t xml:space="preserve">0.0649</w:t>
+              <w:t xml:space="preserve">0.0598</w:t>
             </w:r>
           </w:p>
         </w:tc>
@@ -18738,7 +18738,7 @@
                 <w:sz w:val="18"/>
                 <w:szCs w:val="18"/>
               </w:rPr>
-              <w:t xml:space="preserve">0.0660</w:t>
+              <w:t xml:space="preserve">0.0595</w:t>
             </w:r>
           </w:p>
         </w:tc>
@@ -19008,7 +19008,7 @@
                 <w:sz w:val="20"/>
                 <w:szCs w:val="20"/>
               </w:rPr>
-              <w:t xml:space="preserve">Ruta educativa sugerida. Primera opción recomendada: EDUCACIÓN SECUNDARIA DE LA ESPECIALIDAD DE MATEMÁTICA, FÍSICA, COMPUTACIÓN E INFORMÁTICA, con la mayor probabilidad estimada de ingreso (42.2 %). Alternativas: ARQUITECTURA Y URBANISMO (36.7 %) y INGENIERÍA AGRONÓMICA (36.7 %). Tu fortaleza en Comunicación es coherente con estas opciones. Para mejorar tus posibilidades, refuerza Ciencia y Tecnología antes del examen. Estas probabilidades son [...]</w:t>
+              <w:t xml:space="preserve">Ruta educativa sugerida. Primera opción recomendada: INGENIERÍA TOPOGRÁFICA Y AGRIMENSURA, con la mayor probabilidad estimada de ingreso (38.1 %). Alternativas: INGENIERÍA MECÁNICA ELÉCTRICA (38.1 %) y EDUCACIÓN SECUNDARIA DE LA ESPECIALIDAD DE MATEMÁTICA, FÍSICA, COMPUTACIÓN E INFORMÁTICA (36.0 %). Tu fortaleza en Comunicación es coherente con estas opciones. Para mejorar tus posibilidades, refuerza Ciencia y Tecnología antes del examen. Estas [...]</w:t>
             </w:r>
           </w:p>
         </w:tc>
@@ -19055,7 +19055,7 @@
                 <w:sz w:val="20"/>
                 <w:szCs w:val="20"/>
               </w:rPr>
-              <w:t xml:space="preserve">Basándome en el perfil y las probabilidades proporcionados, puedo generar una ruta educativa personalizada para que tu postulante pueda aprovechar al máximo sus posibilidades de ingresar a la carrera de Ingeniería en Computación e Informática. 1. Preparación Preuniversitaria: - Cepreuna Previa: Esta es una excelente base para comenzar su preparación universitaria. La CEPRENA es un programa de formación continua diseñado [...]</w:t>
+              <w:t xml:space="preserve">Basándome en el perfil y las probabilidades proporcionados, puedo generar una ruta educativa personalizada para que tu postulante pueda aprovechar al máximo sus habilidades y fortalezas. Aquí te presento algunas sugerencias: 1. Comenzar su educación universitaria: Siempre es importante comenzar con los estudios universitarios. Considerando tus probabilidades, podrías considerar dos carreras: Ingeniería Topográfica y Agrimensura o Ingeniería Mecánica Electrónica. 2. [...]</w:t>
             </w:r>
           </w:p>
         </w:tc>
@@ -19102,7 +19102,7 @@
                 <w:sz w:val="20"/>
                 <w:szCs w:val="20"/>
               </w:rPr>
-              <w:t xml:space="preserve">Ruta educativa sugerida. Primera opción recomendada: INGENIERÍA AGRONÓMICA, con la mayor probabilidad estimada de ingreso (17.6 %). Alternativas: INGENIERÍA GEOLÓGICA (15.2 %) y EDUCACIÓN SECUNDARIA DE LA ESPECIALIDAD DE MATEMÁTICA, FÍSICA, COMPUTACIÓN E INFORMÁTICA (13.2 %). Tu fortaleza en Comunicación es coherente con estas opciones. Para mejorar tus posibilidades, refuerza Ciencia y Tecnología antes del examen. Estas probabilidades son estimaciones [...]</w:t>
+              <w:t xml:space="preserve">Ruta educativa sugerida. Primera opción recomendada: INGENIERÍA AGRONÓMICA, con la mayor probabilidad estimada de ingreso (16.4 %). Alternativas: INGENIERÍA TOPOGRÁFICA Y AGRIMENSURA (16.2 %) y INGENIERÍA MECÁNICA ELÉCTRICA (13.8 %). Tu fortaleza en Comunicación es coherente con estas opciones. Para mejorar tus posibilidades, refuerza Ciencia y Tecnología antes del examen. Estas probabilidades son estimaciones orientativas basadas en postulantes con perfiles [...]</w:t>
             </w:r>
           </w:p>
         </w:tc>
@@ -19153,7 +19153,7 @@
                 <w:sz w:val="20"/>
                 <w:szCs w:val="20"/>
               </w:rPr>
-              <w:t xml:space="preserve">Ruta educativa sugerida. Primera opción recomendada: EDUCACIÓN SECUNDARIA DE LA ESPECIALIDAD DE MATEMÁTICA, FÍSICA, COMPUTACIÓN E INFORMÁTICA, con la mayor probabilidad estimada de ingreso (42.2 %). Alternativas: ARQUITECTURA Y URBANISMO (36.7 %) y INGENIERÍA AGRONÓMICA (36.7 %). Tu fortaleza en Comunicación es coherente con estas opciones. Para mejorar tus posibilidades, refuerza Ciencia y Tecnología antes del examen. Estas probabilidades son [...]</w:t>
+              <w:t xml:space="preserve">Ruta educativa sugerida. Primera opción recomendada: INGENIERÍA TOPOGRÁFICA Y AGRIMENSURA, con la mayor probabilidad estimada de ingreso (38.1 %). Alternativas: INGENIERÍA MECÁNICA ELÉCTRICA (38.1 %) y EDUCACIÓN SECUNDARIA DE LA ESPECIALIDAD DE MATEMÁTICA, FÍSICA, COMPUTACIÓN E INFORMÁTICA (36.0 %). Tu fortaleza en Comunicación es coherente con estas opciones. Para mejorar tus posibilidades, refuerza Ciencia y Tecnología antes del examen. Estas [...]</w:t>
             </w:r>
           </w:p>
         </w:tc>
@@ -19178,7 +19178,7 @@
         <w:pStyle w:val="NORML4L5"/>
       </w:pPr>
       <w:r>
-        <w:t xml:space="preserve">Contraste de la hipótesis específica 3. La coherencia contextual del modelo ajustado con LoRA en la arquitectura híbrida fue de 1.000, con 300 de 300 rutas coherentes, valor superior al umbral de 0.80 según la prueba binomial exacta unilateral (p &lt; .001). En consecuencia, se acepta la hipótesis específica 3. Cabe precisar que el modelo ajustado sin el componente tabular alcanzó una coherencia de 0.540, lo que muestra que la coherencia depende de que el modelo reciba el ranking.</w:t>
+        <w:t xml:space="preserve">Contraste de la hipótesis específica 3. La coherencia contextual del modelo ajustado con LoRA en la arquitectura híbrida fue de 1.000, con 300 de 300 rutas coherentes, valor superior al umbral de 0.80 según la prueba binomial exacta unilateral (p &lt; .001). En consecuencia, se acepta la hipótesis específica 3. Cabe precisar que el modelo ajustado sin el componente tabular alcanzó una coherencia de 0.813; la diferencia con la arquitectura híbrida corresponde al aporte del ranking.</w:t>
       </w:r>
     </w:p>
     <w:p>
@@ -20438,7 +20438,7 @@
         <w:pStyle w:val="NORML4L5"/>
       </w:pPr>
       <w:r>
-        <w:t xml:space="preserve">La Tabla 17 compara las tres condiciones sobre los mismos 300 pares de prueba. El modelo base sin ajuste obtuvo una métrica combinada de 0.342: generó textos extensos, con formato propio y sin respetar el orden del ranking, con una coherencia de 0.253. El modelo ajustado sin el componente tabular alcanzó 0.783; reprodujo la estructura de la ruta, con un ROUGE-L de 0.852, cercano al de 0.836 que comparten referencias de personas distintas, pero al no conocer las probabilidades recomendó un programa distinto o en otro orden en el 46.0 % de los casos. La arquitectura híbrida alcanzó 1.000, con intervalos de confianza que no se superponen con los de las otras condiciones.</w:t>
+        <w:t xml:space="preserve">La Tabla 17 compara las tres condiciones sobre los mismos 300 pares de prueba. El modelo base sin ajuste obtuvo una métrica combinada de 0.336: generó textos extensos, con formato propio y sin respetar el orden del ranking, con una coherencia de 0.233. El modelo ajustado sin el componente tabular alcanzó 0.890; reprodujo la estructura de la ruta, con un ROUGE-L de 0.877, cercano al de 0.836 que comparten referencias de personas distintas, pero al no conocer las probabilidades recomendó un programa distinto o en otro orden en el 18.7 % de los casos. La arquitectura híbrida alcanzó 1.000, con intervalos de confianza que no se superponen con los de las otras condiciones.</w:t>
       </w:r>
     </w:p>
     <w:p>
@@ -20664,7 +20664,7 @@
                 <w:sz w:val="18"/>
                 <w:szCs w:val="18"/>
               </w:rPr>
-              <w:t xml:space="preserve">0.143</w:t>
+              <w:t xml:space="preserve">0.142</w:t>
             </w:r>
           </w:p>
           <w:p>
@@ -20699,21 +20699,21 @@
                 <w:sz w:val="18"/>
                 <w:szCs w:val="18"/>
               </w:rPr>
-              <w:t xml:space="preserve">0.631</w:t>
-            </w:r>
-          </w:p>
-          <w:p>
-            <w:pPr>
-              <w:pStyle w:val="CONTTBFB"/>
-              <w:spacing w:after="0" w:line="240" w:lineRule="auto"/>
-              <w:jc w:val="center"/>
-            </w:pPr>
-            <w:r>
-              <w:rPr>
-                <w:sz w:val="18"/>
-                <w:szCs w:val="18"/>
-              </w:rPr>
-              <w:t xml:space="preserve">[0.629, 0.632]</w:t>
+              <w:t xml:space="preserve">0.632</w:t>
+            </w:r>
+          </w:p>
+          <w:p>
+            <w:pPr>
+              <w:pStyle w:val="CONTTBFB"/>
+              <w:spacing w:after="0" w:line="240" w:lineRule="auto"/>
+              <w:jc w:val="center"/>
+            </w:pPr>
+            <w:r>
+              <w:rPr>
+                <w:sz w:val="18"/>
+                <w:szCs w:val="18"/>
+              </w:rPr>
+              <w:t xml:space="preserve">[0.630, 0.633]</w:t>
             </w:r>
           </w:p>
         </w:tc>
@@ -20734,21 +20734,21 @@
                 <w:sz w:val="18"/>
                 <w:szCs w:val="18"/>
               </w:rPr>
-              <w:t xml:space="preserve">0.253</w:t>
-            </w:r>
-          </w:p>
-          <w:p>
-            <w:pPr>
-              <w:pStyle w:val="CONTTBFB"/>
-              <w:spacing w:after="0" w:line="240" w:lineRule="auto"/>
-              <w:jc w:val="center"/>
-            </w:pPr>
-            <w:r>
-              <w:rPr>
-                <w:sz w:val="18"/>
-                <w:szCs w:val="18"/>
-              </w:rPr>
-              <w:t xml:space="preserve">[0.207, 0.303]</w:t>
+              <w:t xml:space="preserve">0.233</w:t>
+            </w:r>
+          </w:p>
+          <w:p>
+            <w:pPr>
+              <w:pStyle w:val="CONTTBFB"/>
+              <w:spacing w:after="0" w:line="240" w:lineRule="auto"/>
+              <w:jc w:val="center"/>
+            </w:pPr>
+            <w:r>
+              <w:rPr>
+                <w:sz w:val="18"/>
+                <w:szCs w:val="18"/>
+              </w:rPr>
+              <w:t xml:space="preserve">[0.187, 0.280]</w:t>
             </w:r>
           </w:p>
         </w:tc>
@@ -20769,21 +20769,21 @@
                 <w:sz w:val="18"/>
                 <w:szCs w:val="18"/>
               </w:rPr>
-              <w:t xml:space="preserve">0.342</w:t>
-            </w:r>
-          </w:p>
-          <w:p>
-            <w:pPr>
-              <w:pStyle w:val="CONTTBFB"/>
-              <w:spacing w:after="0" w:line="240" w:lineRule="auto"/>
-              <w:jc w:val="center"/>
-            </w:pPr>
-            <w:r>
-              <w:rPr>
-                <w:sz w:val="18"/>
-                <w:szCs w:val="18"/>
-              </w:rPr>
-              <w:t xml:space="preserve">[0.326, 0.359]</w:t>
+              <w:t xml:space="preserve">0.336</w:t>
+            </w:r>
+          </w:p>
+          <w:p>
+            <w:pPr>
+              <w:pStyle w:val="CONTTBFB"/>
+              <w:spacing w:after="0" w:line="240" w:lineRule="auto"/>
+              <w:jc w:val="center"/>
+            </w:pPr>
+            <w:r>
+              <w:rPr>
+                <w:sz w:val="18"/>
+                <w:szCs w:val="18"/>
+              </w:rPr>
+              <w:t xml:space="preserve">[0.321, 0.352]</w:t>
             </w:r>
           </w:p>
         </w:tc>
@@ -20830,21 +20830,21 @@
                 <w:sz w:val="18"/>
                 <w:szCs w:val="18"/>
               </w:rPr>
-              <w:t xml:space="preserve">0.852</w:t>
-            </w:r>
-          </w:p>
-          <w:p>
-            <w:pPr>
-              <w:pStyle w:val="CONTTBFB"/>
-              <w:spacing w:after="0" w:line="240" w:lineRule="auto"/>
-              <w:jc w:val="center"/>
-            </w:pPr>
-            <w:r>
-              <w:rPr>
-                <w:sz w:val="18"/>
-                <w:szCs w:val="18"/>
-              </w:rPr>
-              <w:t xml:space="preserve">[0.847, 0.857]</w:t>
+              <w:t xml:space="preserve">0.877</w:t>
+            </w:r>
+          </w:p>
+          <w:p>
+            <w:pPr>
+              <w:pStyle w:val="CONTTBFB"/>
+              <w:spacing w:after="0" w:line="240" w:lineRule="auto"/>
+              <w:jc w:val="center"/>
+            </w:pPr>
+            <w:r>
+              <w:rPr>
+                <w:sz w:val="18"/>
+                <w:szCs w:val="18"/>
+              </w:rPr>
+              <w:t xml:space="preserve">[0.873, 0.882]</w:t>
             </w:r>
           </w:p>
         </w:tc>
@@ -20865,21 +20865,21 @@
                 <w:sz w:val="18"/>
                 <w:szCs w:val="18"/>
               </w:rPr>
-              <w:t xml:space="preserve">0.957</w:t>
-            </w:r>
-          </w:p>
-          <w:p>
-            <w:pPr>
-              <w:pStyle w:val="CONTTBFB"/>
-              <w:spacing w:after="0" w:line="240" w:lineRule="auto"/>
-              <w:jc w:val="center"/>
-            </w:pPr>
-            <w:r>
-              <w:rPr>
-                <w:sz w:val="18"/>
-                <w:szCs w:val="18"/>
-              </w:rPr>
-              <w:t xml:space="preserve">[0.953, 0.961]</w:t>
+              <w:t xml:space="preserve">0.978</w:t>
+            </w:r>
+          </w:p>
+          <w:p>
+            <w:pPr>
+              <w:pStyle w:val="CONTTBFB"/>
+              <w:spacing w:after="0" w:line="240" w:lineRule="auto"/>
+              <w:jc w:val="center"/>
+            </w:pPr>
+            <w:r>
+              <w:rPr>
+                <w:sz w:val="18"/>
+                <w:szCs w:val="18"/>
+              </w:rPr>
+              <w:t xml:space="preserve">[0.976, 0.981]</w:t>
             </w:r>
           </w:p>
         </w:tc>
@@ -20900,21 +20900,21 @@
                 <w:sz w:val="18"/>
                 <w:szCs w:val="18"/>
               </w:rPr>
-              <w:t xml:space="preserve">0.540</w:t>
-            </w:r>
-          </w:p>
-          <w:p>
-            <w:pPr>
-              <w:pStyle w:val="CONTTBFB"/>
-              <w:spacing w:after="0" w:line="240" w:lineRule="auto"/>
-              <w:jc w:val="center"/>
-            </w:pPr>
-            <w:r>
-              <w:rPr>
-                <w:sz w:val="18"/>
-                <w:szCs w:val="18"/>
-              </w:rPr>
-              <w:t xml:space="preserve">[0.487, 0.593]</w:t>
+              <w:t xml:space="preserve">0.813</w:t>
+            </w:r>
+          </w:p>
+          <w:p>
+            <w:pPr>
+              <w:pStyle w:val="CONTTBFB"/>
+              <w:spacing w:after="0" w:line="240" w:lineRule="auto"/>
+              <w:jc w:val="center"/>
+            </w:pPr>
+            <w:r>
+              <w:rPr>
+                <w:sz w:val="18"/>
+                <w:szCs w:val="18"/>
+              </w:rPr>
+              <w:t xml:space="preserve">[0.767, 0.857]</w:t>
             </w:r>
           </w:p>
         </w:tc>
@@ -20935,21 +20935,21 @@
                 <w:sz w:val="18"/>
                 <w:szCs w:val="18"/>
               </w:rPr>
-              <w:t xml:space="preserve">0.783</w:t>
-            </w:r>
-          </w:p>
-          <w:p>
-            <w:pPr>
-              <w:pStyle w:val="CONTTBFB"/>
-              <w:spacing w:after="0" w:line="240" w:lineRule="auto"/>
-              <w:jc w:val="center"/>
-            </w:pPr>
-            <w:r>
-              <w:rPr>
-                <w:sz w:val="18"/>
-                <w:szCs w:val="18"/>
-              </w:rPr>
-              <w:t xml:space="preserve">[0.764, 0.802]</w:t>
+              <w:t xml:space="preserve">0.890</w:t>
+            </w:r>
+          </w:p>
+          <w:p>
+            <w:pPr>
+              <w:pStyle w:val="CONTTBFB"/>
+              <w:spacing w:after="0" w:line="240" w:lineRule="auto"/>
+              <w:jc w:val="center"/>
+            </w:pPr>
+            <w:r>
+              <w:rPr>
+                <w:sz w:val="18"/>
+                <w:szCs w:val="18"/>
+              </w:rPr>
+              <w:t xml:space="preserve">[0.872, 0.905]</w:t>
             </w:r>
           </w:p>
         </w:tc>
@@ -21150,7 +21150,7 @@
         <w:pStyle w:val="NORML4L5"/>
       </w:pPr>
       <w:r>
-        <w:t xml:space="preserve">La Tabla 18 presenta el contraste de la mejora. Las diferencias por par no siguieron una distribución normal según la prueba de Shapiro-Wilk (p &lt; .001), por lo que se aplicó la prueba de rangos con signo de Wilcoxon unilateral. La arquitectura híbrida superó al modelo base en 192.2 % y al modelo ajustado sin componente tabular en 27.7 %, en ambos casos con p &lt; .001 y un tamaño del efecto grande (r = 0.867).</w:t>
+        <w:t xml:space="preserve">La Tabla 18 presenta el contraste de la mejora. Las diferencias por par no siguieron una distribución normal según la prueba de Shapiro-Wilk (p &lt; .001), por lo que se aplicó la prueba de rangos con signo de Wilcoxon unilateral. La arquitectura híbrida superó al modelo base en 197.8 % y al modelo ajustado sin componente tabular en 12.4 %, en ambos casos con p &lt; .001 y un tamaño del efecto grande (r = 0.867 en ambas comparaciones).</w:t>
       </w:r>
     </w:p>
     <w:p>
@@ -21449,7 +21449,7 @@
                 <w:sz w:val="18"/>
                 <w:szCs w:val="18"/>
               </w:rPr>
-              <w:t xml:space="preserve">0.342</w:t>
+              <w:t xml:space="preserve">0.336</w:t>
             </w:r>
           </w:p>
         </w:tc>
@@ -21470,7 +21470,7 @@
                 <w:sz w:val="18"/>
                 <w:szCs w:val="18"/>
               </w:rPr>
-              <w:t xml:space="preserve">192.2</w:t>
+              <w:t xml:space="preserve">197.8</w:t>
             </w:r>
           </w:p>
         </w:tc>
@@ -21607,7 +21607,7 @@
                 <w:sz w:val="18"/>
                 <w:szCs w:val="18"/>
               </w:rPr>
-              <w:t xml:space="preserve">0.783</w:t>
+              <w:t xml:space="preserve">0.890</w:t>
             </w:r>
           </w:p>
         </w:tc>
@@ -21630,7 +21630,7 @@
                 <w:sz w:val="18"/>
                 <w:szCs w:val="18"/>
               </w:rPr>
-              <w:t xml:space="preserve">27.7</w:t>
+              <w:t xml:space="preserve">12.4</w:t>
             </w:r>
           </w:p>
         </w:tc>
@@ -21653,7 +21653,7 @@
                 <w:sz w:val="18"/>
                 <w:szCs w:val="18"/>
               </w:rPr>
-              <w:t xml:space="preserve">45 150</w:t>
+              <w:t xml:space="preserve">44 850</w:t>
             </w:r>
           </w:p>
         </w:tc>
@@ -21716,7 +21716,7 @@
         <w:t xml:space="preserve">Nota.</w:t>
       </w:r>
       <w:r>
-        <w:t xml:space="preserve"> Valores medios de la métrica combinada sobre 300 pares. Prueba de rangos con signo de Wilcoxon unilateral para muestras relacionadas, aplicada porque las diferencias no siguieron una distribución normal según la prueba de Shapiro-Wilk (p &lt; .001). r: tamaño del efecto calculado como z dividido entre la raíz cuadrada de n.</w:t>
+        <w:t xml:space="preserve"> Valores medios de la métrica combinada sobre 300 pares. Prueba de rangos con signo de Wilcoxon unilateral para muestras relacionadas, aplicada porque las diferencias no siguieron una distribución normal según la prueba de Shapiro-Wilk (p &lt; .001). r: tamaño del efecto calculado como z dividido entre la raíz cuadrada de n, excluidos los pares con diferencia nula.</w:t>
       </w:r>
     </w:p>
     <w:p>
@@ -21817,7 +21817,7 @@
         <w:pStyle w:val="NORML12"/>
       </w:pPr>
       <w:r>
-        <w:t xml:space="preserve">El ajuste con LoRA entrenó cerca del 0.3 % de los parámetros de un modelo de 1 500 millones y, en 35 minutos de una GPU Tesla T4, bastó para que el modelo aprendiera a redactar rutas fieles al ranking. Este resultado concuerda con Hu et al. (2021), quienes mostraron que la adaptación de bajo rango es competitiva frente al ajuste fino tradicional con una fracción del costo computacional, y con Dettmers et al. (2023), para quienes la cuantización en 4 bits no degrada el ajuste. A diferencia de Mena (2023), que identificó la memoria de video como una limitación importante al ajustar modelos de 7 mil millones de parámetros, el uso de un modelo de 1 500 millones permitió entrenar en infraestructura gratuita, lo que favorece la replicación en universidades con recursos limitados.</w:t>
+        <w:t xml:space="preserve">El ajuste con LoRA entrenó cerca del 0.3 % de los parámetros de un modelo de 1 500 millones y, en 34 minutos de una GPU Tesla T4, bastó para que el modelo aprendiera a redactar rutas fieles al ranking. Este resultado concuerda con Hu et al. (2021), quienes mostraron que la adaptación de bajo rango es competitiva frente al ajuste fino tradicional con una fracción del costo computacional, y con Dettmers et al. (2023), para quienes la cuantización en 4 bits no degrada el ajuste. A diferencia de Mena (2023), que identificó la memoria de video como una limitación importante al ajustar modelos de 7 mil millones de parámetros, el uso de un modelo de 1 500 millones permitió entrenar en infraestructura gratuita, lo que favorece la replicación en universidades con recursos limitados.</w:t>
       </w:r>
     </w:p>
     <w:p>
@@ -21825,7 +21825,7 @@
         <w:pStyle w:val="NORML12"/>
       </w:pPr>
       <w:r>
-        <w:t xml:space="preserve">La comparación entre condiciones muestra que el aporte del componente tabular no está en la forma del texto, que el modelo aprendió aun sin probabilidades, con un ROUGE-L de 0.852, sino en su contenido: sin el ranking, la coherencia descendió a 0.540, y con él alcanzó 1.000. Este hallazgo coincide con Martínez Sixto et al. (2025), quienes encontraron que la efectividad de un modelo de lenguaje depende en gran medida de la calidad y relevancia del contexto que recibe, y respalda lo planteado por Millan (2025) sobre la ventaja de los enfoques híbridos. En cambio, matiza lo señalado por Castejon (2025), para quien una ingeniería de instrucciones adecuada elimina las alucinaciones: el modelo base recibió la misma instrucción con el ranking y, aun así, generó textos extensos que no respetaron el orden de los programas, lo que indica que en esta tarea la instrucción por sí sola no bastó y fue necesario el ajuste fino.</w:t>
+        <w:t xml:space="preserve">La comparación entre condiciones muestra que el aporte del componente tabular no está en la forma del texto, que el modelo aprendió aun sin probabilidades, con un ROUGE-L de 0.877, sino en su contenido: sin el ranking, la coherencia descendió a 0.813, y con él alcanzó 1.000. Que el modelo sin probabilidades acierte el orden en el 81.3 % de los casos sugiere que el ranking puede inferirse en buena medida a partir del área de interés del perfil, lo que es coherente con el hallazgo del rankeo: la probabilidad de ingreso depende más del programa que del perfil individual. Este hallazgo coincide con Martínez Sixto et al. (2025), quienes encontraron que la efectividad de un modelo de lenguaje depende en gran medida de la calidad y relevancia del contexto que recibe, y respalda lo planteado por Millan (2025) sobre la ventaja de los enfoques híbridos. En cambio, matiza lo señalado por Castejon (2025), para quien una ingeniería de instrucciones adecuada elimina las alucinaciones: el modelo base recibió la misma instrucción con el ranking y, aun así, generó textos extensos que no respetaron el orden de los programas, lo que indica que en esta tarea la instrucción por sí sola no bastó y fue necesario el ajuste fino.</w:t>
       </w:r>
     </w:p>
     <w:p>
@@ -21919,7 +21919,7 @@
         <w:pStyle w:val="CONCLUT1"/>
       </w:pPr>
       <w:r>
-        <w:t xml:space="preserve">El ajuste fino con LoRA, que entrenó cerca del 0.3 % de los parámetros del modelo Qwen2.5-1.5B-Instruct, permitió generar rutas educativas con una coherencia contextual de 1.000, superior al umbral de 0.80 (prueba binomial exacta, p &lt; .001), con un ROUGE-L de 1.000 y un BERTScore F1 de 1.000, por lo que se acepta la hipótesis específica 3. La coherencia depende de que el modelo reciba el ranking del componente tabular: sin él, descendió a 0.540.</w:t>
+        <w:t xml:space="preserve">El ajuste fino con LoRA, que entrenó cerca del 0.3 % de los parámetros del modelo Qwen2.5-1.5B-Instruct, permitió generar rutas educativas con una coherencia contextual de 1.000, superior al umbral de 0.80 (prueba binomial exacta, p &lt; .001), con un ROUGE-L de 1.000 y un BERTScore F1 de 1.000, por lo que se acepta la hipótesis específica 3. La coherencia alcanza su valor máximo cuando el modelo recibe el ranking del componente tabular: sin él, fue de 0.813.</w:t>
       </w:r>
     </w:p>
     <w:p>
@@ -21927,7 +21927,7 @@
         <w:pStyle w:val="CONCLUT1"/>
       </w:pPr>
       <w:r>
-        <w:t xml:space="preserve">En la validación comparativa, el componente de rankeo superó al orden aleatorio, con un MRR de 0.353 frente a 0.299, pero no al orden por popularidad del programa, que alcanzó 0.362, con el que resultó estadísticamente equivalente, sin generar brecha territorial. En la calidad de las rutas, la arquitectura híbrida alcanzó una métrica combinada de 1.000 y superó en 192.2 % al modelo base y en 27.7 % al modelo ajustado sin componente tabular, con diferencias significativas (Wilcoxon, p &lt; .001), por lo que se acepta la hipótesis específica 4 en la dimensión de generación de rutas, mientras que en la dimensión del rankeo la mejora no se verifica.</w:t>
+        <w:t xml:space="preserve">En la validación comparativa, el componente de rankeo superó al orden aleatorio, con un MRR de 0.353 frente a 0.299, pero no al orden por popularidad del programa, que alcanzó 0.362, con el que resultó estadísticamente equivalente, sin generar brecha territorial. En la calidad de las rutas, la arquitectura híbrida alcanzó una métrica combinada de 1.000 y superó en 197.8 % al modelo base y en 12.4 % al modelo ajustado sin componente tabular, con diferencias significativas (Wilcoxon, p &lt; .001), por lo que se acepta la hipótesis específica 4 en la dimensión de generación de rutas, mientras que en la dimensión del rankeo la mejora no se verifica.</w:t>
       </w:r>
     </w:p>
     <w:p>

</xml_diff>

<commit_message>
Completa las referencias de Sabando Moreira y Velasquez Velasquez
- Moreira et al. (2024) corresponde a Sabando Moreira y Zambrano Montenegro
  (2024), Revista Científica Multidisciplinar G-nerando, 5(2), 997-1023.
- Velasquez (2023) corresponde a Velasquez Velasquez (2023), trabajo de
  investigación de bachiller de la USAT.
- Se corrigen las citas en el texto y el orden alfabético.

Co-Authored-By: Claude Opus 5.5 <noreply@anthropic.com>
Claude-Session: https://claude.ai/code/session_01DtqH3frdJcwNPf5uAWNPX3
</commit_message>
<xml_diff>
--- a/Borrador_Tesis_CareER-GPT_EPG_UNA.docx
+++ b/Borrador_Tesis_CareER-GPT_EPG_UNA.docx
@@ -6843,7 +6843,7 @@
         <w:pStyle w:val="NORML3"/>
       </w:pPr>
       <w:r>
-        <w:t xml:space="preserve">La retención estudiantil comprende las estrategias institucionales y personales orientadas a que los estudiantes culminen sus estudios. Ambos aspectos dependen de factores vocacionales, académicos y tecnológicos, y pueden fortalecerse con modelos de inteligencia artificial que anticipan riesgos y personalizan la intervención educativa (Moreira et al., 2024; Muñoz Pilozo et al., 2024).</w:t>
+        <w:t xml:space="preserve">La retención estudiantil comprende las estrategias institucionales y personales orientadas a que los estudiantes culminen sus estudios. Ambos aspectos dependen de factores vocacionales, académicos y tecnológicos, y pueden fortalecerse con modelos de inteligencia artificial que anticipan riesgos y personalizan la intervención educativa (Muñoz Pilozo et al., 2024; Sabando Moreira y Zambrano Montenegro, 2024).</w:t>
       </w:r>
     </w:p>
     <w:p>
@@ -7185,7 +7185,7 @@
         <w:pStyle w:val="NORML3"/>
       </w:pPr>
       <w:r>
-        <w:t xml:space="preserve">Velasquez (2023) realizó una revisión sistemática de la literatura sobre inteligencia artificial aplicada al sector educativo, siguiendo la propuesta de Kitchenham, con el fin de proporcionar una estructura para futuras investigaciones. Entre los resultados destacaron las aplicaciones de tutores inteligentes.</w:t>
+        <w:t xml:space="preserve">Velasquez Velasquez (2023) realizó una revisión sistemática de la literatura sobre inteligencia artificial aplicada al sector educativo, siguiendo la propuesta de Kitchenham, con el fin de proporcionar una estructura para futuras investigaciones. Entre los resultados destacaron las aplicaciones de tutores inteligentes.</w:t>
       </w:r>
     </w:p>
     <w:sdt>
@@ -22317,7 +22317,7 @@
         <w:pStyle w:val="BIBLIOGRAFIA"/>
       </w:pPr>
       <w:r>
-        <w:t xml:space="preserve">Moreira, S., Montenegro, Z., y Fernando, D. (2024). Técnicas de machine learning para predecir la deserción estudiantil universitaria: una revisión sistemática de la literatura. Revista Científica Multidisciplinar. [Completar volumen, número y DOI.]</w:t>
+        <w:t xml:space="preserve">Muñoz Pilozo, A. G., Villalva Pilozo, A. M., Medina Castro, A. R., y Pilozo Mendoza, J. J. (2024). Factores determinantes en el éxito del proceso de enseñanza-aprendizaje. Revista Scientific, 9(33), 45-63. https://doi.org/10.29394/scientific.issn.2542-2987.2024.9.33.2.45-63</w:t>
       </w:r>
     </w:p>
     <w:p>
@@ -22325,7 +22325,7 @@
         <w:pStyle w:val="BIBLIOGRAFIA"/>
       </w:pPr>
       <w:r>
-        <w:t xml:space="preserve">Muñoz Pilozo, A. G., Villalva Pilozo, A. M., Medina Castro, A. R., y Pilozo Mendoza, J. J. (2024). Factores determinantes en el éxito del proceso de enseñanza-aprendizaje. Revista Scientific, 9(33), 45-63. https://doi.org/10.29394/scientific.issn.2542-2987.2024.9.33.2.45-63</w:t>
+        <w:t xml:space="preserve">Nass, O., Skuliabina, O., Bapiyev, I., Dnekeshev, A., Bekenova, S., y Bekenova, A. (2023). Blended learning as a promising direction of informatization of higher education. E3S Web of Conferences, 389. https://doi.org/10.1051/e3sconf/202338908003</w:t>
       </w:r>
     </w:p>
     <w:p>
@@ -22333,7 +22333,7 @@
         <w:pStyle w:val="BIBLIOGRAFIA"/>
       </w:pPr>
       <w:r>
-        <w:t xml:space="preserve">Nass, O., Skuliabina, O., Bapiyev, I., Dnekeshev, A., Bekenova, S., y Bekenova, A. (2023). Blended learning as a promising direction of informatization of higher education. E3S Web of Conferences, 389. https://doi.org/10.1051/e3sconf/202338908003</w:t>
+        <w:t xml:space="preserve">Navarro Forero, C. A., Hernández, M. A., y Viloria, K. T. (2025). Nuevas rutas de aprendizaje: adaptación de contenidos académicos a formatos audiovisuales para mejorar la preparación de los estudiantes. https://doi.org/10.26507/paper.4223</w:t>
       </w:r>
     </w:p>
     <w:p>
@@ -22341,7 +22341,7 @@
         <w:pStyle w:val="BIBLIOGRAFIA"/>
       </w:pPr>
       <w:r>
-        <w:t xml:space="preserve">Navarro Forero, C. A., Hernández, M. A., y Viloria, K. T. (2025). Nuevas rutas de aprendizaje: adaptación de contenidos académicos a formatos audiovisuales para mejorar la preparación de los estudiantes. https://doi.org/10.26507/paper.4223</w:t>
+        <w:t xml:space="preserve">Negueruela Gómez, I. (2024). Análisis y evaluación de LLMs con técnicas RAG para el desarrollo y despliegue de un asistente virtual [Trabajo de fin de estudios, Universidad de Cantabria]. https://repositorio.unican.es/xmlui/handle/10902/33837</w:t>
       </w:r>
     </w:p>
     <w:p>
@@ -22349,7 +22349,7 @@
         <w:pStyle w:val="BIBLIOGRAFIA"/>
       </w:pPr>
       <w:r>
-        <w:t xml:space="preserve">Negueruela Gómez, I. (2024). Análisis y evaluación de LLMs con técnicas RAG para el desarrollo y despliegue de un asistente virtual [Trabajo de fin de estudios, Universidad de Cantabria]. https://repositorio.unican.es/xmlui/handle/10902/33837</w:t>
+        <w:t xml:space="preserve">Ramos-Rivera, R. E., Santana Mancilla, P. C., García-Mancilla, J., y Gaytán-Lugo, L. S. (2025). Modelos de lenguaje en educación: inteligencia artificial generativa para optimizar el análisis del desempeño docente. Innovación Académica, Universidad Autónoma de Nuevo León, 1(2), 70-81. https://doi.org/10.29105/innoacad.v1i2.36</w:t>
       </w:r>
     </w:p>
     <w:p>
@@ -22357,7 +22357,7 @@
         <w:pStyle w:val="BIBLIOGRAFIA"/>
       </w:pPr>
       <w:r>
-        <w:t xml:space="preserve">Ramos-Rivera, R. E., Santana Mancilla, P. C., García-Mancilla, J., y Gaytán-Lugo, L. S. (2025). Modelos de lenguaje en educación: inteligencia artificial generativa para optimizar el análisis del desempeño docente. Innovación Académica, Universidad Autónoma de Nuevo León, 1(2), 70-81. https://doi.org/10.29105/innoacad.v1i2.36</w:t>
+        <w:t xml:space="preserve">Rodas, A. (2024). Orientación vocacional y deserción universitaria en una universidad de Lima - 2024 [Tesis de maestría, Universidad César Vallejo].</w:t>
       </w:r>
     </w:p>
     <w:p>
@@ -22365,7 +22365,7 @@
         <w:pStyle w:val="BIBLIOGRAFIA"/>
       </w:pPr>
       <w:r>
-        <w:t xml:space="preserve">Rodas, A. (2024). Orientación vocacional y deserción universitaria en una universidad de Lima - 2024 [Tesis de maestría, Universidad César Vallejo].</w:t>
+        <w:t xml:space="preserve">Rodriguez, Y. (2023). Inteligencia artificial y rendimiento académico de los estudiantes de educación superior en la región Puno, 2022 [Tesis de maestría, Universidad Alas Peruanas].</w:t>
       </w:r>
     </w:p>
     <w:p>
@@ -22373,7 +22373,7 @@
         <w:pStyle w:val="BIBLIOGRAFIA"/>
       </w:pPr>
       <w:r>
-        <w:t xml:space="preserve">Rodriguez, Y. (2023). Inteligencia artificial y rendimiento académico de los estudiantes de educación superior en la región Puno, 2022 [Tesis de maestría, Universidad Alas Peruanas].</w:t>
+        <w:t xml:space="preserve">Sabando Moreira, P. A., y Zambrano Montenegro, D. F. (2024). Técnicas de machine learning para predecir la deserción estudiantil universitaria: una revisión sistemática de la literatura. Revista Científica Multidisciplinar G-nerando, 5(2), 997-1023. https://doi.org/10.60100/rcmg.v5i2.245</w:t>
       </w:r>
     </w:p>
     <w:p>
@@ -22437,7 +22437,7 @@
         <w:pStyle w:val="BIBLIOGRAFIA"/>
       </w:pPr>
       <w:r>
-        <w:t xml:space="preserve">Velasquez, S. (2023). La inteligencia artificial aplicada al sector educativo: una revisión sistemática de la literatura. [Completar fuente.]</w:t>
+        <w:t xml:space="preserve">Velasquez Velasquez, S. D. (2023). La inteligencia artificial aplicada al sector educativo: una revisión sistemática de la literatura [Trabajo de investigación de bachiller, Universidad Católica Santo Toribio de Mogrovejo]. http://hdl.handle.net/20.500.12423/6921</w:t>
       </w:r>
     </w:p>
     <w:p>

</xml_diff>

<commit_message>
Cita a Behr et al. (2020) como fuente secundaria según APA 7
- En la identificación del problema, la cita pasa a ser "(Behr et al.,
  2020, como se citó en Escalante López et al., 2023)".
- Se elimina la entrada incompleta de Behr de la bibliografía; Escalante
  López et al. (2023) ya figura en ella.
- Se actualiza CLAUDE.md: no quedan textos pendientes en el borrador.

Co-Authored-By: Claude Opus 5.5 <noreply@anthropic.com>
Claude-Session: https://claude.ai/code/session_01DtqH3frdJcwNPf5uAWNPX3
</commit_message>
<xml_diff>
--- a/Borrador_Tesis_CareER-GPT_EPG_UNA.docx
+++ b/Borrador_Tesis_CareER-GPT_EPG_UNA.docx
@@ -7309,7 +7309,7 @@
         <w:pStyle w:val="NORML12"/>
       </w:pPr>
       <w:r>
-        <w:t xml:space="preserve">En América Latina la magnitud del problema es particularmente alta. Según el Banco Mundial, cerca de la mitad de la población de 25 a 29 años que inició estudios superiores no llegó a culminarlos (Ferreyra et al., 2017), y las cifras de deserción en el primer año, antes de la pandemia, rondaban el 31 % en Colombia, el 21 % en Chile y el 33 % en el Perú (Behr, 2020).</w:t>
+        <w:t xml:space="preserve">En América Latina la magnitud del problema es particularmente alta. Según el Banco Mundial, cerca de la mitad de la población de 25 a 29 años que inició estudios superiores no llegó a culminarlos (Ferreyra et al., 2017), y las cifras de deserción en el primer año, antes de la pandemia, rondaban el 31 % en Colombia, el 21 % en Chile y el 33 % en el Perú (Behr et al., 2020, como se citó en Escalante López et al., 2023).</w:t>
       </w:r>
     </w:p>
     <w:p>
@@ -22062,14 +22062,6 @@
       </w:pPr>
       <w:r>
         <w:t xml:space="preserve">Balarezo, M., Pia, M., Hurtado, A., Alfredo, W., Churata, G., Francis, H., Atiquipa, S., Franklin, E., Felix, T., y Erick, R. (2024). Diseño de un asistente inteligente RAG para la Comisión de Eliminación de Barreras Burocráticas de INDECOPI-2024 [Tesis de maestría, Universidad Peruana de Ciencias Aplicadas]. http://hdl.handle.net/10757/684330</w:t>
-      </w:r>
-    </w:p>
-    <w:p>
-      <w:pPr>
-        <w:pStyle w:val="BIBLIOGRAFIA"/>
-      </w:pPr>
-      <w:r>
-        <w:t xml:space="preserve">Behr, A. (2020). [Completar referencia: autor, título, fuente y DOI de la cita sobre tasas de deserción en el primer año en Colombia, Chile y Perú.]</w:t>
       </w:r>
     </w:p>
     <w:p>

</xml_diff>

<commit_message>
Mejora la presentación de las tablas de ejemplo y elimina el punto y coma
- Tabla 12: la instrucción y la respuesta del par de ejemplo se presentan
  con viñetas por elemento.
- Tabla 14: las rutas se muestran completas y por oraciones, sin recortes
  ni [...]; la nota explica el límite de 200 elementos del modelo base.
- Tabla 13: anchos de columna que no parten las palabras.
- Se reescriben 22 frases para no usar punto y coma. Solo se conservan
  los que separan citas múltiples, como exige APA 7, y el del DOI de Brier.

Co-Authored-By: Claude Opus 5.5 <noreply@anthropic.com>
Claude-Session: https://claude.ai/code/session_01DtqH3frdJcwNPf5uAWNPX3
</commit_message>
<xml_diff>
--- a/Borrador_Tesis_CareER-GPT_EPG_UNA.docx
+++ b/Borrador_Tesis_CareER-GPT_EPG_UNA.docx
@@ -5697,7 +5697,7 @@
         <w:ind w:firstLine="0"/>
       </w:pPr>
       <w:r>
-        <w:t xml:space="preserve">La orientación vocacional en el Perú se apoya en instrumentos que no aprovechan el historial académico de los postulantes, lo que se asocia con elecciones de carrera poco informadas y con la deserción universitaria. El objetivo fue desarrollar y validar CareER-GPT, una arquitectura híbrida que combina un modelo tabular XGBoost, para rankear la probabilidad de ingreso por programa, con un modelo de lenguaje grande ajustado mediante LoRA, para generar rutas educativas personalizadas. El estudio fue cuantitativo, aplicado y de diseño preexperimental. Se integraron los registros de admisión de la Universidad Nacional del Altiplano de 2021-I a 2025-II con el historial de secundaria del SIAGIE, y se analizaron 42 156 postulaciones de 34 648 personas mediante validación cruzada agrupada por persona. El modelo tabular alcanzó un AUC-ROC de 0.754 (IC 95 %: 0.747 a 0.761) y un AUC-PR de 0.292, frente a una tasa base de 0.115; no alcanzó el umbral hipotético de 0.85. El promedio de quinto de secundaria, el equipamiento tecnológico del hogar y la preparación preuniversitaria fueron los predictores de mayor peso. Se identificó una brecha de 7.1 puntos en la tasa de falsos negativos en perjuicio de los postulantes de colegios rurales. En el rankeo de programas superó al azar, pero no a la ordenación por la tasa histórica de ingreso. El corpus de instrucción y respuesta reunió 34 648 pares balanceados entre particiones. El modelo de lenguaje ajustado con LoRA alcanzó una coherencia contextual de 1.000, superior al umbral de 0.80, y la arquitectura híbrida superó en 12.4 % al modelo ajustado sin componente tabular en la calidad de las rutas generadas (p &lt; .001). Se concluye que el componente tabular discrimina de manera moderada y que su uso orientador requiere controles de equidad territorial.</w:t>
+        <w:t xml:space="preserve">La orientación vocacional en el Perú se apoya en instrumentos que no aprovechan el historial académico de los postulantes, lo que se asocia con elecciones de carrera poco informadas y con la deserción universitaria. El objetivo fue desarrollar y validar CareER-GPT, una arquitectura híbrida que combina un modelo tabular XGBoost, para rankear la probabilidad de ingreso por programa, con un modelo de lenguaje grande ajustado mediante LoRA, para generar rutas educativas personalizadas. El estudio fue cuantitativo, aplicado y de diseño preexperimental. Se integraron los registros de admisión de la Universidad Nacional del Altiplano de 2021-I a 2025-II con el historial de secundaria del SIAGIE, y se analizaron 42 156 postulaciones de 34 648 personas mediante validación cruzada agrupada por persona. El modelo tabular alcanzó un AUC-ROC de 0.754 (IC 95 %: 0.747 a 0.761) y un AUC-PR de 0.292, frente a una tasa base de 0.115, sin alcanzar el umbral hipotético de 0.85. El promedio de quinto de secundaria, el equipamiento tecnológico del hogar y la preparación preuniversitaria fueron los predictores de mayor peso. Se identificó una brecha de 7.1 puntos en la tasa de falsos negativos en perjuicio de los postulantes de colegios rurales. En el rankeo de programas superó al azar, pero no a la ordenación por la tasa histórica de ingreso. El corpus de instrucción y respuesta reunió 34 648 pares balanceados entre particiones. El modelo de lenguaje ajustado con LoRA alcanzó una coherencia contextual de 1.000, superior al umbral de 0.80, y la arquitectura híbrida superó en 12.4 % al modelo ajustado sin componente tabular en la calidad de las rutas generadas (p &lt; .001). Se concluye que el componente tabular discrimina de manera moderada y que su uso orientador requiere controles de equidad territorial.</w:t>
       </w:r>
     </w:p>
     <w:p>
@@ -5756,7 +5756,7 @@
         <w:ind w:firstLine="0"/>
       </w:pPr>
       <w:r>
-        <w:t xml:space="preserve">Vocational guidance in Peru relies on instruments that do not use applicants' academic records, which is associated with poorly informed career choices and university dropout. The aim was to develop and validate CareER-GPT, a hybrid architecture that combines an XGBoost tabular model, to rank the probability of admission by program, with a large language model fine-tuned through LoRA, to generate personalized educational pathways. The study was quantitative, applied and pre-experimental. Admission records of the Universidad Nacional del Altiplano from 2021-I to 2025-II were linked with secondary school records from SIAGIE, and 42,156 applications from 34,648 individuals were analyzed using person-grouped cross-validation. The tabular model reached an AUC-ROC of 0.754 (95% CI: 0.747 to 0.761) and an AUC-PR of 0.292, against a base rate of 0.115; it did not reach the hypothesized threshold of 0.85. The fifth-grade average, household technological equipment and pre-university preparation were the most influential predictors. A gap of 7.1 points in the false negative rate was found against applicants from rural schools. In program ranking it outperformed random ordering but not ordering by historical admission rate. The instruction-response corpus comprised 34,648 pairs balanced across partitions. The LoRA fine-tuned language model reached a contextual coherence of 1.000, above the 0.80 threshold, and the hybrid architecture outperformed the fine-tuned model without the tabular component by 12.4% in the quality of the generated pathways (p &lt; .001). The tabular component discriminates moderately, and its use for guidance requires territorial fairness controls.</w:t>
+        <w:t xml:space="preserve">Vocational guidance in Peru relies on instruments that do not use applicants' academic records, which is associated with poorly informed career choices and university dropout. The aim was to develop and validate CareER-GPT, a hybrid architecture that combines an XGBoost tabular model, to rank the probability of admission by program, with a large language model fine-tuned through LoRA, to generate personalized educational pathways. The study was quantitative, applied and pre-experimental. Admission records of the Universidad Nacional del Altiplano from 2021-I to 2025-II were linked with secondary school records from SIAGIE, and 42,156 applications from 34,648 individuals were analyzed using person-grouped cross-validation. The tabular model reached an AUC-ROC of 0.754 (95% CI: 0.747 to 0.761) and an AUC-PR of 0.292, against a base rate of 0.115, without reaching the hypothesized threshold of 0.85. The fifth-grade average, household technological equipment and pre-university preparation were the most influential predictors. A gap of 7.1 points in the false negative rate was found against applicants from rural schools. In program ranking it outperformed random ordering but not ordering by historical admission rate. The instruction-response corpus comprised 34,648 pairs balanced across partitions. The LoRA fine-tuned language model reached a contextual coherence of 1.000, above the 0.80 threshold, and the hybrid architecture outperformed the fine-tuned model without the tabular component by 12.4% in the quality of the generated pathways (p &lt; .001). The tabular component discriminates moderately, and its use for guidance requires territorial fairness controls.</w:t>
       </w:r>
     </w:p>
     <w:p>
@@ -5824,7 +5824,7 @@
     <w:p>
       <w:pPr/>
       <w:r>
-        <w:t xml:space="preserve">Metodológicamente, el estudio adoptó un enfoque cuantitativo, de tipo aplicado y diseño preexperimental. El componente tabular se evaluó mediante validación cruzada agrupada por persona, con métricas adecuadas al desbalance de clases y con una auditoría de equidad entre colegios rurales y urbanos; el componente generativo se evaluó con métricas de procesamiento de lenguaje natural; y la arquitectura integrada se comparó con sus componentes individuales.</w:t>
+        <w:t xml:space="preserve">Metodológicamente, el estudio adoptó un enfoque cuantitativo, de tipo aplicado y diseño preexperimental. El componente tabular se evaluó mediante validación cruzada agrupada por persona, con métricas adecuadas al desbalance de clases y con una auditoría de equidad entre colegios rurales y urbanos. El componente generativo se evaluó con métricas de procesamiento de lenguaje natural, y la arquitectura integrada se comparó con sus componentes individuales.</w:t>
       </w:r>
     </w:p>
     <w:p>
@@ -6187,7 +6187,7 @@
         <w:pStyle w:val="NORML3"/>
       </w:pPr>
       <w:r>
-        <w:t xml:space="preserve">QLoRA extiende este esquema cuantizando los pesos congelados del modelo base en 4 bits con el tipo de dato NormalFloat, diseñado para pesos con distribución normal, y aplicando una doble cuantización de las constantes de escala; los adaptadores A y B se mantienen en mayor precisión (Dettmers et al., 2023).</w:t>
+        <w:t xml:space="preserve">QLoRA extiende este esquema cuantizando los pesos congelados del modelo base en 4 bits con el tipo de dato NormalFloat, diseñado para pesos con distribución normal, y aplicando una doble cuantización de las constantes de escala, mientras que los adaptadores A y B se mantienen en mayor precisión (Dettmers et al., 2023).</w:t>
       </w:r>
     </w:p>
     <w:p>
@@ -6907,7 +6907,7 @@
         <w:pStyle w:val="NORML3"/>
       </w:pPr>
       <w:r>
-        <w:t xml:space="preserve">La equidad algorítmica estudia si un modelo predictivo distribuye sus errores de manera homogénea entre grupos de población. En contextos de orientación, un indicador relevante es la tasa de falsos negativos, que mide la proporción de personas que efectivamente logran el resultado pero a quienes el modelo asigna una baja probabilidad; una tasa mayor en un grupo implica que el sistema desalentaría de forma desproporcionada a sus integrantes con potencial. Por ello, la evaluación de modelos con fines educativos debe complementar las métricas globales con métricas desagregadas por grupo.</w:t>
+        <w:t xml:space="preserve">La equidad algorítmica estudia si un modelo predictivo distribuye sus errores de manera homogénea entre grupos de población. En contextos de orientación, un indicador relevante es la tasa de falsos negativos, que mide la proporción de personas que efectivamente logran el resultado pero a quienes el modelo asigna una baja probabilidad. Una tasa mayor en un grupo implica que el sistema desalentaría de forma desproporcionada a sus integrantes con potencial. Por ello, la evaluación de modelos con fines educativos debe complementar las métricas globales con métricas desagregadas por grupo.</w:t>
       </w:r>
     </w:p>
     <w:p>
@@ -7061,7 +7061,7 @@
         <w:pStyle w:val="NORML3"/>
       </w:pPr>
       <w:r>
-        <w:t xml:space="preserve">Castejon (2025) diseñó, implementó y evaluó un sistema conversacional que permite consultar en lenguaje natural la información del Museo Sorolla, con preguntas estructuradas por categorías de uso. El clasificador de intención alcanzó una precisión global de 88 % y un F1 de 0.88, con 0.94 en la clase SQL; el componente RAG obtuvo una relevancia de contexto de 0.98 y una fidelidad de 0.67. Concluyó que el sistema, que integra LLM, RAG y Text2SQL, funciona eficazmente y que una ingeniería de instrucciones adecuada elimina las alucinaciones.</w:t>
+        <w:t xml:space="preserve">Castejon (2025) diseñó, implementó y evaluó un sistema conversacional que permite consultar en lenguaje natural la información del Museo Sorolla, con preguntas estructuradas por categorías de uso. El clasificador de intención alcanzó una precisión global de 88 % y un F1 de 0.88, con 0.94 en la clase SQL, y el componente RAG obtuvo una relevancia de contexto de 0.98 y una fidelidad de 0.67. Concluyó que el sistema, que integra LLM, RAG y Text2SQL, funciona eficazmente y que una ingeniería de instrucciones adecuada elimina las alucinaciones.</w:t>
       </w:r>
     </w:p>
     <w:p>
@@ -7153,7 +7153,7 @@
         <w:pStyle w:val="NORML3"/>
       </w:pPr>
       <w:r>
-        <w:t xml:space="preserve">Balarezo et al. (2024) diseñaron un asistente conversacional basado en arquitectura RAG para optimizar la búsqueda, recuperación y análisis de resoluciones históricas de la Comisión de Eliminación de Barreras Burocráticas del INDECOPI. El diseño optimizó la búsqueda contextual, redujo los tiempos de revisión, análisis y redacción, y mejoró la precisión de las respuestas frente a los buscadores tradicionales; concluyeron que su implementación es viable, pertinente y beneficiosa.</w:t>
+        <w:t xml:space="preserve">Balarezo et al. (2024) diseñaron un asistente conversacional basado en arquitectura RAG para optimizar la búsqueda, recuperación y análisis de resoluciones históricas de la Comisión de Eliminación de Barreras Burocráticas del INDECOPI. El diseño optimizó la búsqueda contextual, redujo los tiempos de revisión, análisis y redacción, y mejoró la precisión de las respuestas frente a los buscadores tradicionales. Concluyeron que su implementación es viable, pertinente y beneficiosa.</w:t>
       </w:r>
     </w:p>
     <w:p>
@@ -8291,7 +8291,7 @@
         <w:pStyle w:val="NORML12"/>
       </w:pPr>
       <w:r>
-        <w:t xml:space="preserve">El conjunto analítico comprende 42 156 postulaciones de 34 648 personas, con una tasa de ingreso de 11.49 %. Para la validación de los modelos, este conjunto se dividió en cinco pliegues estratificados y agrupados por persona, de modo que ninguna persona aparezca simultáneamente en entrenamiento y prueba; para el modelo de lenguaje, los pares se dividieron en 70 % para entrenamiento, 15 % para validación y 15 % para prueba, también agrupados por persona.</w:t>
+        <w:t xml:space="preserve">El conjunto analítico comprende 42 156 postulaciones de 34 648 personas, con una tasa de ingreso de 11.49 %. Para la validación de los modelos, este conjunto se dividió en cinco pliegues estratificados y agrupados por persona, de modo que ninguna persona aparezca simultáneamente en entrenamiento y prueba. Para el modelo de lenguaje, los pares se dividieron en 70 % para entrenamiento, 15 % para validación y 15 % para prueba, también agrupados por persona.</w:t>
       </w:r>
     </w:p>
     <w:sdt>
@@ -8336,7 +8336,7 @@
         <w:pStyle w:val="NORML12"/>
       </w:pPr>
       <w:r>
-        <w:t xml:space="preserve">La Figura 2 presenta la arquitectura propuesta. El componente tabular estima, para cada postulante, la probabilidad de ingreso en cada programa, la calibra y ordena los programas; ese ordenamiento se incorpora a la instrucción que recibe el componente lingüístico, un modelo de lenguaje ajustado con LoRA que genera la ruta educativa en lenguaje natural.</w:t>
+        <w:t xml:space="preserve">La Figura 2 presenta la arquitectura propuesta. El componente tabular estima, para cada postulante, la probabilidad de ingreso en cada programa, la calibra y ordena los programas. Ese ordenamiento se incorpora a la instrucción que recibe el componente lingüístico, un modelo de lenguaje ajustado con LoRA que genera la ruta educativa en lenguaje natural.</w:t>
       </w:r>
     </w:p>
     <w:p>
@@ -8486,7 +8486,7 @@
         <w:pStyle w:val="NORML4L5"/>
       </w:pPr>
       <w:r>
-        <w:t xml:space="preserve">La variable dependiente es el ingreso, codificada como 1 cuando la condición final del postulante fue ingresó y 0 en caso contrario. Como predictores se emplearon exclusivamente variables conocidas antes del examen: 30 numéricas, entre ellas los promedios por área curricular de tercero a quinto de secundaria, el promedio de quinto grado, la tendencia de las notas, las áreas desaprobadas, la repitencia, los perfiles cuantitativo y verbal, la edad, los años desde el egreso, las postulaciones previas, los índices de servicios básicos y de equipamiento tecnológico del hogar y la tasa previa de ingreso del programa; y 26 categóricas, entre ellas el tipo de proceso, el programa postulado, el área y la gestión del colegio, la UGEL, la lengua materna, el nivel educativo y la ocupación de los padres, el rango de ingreso familiar y la preparación preuniversitaria.</w:t>
+        <w:t xml:space="preserve">La variable dependiente es el ingreso, codificada como 1 cuando la condición final del postulante fue ingresó y 0 en caso contrario. Como predictores se emplearon exclusivamente variables conocidas antes del examen: 30 numéricas, entre ellas los promedios por área curricular de tercero a quinto de secundaria, el promedio de quinto grado, la tendencia de las notas, las áreas desaprobadas, la repitencia, los perfiles cuantitativo y verbal, la edad, los años desde el egreso, las postulaciones previas, los índices de servicios básicos y de equipamiento tecnológico del hogar y la tasa previa de ingreso del programa. Además, se emplearon 26 categóricas, entre ellas el tipo de proceso, el programa postulado, el área y la gestión del colegio, la UGEL, la lengua materna, el nivel educativo y la ocupación de los padres, el rango de ingreso familiar y la preparación preuniversitaria.</w:t>
       </w:r>
     </w:p>
     <w:p>
@@ -8510,7 +8510,7 @@
         <w:pStyle w:val="NORML4L5"/>
       </w:pPr>
       <w:r>
-        <w:t xml:space="preserve">Los insumos fueron las bases de admisión y del SIAGIE. El historial escolar, registrado en formato largo con un registro por grado, se transformó a formato ancho con una fila por estudiante; en los grados repetidos se conservó el último año cursado. Las calificaciones en escala literal se utilizaron en su equivalente vigesimal. El procesamiento se realizó en Python 3 con las bibliotecas Pandas, NumPy, SciPy, Scikit-learn y XGBoost, en una estación de trabajo con 16 GB de memoria RAM.</w:t>
+        <w:t xml:space="preserve">Los insumos fueron las bases de admisión y del SIAGIE. El historial escolar, registrado en formato largo con un registro por grado, se transformó a formato ancho con una fila por estudiante, y en los grados repetidos se conservó el último año cursado. Las calificaciones en escala literal se utilizaron en su equivalente vigesimal. El procesamiento se realizó en Python 3 con las bibliotecas Pandas, NumPy, SciPy, Scikit-learn y XGBoost, en una estación de trabajo con 16 GB de memoria RAM.</w:t>
       </w:r>
     </w:p>
     <w:p>
@@ -8709,7 +8709,7 @@
         <w:pStyle w:val="NORML4L5"/>
       </w:pPr>
       <w:r>
-        <w:t xml:space="preserve">donde x_i y y_j son las observaciones de ingresantes y no ingresantes, y n₁ y n₂ los tamaños de cada grupo; valores absolutos de 0.147, 0.33 y 0.474 delimitan efectos pequeños, medianos y grandes. En las variables categóricas se aplicó la prueba chi cuadrado de independencia, con la V de Cramér (Cramér, 1946):</w:t>
+        <w:t xml:space="preserve">donde x_i y y_j son las observaciones de ingresantes y no ingresantes, y n₁ y n₂ los tamaños de cada grupo. Los valores absolutos de 0.147, 0.33 y 0.474 delimitan efectos pequeños, medianos y grandes. En las variables categóricas se aplicó la prueba chi cuadrado de independencia, con la V de Cramér (Cramér, 1946):</w:t>
       </w:r>
     </w:p>
     <w:p>
@@ -9085,7 +9085,7 @@
         <w:pStyle w:val="NORML4L5"/>
       </w:pPr>
       <w:r>
-        <w:t xml:space="preserve">Las variables numéricas se tradujeron a descriptores verbales; por ejemplo, un promedio igual o mayor a 16 se describió como alto desempeño, de 13 a menos de 16 como desempeño satisfactorio, de 11 a menos de 13 como desempeño en proceso y menor a 11 como desempeño en inicio. Para cada persona se tomó su postulación más reciente y se estimó con el modelo tabular la probabilidad de ingreso en los diez programas más demandados de su área académica, conservándose los tres de mayor probabilidad. Debido a que la ponderación de la clase minoritaria desplaza las salidas del modelo hacia valores altos, las probabilidades se calibraron mediante regresión isotónica ajustada sobre las predicciones fuera de pliegue, de modo que correspondan a frecuencias de ingreso observadas.</w:t>
+        <w:t xml:space="preserve">Las variables numéricas se tradujeron a descriptores verbales. Por ejemplo, un promedio igual o mayor a 16 se describió como alto desempeño, de 13 a menos de 16 como desempeño satisfactorio, de 11 a menos de 13 como desempeño en proceso y menor a 11 como desempeño en inicio. Para cada persona se tomó su postulación más reciente y se estimó con el modelo tabular la probabilidad de ingreso en los diez programas más demandados de su área académica, conservándose los tres de mayor probabilidad. Debido a que la ponderación de la clase minoritaria desplaza las salidas del modelo hacia valores altos, las probabilidades se calibraron mediante regresión isotónica ajustada sobre las predicciones fuera de pliegue, de modo que correspondan a frecuencias de ingreso observadas.</w:t>
       </w:r>
     </w:p>
     <w:p>
@@ -9165,7 +9165,7 @@
         <w:pStyle w:val="NORML4L5"/>
       </w:pPr>
       <w:r>
-        <w:t xml:space="preserve">Cada par se formateó con la plantilla de conversación del modelo, con un mensaje de sistema que define el rol de orientador vocacional, la instrucción como mensaje del usuario y la ruta de referencia como respuesta; la pérdida se calculó únicamente sobre la respuesta. La Figura 3 resume el proceso. Al finalizar, los adaptadores se guardaron por separado y pueden fusionarse con el modelo base para la inferencia.</w:t>
+        <w:t xml:space="preserve">Cada par se formateó con la plantilla de conversación del modelo, con un mensaje de sistema que define el rol de orientador vocacional, la instrucción como mensaje del usuario y la ruta de referencia como respuesta. La pérdida se calculó únicamente sobre la respuesta. La Figura 3 resume el proceso. Al finalizar, los adaptadores se guardaron por separado y pueden fusionarse con el modelo base para la inferencia.</w:t>
       </w:r>
     </w:p>
     <w:p>
@@ -10014,7 +10014,7 @@
         <w:pStyle w:val="NORML4L5"/>
       </w:pPr>
       <w:r>
-        <w:t xml:space="preserve">Para la calidad de las rutas se comparan tres condiciones sobre la misma partición de prueba: el modelo de lenguaje base sin ajuste, que recibe el perfil y el ranking; el modelo ajustado con LoRA sin el componente tabular, entrenado y evaluado con el perfil pero sin las probabilidades; y la arquitectura híbrida CareER-GPT, ajustada con LoRA y alimentada con el ranking calibrado. Para cada ruta se calcula una métrica combinada como el promedio de ROUGE-L, BERTScore F1 y coherencia. Los experimentos se registran con control de versiones en Git.</w:t>
+        <w:t xml:space="preserve">Para la calidad de las rutas se comparan tres condiciones sobre la misma partición de prueba: el modelo de lenguaje base sin ajuste, que recibe el perfil y el ranking, el modelo ajustado con LoRA sin el componente tabular, entrenado y evaluado con el perfil pero sin las probabilidades, y la arquitectura híbrida CareER-GPT, ajustada con LoRA y alimentada con el ranking calibrado. Para cada ruta se calcula una métrica combinada como el promedio de ROUGE-L, BERTScore F1 y coherencia. Los experimentos se registran con control de versiones en Git.</w:t>
       </w:r>
     </w:p>
     <w:p>
@@ -16417,7 +16417,7 @@
         <w:t xml:space="preserve">Nota.</w:t>
       </w:r>
       <w:r>
-        <w:t xml:space="preserve"> Ganancia relativa acumulada en las divisiones de los árboles; los colores indican el tipo de variable. Elaboración propia.</w:t>
+        <w:t xml:space="preserve"> Ganancia relativa acumulada en las divisiones de los árboles. Los colores indican el tipo de variable. Elaboración propia.</w:t>
       </w:r>
     </w:p>
     <w:p>
@@ -18156,10 +18156,181 @@
             </w:pPr>
             <w:r>
               <w:rPr>
+                <w:b/>
                 <w:sz w:val="20"/>
                 <w:szCs w:val="20"/>
               </w:rPr>
-              <w:t xml:space="preserve">Perfil del postulante: procede de un colegio público de área urbana (UGEL MELGAR); promedio de secundaria con desempeño satisfactorio; mayor fortaleza en Matemática y menor en Ciencia y Tecnología; postulaciones anteriores: 0; preparación preuniversitaria: ninguna; área de interés: biomédicas. Probabilidades estimadas de ingreso: BIOLOGÍA: ECOLOGÍA 6.8 %; BIOLOGÍA: PESQUERÍA 6.8 %; MEDICINA VETERINARIA Y ZOOTECNIA 5.4 %. Genera una ruta educativa personalizada.</w:t>
+              <w:t xml:space="preserve">Perfil del postulante:</w:t>
+            </w:r>
+          </w:p>
+          <w:p>
+            <w:pPr>
+              <w:pStyle w:val="CONTTBFB"/>
+              <w:spacing w:after="0" w:line="240" w:lineRule="auto"/>
+              <w:jc w:val="left"/>
+            </w:pPr>
+            <w:r>
+              <w:rPr>
+                <w:sz w:val="20"/>
+                <w:szCs w:val="20"/>
+              </w:rPr>
+              <w:t xml:space="preserve">• Procede de un colegio público de área urbana (UGEL MELGAR)</w:t>
+            </w:r>
+          </w:p>
+          <w:p>
+            <w:pPr>
+              <w:pStyle w:val="CONTTBFB"/>
+              <w:spacing w:after="0" w:line="240" w:lineRule="auto"/>
+              <w:jc w:val="left"/>
+            </w:pPr>
+            <w:r>
+              <w:rPr>
+                <w:sz w:val="20"/>
+                <w:szCs w:val="20"/>
+              </w:rPr>
+              <w:t xml:space="preserve">• Promedio de secundaria con desempeño satisfactorio</w:t>
+            </w:r>
+          </w:p>
+          <w:p>
+            <w:pPr>
+              <w:pStyle w:val="CONTTBFB"/>
+              <w:spacing w:after="0" w:line="240" w:lineRule="auto"/>
+              <w:jc w:val="left"/>
+            </w:pPr>
+            <w:r>
+              <w:rPr>
+                <w:sz w:val="20"/>
+                <w:szCs w:val="20"/>
+              </w:rPr>
+              <w:t xml:space="preserve">• Mayor fortaleza en Matemática y menor en Ciencia y Tecnología</w:t>
+            </w:r>
+          </w:p>
+          <w:p>
+            <w:pPr>
+              <w:pStyle w:val="CONTTBFB"/>
+              <w:spacing w:after="0" w:line="240" w:lineRule="auto"/>
+              <w:jc w:val="left"/>
+            </w:pPr>
+            <w:r>
+              <w:rPr>
+                <w:sz w:val="20"/>
+                <w:szCs w:val="20"/>
+              </w:rPr>
+              <w:t xml:space="preserve">• Postulaciones anteriores: 0</w:t>
+            </w:r>
+          </w:p>
+          <w:p>
+            <w:pPr>
+              <w:pStyle w:val="CONTTBFB"/>
+              <w:spacing w:after="0" w:line="240" w:lineRule="auto"/>
+              <w:jc w:val="left"/>
+            </w:pPr>
+            <w:r>
+              <w:rPr>
+                <w:sz w:val="20"/>
+                <w:szCs w:val="20"/>
+              </w:rPr>
+              <w:t xml:space="preserve">• Preparación preuniversitaria: ninguna</w:t>
+            </w:r>
+          </w:p>
+          <w:p>
+            <w:pPr>
+              <w:pStyle w:val="CONTTBFB"/>
+              <w:spacing w:after="0" w:line="240" w:lineRule="auto"/>
+              <w:jc w:val="left"/>
+            </w:pPr>
+            <w:r>
+              <w:rPr>
+                <w:sz w:val="20"/>
+                <w:szCs w:val="20"/>
+              </w:rPr>
+              <w:t xml:space="preserve">• Área de interés: biomédicas</w:t>
+            </w:r>
+          </w:p>
+          <w:p>
+            <w:pPr>
+              <w:pStyle w:val="CONTTBFB"/>
+              <w:spacing w:after="0" w:line="240" w:lineRule="auto"/>
+              <w:jc w:val="left"/>
+            </w:pPr>
+            <w:r>
+              <w:rPr>
+                <w:b/>
+                <w:sz w:val="20"/>
+                <w:szCs w:val="20"/>
+              </w:rPr>
+              <w:t xml:space="preserve">Probabilidades estimadas de ingreso:</w:t>
+            </w:r>
+          </w:p>
+          <w:p>
+            <w:pPr>
+              <w:pStyle w:val="CONTTBFB"/>
+              <w:spacing w:after="0" w:line="240" w:lineRule="auto"/>
+              <w:jc w:val="left"/>
+            </w:pPr>
+            <w:r>
+              <w:rPr>
+                <w:sz w:val="20"/>
+                <w:szCs w:val="20"/>
+              </w:rPr>
+              <w:t xml:space="preserve">• BIOLOGÍA: ECOLOGÍA 6.8 %</w:t>
+            </w:r>
+          </w:p>
+          <w:p>
+            <w:pPr>
+              <w:pStyle w:val="CONTTBFB"/>
+              <w:spacing w:after="0" w:line="240" w:lineRule="auto"/>
+              <w:jc w:val="left"/>
+            </w:pPr>
+            <w:r>
+              <w:rPr>
+                <w:sz w:val="20"/>
+                <w:szCs w:val="20"/>
+              </w:rPr>
+              <w:t xml:space="preserve">• BIOLOGÍA: PESQUERÍA 6.8 %</w:t>
+            </w:r>
+          </w:p>
+          <w:p>
+            <w:pPr>
+              <w:pStyle w:val="CONTTBFB"/>
+              <w:spacing w:after="0" w:line="240" w:lineRule="auto"/>
+              <w:jc w:val="left"/>
+            </w:pPr>
+            <w:r>
+              <w:rPr>
+                <w:sz w:val="20"/>
+                <w:szCs w:val="20"/>
+              </w:rPr>
+              <w:t xml:space="preserve">• MEDICINA VETERINARIA Y ZOOTECNIA 5.4 %</w:t>
+            </w:r>
+          </w:p>
+          <w:p>
+            <w:pPr>
+              <w:pStyle w:val="CONTTBFB"/>
+              <w:spacing w:after="0" w:line="240" w:lineRule="auto"/>
+              <w:jc w:val="left"/>
+            </w:pPr>
+            <w:r>
+              <w:rPr>
+                <w:b/>
+                <w:sz w:val="20"/>
+                <w:szCs w:val="20"/>
+              </w:rPr>
+              <w:t xml:space="preserve">Solicitud:</w:t>
+            </w:r>
+          </w:p>
+          <w:p>
+            <w:pPr>
+              <w:pStyle w:val="CONTTBFB"/>
+              <w:spacing w:after="0" w:line="240" w:lineRule="auto"/>
+              <w:jc w:val="left"/>
+            </w:pPr>
+            <w:r>
+              <w:rPr>
+                <w:sz w:val="20"/>
+                <w:szCs w:val="20"/>
+              </w:rPr>
+              <w:t xml:space="preserve">• Genera una ruta educativa personalizada.</w:t>
             </w:r>
           </w:p>
         </w:tc>
@@ -18210,7 +18381,77 @@
                 <w:sz w:val="20"/>
                 <w:szCs w:val="20"/>
               </w:rPr>
-              <w:t xml:space="preserve">Ruta educativa sugerida. Primera opción recomendada: BIOLOGÍA: ECOLOGÍA, con la mayor probabilidad estimada de ingreso (6.8 %). Alternativas: BIOLOGÍA: PESQUERÍA (6.8 %) y MEDICINA VETERINARIA Y ZOOTECNIA (5.4 %). Tu fortaleza en Matemática es coherente con estas opciones. Para mejorar tus posibilidades, refuerza Ciencia y Tecnología antes del examen y considera una preparación preuniversitaria estructurada. Estas probabilidades son estimaciones orientativas basadas en postulantes con perfiles similares, no una garantía de resultado.</w:t>
+              <w:t xml:space="preserve">• Ruta educativa sugerida.</w:t>
+            </w:r>
+          </w:p>
+          <w:p>
+            <w:pPr>
+              <w:pStyle w:val="CONTTBFB"/>
+              <w:spacing w:after="0" w:line="240" w:lineRule="auto"/>
+              <w:jc w:val="left"/>
+            </w:pPr>
+            <w:r>
+              <w:rPr>
+                <w:sz w:val="20"/>
+                <w:szCs w:val="20"/>
+              </w:rPr>
+              <w:t xml:space="preserve">• Primera opción recomendada: BIOLOGÍA: ECOLOGÍA, con la mayor probabilidad estimada de ingreso (6.8 %).</w:t>
+            </w:r>
+          </w:p>
+          <w:p>
+            <w:pPr>
+              <w:pStyle w:val="CONTTBFB"/>
+              <w:spacing w:after="0" w:line="240" w:lineRule="auto"/>
+              <w:jc w:val="left"/>
+            </w:pPr>
+            <w:r>
+              <w:rPr>
+                <w:sz w:val="20"/>
+                <w:szCs w:val="20"/>
+              </w:rPr>
+              <w:t xml:space="preserve">• Alternativas: BIOLOGÍA: PESQUERÍA (6.8 %) y MEDICINA VETERINARIA Y ZOOTECNIA (5.4 %).</w:t>
+            </w:r>
+          </w:p>
+          <w:p>
+            <w:pPr>
+              <w:pStyle w:val="CONTTBFB"/>
+              <w:spacing w:after="0" w:line="240" w:lineRule="auto"/>
+              <w:jc w:val="left"/>
+            </w:pPr>
+            <w:r>
+              <w:rPr>
+                <w:sz w:val="20"/>
+                <w:szCs w:val="20"/>
+              </w:rPr>
+              <w:t xml:space="preserve">• Tu fortaleza en Matemática es coherente con estas opciones.</w:t>
+            </w:r>
+          </w:p>
+          <w:p>
+            <w:pPr>
+              <w:pStyle w:val="CONTTBFB"/>
+              <w:spacing w:after="0" w:line="240" w:lineRule="auto"/>
+              <w:jc w:val="left"/>
+            </w:pPr>
+            <w:r>
+              <w:rPr>
+                <w:sz w:val="20"/>
+                <w:szCs w:val="20"/>
+              </w:rPr>
+              <w:t xml:space="preserve">• Para mejorar tus posibilidades, refuerza Ciencia y Tecnología antes del examen y considera una preparación preuniversitaria estructurada.</w:t>
+            </w:r>
+          </w:p>
+          <w:p>
+            <w:pPr>
+              <w:pStyle w:val="CONTTBFB"/>
+              <w:spacing w:after="0" w:line="240" w:lineRule="auto"/>
+              <w:jc w:val="left"/>
+            </w:pPr>
+            <w:r>
+              <w:rPr>
+                <w:sz w:val="20"/>
+                <w:szCs w:val="20"/>
+              </w:rPr>
+              <w:t xml:space="preserve">• Estas probabilidades son estimaciones orientativas basadas en postulantes con perfiles similares, no una garantía de resultado.</w:t>
             </w:r>
           </w:p>
         </w:tc>
@@ -18227,7 +18468,7 @@
         <w:t xml:space="preserve">Nota.</w:t>
       </w:r>
       <w:r>
-        <w:t xml:space="preserve"> Par correspondiente a la partición de entrenamiento. Elaboración propia.</w:t>
+        <w:t xml:space="preserve"> Par correspondiente a la partición de entrenamiento. En el corpus, la instrucción y la respuesta son párrafos continuos. Aquí se presentan por elementos para facilitar su lectura. Elaboración propia.</w:t>
       </w:r>
     </w:p>
     <w:p>
@@ -18294,7 +18535,7 @@
     <w:tbl>
       <w:tblPr>
         <w:tblStyle w:val="Tablaconcuadrcula"/>
-        <w:tblW w:w="7083" w:type="dxa"/>
+        <w:tblW w:w="7085" w:type="dxa"/>
         <w:tblInd w:w="1418" w:type="dxa"/>
         <w:tblBorders>
           <w:top w:val="none" w:sz="0" w:space="0" w:color="auto"/>
@@ -18307,12 +18548,12 @@
         <w:tblLayout w:type="fixed"/>
       </w:tblPr>
       <w:tblGrid>
-        <w:gridCol w:w="2408"/>
-        <w:gridCol w:w="935"/>
-        <w:gridCol w:w="935"/>
-        <w:gridCol w:w="935"/>
-        <w:gridCol w:w="935"/>
-        <w:gridCol w:w="935"/>
+        <w:gridCol w:w="1285"/>
+        <w:gridCol w:w="1150"/>
+        <w:gridCol w:w="950"/>
+        <w:gridCol w:w="850"/>
+        <w:gridCol w:w="1450"/>
+        <w:gridCol w:w="1400"/>
       </w:tblGrid>
       <w:tr>
         <w:trPr>
@@ -18320,7 +18561,7 @@
         </w:trPr>
         <w:tc>
           <w:tcPr>
-            <w:tcW w:w="2408" w:type="dxa"/>
+            <w:tcW w:w="1285" w:type="dxa"/>
             <w:tcBorders>
               <w:top w:val="single" w:sz="4" w:space="0" w:color="auto"/>
               <w:bottom w:val="single" w:sz="4" w:space="0" w:color="auto"/>
@@ -18345,7 +18586,7 @@
         </w:tc>
         <w:tc>
           <w:tcPr>
-            <w:tcW w:w="935" w:type="dxa"/>
+            <w:tcW w:w="1150" w:type="dxa"/>
             <w:tcBorders>
               <w:top w:val="single" w:sz="4" w:space="0" w:color="auto"/>
               <w:bottom w:val="single" w:sz="4" w:space="0" w:color="auto"/>
@@ -18370,7 +18611,7 @@
         </w:tc>
         <w:tc>
           <w:tcPr>
-            <w:tcW w:w="935" w:type="dxa"/>
+            <w:tcW w:w="950" w:type="dxa"/>
             <w:tcBorders>
               <w:top w:val="single" w:sz="4" w:space="0" w:color="auto"/>
               <w:bottom w:val="single" w:sz="4" w:space="0" w:color="auto"/>
@@ -18395,7 +18636,7 @@
         </w:tc>
         <w:tc>
           <w:tcPr>
-            <w:tcW w:w="935" w:type="dxa"/>
+            <w:tcW w:w="850" w:type="dxa"/>
             <w:tcBorders>
               <w:top w:val="single" w:sz="4" w:space="0" w:color="auto"/>
               <w:bottom w:val="single" w:sz="4" w:space="0" w:color="auto"/>
@@ -18420,7 +18661,7 @@
         </w:tc>
         <w:tc>
           <w:tcPr>
-            <w:tcW w:w="935" w:type="dxa"/>
+            <w:tcW w:w="1450" w:type="dxa"/>
             <w:tcBorders>
               <w:top w:val="single" w:sz="4" w:space="0" w:color="auto"/>
               <w:bottom w:val="single" w:sz="4" w:space="0" w:color="auto"/>
@@ -18445,7 +18686,7 @@
         </w:tc>
         <w:tc>
           <w:tcPr>
-            <w:tcW w:w="935" w:type="dxa"/>
+            <w:tcW w:w="1400" w:type="dxa"/>
             <w:tcBorders>
               <w:top w:val="single" w:sz="4" w:space="0" w:color="auto"/>
               <w:bottom w:val="single" w:sz="4" w:space="0" w:color="auto"/>
@@ -18475,7 +18716,7 @@
         </w:trPr>
         <w:tc>
           <w:tcPr>
-            <w:tcW w:w="2408" w:type="dxa"/>
+            <w:tcW w:w="1285" w:type="dxa"/>
             <w:tcBorders/>
             <w:vAlign w:val="center"/>
           </w:tcPr>
@@ -18496,7 +18737,7 @@
         </w:tc>
         <w:tc>
           <w:tcPr>
-            <w:tcW w:w="935" w:type="dxa"/>
+            <w:tcW w:w="1150" w:type="dxa"/>
             <w:tcBorders/>
             <w:vAlign w:val="center"/>
           </w:tcPr>
@@ -18517,7 +18758,7 @@
         </w:tc>
         <w:tc>
           <w:tcPr>
-            <w:tcW w:w="935" w:type="dxa"/>
+            <w:tcW w:w="950" w:type="dxa"/>
             <w:tcBorders/>
             <w:vAlign w:val="center"/>
           </w:tcPr>
@@ -18538,7 +18779,7 @@
         </w:tc>
         <w:tc>
           <w:tcPr>
-            <w:tcW w:w="935" w:type="dxa"/>
+            <w:tcW w:w="850" w:type="dxa"/>
             <w:tcBorders/>
             <w:vAlign w:val="center"/>
           </w:tcPr>
@@ -18559,7 +18800,7 @@
         </w:tc>
         <w:tc>
           <w:tcPr>
-            <w:tcW w:w="935" w:type="dxa"/>
+            <w:tcW w:w="1450" w:type="dxa"/>
             <w:tcBorders/>
             <w:vAlign w:val="center"/>
           </w:tcPr>
@@ -18580,7 +18821,7 @@
         </w:tc>
         <w:tc>
           <w:tcPr>
-            <w:tcW w:w="935" w:type="dxa"/>
+            <w:tcW w:w="1400" w:type="dxa"/>
             <w:tcBorders/>
             <w:vAlign w:val="center"/>
           </w:tcPr>
@@ -18606,7 +18847,7 @@
         </w:trPr>
         <w:tc>
           <w:tcPr>
-            <w:tcW w:w="2408" w:type="dxa"/>
+            <w:tcW w:w="1285" w:type="dxa"/>
             <w:tcBorders>
               <w:bottom w:val="single" w:sz="4" w:space="0" w:color="auto"/>
             </w:tcBorders>
@@ -18629,7 +18870,7 @@
         </w:tc>
         <w:tc>
           <w:tcPr>
-            <w:tcW w:w="935" w:type="dxa"/>
+            <w:tcW w:w="1150" w:type="dxa"/>
             <w:tcBorders>
               <w:bottom w:val="single" w:sz="4" w:space="0" w:color="auto"/>
             </w:tcBorders>
@@ -18652,7 +18893,7 @@
         </w:tc>
         <w:tc>
           <w:tcPr>
-            <w:tcW w:w="935" w:type="dxa"/>
+            <w:tcW w:w="950" w:type="dxa"/>
             <w:tcBorders>
               <w:bottom w:val="single" w:sz="4" w:space="0" w:color="auto"/>
             </w:tcBorders>
@@ -18675,7 +18916,7 @@
         </w:tc>
         <w:tc>
           <w:tcPr>
-            <w:tcW w:w="935" w:type="dxa"/>
+            <w:tcW w:w="850" w:type="dxa"/>
             <w:tcBorders>
               <w:bottom w:val="single" w:sz="4" w:space="0" w:color="auto"/>
             </w:tcBorders>
@@ -18698,7 +18939,7 @@
         </w:tc>
         <w:tc>
           <w:tcPr>
-            <w:tcW w:w="935" w:type="dxa"/>
+            <w:tcW w:w="1450" w:type="dxa"/>
             <w:tcBorders>
               <w:bottom w:val="single" w:sz="4" w:space="0" w:color="auto"/>
             </w:tcBorders>
@@ -18721,7 +18962,7 @@
         </w:tc>
         <w:tc>
           <w:tcPr>
-            <w:tcW w:w="935" w:type="dxa"/>
+            <w:tcW w:w="1400" w:type="dxa"/>
             <w:tcBorders>
               <w:bottom w:val="single" w:sz="4" w:space="0" w:color="auto"/>
             </w:tcBorders>
@@ -18860,7 +19101,7 @@
         <w:pStyle w:val="NORML4L5"/>
       </w:pPr>
       <w:r>
-        <w:t xml:space="preserve">Se generaron rutas para 300 pares de la partición de prueba, correspondientes a personas no vistas durante el entrenamiento. El modelo CareER-GPT obtuvo un ROUGE-L de 1.000, un BERTScore F1 de 1.000 y una coherencia de 1.000; el 100.0 % de sus rutas coincidió literalmente con la respuesta de referencia. Este resultado se explica porque las referencias del corpus se construyeron con una estructura fija a partir del ranking del componente tabular, de modo que el modelo aprendió a trasladar con exactitud las probabilidades y los programas recibidos a una ruta redactada. La Tabla 14 presenta un ejemplo de las rutas generadas en cada condición.</w:t>
+        <w:t xml:space="preserve">Se generaron rutas para 300 pares de la partición de prueba, correspondientes a personas no vistas durante el entrenamiento. El modelo CareER-GPT obtuvo un ROUGE-L de 1.000, un BERTScore F1 de 1.000 y una coherencia de 1.000, y el 100.0 % de sus rutas coincidió literalmente con la respuesta de referencia. Este resultado se explica porque las referencias del corpus se construyeron con una estructura fija a partir del ranking del componente tabular, de modo que el modelo aprendió a trasladar con exactitud las probabilidades y los programas recibidos a una ruta redactada. La Tabla 14 presenta un ejemplo de las rutas generadas en cada condición.</w:t>
       </w:r>
     </w:p>
     <w:p>
@@ -19008,7 +19249,77 @@
                 <w:sz w:val="20"/>
                 <w:szCs w:val="20"/>
               </w:rPr>
-              <w:t xml:space="preserve">Ruta educativa sugerida. Primera opción recomendada: INGENIERÍA TOPOGRÁFICA Y AGRIMENSURA, con la mayor probabilidad estimada de ingreso (38.1 %). Alternativas: INGENIERÍA MECÁNICA ELÉCTRICA (38.1 %) y EDUCACIÓN SECUNDARIA DE LA ESPECIALIDAD DE MATEMÁTICA, FÍSICA, COMPUTACIÓN E INFORMÁTICA (36.0 %). Tu fortaleza en Comunicación es coherente con estas opciones. Para mejorar tus posibilidades, refuerza Ciencia y Tecnología antes del examen. Estas [...]</w:t>
+              <w:t xml:space="preserve">• Ruta educativa sugerida.</w:t>
+            </w:r>
+          </w:p>
+          <w:p>
+            <w:pPr>
+              <w:pStyle w:val="CONTTBFB"/>
+              <w:spacing w:after="0" w:line="240" w:lineRule="auto"/>
+              <w:jc w:val="left"/>
+            </w:pPr>
+            <w:r>
+              <w:rPr>
+                <w:sz w:val="20"/>
+                <w:szCs w:val="20"/>
+              </w:rPr>
+              <w:t xml:space="preserve">• Primera opción recomendada: INGENIERÍA TOPOGRÁFICA Y AGRIMENSURA, con la mayor probabilidad estimada de ingreso (38.1 %).</w:t>
+            </w:r>
+          </w:p>
+          <w:p>
+            <w:pPr>
+              <w:pStyle w:val="CONTTBFB"/>
+              <w:spacing w:after="0" w:line="240" w:lineRule="auto"/>
+              <w:jc w:val="left"/>
+            </w:pPr>
+            <w:r>
+              <w:rPr>
+                <w:sz w:val="20"/>
+                <w:szCs w:val="20"/>
+              </w:rPr>
+              <w:t xml:space="preserve">• Alternativas: INGENIERÍA MECÁNICA ELÉCTRICA (38.1 %) y EDUCACIÓN SECUNDARIA DE LA ESPECIALIDAD DE MATEMÁTICA, FÍSICA, COMPUTACIÓN E INFORMÁTICA (36.0 %).</w:t>
+            </w:r>
+          </w:p>
+          <w:p>
+            <w:pPr>
+              <w:pStyle w:val="CONTTBFB"/>
+              <w:spacing w:after="0" w:line="240" w:lineRule="auto"/>
+              <w:jc w:val="left"/>
+            </w:pPr>
+            <w:r>
+              <w:rPr>
+                <w:sz w:val="20"/>
+                <w:szCs w:val="20"/>
+              </w:rPr>
+              <w:t xml:space="preserve">• Tu fortaleza en Comunicación es coherente con estas opciones.</w:t>
+            </w:r>
+          </w:p>
+          <w:p>
+            <w:pPr>
+              <w:pStyle w:val="CONTTBFB"/>
+              <w:spacing w:after="0" w:line="240" w:lineRule="auto"/>
+              <w:jc w:val="left"/>
+            </w:pPr>
+            <w:r>
+              <w:rPr>
+                <w:sz w:val="20"/>
+                <w:szCs w:val="20"/>
+              </w:rPr>
+              <w:t xml:space="preserve">• Para mejorar tus posibilidades, refuerza Ciencia y Tecnología antes del examen.</w:t>
+            </w:r>
+          </w:p>
+          <w:p>
+            <w:pPr>
+              <w:pStyle w:val="CONTTBFB"/>
+              <w:spacing w:after="0" w:line="240" w:lineRule="auto"/>
+              <w:jc w:val="left"/>
+            </w:pPr>
+            <w:r>
+              <w:rPr>
+                <w:sz w:val="20"/>
+                <w:szCs w:val="20"/>
+              </w:rPr>
+              <w:t xml:space="preserve">• Estas probabilidades son estimaciones orientativas basadas en postulantes con perfiles similares, no una garantía de resultado.</w:t>
             </w:r>
           </w:p>
         </w:tc>
@@ -19055,7 +19366,77 @@
                 <w:sz w:val="20"/>
                 <w:szCs w:val="20"/>
               </w:rPr>
-              <w:t xml:space="preserve">Basándome en el perfil y las probabilidades proporcionados, puedo generar una ruta educativa personalizada para que tu postulante pueda aprovechar al máximo sus habilidades y fortalezas. Aquí te presento algunas sugerencias: 1. Comenzar su educación universitaria: Siempre es importante comenzar con los estudios universitarios. Considerando tus probabilidades, podrías considerar dos carreras: Ingeniería Topográfica y Agrimensura o Ingeniería Mecánica Electrónica. 2. [...]</w:t>
+              <w:t xml:space="preserve">Basándome en el perfil y las probabilidades proporcionados, puedo generar una ruta educativa personalizada para que tu postulante pueda aprovechar al máximo sus habilidades y fortalezas. Aquí te presento algunas sugerencias:</w:t>
+            </w:r>
+          </w:p>
+          <w:p>
+            <w:pPr>
+              <w:pStyle w:val="CONTTBFB"/>
+              <w:spacing w:after="0" w:line="240" w:lineRule="auto"/>
+              <w:jc w:val="left"/>
+            </w:pPr>
+            <w:r>
+              <w:rPr>
+                <w:sz w:val="20"/>
+                <w:szCs w:val="20"/>
+              </w:rPr>
+              <w:t xml:space="preserve">1. Comenzar su educación universitaria: Siempre es importante comenzar con los estudios universitarios. Considerando tus probabilidades, podrías considerar dos carreras: Ingeniería Topográfica y Agrimensura o Ingeniería Mecánica Electrónica.</w:t>
+            </w:r>
+          </w:p>
+          <w:p>
+            <w:pPr>
+              <w:pStyle w:val="CONTTBFB"/>
+              <w:spacing w:after="0" w:line="240" w:lineRule="auto"/>
+              <w:jc w:val="left"/>
+            </w:pPr>
+            <w:r>
+              <w:rPr>
+                <w:sz w:val="20"/>
+                <w:szCs w:val="20"/>
+              </w:rPr>
+              <w:t xml:space="preserve">2. Ingeniería Topográfica y Agrimensura:</w:t>
+            </w:r>
+          </w:p>
+          <w:p>
+            <w:pPr>
+              <w:pStyle w:val="CONTTBFB"/>
+              <w:spacing w:after="0" w:line="240" w:lineRule="auto"/>
+              <w:jc w:val="left"/>
+            </w:pPr>
+            <w:r>
+              <w:rPr>
+                <w:sz w:val="20"/>
+                <w:szCs w:val="20"/>
+              </w:rPr>
+              <w:t xml:space="preserve">• Esta carrera combina aspectos prácticos como geografía y ciencias naturales con técnicas de topografía.</w:t>
+            </w:r>
+          </w:p>
+          <w:p>
+            <w:pPr>
+              <w:pStyle w:val="CONTTBFB"/>
+              <w:spacing w:after="0" w:line="240" w:lineRule="auto"/>
+              <w:jc w:val="left"/>
+            </w:pPr>
+            <w:r>
+              <w:rPr>
+                <w:sz w:val="20"/>
+                <w:szCs w:val="20"/>
+              </w:rPr>
+              <w:t xml:space="preserve">• Es una opción interesante si tu postulante tiene una fuerte base en Geografía y Ciencias Naturales.</w:t>
+            </w:r>
+          </w:p>
+          <w:p>
+            <w:pPr>
+              <w:pStyle w:val="CONTTBFB"/>
+              <w:spacing w:after="0" w:line="240" w:lineRule="auto"/>
+              <w:jc w:val="left"/>
+            </w:pPr>
+            <w:r>
+              <w:rPr>
+                <w:sz w:val="20"/>
+                <w:szCs w:val="20"/>
+              </w:rPr>
+              <w:t xml:space="preserve">• La probabilidad de ingresar a esta carrera es alta (38.1%).</w:t>
             </w:r>
           </w:p>
         </w:tc>
@@ -19102,7 +19483,77 @@
                 <w:sz w:val="20"/>
                 <w:szCs w:val="20"/>
               </w:rPr>
-              <w:t xml:space="preserve">Ruta educativa sugerida. Primera opción recomendada: INGENIERÍA AGRONÓMICA, con la mayor probabilidad estimada de ingreso (16.4 %). Alternativas: INGENIERÍA TOPOGRÁFICA Y AGRIMENSURA (16.2 %) y INGENIERÍA MECÁNICA ELÉCTRICA (13.8 %). Tu fortaleza en Comunicación es coherente con estas opciones. Para mejorar tus posibilidades, refuerza Ciencia y Tecnología antes del examen. Estas probabilidades son estimaciones orientativas basadas en postulantes con perfiles [...]</w:t>
+              <w:t xml:space="preserve">• Ruta educativa sugerida.</w:t>
+            </w:r>
+          </w:p>
+          <w:p>
+            <w:pPr>
+              <w:pStyle w:val="CONTTBFB"/>
+              <w:spacing w:after="0" w:line="240" w:lineRule="auto"/>
+              <w:jc w:val="left"/>
+            </w:pPr>
+            <w:r>
+              <w:rPr>
+                <w:sz w:val="20"/>
+                <w:szCs w:val="20"/>
+              </w:rPr>
+              <w:t xml:space="preserve">• Primera opción recomendada: INGENIERÍA AGRONÓMICA, con la mayor probabilidad estimada de ingreso (16.4 %).</w:t>
+            </w:r>
+          </w:p>
+          <w:p>
+            <w:pPr>
+              <w:pStyle w:val="CONTTBFB"/>
+              <w:spacing w:after="0" w:line="240" w:lineRule="auto"/>
+              <w:jc w:val="left"/>
+            </w:pPr>
+            <w:r>
+              <w:rPr>
+                <w:sz w:val="20"/>
+                <w:szCs w:val="20"/>
+              </w:rPr>
+              <w:t xml:space="preserve">• Alternativas: INGENIERÍA TOPOGRÁFICA Y AGRIMENSURA (16.2 %) y INGENIERÍA MECÁNICA ELÉCTRICA (13.8 %).</w:t>
+            </w:r>
+          </w:p>
+          <w:p>
+            <w:pPr>
+              <w:pStyle w:val="CONTTBFB"/>
+              <w:spacing w:after="0" w:line="240" w:lineRule="auto"/>
+              <w:jc w:val="left"/>
+            </w:pPr>
+            <w:r>
+              <w:rPr>
+                <w:sz w:val="20"/>
+                <w:szCs w:val="20"/>
+              </w:rPr>
+              <w:t xml:space="preserve">• Tu fortaleza en Comunicación es coherente con estas opciones.</w:t>
+            </w:r>
+          </w:p>
+          <w:p>
+            <w:pPr>
+              <w:pStyle w:val="CONTTBFB"/>
+              <w:spacing w:after="0" w:line="240" w:lineRule="auto"/>
+              <w:jc w:val="left"/>
+            </w:pPr>
+            <w:r>
+              <w:rPr>
+                <w:sz w:val="20"/>
+                <w:szCs w:val="20"/>
+              </w:rPr>
+              <w:t xml:space="preserve">• Para mejorar tus posibilidades, refuerza Ciencia y Tecnología antes del examen.</w:t>
+            </w:r>
+          </w:p>
+          <w:p>
+            <w:pPr>
+              <w:pStyle w:val="CONTTBFB"/>
+              <w:spacing w:after="0" w:line="240" w:lineRule="auto"/>
+              <w:jc w:val="left"/>
+            </w:pPr>
+            <w:r>
+              <w:rPr>
+                <w:sz w:val="20"/>
+                <w:szCs w:val="20"/>
+              </w:rPr>
+              <w:t xml:space="preserve">• Estas probabilidades son estimaciones orientativas basadas en postulantes con perfiles similares, no una garantía de resultado.</w:t>
             </w:r>
           </w:p>
         </w:tc>
@@ -19153,7 +19604,77 @@
                 <w:sz w:val="20"/>
                 <w:szCs w:val="20"/>
               </w:rPr>
-              <w:t xml:space="preserve">Ruta educativa sugerida. Primera opción recomendada: INGENIERÍA TOPOGRÁFICA Y AGRIMENSURA, con la mayor probabilidad estimada de ingreso (38.1 %). Alternativas: INGENIERÍA MECÁNICA ELÉCTRICA (38.1 %) y EDUCACIÓN SECUNDARIA DE LA ESPECIALIDAD DE MATEMÁTICA, FÍSICA, COMPUTACIÓN E INFORMÁTICA (36.0 %). Tu fortaleza en Comunicación es coherente con estas opciones. Para mejorar tus posibilidades, refuerza Ciencia y Tecnología antes del examen. Estas [...]</w:t>
+              <w:t xml:space="preserve">• Ruta educativa sugerida.</w:t>
+            </w:r>
+          </w:p>
+          <w:p>
+            <w:pPr>
+              <w:pStyle w:val="CONTTBFB"/>
+              <w:spacing w:after="0" w:line="240" w:lineRule="auto"/>
+              <w:jc w:val="left"/>
+            </w:pPr>
+            <w:r>
+              <w:rPr>
+                <w:sz w:val="20"/>
+                <w:szCs w:val="20"/>
+              </w:rPr>
+              <w:t xml:space="preserve">• Primera opción recomendada: INGENIERÍA TOPOGRÁFICA Y AGRIMENSURA, con la mayor probabilidad estimada de ingreso (38.1 %).</w:t>
+            </w:r>
+          </w:p>
+          <w:p>
+            <w:pPr>
+              <w:pStyle w:val="CONTTBFB"/>
+              <w:spacing w:after="0" w:line="240" w:lineRule="auto"/>
+              <w:jc w:val="left"/>
+            </w:pPr>
+            <w:r>
+              <w:rPr>
+                <w:sz w:val="20"/>
+                <w:szCs w:val="20"/>
+              </w:rPr>
+              <w:t xml:space="preserve">• Alternativas: INGENIERÍA MECÁNICA ELÉCTRICA (38.1 %) y EDUCACIÓN SECUNDARIA DE LA ESPECIALIDAD DE MATEMÁTICA, FÍSICA, COMPUTACIÓN E INFORMÁTICA (36.0 %).</w:t>
+            </w:r>
+          </w:p>
+          <w:p>
+            <w:pPr>
+              <w:pStyle w:val="CONTTBFB"/>
+              <w:spacing w:after="0" w:line="240" w:lineRule="auto"/>
+              <w:jc w:val="left"/>
+            </w:pPr>
+            <w:r>
+              <w:rPr>
+                <w:sz w:val="20"/>
+                <w:szCs w:val="20"/>
+              </w:rPr>
+              <w:t xml:space="preserve">• Tu fortaleza en Comunicación es coherente con estas opciones.</w:t>
+            </w:r>
+          </w:p>
+          <w:p>
+            <w:pPr>
+              <w:pStyle w:val="CONTTBFB"/>
+              <w:spacing w:after="0" w:line="240" w:lineRule="auto"/>
+              <w:jc w:val="left"/>
+            </w:pPr>
+            <w:r>
+              <w:rPr>
+                <w:sz w:val="20"/>
+                <w:szCs w:val="20"/>
+              </w:rPr>
+              <w:t xml:space="preserve">• Para mejorar tus posibilidades, refuerza Ciencia y Tecnología antes del examen.</w:t>
+            </w:r>
+          </w:p>
+          <w:p>
+            <w:pPr>
+              <w:pStyle w:val="CONTTBFB"/>
+              <w:spacing w:after="0" w:line="240" w:lineRule="auto"/>
+              <w:jc w:val="left"/>
+            </w:pPr>
+            <w:r>
+              <w:rPr>
+                <w:sz w:val="20"/>
+                <w:szCs w:val="20"/>
+              </w:rPr>
+              <w:t xml:space="preserve">• Estas probabilidades son estimaciones orientativas basadas en postulantes con perfiles similares, no una garantía de resultado.</w:t>
             </w:r>
           </w:p>
         </w:tc>
@@ -19170,7 +19691,7 @@
         <w:t xml:space="preserve">Nota.</w:t>
       </w:r>
       <w:r>
-        <w:t xml:space="preserve"> Se muestran las primeras 60 palabras de cada ruta; [...] indica texto omitido. Se eliminaron los símbolos de formato del modelo base. Elaboración propia.</w:t>
+        <w:t xml:space="preserve"> Rutas completas, presentadas por oraciones para facilitar su lectura. La respuesta del modelo base termina incompleta porque alcanzó el máximo de 200 elementos generados. Se eliminaron sus símbolos de formato. Elaboración propia.</w:t>
       </w:r>
     </w:p>
     <w:p>
@@ -19178,7 +19699,7 @@
         <w:pStyle w:val="NORML4L5"/>
       </w:pPr>
       <w:r>
-        <w:t xml:space="preserve">Contraste de la hipótesis específica 3. La coherencia contextual del modelo ajustado con LoRA en la arquitectura híbrida fue de 1.000, con 300 de 300 rutas coherentes, valor superior al umbral de 0.80 según la prueba binomial exacta unilateral (p &lt; .001). En consecuencia, se acepta la hipótesis específica 3. Cabe precisar que el modelo ajustado sin el componente tabular alcanzó una coherencia de 0.813; la diferencia con la arquitectura híbrida corresponde al aporte del ranking.</w:t>
+        <w:t xml:space="preserve">Contraste de la hipótesis específica 3. La coherencia contextual del modelo ajustado con LoRA en la arquitectura híbrida fue de 1.000, con 300 de 300 rutas coherentes, valor superior al umbral de 0.80 según la prueba binomial exacta unilateral (p &lt; .001). En consecuencia, se acepta la hipótesis específica 3. Cabe precisar que el modelo ajustado sin el componente tabular alcanzó una coherencia de 0.813, y la diferencia con la arquitectura híbrida corresponde al aporte del ranking.</w:t>
       </w:r>
     </w:p>
     <w:p>
@@ -20438,7 +20959,7 @@
         <w:pStyle w:val="NORML4L5"/>
       </w:pPr>
       <w:r>
-        <w:t xml:space="preserve">La Tabla 17 compara las tres condiciones sobre los mismos 300 pares de prueba. El modelo base sin ajuste obtuvo una métrica combinada de 0.336: generó textos extensos, con formato propio y sin respetar el orden del ranking, con una coherencia de 0.233. El modelo ajustado sin el componente tabular alcanzó 0.890; reprodujo la estructura de la ruta, con un ROUGE-L de 0.877, cercano al de 0.836 que comparten referencias de personas distintas, pero al no conocer las probabilidades recomendó un programa distinto o en otro orden en el 18.7 % de los casos. La arquitectura híbrida alcanzó 1.000, con intervalos de confianza que no se superponen con los de las otras condiciones.</w:t>
+        <w:t xml:space="preserve">La Tabla 17 compara las tres condiciones sobre los mismos 300 pares de prueba. El modelo base sin ajuste obtuvo una métrica combinada de 0.336: generó textos extensos, con formato propio y sin respetar el orden del ranking, con una coherencia de 0.233. El modelo ajustado sin el componente tabular alcanzó 0.890. Reprodujo la estructura de la ruta, con un ROUGE-L de 0.877, cercano al de 0.836 que comparten referencias de personas distintas, pero al no conocer las probabilidades recomendó un programa distinto o en otro orden en el 18.7 % de los casos. La arquitectura híbrida alcanzó 1.000, con intervalos de confianza que no se superponen con los de las otras condiciones.</w:t>
       </w:r>
     </w:p>
     <w:p>
@@ -21724,7 +22245,7 @@
         <w:pStyle w:val="NORML4L5"/>
       </w:pPr>
       <w:r>
-        <w:t xml:space="preserve">Contraste de la hipótesis específica 4. En la calidad de las rutas generadas, la arquitectura híbrida superó a cada modelo individual en más del 10 % con diferencias estadísticamente significativas, por lo que se acepta la hipótesis específica 4 en esta dimensión. En la dimensión del rankeo, el ordenamiento que la arquitectura entrega es el del componente tabular, que no superó a la referencia por popularidad; por ello, la ventaja de la integración radica en traducir el ranking a una ruta comprensible y fiel a las probabilidades, y no en mejorar el orden de los programas.</w:t>
+        <w:t xml:space="preserve">Contraste de la hipótesis específica 4. En la calidad de las rutas generadas, la arquitectura híbrida superó a cada modelo individual en más del 10 % con diferencias estadísticamente significativas, por lo que se acepta la hipótesis específica 4 en esta dimensión. En la dimensión del rankeo, el ordenamiento que la arquitectura entrega es el del componente tabular, que no superó a la referencia por popularidad. Por ello, la ventaja de la integración radica en traducir el ranking a una ruta comprensible y fiel a las probabilidades, y no en mejorar el orden de los programas.</w:t>
       </w:r>
     </w:p>
     <w:p>
@@ -23418,7 +23939,7 @@
                 <w:sz w:val="18"/>
                 <w:szCs w:val="18"/>
               </w:rPr>
-              <w:t xml:space="preserve">H1: AUC-ROC igual o mayor a 0.85; AUC-PR; F1.</w:t>
+              <w:t xml:space="preserve">H1: AUC-ROC igual o mayor a 0.85, AUC-PR y F1.</w:t>
             </w:r>
           </w:p>
           <w:p>
@@ -23460,7 +23981,7 @@
                 <w:sz w:val="18"/>
                 <w:szCs w:val="18"/>
               </w:rPr>
-              <w:t xml:space="preserve">H4: NDCG@5, NDCG@10, MRR; mejora igual o mayor a 10 %.</w:t>
+              <w:t xml:space="preserve">H4: NDCG@5, NDCG@10 y MRR, con mejora igual o mayor a 10 %.</w:t>
             </w:r>
           </w:p>
           <w:p>
@@ -23541,7 +24062,7 @@
                 <w:sz w:val="18"/>
                 <w:szCs w:val="18"/>
               </w:rPr>
-              <w:t xml:space="preserve">censal; conjunto analítico de 42 156 postulaciones.</w:t>
+              <w:t xml:space="preserve">censal, con un conjunto analítico de 42 156 postulaciones.</w:t>
             </w:r>
           </w:p>
           <w:p>
@@ -23570,7 +24091,7 @@
                 <w:sz w:val="18"/>
                 <w:szCs w:val="18"/>
               </w:rPr>
-              <w:t xml:space="preserve">análisis documental de registros de admisión y del SIAGIE; validación cruzada; U de Mann-Whitney, chi cuadrado, t de Student y Wilcoxon.</w:t>
+              <w:t xml:space="preserve">análisis documental de registros de admisión y del SIAGIE, validación cruzada, U de Mann-Whitney, chi cuadrado, t de Student y Wilcoxon.</w:t>
             </w:r>
           </w:p>
         </w:tc>

</xml_diff>

<commit_message>
Verifica las referencias, usa la sigla UNA-Puno y genera citas de Mendeley
- Sigla oficial UNA-Puno según el Estatuto 2023: nombre completo con la
  sigla en la primera mención y luego solo la sigla.
- Verificación de las 60 referencias en Crossref y repositorios: todas
  con enlace; se corrigen autores mal separados, tipos de trabajo, años,
  números de artículo y el DOI de Jardón Gallegos et al.
- Las citas pasan a controles de contenido de Mendeley Cite con los
  metadatos de cada referencia, y la bibliografía queda en el bloque de
  Mendeley con cursivas APA 7.
- Se genera referencias_mendeley.ris para importar las referencias
  corregidas a Mendeley.

Co-Authored-By: Claude Opus 5.5 <noreply@anthropic.com>
Claude-Session: https://claude.ai/code/session_01DtqH3frdJcwNPf5uAWNPX3
</commit_message>
<xml_diff>
--- a/Borrador_Tesis_CareER-GPT_EPG_UNA.docx
+++ b/Borrador_Tesis_CareER-GPT_EPG_UNA.docx
@@ -5559,7 +5559,7 @@
               <w:pStyle w:val="CONTTBFB"/>
             </w:pPr>
             <w:r>
-              <w:t xml:space="preserve">UNAP</w:t>
+              <w:t xml:space="preserve">UNA-Puno</w:t>
             </w:r>
           </w:p>
         </w:tc>
@@ -5585,7 +5585,7 @@
               <w:pStyle w:val="CONTTBFB"/>
             </w:pPr>
             <w:r>
-              <w:t xml:space="preserve">Universidad Nacional del Altiplano de Puno</w:t>
+              <w:t xml:space="preserve">Universidad Nacional del Altiplano</w:t>
             </w:r>
           </w:p>
         </w:tc>
@@ -5812,13 +5812,13 @@
     <w:p>
       <w:pPr/>
       <w:r>
-        <w:t xml:space="preserve">La transición de la educación secundaria a la universidad es la etapa más vulnerable de la trayectoria académica, y en ella se concentra buena parte de la deserción universitaria. En el Perú, y de manera particular en la región de Puno, la decisión de a qué programa postular suele tomarse sin información personalizada sobre las probabilidades reales de éxito, pese a que las instituciones acumulan registros históricos que podrían orientar esa decisión. El presente estudio se inscribe en el programa de Maestría en Informática con mención en Gerencia de Tecnologías de Información y Comunicaciones de la Escuela de Posgrado de la Universidad Nacional del Altiplano, en la línea de investigación Inteligencia de negocios y datos, sublínea BI, Big Data, aprendizaje automático y visualización de datos.</w:t>
+        <w:t xml:space="preserve">La transición de la educación secundaria a la universidad es la etapa más vulnerable de la trayectoria académica, y en ella se concentra buena parte de la deserción universitaria. En el Perú, y de manera particular en la región de Puno, la decisión de a qué programa postular suele tomarse sin información personalizada sobre las probabilidades reales de éxito, pese a que las instituciones acumulan registros históricos que podrían orientar esa decisión. El presente estudio se inscribe en el programa de Maestría en Informática con mención en Gerencia de Tecnologías de Información y Comunicaciones de la Escuela de Posgrado de la Universidad Nacional del Altiplano (UNA-Puno), en la línea de investigación Inteligencia de negocios y datos, sublínea BI, Big Data, aprendizaje automático y visualización de datos.</w:t>
       </w:r>
     </w:p>
     <w:p>
       <w:pPr/>
       <w:r>
-        <w:t xml:space="preserve">El propósito de la investigación fue desarrollar y validar CareER-GPT, una arquitectura híbrida de inteligencia artificial que combina un modelo tabular, encargado de estimar y ordenar la probabilidad de ingreso de un postulante en cada programa de estudios, con un modelo de lenguaje grande ajustado mediante adaptación de bajo rango, encargado de traducir ese ordenamiento en una ruta educativa personalizada y comprensible. Para ello se integraron los registros de los procesos de admisión de la Universidad Nacional del Altiplano con el historial académico de educación secundaria registrado en el SIAGIE.</w:t>
+        <w:t xml:space="preserve">El propósito de la investigación fue desarrollar y validar CareER-GPT, una arquitectura híbrida de inteligencia artificial que combina un modelo tabular, encargado de estimar y ordenar la probabilidad de ingreso de un postulante en cada programa de estudios, con un modelo de lenguaje grande ajustado mediante adaptación de bajo rango, encargado de traducir ese ordenamiento en una ruta educativa personalizada y comprensible. Para ello se integraron los registros de los procesos de admisión de la UNA-Puno con el historial académico de educación secundaria registrado en el SIAGIE.</w:t>
       </w:r>
     </w:p>
     <w:p>
@@ -5931,7 +5931,21 @@
         <w:pStyle w:val="NORML3"/>
       </w:pPr>
       <w:r>
-        <w:t xml:space="preserve">Una arquitectura híbrida combina dos o más métodos, técnicas o arquitecturas distintos para integrar sus fortalezas y compensar sus limitaciones. En los sistemas de recomendación, por ejemplo, la integración del filtrado colaborativo con el filtrado basado en contenido ofrece recomendaciones más precisas y personalizadas, especialmente cuando un solo enfoque resulta insuficiente, como en el arranque en frío o ante la escasez de datos (Millan, 2025).</w:t>
+        <w:t xml:space="preserve">Una arquitectura híbrida combina dos o más métodos, técnicas o arquitecturas distintos para integrar sus fortalezas y compensar sus limitaciones. En los sistemas de recomendación, por ejemplo, la integración del filtrado colaborativo con el filtrado basado en contenido ofrece recomendaciones más precisas y personalizadas, especialmente cuando un solo enfoque resulta insuficiente, como en el arranque en frío o ante la escasez de datos </w:t>
+      </w:r>
+      <w:sdt>
+        <w:sdtPr>
+          <w:tag w:val="MENDELEY_CITATION_v3_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"/>
+          <w:id w:val="-439780185"/>
+        </w:sdtPr>
+        <w:sdtContent>
+          <w:r>
+            <w:t xml:space="preserve">(Millán Gordillo, 2025)</w:t>
+          </w:r>
+        </w:sdtContent>
+      </w:sdt>
+      <w:r>
+        <w:t xml:space="preserve">.</w:t>
       </w:r>
     </w:p>
     <w:p>
@@ -5939,7 +5953,21 @@
         <w:pStyle w:val="NORML3"/>
       </w:pPr>
       <w:r>
-        <w:t xml:space="preserve">Cuando la arquitectura combina modelos de lenguaje de gran tamaño con modelos tabulares, se integra la capacidad de comprensión contextual de los primeros con la capacidad analítica sobre datos estructurados de los algoritmos tabulares. Esta colaboración permite procesar de forma conjunta información estructurada y no estructurada, lo que mejora la adaptabilidad y la precisión en tareas de predicción y clasificación en dominios como la medicina, la educación o las finanzas (Zheng et al., 2023).</w:t>
+        <w:t xml:space="preserve">Cuando la arquitectura combina modelos de lenguaje de gran tamaño con modelos tabulares, se integra la capacidad de comprensión contextual de los primeros con la capacidad analítica sobre datos estructurados de los algoritmos tabulares. Esta colaboración permite procesar de forma conjunta información estructurada y no estructurada, lo que mejora la adaptabilidad y la precisión en tareas de predicción y clasificación en dominios como la medicina, la educación o las finanzas </w:t>
+      </w:r>
+      <w:sdt>
+        <w:sdtPr>
+          <w:tag w:val="MENDELEY_CITATION_v3_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"/>
+          <w:id w:val="-743944921"/>
+        </w:sdtPr>
+        <w:sdtContent>
+          <w:r>
+            <w:t xml:space="preserve">(Zheng et al., 2023)</w:t>
+          </w:r>
+        </w:sdtContent>
+      </w:sdt>
+      <w:r>
+        <w:t xml:space="preserve">.</w:t>
       </w:r>
     </w:p>
     <w:p>
@@ -5955,7 +5983,63 @@
         <w:pStyle w:val="NORML3"/>
       </w:pPr>
       <w:r>
-        <w:t xml:space="preserve">Según Song et al. (2025) y Zhang et al. (2025), LoRA es una técnica para ajustar modelos de lenguaje preentrenados de gran escala, como los basados en la arquitectura Transformer, a tareas específicas sin modificar todos sus parámetros. En lugar de recalibrar cada peso, introduce matrices de descomposición de bajo rango en las capas del modelo, lo que reduce considerablemente la cantidad de parámetros entrenables y hace el ajuste más eficiente en memoria y cómputo, manteniendo la efectividad del modelo en la tarea. La técnica resulta especialmente útil en modelos muy grandes, en los que un ajuste completo es poco práctico (Gao et al., 2025; Liu et al., 2025). Su variante cuantizada, QLoRA, permite además ajustar modelos de varios miles de millones de parámetros en una sola unidad de procesamiento gráfico (Dettmers et al., 2023).</w:t>
+        <w:t xml:space="preserve">Según </w:t>
+      </w:r>
+      <w:sdt>
+        <w:sdtPr>
+          <w:tag w:val="MENDELEY_CITATION_v3_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"/>
+          <w:id w:val="625315701"/>
+        </w:sdtPr>
+        <w:sdtContent>
+          <w:r>
+            <w:t xml:space="preserve">Song et al. (2025)</w:t>
+          </w:r>
+        </w:sdtContent>
+      </w:sdt>
+      <w:r>
+        <w:t xml:space="preserve"> y </w:t>
+      </w:r>
+      <w:sdt>
+        <w:sdtPr>
+          <w:tag w:val="MENDELEY_CITATION_v3_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"/>
+          <w:id w:val="-953853817"/>
+        </w:sdtPr>
+        <w:sdtContent>
+          <w:r>
+            <w:t xml:space="preserve">Zhang et al. (2025)</w:t>
+          </w:r>
+        </w:sdtContent>
+      </w:sdt>
+      <w:r>
+        <w:t xml:space="preserve">, LoRA es una técnica para ajustar modelos de lenguaje preentrenados de gran escala, como los basados en la arquitectura Transformer, a tareas específicas sin modificar todos sus parámetros. En lugar de recalibrar cada peso, introduce matrices de descomposición de bajo rango en las capas del modelo, lo que reduce considerablemente la cantidad de parámetros entrenables y hace el ajuste más eficiente en memoria y cómputo, manteniendo la efectividad del modelo en la tarea. La técnica resulta especialmente útil en modelos muy grandes, en los que un ajuste completo es poco práctico </w:t>
+      </w:r>
+      <w:sdt>
+        <w:sdtPr>
+          <w:tag w:val="MENDELEY_CITATION_v3_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"/>
+          <w:id w:val="569245060"/>
+        </w:sdtPr>
+        <w:sdtContent>
+          <w:r>
+            <w:t xml:space="preserve">(Gao et al., 2026; Liu et al., 2026)</w:t>
+          </w:r>
+        </w:sdtContent>
+      </w:sdt>
+      <w:r>
+        <w:t xml:space="preserve">. Su variante cuantizada, QLoRA, permite además ajustar modelos de varios miles de millones de parámetros en una sola unidad de procesamiento gráfico </w:t>
+      </w:r>
+      <w:sdt>
+        <w:sdtPr>
+          <w:tag w:val="MENDELEY_CITATION_v3_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"/>
+          <w:id w:val="-1853717557"/>
+        </w:sdtPr>
+        <w:sdtContent>
+          <w:r>
+            <w:t xml:space="preserve">(Dettmers et al., 2023)</w:t>
+          </w:r>
+        </w:sdtContent>
+      </w:sdt>
+      <w:r>
+        <w:t xml:space="preserve">.</w:t>
       </w:r>
     </w:p>
     <w:p>
@@ -5963,7 +6047,21 @@
         <w:pStyle w:val="NORML3"/>
       </w:pPr>
       <w:r>
-        <w:t xml:space="preserve">Formalmente, dada una matriz de pesos preentrenada W₀ de dimensión d × k, LoRA no la modifica, sino que representa su actualización como el producto de dos matrices de bajo rango, B de dimensión d × r y A de dimensión r × k, con r mucho menor que d y k (Hu et al., 2021). La salida de la capa se calcula como:</w:t>
+        <w:t xml:space="preserve">Formalmente, dada una matriz de pesos preentrenada W₀ de dimensión d × k, LoRA no la modifica, sino que representa su actualización como el producto de dos matrices de bajo rango, B de dimensión d × r y A de dimensión r × k, con r mucho menor que d y k </w:t>
+      </w:r>
+      <w:sdt>
+        <w:sdtPr>
+          <w:tag w:val="MENDELEY_CITATION_v3_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"/>
+          <w:id w:val="766315322"/>
+        </w:sdtPr>
+        <w:sdtContent>
+          <w:r>
+            <w:t xml:space="preserve">(Hu et al., 2021)</w:t>
+          </w:r>
+        </w:sdtContent>
+      </w:sdt>
+      <w:r>
+        <w:t xml:space="preserve">. La salida de la capa se calcula como:</w:t>
       </w:r>
     </w:p>
     <w:p>
@@ -6179,7 +6277,21 @@
         <w:t xml:space="preserve">Nota.</w:t>
       </w:r>
       <w:r>
-        <w:t xml:space="preserve"> Los pesos preentrenados permanecen congelados y solo se entrenan las matrices A y B. Elaboración propia con base en Hu et al. (2021).</w:t>
+        <w:t xml:space="preserve"> Los pesos preentrenados permanecen congelados y solo se entrenan las matrices A y B. Elaboración propia con base en </w:t>
+      </w:r>
+      <w:sdt>
+        <w:sdtPr>
+          <w:tag w:val="MENDELEY_CITATION_v3_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"/>
+          <w:id w:val="701335161"/>
+        </w:sdtPr>
+        <w:sdtContent>
+          <w:r>
+            <w:t xml:space="preserve">Hu et al. (2021)</w:t>
+          </w:r>
+        </w:sdtContent>
+      </w:sdt>
+      <w:r>
+        <w:t xml:space="preserve">.</w:t>
       </w:r>
     </w:p>
     <w:p>
@@ -6187,7 +6299,21 @@
         <w:pStyle w:val="NORML3"/>
       </w:pPr>
       <w:r>
-        <w:t xml:space="preserve">QLoRA extiende este esquema cuantizando los pesos congelados del modelo base en 4 bits con el tipo de dato NormalFloat, diseñado para pesos con distribución normal, y aplicando una doble cuantización de las constantes de escala, mientras que los adaptadores A y B se mantienen en mayor precisión (Dettmers et al., 2023).</w:t>
+        <w:t xml:space="preserve">QLoRA extiende este esquema cuantizando los pesos congelados del modelo base en 4 bits con el tipo de dato NormalFloat, diseñado para pesos con distribución normal, y aplicando una doble cuantización de las constantes de escala, mientras que los adaptadores A y B se mantienen en mayor precisión </w:t>
+      </w:r>
+      <w:sdt>
+        <w:sdtPr>
+          <w:tag w:val="MENDELEY_CITATION_v3_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"/>
+          <w:id w:val="2067181063"/>
+        </w:sdtPr>
+        <w:sdtContent>
+          <w:r>
+            <w:t xml:space="preserve">(Dettmers et al., 2023)</w:t>
+          </w:r>
+        </w:sdtContent>
+      </w:sdt>
+      <w:r>
+        <w:t xml:space="preserve">.</w:t>
       </w:r>
     </w:p>
     <w:p>
@@ -6202,8 +6328,33 @@
       <w:pPr>
         <w:pStyle w:val="NORML3"/>
       </w:pPr>
-      <w:r>
-        <w:t xml:space="preserve">Singhal et al. (2023) definen un modelo de lenguaje grande como una forma avanzada de inteligencia artificial capaz de comprender y generar lenguaje natural a partir del entrenamiento con grandes volúmenes de texto. Estos modelos funcionan como arquitecturas fundacionales versátiles, aplicables en campos como la atención sanitaria, y muestran un potencial significativo en razonamiento, recuperación de información y respuesta a preguntas, aunque requieren evaluaciones exhaustivas para evitar errores y sesgos (Negueruela Gómez, 2024; H. Zhang et al., 2026).</w:t>
+      <w:sdt>
+        <w:sdtPr>
+          <w:tag w:val="MENDELEY_CITATION_v3_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"/>
+          <w:id w:val="-134773242"/>
+        </w:sdtPr>
+        <w:sdtContent>
+          <w:r>
+            <w:t xml:space="preserve">Singhal et al. (2023)</w:t>
+          </w:r>
+        </w:sdtContent>
+      </w:sdt>
+      <w:r>
+        <w:t xml:space="preserve"> definen un modelo de lenguaje grande como una forma avanzada de inteligencia artificial capaz de comprender y generar lenguaje natural a partir del entrenamiento con grandes volúmenes de texto. Estos modelos funcionan como arquitecturas fundacionales versátiles, aplicables en campos como la atención sanitaria, y muestran un potencial significativo en razonamiento, recuperación de información y respuesta a preguntas, aunque requieren evaluaciones exhaustivas para evitar errores y sesgos </w:t>
+      </w:r>
+      <w:sdt>
+        <w:sdtPr>
+          <w:tag w:val="MENDELEY_CITATION_v3_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"/>
+          <w:id w:val="1324554743"/>
+        </w:sdtPr>
+        <w:sdtContent>
+          <w:r>
+            <w:t xml:space="preserve">(Negueruela Gómez, 2024; H. Zhang et al., 2026)</w:t>
+          </w:r>
+        </w:sdtContent>
+      </w:sdt>
+      <w:r>
+        <w:t xml:space="preserve">.</w:t>
       </w:r>
     </w:p>
     <w:p>
@@ -6211,7 +6362,21 @@
         <w:pStyle w:val="NORML3"/>
       </w:pPr>
       <w:r>
-        <w:t xml:space="preserve">Estos modelos se basan en la arquitectura Transformer, cuyo componente central es el mecanismo de atención, que pondera la relevancia de cada elemento de la secuencia respecto de los demás (Vaswani et al., 2017):</w:t>
+        <w:t xml:space="preserve">Estos modelos se basan en la arquitectura Transformer, cuyo componente central es el mecanismo de atención, que pondera la relevancia de cada elemento de la secuencia respecto de los demás </w:t>
+      </w:r>
+      <w:sdt>
+        <w:sdtPr>
+          <w:tag w:val="MENDELEY_CITATION_v3_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"/>
+          <w:id w:val="296043143"/>
+        </w:sdtPr>
+        <w:sdtContent>
+          <w:r>
+            <w:t xml:space="preserve">(Vaswani et al., 2017)</w:t>
+          </w:r>
+        </w:sdtContent>
+      </w:sdt>
+      <w:r>
+        <w:t xml:space="preserve">:</w:t>
       </w:r>
     </w:p>
     <w:p>
@@ -6490,7 +6655,21 @@
         <w:pStyle w:val="NORML3"/>
       </w:pPr>
       <w:r>
-        <w:t xml:space="preserve">El ajuste fino es el proceso mediante el cual se reentrena parcialmente un modelo de lenguaje previamente entrenado, con el objetivo de adaptar su conocimiento general a un dominio o tarea específica. El enfoque conserva los parámetros esenciales del modelo y los ajusta con un conjunto de datos especializado, lo que mejora su precisión y pertinencia en contextos como la medicina o la educación (Li et al., 2023).</w:t>
+        <w:t xml:space="preserve">El ajuste fino es el proceso mediante el cual se reentrena parcialmente un modelo de lenguaje previamente entrenado, con el objetivo de adaptar su conocimiento general a un dominio o tarea específica. El enfoque conserva los parámetros esenciales del modelo y los ajusta con un conjunto de datos especializado, lo que mejora su precisión y pertinencia en contextos como la medicina o la educación </w:t>
+      </w:r>
+      <w:sdt>
+        <w:sdtPr>
+          <w:tag w:val="MENDELEY_CITATION_v3_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"/>
+          <w:id w:val="870425057"/>
+        </w:sdtPr>
+        <w:sdtContent>
+          <w:r>
+            <w:t xml:space="preserve">(Li et al., 2023)</w:t>
+          </w:r>
+        </w:sdtContent>
+      </w:sdt>
+      <w:r>
+        <w:t xml:space="preserve">.</w:t>
       </w:r>
     </w:p>
     <w:p>
@@ -6506,7 +6685,35 @@
         <w:pStyle w:val="NORML3"/>
       </w:pPr>
       <w:r>
-        <w:t xml:space="preserve">Los modelos tabulares son algoritmos de aprendizaje automático especializados en datos estructurados, organizados en tablas con variables bien definidas. Detectan patrones entre las columnas, que representan características, y las filas, que representan instancias, lo que les permite realizar tareas de predicción y clasificación cuando la información tiene una estructura relacional clara, como en bases de datos médicas, financieras o educativas (Zavala Guirado et al., 2024). Entre ellos destaca XGBoost, un sistema de potenciación del gradiente sobre árboles de decisión, diseñado para ser escalable y regularizado (Chen y Guestrin, 2016).</w:t>
+        <w:t xml:space="preserve">Los modelos tabulares son algoritmos de aprendizaje automático especializados en datos estructurados, organizados en tablas con variables bien definidas. Detectan patrones entre las columnas, que representan características, y las filas, que representan instancias, lo que les permite realizar tareas de predicción y clasificación cuando la información tiene una estructura relacional clara, como en bases de datos médicas, financieras o educativas </w:t>
+      </w:r>
+      <w:sdt>
+        <w:sdtPr>
+          <w:tag w:val="MENDELEY_CITATION_v3_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"/>
+          <w:id w:val="-903140013"/>
+        </w:sdtPr>
+        <w:sdtContent>
+          <w:r>
+            <w:t xml:space="preserve">(Zavala Guirado et al., 2024)</w:t>
+          </w:r>
+        </w:sdtContent>
+      </w:sdt>
+      <w:r>
+        <w:t xml:space="preserve">. Entre ellos destaca XGBoost, un sistema de potenciación del gradiente sobre árboles de decisión, diseñado para ser escalable y regularizado </w:t>
+      </w:r>
+      <w:sdt>
+        <w:sdtPr>
+          <w:tag w:val="MENDELEY_CITATION_v3_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"/>
+          <w:id w:val="-980351901"/>
+        </w:sdtPr>
+        <w:sdtContent>
+          <w:r>
+            <w:t xml:space="preserve">(Chen y Guestrin, 2016)</w:t>
+          </w:r>
+        </w:sdtContent>
+      </w:sdt>
+      <w:r>
+        <w:t xml:space="preserve">.</w:t>
       </w:r>
     </w:p>
     <w:p>
@@ -6514,7 +6721,21 @@
         <w:pStyle w:val="NORML3"/>
       </w:pPr>
       <w:r>
-        <w:t xml:space="preserve">XGBoost construye un conjunto de K árboles de forma secuencial, donde cada árbol corrige los errores de los anteriores, minimizando una función objetivo que combina la pérdida de predicción con un término de regularización (Chen y Guestrin, 2016):</w:t>
+        <w:t xml:space="preserve">XGBoost construye un conjunto de K árboles de forma secuencial, donde cada árbol corrige los errores de los anteriores, minimizando una función objetivo que combina la pérdida de predicción con un término de regularización </w:t>
+      </w:r>
+      <w:sdt>
+        <w:sdtPr>
+          <w:tag w:val="MENDELEY_CITATION_v3_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"/>
+          <w:id w:val="-1234098095"/>
+        </w:sdtPr>
+        <w:sdtContent>
+          <w:r>
+            <w:t xml:space="preserve">(Chen y Guestrin, 2016)</w:t>
+          </w:r>
+        </w:sdtContent>
+      </w:sdt>
+      <w:r>
+        <w:t xml:space="preserve">:</w:t>
       </w:r>
     </w:p>
     <w:p>
@@ -6755,7 +6976,21 @@
         <w:pStyle w:val="NORML3"/>
       </w:pPr>
       <w:r>
-        <w:t xml:space="preserve">La generación de rutas educativas es un proceso basado en el análisis de datos académicos, personales y vocacionales, cuyo objetivo es recomendar itinerarios de formación personalizados. La combinación de modelos predictivos tabulares con modelos de lenguaje permite identificar patrones de rendimiento, intereses y riesgos, y diseñar trayectorias adaptadas al perfil y al contexto de cada estudiante (Cen et al., 2024; Nass et al., 2023).</w:t>
+        <w:t xml:space="preserve">La generación de rutas educativas es un proceso basado en el análisis de datos académicos, personales y vocacionales, cuyo objetivo es recomendar itinerarios de formación personalizados. La combinación de modelos predictivos tabulares con modelos de lenguaje permite identificar patrones de rendimiento, intereses y riesgos, y diseñar trayectorias adaptadas al perfil y al contexto de cada estudiante </w:t>
+      </w:r>
+      <w:sdt>
+        <w:sdtPr>
+          <w:tag w:val="MENDELEY_CITATION_v3_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"/>
+          <w:id w:val="-557246054"/>
+        </w:sdtPr>
+        <w:sdtContent>
+          <w:r>
+            <w:t xml:space="preserve">(Cen et al., 2024; Nass et al., 2023)</w:t>
+          </w:r>
+        </w:sdtContent>
+      </w:sdt>
+      <w:r>
+        <w:t xml:space="preserve">.</w:t>
       </w:r>
     </w:p>
     <w:p>
@@ -6771,7 +7006,21 @@
         <w:pStyle w:val="NORML3"/>
       </w:pPr>
       <w:r>
-        <w:t xml:space="preserve">El aprendizaje en contexto es la capacidad de los modelos de lenguaje de gran escala para resolver nuevas tareas a partir de ejemplos o instrucciones incluidos en la entrada, sin modificar sus parámetros internos. Se basa en los mecanismos de atención y constituye una alternativa flexible al ajuste tradicional (Kung et al., 2023).</w:t>
+        <w:t xml:space="preserve">El aprendizaje en contexto es la capacidad de los modelos de lenguaje de gran escala para resolver nuevas tareas a partir de ejemplos o instrucciones incluidos en la entrada, sin modificar sus parámetros internos. Se basa en los mecanismos de atención y constituye una alternativa flexible al ajuste tradicional </w:t>
+      </w:r>
+      <w:sdt>
+        <w:sdtPr>
+          <w:tag w:val="MENDELEY_CITATION_v3_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"/>
+          <w:id w:val="-1567426329"/>
+        </w:sdtPr>
+        <w:sdtContent>
+          <w:r>
+            <w:t xml:space="preserve">(Kung et al., 2023)</w:t>
+          </w:r>
+        </w:sdtContent>
+      </w:sdt>
+      <w:r>
+        <w:t xml:space="preserve">.</w:t>
       </w:r>
     </w:p>
     <w:p>
@@ -6787,7 +7036,21 @@
         <w:pStyle w:val="NORML3"/>
       </w:pPr>
       <w:r>
-        <w:t xml:space="preserve">El rankeo de rutas educativas consiste en ordenar las alternativas de formación de un estudiante según un criterio de pertinencia, como la probabilidad estimada de éxito en cada programa. La integración de modelos predictivos tabulares con modelos de lenguaje permite identificar patrones de rendimiento académico, inclinaciones de interés y riesgos de abandono, y presentar las alternativas ordenadas de acuerdo con las características y antecedentes individuales (Fernandez et al., 2025; Navarro Forero et al., 2025).</w:t>
+        <w:t xml:space="preserve">El rankeo de rutas educativas consiste en ordenar las alternativas de formación de un estudiante según un criterio de pertinencia, como la probabilidad estimada de éxito en cada programa. La integración de modelos predictivos tabulares con modelos de lenguaje permite identificar patrones de rendimiento académico, inclinaciones de interés y riesgos de abandono, y presentar las alternativas ordenadas de acuerdo con las características y antecedentes individuales </w:t>
+      </w:r>
+      <w:sdt>
+        <w:sdtPr>
+          <w:tag w:val="MENDELEY_CITATION_v3_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"/>
+          <w:id w:val="112707111"/>
+        </w:sdtPr>
+        <w:sdtContent>
+          <w:r>
+            <w:t xml:space="preserve">(Fernández et al., 2025; Navarro Forero et al., 2025)</w:t>
+          </w:r>
+        </w:sdtContent>
+      </w:sdt>
+      <w:r>
+        <w:t xml:space="preserve">.</w:t>
       </w:r>
     </w:p>
     <w:p>
@@ -6803,7 +7066,49 @@
         <w:pStyle w:val="NORML3"/>
       </w:pPr>
       <w:r>
-        <w:t xml:space="preserve">Según Cisneros-Bravo et al. (2023) y Alejandro (2024), la orientación vocacional es un proceso educativo y psicológico que ayuda a los estudiantes a explorar sus intereses, valores y habilidades, para tomar decisiones académicas acordes con su proyecto de vida. En la actualidad este proceso incorpora herramientas tecnológicas e inteligencia artificial para ofrecer asesoramiento personalizado y mejorar la retención universitaria (Flores Meléndez et al., 2020).</w:t>
+        <w:t xml:space="preserve">Según </w:t>
+      </w:r>
+      <w:sdt>
+        <w:sdtPr>
+          <w:tag w:val="MENDELEY_CITATION_v3_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"/>
+          <w:id w:val="-2017713755"/>
+        </w:sdtPr>
+        <w:sdtContent>
+          <w:r>
+            <w:t xml:space="preserve">Cisneros-Bravo et al. (2023)</w:t>
+          </w:r>
+        </w:sdtContent>
+      </w:sdt>
+      <w:r>
+        <w:t xml:space="preserve"> y </w:t>
+      </w:r>
+      <w:sdt>
+        <w:sdtPr>
+          <w:tag w:val="MENDELEY_CITATION_v3_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"/>
+          <w:id w:val="-440297799"/>
+        </w:sdtPr>
+        <w:sdtContent>
+          <w:r>
+            <w:t xml:space="preserve">Alejandro Jaramillo (2024)</w:t>
+          </w:r>
+        </w:sdtContent>
+      </w:sdt>
+      <w:r>
+        <w:t xml:space="preserve">, la orientación vocacional es un proceso educativo y psicológico que ayuda a los estudiantes a explorar sus intereses, valores y habilidades, para tomar decisiones académicas acordes con su proyecto de vida. En la actualidad este proceso incorpora herramientas tecnológicas e inteligencia artificial para ofrecer asesoramiento personalizado y mejorar la retención universitaria </w:t>
+      </w:r>
+      <w:sdt>
+        <w:sdtPr>
+          <w:tag w:val="MENDELEY_CITATION_v3_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"/>
+          <w:id w:val="856900137"/>
+        </w:sdtPr>
+        <w:sdtContent>
+          <w:r>
+            <w:t xml:space="preserve">(Flores Meléndez et al., 2020)</w:t>
+          </w:r>
+        </w:sdtContent>
+      </w:sdt>
+      <w:r>
+        <w:t xml:space="preserve">.</w:t>
       </w:r>
     </w:p>
     <w:p>
@@ -6819,7 +7124,21 @@
         <w:pStyle w:val="NORML3"/>
       </w:pPr>
       <w:r>
-        <w:t xml:space="preserve">El perfil del estudiante describe sus habilidades, intereses, motivaciones, rendimiento académico y capacidades tecnológicas. Esta información es fundamental para orientar las decisiones educativas y adaptar el proceso de aprendizaje, y puede ser procesada mediante modelos de lenguaje y análisis de datos para construir itinerarios específicos para cada contexto (Yupanquin, 2024).</w:t>
+        <w:t xml:space="preserve">El perfil del estudiante describe sus habilidades, intereses, motivaciones, rendimiento académico y capacidades tecnológicas. Esta información es fundamental para orientar las decisiones educativas y adaptar el proceso de aprendizaje, y puede ser procesada mediante modelos de lenguaje y análisis de datos para construir itinerarios específicos para cada contexto </w:t>
+      </w:r>
+      <w:sdt>
+        <w:sdtPr>
+          <w:tag w:val="MENDELEY_CITATION_v3_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"/>
+          <w:id w:val="-691676324"/>
+        </w:sdtPr>
+        <w:sdtContent>
+          <w:r>
+            <w:t xml:space="preserve">(Yupanqui Sanchez, 2024)</w:t>
+          </w:r>
+        </w:sdtContent>
+      </w:sdt>
+      <w:r>
+        <w:t xml:space="preserve">.</w:t>
       </w:r>
     </w:p>
     <w:p>
@@ -6835,7 +7154,21 @@
         <w:pStyle w:val="NORML3"/>
       </w:pPr>
       <w:r>
-        <w:t xml:space="preserve">El éxito académico es el grado en que los estudiantes alcanzan las metas de aprendizaje establecidas por el sistema educativo, y se manifiesta en un rendimiento constante, satisfacción personal y capacidad sostenida para cursar estudios universitarios (Aguilar-Reyes et al., 2025). En esta investigación, el éxito se operacionaliza como el ingreso a la universidad en el programa postulado.</w:t>
+        <w:t xml:space="preserve">El éxito académico es el grado en que los estudiantes alcanzan las metas de aprendizaje establecidas por el sistema educativo, y se manifiesta en un rendimiento constante, satisfacción personal y capacidad sostenida para cursar estudios universitarios </w:t>
+      </w:r>
+      <w:sdt>
+        <w:sdtPr>
+          <w:tag w:val="MENDELEY_CITATION_v3_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"/>
+          <w:id w:val="-607152571"/>
+        </w:sdtPr>
+        <w:sdtContent>
+          <w:r>
+            <w:t xml:space="preserve">(Aguilar-Reyes et al., 2025)</w:t>
+          </w:r>
+        </w:sdtContent>
+      </w:sdt>
+      <w:r>
+        <w:t xml:space="preserve">. En esta investigación, el éxito se operacionaliza como el ingreso a la universidad en el programa postulado.</w:t>
       </w:r>
     </w:p>
     <w:p>
@@ -6843,7 +7176,21 @@
         <w:pStyle w:val="NORML3"/>
       </w:pPr>
       <w:r>
-        <w:t xml:space="preserve">La retención estudiantil comprende las estrategias institucionales y personales orientadas a que los estudiantes culminen sus estudios. Ambos aspectos dependen de factores vocacionales, académicos y tecnológicos, y pueden fortalecerse con modelos de inteligencia artificial que anticipan riesgos y personalizan la intervención educativa (Muñoz Pilozo et al., 2024; Sabando Moreira y Zambrano Montenegro, 2024).</w:t>
+        <w:t xml:space="preserve">La retención estudiantil comprende las estrategias institucionales y personales orientadas a que los estudiantes culminen sus estudios. Ambos aspectos dependen de factores vocacionales, académicos y tecnológicos, y pueden fortalecerse con modelos de inteligencia artificial que anticipan riesgos y personalizan la intervención educativa </w:t>
+      </w:r>
+      <w:sdt>
+        <w:sdtPr>
+          <w:tag w:val="MENDELEY_CITATION_v3_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"/>
+          <w:id w:val="-821877571"/>
+        </w:sdtPr>
+        <w:sdtContent>
+          <w:r>
+            <w:t xml:space="preserve">(Muñoz Pilozo et al., 2024; Sabando Moreira y Zambrano Montenegro, 2024)</w:t>
+          </w:r>
+        </w:sdtContent>
+      </w:sdt>
+      <w:r>
+        <w:t xml:space="preserve">.</w:t>
       </w:r>
     </w:p>
     <w:p>
@@ -6859,7 +7206,49 @@
         <w:pStyle w:val="NORML3"/>
       </w:pPr>
       <w:r>
-        <w:t xml:space="preserve">El desempeño académico es el resultado del proceso de aprendizaje reflejado en el nivel de rendimiento del estudiante, y se mide mediante calificaciones, evaluaciones, logro de objetivos y desarrollo de competencias (Jardon et al., 2024). Desde un enfoque integral, no depende solo de las habilidades cognitivas, sino también de la motivación, de la adecuación entre intereses y carrera elegida y de las condiciones institucionales (Escalante López et al., 2023). La literatura reciente destaca además la autoeficacia, la gestión del tiempo y la percepción del apoyo institucional como factores de la perseverancia (Rodas, 2024).</w:t>
+        <w:t xml:space="preserve">El desempeño académico es el resultado del proceso de aprendizaje reflejado en el nivel de rendimiento del estudiante, y se mide mediante calificaciones, evaluaciones, logro de objetivos y desarrollo de competencias </w:t>
+      </w:r>
+      <w:sdt>
+        <w:sdtPr>
+          <w:tag w:val="MENDELEY_CITATION_v3_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"/>
+          <w:id w:val="641409257"/>
+        </w:sdtPr>
+        <w:sdtContent>
+          <w:r>
+            <w:t xml:space="preserve">(Jardón Gallegos et al., 2024)</w:t>
+          </w:r>
+        </w:sdtContent>
+      </w:sdt>
+      <w:r>
+        <w:t xml:space="preserve">. Desde un enfoque integral, no depende solo de las habilidades cognitivas, sino también de la motivación, de la adecuación entre intereses y carrera elegida y de las condiciones institucionales </w:t>
+      </w:r>
+      <w:sdt>
+        <w:sdtPr>
+          <w:tag w:val="MENDELEY_CITATION_v3_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"/>
+          <w:id w:val="941514233"/>
+        </w:sdtPr>
+        <w:sdtContent>
+          <w:r>
+            <w:t xml:space="preserve">(Escalante López et al., 2023)</w:t>
+          </w:r>
+        </w:sdtContent>
+      </w:sdt>
+      <w:r>
+        <w:t xml:space="preserve">. La literatura reciente destaca además la autoeficacia, la gestión del tiempo y la percepción del apoyo institucional como factores de la perseverancia </w:t>
+      </w:r>
+      <w:sdt>
+        <w:sdtPr>
+          <w:tag w:val="MENDELEY_CITATION_v3_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"/>
+          <w:id w:val="1764550918"/>
+        </w:sdtPr>
+        <w:sdtContent>
+          <w:r>
+            <w:t xml:space="preserve">(Rodas Zegarra de Escalante, 2024)</w:t>
+          </w:r>
+        </w:sdtContent>
+      </w:sdt>
+      <w:r>
+        <w:t xml:space="preserve">.</w:t>
       </w:r>
     </w:p>
     <w:p>
@@ -6875,7 +7264,21 @@
         <w:pStyle w:val="NORML3"/>
       </w:pPr>
       <w:r>
-        <w:t xml:space="preserve">La deserción es el abandono del proceso educativo antes de su culminación. Según Torres-Delgado et al. (2024), es un fenómeno multicausal en el que se entrelazan factores académicos, sociales, familiares y personales que afectan la decisión de dejar los estudios.</w:t>
+        <w:t xml:space="preserve">La deserción es el abandono del proceso educativo antes de su culminación. Según </w:t>
+      </w:r>
+      <w:sdt>
+        <w:sdtPr>
+          <w:tag w:val="MENDELEY_CITATION_v3_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"/>
+          <w:id w:val="-1467420585"/>
+        </w:sdtPr>
+        <w:sdtContent>
+          <w:r>
+            <w:t xml:space="preserve">Torres-Delgado et al. (2024)</w:t>
+          </w:r>
+        </w:sdtContent>
+      </w:sdt>
+      <w:r>
+        <w:t xml:space="preserve">, es un fenómeno multicausal en el que se entrelazan factores académicos, sociales, familiares y personales que afectan la decisión de dejar los estudios.</w:t>
       </w:r>
     </w:p>
     <w:p>
@@ -6891,7 +7294,21 @@
         <w:pStyle w:val="NORML3"/>
       </w:pPr>
       <w:r>
-        <w:t xml:space="preserve">La inteligencia artificial es la rama de la informática dedicada al diseño, desarrollo y aplicación de sistemas capaces de realizar tareas que antes requerían inteligencia humana, como el razonamiento lógico, el aprendizaje a partir de datos, la comprensión del lenguaje natural y la toma de decisiones (Ramos-Rivera et al., 2025; Sancho Escrivá et al., 2020).</w:t>
+        <w:t xml:space="preserve">La inteligencia artificial es la rama de la informática dedicada al diseño, desarrollo y aplicación de sistemas capaces de realizar tareas que antes requerían inteligencia humana, como el razonamiento lógico, el aprendizaje a partir de datos, la comprensión del lenguaje natural y la toma de decisiones </w:t>
+      </w:r>
+      <w:sdt>
+        <w:sdtPr>
+          <w:tag w:val="MENDELEY_CITATION_v3_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"/>
+          <w:id w:val="1821712189"/>
+        </w:sdtPr>
+        <w:sdtContent>
+          <w:r>
+            <w:t xml:space="preserve">(Ramos-Rivera et al., 2025; Sancho Escrivá et al., 2020)</w:t>
+          </w:r>
+        </w:sdtContent>
+      </w:sdt>
+      <w:r>
+        <w:t xml:space="preserve">.</w:t>
       </w:r>
     </w:p>
     <w:p>
@@ -7020,64 +7437,152 @@
       <w:pPr>
         <w:pStyle w:val="NORML3"/>
       </w:pPr>
-      <w:r>
-        <w:t xml:space="preserve">García y Serradilla (2021) tuvieron como objetivo desarrollar técnicas de clasificación de textos que alcanzaran el estado del arte sin requerir grandes recursos computacionales, y ampliar los modelos de lenguaje para el español ante la escasez de recursos para esta lengua. Emplearon modelos basados en la arquitectura Transformer y BERT, y obtuvieron resultados alineados con el estado del arte, que evidencian la eficiencia de modelos abiertos de tamaño moderado. Concluyeron que existe un interés insuficiente de la industria y la academia por los modelos neuronales en español, lo que representa un nicho para el desarrollo de recursos en este idioma.</w:t>
+      <w:sdt>
+        <w:sdtPr>
+          <w:tag w:val="MENDELEY_CITATION_v3_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"/>
+          <w:id w:val="979317874"/>
+        </w:sdtPr>
+        <w:sdtContent>
+          <w:r>
+            <w:t xml:space="preserve">García Subies (2021)</w:t>
+          </w:r>
+        </w:sdtContent>
+      </w:sdt>
+      <w:r>
+        <w:t xml:space="preserve"> tuvo como objetivo desarrollar técnicas de clasificación de textos que alcanzaran el estado del arte sin requerir grandes recursos computacionales, y ampliar los modelos de lenguaje para el español ante la escasez de recursos para esta lengua. Emplearon modelos basados en la arquitectura Transformer y BERT, y obtuvieron resultados alineados con el estado del arte, que evidencian la eficiencia de modelos abiertos de tamaño moderado. Concluyó que existe un interés insuficiente de la industria y la academia por los modelos neuronales en español, lo que representa un nicho para el desarrollo de recursos en este idioma.</w:t>
       </w:r>
     </w:p>
     <w:p>
       <w:pPr>
         <w:pStyle w:val="NORML3"/>
       </w:pPr>
-      <w:r>
-        <w:t xml:space="preserve">Mena (2023) se propuso evaluar modelos de lenguaje masivos en español, comparar LLaMA2-Chat, Mistral y Falcon, y estudiar su adaptación para generar chatbots en Ecuador. Probó modelos de 7 mil millones de parámetros ajustados mediante QLoRA. Los tres modelos mejoraron tras el ajuste, con Mistral destacando en tareas complejas y Falcon en tareas creativas, aunque algunos modelos ajustados mostraron respuestas imprecisas. Concluyó que la memoria de video fue una limitación importante, que el ajuste fue exitoso y que Mistral obtuvo el mejor desempeño global, y recomendó explorar RAG y mezcla de expertos.</w:t>
+      <w:sdt>
+        <w:sdtPr>
+          <w:tag w:val="MENDELEY_CITATION_v3_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"/>
+          <w:id w:val="-1279429732"/>
+        </w:sdtPr>
+        <w:sdtContent>
+          <w:r>
+            <w:t xml:space="preserve">Mena Guitarra (2023)</w:t>
+          </w:r>
+        </w:sdtContent>
+      </w:sdt>
+      <w:r>
+        <w:t xml:space="preserve"> se propuso evaluar modelos de lenguaje masivos en español, comparar LLaMA2-Chat, Mistral y Falcon, y estudiar su adaptación para generar chatbots en Ecuador. Probó modelos de 7 mil millones de parámetros ajustados mediante QLoRA. Los tres modelos mejoraron tras el ajuste, con Mistral destacando en tareas complejas y Falcon en tareas creativas, aunque algunos modelos ajustados mostraron respuestas imprecisas. Concluyó que la memoria de video fue una limitación importante, que el ajuste fue exitoso y que Mistral obtuvo el mejor desempeño global, y recomendó explorar RAG y mezcla de expertos.</w:t>
       </w:r>
     </w:p>
     <w:p>
       <w:pPr>
         <w:pStyle w:val="NORML3"/>
       </w:pPr>
-      <w:r>
-        <w:t xml:space="preserve">Hu et al. (2021) aplicaron la adaptación de bajo rango para entrenar parámetros específicos de la tarea sin modificar los pesos preentrenados. Demostraron que LoRA es competitivo en tareas de comprensión del lenguaje natural, como GLUE y WikiSQL, frente al ajuste fino tradicional, y concluyeron que reduce significativamente los requisitos de memoria, el costo computacional y el tiempo de entrenamiento sin afectar el rendimiento.</w:t>
+      <w:sdt>
+        <w:sdtPr>
+          <w:tag w:val="MENDELEY_CITATION_v3_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"/>
+          <w:id w:val="-395249232"/>
+        </w:sdtPr>
+        <w:sdtContent>
+          <w:r>
+            <w:t xml:space="preserve">Hu et al. (2021)</w:t>
+          </w:r>
+        </w:sdtContent>
+      </w:sdt>
+      <w:r>
+        <w:t xml:space="preserve"> aplicaron la adaptación de bajo rango para entrenar parámetros específicos de la tarea sin modificar los pesos preentrenados. Demostraron que LoRA es competitivo en tareas de comprensión del lenguaje natural, como GLUE y WikiSQL, frente al ajuste fino tradicional, y concluyeron que reduce significativamente los requisitos de memoria, el costo computacional y el tiempo de entrenamiento sin afectar el rendimiento.</w:t>
       </w:r>
     </w:p>
     <w:p>
       <w:pPr>
         <w:pStyle w:val="NORML3"/>
       </w:pPr>
-      <w:r>
-        <w:t xml:space="preserve">Dettmers et al. (2023) propusieron QLoRA, un método que retropropaga gradientes a través de un modelo cuantizado en 4 bits hacia adaptadores de bajo rango. Con esta técnica ajustaron un modelo de 65 mil millones de parámetros en una sola unidad de procesamiento gráfico de 48 GB, y su mejor modelo alcanzó un desempeño cercano al de ChatGPT en el benchmark de Vicuna. Concluyeron que la cuantización no degrada el desempeño del ajuste fino de 16 bits y que democratiza el ajuste de modelos grandes.</w:t>
+      <w:sdt>
+        <w:sdtPr>
+          <w:tag w:val="MENDELEY_CITATION_v3_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"/>
+          <w:id w:val="-1139687701"/>
+        </w:sdtPr>
+        <w:sdtContent>
+          <w:r>
+            <w:t xml:space="preserve">Dettmers et al. (2023)</w:t>
+          </w:r>
+        </w:sdtContent>
+      </w:sdt>
+      <w:r>
+        <w:t xml:space="preserve"> propusieron QLoRA, un método que retropropaga gradientes a través de un modelo cuantizado en 4 bits hacia adaptadores de bajo rango. Con esta técnica ajustaron un modelo de 65 mil millones de parámetros en una sola unidad de procesamiento gráfico de 48 GB, y su mejor modelo alcanzó un desempeño cercano al de ChatGPT en el benchmark de Vicuna. Concluyeron que la cuantización no degrada el desempeño del ajuste fino de 16 bits y que democratiza el ajuste de modelos grandes.</w:t>
       </w:r>
     </w:p>
     <w:p>
       <w:pPr>
         <w:pStyle w:val="NORML3"/>
       </w:pPr>
-      <w:r>
-        <w:t xml:space="preserve">Armando et al. (2023), en la investigación titulada "URKU: Adaptación de LLaMA 2 para la generación de texto en kichwa usando técnicas de Low-Rank Adaptation (LoRA)", tuvieron como propósito adaptar LLaMA 2 al kichwa, crear un corpus de alta calidad y establecer un benchmark para la evaluación, generación y traducción de textos. El modelo URKU superó a modelos previos en generación de texto en kichwa, y los autores concluyeron que constituye un avance para la inclusión lingüística y la preservación cultural en idiomas con recursos limitados.</w:t>
+      <w:sdt>
+        <w:sdtPr>
+          <w:tag w:val="MENDELEY_CITATION_v3_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"/>
+          <w:id w:val="1345000153"/>
+        </w:sdtPr>
+        <w:sdtContent>
+          <w:r>
+            <w:t xml:space="preserve">León Caranqui (2023)</w:t>
+          </w:r>
+        </w:sdtContent>
+      </w:sdt>
+      <w:r>
+        <w:t xml:space="preserve">, en la investigación titulada "URKU: Adaptación de LLaMA 2 para la generación de texto en kichwa usando técnicas de Low-Rank Adaptation (LoRA)", tuvo como propósito adaptar LLaMA 2 al kichwa, crear un corpus de alta calidad y establecer un benchmark para la evaluación, generación y traducción de textos. El modelo URKU superó a modelos previos en generación de texto en kichwa, y el autor concluyó que constituye un avance para la inclusión lingüística y la preservación cultural en idiomas con recursos limitados.</w:t>
       </w:r>
     </w:p>
     <w:p>
       <w:pPr>
         <w:pStyle w:val="NORML3"/>
       </w:pPr>
-      <w:r>
-        <w:t xml:space="preserve">Castejon (2025) diseñó, implementó y evaluó un sistema conversacional que permite consultar en lenguaje natural la información del Museo Sorolla, con preguntas estructuradas por categorías de uso. El clasificador de intención alcanzó una precisión global de 88 % y un F1 de 0.88, con 0.94 en la clase SQL, y el componente RAG obtuvo una relevancia de contexto de 0.98 y una fidelidad de 0.67. Concluyó que el sistema, que integra LLM, RAG y Text2SQL, funciona eficazmente y que una ingeniería de instrucciones adecuada elimina las alucinaciones.</w:t>
+      <w:sdt>
+        <w:sdtPr>
+          <w:tag w:val="MENDELEY_CITATION_v3_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"/>
+          <w:id w:val="20826988"/>
+        </w:sdtPr>
+        <w:sdtContent>
+          <w:r>
+            <w:t xml:space="preserve">Castejón Lozano (2025)</w:t>
+          </w:r>
+        </w:sdtContent>
+      </w:sdt>
+      <w:r>
+        <w:t xml:space="preserve"> diseñó, implementó y evaluó un sistema conversacional que permite consultar en lenguaje natural la información del Museo Sorolla, con preguntas estructuradas por categorías de uso. El clasificador de intención alcanzó una precisión global de 88 % y un F1 de 0.88, con 0.94 en la clase SQL, y el componente RAG obtuvo una relevancia de contexto de 0.98 y una fidelidad de 0.67. Concluyó que el sistema, que integra LLM, RAG y Text2SQL, funciona eficazmente y que una ingeniería de instrucciones adecuada elimina las alucinaciones.</w:t>
       </w:r>
     </w:p>
     <w:p>
       <w:pPr>
         <w:pStyle w:val="NORML3"/>
       </w:pPr>
-      <w:r>
-        <w:t xml:space="preserve">Fang et al. (2024) realizaron una revisión extensa de los modelos de lenguaje grandes aplicados a datos tabulares en predicción, generación de datos y comprensión de tablas. Analizaron técnicas, métricas y enfoques, y compararon estos modelos con los árboles de decisión en conjuntos grandes y heterogéneos. Encontraron una gran capacidad de los LLM para tareas complejas, con debilidades en generalización e interpretabilidad, y concluyeron que se requiere más investigación para mejorar su rendimiento y adaptabilidad.</w:t>
+      <w:sdt>
+        <w:sdtPr>
+          <w:tag w:val="MENDELEY_CITATION_v3_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"/>
+          <w:id w:val="902448716"/>
+        </w:sdtPr>
+        <w:sdtContent>
+          <w:r>
+            <w:t xml:space="preserve">Fang et al. (2024)</w:t>
+          </w:r>
+        </w:sdtContent>
+      </w:sdt>
+      <w:r>
+        <w:t xml:space="preserve"> realizaron una revisión extensa de los modelos de lenguaje grandes aplicados a datos tabulares en predicción, generación de datos y comprensión de tablas. Analizaron técnicas, métricas y enfoques, y compararon estos modelos con los árboles de decisión en conjuntos grandes y heterogéneos. Encontraron una gran capacidad de los LLM para tareas complejas, con debilidades en generalización e interpretabilidad, y concluyeron que se requiere más investigación para mejorar su rendimiento y adaptabilidad.</w:t>
       </w:r>
     </w:p>
     <w:p>
       <w:pPr>
         <w:pStyle w:val="NORML3"/>
       </w:pPr>
-      <w:r>
-        <w:t xml:space="preserve">Fernandez et al. (2025) estudiaron el ajuste fino de modelos de lenguaje para convertirlos en tutores de matemática y física en educación básica, entrenándolos con problemas específicos como los del conjunto GSM8K. Los resultados mostraron que el ajuste fino mejora la precisión en la resolución de problemas y la claridad con que el modelo explica los conceptos, lo que lo convierte en una herramienta educativa valiosa en ciencias.</w:t>
+      <w:sdt>
+        <w:sdtPr>
+          <w:tag w:val="MENDELEY_CITATION_v3_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"/>
+          <w:id w:val="1118915131"/>
+        </w:sdtPr>
+        <w:sdtContent>
+          <w:r>
+            <w:t xml:space="preserve">Fernández et al. (2025)</w:t>
+          </w:r>
+        </w:sdtContent>
+      </w:sdt>
+      <w:r>
+        <w:t xml:space="preserve"> estudiaron el ajuste fino de modelos de lenguaje para convertirlos en tutores de matemática y física en educación básica, entrenándolos con problemas específicos como los del conjunto GSM8K. Los resultados mostraron que el ajuste fino mejora la precisión en la resolución de problemas y la claridad con que el modelo explica los conceptos, lo que lo convierte en una herramienta educativa valiosa en ciencias.</w:t>
       </w:r>
     </w:p>
     <w:p>
@@ -7085,47 +7590,116 @@
         <w:pStyle w:val="NORML3"/>
       </w:pPr>
       <w:r>
-        <w:t xml:space="preserve">En otro estudio, Fernandez et al. (2025) optimizaron grandes modelos de lenguaje mediante técnicas de ajuste eficiente sobre infraestructura de alto rendimiento, como el supercomputador Clementina XXI, con el objetivo de mejorar la eficiencia computacional y el rendimiento en seguridad, biología y educación. Emplearon LoRA, QLoRA, ajuste con adaptadores y mezcla de expertos, evaluaron la eficacia de estas técnicas y establecieron repositorios abiertos para la reproducibilidad, reduciendo el costo y la duración del entrenamiento.</w:t>
+        <w:t xml:space="preserve">En otro estudio, </w:t>
+      </w:r>
+      <w:sdt>
+        <w:sdtPr>
+          <w:tag w:val="MENDELEY_CITATION_v3_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"/>
+          <w:id w:val="-299212047"/>
+        </w:sdtPr>
+        <w:sdtContent>
+          <w:r>
+            <w:t xml:space="preserve">Fernández et al. (2025)</w:t>
+          </w:r>
+        </w:sdtContent>
+      </w:sdt>
+      <w:r>
+        <w:t xml:space="preserve"> optimizaron grandes modelos de lenguaje mediante técnicas de ajuste eficiente sobre infraestructura de alto rendimiento, como el supercomputador Clementina XXI, con el objetivo de mejorar la eficiencia computacional y el rendimiento en seguridad, biología y educación. Emplearon LoRA, QLoRA, ajuste con adaptadores y mezcla de expertos, evaluaron la eficacia de estas técnicas y establecieron repositorios abiertos para la reproducibilidad, reduciendo el costo y la duración del entrenamiento.</w:t>
       </w:r>
     </w:p>
     <w:p>
       <w:pPr>
         <w:pStyle w:val="NORML3"/>
       </w:pPr>
-      <w:r>
-        <w:t xml:space="preserve">Ramos-Rivera et al. (2025) analizaron la aplicación de modelos de lenguaje grandes para mejorar el análisis de las respuestas abiertas en la evaluación del desempeño docente. Mediante modelos específicos de dominio, modelos de lenguaje pequeños y modelos en la nube con menos iteraciones de entrenamiento, buscaron mitigar las alucinaciones. Los resultados indicaron que los LLM reducen sustancialmente el tiempo de procesamiento de las evaluaciones y mejoran la toma de decisiones en las instituciones educativas.</w:t>
+      <w:sdt>
+        <w:sdtPr>
+          <w:tag w:val="MENDELEY_CITATION_v3_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"/>
+          <w:id w:val="-186218481"/>
+        </w:sdtPr>
+        <w:sdtContent>
+          <w:r>
+            <w:t xml:space="preserve">Ramos-Rivera et al. (2025)</w:t>
+          </w:r>
+        </w:sdtContent>
+      </w:sdt>
+      <w:r>
+        <w:t xml:space="preserve"> analizaron la aplicación de modelos de lenguaje grandes para mejorar el análisis de las respuestas abiertas en la evaluación del desempeño docente. Mediante modelos específicos de dominio, modelos de lenguaje pequeños y modelos en la nube con menos iteraciones de entrenamiento, buscaron mitigar las alucinaciones. Los resultados indicaron que los LLM reducen sustancialmente el tiempo de procesamiento de las evaluaciones y mejoran la toma de decisiones en las instituciones educativas.</w:t>
       </w:r>
     </w:p>
     <w:p>
       <w:pPr>
         <w:pStyle w:val="NORML3"/>
       </w:pPr>
-      <w:r>
-        <w:t xml:space="preserve">Millan (2025), en el estudio "Estudio comparativo de sistemas de recomendación mediante filtrado colaborativo, basado en contenido y propuestas híbridas", comparó el rendimiento de los tres tipos de sistemas con datos de Goodreads que incluyeron 93 398 libros, 34 919 254 interacciones y 2 389 900 reseñas. Los modelos híbridos mejoraron la calidad de las recomendaciones al superar la sobreespecialización y la escasez de datos, y concluyó que combinan eficientemente ambos enfoques con mejoras en precisión, diversidad y adaptabilidad.</w:t>
+      <w:sdt>
+        <w:sdtPr>
+          <w:tag w:val="MENDELEY_CITATION_v3_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"/>
+          <w:id w:val="-1157141702"/>
+        </w:sdtPr>
+        <w:sdtContent>
+          <w:r>
+            <w:t xml:space="preserve">Millán Gordillo (2025)</w:t>
+          </w:r>
+        </w:sdtContent>
+      </w:sdt>
+      <w:r>
+        <w:t xml:space="preserve">, en el estudio "Estudio comparativo de sistemas de recomendación mediante filtrado colaborativo, basado en contenido y propuestas híbridas", comparó el rendimiento de los tres tipos de sistemas con datos de Goodreads que incluyeron 93 398 libros, 34 919 254 interacciones y 2 389 900 reseñas. Los modelos híbridos mejoraron la calidad de las recomendaciones al superar la sobreespecialización y la escasez de datos, y concluyó que combinan eficientemente ambos enfoques con mejoras en precisión, diversidad y adaptabilidad.</w:t>
       </w:r>
     </w:p>
     <w:p>
       <w:pPr>
         <w:pStyle w:val="NORML3"/>
       </w:pPr>
-      <w:r>
-        <w:t xml:space="preserve">Martínez Sixto et al. (2025) evaluaron el desempeño de seis modelos de lenguaje grandes dentro de un sistema de generación aumentada por recuperación para producir diagramas de clases UML a partir de historias de usuario. Entre los modelos evaluados figuraron Gemini 2.5 Pro, Claude Sonnet 4, GPT-4 y Llama 3.2. Claude Sonnet 4, Gemini 2.5 Pro y GPT-4 obtuvieron el mejor desempeño, y el estudio mostró que la efectividad de RAG depende en gran medida de la calidad y relevancia del contexto recuperado.</w:t>
+      <w:sdt>
+        <w:sdtPr>
+          <w:tag w:val="MENDELEY_CITATION_v3_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"/>
+          <w:id w:val="-638811627"/>
+        </w:sdtPr>
+        <w:sdtContent>
+          <w:r>
+            <w:t xml:space="preserve">Martínez Sixto et al. (2025)</w:t>
+          </w:r>
+        </w:sdtContent>
+      </w:sdt>
+      <w:r>
+        <w:t xml:space="preserve"> evaluaron el desempeño de seis modelos de lenguaje grandes dentro de un sistema de generación aumentada por recuperación para producir diagramas de clases UML a partir de historias de usuario. Entre los modelos evaluados figuraron Gemini 2.5 Pro, Claude Sonnet 4, GPT-4 y Llama 3.2. Claude Sonnet 4, Gemini 2.5 Pro y GPT-4 obtuvieron el mejor desempeño, y el estudio mostró que la efectividad de RAG depende en gran medida de la calidad y relevancia del contexto recuperado.</w:t>
       </w:r>
     </w:p>
     <w:p>
       <w:pPr>
         <w:pStyle w:val="NORML3"/>
       </w:pPr>
-      <w:r>
-        <w:t xml:space="preserve">Cisneros-Bravo et al. (2023) exploraron cómo la falta de orientación vocacional influye en la deserción universitaria. Mediante una metodología mixta encuestaron a 231 estudiantes de bachillerato: el 36.8 % no había recibido orientación vocacional y el 87 % manifestó interés en contar con herramientas de orientación. Concluyeron que la falta de orientación es un factor clave de la deserción y que deben fortalecerse estas herramientas en el nivel medio superior.</w:t>
+      <w:sdt>
+        <w:sdtPr>
+          <w:tag w:val="MENDELEY_CITATION_v3_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"/>
+          <w:id w:val="-723253467"/>
+        </w:sdtPr>
+        <w:sdtContent>
+          <w:r>
+            <w:t xml:space="preserve">Cisneros-Bravo et al. (2023)</w:t>
+          </w:r>
+        </w:sdtContent>
+      </w:sdt>
+      <w:r>
+        <w:t xml:space="preserve"> exploraron cómo la falta de orientación vocacional influye en la deserción universitaria. Mediante una metodología mixta encuestaron a 231 estudiantes de bachillerato: el 36.8 % no había recibido orientación vocacional y el 87 % manifestó interés en contar con herramientas de orientación. Concluyeron que la falta de orientación es un factor clave de la deserción y que deben fortalecerse estas herramientas en el nivel medio superior.</w:t>
       </w:r>
     </w:p>
     <w:p>
       <w:pPr>
         <w:pStyle w:val="NORML3"/>
       </w:pPr>
-      <w:r>
-        <w:t xml:space="preserve">Carballo-Mendívil et al. (2025) diseñaron un sistema de alerta temprana para predecir la deserción universitaria desde la inscripción, con información académica, socioeconómica y demográfica de cerca de 40 000 estudiantes de una universidad pública de México. Siguiendo la metodología CRISP-DM, el algoritmo XGBoost obtuvo un AUC-ROC de 0.69 y una sensibilidad de 88 %. La edad, el promedio de bachillerato y las condiciones económicas y familiares fueron determinantes, y el modelo permitió identificar estudiantes en riesgo antes del inicio del ciclo.</w:t>
+      <w:sdt>
+        <w:sdtPr>
+          <w:tag w:val="MENDELEY_CITATION_v3_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"/>
+          <w:id w:val="-1576282367"/>
+        </w:sdtPr>
+        <w:sdtContent>
+          <w:r>
+            <w:t xml:space="preserve">Carballo-Mendívil et al. (2025)</w:t>
+          </w:r>
+        </w:sdtContent>
+      </w:sdt>
+      <w:r>
+        <w:t xml:space="preserve"> diseñaron un sistema de alerta temprana para predecir la deserción universitaria desde la inscripción, con información académica, socioeconómica y demográfica de cerca de 40 000 estudiantes de una universidad pública de México. Siguiendo la metodología CRISP-DM, el algoritmo XGBoost obtuvo un AUC-ROC de 0.69 y una sensibilidad de 88 %. La edad, el promedio de bachillerato y las condiciones económicas y familiares fueron determinantes, y el modelo permitió identificar estudiantes en riesgo antes del inicio del ciclo.</w:t>
       </w:r>
     </w:p>
     <w:sdt>
@@ -7152,40 +7726,95 @@
       <w:pPr>
         <w:pStyle w:val="NORML3"/>
       </w:pPr>
-      <w:r>
-        <w:t xml:space="preserve">Balarezo et al. (2024) diseñaron un asistente conversacional basado en arquitectura RAG para optimizar la búsqueda, recuperación y análisis de resoluciones históricas de la Comisión de Eliminación de Barreras Burocráticas del INDECOPI. El diseño optimizó la búsqueda contextual, redujo los tiempos de revisión, análisis y redacción, y mejoró la precisión de las respuestas frente a los buscadores tradicionales. Concluyeron que su implementación es viable, pertinente y beneficiosa.</w:t>
+      <w:sdt>
+        <w:sdtPr>
+          <w:tag w:val="MENDELEY_CITATION_v3_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"/>
+          <w:id w:val="980771596"/>
+        </w:sdtPr>
+        <w:sdtContent>
+          <w:r>
+            <w:t xml:space="preserve">Marroquin Balarezo et al. (2024)</w:t>
+          </w:r>
+        </w:sdtContent>
+      </w:sdt>
+      <w:r>
+        <w:t xml:space="preserve"> diseñaron un asistente conversacional basado en arquitectura RAG para optimizar la búsqueda, recuperación y análisis de resoluciones históricas de la Comisión de Eliminación de Barreras Burocráticas del INDECOPI. El diseño optimizó la búsqueda contextual, redujo los tiempos de revisión, análisis y redacción, y mejoró la precisión de las respuestas frente a los buscadores tradicionales. Concluyeron que su implementación es viable, pertinente y beneficiosa.</w:t>
       </w:r>
     </w:p>
     <w:p>
       <w:pPr>
         <w:pStyle w:val="NORML3"/>
       </w:pPr>
-      <w:r>
-        <w:t xml:space="preserve">Yatco y Jacha (2024), en la investigación "Modelo de machine learning para predicción de deserción estudiantil", desarrollaron un modelo predictivo de la deserción en el Perú con datos de la Encuesta Nacional de Hogares y una amplia gama de variables sociodemográficas. El modelo mostró potencial para la identificación temprana de estudiantes en riesgo, y los autores recomendaron explorar modelos híbridos y técnicas de aprendizaje profundo.</w:t>
+      <w:sdt>
+        <w:sdtPr>
+          <w:tag w:val="MENDELEY_CITATION_v3_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"/>
+          <w:id w:val="294075181"/>
+        </w:sdtPr>
+        <w:sdtContent>
+          <w:r>
+            <w:t xml:space="preserve">Yataco Cañari y Jacha Rojas (2024)</w:t>
+          </w:r>
+        </w:sdtContent>
+      </w:sdt>
+      <w:r>
+        <w:t xml:space="preserve">, en la investigación "Modelo de machine learning para predicción de deserción estudiantil", desarrollaron un modelo predictivo de la deserción en el Perú con datos de la Encuesta Nacional de Hogares y una amplia gama de variables sociodemográficas. El modelo mostró potencial para la identificación temprana de estudiantes en riesgo, y los autores recomendaron explorar modelos híbridos y técnicas de aprendizaje profundo.</w:t>
       </w:r>
     </w:p>
     <w:p>
       <w:pPr>
         <w:pStyle w:val="NORML3"/>
       </w:pPr>
-      <w:r>
-        <w:t xml:space="preserve">Guadalupe y Rodriguez (2025), en el estudio "Modelo predictivo basado en machine learning para la reducción de la deserción estudiantil en las universidades privadas del Perú: caso Universidad Privada San Juan Bautista", desarrollaron un modelo predictivo con enfoque cuantitativo y diseño preexperimental longitudinal. El modelo anticipó eficazmente la deserción, y concluyeron que los factores personales, académicos y socioeconómicos son determinantes y que las intervenciones específicas pueden mejorar la retención.</w:t>
+      <w:sdt>
+        <w:sdtPr>
+          <w:tag w:val="MENDELEY_CITATION_v3_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"/>
+          <w:id w:val="40166710"/>
+        </w:sdtPr>
+        <w:sdtContent>
+          <w:r>
+            <w:t xml:space="preserve">Guadalupe Mori (2025)</w:t>
+          </w:r>
+        </w:sdtContent>
+      </w:sdt>
+      <w:r>
+        <w:t xml:space="preserve">, en el estudio "Modelo predictivo basado en machine learning para la reducción de la deserción estudiantil en las universidades privadas del Perú: caso Universidad Privada San Juan Bautista", desarrolló un modelo predictivo con enfoque cuantitativo y diseño preexperimental longitudinal. El modelo anticipó eficazmente la deserción, y concluyó que los factores personales, académicos y socioeconómicos son determinantes y que las intervenciones específicas pueden mejorar la retención.</w:t>
       </w:r>
     </w:p>
     <w:p>
       <w:pPr>
         <w:pStyle w:val="NORML3"/>
       </w:pPr>
-      <w:r>
-        <w:t xml:space="preserve">Rodas (2024), en la investigación "Orientación vocacional y deserción universitaria en una universidad de Lima - 2024", exploró la relación entre ambas variables con enfoque cuantitativo y diseño no experimental en una muestra de 103 estudiantes de ingeniería. Encontró una correlación inversa significativa: a mayor orientación vocacional, menor deserción, además de la influencia de factores externos, institucionales, académicos y personales.</w:t>
+      <w:sdt>
+        <w:sdtPr>
+          <w:tag w:val="MENDELEY_CITATION_v3_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"/>
+          <w:id w:val="943547471"/>
+        </w:sdtPr>
+        <w:sdtContent>
+          <w:r>
+            <w:t xml:space="preserve">Rodas Zegarra de Escalante (2024)</w:t>
+          </w:r>
+        </w:sdtContent>
+      </w:sdt>
+      <w:r>
+        <w:t xml:space="preserve">, en la investigación "Orientación vocacional y deserción universitaria en una universidad de Lima - 2024", exploró la relación entre ambas variables con enfoque cuantitativo y diseño no experimental en una muestra de 103 estudiantes de ingeniería. Encontró una correlación inversa significativa: a mayor orientación vocacional, menor deserción, además de la influencia de factores externos, institucionales, académicos y personales.</w:t>
       </w:r>
     </w:p>
     <w:p>
       <w:pPr>
         <w:pStyle w:val="NORML3"/>
       </w:pPr>
-      <w:r>
-        <w:t xml:space="preserve">Velasquez Velasquez (2023) realizó una revisión sistemática de la literatura sobre inteligencia artificial aplicada al sector educativo, siguiendo la propuesta de Kitchenham, con el fin de proporcionar una estructura para futuras investigaciones. Entre los resultados destacaron las aplicaciones de tutores inteligentes.</w:t>
+      <w:sdt>
+        <w:sdtPr>
+          <w:tag w:val="MENDELEY_CITATION_v3_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"/>
+          <w:id w:val="1984066481"/>
+        </w:sdtPr>
+        <w:sdtContent>
+          <w:r>
+            <w:t xml:space="preserve">Velasquez Velasquez (2023)</w:t>
+          </w:r>
+        </w:sdtContent>
+      </w:sdt>
+      <w:r>
+        <w:t xml:space="preserve"> realizó una revisión sistemática de la literatura sobre inteligencia artificial aplicada al sector educativo, siguiendo la propuesta de Kitchenham, con el fin de proporcionar una estructura para futuras investigaciones. Entre los resultados destacaron las aplicaciones de tutores inteligentes.</w:t>
       </w:r>
     </w:p>
     <w:sdt>
@@ -7211,8 +7840,19 @@
       <w:pPr>
         <w:pStyle w:val="NORML3"/>
       </w:pPr>
-      <w:r>
-        <w:t xml:space="preserve">Rodriguez (2023) analizó la relación entre la inteligencia artificial y el rendimiento académico de los estudiantes de la Universidad Nacional del Altiplano, en la región Puno, mediante un enfoque cuantitativo, diseño no experimental descriptivo y encuestas aplicadas a una muestra censal de 82 estudiantes. Encontró que la inteligencia artificial tiene un efecto positivo en el rendimiento académico, principalmente en lo referido al aprendizaje automático, la tecnología de código abierto y los dispositivos portátiles, y concluyó que puede contribuir a mejorar la calidad de la educación en la región.</w:t>
+      <w:sdt>
+        <w:sdtPr>
+          <w:tag w:val="MENDELEY_CITATION_v3_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"/>
+          <w:id w:val="-1918949914"/>
+        </w:sdtPr>
+        <w:sdtContent>
+          <w:r>
+            <w:t xml:space="preserve">Rodríguez Chipana (2023)</w:t>
+          </w:r>
+        </w:sdtContent>
+      </w:sdt>
+      <w:r>
+        <w:t xml:space="preserve"> analizó la relación entre la inteligencia artificial y el rendimiento académico de los estudiantes de la UNA-Puno, en la región Puno, mediante un enfoque cuantitativo, diseño no experimental descriptivo y encuestas aplicadas a una muestra censal de 82 estudiantes. Encontró que la inteligencia artificial tiene un efecto positivo en el rendimiento académico, principalmente en lo referido al aprendizaje automático, la tecnología de código abierto y los dispositivos portátiles, y concluyó que puede contribuir a mejorar la calidad de la educación en la región.</w:t>
       </w:r>
     </w:p>
     <w:p>
@@ -7309,7 +7949,35 @@
         <w:pStyle w:val="NORML12"/>
       </w:pPr>
       <w:r>
-        <w:t xml:space="preserve">En América Latina la magnitud del problema es particularmente alta. Según el Banco Mundial, cerca de la mitad de la población de 25 a 29 años que inició estudios superiores no llegó a culminarlos (Ferreyra et al., 2017), y las cifras de deserción en el primer año, antes de la pandemia, rondaban el 31 % en Colombia, el 21 % en Chile y el 33 % en el Perú (Behr et al., 2020, como se citó en Escalante López et al., 2023).</w:t>
+        <w:t xml:space="preserve">En América Latina la magnitud del problema es particularmente alta. Según el Banco Mundial, cerca de la mitad de la población de 25 a 29 años que inició estudios superiores no llegó a culminarlos </w:t>
+      </w:r>
+      <w:sdt>
+        <w:sdtPr>
+          <w:tag w:val="MENDELEY_CITATION_v3_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"/>
+          <w:id w:val="1936843724"/>
+        </w:sdtPr>
+        <w:sdtContent>
+          <w:r>
+            <w:t xml:space="preserve">(Ferreyra et al., 2017)</w:t>
+          </w:r>
+        </w:sdtContent>
+      </w:sdt>
+      <w:r>
+        <w:t xml:space="preserve">, y las cifras de deserción en el primer año, antes de la pandemia, rondaban el 31 % en Colombia, el 21 % en Chile y el 33 % en el Perú </w:t>
+      </w:r>
+      <w:sdt>
+        <w:sdtPr>
+          <w:tag w:val="MENDELEY_CITATION_v3_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"/>
+          <w:id w:val="-1716161159"/>
+        </w:sdtPr>
+        <w:sdtContent>
+          <w:r>
+            <w:t xml:space="preserve">(Behr et al., 2020, como se citó en Escalante López et al., 2023)</w:t>
+          </w:r>
+        </w:sdtContent>
+      </w:sdt>
+      <w:r>
+        <w:t xml:space="preserve">.</w:t>
       </w:r>
     </w:p>
     <w:p>
@@ -7317,7 +7985,35 @@
         <w:pStyle w:val="NORML12"/>
       </w:pPr>
       <w:r>
-        <w:t xml:space="preserve">En el caso peruano, según el II Informe Bienal sobre la Realidad Universitaria de la SUNEDU, alrededor del 15.8 % de los estudiantes abandonó las aulas universitarias entre 2012 y 2018 (Superintendencia Nacional de Educación Superior Universitaria, 2020), y la limitada disponibilidad de herramientas de orientación vocacional basadas en evidencia agrava este panorama. Escalante López et al. (2023) señalan que la deserción sigue siendo un problema no resuelto, asociado a factores económicos, familiares, vocacionales y motivacionales, y que la falta de orientación y de estrategias preventivas limita la permanencia.</w:t>
+        <w:t xml:space="preserve">En el caso peruano, según el II Informe Bienal sobre la Realidad Universitaria de la SUNEDU, alrededor del 15.8 % de los estudiantes abandonó las aulas universitarias entre 2012 y 2018 </w:t>
+      </w:r>
+      <w:sdt>
+        <w:sdtPr>
+          <w:tag w:val="MENDELEY_CITATION_v3_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"/>
+          <w:id w:val="875948172"/>
+        </w:sdtPr>
+        <w:sdtContent>
+          <w:r>
+            <w:t xml:space="preserve">(Superintendencia Nacional de Educación Superior Universitaria, 2020)</w:t>
+          </w:r>
+        </w:sdtContent>
+      </w:sdt>
+      <w:r>
+        <w:t xml:space="preserve">, y la limitada disponibilidad de herramientas de orientación vocacional basadas en evidencia agrava este panorama. </w:t>
+      </w:r>
+      <w:sdt>
+        <w:sdtPr>
+          <w:tag w:val="MENDELEY_CITATION_v3_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"/>
+          <w:id w:val="-369095467"/>
+        </w:sdtPr>
+        <w:sdtContent>
+          <w:r>
+            <w:t xml:space="preserve">Escalante López et al. (2023)</w:t>
+          </w:r>
+        </w:sdtContent>
+      </w:sdt>
+      <w:r>
+        <w:t xml:space="preserve"> señalan que la deserción sigue siendo un problema no resuelto, asociado a factores económicos, familiares, vocacionales y motivacionales, y que la falta de orientación y de estrategias preventivas limita la permanencia.</w:t>
       </w:r>
     </w:p>
     <w:p>
@@ -7325,7 +8021,35 @@
         <w:pStyle w:val="NORML12"/>
       </w:pPr>
       <w:r>
-        <w:t xml:space="preserve">En la región de Puno el panorama se intensifica por las desigualdades socioeconómicas y geográficas del Altiplano y por el limitado acceso a información vocacional personalizada. La deserción y el bajo rendimiento representan desafíos críticos para la Universidad Nacional del Altiplano (Escobar-Mamani y Cuentas Yupanqui, 2024), institución en la que la inteligencia artificial ha mostrado potencial para mejorar el rendimiento académico (Rodriguez, 2023).</w:t>
+        <w:t xml:space="preserve">En la región de Puno el panorama se intensifica por las desigualdades socioeconómicas y geográficas del Altiplano y por el limitado acceso a información vocacional personalizada. La deserción y el bajo rendimiento representan desafíos críticos para la UNA-Puno </w:t>
+      </w:r>
+      <w:sdt>
+        <w:sdtPr>
+          <w:tag w:val="MENDELEY_CITATION_v3_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"/>
+          <w:id w:val="318749974"/>
+        </w:sdtPr>
+        <w:sdtContent>
+          <w:r>
+            <w:t xml:space="preserve">(Escobar-Mamani y Cuentas Yupanqui, 2024)</w:t>
+          </w:r>
+        </w:sdtContent>
+      </w:sdt>
+      <w:r>
+        <w:t xml:space="preserve">, institución en la que la inteligencia artificial ha mostrado potencial para mejorar el rendimiento académico </w:t>
+      </w:r>
+      <w:sdt>
+        <w:sdtPr>
+          <w:tag w:val="MENDELEY_CITATION_v3_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"/>
+          <w:id w:val="1880488820"/>
+        </w:sdtPr>
+        <w:sdtContent>
+          <w:r>
+            <w:t xml:space="preserve">(Rodríguez Chipana, 2023)</w:t>
+          </w:r>
+        </w:sdtContent>
+      </w:sdt>
+      <w:r>
+        <w:t xml:space="preserve">.</w:t>
       </w:r>
     </w:p>
     <w:p>
@@ -7495,7 +8219,21 @@
         <w:pStyle w:val="NORML12"/>
       </w:pPr>
       <w:r>
-        <w:t xml:space="preserve">La deserción universitaria es un desafío serio en la educación superior peruana, especialmente en la región de Puno, donde existen marcadas desigualdades en el acceso a información y apoyo para elegir una carrera. La brecha entre las capacidades de los postulantes y las rutas educativas que eligen incide en la deserción y en la falta de coincidencia entre habilidades, intereses y trayectorias formativas (Rodas, 2024). Con frecuencia los postulantes eligen una carrera sin información previa adecuada, lo que conduce a su abandono o a cambios de programa.</w:t>
+        <w:t xml:space="preserve">La deserción universitaria es un desafío serio en la educación superior peruana, especialmente en la región de Puno, donde existen marcadas desigualdades en el acceso a información y apoyo para elegir una carrera. La brecha entre las capacidades de los postulantes y las rutas educativas que eligen incide en la deserción y en la falta de coincidencia entre habilidades, intereses y trayectorias formativas </w:t>
+      </w:r>
+      <w:sdt>
+        <w:sdtPr>
+          <w:tag w:val="MENDELEY_CITATION_v3_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"/>
+          <w:id w:val="-367224100"/>
+        </w:sdtPr>
+        <w:sdtContent>
+          <w:r>
+            <w:t xml:space="preserve">(Rodas Zegarra de Escalante, 2024)</w:t>
+          </w:r>
+        </w:sdtContent>
+      </w:sdt>
+      <w:r>
+        <w:t xml:space="preserve">. Con frecuencia los postulantes eligen una carrera sin información previa adecuada, lo que conduce a su abandono o a cambios de programa.</w:t>
       </w:r>
     </w:p>
     <w:p>
@@ -7833,7 +8571,7 @@
         <w:pStyle w:val="NORML12"/>
       </w:pPr>
       <w:r>
-        <w:t xml:space="preserve">La investigación se desarrolló en la Universidad Nacional del Altiplano de Puno, ubicada en la ciudad de Puno, provincia y región de Puno, Perú, a una altitud aproximada de 3 827 m s. n. m., en las coordenadas 15°50′24″ S y 70°01′19″ O. La universidad es la principal institución pública de educación superior de la región y recibe postulantes de sus trece provincias, tanto de zonas urbanas como rurales.</w:t>
+        <w:t xml:space="preserve">La investigación se desarrolló en la UNA-Puno, ubicada en la ciudad de Puno, provincia y región de Puno, Perú, a una altitud aproximada de 3 827 m s. n. m., en las coordenadas 15°50′24″ S y 70°01′19″ O. La universidad es la principal institución pública de educación superior de la región y recibe postulantes de sus trece provincias, tanto de zonas urbanas como rurales.</w:t>
       </w:r>
     </w:p>
     <w:p>
@@ -7878,7 +8616,7 @@
         <w:pStyle w:val="NORML12"/>
       </w:pPr>
       <w:r>
-        <w:t xml:space="preserve">La población está conformada por la totalidad de postulaciones registradas en la Universidad Nacional del Altiplano de Puno en los procesos de admisión comprendidos entre 2021-I y 2025-II, que suman 48 059 postulaciones correspondientes a 39 327 personas distintas, en todas las modalidades de admisión. La información se obtuvo de la Oficina de Admisión, con autorización del Vicerrectorado Académico, y del historial de educación secundaria registrado en el SIAGIE, vinculados mediante un identificador anónimo común.</w:t>
+        <w:t xml:space="preserve">La población está conformada por la totalidad de postulaciones registradas en la UNA-Puno en los procesos de admisión comprendidos entre 2021-I y 2025-II, que suman 48 059 postulaciones correspondientes a 39 327 personas distintas, en todas las modalidades de admisión. La información se obtuvo de la Oficina de Admisión, con autorización del Vicerrectorado Académico, y del historial de educación secundaria registrado en el SIAGIE, vinculados mediante un identificador anónimo común.</w:t>
       </w:r>
     </w:p>
     <w:p>
@@ -8246,7 +8984,7 @@
         <w:t xml:space="preserve">Nota.</w:t>
       </w:r>
       <w:r>
-        <w:t xml:space="preserve"> El conjunto analítico corresponde a 34 648 personas. Elaboración propia con datos de la Oficina de Admisión de la UNAP y del SIAGIE.</w:t>
+        <w:t xml:space="preserve"> El conjunto analítico corresponde a 34 648 personas. Elaboración propia con datos de la Oficina de Admisión de la UNA-Puno y del SIAGIE.</w:t>
       </w:r>
     </w:p>
     <w:sdt>
@@ -8534,7 +9272,35 @@
         <w:pStyle w:val="NORML4L5"/>
       </w:pPr>
       <w:r>
-        <w:t xml:space="preserve">Para identificar las variables asociadas al ingreso se aplicó la prueba U de Mann-Whitney en las variables numéricas (Mann y Whitney, 1947), con el delta de Cliff como tamaño del efecto (Cliff, 1993):</w:t>
+        <w:t xml:space="preserve">Para identificar las variables asociadas al ingreso se aplicó la prueba U de Mann-Whitney en las variables numéricas </w:t>
+      </w:r>
+      <w:sdt>
+        <w:sdtPr>
+          <w:tag w:val="MENDELEY_CITATION_v3_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"/>
+          <w:id w:val="-1908534228"/>
+        </w:sdtPr>
+        <w:sdtContent>
+          <w:r>
+            <w:t xml:space="preserve">(Mann y Whitney, 1947)</w:t>
+          </w:r>
+        </w:sdtContent>
+      </w:sdt>
+      <w:r>
+        <w:t xml:space="preserve">, con el delta de Cliff como tamaño del efecto </w:t>
+      </w:r>
+      <w:sdt>
+        <w:sdtPr>
+          <w:tag w:val="MENDELEY_CITATION_v3_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"/>
+          <w:id w:val="580771383"/>
+        </w:sdtPr>
+        <w:sdtContent>
+          <w:r>
+            <w:t xml:space="preserve">(Cliff, 1993)</w:t>
+          </w:r>
+        </w:sdtContent>
+      </w:sdt>
+      <w:r>
+        <w:t xml:space="preserve">:</w:t>
       </w:r>
     </w:p>
     <w:p>
@@ -8709,7 +9475,21 @@
         <w:pStyle w:val="NORML4L5"/>
       </w:pPr>
       <w:r>
-        <w:t xml:space="preserve">donde x_i y y_j son las observaciones de ingresantes y no ingresantes, y n₁ y n₂ los tamaños de cada grupo. Los valores absolutos de 0.147, 0.33 y 0.474 delimitan efectos pequeños, medianos y grandes. En las variables categóricas se aplicó la prueba chi cuadrado de independencia, con la V de Cramér (Cramér, 1946):</w:t>
+        <w:t xml:space="preserve">donde x_i y y_j son las observaciones de ingresantes y no ingresantes, y n₁ y n₂ los tamaños de cada grupo. Los valores absolutos de 0.147, 0.33 y 0.474 delimitan efectos pequeños, medianos y grandes. En las variables categóricas se aplicó la prueba chi cuadrado de independencia, con la V de Cramér </w:t>
+      </w:r>
+      <w:sdt>
+        <w:sdtPr>
+          <w:tag w:val="MENDELEY_CITATION_v3_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"/>
+          <w:id w:val="494858024"/>
+        </w:sdtPr>
+        <w:sdtContent>
+          <w:r>
+            <w:t xml:space="preserve">(Cramér, 1946)</w:t>
+          </w:r>
+        </w:sdtContent>
+      </w:sdt>
+      <w:r>
+        <w:t xml:space="preserve">:</w:t>
       </w:r>
     </w:p>
     <w:p>
@@ -8786,7 +9566,21 @@
         <w:pStyle w:val="NORML4L5"/>
       </w:pPr>
       <w:r>
-        <w:t xml:space="preserve">El desempeño se estimó mediante validación cruzada de cinco pliegues estratificada y agrupada por persona. La métrica principal fue el AUC-ROC, que equivale a la probabilidad de que el modelo asigne un puntaje mayor a un ingresante que a un no ingresante elegidos al azar (Hanley y McNeil, 1982):</w:t>
+        <w:t xml:space="preserve">El desempeño se estimó mediante validación cruzada de cinco pliegues estratificada y agrupada por persona. La métrica principal fue el AUC-ROC, que equivale a la probabilidad de que el modelo asigne un puntaje mayor a un ingresante que a un no ingresante elegidos al azar </w:t>
+      </w:r>
+      <w:sdt>
+        <w:sdtPr>
+          <w:tag w:val="MENDELEY_CITATION_v3_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"/>
+          <w:id w:val="-720301293"/>
+        </w:sdtPr>
+        <w:sdtContent>
+          <w:r>
+            <w:t xml:space="preserve">(Hanley y McNeil, 1982)</w:t>
+          </w:r>
+        </w:sdtContent>
+      </w:sdt>
+      <w:r>
+        <w:t xml:space="preserve">:</w:t>
       </w:r>
     </w:p>
     <w:p>
@@ -8858,7 +9652,21 @@
         <w:pStyle w:val="NORML4L5"/>
       </w:pPr>
       <w:r>
-        <w:t xml:space="preserve">Su intervalo de confianza al 95 % se obtuvo por remuestreo bootstrap de 1 000 réplicas. Se complementó con el AUC-PR, más informativo que el AUC-ROC cuando las clases están desbalanceadas (Saito y Rehmsmeier, 2015), y con la precisión, la sensibilidad y el F1 en el umbral que maximiza este último:</w:t>
+        <w:t xml:space="preserve">Su intervalo de confianza al 95 % se obtuvo por remuestreo bootstrap de 1 000 réplicas. Se complementó con el AUC-PR, más informativo que el AUC-ROC cuando las clases están desbalanceadas </w:t>
+      </w:r>
+      <w:sdt>
+        <w:sdtPr>
+          <w:tag w:val="MENDELEY_CITATION_v3_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"/>
+          <w:id w:val="-1090967872"/>
+        </w:sdtPr>
+        <w:sdtContent>
+          <w:r>
+            <w:t xml:space="preserve">(Saito y Rehmsmeier, 2015)</w:t>
+          </w:r>
+        </w:sdtContent>
+      </w:sdt>
+      <w:r>
+        <w:t xml:space="preserve">, y con la precisión, la sensibilidad y el F1 en el umbral que maximiza este último:</w:t>
       </w:r>
     </w:p>
     <w:p>
@@ -8907,7 +9715,35 @@
         <w:pStyle w:val="NORML4L5"/>
       </w:pPr>
       <w:r>
-        <w:t xml:space="preserve">Las probabilidades se calibraron mediante regresión isotónica ajustada sobre las predicciones fuera de pliegue (Zadrozny y Elkan, 2002), y la calidad de la calibración se evaluó con el puntaje de Brier (Brier, 1950), donde p_i es la probabilidad estimada y y_i el resultado observado:</w:t>
+        <w:t xml:space="preserve">Las probabilidades se calibraron mediante regresión isotónica ajustada sobre las predicciones fuera de pliegue </w:t>
+      </w:r>
+      <w:sdt>
+        <w:sdtPr>
+          <w:tag w:val="MENDELEY_CITATION_v3_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"/>
+          <w:id w:val="-1954207955"/>
+        </w:sdtPr>
+        <w:sdtContent>
+          <w:r>
+            <w:t xml:space="preserve">(Zadrozny y Elkan, 2002)</w:t>
+          </w:r>
+        </w:sdtContent>
+      </w:sdt>
+      <w:r>
+        <w:t xml:space="preserve">, y la calidad de la calibración se evaluó con el puntaje de Brier </w:t>
+      </w:r>
+      <w:sdt>
+        <w:sdtPr>
+          <w:tag w:val="MENDELEY_CITATION_v3_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"/>
+          <w:id w:val="277466213"/>
+        </w:sdtPr>
+        <w:sdtContent>
+          <w:r>
+            <w:t xml:space="preserve">(Brier, 1950)</w:t>
+          </w:r>
+        </w:sdtContent>
+      </w:sdt>
+      <w:r>
+        <w:t xml:space="preserve">, donde p_i es la probabilidad estimada y y_i el resultado observado:</w:t>
       </w:r>
     </w:p>
     <w:p>
@@ -9278,7 +10114,21 @@
         <w:pStyle w:val="NORML4L5"/>
       </w:pPr>
       <w:r>
-        <w:t xml:space="preserve">La calidad léxica de las rutas se evalúa con ROUGE-L, basado en la subsecuencia común más larga entre la ruta generada y la de referencia (Lin, 2004):</w:t>
+        <w:t xml:space="preserve">La calidad léxica de las rutas se evalúa con ROUGE-L, basado en la subsecuencia común más larga entre la ruta generada y la de referencia </w:t>
+      </w:r>
+      <w:sdt>
+        <w:sdtPr>
+          <w:tag w:val="MENDELEY_CITATION_v3_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"/>
+          <w:id w:val="-1651113206"/>
+        </w:sdtPr>
+        <w:sdtContent>
+          <w:r>
+            <w:t xml:space="preserve">(Lin, 2004)</w:t>
+          </w:r>
+        </w:sdtContent>
+      </w:sdt>
+      <w:r>
+        <w:t xml:space="preserve">:</w:t>
       </w:r>
     </w:p>
     <w:p>
@@ -9375,7 +10225,21 @@
         <w:pStyle w:val="NORML4L5"/>
       </w:pPr>
       <w:r>
-        <w:t xml:space="preserve">donde R y P son la sensibilidad y la precisión de la subsecuencia común más larga. La similitud semántica se evalúa con BERTScore, que compara las representaciones contextuales de cada elemento de ambos textos mediante similitud coseno (Zhang et al., 2020):</w:t>
+        <w:t xml:space="preserve">donde R y P son la sensibilidad y la precisión de la subsecuencia común más larga. La similitud semántica se evalúa con BERTScore, que compara las representaciones contextuales de cada elemento de ambos textos mediante similitud coseno </w:t>
+      </w:r>
+      <w:sdt>
+        <w:sdtPr>
+          <w:tag w:val="MENDELEY_CITATION_v3_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"/>
+          <w:id w:val="-2103205486"/>
+        </w:sdtPr>
+        <w:sdtContent>
+          <w:r>
+            <w:t xml:space="preserve">(Zhang et al., 2020)</w:t>
+          </w:r>
+        </w:sdtContent>
+      </w:sdt>
+      <w:r>
+        <w:t xml:space="preserve">:</w:t>
       </w:r>
     </w:p>
     <w:p>
@@ -9754,7 +10618,21 @@
         <w:pStyle w:val="NORML4L5"/>
       </w:pPr>
       <w:r>
-        <w:t xml:space="preserve">La calidad del rankeo se midió con la ganancia acumulada descontada normalizada (Järvelin y Kekäläinen, 2002), donde rel_i vale 1 si el programa de la posición i es el relevante y 0 en otro caso, e IDCG@k es el valor máximo alcanzable:</w:t>
+        <w:t xml:space="preserve">La calidad del rankeo se midió con la ganancia acumulada descontada normalizada </w:t>
+      </w:r>
+      <w:sdt>
+        <w:sdtPr>
+          <w:tag w:val="MENDELEY_CITATION_v3_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"/>
+          <w:id w:val="-2057606780"/>
+        </w:sdtPr>
+        <w:sdtContent>
+          <w:r>
+            <w:t xml:space="preserve">(Järvelin y Kekäläinen, 2002)</w:t>
+          </w:r>
+        </w:sdtContent>
+      </w:sdt>
+      <w:r>
+        <w:t xml:space="preserve">, donde rel_i vale 1 si el programa de la posición i es el relevante y 0 en otro caso, e IDCG@k es el valor máximo alcanzable:</w:t>
       </w:r>
     </w:p>
     <w:p>
@@ -9897,7 +10775,21 @@
         <w:pStyle w:val="NORML4L5"/>
       </w:pPr>
       <w:r>
-        <w:t xml:space="preserve">y con el rango recíproco medio (Voorhees, 1999), donde rank_q es la posición del programa relevante para el postulante q:</w:t>
+        <w:t xml:space="preserve">y con el rango recíproco medio </w:t>
+      </w:r>
+      <w:sdt>
+        <w:sdtPr>
+          <w:tag w:val="MENDELEY_CITATION_v3_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"/>
+          <w:id w:val="760857000"/>
+        </w:sdtPr>
+        <w:sdtContent>
+          <w:r>
+            <w:t xml:space="preserve">(Voorhees, 1999)</w:t>
+          </w:r>
+        </w:sdtContent>
+      </w:sdt>
+      <w:r>
+        <w:t xml:space="preserve">, donde rank_q es la posición del programa relevante para el postulante q:</w:t>
       </w:r>
     </w:p>
     <w:p>
@@ -10030,7 +10922,21 @@
         <w:pStyle w:val="NORML4L5"/>
       </w:pPr>
       <w:r>
-        <w:t xml:space="preserve">La diferencia entre el rango recíproco del XGBoost y el de la referencia por popularidad se evaluó con la prueba de rangos con signo de Wilcoxon para muestras relacionadas (Wilcoxon, 1945). Para contrastar si la arquitectura híbrida supera en al menos 10 % a cada modelo individual en la métrica combinada, se evalúa la normalidad de las diferencias con la prueba de Shapiro-Wilk y se aplica la prueba t de Student para muestras relacionadas si se cumple, o la prueba de Wilcoxon en caso contrario, con α = 0.05.</w:t>
+        <w:t xml:space="preserve">La diferencia entre el rango recíproco del XGBoost y el de la referencia por popularidad se evaluó con la prueba de rangos con signo de Wilcoxon para muestras relacionadas </w:t>
+      </w:r>
+      <w:sdt>
+        <w:sdtPr>
+          <w:tag w:val="MENDELEY_CITATION_v3_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"/>
+          <w:id w:val="-970806238"/>
+        </w:sdtPr>
+        <w:sdtContent>
+          <w:r>
+            <w:t xml:space="preserve">(Wilcoxon, 1945)</w:t>
+          </w:r>
+        </w:sdtContent>
+      </w:sdt>
+      <w:r>
+        <w:t xml:space="preserve">. Para contrastar si la arquitectura híbrida supera en al menos 10 % a cada modelo individual en la métrica combinada, se evalúa la normalidad de las diferencias con la prueba de Shapiro-Wilk y se aplica la prueba t de Student para muestras relacionadas si se cumple, o la prueba de Wilcoxon en caso contrario, con α = 0.05.</w:t>
       </w:r>
     </w:p>
     <w:p>
@@ -11065,7 +11971,7 @@
         <w:t xml:space="preserve">Nota.</w:t>
       </w:r>
       <w:r>
-        <w:t xml:space="preserve"> Postulaciones con resultado y con historial escolar emparejado. Elaboración propia con datos de la Oficina de Admisión de la UNAP y del SIAGIE.</w:t>
+        <w:t xml:space="preserve"> Postulaciones con resultado y con historial escolar emparejado. Elaboración propia con datos de la Oficina de Admisión de la UNA-Puno y del SIAGIE.</w:t>
       </w:r>
     </w:p>
     <w:p>
@@ -22290,7 +23196,21 @@
         <w:pStyle w:val="NORML12"/>
       </w:pPr>
       <w:r>
-        <w:t xml:space="preserve">El modelo tabular alcanzó un AUC-ROC de 0.754, superior al valor de 0.69 que Carballo-Mendívil et al. (2025) obtuvieron con XGBoost al predecir la deserción desde la inscripción con información previa al ingreso. Ambos estudios coinciden en que, con variables disponibles antes del inicio de los estudios, la capacidad predictiva es moderada: el resultado depende de factores que no están registrados en las bases administrativas, como el desempeño en el propio examen, la motivación o la preparación específica. Por ello, el umbral de 0.85 planteado en la hipótesis específica 1 resultó optimista para este tipo de información.</w:t>
+        <w:t xml:space="preserve">El modelo tabular alcanzó un AUC-ROC de 0.754, superior al valor de 0.69 que </w:t>
+      </w:r>
+      <w:sdt>
+        <w:sdtPr>
+          <w:tag w:val="MENDELEY_CITATION_v3_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"/>
+          <w:id w:val="1367913345"/>
+        </w:sdtPr>
+        <w:sdtContent>
+          <w:r>
+            <w:t xml:space="preserve">Carballo-Mendívil et al. (2025)</w:t>
+          </w:r>
+        </w:sdtContent>
+      </w:sdt>
+      <w:r>
+        <w:t xml:space="preserve"> obtuvieron con XGBoost al predecir la deserción desde la inscripción con información previa al ingreso. Ambos estudios coinciden en que, con variables disponibles antes del inicio de los estudios, la capacidad predictiva es moderada: el resultado depende de factores que no están registrados en las bases administrativas, como el desempeño en el propio examen, la motivación o la preparación específica. Por ello, el umbral de 0.85 planteado en la hipótesis específica 1 resultó optimista para este tipo de información.</w:t>
       </w:r>
     </w:p>
     <w:p>
@@ -22298,7 +23218,49 @@
         <w:pStyle w:val="NORML12"/>
       </w:pPr>
       <w:r>
-        <w:t xml:space="preserve">Los predictores de mayor peso, el rendimiento escolar previo, el acceso a tecnología y la preparación preuniversitaria, concuerdan con Guadalupe y Rodriguez (2025), quienes identificaron los factores académicos y socioeconómicos como determinantes, y con Carballo-Mendívil et al. (2025), que destacaron el promedio de bachillerato y las condiciones económicas. También son coherentes con Yatco y Jacha (2024), para quienes las variables sociodemográficas permiten anticipar trayectorias de riesgo.</w:t>
+        <w:t xml:space="preserve">Los predictores de mayor peso, el rendimiento escolar previo, el acceso a tecnología y la preparación preuniversitaria, concuerdan con </w:t>
+      </w:r>
+      <w:sdt>
+        <w:sdtPr>
+          <w:tag w:val="MENDELEY_CITATION_v3_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"/>
+          <w:id w:val="496311358"/>
+        </w:sdtPr>
+        <w:sdtContent>
+          <w:r>
+            <w:t xml:space="preserve">Guadalupe Mori (2025)</w:t>
+          </w:r>
+        </w:sdtContent>
+      </w:sdt>
+      <w:r>
+        <w:t xml:space="preserve">, quien identificó los factores académicos y socioeconómicos como determinantes, y con </w:t>
+      </w:r>
+      <w:sdt>
+        <w:sdtPr>
+          <w:tag w:val="MENDELEY_CITATION_v3_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"/>
+          <w:id w:val="-492136592"/>
+        </w:sdtPr>
+        <w:sdtContent>
+          <w:r>
+            <w:t xml:space="preserve">Carballo-Mendívil et al. (2025)</w:t>
+          </w:r>
+        </w:sdtContent>
+      </w:sdt>
+      <w:r>
+        <w:t xml:space="preserve">, que destacaron el promedio de bachillerato y las condiciones económicas. También son coherentes con </w:t>
+      </w:r>
+      <w:sdt>
+        <w:sdtPr>
+          <w:tag w:val="MENDELEY_CITATION_v3_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"/>
+          <w:id w:val="-2115135381"/>
+        </w:sdtPr>
+        <w:sdtContent>
+          <w:r>
+            <w:t xml:space="preserve">Yataco Cañari y Jacha Rojas (2024)</w:t>
+          </w:r>
+        </w:sdtContent>
+      </w:sdt>
+      <w:r>
+        <w:t xml:space="preserve">, para quienes las variables sociodemográficas permiten anticipar trayectorias de riesgo.</w:t>
       </w:r>
     </w:p>
     <w:p>
@@ -22306,7 +23268,35 @@
         <w:pStyle w:val="NORML12"/>
       </w:pPr>
       <w:r>
-        <w:t xml:space="preserve">La equivalencia práctica entre XGBoost y la regresión logística es consistente con Aguilar-Reyes et al. (2025), que compararon modelos de regresión y árboles de clasificación en el estudio del rendimiento académico, y matiza lo señalado por Fang et al. (2024) sobre la ventaja de los árboles de decisión en datos tabulares: cuando la relación entre predictores y resultado es predominantemente aditiva, un modelo lineal regularizado puede ser igual de eficaz y más interpretable. Aun así, el XGBoost ofrece una mayor sensibilidad en su umbral óptimo, lo que resulta preferible en orientación vocacional, donde descartar a quien sí podría ingresar es el error más costoso.</w:t>
+        <w:t xml:space="preserve">La equivalencia práctica entre XGBoost y la regresión logística es consistente con </w:t>
+      </w:r>
+      <w:sdt>
+        <w:sdtPr>
+          <w:tag w:val="MENDELEY_CITATION_v3_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"/>
+          <w:id w:val="2053906104"/>
+        </w:sdtPr>
+        <w:sdtContent>
+          <w:r>
+            <w:t xml:space="preserve">Aguilar-Reyes et al. (2025)</w:t>
+          </w:r>
+        </w:sdtContent>
+      </w:sdt>
+      <w:r>
+        <w:t xml:space="preserve">, que compararon modelos de regresión y árboles de clasificación en el estudio del rendimiento académico, y matiza lo señalado por </w:t>
+      </w:r>
+      <w:sdt>
+        <w:sdtPr>
+          <w:tag w:val="MENDELEY_CITATION_v3_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"/>
+          <w:id w:val="72961135"/>
+        </w:sdtPr>
+        <w:sdtContent>
+          <w:r>
+            <w:t xml:space="preserve">Fang et al. (2024)</w:t>
+          </w:r>
+        </w:sdtContent>
+      </w:sdt>
+      <w:r>
+        <w:t xml:space="preserve"> sobre la ventaja de los árboles de decisión en datos tabulares: cuando la relación entre predictores y resultado es predominantemente aditiva, un modelo lineal regularizado puede ser igual de eficaz y más interpretable. Aun así, el XGBoost ofrece una mayor sensibilidad en su umbral óptimo, lo que resulta preferible en orientación vocacional, donde descartar a quien sí podría ingresar es el error más costoso.</w:t>
       </w:r>
     </w:p>
     <w:p>
@@ -22314,7 +23304,21 @@
         <w:pStyle w:val="NORML12"/>
       </w:pPr>
       <w:r>
-        <w:t xml:space="preserve">La brecha en la tasa de falsos negativos entre colegios rurales y urbanos constituye el hallazgo de mayor implicancia práctica. Mientras los estudios de deserción revisados reportan métricas globales, este resultado muestra que una capacidad discriminativa equivalente entre grupos no garantiza errores equivalentes. Dado que la falta de orientación es un factor clave del abandono (Cisneros-Bravo et al., 2023; Rodas, 2024), un sistema que subestime sistemáticamente a los postulantes rurales podría ampliar la desigualdad que pretende reducir.</w:t>
+        <w:t xml:space="preserve">La brecha en la tasa de falsos negativos entre colegios rurales y urbanos constituye el hallazgo de mayor implicancia práctica. Mientras los estudios de deserción revisados reportan métricas globales, este resultado muestra que una capacidad discriminativa equivalente entre grupos no garantiza errores equivalentes. Dado que la falta de orientación es un factor clave del abandono </w:t>
+      </w:r>
+      <w:sdt>
+        <w:sdtPr>
+          <w:tag w:val="MENDELEY_CITATION_v3_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"/>
+          <w:id w:val="944405901"/>
+        </w:sdtPr>
+        <w:sdtContent>
+          <w:r>
+            <w:t xml:space="preserve">(Cisneros-Bravo et al., 2023; Rodas Zegarra de Escalante, 2024)</w:t>
+          </w:r>
+        </w:sdtContent>
+      </w:sdt>
+      <w:r>
+        <w:t xml:space="preserve">, un sistema que subestime sistemáticamente a los postulantes rurales podría ampliar la desigualdad que pretende reducir.</w:t>
       </w:r>
     </w:p>
     <w:p>
@@ -22322,7 +23326,21 @@
         <w:pStyle w:val="NORML12"/>
       </w:pPr>
       <w:r>
-        <w:t xml:space="preserve">En el rankeo, el hecho de que la tasa histórica de ingreso de cada programa ordene al menos tan bien como el modelo personalizado indica que la probabilidad de ingreso depende más del programa que de la interacción entre el perfil del postulante y el programa. El XGBoost aprendió principalmente efectos aditivos, lo que es coherente con su equivalencia frente a la regresión logística. Este resultado matiza lo reportado por Millan (2025), para quien los sistemas híbridos superan a los enfoques simples, y sugiere que en orientación vocacional la personalización debe demostrarse frente a referencias simples y no solo frente al azar. Como aspecto favorable, el rankeo no reprodujo la brecha territorial observada en la clasificación.</w:t>
+        <w:t xml:space="preserve">En el rankeo, el hecho de que la tasa histórica de ingreso de cada programa ordene al menos tan bien como el modelo personalizado indica que la probabilidad de ingreso depende más del programa que de la interacción entre el perfil del postulante y el programa. El XGBoost aprendió principalmente efectos aditivos, lo que es coherente con su equivalencia frente a la regresión logística. Este resultado matiza lo reportado por </w:t>
+      </w:r>
+      <w:sdt>
+        <w:sdtPr>
+          <w:tag w:val="MENDELEY_CITATION_v3_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"/>
+          <w:id w:val="-1691924039"/>
+        </w:sdtPr>
+        <w:sdtContent>
+          <w:r>
+            <w:t xml:space="preserve">Millán Gordillo (2025)</w:t>
+          </w:r>
+        </w:sdtContent>
+      </w:sdt>
+      <w:r>
+        <w:t xml:space="preserve">, para quien los sistemas híbridos superan a los enfoques simples, y sugiere que en orientación vocacional la personalización debe demostrarse frente a referencias simples y no solo frente al azar. Como aspecto favorable, el rankeo no reprodujo la brecha territorial observada en la clasificación.</w:t>
       </w:r>
     </w:p>
     <w:p>
@@ -22330,7 +23348,49 @@
         <w:pStyle w:val="NORML12"/>
       </w:pPr>
       <w:r>
-        <w:t xml:space="preserve">Respecto al corpus, la estrategia de traducir variables numéricas a descriptores verbales y construir respuestas de referencia a partir del rankeo sigue la lógica de Armando et al. (2023), que destacaron la calidad del corpus como factor clave del ajuste con LoRA, y de Mena (2023) y Dettmers et al. (2023), que mostraron la viabilidad del ajuste cuantizado con recursos limitados.</w:t>
+        <w:t xml:space="preserve">Respecto al corpus, la estrategia de traducir variables numéricas a descriptores verbales y construir respuestas de referencia a partir del rankeo sigue la lógica de </w:t>
+      </w:r>
+      <w:sdt>
+        <w:sdtPr>
+          <w:tag w:val="MENDELEY_CITATION_v3_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"/>
+          <w:id w:val="805325086"/>
+        </w:sdtPr>
+        <w:sdtContent>
+          <w:r>
+            <w:t xml:space="preserve">León Caranqui (2023)</w:t>
+          </w:r>
+        </w:sdtContent>
+      </w:sdt>
+      <w:r>
+        <w:t xml:space="preserve">, que destacó la calidad del corpus como factor clave del ajuste con LoRA, y de </w:t>
+      </w:r>
+      <w:sdt>
+        <w:sdtPr>
+          <w:tag w:val="MENDELEY_CITATION_v3_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"/>
+          <w:id w:val="1049878267"/>
+        </w:sdtPr>
+        <w:sdtContent>
+          <w:r>
+            <w:t xml:space="preserve">Mena Guitarra (2023)</w:t>
+          </w:r>
+        </w:sdtContent>
+      </w:sdt>
+      <w:r>
+        <w:t xml:space="preserve"> y </w:t>
+      </w:r>
+      <w:sdt>
+        <w:sdtPr>
+          <w:tag w:val="MENDELEY_CITATION_v3_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"/>
+          <w:id w:val="1665745616"/>
+        </w:sdtPr>
+        <w:sdtContent>
+          <w:r>
+            <w:t xml:space="preserve">Dettmers et al. (2023)</w:t>
+          </w:r>
+        </w:sdtContent>
+      </w:sdt>
+      <w:r>
+        <w:t xml:space="preserve">, que mostraron la viabilidad del ajuste cuantizado con recursos limitados.</w:t>
       </w:r>
     </w:p>
     <w:p>
@@ -22338,7 +23398,49 @@
         <w:pStyle w:val="NORML12"/>
       </w:pPr>
       <w:r>
-        <w:t xml:space="preserve">El ajuste con LoRA entrenó cerca del 0.3 % de los parámetros de un modelo de 1 500 millones y, en 34 minutos de una GPU Tesla T4, bastó para que el modelo aprendiera a redactar rutas fieles al ranking. Este resultado concuerda con Hu et al. (2021), quienes mostraron que la adaptación de bajo rango es competitiva frente al ajuste fino tradicional con una fracción del costo computacional, y con Dettmers et al. (2023), para quienes la cuantización en 4 bits no degrada el ajuste. A diferencia de Mena (2023), que identificó la memoria de video como una limitación importante al ajustar modelos de 7 mil millones de parámetros, el uso de un modelo de 1 500 millones permitió entrenar en infraestructura gratuita, lo que favorece la replicación en universidades con recursos limitados.</w:t>
+        <w:t xml:space="preserve">El ajuste con LoRA entrenó cerca del 0.3 % de los parámetros de un modelo de 1 500 millones y, en 34 minutos de una GPU Tesla T4, bastó para que el modelo aprendiera a redactar rutas fieles al ranking. Este resultado concuerda con </w:t>
+      </w:r>
+      <w:sdt>
+        <w:sdtPr>
+          <w:tag w:val="MENDELEY_CITATION_v3_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"/>
+          <w:id w:val="-1114220807"/>
+        </w:sdtPr>
+        <w:sdtContent>
+          <w:r>
+            <w:t xml:space="preserve">Hu et al. (2021)</w:t>
+          </w:r>
+        </w:sdtContent>
+      </w:sdt>
+      <w:r>
+        <w:t xml:space="preserve">, quienes mostraron que la adaptación de bajo rango es competitiva frente al ajuste fino tradicional con una fracción del costo computacional, y con </w:t>
+      </w:r>
+      <w:sdt>
+        <w:sdtPr>
+          <w:tag w:val="MENDELEY_CITATION_v3_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"/>
+          <w:id w:val="-1042845914"/>
+        </w:sdtPr>
+        <w:sdtContent>
+          <w:r>
+            <w:t xml:space="preserve">Dettmers et al. (2023)</w:t>
+          </w:r>
+        </w:sdtContent>
+      </w:sdt>
+      <w:r>
+        <w:t xml:space="preserve">, para quienes la cuantización en 4 bits no degrada el ajuste. A diferencia de </w:t>
+      </w:r>
+      <w:sdt>
+        <w:sdtPr>
+          <w:tag w:val="MENDELEY_CITATION_v3_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"/>
+          <w:id w:val="638433179"/>
+        </w:sdtPr>
+        <w:sdtContent>
+          <w:r>
+            <w:t xml:space="preserve">Mena Guitarra (2023)</w:t>
+          </w:r>
+        </w:sdtContent>
+      </w:sdt>
+      <w:r>
+        <w:t xml:space="preserve">, que identificó la memoria de video como una limitación importante al ajustar modelos de 7 mil millones de parámetros, el uso de un modelo de 1 500 millones permitió entrenar en infraestructura gratuita, lo que favorece la replicación en universidades con recursos limitados.</w:t>
       </w:r>
     </w:p>
     <w:p>
@@ -22346,7 +23448,49 @@
         <w:pStyle w:val="NORML12"/>
       </w:pPr>
       <w:r>
-        <w:t xml:space="preserve">La comparación entre condiciones muestra que el aporte del componente tabular no está en la forma del texto, que el modelo aprendió aun sin probabilidades, con un ROUGE-L de 0.877, sino en su contenido: sin el ranking, la coherencia descendió a 0.813, y con él alcanzó 1.000. Que el modelo sin probabilidades acierte el orden en el 81.3 % de los casos sugiere que el ranking puede inferirse en buena medida a partir del área de interés del perfil, lo que es coherente con el hallazgo del rankeo: la probabilidad de ingreso depende más del programa que del perfil individual. Este hallazgo coincide con Martínez Sixto et al. (2025), quienes encontraron que la efectividad de un modelo de lenguaje depende en gran medida de la calidad y relevancia del contexto que recibe, y respalda lo planteado por Millan (2025) sobre la ventaja de los enfoques híbridos. En cambio, matiza lo señalado por Castejon (2025), para quien una ingeniería de instrucciones adecuada elimina las alucinaciones: el modelo base recibió la misma instrucción con el ranking y, aun así, generó textos extensos que no respetaron el orden de los programas, lo que indica que en esta tarea la instrucción por sí sola no bastó y fue necesario el ajuste fino.</w:t>
+        <w:t xml:space="preserve">La comparación entre condiciones muestra que el aporte del componente tabular no está en la forma del texto, que el modelo aprendió aun sin probabilidades, con un ROUGE-L de 0.877, sino en su contenido: sin el ranking, la coherencia descendió a 0.813, y con él alcanzó 1.000. Que el modelo sin probabilidades acierte el orden en el 81.3 % de los casos sugiere que el ranking puede inferirse en buena medida a partir del área de interés del perfil, lo que es coherente con el hallazgo del rankeo: la probabilidad de ingreso depende más del programa que del perfil individual. Este hallazgo coincide con </w:t>
+      </w:r>
+      <w:sdt>
+        <w:sdtPr>
+          <w:tag w:val="MENDELEY_CITATION_v3_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"/>
+          <w:id w:val="-1468160619"/>
+        </w:sdtPr>
+        <w:sdtContent>
+          <w:r>
+            <w:t xml:space="preserve">Martínez Sixto et al. (2025)</w:t>
+          </w:r>
+        </w:sdtContent>
+      </w:sdt>
+      <w:r>
+        <w:t xml:space="preserve">, quienes encontraron que la efectividad de un modelo de lenguaje depende en gran medida de la calidad y relevancia del contexto que recibe, y respalda lo planteado por </w:t>
+      </w:r>
+      <w:sdt>
+        <w:sdtPr>
+          <w:tag w:val="MENDELEY_CITATION_v3_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"/>
+          <w:id w:val="-1513265289"/>
+        </w:sdtPr>
+        <w:sdtContent>
+          <w:r>
+            <w:t xml:space="preserve">Millán Gordillo (2025)</w:t>
+          </w:r>
+        </w:sdtContent>
+      </w:sdt>
+      <w:r>
+        <w:t xml:space="preserve"> sobre la ventaja de los enfoques híbridos. En cambio, matiza lo señalado por </w:t>
+      </w:r>
+      <w:sdt>
+        <w:sdtPr>
+          <w:tag w:val="MENDELEY_CITATION_v3_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"/>
+          <w:id w:val="-1791326862"/>
+        </w:sdtPr>
+        <w:sdtContent>
+          <w:r>
+            <w:t xml:space="preserve">Castejón Lozano (2025)</w:t>
+          </w:r>
+        </w:sdtContent>
+      </w:sdt>
+      <w:r>
+        <w:t xml:space="preserve">, para quien una ingeniería de instrucciones adecuada elimina las alucinaciones: el modelo base recibió la misma instrucción con el ranking y, aun así, generó textos extensos que no respetaron el orden de los programas, lo que indica que en esta tarea la instrucción por sí sola no bastó y fue necesario el ajuste fino.</w:t>
       </w:r>
     </w:p>
     <w:p>
@@ -22354,7 +23498,21 @@
         <w:pStyle w:val="NORML12"/>
       </w:pPr>
       <w:r>
-        <w:t xml:space="preserve">Los valores máximos de la arquitectura híbrida, con el 100.0 % de rutas idénticas a la referencia, deben interpretarse con cautela. Las respuestas de referencia se construyeron con una estructura fija a partir del ranking, por lo que el resultado demuestra que el modelo traslada con exactitud la información del componente tabular, pero no mide la calidad pedagógica de la orientación ni su utilidad percibida por los postulantes. Esta es la principal limitación del componente lingüístico y justifica validar las rutas con especialistas en orientación vocacional y con los propios postulantes, y ampliar el corpus con respuestas redactadas por orientadores, en línea con Armando et al. (2023), que destacaron la calidad del corpus como factor clave.</w:t>
+        <w:t xml:space="preserve">Los valores máximos de la arquitectura híbrida, con el 100.0 % de rutas idénticas a la referencia, deben interpretarse con cautela. Las respuestas de referencia se construyeron con una estructura fija a partir del ranking, por lo que el resultado demuestra que el modelo traslada con exactitud la información del componente tabular, pero no mide la calidad pedagógica de la orientación ni su utilidad percibida por los postulantes. Esta es la principal limitación del componente lingüístico y justifica validar las rutas con especialistas en orientación vocacional y con los propios postulantes, y ampliar el corpus con respuestas redactadas por orientadores, en línea con </w:t>
+      </w:r>
+      <w:sdt>
+        <w:sdtPr>
+          <w:tag w:val="MENDELEY_CITATION_v3_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"/>
+          <w:id w:val="-1424229125"/>
+        </w:sdtPr>
+        <w:sdtContent>
+          <w:r>
+            <w:t xml:space="preserve">León Caranqui (2023)</w:t>
+          </w:r>
+        </w:sdtContent>
+      </w:sdt>
+      <w:r>
+        <w:t xml:space="preserve">, que destacó la calidad del corpus como factor clave.</w:t>
       </w:r>
     </w:p>
     <w:p>
@@ -22499,7 +23657,7 @@
         <w:pStyle w:val="RECOMENT1"/>
       </w:pPr>
       <w:r>
-        <w:t xml:space="preserve">A la Universidad Nacional del Altiplano, incorporar en los procesos de admisión el registro sistemático de variables de preparación y de acceso a tecnología, y establecer mecanismos formales de vinculación con el SIAGIE, para disponer de información previa al examen que permita mejorar la capacidad predictiva de los sistemas de orientación.</w:t>
+        <w:t xml:space="preserve">A la UNA-Puno, incorporar en los procesos de admisión el registro sistemático de variables de preparación y de acceso a tecnología, y establecer mecanismos formales de vinculación con el SIAGIE, para disponer de información previa al examen que permita mejorar la capacidad predictiva de los sistemas de orientación.</w:t>
       </w:r>
     </w:p>
     <w:p>
@@ -22553,486 +23711,1313 @@
         </w:p>
       </w:sdtContent>
     </w:sdt>
-    <w:p>
-      <w:pPr>
-        <w:pStyle w:val="BIBLIOGRAFIA"/>
-      </w:pPr>
-      <w:r>
-        <w:t xml:space="preserve">Aguilar-Reyes, J. E., Mejía-Peñafiel, E. F., Morocho-Barrionuevo, T. P., y Velasco-Castelo, G.-M. (2025). Estudio del rendimiento académico mediante la comparación de modelos de regresión y árboles de clasificación. Telos: Revista de Estudios Interdisciplinarios en Ciencias Sociales, 27(1), 94-115. https://doi.org/10.36390/telos271.08</w:t>
-      </w:r>
-    </w:p>
-    <w:p>
-      <w:pPr>
-        <w:pStyle w:val="BIBLIOGRAFIA"/>
-      </w:pPr>
-      <w:r>
-        <w:t xml:space="preserve">Alejandro, S. Y. (2024). Orientación vocacional y profesional: la inteligencia artificial y su impacto en la educación. Revista Scientific, 9(34), 285-300. https://doi.org/10.29394/scientific.issn.2542-2987.2024.9.34.13.285-300</w:t>
-      </w:r>
-    </w:p>
-    <w:p>
-      <w:pPr>
-        <w:pStyle w:val="BIBLIOGRAFIA"/>
-      </w:pPr>
-      <w:r>
-        <w:t xml:space="preserve">Armando, J., Caranqui, L., y Riofrío, D. (2023). URKU: Adaptación de LLaMA 2 para la generación de texto en kichwa usando técnicas de Low-Rank Adaptation (LoRA) [Tesis de maestría, Universidad San Francisco de Quito]. http://bit.ly/COPETheses</w:t>
-      </w:r>
-    </w:p>
-    <w:p>
-      <w:pPr>
-        <w:pStyle w:val="BIBLIOGRAFIA"/>
-      </w:pPr>
-      <w:r>
-        <w:t xml:space="preserve">Balarezo, M., Pia, M., Hurtado, A., Alfredo, W., Churata, G., Francis, H., Atiquipa, S., Franklin, E., Felix, T., y Erick, R. (2024). Diseño de un asistente inteligente RAG para la Comisión de Eliminación de Barreras Burocráticas de INDECOPI-2024 [Tesis de maestría, Universidad Peruana de Ciencias Aplicadas]. http://hdl.handle.net/10757/684330</w:t>
-      </w:r>
-    </w:p>
-    <w:p>
-      <w:pPr>
-        <w:pStyle w:val="BIBLIOGRAFIA"/>
-      </w:pPr>
-      <w:r>
-        <w:t xml:space="preserve">Brier, G. W. (1950). Verification of forecasts expressed in terms of probability. Monthly Weather Review, 78(1), 1-3. https://doi.org/10.1175/1520-0493(1950)078&lt;0001:VOFEIT&gt;2.0.CO;2</w:t>
-      </w:r>
-    </w:p>
-    <w:p>
-      <w:pPr>
-        <w:pStyle w:val="BIBLIOGRAFIA"/>
-      </w:pPr>
-      <w:r>
-        <w:t xml:space="preserve">Carballo-Mendívil, B., Arellano-González, A., Ríos-Vázquez, N. J., y Lizardi-Duarte, M. del P. (2025). Predicting student dropout from day one: XGBoost-based early warning system using pre-enrollment data. Applied Sciences, 15(16). https://doi.org/10.3390/app15169202</w:t>
-      </w:r>
-    </w:p>
-    <w:p>
-      <w:pPr>
-        <w:pStyle w:val="BIBLIOGRAFIA"/>
-      </w:pPr>
-      <w:r>
-        <w:t xml:space="preserve">Castejon, F. (2025). SoroIA: Diseño e implementación de un sistema conversacional basado en modelos grandes de lenguaje para el Museo Sorolla [Tesis de maestría, Universidad Politécnica de Madrid]. https://oa.upm.es/90917/1/TFM_FEDERICO_CASTEJON_LOZANO.pdf</w:t>
-      </w:r>
-    </w:p>
-    <w:p>
-      <w:pPr>
-        <w:pStyle w:val="BIBLIOGRAFIA"/>
-      </w:pPr>
-      <w:r>
-        <w:t xml:space="preserve">Cen, C., Luo, G., Tian, Y., Fu, B., Chen, Y., Huang, S., Jiang, T., y Huang, G. (2024). Enhancing the dissemination of Cantonese Opera among youth via Bilibili: A study on intangible cultural heritage transmission. Humanities and Social Sciences Communications, 11(1). https://doi.org/10.1057/s41599-024-03537-w</w:t>
-      </w:r>
-    </w:p>
-    <w:p>
-      <w:pPr>
-        <w:pStyle w:val="BIBLIOGRAFIA"/>
-      </w:pPr>
-      <w:r>
-        <w:t xml:space="preserve">Chen, T., y Guestrin, C. (2016). XGBoost: A scalable tree boosting system. En Proceedings of the 22nd ACM SIGKDD International Conference on Knowledge Discovery and Data Mining (pp. 785-794). https://doi.org/10.1145/2939672.2939785</w:t>
-      </w:r>
-    </w:p>
-    <w:p>
-      <w:pPr>
-        <w:pStyle w:val="BIBLIOGRAFIA"/>
-      </w:pPr>
-      <w:r>
-        <w:t xml:space="preserve">Cisneros-Bravo, B. E., Rodríguez-Aguilar, R. M., Niño-Membrillo, Y. E., y Cuevas-Rasgado, A. D. (2023). Falta de orientación vocacional como factor en la deserción universitaria. Caso de estudio: zona Oriente del Estado de México. RIDE Revista Iberoamericana para la Investigación y el Desarrollo Educativo, 14(27). https://doi.org/10.23913/ride.v14i27.1715</w:t>
-      </w:r>
-    </w:p>
-    <w:p>
-      <w:pPr>
-        <w:pStyle w:val="BIBLIOGRAFIA"/>
-      </w:pPr>
-      <w:r>
-        <w:t xml:space="preserve">Cliff, N. (1993). Dominance statistics: Ordinal analyses to answer ordinal questions. Psychological Bulletin, 114(3), 494-509. https://doi.org/10.1037/0033-2909.114.3.494</w:t>
-      </w:r>
-    </w:p>
-    <w:p>
-      <w:pPr>
-        <w:pStyle w:val="BIBLIOGRAFIA"/>
-      </w:pPr>
-      <w:r>
-        <w:t xml:space="preserve">Cramér, H. (1946). Mathematical methods of statistics. Princeton University Press.</w:t>
-      </w:r>
-    </w:p>
-    <w:p>
-      <w:pPr>
-        <w:pStyle w:val="BIBLIOGRAFIA"/>
-      </w:pPr>
-      <w:r>
-        <w:t xml:space="preserve">Dettmers, T., Pagnoni, A., Holtzman, A., y Zettlemoyer, L. (2023). QLoRA: Efficient finetuning of quantized LLMs. En Advances in Neural Information Processing Systems 36. https://doi.org/10.48550/arXiv.2305.14314</w:t>
-      </w:r>
-    </w:p>
-    <w:p>
-      <w:pPr>
-        <w:pStyle w:val="BIBLIOGRAFIA"/>
-      </w:pPr>
-      <w:r>
-        <w:t xml:space="preserve">Escalante López, J. I., Medina Valderrama, C. J., y Vásquez Muñoz, A. (2023). La deserción universitaria: un problema no resuelto en el Perú. Hacedor - AIAPÆC, 7(1), 60-72. https://doi.org/10.26495/rch.v7i1.2421</w:t>
-      </w:r>
-    </w:p>
-    <w:p>
-      <w:pPr>
-        <w:pStyle w:val="BIBLIOGRAFIA"/>
-      </w:pPr>
-      <w:r>
-        <w:t xml:space="preserve">Escobar-Mamani, F., y Cuentas Yupanqui, S. R. (2024). Situación académica de estudiantes con matrícula regular y en riesgo académico en la Universidad Nacional del Altiplano, 2023-II. Journal of Humanities Titicaca, 2(1), 66-88. https://doi.org/10.70123/jht.7</w:t>
-      </w:r>
-    </w:p>
-    <w:p>
-      <w:pPr>
-        <w:pStyle w:val="BIBLIOGRAFIA"/>
-      </w:pPr>
-      <w:r>
-        <w:t xml:space="preserve">Fang, X., Xu, W., Tan, F. A., Zhang, J., Hu, Z., Qi, Y., Nickleach, S., Socolinsky, D., Sengamedu, S., y Faloutsos, C. (2024). Large language models (LLMs) on tabular data: Prediction, generation, and understanding. A survey. Transactions on Machine Learning Research. http://arxiv.org/abs/2402.17944</w:t>
-      </w:r>
-    </w:p>
-    <w:p>
-      <w:pPr>
-        <w:pStyle w:val="BIBLIOGRAFIA"/>
-      </w:pPr>
-      <w:r>
-        <w:t xml:space="preserve">Fernandez, J. M., Petrocelli, D., Matuk, R., Lanson, D., Zamudio, E., Cagnina, L., Gil Costa, V., y Errecalde, M. (2025). Fine-tuning y adaptación de modelos de lenguaje abiertos en infraestructura HPC para aplicaciones de dominio específico. SEDICI, Universidad Nacional de La Plata. http://sedici.unlp.edu.ar/handle/10915/183892</w:t>
-      </w:r>
-    </w:p>
-    <w:p>
-      <w:pPr>
-        <w:pStyle w:val="BIBLIOGRAFIA"/>
-      </w:pPr>
-      <w:r>
-        <w:t xml:space="preserve">Ferreyra, M. M., Avitabile, C., Botero Álvarez, J., Haimovich Paz, F., y Urzúa, S. (2017). Momento decisivo: la educación superior en América Latina y el Caribe. Banco Mundial. https://doi.org/10.1596/978-1-4648-1014-5</w:t>
-      </w:r>
-    </w:p>
-    <w:p>
-      <w:pPr>
-        <w:pStyle w:val="BIBLIOGRAFIA"/>
-      </w:pPr>
-      <w:r>
-        <w:t xml:space="preserve">Flores Meléndez, M., Góngora Cortés, J. J., López Cabrera, M. V., y Eraña Rojas, I. E. (2020). The «call» of medicine. Use of new mentoring models for vocational orientation. Educación Médica, 21(2), 145-148. https://doi.org/10.1016/j.edumed.2018.11.008</w:t>
-      </w:r>
-    </w:p>
-    <w:p>
-      <w:pPr>
-        <w:pStyle w:val="BIBLIOGRAFIA"/>
-      </w:pPr>
-      <w:r>
-        <w:t xml:space="preserve">Gao, D., Chen, S., Yang, Z., Yang, L., Gao, H., Wu, M., Yu, S., Xuan, Q., Zhang, W., Yang, L., y Cai, X. (2025). MLoRA+: Transformer-fusion mixture-of-LoRA network for multi-domain click-through rate prediction. Expert Systems with Applications, 297. https://doi.org/10.1016/j.eswa.2025.129486</w:t>
-      </w:r>
-    </w:p>
-    <w:p>
-      <w:pPr>
-        <w:pStyle w:val="BIBLIOGRAFIA"/>
-      </w:pPr>
-      <w:r>
-        <w:t xml:space="preserve">García, G., y Serradilla, F. (2021). Modelos de Transformers para la clasificación de texto [Tesis de maestría, Universidad Politécnica de Madrid].</w:t>
-      </w:r>
-    </w:p>
-    <w:p>
-      <w:pPr>
-        <w:pStyle w:val="BIBLIOGRAFIA"/>
-      </w:pPr>
-      <w:r>
-        <w:t xml:space="preserve">Guadalupe, V., y Rodriguez, C. (2025). Modelo predictivo basado en machine learning para la reducción de la deserción estudiantil en las universidades privadas del Perú: caso Universidad Privada San Juan Bautista [Tesis doctoral, Universidad Nacional Federico Villarreal].</w:t>
-      </w:r>
-    </w:p>
-    <w:p>
-      <w:pPr>
-        <w:pStyle w:val="BIBLIOGRAFIA"/>
-      </w:pPr>
-      <w:r>
-        <w:t xml:space="preserve">Hanley, J. A., y McNeil, B. J. (1982). The meaning and use of the area under a receiver operating characteristic (ROC) curve. Radiology, 143(1), 29-36. https://doi.org/10.1148/radiology.143.1.7063747</w:t>
-      </w:r>
-    </w:p>
-    <w:p>
-      <w:pPr>
-        <w:pStyle w:val="BIBLIOGRAFIA"/>
-      </w:pPr>
-      <w:r>
-        <w:t xml:space="preserve">Hu, E. J., Shen, Y., Wallis, P., Allen-Zhu, Z., Li, Y., Wang, S., Wang, L., y Chen, W. (2021). LoRA: Low-rank adaptation of large language models. arXiv. https://doi.org/10.48550/arXiv.2106.09685</w:t>
-      </w:r>
-    </w:p>
-    <w:p>
-      <w:pPr>
-        <w:pStyle w:val="BIBLIOGRAFIA"/>
-      </w:pPr>
-      <w:r>
-        <w:t xml:space="preserve">Jardon, M., Granizo, J., Yaselga, W., y Cocha, M. (2024). Impacto de los asistentes virtuales de inteligencia artificial en el rendimiento académico de estudiantes universitarios. Revista Social Fronteriza, 4. https://doi.org/10.59814/resofro.2024.4(4)e338</w:t>
-      </w:r>
-    </w:p>
-    <w:p>
-      <w:pPr>
-        <w:pStyle w:val="BIBLIOGRAFIA"/>
-      </w:pPr>
-      <w:r>
-        <w:t xml:space="preserve">Järvelin, K., y Kekäläinen, J. (2002). Cumulated gain-based evaluation of IR techniques. ACM Transactions on Information Systems, 20(4), 422-446. https://doi.org/10.1145/582415.582418</w:t>
-      </w:r>
-    </w:p>
-    <w:p>
-      <w:pPr>
-        <w:pStyle w:val="BIBLIOGRAFIA"/>
-      </w:pPr>
-      <w:r>
-        <w:t xml:space="preserve">Kung, T. H., Cheatham, M., Medenilla, A., Sillos, C., De Leon, L., Elepaño, C., Madriaga, M., Aggabao, R., Diaz-Candido, G., Maningo, J., y Tseng, V. (2023). Performance of ChatGPT on USMLE: Potential for AI-assisted medical education using large language models. PLOS Digital Health, 2(2), e0000198. https://doi.org/10.1371/journal.pdig.0000198</w:t>
-      </w:r>
-    </w:p>
-    <w:p>
-      <w:pPr>
-        <w:pStyle w:val="BIBLIOGRAFIA"/>
-      </w:pPr>
-      <w:r>
-        <w:t xml:space="preserve">Li, Y., Li, Z., Zhang, K., Dan, R., Jiang, S., y Zhang, Y. (2023). ChatDoctor: A medical chat model fine-tuned on a large language model Meta-AI (LLaMA) using medical domain knowledge. Cureus. https://doi.org/10.7759/cureus.40895</w:t>
-      </w:r>
-    </w:p>
-    <w:p>
-      <w:pPr>
-        <w:pStyle w:val="BIBLIOGRAFIA"/>
-      </w:pPr>
-      <w:r>
-        <w:t xml:space="preserve">Lin, C.-Y. (2004). ROUGE: A package for automatic evaluation of summaries. En Text Summarization Branches Out (pp. 74-81). Association for Computational Linguistics.</w:t>
-      </w:r>
-    </w:p>
-    <w:p>
-      <w:pPr>
-        <w:pStyle w:val="BIBLIOGRAFIA"/>
-      </w:pPr>
-      <w:r>
-        <w:t xml:space="preserve">Liu, Z., Liu, Z., Feng, R., Feng, P., Chu, J., y Peng, X. (2025). LoRA-TCN: A pre-trained/fine-tuning learning paradigm for drift adaptation. Sensors and Actuators B: Chemical, 446. https://doi.org/10.1016/j.snb.2025.138644</w:t>
-      </w:r>
-    </w:p>
-    <w:p>
-      <w:pPr>
-        <w:pStyle w:val="BIBLIOGRAFIA"/>
-      </w:pPr>
-      <w:r>
-        <w:t xml:space="preserve">Mann, H. B., y Whitney, D. R. (1947). On a test of whether one of two random variables is stochastically larger than the other. The Annals of Mathematical Statistics, 18(1), 50-60. https://doi.org/10.1214/aoms/1177730491</w:t>
-      </w:r>
-    </w:p>
-    <w:p>
-      <w:pPr>
-        <w:pStyle w:val="BIBLIOGRAFIA"/>
-      </w:pPr>
-      <w:r>
-        <w:t xml:space="preserve">Martínez Sixto, L., Fernández y Fernández, C. A., y Millán Hernández, C. E. (2025). Comparación del desempeño de LLMs en la generación de diagramas de clases UML mediante un sistema RAG. Revista de Investigación en Tecnologías de la Información, 13(31), 64-79. https://doi.org/10.36825/riti.13.31.007</w:t>
-      </w:r>
-    </w:p>
-    <w:p>
-      <w:pPr>
-        <w:pStyle w:val="BIBLIOGRAFIA"/>
-      </w:pPr>
-      <w:r>
-        <w:t xml:space="preserve">Mena, S. (2023). Usos y aplicaciones de modelos de lenguaje masivos en español [Tesis de maestría, Universidad San Francisco de Quito].</w:t>
-      </w:r>
-    </w:p>
-    <w:p>
-      <w:pPr>
-        <w:pStyle w:val="BIBLIOGRAFIA"/>
-      </w:pPr>
-      <w:r>
-        <w:t xml:space="preserve">Millan, M. (2025). Estudio comparativo de sistemas de recomendación mediante filtrado colaborativo, basado en contenido y propuestas híbridas [Tesis de maestría, Universidad Loyola Andalucía]. https://repositorio.uloyola.es/bitstream/handle/20.500.12412/6735/TFM%20Mar%C3%ADa%20Mill%C3%A1n.pdf</w:t>
-      </w:r>
-    </w:p>
-    <w:p>
-      <w:pPr>
-        <w:pStyle w:val="BIBLIOGRAFIA"/>
-      </w:pPr>
-      <w:r>
-        <w:t xml:space="preserve">Muñoz Pilozo, A. G., Villalva Pilozo, A. M., Medina Castro, A. R., y Pilozo Mendoza, J. J. (2024). Factores determinantes en el éxito del proceso de enseñanza-aprendizaje. Revista Scientific, 9(33), 45-63. https://doi.org/10.29394/scientific.issn.2542-2987.2024.9.33.2.45-63</w:t>
-      </w:r>
-    </w:p>
-    <w:p>
-      <w:pPr>
-        <w:pStyle w:val="BIBLIOGRAFIA"/>
-      </w:pPr>
-      <w:r>
-        <w:t xml:space="preserve">Nass, O., Skuliabina, O., Bapiyev, I., Dnekeshev, A., Bekenova, S., y Bekenova, A. (2023). Blended learning as a promising direction of informatization of higher education. E3S Web of Conferences, 389. https://doi.org/10.1051/e3sconf/202338908003</w:t>
-      </w:r>
-    </w:p>
-    <w:p>
-      <w:pPr>
-        <w:pStyle w:val="BIBLIOGRAFIA"/>
-      </w:pPr>
-      <w:r>
-        <w:t xml:space="preserve">Navarro Forero, C. A., Hernández, M. A., y Viloria, K. T. (2025). Nuevas rutas de aprendizaje: adaptación de contenidos académicos a formatos audiovisuales para mejorar la preparación de los estudiantes. https://doi.org/10.26507/paper.4223</w:t>
-      </w:r>
-    </w:p>
-    <w:p>
-      <w:pPr>
-        <w:pStyle w:val="BIBLIOGRAFIA"/>
-      </w:pPr>
-      <w:r>
-        <w:t xml:space="preserve">Negueruela Gómez, I. (2024). Análisis y evaluación de LLMs con técnicas RAG para el desarrollo y despliegue de un asistente virtual [Trabajo de fin de estudios, Universidad de Cantabria]. https://repositorio.unican.es/xmlui/handle/10902/33837</w:t>
-      </w:r>
-    </w:p>
-    <w:p>
-      <w:pPr>
-        <w:pStyle w:val="BIBLIOGRAFIA"/>
-      </w:pPr>
-      <w:r>
-        <w:t xml:space="preserve">Ramos-Rivera, R. E., Santana Mancilla, P. C., García-Mancilla, J., y Gaytán-Lugo, L. S. (2025). Modelos de lenguaje en educación: inteligencia artificial generativa para optimizar el análisis del desempeño docente. Innovación Académica, Universidad Autónoma de Nuevo León, 1(2), 70-81. https://doi.org/10.29105/innoacad.v1i2.36</w:t>
-      </w:r>
-    </w:p>
-    <w:p>
-      <w:pPr>
-        <w:pStyle w:val="BIBLIOGRAFIA"/>
-      </w:pPr>
-      <w:r>
-        <w:t xml:space="preserve">Rodas, A. (2024). Orientación vocacional y deserción universitaria en una universidad de Lima - 2024 [Tesis de maestría, Universidad César Vallejo].</w:t>
-      </w:r>
-    </w:p>
-    <w:p>
-      <w:pPr>
-        <w:pStyle w:val="BIBLIOGRAFIA"/>
-      </w:pPr>
-      <w:r>
-        <w:t xml:space="preserve">Rodriguez, Y. (2023). Inteligencia artificial y rendimiento académico de los estudiantes de educación superior en la región Puno, 2022 [Tesis de maestría, Universidad Alas Peruanas].</w:t>
-      </w:r>
-    </w:p>
-    <w:p>
-      <w:pPr>
-        <w:pStyle w:val="BIBLIOGRAFIA"/>
-      </w:pPr>
-      <w:r>
-        <w:t xml:space="preserve">Sabando Moreira, P. A., y Zambrano Montenegro, D. F. (2024). Técnicas de machine learning para predecir la deserción estudiantil universitaria: una revisión sistemática de la literatura. Revista Científica Multidisciplinar G-nerando, 5(2), 997-1023. https://doi.org/10.60100/rcmg.v5i2.245</w:t>
-      </w:r>
-    </w:p>
-    <w:p>
-      <w:pPr>
-        <w:pStyle w:val="BIBLIOGRAFIA"/>
-      </w:pPr>
-      <w:r>
-        <w:t xml:space="preserve">Saito, T., y Rehmsmeier, M. (2015). The precision-recall plot is more informative than the ROC plot when evaluating binary classifiers on imbalanced datasets. PLOS ONE, 10(3), e0118432. https://doi.org/10.1371/journal.pone.0118432</w:t>
-      </w:r>
-    </w:p>
-    <w:p>
-      <w:pPr>
-        <w:pStyle w:val="BIBLIOGRAFIA"/>
-      </w:pPr>
-      <w:r>
-        <w:t xml:space="preserve">Sancho Escrivá, J. V., Fanjul Peyró, C., De la Iglesia Vayá, M., Montell, J. A., y Escartí Fabra, M. J. (2020). Aplicación de la inteligencia artificial con procesamiento del lenguaje natural para textos de investigación cualitativa en la relación médico-paciente con enfermedad mental mediante el uso de tecnologías móviles. Revista de Comunicación y Salud, 10(1), 19-41. https://doi.org/10.35669/rcys.2020.10(1).19-41</w:t>
-      </w:r>
-    </w:p>
-    <w:p>
-      <w:pPr>
-        <w:pStyle w:val="BIBLIOGRAFIA"/>
-      </w:pPr>
-      <w:r>
-        <w:t xml:space="preserve">Singhal, K., Azizi, S., Tu, T., Mahdavi, S. S., Wei, J., Chung, H. W., Scales, N., Tanwani, A., Cole-Lewis, H., Pfohl, S., Payne, P., Seneviratne, M., Gamble, P., Kelly, C., Babiker, A., Schärli, N., Chowdhery, A., Mansfield, P., Demner-Fushman, D., … Natarajan, V. (2023). Large language models encode clinical knowledge. Nature, 620(7972), 172-180. https://doi.org/10.1038/s41586-023-06291-2</w:t>
-      </w:r>
-    </w:p>
-    <w:p>
-      <w:pPr>
-        <w:pStyle w:val="BIBLIOGRAFIA"/>
-      </w:pPr>
-      <w:r>
-        <w:t xml:space="preserve">Song, Y., Lv, C., Zhu, K., y Qiu, X. (2025). LoRA fine-tuning of Llama3 large model for intelligent fishery field. Discover Computing, 28(1). https://doi.org/10.1007/s10791-025-09663-6</w:t>
-      </w:r>
-    </w:p>
-    <w:p>
-      <w:pPr>
-        <w:pStyle w:val="BIBLIOGRAFIA"/>
-      </w:pPr>
-      <w:r>
-        <w:t xml:space="preserve">Superintendencia Nacional de Educación Superior Universitaria. (2020). II Informe bienal sobre la realidad universitaria en el Perú. SUNEDU.</w:t>
-      </w:r>
-    </w:p>
-    <w:p>
-      <w:pPr>
-        <w:pStyle w:val="BIBLIOGRAFIA"/>
-      </w:pPr>
-      <w:r>
-        <w:t xml:space="preserve">Torres-Delgado, G., Ramos-Pulido, S., y Hernández-Gress, N. (2024). Satisfaction with research-based learning and academic performance by big data analysis. Engineering Proceedings, 74(1). https://doi.org/10.3390/engproc2024074074</w:t>
-      </w:r>
-    </w:p>
-    <w:p>
-      <w:pPr>
-        <w:pStyle w:val="BIBLIOGRAFIA"/>
-      </w:pPr>
-      <w:r>
-        <w:t xml:space="preserve">Vaswani, A., Shazeer, N., Parmar, N., Uszkoreit, J., Jones, L., Gomez, A. N., Kaiser, Ł., y Polosukhin, I. (2017). Attention is all you need. En Advances in Neural Information Processing Systems 30 (pp. 5998-6008).</w:t>
-      </w:r>
-    </w:p>
-    <w:p>
-      <w:pPr>
-        <w:pStyle w:val="BIBLIOGRAFIA"/>
-      </w:pPr>
-      <w:r>
-        <w:t xml:space="preserve">Velasquez Velasquez, S. D. (2023). La inteligencia artificial aplicada al sector educativo: una revisión sistemática de la literatura [Trabajo de investigación de bachiller, Universidad Católica Santo Toribio de Mogrovejo]. http://hdl.handle.net/20.500.12423/6921</w:t>
-      </w:r>
-    </w:p>
-    <w:p>
-      <w:pPr>
-        <w:pStyle w:val="BIBLIOGRAFIA"/>
-      </w:pPr>
-      <w:r>
-        <w:t xml:space="preserve">Voorhees, E. M. (1999). The TREC-8 question answering track report. En Proceedings of the Eighth Text REtrieval Conference (pp. 77-82). National Institute of Standards and Technology.</w:t>
-      </w:r>
-    </w:p>
-    <w:p>
-      <w:pPr>
-        <w:pStyle w:val="BIBLIOGRAFIA"/>
-      </w:pPr>
-      <w:r>
-        <w:t xml:space="preserve">Wilcoxon, F. (1945). Individual comparisons by ranking methods. Biometrics Bulletin, 1(6), 80-83. https://doi.org/10.2307/3001968</w:t>
-      </w:r>
-    </w:p>
-    <w:p>
-      <w:pPr>
-        <w:pStyle w:val="BIBLIOGRAFIA"/>
-      </w:pPr>
-      <w:r>
-        <w:t xml:space="preserve">Yatco, W., y Jacha, J. (2024). Modelo machine learning para predicción de deserción estudiantil [Tesis de segunda especialidad, Universidad Peruana Unión].</w:t>
-      </w:r>
-    </w:p>
-    <w:p>
-      <w:pPr>
-        <w:pStyle w:val="BIBLIOGRAFIA"/>
-      </w:pPr>
-      <w:r>
-        <w:t xml:space="preserve">Yupanquin, L. A. (2024). Perfil del egresado y la formación profesional en estudiantes del último año de arquitectura de la Universidad Femenina del Sagrado Corazón, 2020 [Tesis de maestría, Universidad Nacional de Educación Enrique Guzmán y Valle]. https://repositorio.une.edu.pe/server/api/core/bitstreams/0a198466-0baf-4299-897b-90a22a49c958/content</w:t>
-      </w:r>
-    </w:p>
-    <w:p>
-      <w:pPr>
-        <w:pStyle w:val="BIBLIOGRAFIA"/>
-      </w:pPr>
-      <w:r>
-        <w:t xml:space="preserve">Zadrozny, B., y Elkan, C. (2002). Transforming classifier scores into accurate multiclass probability estimates. En Proceedings of the Eighth ACM SIGKDD International Conference on Knowledge Discovery and Data Mining (pp. 694-699). https://doi.org/10.1145/775047.775151</w:t>
-      </w:r>
-    </w:p>
-    <w:p>
-      <w:pPr>
-        <w:pStyle w:val="BIBLIOGRAFIA"/>
-      </w:pPr>
-      <w:r>
-        <w:t xml:space="preserve">Zavala Guirado, M. A., González Castro, I., Tapia Ruelas, C. S., Cota Valenzuela, L. V., y Durón Ramos, M. F. (2024). Propiedades psicométricas de una escala para medir la práctica docente universitaria en la modalidad híbrida. RIDE Revista Iberoamericana para la Investigación y el Desarrollo Educativo, 14(28). https://doi.org/10.23913/ride.v14i28.1878</w:t>
-      </w:r>
-    </w:p>
-    <w:p>
-      <w:pPr>
-        <w:pStyle w:val="BIBLIOGRAFIA"/>
-      </w:pPr>
-      <w:r>
-        <w:t xml:space="preserve">Zhang, H., Li, Z., y Liu, J. (2026). SceneLLM: Implicit language reasoning in LLM for dynamic scene graph generation. Pattern Recognition, 170. https://doi.org/10.1016/j.patcog.2025.111992</w:t>
-      </w:r>
-    </w:p>
-    <w:p>
-      <w:pPr>
-        <w:pStyle w:val="BIBLIOGRAFIA"/>
-      </w:pPr>
-      <w:r>
-        <w:t xml:space="preserve">Zhang, J. C., Xiong, Y. J., Xia, C. M., Zhu, D. H., y Zhan, H. J. (2025). LoRA2: Multi-scale low-rank approximations for fine-tuning large language models. Neurocomputing, 650. https://doi.org/10.1016/j.neucom.2025.130859</w:t>
-      </w:r>
-    </w:p>
-    <w:p>
-      <w:pPr>
-        <w:pStyle w:val="BIBLIOGRAFIA"/>
-      </w:pPr>
-      <w:r>
-        <w:t xml:space="preserve">Zhang, T., Kishore, V., Wu, F., Weinberger, K. Q., y Artzi, Y. (2020). BERTScore: Evaluating text generation with BERT. En International Conference on Learning Representations. https://doi.org/10.48550/arXiv.1904.09675</w:t>
-      </w:r>
-    </w:p>
-    <w:p>
-      <w:pPr>
-        <w:pStyle w:val="BIBLIOGRAFIA"/>
-      </w:pPr>
-      <w:r>
-        <w:t xml:space="preserve">Zheng, L., Chiang, W.-L., Sheng, Y., Zhuang, S., Wu, Z., Zhuang, Y., Lin, Z., Li, Z., Li, D., Xing, E. P., Zhang, H., Gonzalez, J. E., y Stoica, I. (2023). Judging LLM-as-a-judge with MT-Bench and Chatbot Arena. http://arxiv.org/abs/2306.05685</w:t>
-      </w:r>
-    </w:p>
+    <w:sdt>
+      <w:sdtPr>
+        <w:tag w:val="MENDELEY_BIBLIOGRAPHY"/>
+        <w:id w:val="607292351"/>
+      </w:sdtPr>
+      <w:sdtContent>
+        <w:p>
+          <w:pPr>
+            <w:pStyle w:val="BIBLIOGRAFIA"/>
+          </w:pPr>
+          <w:r>
+            <w:t xml:space="preserve">Aguilar-Reyes, J. E., Mejía-Peñafiel, E. F., Morocho-Barrionuevo, T. P., y Velasco-Castelo, G.-M. (2025). Estudio del rendimiento académico mediante la comparación de modelos de regresión y árboles de clasificación. </w:t>
+          </w:r>
+          <w:r>
+            <w:rPr>
+              <w:i/>
+            </w:rPr>
+            <w:t xml:space="preserve">Telos: Revista de Estudios Interdisciplinarios en Ciencias Sociales</w:t>
+          </w:r>
+          <w:r>
+            <w:t xml:space="preserve">, </w:t>
+          </w:r>
+          <w:r>
+            <w:rPr>
+              <w:i/>
+            </w:rPr>
+            <w:t xml:space="preserve">27</w:t>
+          </w:r>
+          <w:r>
+            <w:t xml:space="preserve">(1), 94-115. https://doi.org/10.36390/telos271.08</w:t>
+          </w:r>
+        </w:p>
+        <w:p>
+          <w:pPr>
+            <w:pStyle w:val="BIBLIOGRAFIA"/>
+          </w:pPr>
+          <w:r>
+            <w:t xml:space="preserve">Alejandro Jaramillo, S. Y. (2024). Orientación vocacional y profesional: la inteligencia artificial y su impacto en la educación. </w:t>
+          </w:r>
+          <w:r>
+            <w:rPr>
+              <w:i/>
+            </w:rPr>
+            <w:t xml:space="preserve">Revista Scientific</w:t>
+          </w:r>
+          <w:r>
+            <w:t xml:space="preserve">, </w:t>
+          </w:r>
+          <w:r>
+            <w:rPr>
+              <w:i/>
+            </w:rPr>
+            <w:t xml:space="preserve">9</w:t>
+          </w:r>
+          <w:r>
+            <w:t xml:space="preserve">(34), 285-300. https://doi.org/10.29394/scientific.issn.2542-2987.2024.9.34.13.285-300</w:t>
+          </w:r>
+        </w:p>
+        <w:p>
+          <w:pPr>
+            <w:pStyle w:val="BIBLIOGRAFIA"/>
+          </w:pPr>
+          <w:r>
+            <w:t xml:space="preserve">Brier, G. W. (1950). Verification of forecasts expressed in terms of probability. </w:t>
+          </w:r>
+          <w:r>
+            <w:rPr>
+              <w:i/>
+            </w:rPr>
+            <w:t xml:space="preserve">Monthly Weather Review</w:t>
+          </w:r>
+          <w:r>
+            <w:t xml:space="preserve">, </w:t>
+          </w:r>
+          <w:r>
+            <w:rPr>
+              <w:i/>
+            </w:rPr>
+            <w:t xml:space="preserve">78</w:t>
+          </w:r>
+          <w:r>
+            <w:t xml:space="preserve">(1), 1-3. https://doi.org/10.1175/1520-0493(1950)078&lt;0001:VOFEIT&gt;2.0.CO;2</w:t>
+          </w:r>
+        </w:p>
+        <w:p>
+          <w:pPr>
+            <w:pStyle w:val="BIBLIOGRAFIA"/>
+          </w:pPr>
+          <w:r>
+            <w:t xml:space="preserve">Carballo-Mendívil, B., Arellano-González, A., Ríos-Vázquez, N. J., y Lizardi-Duarte, M. del P. (2025). Predicting student dropout from day one: XGBoost-based early warning system using pre-enrollment data. </w:t>
+          </w:r>
+          <w:r>
+            <w:rPr>
+              <w:i/>
+            </w:rPr>
+            <w:t xml:space="preserve">Applied Sciences</w:t>
+          </w:r>
+          <w:r>
+            <w:t xml:space="preserve">, </w:t>
+          </w:r>
+          <w:r>
+            <w:rPr>
+              <w:i/>
+            </w:rPr>
+            <w:t xml:space="preserve">15</w:t>
+          </w:r>
+          <w:r>
+            <w:t xml:space="preserve">(16), 9202. https://doi.org/10.3390/app15169202</w:t>
+          </w:r>
+        </w:p>
+        <w:p>
+          <w:pPr>
+            <w:pStyle w:val="BIBLIOGRAFIA"/>
+          </w:pPr>
+          <w:r>
+            <w:t xml:space="preserve">Castejón Lozano, F. (2025). </w:t>
+          </w:r>
+          <w:r>
+            <w:rPr>
+              <w:i/>
+            </w:rPr>
+            <w:t xml:space="preserve">SoroIA: Diseño e implementación de un sistema conversacional basado en modelos grandes de lenguaje para el Museo Sorolla</w:t>
+          </w:r>
+          <w:r>
+            <w:t xml:space="preserve"> [Tesis de maestría, Universidad Politécnica de Madrid]. https://oa.upm.es/90917/</w:t>
+          </w:r>
+        </w:p>
+        <w:p>
+          <w:pPr>
+            <w:pStyle w:val="BIBLIOGRAFIA"/>
+          </w:pPr>
+          <w:r>
+            <w:t xml:space="preserve">Cen, C., Luo, G., Tian, Y., Fu, B., Chen, Y., Huang, S., Jiang, T., y Huang, G. (2024). Enhancing the dissemination of Cantonese Opera among youth via Bilibili: A study on intangible cultural heritage transmission. </w:t>
+          </w:r>
+          <w:r>
+            <w:rPr>
+              <w:i/>
+            </w:rPr>
+            <w:t xml:space="preserve">Humanities and Social Sciences Communications</w:t>
+          </w:r>
+          <w:r>
+            <w:t xml:space="preserve">, </w:t>
+          </w:r>
+          <w:r>
+            <w:rPr>
+              <w:i/>
+            </w:rPr>
+            <w:t xml:space="preserve">11</w:t>
+          </w:r>
+          <w:r>
+            <w:t xml:space="preserve">(1), 1038. https://doi.org/10.1057/s41599-024-03537-w</w:t>
+          </w:r>
+        </w:p>
+        <w:p>
+          <w:pPr>
+            <w:pStyle w:val="BIBLIOGRAFIA"/>
+          </w:pPr>
+          <w:r>
+            <w:t xml:space="preserve">Chen, T., y Guestrin, C. (2016). XGBoost: A scalable tree boosting system. En </w:t>
+          </w:r>
+          <w:r>
+            <w:rPr>
+              <w:i/>
+            </w:rPr>
+            <w:t xml:space="preserve">Proceedings of the 22nd ACM SIGKDD International Conference on Knowledge Discovery and Data Mining</w:t>
+          </w:r>
+          <w:r>
+            <w:t xml:space="preserve"> (pp. 785-794). https://doi.org/10.1145/2939672.2939785</w:t>
+          </w:r>
+        </w:p>
+        <w:p>
+          <w:pPr>
+            <w:pStyle w:val="BIBLIOGRAFIA"/>
+          </w:pPr>
+          <w:r>
+            <w:t xml:space="preserve">Cisneros-Bravo, B. E., Rodríguez-Aguilar, R. M., Niño-Membrillo, Y. E., y Cuevas-Rasgado, A. D. (2023). Falta de orientación vocacional como factor en la deserción universitaria. Caso de estudio: zona Oriente del Estado de México. </w:t>
+          </w:r>
+          <w:r>
+            <w:rPr>
+              <w:i/>
+            </w:rPr>
+            <w:t xml:space="preserve">RIDE Revista Iberoamericana para la Investigación y el Desarrollo Educativo</w:t>
+          </w:r>
+          <w:r>
+            <w:t xml:space="preserve">, </w:t>
+          </w:r>
+          <w:r>
+            <w:rPr>
+              <w:i/>
+            </w:rPr>
+            <w:t xml:space="preserve">14</w:t>
+          </w:r>
+          <w:r>
+            <w:t xml:space="preserve">(27). https://doi.org/10.23913/ride.v14i27.1715</w:t>
+          </w:r>
+        </w:p>
+        <w:p>
+          <w:pPr>
+            <w:pStyle w:val="BIBLIOGRAFIA"/>
+          </w:pPr>
+          <w:r>
+            <w:t xml:space="preserve">Cliff, N. (1993). Dominance statistics: Ordinal analyses to answer ordinal questions. </w:t>
+          </w:r>
+          <w:r>
+            <w:rPr>
+              <w:i/>
+            </w:rPr>
+            <w:t xml:space="preserve">Psychological Bulletin</w:t>
+          </w:r>
+          <w:r>
+            <w:t xml:space="preserve">, </w:t>
+          </w:r>
+          <w:r>
+            <w:rPr>
+              <w:i/>
+            </w:rPr>
+            <w:t xml:space="preserve">114</w:t>
+          </w:r>
+          <w:r>
+            <w:t xml:space="preserve">(3), 494-509. https://doi.org/10.1037/0033-2909.114.3.494</w:t>
+          </w:r>
+        </w:p>
+        <w:p>
+          <w:pPr>
+            <w:pStyle w:val="BIBLIOGRAFIA"/>
+          </w:pPr>
+          <w:r>
+            <w:t xml:space="preserve">Cramér, H. (1946). </w:t>
+          </w:r>
+          <w:r>
+            <w:rPr>
+              <w:i/>
+            </w:rPr>
+            <w:t xml:space="preserve">Mathematical methods of statistics</w:t>
+          </w:r>
+          <w:r>
+            <w:t xml:space="preserve">. Princeton University Press. https://doi.org/10.1515/9781400883868</w:t>
+          </w:r>
+        </w:p>
+        <w:p>
+          <w:pPr>
+            <w:pStyle w:val="BIBLIOGRAFIA"/>
+          </w:pPr>
+          <w:r>
+            <w:t xml:space="preserve">Dettmers, T., Pagnoni, A., Holtzman, A., y Zettlemoyer, L. (2023). QLoRA: Efficient finetuning of quantized LLMs. En </w:t>
+          </w:r>
+          <w:r>
+            <w:rPr>
+              <w:i/>
+            </w:rPr>
+            <w:t xml:space="preserve">Advances in Neural Information Processing Systems 36</w:t>
+          </w:r>
+          <w:r>
+            <w:t xml:space="preserve">. https://doi.org/10.48550/arXiv.2305.14314</w:t>
+          </w:r>
+        </w:p>
+        <w:p>
+          <w:pPr>
+            <w:pStyle w:val="BIBLIOGRAFIA"/>
+          </w:pPr>
+          <w:r>
+            <w:t xml:space="preserve">Escalante López, J. I., Medina Valderrama, C. J., y Vásquez Muñoz, A. (2023). La deserción universitaria: un problema no resuelto en el Perú. </w:t>
+          </w:r>
+          <w:r>
+            <w:rPr>
+              <w:i/>
+            </w:rPr>
+            <w:t xml:space="preserve">Hacedor - AIAPÆC</w:t>
+          </w:r>
+          <w:r>
+            <w:t xml:space="preserve">, </w:t>
+          </w:r>
+          <w:r>
+            <w:rPr>
+              <w:i/>
+            </w:rPr>
+            <w:t xml:space="preserve">7</w:t>
+          </w:r>
+          <w:r>
+            <w:t xml:space="preserve">(1), 60-72. https://doi.org/10.26495/rch.v7i1.2421</w:t>
+          </w:r>
+        </w:p>
+        <w:p>
+          <w:pPr>
+            <w:pStyle w:val="BIBLIOGRAFIA"/>
+          </w:pPr>
+          <w:r>
+            <w:t xml:space="preserve">Escobar-Mamani, F., y Cuentas Yupanqui, S. R. (2024). Situación académica de estudiantes con matrícula regular y en riesgo académico en la Universidad Nacional del Altiplano, 2023-II. </w:t>
+          </w:r>
+          <w:r>
+            <w:rPr>
+              <w:i/>
+            </w:rPr>
+            <w:t xml:space="preserve">Journal of Humanities Titicaca</w:t>
+          </w:r>
+          <w:r>
+            <w:t xml:space="preserve">, </w:t>
+          </w:r>
+          <w:r>
+            <w:rPr>
+              <w:i/>
+            </w:rPr>
+            <w:t xml:space="preserve">2</w:t>
+          </w:r>
+          <w:r>
+            <w:t xml:space="preserve">(1), 66-88. https://doi.org/10.70123/jht.7</w:t>
+          </w:r>
+        </w:p>
+        <w:p>
+          <w:pPr>
+            <w:pStyle w:val="BIBLIOGRAFIA"/>
+          </w:pPr>
+          <w:r>
+            <w:t xml:space="preserve">Fang, X., Xu, W., Tan, F. A., Zhang, J., Hu, Z., Qi, Y., Nickleach, S., Socolinsky, D., Sengamedu, S., y Faloutsos, C. (2024). Large language models (LLMs) on tabular data: Prediction, generation, and understanding. A survey. </w:t>
+          </w:r>
+          <w:r>
+            <w:rPr>
+              <w:i/>
+            </w:rPr>
+            <w:t xml:space="preserve">Transactions on Machine Learning Research</w:t>
+          </w:r>
+          <w:r>
+            <w:t xml:space="preserve">. http://arxiv.org/abs/2402.17944</w:t>
+          </w:r>
+        </w:p>
+        <w:p>
+          <w:pPr>
+            <w:pStyle w:val="BIBLIOGRAFIA"/>
+          </w:pPr>
+          <w:r>
+            <w:t xml:space="preserve">Fernández, J. M., Petrocelli, D. M., Matuk, R., Lanson, D., Zamudio, E., Cagnina, L. C., Gil Costa, G. V., y Errecalde, M. L. (2025). Fine-tuning y adaptación de modelos de lenguaje abiertos en infraestructura HPC para aplicaciones de dominio específico. En </w:t>
+          </w:r>
+          <w:r>
+            <w:rPr>
+              <w:i/>
+            </w:rPr>
+            <w:t xml:space="preserve">Libro de actas del XXVII Workshop de Investigadores en Ciencias de la Computación</w:t>
+          </w:r>
+          <w:r>
+            <w:t xml:space="preserve"> (pp. 72-76). Red de Universidades con Carreras en Informática. http://sedici.unlp.edu.ar/handle/10915/183892</w:t>
+          </w:r>
+        </w:p>
+        <w:p>
+          <w:pPr>
+            <w:pStyle w:val="BIBLIOGRAFIA"/>
+          </w:pPr>
+          <w:r>
+            <w:t xml:space="preserve">Ferreyra, M. M., Avitabile, C., Botero Álvarez, J., Haimovich Paz, F., y Urzúa, S. (2017). </w:t>
+          </w:r>
+          <w:r>
+            <w:rPr>
+              <w:i/>
+            </w:rPr>
+            <w:t xml:space="preserve">Momento decisivo: la educación superior en América Latina y el Caribe</w:t>
+          </w:r>
+          <w:r>
+            <w:t xml:space="preserve">. Banco Mundial. https://doi.org/10.1596/978-1-4648-1014-5</w:t>
+          </w:r>
+        </w:p>
+        <w:p>
+          <w:pPr>
+            <w:pStyle w:val="BIBLIOGRAFIA"/>
+          </w:pPr>
+          <w:r>
+            <w:t xml:space="preserve">Flores Meléndez, M., Góngora Cortés, J. J., López Cabrera, M. V., y Eraña Rojas, I. E. (2020). The «call» of medicine. Use of new mentoring models for vocational orientation. </w:t>
+          </w:r>
+          <w:r>
+            <w:rPr>
+              <w:i/>
+            </w:rPr>
+            <w:t xml:space="preserve">Educación Médica</w:t>
+          </w:r>
+          <w:r>
+            <w:t xml:space="preserve">, </w:t>
+          </w:r>
+          <w:r>
+            <w:rPr>
+              <w:i/>
+            </w:rPr>
+            <w:t xml:space="preserve">21</w:t>
+          </w:r>
+          <w:r>
+            <w:t xml:space="preserve">(2), 145-148. https://doi.org/10.1016/j.edumed.2018.11.008</w:t>
+          </w:r>
+        </w:p>
+        <w:p>
+          <w:pPr>
+            <w:pStyle w:val="BIBLIOGRAFIA"/>
+          </w:pPr>
+          <w:r>
+            <w:t xml:space="preserve">Gao, D., Chen, S., Yang, Z., Yang, L., Gao, H., Wu, M., Yu, S., Xuan, Q., Zhang, W., Yang, L., y Cai, X. (2026). MLoRA+: Transformer-fusion mixture-of-LoRA network for multi-domain click-through rate prediction. </w:t>
+          </w:r>
+          <w:r>
+            <w:rPr>
+              <w:i/>
+            </w:rPr>
+            <w:t xml:space="preserve">Expert Systems with Applications</w:t>
+          </w:r>
+          <w:r>
+            <w:t xml:space="preserve">, </w:t>
+          </w:r>
+          <w:r>
+            <w:rPr>
+              <w:i/>
+            </w:rPr>
+            <w:t xml:space="preserve">297</w:t>
+          </w:r>
+          <w:r>
+            <w:t xml:space="preserve">, 129486. https://doi.org/10.1016/j.eswa.2025.129486</w:t>
+          </w:r>
+        </w:p>
+        <w:p>
+          <w:pPr>
+            <w:pStyle w:val="BIBLIOGRAFIA"/>
+          </w:pPr>
+          <w:r>
+            <w:t xml:space="preserve">García Subies, G. (2021). </w:t>
+          </w:r>
+          <w:r>
+            <w:rPr>
+              <w:i/>
+            </w:rPr>
+            <w:t xml:space="preserve">Modelos de Transformers para la clasificación de texto</w:t>
+          </w:r>
+          <w:r>
+            <w:t xml:space="preserve"> [Tesis de maestría, Universidad Politécnica de Madrid]. https://oa.upm.es/68623/</w:t>
+          </w:r>
+        </w:p>
+        <w:p>
+          <w:pPr>
+            <w:pStyle w:val="BIBLIOGRAFIA"/>
+          </w:pPr>
+          <w:r>
+            <w:t xml:space="preserve">Guadalupe Mori, V. H. (2025). </w:t>
+          </w:r>
+          <w:r>
+            <w:rPr>
+              <w:i/>
+            </w:rPr>
+            <w:t xml:space="preserve">Modelo predictivo basado en machine learning para la reducción de la deserción estudiantil en las universidades privadas del Perú: caso Universidad Privada San Juan Bautista</w:t>
+          </w:r>
+          <w:r>
+            <w:t xml:space="preserve"> [Tesis doctoral, Universidad Nacional Federico Villarreal]. https://hdl.handle.net/20.500.13084/10839</w:t>
+          </w:r>
+        </w:p>
+        <w:p>
+          <w:pPr>
+            <w:pStyle w:val="BIBLIOGRAFIA"/>
+          </w:pPr>
+          <w:r>
+            <w:t xml:space="preserve">Hanley, J. A., y McNeil, B. J. (1982). The meaning and use of the area under a receiver operating characteristic (ROC) curve. </w:t>
+          </w:r>
+          <w:r>
+            <w:rPr>
+              <w:i/>
+            </w:rPr>
+            <w:t xml:space="preserve">Radiology</w:t>
+          </w:r>
+          <w:r>
+            <w:t xml:space="preserve">, </w:t>
+          </w:r>
+          <w:r>
+            <w:rPr>
+              <w:i/>
+            </w:rPr>
+            <w:t xml:space="preserve">143</w:t>
+          </w:r>
+          <w:r>
+            <w:t xml:space="preserve">(1), 29-36. https://doi.org/10.1148/radiology.143.1.7063747</w:t>
+          </w:r>
+        </w:p>
+        <w:p>
+          <w:pPr>
+            <w:pStyle w:val="BIBLIOGRAFIA"/>
+          </w:pPr>
+          <w:r>
+            <w:t xml:space="preserve">Hu, E. J., Shen, Y., Wallis, P., Allen-Zhu, Z., Li, Y., Wang, S., Wang, L., y Chen, W. (2021). </w:t>
+          </w:r>
+          <w:r>
+            <w:rPr>
+              <w:i/>
+            </w:rPr>
+            <w:t xml:space="preserve">LoRA: Low-rank adaptation of large language models</w:t>
+          </w:r>
+          <w:r>
+            <w:t xml:space="preserve">. arXiv. https://doi.org/10.48550/arXiv.2106.09685</w:t>
+          </w:r>
+        </w:p>
+        <w:p>
+          <w:pPr>
+            <w:pStyle w:val="BIBLIOGRAFIA"/>
+          </w:pPr>
+          <w:r>
+            <w:t xml:space="preserve">Jardón Gallegos, M. del C., Granizo Malusin, J. H., Yaselga Auz, W. F., y Cocha Telenchana, M. G. (2024). Impacto de los asistentes virtuales de inteligencia artificial en el rendimiento académico de estudiantes universitarios. </w:t>
+          </w:r>
+          <w:r>
+            <w:rPr>
+              <w:i/>
+            </w:rPr>
+            <w:t xml:space="preserve">Revista Social Fronteriza</w:t>
+          </w:r>
+          <w:r>
+            <w:t xml:space="preserve">, </w:t>
+          </w:r>
+          <w:r>
+            <w:rPr>
+              <w:i/>
+            </w:rPr>
+            <w:t xml:space="preserve">4</w:t>
+          </w:r>
+          <w:r>
+            <w:t xml:space="preserve">(4), e44338. https://doi.org/10.59814/resofro.2024.4(4)338</w:t>
+          </w:r>
+        </w:p>
+        <w:p>
+          <w:pPr>
+            <w:pStyle w:val="BIBLIOGRAFIA"/>
+          </w:pPr>
+          <w:r>
+            <w:t xml:space="preserve">Järvelin, K., y Kekäläinen, J. (2002). Cumulated gain-based evaluation of IR techniques. </w:t>
+          </w:r>
+          <w:r>
+            <w:rPr>
+              <w:i/>
+            </w:rPr>
+            <w:t xml:space="preserve">ACM Transactions on Information Systems</w:t>
+          </w:r>
+          <w:r>
+            <w:t xml:space="preserve">, </w:t>
+          </w:r>
+          <w:r>
+            <w:rPr>
+              <w:i/>
+            </w:rPr>
+            <w:t xml:space="preserve">20</w:t>
+          </w:r>
+          <w:r>
+            <w:t xml:space="preserve">(4), 422-446. https://doi.org/10.1145/582415.582418</w:t>
+          </w:r>
+        </w:p>
+        <w:p>
+          <w:pPr>
+            <w:pStyle w:val="BIBLIOGRAFIA"/>
+          </w:pPr>
+          <w:r>
+            <w:t xml:space="preserve">Kung, T. H., Cheatham, M., Medenilla, A., Sillos, C., De Leon, L., Elepaño, C., Madriaga, M., Aggabao, R., Diaz-Candido, G., Maningo, J., y Tseng, V. (2023). Performance of ChatGPT on USMLE: Potential for AI-assisted medical education using large language models. </w:t>
+          </w:r>
+          <w:r>
+            <w:rPr>
+              <w:i/>
+            </w:rPr>
+            <w:t xml:space="preserve">PLOS Digital Health</w:t>
+          </w:r>
+          <w:r>
+            <w:t xml:space="preserve">, </w:t>
+          </w:r>
+          <w:r>
+            <w:rPr>
+              <w:i/>
+            </w:rPr>
+            <w:t xml:space="preserve">2</w:t>
+          </w:r>
+          <w:r>
+            <w:t xml:space="preserve">(2), e0000198. https://doi.org/10.1371/journal.pdig.0000198</w:t>
+          </w:r>
+        </w:p>
+        <w:p>
+          <w:pPr>
+            <w:pStyle w:val="BIBLIOGRAFIA"/>
+          </w:pPr>
+          <w:r>
+            <w:t xml:space="preserve">León Caranqui, J. A. (2023). </w:t>
+          </w:r>
+          <w:r>
+            <w:rPr>
+              <w:i/>
+            </w:rPr>
+            <w:t xml:space="preserve">URKU: Adaptación de LLaMA 2 para la generación de texto en kichwa usando técnicas de Low-Rank Adaptation (LoRA)</w:t>
+          </w:r>
+          <w:r>
+            <w:t xml:space="preserve"> [Trabajo de titulación de pregrado, Universidad San Francisco de Quito]. https://repositorio.usfq.edu.ec/handle/23000/13497</w:t>
+          </w:r>
+        </w:p>
+        <w:p>
+          <w:pPr>
+            <w:pStyle w:val="BIBLIOGRAFIA"/>
+          </w:pPr>
+          <w:r>
+            <w:t xml:space="preserve">Li, Y., Li, Z., Zhang, K., Dan, R., Jiang, S., y Zhang, Y. (2023). ChatDoctor: A medical chat model fine-tuned on a large language model Meta-AI (LLaMA) using medical domain knowledge. </w:t>
+          </w:r>
+          <w:r>
+            <w:rPr>
+              <w:i/>
+            </w:rPr>
+            <w:t xml:space="preserve">Cureus</w:t>
+          </w:r>
+          <w:r>
+            <w:t xml:space="preserve">. https://doi.org/10.7759/cureus.40895</w:t>
+          </w:r>
+        </w:p>
+        <w:p>
+          <w:pPr>
+            <w:pStyle w:val="BIBLIOGRAFIA"/>
+          </w:pPr>
+          <w:r>
+            <w:t xml:space="preserve">Lin, C.-Y. (2004). ROUGE: A package for automatic evaluation of summaries. En </w:t>
+          </w:r>
+          <w:r>
+            <w:rPr>
+              <w:i/>
+            </w:rPr>
+            <w:t xml:space="preserve">Text Summarization Branches Out</w:t>
+          </w:r>
+          <w:r>
+            <w:t xml:space="preserve"> (pp. 74-81). Association for Computational Linguistics. https://aclanthology.org/W04-1013/</w:t>
+          </w:r>
+        </w:p>
+        <w:p>
+          <w:pPr>
+            <w:pStyle w:val="BIBLIOGRAFIA"/>
+          </w:pPr>
+          <w:r>
+            <w:t xml:space="preserve">Liu, Z., Liu, Z., Feng, R., Feng, P., Chu, J., y Peng, X. (2026). LoRA-TCN: A pre-trained/fine-tuning learning paradigm for drift adaptation. </w:t>
+          </w:r>
+          <w:r>
+            <w:rPr>
+              <w:i/>
+            </w:rPr>
+            <w:t xml:space="preserve">Sensors and Actuators B: Chemical</w:t>
+          </w:r>
+          <w:r>
+            <w:t xml:space="preserve">, </w:t>
+          </w:r>
+          <w:r>
+            <w:rPr>
+              <w:i/>
+            </w:rPr>
+            <w:t xml:space="preserve">446</w:t>
+          </w:r>
+          <w:r>
+            <w:t xml:space="preserve">, 138644. https://doi.org/10.1016/j.snb.2025.138644</w:t>
+          </w:r>
+        </w:p>
+        <w:p>
+          <w:pPr>
+            <w:pStyle w:val="BIBLIOGRAFIA"/>
+          </w:pPr>
+          <w:r>
+            <w:t xml:space="preserve">Mann, H. B., y Whitney, D. R. (1947). On a test of whether one of two random variables is stochastically larger than the other. </w:t>
+          </w:r>
+          <w:r>
+            <w:rPr>
+              <w:i/>
+            </w:rPr>
+            <w:t xml:space="preserve">The Annals of Mathematical Statistics</w:t>
+          </w:r>
+          <w:r>
+            <w:t xml:space="preserve">, </w:t>
+          </w:r>
+          <w:r>
+            <w:rPr>
+              <w:i/>
+            </w:rPr>
+            <w:t xml:space="preserve">18</w:t>
+          </w:r>
+          <w:r>
+            <w:t xml:space="preserve">(1), 50-60. https://doi.org/10.1214/aoms/1177730491</w:t>
+          </w:r>
+        </w:p>
+        <w:p>
+          <w:pPr>
+            <w:pStyle w:val="BIBLIOGRAFIA"/>
+          </w:pPr>
+          <w:r>
+            <w:t xml:space="preserve">Marroquin Balarezo, M. P., Ambia Hurtado, W. A., Gutierrez Churata, H. F., Salcedo Atiquipa, E. F., y Tipiana Felix, R. E. (2024). </w:t>
+          </w:r>
+          <w:r>
+            <w:rPr>
+              <w:i/>
+            </w:rPr>
+            <w:t xml:space="preserve">Diseño de un asistente inteligente RAG para la Comisión de Eliminación de Barreras Burocráticas de INDECOPI-2024</w:t>
+          </w:r>
+          <w:r>
+            <w:t xml:space="preserve"> [Tesis de maestría, Universidad Peruana de Ciencias Aplicadas]. http://hdl.handle.net/10757/684330</w:t>
+          </w:r>
+        </w:p>
+        <w:p>
+          <w:pPr>
+            <w:pStyle w:val="BIBLIOGRAFIA"/>
+          </w:pPr>
+          <w:r>
+            <w:t xml:space="preserve">Martínez Sixto, L., Fernández y Fernández, C. A., y Millán Hernández, C. E. (2025). Comparación del desempeño de LLMs en la generación de diagramas de clases UML mediante un sistema RAG. </w:t>
+          </w:r>
+          <w:r>
+            <w:rPr>
+              <w:i/>
+            </w:rPr>
+            <w:t xml:space="preserve">Revista de Investigación en Tecnologías de la Información</w:t>
+          </w:r>
+          <w:r>
+            <w:t xml:space="preserve">, </w:t>
+          </w:r>
+          <w:r>
+            <w:rPr>
+              <w:i/>
+            </w:rPr>
+            <w:t xml:space="preserve">13</w:t>
+          </w:r>
+          <w:r>
+            <w:t xml:space="preserve">(31), 64-79. https://doi.org/10.36825/riti.13.31.007</w:t>
+          </w:r>
+        </w:p>
+        <w:p>
+          <w:pPr>
+            <w:pStyle w:val="BIBLIOGRAFIA"/>
+          </w:pPr>
+          <w:r>
+            <w:t xml:space="preserve">Mena Guitarra, S. D. (2023). </w:t>
+          </w:r>
+          <w:r>
+            <w:rPr>
+              <w:i/>
+            </w:rPr>
+            <w:t xml:space="preserve">Usos y aplicaciones de modelos de lenguaje masivos en español</w:t>
+          </w:r>
+          <w:r>
+            <w:t xml:space="preserve"> [Trabajo de titulación de pregrado, Universidad San Francisco de Quito]. https://repositorio.usfq.edu.ec/handle/23000/13665</w:t>
+          </w:r>
+        </w:p>
+        <w:p>
+          <w:pPr>
+            <w:pStyle w:val="BIBLIOGRAFIA"/>
+          </w:pPr>
+          <w:r>
+            <w:t xml:space="preserve">Millán Gordillo, M. (2025). </w:t>
+          </w:r>
+          <w:r>
+            <w:rPr>
+              <w:i/>
+            </w:rPr>
+            <w:t xml:space="preserve">Estudio comparativo de sistemas de recomendación mediante filtrado colaborativo, basado en contenido y propuestas híbridas</w:t>
+          </w:r>
+          <w:r>
+            <w:t xml:space="preserve"> [Tesis de maestría, Universidad Loyola Andalucía]. https://repositorio.uloyola.es/bitstream/handle/20.500.12412/6735/TFM%20Mar%C3%ADa%20Mill%C3%A1n.pdf</w:t>
+          </w:r>
+        </w:p>
+        <w:p>
+          <w:pPr>
+            <w:pStyle w:val="BIBLIOGRAFIA"/>
+          </w:pPr>
+          <w:r>
+            <w:t xml:space="preserve">Muñoz Pilozo, A. G., Villalva Pilozo, A. M., Medina Castro, A. R., y Pilozo Mendoza, J. J. (2024). Factores determinantes en el éxito del proceso de enseñanza-aprendizaje. </w:t>
+          </w:r>
+          <w:r>
+            <w:rPr>
+              <w:i/>
+            </w:rPr>
+            <w:t xml:space="preserve">Revista Scientific</w:t>
+          </w:r>
+          <w:r>
+            <w:t xml:space="preserve">, </w:t>
+          </w:r>
+          <w:r>
+            <w:rPr>
+              <w:i/>
+            </w:rPr>
+            <w:t xml:space="preserve">9</w:t>
+          </w:r>
+          <w:r>
+            <w:t xml:space="preserve">(33), 45-63. https://doi.org/10.29394/scientific.issn.2542-2987.2024.9.33.2.45-63</w:t>
+          </w:r>
+        </w:p>
+        <w:p>
+          <w:pPr>
+            <w:pStyle w:val="BIBLIOGRAFIA"/>
+          </w:pPr>
+          <w:r>
+            <w:t xml:space="preserve">Nass, O., Skuliabina, O., Bapiyev, I., Dnekeshev, A., Bekenova, S., y Bekenova, A. (2023). Blended learning as a promising direction of informatization of higher education. </w:t>
+          </w:r>
+          <w:r>
+            <w:rPr>
+              <w:i/>
+            </w:rPr>
+            <w:t xml:space="preserve">E3S Web of Conferences</w:t>
+          </w:r>
+          <w:r>
+            <w:t xml:space="preserve">, </w:t>
+          </w:r>
+          <w:r>
+            <w:rPr>
+              <w:i/>
+            </w:rPr>
+            <w:t xml:space="preserve">389</w:t>
+          </w:r>
+          <w:r>
+            <w:t xml:space="preserve">, 08003. https://doi.org/10.1051/e3sconf/202338908003</w:t>
+          </w:r>
+        </w:p>
+        <w:p>
+          <w:pPr>
+            <w:pStyle w:val="BIBLIOGRAFIA"/>
+          </w:pPr>
+          <w:r>
+            <w:t xml:space="preserve">Navarro Forero, C. A., Hernández, M. A., y Viloria, K. T. (2025). Nuevas rutas de aprendizaje: adaptación de contenidos académicos a formatos audiovisuales para mejorar la preparación de los estudiantes. En </w:t>
+          </w:r>
+          <w:r>
+            <w:rPr>
+              <w:i/>
+            </w:rPr>
+            <w:t xml:space="preserve">Encuentro Internacional de Educación en Ingeniería</w:t>
+          </w:r>
+          <w:r>
+            <w:t xml:space="preserve">. Asociación Colombiana de Facultades de Ingeniería. https://doi.org/10.26507/paper.4223</w:t>
+          </w:r>
+        </w:p>
+        <w:p>
+          <w:pPr>
+            <w:pStyle w:val="BIBLIOGRAFIA"/>
+          </w:pPr>
+          <w:r>
+            <w:t xml:space="preserve">Negueruela Gómez, I. (2024). </w:t>
+          </w:r>
+          <w:r>
+            <w:rPr>
+              <w:i/>
+            </w:rPr>
+            <w:t xml:space="preserve">Análisis y evaluación de LLMs con técnicas RAG para el desarrollo y despliegue de un asistente virtual</w:t>
+          </w:r>
+          <w:r>
+            <w:t xml:space="preserve"> [Trabajo de fin de estudios, Universidad de Cantabria]. https://repositorio.unican.es/xmlui/handle/10902/33837</w:t>
+          </w:r>
+        </w:p>
+        <w:p>
+          <w:pPr>
+            <w:pStyle w:val="BIBLIOGRAFIA"/>
+          </w:pPr>
+          <w:r>
+            <w:t xml:space="preserve">Ramos-Rivera, R. E., Santana Mancilla, P. C., García-Mancilla, J., y Gaytán-Lugo, L. S. (2025). Modelos de lenguaje en educación: inteligencia artificial generativa para optimizar el análisis del desempeño docente. </w:t>
+          </w:r>
+          <w:r>
+            <w:rPr>
+              <w:i/>
+            </w:rPr>
+            <w:t xml:space="preserve">Innovación Académica, Universidad Autónoma de Nuevo León</w:t>
+          </w:r>
+          <w:r>
+            <w:t xml:space="preserve">, </w:t>
+          </w:r>
+          <w:r>
+            <w:rPr>
+              <w:i/>
+            </w:rPr>
+            <w:t xml:space="preserve">1</w:t>
+          </w:r>
+          <w:r>
+            <w:t xml:space="preserve">(2), 70-81. https://doi.org/10.29105/innoacad.v1i2.36</w:t>
+          </w:r>
+        </w:p>
+        <w:p>
+          <w:pPr>
+            <w:pStyle w:val="BIBLIOGRAFIA"/>
+          </w:pPr>
+          <w:r>
+            <w:t xml:space="preserve">Rodas Zegarra de Escalante, A. (2024). </w:t>
+          </w:r>
+          <w:r>
+            <w:rPr>
+              <w:i/>
+            </w:rPr>
+            <w:t xml:space="preserve">Orientación vocacional y deserción universitaria en una universidad de Lima - 2024</w:t>
+          </w:r>
+          <w:r>
+            <w:t xml:space="preserve"> [Tesis de maestría, Universidad César Vallejo]. https://hdl.handle.net/20.500.12692/150276</w:t>
+          </w:r>
+        </w:p>
+        <w:p>
+          <w:pPr>
+            <w:pStyle w:val="BIBLIOGRAFIA"/>
+          </w:pPr>
+          <w:r>
+            <w:t xml:space="preserve">Rodríguez Chipana, Y. M. (2023). </w:t>
+          </w:r>
+          <w:r>
+            <w:rPr>
+              <w:i/>
+            </w:rPr>
+            <w:t xml:space="preserve">Inteligencia artificial y rendimiento académico de los estudiantes de educación superior en la región Puno, 2022</w:t>
+          </w:r>
+          <w:r>
+            <w:t xml:space="preserve"> [Tesis de maestría, Universidad Alas Peruanas]. https://hdl.handle.net/20.500.12990/13324</w:t>
+          </w:r>
+        </w:p>
+        <w:p>
+          <w:pPr>
+            <w:pStyle w:val="BIBLIOGRAFIA"/>
+          </w:pPr>
+          <w:r>
+            <w:t xml:space="preserve">Sabando Moreira, P. A., y Zambrano Montenegro, D. F. (2024). Técnicas de machine learning para predecir la deserción estudiantil universitaria: una revisión sistemática de la literatura. </w:t>
+          </w:r>
+          <w:r>
+            <w:rPr>
+              <w:i/>
+            </w:rPr>
+            <w:t xml:space="preserve">Revista Científica Multidisciplinar G-nerando</w:t>
+          </w:r>
+          <w:r>
+            <w:t xml:space="preserve">, </w:t>
+          </w:r>
+          <w:r>
+            <w:rPr>
+              <w:i/>
+            </w:rPr>
+            <w:t xml:space="preserve">5</w:t>
+          </w:r>
+          <w:r>
+            <w:t xml:space="preserve">(2), 997-1023. https://doi.org/10.60100/rcmg.v5i2.245</w:t>
+          </w:r>
+        </w:p>
+        <w:p>
+          <w:pPr>
+            <w:pStyle w:val="BIBLIOGRAFIA"/>
+          </w:pPr>
+          <w:r>
+            <w:t xml:space="preserve">Saito, T., y Rehmsmeier, M. (2015). The precision-recall plot is more informative than the ROC plot when evaluating binary classifiers on imbalanced datasets. </w:t>
+          </w:r>
+          <w:r>
+            <w:rPr>
+              <w:i/>
+            </w:rPr>
+            <w:t xml:space="preserve">PLOS ONE</w:t>
+          </w:r>
+          <w:r>
+            <w:t xml:space="preserve">, </w:t>
+          </w:r>
+          <w:r>
+            <w:rPr>
+              <w:i/>
+            </w:rPr>
+            <w:t xml:space="preserve">10</w:t>
+          </w:r>
+          <w:r>
+            <w:t xml:space="preserve">(3), e0118432. https://doi.org/10.1371/journal.pone.0118432</w:t>
+          </w:r>
+        </w:p>
+        <w:p>
+          <w:pPr>
+            <w:pStyle w:val="BIBLIOGRAFIA"/>
+          </w:pPr>
+          <w:r>
+            <w:t xml:space="preserve">Sancho Escrivá, J. V., Fanjul Peyró, C., De la Iglesia Vayá, M., Montell, J. A., y Escartí Fabra, M. J. (2020). Aplicación de la inteligencia artificial con procesamiento del lenguaje natural para textos de investigación cualitativa en la relación médico-paciente con enfermedad mental mediante el uso de tecnologías móviles. </w:t>
+          </w:r>
+          <w:r>
+            <w:rPr>
+              <w:i/>
+            </w:rPr>
+            <w:t xml:space="preserve">Revista de Comunicación y Salud</w:t>
+          </w:r>
+          <w:r>
+            <w:t xml:space="preserve">, </w:t>
+          </w:r>
+          <w:r>
+            <w:rPr>
+              <w:i/>
+            </w:rPr>
+            <w:t xml:space="preserve">10</w:t>
+          </w:r>
+          <w:r>
+            <w:t xml:space="preserve">(1), 19-41. https://doi.org/10.35669/rcys.2020.10(1).19-41</w:t>
+          </w:r>
+        </w:p>
+        <w:p>
+          <w:pPr>
+            <w:pStyle w:val="BIBLIOGRAFIA"/>
+          </w:pPr>
+          <w:r>
+            <w:t xml:space="preserve">Singhal, K., Azizi, S., Tu, T., Mahdavi, S. S., Wei, J., Chung, H. W., Scales, N., Tanwani, A., Cole-Lewis, H., Pfohl, S., Payne, P., Seneviratne, M., Gamble, P., Kelly, C., Babiker, A., Schärli, N., Chowdhery, A., Mansfield, P., Demner-Fushman, D., … Natarajan, V. (2023). Large language models encode clinical knowledge. </w:t>
+          </w:r>
+          <w:r>
+            <w:rPr>
+              <w:i/>
+            </w:rPr>
+            <w:t xml:space="preserve">Nature</w:t>
+          </w:r>
+          <w:r>
+            <w:t xml:space="preserve">, </w:t>
+          </w:r>
+          <w:r>
+            <w:rPr>
+              <w:i/>
+            </w:rPr>
+            <w:t xml:space="preserve">620</w:t>
+          </w:r>
+          <w:r>
+            <w:t xml:space="preserve">(7972), 172-180. https://doi.org/10.1038/s41586-023-06291-2</w:t>
+          </w:r>
+        </w:p>
+        <w:p>
+          <w:pPr>
+            <w:pStyle w:val="BIBLIOGRAFIA"/>
+          </w:pPr>
+          <w:r>
+            <w:t xml:space="preserve">Song, Y., Lv, C., Zhu, K., y Qiu, X. (2025). LoRA fine-tuning of Llama3 large model for intelligent fishery field. </w:t>
+          </w:r>
+          <w:r>
+            <w:rPr>
+              <w:i/>
+            </w:rPr>
+            <w:t xml:space="preserve">Discover Computing</w:t>
+          </w:r>
+          <w:r>
+            <w:t xml:space="preserve">, </w:t>
+          </w:r>
+          <w:r>
+            <w:rPr>
+              <w:i/>
+            </w:rPr>
+            <w:t xml:space="preserve">28</w:t>
+          </w:r>
+          <w:r>
+            <w:t xml:space="preserve">(1), 135. https://doi.org/10.1007/s10791-025-09663-6</w:t>
+          </w:r>
+        </w:p>
+        <w:p>
+          <w:pPr>
+            <w:pStyle w:val="BIBLIOGRAFIA"/>
+          </w:pPr>
+          <w:r>
+            <w:t xml:space="preserve">Superintendencia Nacional de Educación Superior Universitaria. (2020). </w:t>
+          </w:r>
+          <w:r>
+            <w:rPr>
+              <w:i/>
+            </w:rPr>
+            <w:t xml:space="preserve">II Informe bienal sobre la realidad universitaria en el Perú</w:t>
+          </w:r>
+          <w:r>
+            <w:t xml:space="preserve">. SUNEDU. https://hdl.handle.net/20.500.12799/6911</w:t>
+          </w:r>
+        </w:p>
+        <w:p>
+          <w:pPr>
+            <w:pStyle w:val="BIBLIOGRAFIA"/>
+          </w:pPr>
+          <w:r>
+            <w:t xml:space="preserve">Torres-Delgado, G., Ramos-Pulido, S., y Hernández-Gress, N. (2024). Satisfaction with research-based learning and academic performance by big data analysis. </w:t>
+          </w:r>
+          <w:r>
+            <w:rPr>
+              <w:i/>
+            </w:rPr>
+            <w:t xml:space="preserve">Engineering Proceedings</w:t>
+          </w:r>
+          <w:r>
+            <w:t xml:space="preserve">, </w:t>
+          </w:r>
+          <w:r>
+            <w:rPr>
+              <w:i/>
+            </w:rPr>
+            <w:t xml:space="preserve">74</w:t>
+          </w:r>
+          <w:r>
+            <w:t xml:space="preserve">(1), 74. https://doi.org/10.3390/engproc2024074074</w:t>
+          </w:r>
+        </w:p>
+        <w:p>
+          <w:pPr>
+            <w:pStyle w:val="BIBLIOGRAFIA"/>
+          </w:pPr>
+          <w:r>
+            <w:t xml:space="preserve">Vaswani, A., Shazeer, N., Parmar, N., Uszkoreit, J., Jones, L., Gomez, A. N., Kaiser, Ł., y Polosukhin, I. (2017). Attention is all you need. En </w:t>
+          </w:r>
+          <w:r>
+            <w:rPr>
+              <w:i/>
+            </w:rPr>
+            <w:t xml:space="preserve">Advances in Neural Information Processing Systems 30</w:t>
+          </w:r>
+          <w:r>
+            <w:t xml:space="preserve"> (pp. 5998-6008). https://doi.org/10.48550/arXiv.1706.03762</w:t>
+          </w:r>
+        </w:p>
+        <w:p>
+          <w:pPr>
+            <w:pStyle w:val="BIBLIOGRAFIA"/>
+          </w:pPr>
+          <w:r>
+            <w:t xml:space="preserve">Velasquez Velasquez, S. D. (2023). </w:t>
+          </w:r>
+          <w:r>
+            <w:rPr>
+              <w:i/>
+            </w:rPr>
+            <w:t xml:space="preserve">La inteligencia artificial aplicada al sector educativo: una revisión sistemática de la literatura</w:t>
+          </w:r>
+          <w:r>
+            <w:t xml:space="preserve"> [Trabajo de investigación de bachiller, Universidad Católica Santo Toribio de Mogrovejo]. http://hdl.handle.net/20.500.12423/6921</w:t>
+          </w:r>
+        </w:p>
+        <w:p>
+          <w:pPr>
+            <w:pStyle w:val="BIBLIOGRAFIA"/>
+          </w:pPr>
+          <w:r>
+            <w:t xml:space="preserve">Voorhees, E. M. (1999). The TREC-8 question answering track report. En </w:t>
+          </w:r>
+          <w:r>
+            <w:rPr>
+              <w:i/>
+            </w:rPr>
+            <w:t xml:space="preserve">Proceedings of the Eighth Text REtrieval Conference</w:t>
+          </w:r>
+          <w:r>
+            <w:t xml:space="preserve"> (pp. 77-82). National Institute of Standards and Technology. https://trec.nist.gov/pubs/trec8/papers/qa_report.pdf</w:t>
+          </w:r>
+        </w:p>
+        <w:p>
+          <w:pPr>
+            <w:pStyle w:val="BIBLIOGRAFIA"/>
+          </w:pPr>
+          <w:r>
+            <w:t xml:space="preserve">Wilcoxon, F. (1945). Individual comparisons by ranking methods. </w:t>
+          </w:r>
+          <w:r>
+            <w:rPr>
+              <w:i/>
+            </w:rPr>
+            <w:t xml:space="preserve">Biometrics Bulletin</w:t>
+          </w:r>
+          <w:r>
+            <w:t xml:space="preserve">, </w:t>
+          </w:r>
+          <w:r>
+            <w:rPr>
+              <w:i/>
+            </w:rPr>
+            <w:t xml:space="preserve">1</w:t>
+          </w:r>
+          <w:r>
+            <w:t xml:space="preserve">(6), 80-83. https://doi.org/10.2307/3001968</w:t>
+          </w:r>
+        </w:p>
+        <w:p>
+          <w:pPr>
+            <w:pStyle w:val="BIBLIOGRAFIA"/>
+          </w:pPr>
+          <w:r>
+            <w:t xml:space="preserve">Yataco Cañari, W., y Jacha Rojas, J. P. (2024). </w:t>
+          </w:r>
+          <w:r>
+            <w:rPr>
+              <w:i/>
+            </w:rPr>
+            <w:t xml:space="preserve">Modelo machine learning para predicción de deserción estudiantil</w:t>
+          </w:r>
+          <w:r>
+            <w:t xml:space="preserve"> [Trabajo académico de segunda especialidad, Universidad Peruana Unión]. https://hdl.handle.net/20.500.12840/7597</w:t>
+          </w:r>
+        </w:p>
+        <w:p>
+          <w:pPr>
+            <w:pStyle w:val="BIBLIOGRAFIA"/>
+          </w:pPr>
+          <w:r>
+            <w:t xml:space="preserve">Yupanqui Sanchez, L. A. (2024). </w:t>
+          </w:r>
+          <w:r>
+            <w:rPr>
+              <w:i/>
+            </w:rPr>
+            <w:t xml:space="preserve">Perfil del egresado y la formación profesional en estudiantes del último año de arquitectura de la Universidad Femenina del Sagrado Corazón, 2020</w:t>
+          </w:r>
+          <w:r>
+            <w:t xml:space="preserve"> [Tesis de maestría, Universidad Nacional de Educación Enrique Guzmán y Valle]. https://repositorio.une.edu.pe/server/api/core/bitstreams/0a198466-0baf-4299-897b-90a22a49c958/content</w:t>
+          </w:r>
+        </w:p>
+        <w:p>
+          <w:pPr>
+            <w:pStyle w:val="BIBLIOGRAFIA"/>
+          </w:pPr>
+          <w:r>
+            <w:t xml:space="preserve">Zadrozny, B., y Elkan, C. (2002). Transforming classifier scores into accurate multiclass probability estimates. En </w:t>
+          </w:r>
+          <w:r>
+            <w:rPr>
+              <w:i/>
+            </w:rPr>
+            <w:t xml:space="preserve">Proceedings of the Eighth ACM SIGKDD International Conference on Knowledge Discovery and Data Mining</w:t>
+          </w:r>
+          <w:r>
+            <w:t xml:space="preserve"> (pp. 694-699). https://doi.org/10.1145/775047.775151</w:t>
+          </w:r>
+        </w:p>
+        <w:p>
+          <w:pPr>
+            <w:pStyle w:val="BIBLIOGRAFIA"/>
+          </w:pPr>
+          <w:r>
+            <w:t xml:space="preserve">Zavala Guirado, M. A., González Castro, I., Tapia Ruelas, C. S., Cota Valenzuela, L. V., y Durón Ramos, M. F. (2024). Propiedades psicométricas de una escala para medir la práctica docente universitaria en la modalidad híbrida. </w:t>
+          </w:r>
+          <w:r>
+            <w:rPr>
+              <w:i/>
+            </w:rPr>
+            <w:t xml:space="preserve">RIDE Revista Iberoamericana para la Investigación y el Desarrollo Educativo</w:t>
+          </w:r>
+          <w:r>
+            <w:t xml:space="preserve">, </w:t>
+          </w:r>
+          <w:r>
+            <w:rPr>
+              <w:i/>
+            </w:rPr>
+            <w:t xml:space="preserve">14</w:t>
+          </w:r>
+          <w:r>
+            <w:t xml:space="preserve">(28). https://doi.org/10.23913/ride.v14i28.1878</w:t>
+          </w:r>
+        </w:p>
+        <w:p>
+          <w:pPr>
+            <w:pStyle w:val="BIBLIOGRAFIA"/>
+          </w:pPr>
+          <w:r>
+            <w:t xml:space="preserve">Zhang, H., Li, Z., y Liu, J. (2026). SceneLLM: Implicit language reasoning in LLM for dynamic scene graph generation. </w:t>
+          </w:r>
+          <w:r>
+            <w:rPr>
+              <w:i/>
+            </w:rPr>
+            <w:t xml:space="preserve">Pattern Recognition</w:t>
+          </w:r>
+          <w:r>
+            <w:t xml:space="preserve">, </w:t>
+          </w:r>
+          <w:r>
+            <w:rPr>
+              <w:i/>
+            </w:rPr>
+            <w:t xml:space="preserve">170</w:t>
+          </w:r>
+          <w:r>
+            <w:t xml:space="preserve">, 111992. https://doi.org/10.1016/j.patcog.2025.111992</w:t>
+          </w:r>
+        </w:p>
+        <w:p>
+          <w:pPr>
+            <w:pStyle w:val="BIBLIOGRAFIA"/>
+          </w:pPr>
+          <w:r>
+            <w:t xml:space="preserve">Zhang, J. C., Xiong, Y. J., Xia, C. M., Zhu, D. H., y Zhan, H. J. (2025). LoRA2: Multi-scale low-rank approximations for fine-tuning large language models. </w:t>
+          </w:r>
+          <w:r>
+            <w:rPr>
+              <w:i/>
+            </w:rPr>
+            <w:t xml:space="preserve">Neurocomputing</w:t>
+          </w:r>
+          <w:r>
+            <w:t xml:space="preserve">, </w:t>
+          </w:r>
+          <w:r>
+            <w:rPr>
+              <w:i/>
+            </w:rPr>
+            <w:t xml:space="preserve">650</w:t>
+          </w:r>
+          <w:r>
+            <w:t xml:space="preserve">, 130859. https://doi.org/10.1016/j.neucom.2025.130859</w:t>
+          </w:r>
+        </w:p>
+        <w:p>
+          <w:pPr>
+            <w:pStyle w:val="BIBLIOGRAFIA"/>
+          </w:pPr>
+          <w:r>
+            <w:t xml:space="preserve">Zhang, T., Kishore, V., Wu, F., Weinberger, K. Q., y Artzi, Y. (2020). BERTScore: Evaluating text generation with BERT. En </w:t>
+          </w:r>
+          <w:r>
+            <w:rPr>
+              <w:i/>
+            </w:rPr>
+            <w:t xml:space="preserve">International Conference on Learning Representations</w:t>
+          </w:r>
+          <w:r>
+            <w:t xml:space="preserve">. https://doi.org/10.48550/arXiv.1904.09675</w:t>
+          </w:r>
+        </w:p>
+        <w:p>
+          <w:pPr>
+            <w:pStyle w:val="BIBLIOGRAFIA"/>
+          </w:pPr>
+          <w:r>
+            <w:t xml:space="preserve">Zheng, L., Chiang, W.-L., Sheng, Y., Zhuang, S., Wu, Z., Zhuang, Y., Lin, Z., Li, Z., Li, D., Xing, E. P., Zhang, H., Gonzalez, J. E., y Stoica, I. (2023). </w:t>
+          </w:r>
+          <w:r>
+            <w:rPr>
+              <w:i/>
+            </w:rPr>
+            <w:t xml:space="preserve">Judging LLM-as-a-judge with MT-Bench and Chatbot Arena</w:t>
+          </w:r>
+          <w:r>
+            <w:t xml:space="preserve">. arXiv. https://doi.org/10.48550/arXiv.2306.05685</w:t>
+          </w:r>
+        </w:p>
+      </w:sdtContent>
+    </w:sdt>
     <w:p>
       <w:pPr>
         <w:spacing w:after="160" w:line="259" w:lineRule="auto"/>
@@ -32060,6 +34045,32 @@
 </a:theme>
 </file>
 
+<file path=word/webextensions/taskpanes.xml><?xml version="1.0" encoding="utf-8"?>
+<wetp:taskpanes xmlns:wetp="http://schemas.microsoft.com/office/webextensions/taskpanes/2010/11">
+  <wetp:taskpane dockstate="right" visibility="0" width="438" row="2">
+    <wetp:webextensionref xmlns:r="http://schemas.openxmlformats.org/officeDocument/2006/relationships" r:id="rId1"/>
+  </wetp:taskpane>
+</wetp:taskpanes>
+</file>
+
+<file path=word/webextensions/webextension1.xml><?xml version="1.0" encoding="utf-8"?>
+<we:webextension xmlns:we="http://schemas.microsoft.com/office/webextensions/webextension/2010/11" id="{996E50D1-05FE-4C21-A547-D8AA47C460BC}">
+  <we:reference id="wa104382081" version="1.55.1.0" store="es-MX" storeType="OMEX"/>
+  <we:alternateReferences>
+    <we:reference id="wa104382081" version="1.55.1.0" store="wa104382081" storeType="OMEX"/>
+  </we:alternateReferences>
+  <we:properties>
+    <we:property name="MENDELEY_BIBLIOGRAPHY_IS_DIRTY" value="false"/>
+    <we:property name="MENDELEY_BIBLIOGRAPHY_LAST_MODIFIED" value="1790906303426"/>
+    <we:property name="MENDELEY_CITATIONS" value="[{&quot;citationID&quot;: &quot;MENDELEY_CITATION_f0dc5cb2-23c3-4684-b02c-cd58112354e5&quot;, &quot;properties&quot;: {&quot;noteIndex&quot;: 0}, &quot;isEdited&quot;: false, &quot;manualOverride&quot;: {&quot;isManuallyOverridden&quot;: false, &quot;citeprocText&quot;: &quot;(Millán Gordillo, 2025)&quot;, &quot;manualOverrideText&quot;: &quot;&quot;}, &quot;citationItems&quot;: [{&quot;id&quot;: &quot;ITEM-d048a752-48c5-509f-92fd-95097e22963d&quot;, &quot;itemData&quot;: {&quot;author&quot;: [{&quot;family&quot;: &quot;Millán Gordillo&quot;, &quot;given&quot;: &quot;M.&quot;, &quot;parse-names&quot;: false, &quot;dropping-particle&quot;: &quot;&quot;, &quot;non-dropping-particle&quot;: &quot;&quot;}], &quot;issued&quot;: {&quot;date-parts&quot;: [[2025]]}, &quot;URL&quot;: &quot;https://repositorio.uloyola.es/bitstream/handle/20.500.12412/6735/TFM%20Mar%C3%ADa%20Mill%C3%A1n.pdf&quot;, &quot;type&quot;: &quot;thesis&quot;, &quot;title&quot;: &quot;Estudio comparativo de sistemas de recomendación mediante filtrado colaborativo, basado en contenido y propuestas híbridas&quot;, &quot;genre&quot;: &quot;Tesis de maestría&quot;, &quot;publisher&quot;: &quot;Universidad Loyola Andalucía&quot;, &quot;id&quot;: &quot;ITEM-d048a752-48c5-509f-92fd-95097e22963d&quot;, &quot;container-title-short&quot;: &quot;&quot;}, &quot;isTemporary&quot;: false}]}, {&quot;citationID&quot;: &quot;MENDELEY_CITATION_0bf8e675-f566-4542-9238-a438b2e1bfcc&quot;, &quot;properties&quot;: {&quot;noteIndex&quot;: 0}, &quot;isEdited&quot;: false, &quot;manualOverride&quot;: {&quot;isManuallyOverridden&quot;: false, &quot;citeprocText&quot;: &quot;(Zheng et al., 2023)&quot;, &quot;manualOverrideText&quot;: &quot;&quot;}, &quot;citationItems&quot;: [{&quot;id&quot;: &quot;ITEM-658ab4b7-6469-5fa3-999a-4ffd7c7cd3d0&quot;, &quot;itemData&quot;: {&quot;author&quot;: [{&quot;family&quot;: &quot;Zheng&quot;, &quot;given&quot;: &quot;L.&quot;, &quot;parse-names&quot;: false, &quot;dropping-particle&quot;: &quot;&quot;, &quot;non-dropping-particle&quot;: &quot;&quot;}, {&quot;family&quot;: &quot;Chiang&quot;, &quot;given&quot;: &quot;W.-L.&quot;, &quot;parse-names&quot;: false, &quot;dropping-particle&quot;: &quot;&quot;, &quot;non-dropping-particle&quot;: &quot;&quot;}, {&quot;family&quot;: &quot;Sheng&quot;, &quot;given&quot;: &quot;Y.&quot;, &quot;parse-names&quot;: false, &quot;dropping-particle&quot;: &quot;&quot;, &quot;non-dropping-particle&quot;: &quot;&quot;}, {&quot;family&quot;: &quot;Zhuang&quot;, &quot;given&quot;: &quot;S.&quot;, &quot;parse-names&quot;: false, &quot;dropping-particle&quot;: &quot;&quot;, &quot;non-dropping-particle&quot;: &quot;&quot;}, {&quot;family&quot;: &quot;Wu&quot;, &quot;given&quot;: &quot;Z.&quot;, &quot;parse-names&quot;: false, &quot;dropping-particle&quot;: &quot;&quot;, &quot;non-dropping-particle&quot;: &quot;&quot;}, {&quot;family&quot;: &quot;Zhuang&quot;, &quot;given&quot;: &quot;Y.&quot;, &quot;parse-names&quot;: false, &quot;dropping-particle&quot;: &quot;&quot;, &quot;non-dropping-particle&quot;: &quot;&quot;}, {&quot;family&quot;: &quot;Lin&quot;, &quot;given&quot;: &quot;Z.&quot;, &quot;parse-names&quot;: false, &quot;dropping-particle&quot;: &quot;&quot;, &quot;non-dropping-particle&quot;: &quot;&quot;}, {&quot;family&quot;: &quot;Li&quot;, &quot;given&quot;: &quot;Z.&quot;, &quot;parse-names&quot;: false, &quot;dropping-particle&quot;: &quot;&quot;, &quot;non-dropping-particle&quot;: &quot;&quot;}, {&quot;family&quot;: &quot;Li&quot;, &quot;given&quot;: &quot;D.&quot;, &quot;parse-names&quot;: false, &quot;dropping-particle&quot;: &quot;&quot;, &quot;non-dropping-particle&quot;: &quot;&quot;}, {&quot;family&quot;: &quot;Xing&quot;, &quot;given&quot;: &quot;E. P.&quot;, &quot;parse-names&quot;: false, &quot;dropping-particle&quot;: &quot;&quot;, &quot;non-dropping-particle&quot;: &quot;&quot;}, {&quot;family&quot;: &quot;Zhang&quot;, &quot;given&quot;: &quot;H.&quot;, &quot;parse-names&quot;: false, &quot;dropping-particle&quot;: &quot;&quot;, &quot;non-dropping-particle&quot;: &quot;&quot;}, {&quot;family&quot;: &quot;Gonzalez&quot;, &quot;given&quot;: &quot;J. E.&quot;, &quot;parse-names&quot;: false, &quot;dropping-particle&quot;: &quot;&quot;, &quot;non-dropping-particle&quot;: &quot;&quot;}, {&quot;family&quot;: &quot;Stoica&quot;, &quot;given&quot;: &quot;I.&quot;, &quot;parse-names&quot;: false, &quot;dropping-particle&quot;: &quot;&quot;, &quot;non-dropping-particle&quot;: &quot;&quot;}], &quot;issued&quot;: {&quot;date-parts&quot;: [[2023]]}, &quot;DOI&quot;: &quot;10.48550/arXiv.2306.05685&quot;, &quot;type&quot;: &quot;book&quot;, &quot;title&quot;: &quot;Judging LLM-as-a-judge with MT-Bench and Chatbot Arena&quot;, &quot;publisher&quot;: &quot;arXiv&quot;, &quot;id&quot;: &quot;ITEM-658ab4b7-6469-5fa3-999a-4ffd7c7cd3d0&quot;, &quot;container-title-short&quot;: &quot;&quot;}, &quot;isTemporary&quot;: false}]}, {&quot;citationID&quot;: &quot;MENDELEY_CITATION_da31558b-45c6-470f-9f2f-c4322570e040&quot;, &quot;properties&quot;: {&quot;noteIndex&quot;: 0}, &quot;isEdited&quot;: false, &quot;manualOverride&quot;: {&quot;isManuallyOverridden&quot;: true, &quot;citeprocText&quot;: &quot;(Song et al., 2025)&quot;, &quot;manualOverrideText&quot;: &quot;Song et al. (2025)&quot;}, &quot;citationItems&quot;: [{&quot;id&quot;: &quot;ITEM-e0e22fed-4a06-55b1-8d82-b72075b7c2d9&quot;, &quot;itemData&quot;: {&quot;author&quot;: [{&quot;family&quot;: &quot;Song&quot;, &quot;given&quot;: &quot;Y.&quot;, &quot;parse-names&quot;: false, &quot;dropping-particle&quot;: &quot;&quot;, &quot;non-dropping-particle&quot;: &quot;&quot;}, {&quot;family&quot;: &quot;Lv&quot;, &quot;given&quot;: &quot;C.&quot;, &quot;parse-names&quot;: false, &quot;dropping-particle&quot;: &quot;&quot;, &quot;non-dropping-particle&quot;: &quot;&quot;}, {&quot;family&quot;: &quot;Zhu&quot;, &quot;given&quot;: &quot;K.&quot;, &quot;parse-names&quot;: false, &quot;dropping-particle&quot;: &quot;&quot;, &quot;non-dropping-particle&quot;: &quot;&quot;}, {&quot;family&quot;: &quot;Qiu&quot;, &quot;given&quot;: &quot;X.&quot;, &quot;parse-names&quot;: false, &quot;dropping-particle&quot;: &quot;&quot;, &quot;non-dropping-particle&quot;: &quot;&quot;}], &quot;issued&quot;: {&quot;date-parts&quot;: [[2025]]}, &quot;DOI&quot;: &quot;10.1007/s10791-025-09663-6&quot;, &quot;type&quot;: &quot;article-journal&quot;, &quot;title&quot;: &quot;LoRA fine-tuning of Llama3 large model for intelligent fishery field&quot;, &quot;container-title&quot;: &quot;Discover Computing&quot;, &quot;volume&quot;: &quot;28&quot;, &quot;issue&quot;: &quot;1&quot;, &quot;page&quot;: &quot;135&quot;, &quot;id&quot;: &quot;ITEM-e0e22fed-4a06-55b1-8d82-b72075b7c2d9&quot;, &quot;container-title-short&quot;: &quot;&quot;}, &quot;isTemporary&quot;: false}]}, {&quot;citationID&quot;: &quot;MENDELEY_CITATION_7cde0212-c4a7-4a97-a51e-89469bd13a2e&quot;, &quot;properties&quot;: {&quot;noteIndex&quot;: 0}, &quot;isEdited&quot;: false, &quot;manualOverride&quot;: {&quot;isManuallyOverridden&quot;: true, &quot;citeprocText&quot;: &quot;(Zhang et al., 2025)&quot;, &quot;manualOverrideText&quot;: &quot;Zhang et al. (2025)&quot;}, &quot;citationItems&quot;: [{&quot;id&quot;: &quot;ITEM-1b18d17f-3a57-568c-a65a-b5824a81dd38&quot;, &quot;itemData&quot;: {&quot;author&quot;: [{&quot;family&quot;: &quot;Zhang&quot;, &quot;given&quot;: &quot;J. C.&quot;, &quot;parse-names&quot;: false, &quot;dropping-particle&quot;: &quot;&quot;, &quot;non-dropping-particle&quot;: &quot;&quot;}, {&quot;family&quot;: &quot;Xiong&quot;, &quot;given&quot;: &quot;Y. J.&quot;, &quot;parse-names&quot;: false, &quot;dropping-particle&quot;: &quot;&quot;, &quot;non-dropping-particle&quot;: &quot;&quot;}, {&quot;family&quot;: &quot;Xia&quot;, &quot;given&quot;: &quot;C. M.&quot;, &quot;parse-names&quot;: false, &quot;dropping-particle&quot;: &quot;&quot;, &quot;non-dropping-particle&quot;: &quot;&quot;}, {&quot;family&quot;: &quot;Zhu&quot;, &quot;given&quot;: &quot;D. H.&quot;, &quot;parse-names&quot;: false, &quot;dropping-particle&quot;: &quot;&quot;, &quot;non-dropping-particle&quot;: &quot;&quot;}, {&quot;family&quot;: &quot;Zhan&quot;, &quot;given&quot;: &quot;H. J.&quot;, &quot;parse-names&quot;: false, &quot;dropping-particle&quot;: &quot;&quot;, &quot;non-dropping-particle&quot;: &quot;&quot;}], &quot;issued&quot;: {&quot;date-parts&quot;: [[2025]]}, &quot;DOI&quot;: &quot;10.1016/j.neucom.2025.130859&quot;, &quot;type&quot;: &quot;article-journal&quot;, &quot;title&quot;: &quot;LoRA2: Multi-scale low-rank approximations for fine-tuning large language models&quot;, &quot;container-title&quot;: &quot;Neurocomputing&quot;, &quot;volume&quot;: &quot;650&quot;, &quot;page&quot;: &quot;130859&quot;, &quot;id&quot;: &quot;ITEM-1b18d17f-3a57-568c-a65a-b5824a81dd38&quot;, &quot;container-title-short&quot;: &quot;&quot;}, &quot;isTemporary&quot;: false}]}, {&quot;citationID&quot;: &quot;MENDELEY_CITATION_543ee096-5ba2-46c5-bf0d-f634106b7077&quot;, &quot;properties&quot;: {&quot;noteIndex&quot;: 0}, &quot;isEdited&quot;: false, &quot;manualOverride&quot;: {&quot;isManuallyOverridden&quot;: false, &quot;citeprocText&quot;: &quot;(Gao et al., 2026; Liu et al., 2026)&quot;, &quot;manualOverrideText&quot;: &quot;&quot;}, &quot;citationItems&quot;: [{&quot;id&quot;: &quot;ITEM-d320fd95-a78e-5478-a293-ab29c9647d86&quot;, &quot;itemData&quot;: {&quot;author&quot;: [{&quot;family&quot;: &quot;Gao&quot;, &quot;given&quot;: &quot;D.&quot;, &quot;parse-names&quot;: false, &quot;dropping-particle&quot;: &quot;&quot;, &quot;non-dropping-particle&quot;: &quot;&quot;}, {&quot;family&quot;: &quot;Chen&quot;, &quot;given&quot;: &quot;S.&quot;, &quot;parse-names&quot;: false, &quot;dropping-particle&quot;: &quot;&quot;, &quot;non-dropping-particle&quot;: &quot;&quot;}, {&quot;family&quot;: &quot;Yang&quot;, &quot;given&quot;: &quot;Z.&quot;, &quot;parse-names&quot;: false, &quot;dropping-particle&quot;: &quot;&quot;, &quot;non-dropping-particle&quot;: &quot;&quot;}, {&quot;family&quot;: &quot;Yang&quot;, &quot;given&quot;: &quot;L.&quot;, &quot;parse-names&quot;: false, &quot;dropping-particle&quot;: &quot;&quot;, &quot;non-dropping-particle&quot;: &quot;&quot;}, {&quot;family&quot;: &quot;Gao&quot;, &quot;given&quot;: &quot;H.&quot;, &quot;parse-names&quot;: false, &quot;dropping-particle&quot;: &quot;&quot;, &quot;non-dropping-particle&quot;: &quot;&quot;}, {&quot;family&quot;: &quot;Wu&quot;, &quot;given&quot;: &quot;M.&quot;, &quot;parse-names&quot;: false, &quot;dropping-particle&quot;: &quot;&quot;, &quot;non-dropping-particle&quot;: &quot;&quot;}, {&quot;family&quot;: &quot;Yu&quot;, &quot;given&quot;: &quot;S.&quot;, &quot;parse-names&quot;: false, &quot;dropping-particle&quot;: &quot;&quot;, &quot;non-dropping-particle&quot;: &quot;&quot;}, {&quot;family&quot;: &quot;Xuan&quot;, &quot;given&quot;: &quot;Q.&quot;, &quot;parse-names&quot;: false, &quot;dropping-particle&quot;: &quot;&quot;, &quot;non-dropping-particle&quot;: &quot;&quot;}, {&quot;family&quot;: &quot;Zhang&quot;, &quot;given&quot;: &quot;W.&quot;, &quot;parse-names&quot;: false, &quot;dropping-particle&quot;: &quot;&quot;, &quot;non-dropping-particle&quot;: &quot;&quot;}, {&quot;family&quot;: &quot;Yang&quot;, &quot;given&quot;: &quot;L.&quot;, &quot;parse-names&quot;: false, &quot;dropping-particle&quot;: &quot;&quot;, &quot;non-dropping-particle&quot;: &quot;&quot;}, {&quot;family&quot;: &quot;Cai&quot;, &quot;given&quot;: &quot;X.&quot;, &quot;parse-names&quot;: false, &quot;dropping-particle&quot;: &quot;&quot;, &quot;non-dropping-particle&quot;: &quot;&quot;}], &quot;issued&quot;: {&quot;date-parts&quot;: [[2026]]}, &quot;DOI&quot;: &quot;10.1016/j.eswa.2025.129486&quot;, &quot;type&quot;: &quot;article-journal&quot;, &quot;title&quot;: &quot;MLoRA+: Transformer-fusion mixture-of-LoRA network for multi-domain click-through rate prediction&quot;, &quot;container-title&quot;: &quot;Expert Systems with Applications&quot;, &quot;volume&quot;: &quot;297&quot;, &quot;page&quot;: &quot;129486&quot;, &quot;id&quot;: &quot;ITEM-d320fd95-a78e-5478-a293-ab29c9647d86&quot;, &quot;container-title-short&quot;: &quot;&quot;}, &quot;isTemporary&quot;: false}, {&quot;id&quot;: &quot;ITEM-b4080137-1a47-52cd-9e37-0f8562cb0792&quot;, &quot;itemData&quot;: {&quot;author&quot;: [{&quot;family&quot;: &quot;Liu&quot;, &quot;given&quot;: &quot;Z.&quot;, &quot;parse-names&quot;: false, &quot;dropping-particle&quot;: &quot;&quot;, &quot;non-dropping-particle&quot;: &quot;&quot;}, {&quot;family&quot;: &quot;Liu&quot;, &quot;given&quot;: &quot;Z.&quot;, &quot;parse-names&quot;: false, &quot;dropping-particle&quot;: &quot;&quot;, &quot;non-dropping-particle&quot;: &quot;&quot;}, {&quot;family&quot;: &quot;Feng&quot;, &quot;given&quot;: &quot;R.&quot;, &quot;parse-names&quot;: false, &quot;dropping-particle&quot;: &quot;&quot;, &quot;non-dropping-particle&quot;: &quot;&quot;}, {&quot;family&quot;: &quot;Feng&quot;, &quot;given&quot;: &quot;P.&quot;, &quot;parse-names&quot;: false, &quot;dropping-particle&quot;: &quot;&quot;, &quot;non-dropping-particle&quot;: &quot;&quot;}, {&quot;family&quot;: &quot;Chu&quot;, &quot;given&quot;: &quot;J.&quot;, &quot;parse-names&quot;: false, &quot;dropping-particle&quot;: &quot;&quot;, &quot;non-dropping-particle&quot;: &quot;&quot;}, {&quot;family&quot;: &quot;Peng&quot;, &quot;given&quot;: &quot;X.&quot;, &quot;parse-names&quot;: false, &quot;dropping-particle&quot;: &quot;&quot;, &quot;non-dropping-particle&quot;: &quot;&quot;}], &quot;issued&quot;: {&quot;date-parts&quot;: [[2026]]}, &quot;DOI&quot;: &quot;10.1016/j.snb.2025.138644&quot;, &quot;type&quot;: &quot;article-journal&quot;, &quot;title&quot;: &quot;LoRA-TCN: A pre-trained/fine-tuning learning paradigm for drift adaptation&quot;, &quot;container-title&quot;: &quot;Sensors and Actuators B: Chemical&quot;, &quot;volume&quot;: &quot;446&quot;, &quot;page&quot;: &quot;138644&quot;, &quot;id&quot;: &quot;ITEM-b4080137-1a47-52cd-9e37-0f8562cb0792&quot;, &quot;container-title-short&quot;: &quot;&quot;}, &quot;isTemporary&quot;: false}]}, {&quot;citationID&quot;: &quot;MENDELEY_CITATION_4a96d978-6bde-4b36-b510-167b5d7f4396&quot;, &quot;properties&quot;: {&quot;noteIndex&quot;: 0}, &quot;isEdited&quot;: false, &quot;manualOverride&quot;: {&quot;isManuallyOverridden&quot;: false, &quot;citeprocText&quot;: &quot;(Dettmers et al., 2023)&quot;, &quot;manualOverrideText&quot;: &quot;&quot;}, &quot;citationItems&quot;: [{&quot;id&quot;: &quot;ITEM-66ff8277-e9ea-5605-b98c-71a6ac2aa4a6&quot;, &quot;itemData&quot;: {&quot;author&quot;: [{&quot;family&quot;: &quot;Dettmers&quot;, &quot;given&quot;: &quot;T.&quot;, &quot;parse-names&quot;: false, &quot;dropping-particle&quot;: &quot;&quot;, &quot;non-dropping-particle&quot;: &quot;&quot;}, {&quot;family&quot;: &quot;Pagnoni&quot;, &quot;given&quot;: &quot;A.&quot;, &quot;parse-names&quot;: false, &quot;dropping-particle&quot;: &quot;&quot;, &quot;non-dropping-particle&quot;: &quot;&quot;}, {&quot;family&quot;: &quot;Holtzman&quot;, &quot;given&quot;: &quot;A.&quot;, &quot;parse-names&quot;: false, &quot;dropping-particle&quot;: &quot;&quot;, &quot;non-dropping-particle&quot;: &quot;&quot;}, {&quot;family&quot;: &quot;Zettlemoyer&quot;, &quot;given&quot;: &quot;L.&quot;, &quot;parse-names&quot;: false, &quot;dropping-particle&quot;: &quot;&quot;, &quot;non-dropping-particle&quot;: &quot;&quot;}], &quot;issued&quot;: {&quot;date-parts&quot;: [[2023]]}, &quot;DOI&quot;: &quot;10.48550/arXiv.2305.14314&quot;, &quot;type&quot;: &quot;paper-conference&quot;, &quot;title&quot;: &quot;QLoRA: Efficient finetuning of quantized LLMs&quot;, &quot;container-title&quot;: &quot;Advances in Neural Information Processing Systems 36&quot;, &quot;id&quot;: &quot;ITEM-66ff8277-e9ea-5605-b98c-71a6ac2aa4a6&quot;, &quot;container-title-short&quot;: &quot;&quot;}, &quot;isTemporary&quot;: false}]}, {&quot;citationID&quot;: &quot;MENDELEY_CITATION_8c2b9d6d-dbe2-4811-9d6e-252e9db94251&quot;, &quot;properties&quot;: {&quot;noteIndex&quot;: 0}, &quot;isEdited&quot;: false, &quot;manualOverride&quot;: {&quot;isManuallyOverridden&quot;: false, &quot;citeprocText&quot;: &quot;(Hu et al., 2021)&quot;, &quot;manualOverrideText&quot;: &quot;&quot;}, &quot;citationItems&quot;: [{&quot;id&quot;: &quot;ITEM-74d30536-939b-537f-bec0-b59afedae2e3&quot;, &quot;itemData&quot;: {&quot;author&quot;: [{&quot;family&quot;: &quot;Hu&quot;, &quot;given&quot;: &quot;E. J.&quot;, &quot;parse-names&quot;: false, &quot;dropping-particle&quot;: &quot;&quot;, &quot;non-dropping-particle&quot;: &quot;&quot;}, {&quot;family&quot;: &quot;Shen&quot;, &quot;given&quot;: &quot;Y.&quot;, &quot;parse-names&quot;: false, &quot;dropping-particle&quot;: &quot;&quot;, &quot;non-dropping-particle&quot;: &quot;&quot;}, {&quot;family&quot;: &quot;Wallis&quot;, &quot;given&quot;: &quot;P.&quot;, &quot;parse-names&quot;: false, &quot;dropping-particle&quot;: &quot;&quot;, &quot;non-dropping-particle&quot;: &quot;&quot;}, {&quot;family&quot;: &quot;Allen-Zhu&quot;, &quot;given&quot;: &quot;Z.&quot;, &quot;parse-names&quot;: false, &quot;dropping-particle&quot;: &quot;&quot;, &quot;non-dropping-particle&quot;: &quot;&quot;}, {&quot;family&quot;: &quot;Li&quot;, &quot;given&quot;: &quot;Y.&quot;, &quot;parse-names&quot;: false, &quot;dropping-particle&quot;: &quot;&quot;, &quot;non-dropping-particle&quot;: &quot;&quot;}, {&quot;family&quot;: &quot;Wang&quot;, &quot;given&quot;: &quot;S.&quot;, &quot;parse-names&quot;: false, &quot;dropping-particle&quot;: &quot;&quot;, &quot;non-dropping-particle&quot;: &quot;&quot;}, {&quot;family&quot;: &quot;Wang&quot;, &quot;given&quot;: &quot;L.&quot;, &quot;parse-names&quot;: false, &quot;dropping-particle&quot;: &quot;&quot;, &quot;non-dropping-particle&quot;: &quot;&quot;}, {&quot;family&quot;: &quot;Chen&quot;, &quot;given&quot;: &quot;W.&quot;, &quot;parse-names&quot;: false, &quot;dropping-particle&quot;: &quot;&quot;, &quot;non-dropping-particle&quot;: &quot;&quot;}], &quot;issued&quot;: {&quot;date-parts&quot;: [[2021]]}, &quot;DOI&quot;: &quot;10.48550/arXiv.2106.09685&quot;, &quot;type&quot;: &quot;book&quot;, &quot;title&quot;: &quot;LoRA: Low-rank adaptation of large language models&quot;, &quot;publisher&quot;: &quot;arXiv&quot;, &quot;id&quot;: &quot;ITEM-74d30536-939b-537f-bec0-b59afedae2e3&quot;, &quot;container-title-short&quot;: &quot;&quot;}, &quot;isTemporary&quot;: false}]}, {&quot;citationID&quot;: &quot;MENDELEY_CITATION_ebbb81cd-3f8a-4604-b53f-0330d552f160&quot;, &quot;properties&quot;: {&quot;noteIndex&quot;: 0}, &quot;isEdited&quot;: false, &quot;manualOverride&quot;: {&quot;isManuallyOverridden&quot;: true, &quot;citeprocText&quot;: &quot;(Hu et al., 2021)&quot;, &quot;manualOverrideText&quot;: &quot;Hu et al. (2021)&quot;}, &quot;citationItems&quot;: [{&quot;id&quot;: &quot;ITEM-74d30536-939b-537f-bec0-b59afedae2e3&quot;, &quot;itemData&quot;: {&quot;author&quot;: [{&quot;family&quot;: &quot;Hu&quot;, &quot;given&quot;: &quot;E. J.&quot;, &quot;parse-names&quot;: false, &quot;dropping-particle&quot;: &quot;&quot;, &quot;non-dropping-particle&quot;: &quot;&quot;}, {&quot;family&quot;: &quot;Shen&quot;, &quot;given&quot;: &quot;Y.&quot;, &quot;parse-names&quot;: false, &quot;dropping-particle&quot;: &quot;&quot;, &quot;non-dropping-particle&quot;: &quot;&quot;}, {&quot;family&quot;: &quot;Wallis&quot;, &quot;given&quot;: &quot;P.&quot;, &quot;parse-names&quot;: false, &quot;dropping-particle&quot;: &quot;&quot;, &quot;non-dropping-particle&quot;: &quot;&quot;}, {&quot;family&quot;: &quot;Allen-Zhu&quot;, &quot;given&quot;: &quot;Z.&quot;, &quot;parse-names&quot;: false, &quot;dropping-particle&quot;: &quot;&quot;, &quot;non-dropping-particle&quot;: &quot;&quot;}, {&quot;family&quot;: &quot;Li&quot;, &quot;given&quot;: &quot;Y.&quot;, &quot;parse-names&quot;: false, &quot;dropping-particle&quot;: &quot;&quot;, &quot;non-dropping-particle&quot;: &quot;&quot;}, {&quot;family&quot;: &quot;Wang&quot;, &quot;given&quot;: &quot;S.&quot;, &quot;parse-names&quot;: false, &quot;dropping-particle&quot;: &quot;&quot;, &quot;non-dropping-particle&quot;: &quot;&quot;}, {&quot;family&quot;: &quot;Wang&quot;, &quot;given&quot;: &quot;L.&quot;, &quot;parse-names&quot;: false, &quot;dropping-particle&quot;: &quot;&quot;, &quot;non-dropping-particle&quot;: &quot;&quot;}, {&quot;family&quot;: &quot;Chen&quot;, &quot;given&quot;: &quot;W.&quot;, &quot;parse-names&quot;: false, &quot;dropping-particle&quot;: &quot;&quot;, &quot;non-dropping-particle&quot;: &quot;&quot;}], &quot;issued&quot;: {&quot;date-parts&quot;: [[2021]]}, &quot;DOI&quot;: &quot;10.48550/arXiv.2106.09685&quot;, &quot;type&quot;: &quot;book&quot;, &quot;title&quot;: &quot;LoRA: Low-rank adaptation of large language models&quot;, &quot;publisher&quot;: &quot;arXiv&quot;, &quot;id&quot;: &quot;ITEM-74d30536-939b-537f-bec0-b59afedae2e3&quot;, &quot;container-title-short&quot;: &quot;&quot;}, &quot;isTemporary&quot;: false}]}, {&quot;citationID&quot;: &quot;MENDELEY_CITATION_86a27299-278c-4305-a9d3-0575846e50f9&quot;, &quot;properties&quot;: {&quot;noteIndex&quot;: 0}, &quot;isEdited&quot;: false, &quot;manualOverride&quot;: {&quot;isManuallyOverridden&quot;: false, &quot;citeprocText&quot;: &quot;(Dettmers et al., 2023)&quot;, &quot;manualOverrideText&quot;: &quot;&quot;}, &quot;citationItems&quot;: [{&quot;id&quot;: &quot;ITEM-66ff8277-e9ea-5605-b98c-71a6ac2aa4a6&quot;, &quot;itemData&quot;: {&quot;author&quot;: [{&quot;family&quot;: &quot;Dettmers&quot;, &quot;given&quot;: &quot;T.&quot;, &quot;parse-names&quot;: false, &quot;dropping-particle&quot;: &quot;&quot;, &quot;non-dropping-particle&quot;: &quot;&quot;}, {&quot;family&quot;: &quot;Pagnoni&quot;, &quot;given&quot;: &quot;A.&quot;, &quot;parse-names&quot;: false, &quot;dropping-particle&quot;: &quot;&quot;, &quot;non-dropping-particle&quot;: &quot;&quot;}, {&quot;family&quot;: &quot;Holtzman&quot;, &quot;given&quot;: &quot;A.&quot;, &quot;parse-names&quot;: false, &quot;dropping-particle&quot;: &quot;&quot;, &quot;non-dropping-particle&quot;: &quot;&quot;}, {&quot;family&quot;: &quot;Zettlemoyer&quot;, &quot;given&quot;: &quot;L.&quot;, &quot;parse-names&quot;: false, &quot;dropping-particle&quot;: &quot;&quot;, &quot;non-dropping-particle&quot;: &quot;&quot;}], &quot;issued&quot;: {&quot;date-parts&quot;: [[2023]]}, &quot;DOI&quot;: &quot;10.48550/arXiv.2305.14314&quot;, &quot;type&quot;: &quot;paper-conference&quot;, &quot;title&quot;: &quot;QLoRA: Efficient finetuning of quantized LLMs&quot;, &quot;container-title&quot;: &quot;Advances in Neural Information Processing Systems 36&quot;, &quot;id&quot;: &quot;ITEM-66ff8277-e9ea-5605-b98c-71a6ac2aa4a6&quot;, &quot;container-title-short&quot;: &quot;&quot;}, &quot;isTemporary&quot;: false}]}, {&quot;citationID&quot;: &quot;MENDELEY_CITATION_ce852990-1488-4a5b-a776-4003adb34b34&quot;, &quot;properties&quot;: {&quot;noteIndex&quot;: 0}, &quot;isEdited&quot;: false, &quot;manualOverride&quot;: {&quot;isManuallyOverridden&quot;: true, &quot;citeprocText&quot;: &quot;(Singhal et al., 2023)&quot;, &quot;manualOverrideText&quot;: &quot;Singhal et al. (2023)&quot;}, &quot;citationItems&quot;: [{&quot;id&quot;: &quot;ITEM-50da8b62-4567-5119-b691-5e46f77cae26&quot;, &quot;itemData&quot;: {&quot;author&quot;: [{&quot;family&quot;: &quot;Singhal&quot;, &quot;given&quot;: &quot;K.&quot;, &quot;parse-names&quot;: false, &quot;dropping-particle&quot;: &quot;&quot;, &quot;non-dropping-particle&quot;: &quot;&quot;}, {&quot;family&quot;: &quot;Azizi&quot;, &quot;given&quot;: &quot;S.&quot;, &quot;parse-names&quot;: false, &quot;dropping-particle&quot;: &quot;&quot;, &quot;non-dropping-particle&quot;: &quot;&quot;}, {&quot;family&quot;: &quot;Tu&quot;, &quot;given&quot;: &quot;T.&quot;, &quot;parse-names&quot;: false, &quot;dropping-particle&quot;: &quot;&quot;, &quot;non-dropping-particle&quot;: &quot;&quot;}, {&quot;family&quot;: &quot;Mahdavi&quot;, &quot;given&quot;: &quot;S. S.&quot;, &quot;parse-names&quot;: false, &quot;dropping-particle&quot;: &quot;&quot;, &quot;non-dropping-particle&quot;: &quot;&quot;}, {&quot;family&quot;: &quot;Wei&quot;, &quot;given&quot;: &quot;J.&quot;, &quot;parse-names&quot;: false, &quot;dropping-particle&quot;: &quot;&quot;, &quot;non-dropping-particle&quot;: &quot;&quot;}, {&quot;family&quot;: &quot;Chung&quot;, &quot;given&quot;: &quot;H. W.&quot;, &quot;parse-names&quot;: false, &quot;dropping-particle&quot;: &quot;&quot;, &quot;non-dropping-particle&quot;: &quot;&quot;}, {&quot;family&quot;: &quot;Scales&quot;, &quot;given&quot;: &quot;N.&quot;, &quot;parse-names&quot;: false, &quot;dropping-particle&quot;: &quot;&quot;, &quot;non-dropping-particle&quot;: &quot;&quot;}, {&quot;family&quot;: &quot;Tanwani&quot;, &quot;given&quot;: &quot;A.&quot;, &quot;parse-names&quot;: false, &quot;dropping-particle&quot;: &quot;&quot;, &quot;non-dropping-particle&quot;: &quot;&quot;}, {&quot;family&quot;: &quot;Cole-Lewis&quot;, &quot;given&quot;: &quot;H.&quot;, &quot;parse-names&quot;: false, &quot;dropping-particle&quot;: &quot;&quot;, &quot;non-dropping-particle&quot;: &quot;&quot;}, {&quot;family&quot;: &quot;Pfohl&quot;, &quot;given&quot;: &quot;S.&quot;, &quot;parse-names&quot;: false, &quot;dropping-particle&quot;: &quot;&quot;, &quot;non-dropping-particle&quot;: &quot;&quot;}, {&quot;family&quot;: &quot;Payne&quot;, &quot;given&quot;: &quot;P.&quot;, &quot;parse-names&quot;: false, &quot;dropping-particle&quot;: &quot;&quot;, &quot;non-dropping-particle&quot;: &quot;&quot;}, {&quot;family&quot;: &quot;Seneviratne&quot;, &quot;given&quot;: &quot;M.&quot;, &quot;parse-names&quot;: false, &quot;dropping-particle&quot;: &quot;&quot;, &quot;non-dropping-particle&quot;: &quot;&quot;}, {&quot;family&quot;: &quot;Gamble&quot;, &quot;given&quot;: &quot;P.&quot;, &quot;parse-names&quot;: false, &quot;dropping-particle&quot;: &quot;&quot;, &quot;non-dropping-particle&quot;: &quot;&quot;}, {&quot;family&quot;: &quot;Kelly&quot;, &quot;given&quot;: &quot;C.&quot;, &quot;parse-names&quot;: false, &quot;dropping-particle&quot;: &quot;&quot;, &quot;non-dropping-particle&quot;: &quot;&quot;}, {&quot;family&quot;: &quot;Babiker&quot;, &quot;given&quot;: &quot;A.&quot;, &quot;parse-names&quot;: false, &quot;dropping-particle&quot;: &quot;&quot;, &quot;non-dropping-particle&quot;: &quot;&quot;}, {&quot;family&quot;: &quot;Schärli&quot;, &quot;given&quot;: &quot;N.&quot;, &quot;parse-names&quot;: false, &quot;dropping-particle&quot;: &quot;&quot;, &quot;non-dropping-particle&quot;: &quot;&quot;}, {&quot;family&quot;: &quot;Chowdhery&quot;, &quot;given&quot;: &quot;A.&quot;, &quot;parse-names&quot;: false, &quot;dropping-particle&quot;: &quot;&quot;, &quot;non-dropping-particle&quot;: &quot;&quot;}, {&quot;family&quot;: &quot;Mansfield&quot;, &quot;given&quot;: &quot;P.&quot;, &quot;parse-names&quot;: false, &quot;dropping-particle&quot;: &quot;&quot;, &quot;non-dropping-particle&quot;: &quot;&quot;}, {&quot;family&quot;: &quot;Demner-Fushman&quot;, &quot;given&quot;: &quot;D.&quot;, &quot;parse-names&quot;: false, &quot;dropping-particle&quot;: &quot;&quot;, &quot;non-dropping-particle&quot;: &quot;&quot;}, {&quot;family&quot;: &quot;Natarajan&quot;, &quot;given&quot;: &quot;V.&quot;, &quot;parse-names&quot;: false, &quot;dropping-particle&quot;: &quot;&quot;, &quot;non-dropping-particle&quot;: &quot;&quot;}], &quot;issued&quot;: {&quot;date-parts&quot;: [[2023]]}, &quot;DOI&quot;: &quot;10.1038/s41586-023-06291-2&quot;, &quot;type&quot;: &quot;article-journal&quot;, &quot;title&quot;: &quot;Large language models encode clinical knowledge&quot;, &quot;container-title&quot;: &quot;Nature&quot;, &quot;volume&quot;: &quot;620&quot;, &quot;issue&quot;: &quot;7972&quot;, &quot;page&quot;: &quot;172-180&quot;, &quot;id&quot;: &quot;ITEM-50da8b62-4567-5119-b691-5e46f77cae26&quot;, &quot;container-title-short&quot;: &quot;&quot;}, &quot;isTemporary&quot;: false}]}, {&quot;citationID&quot;: &quot;MENDELEY_CITATION_5de94ccb-6a0c-4332-8702-21e63f95e5b6&quot;, &quot;properties&quot;: {&quot;noteIndex&quot;: 0}, &quot;isEdited&quot;: false, &quot;manualOverride&quot;: {&quot;isManuallyOverridden&quot;: true, &quot;citeprocText&quot;: &quot;(Negueruela Gómez, 2024; Zhang et al., 2026)&quot;, &quot;manualOverrideText&quot;: &quot;(Negueruela Gómez, 2024; H. Zhang et al., 2026)&quot;}, &quot;citationItems&quot;: [{&quot;id&quot;: &quot;ITEM-99b80702-9513-57fc-b45d-6af1c9999632&quot;, &quot;itemData&quot;: {&quot;author&quot;: [{&quot;family&quot;: &quot;Negueruela Gómez&quot;, &quot;given&quot;: &quot;I.&quot;, &quot;parse-names&quot;: false, &quot;dropping-particle&quot;: &quot;&quot;, &quot;non-dropping-particle&quot;: &quot;&quot;}], &quot;issued&quot;: {&quot;date-parts&quot;: [[2024]]}, &quot;URL&quot;: &quot;https://repositorio.unican.es/xmlui/handle/10902/33837&quot;, &quot;type&quot;: &quot;thesis&quot;, &quot;title&quot;: &quot;Análisis y evaluación de LLMs con técnicas RAG para el desarrollo y despliegue de un asistente virtual&quot;, &quot;genre&quot;: &quot;Trabajo de fin de estudios&quot;, &quot;publisher&quot;: &quot;Universidad de Cantabria&quot;, &quot;id&quot;: &quot;ITEM-99b80702-9513-57fc-b45d-6af1c9999632&quot;, &quot;container-title-short&quot;: &quot;&quot;}, &quot;isTemporary&quot;: false}, {&quot;id&quot;: &quot;ITEM-c14394b5-5d79-565b-92c8-bcd30bfc44ad&quot;, &quot;itemData&quot;: {&quot;author&quot;: [{&quot;family&quot;: &quot;Zhang&quot;, &quot;given&quot;: &quot;H.&quot;, &quot;parse-names&quot;: false, &quot;dropping-particle&quot;: &quot;&quot;, &quot;non-dropping-particle&quot;: &quot;&quot;}, {&quot;family&quot;: &quot;Li&quot;, &quot;given&quot;: &quot;Z.&quot;, &quot;parse-names&quot;: false, &quot;dropping-particle&quot;: &quot;&quot;, &quot;non-dropping-particle&quot;: &quot;&quot;}, {&quot;family&quot;: &quot;Liu&quot;, &quot;given&quot;: &quot;J.&quot;, &quot;parse-names&quot;: false, &quot;dropping-particle&quot;: &quot;&quot;, &quot;non-dropping-particle&quot;: &quot;&quot;}], &quot;issued&quot;: {&quot;date-parts&quot;: [[2026]]}, &quot;DOI&quot;: &quot;10.1016/j.patcog.2025.111992&quot;, &quot;type&quot;: &quot;article-journal&quot;, &quot;title&quot;: &quot;SceneLLM: Implicit language reasoning in LLM for dynamic scene graph generation&quot;, &quot;container-title&quot;: &quot;Pattern Recognition&quot;, &quot;volume&quot;: &quot;170&quot;, &quot;page&quot;: &quot;111992&quot;, &quot;id&quot;: &quot;ITEM-c14394b5-5d79-565b-92c8-bcd30bfc44ad&quot;, &quot;container-title-short&quot;: &quot;&quot;}, &quot;isTemporary&quot;: false}]}, {&quot;citationID&quot;: &quot;MENDELEY_CITATION_3d8b5c16-9cb0-45dd-b775-562098a47f50&quot;, &quot;properties&quot;: {&quot;noteIndex&quot;: 0}, &quot;isEdited&quot;: false, &quot;manualOverride&quot;: {&quot;isManuallyOverridden&quot;: false, &quot;citeprocText&quot;: &quot;(Vaswani et al., 2017)&quot;, &quot;manualOverrideText&quot;: &quot;&quot;}, &quot;citationItems&quot;: [{&quot;id&quot;: &quot;ITEM-17a82183-4067-5f24-9b07-243be6e2ad27&quot;, &quot;itemData&quot;: {&quot;author&quot;: [{&quot;family&quot;: &quot;Vaswani&quot;, &quot;given&quot;: &quot;A.&quot;, &quot;parse-names&quot;: false, &quot;dropping-particle&quot;: &quot;&quot;, &quot;non-dropping-particle&quot;: &quot;&quot;}, {&quot;family&quot;: &quot;Shazeer&quot;, &quot;given&quot;: &quot;N.&quot;, &quot;parse-names&quot;: false, &quot;dropping-particle&quot;: &quot;&quot;, &quot;non-dropping-particle&quot;: &quot;&quot;}, {&quot;family&quot;: &quot;Parmar&quot;, &quot;given&quot;: &quot;N.&quot;, &quot;parse-names&quot;: false, &quot;dropping-particle&quot;: &quot;&quot;, &quot;non-dropping-particle&quot;: &quot;&quot;}, {&quot;family&quot;: &quot;Uszkoreit&quot;, &quot;given&quot;: &quot;J.&quot;, &quot;parse-names&quot;: false, &quot;dropping-particle&quot;: &quot;&quot;, &quot;non-dropping-particle&quot;: &quot;&quot;}, {&quot;family&quot;: &quot;Jones&quot;, &quot;given&quot;: &quot;L.&quot;, &quot;parse-names&quot;: false, &quot;dropping-particle&quot;: &quot;&quot;, &quot;non-dropping-particle&quot;: &quot;&quot;}, {&quot;family&quot;: &quot;Gomez&quot;, &quot;given&quot;: &quot;A. N.&quot;, &quot;parse-names&quot;: false, &quot;dropping-particle&quot;: &quot;&quot;, &quot;non-dropping-particle&quot;: &quot;&quot;}, {&quot;family&quot;: &quot;Kaiser&quot;, &quot;given&quot;: &quot;Ł.&quot;, &quot;parse-names&quot;: false, &quot;dropping-particle&quot;: &quot;&quot;, &quot;non-dropping-particle&quot;: &quot;&quot;}, {&quot;family&quot;: &quot;Polosukhin&quot;, &quot;given&quot;: &quot;I.&quot;, &quot;parse-names&quot;: false, &quot;dropping-particle&quot;: &quot;&quot;, &quot;non-dropping-particle&quot;: &quot;&quot;}], &quot;issued&quot;: {&quot;date-parts&quot;: [[2017]]}, &quot;DOI&quot;: &quot;10.48550/arXiv.1706.03762&quot;, &quot;type&quot;: &quot;paper-conference&quot;, &quot;title&quot;: &quot;Attention is all you need&quot;, &quot;container-title&quot;: &quot;Advances in Neural Information Processing Systems 30&quot;, &quot;page&quot;: &quot;5998-6008&quot;, &quot;id&quot;: &quot;ITEM-17a82183-4067-5f24-9b07-243be6e2ad27&quot;, &quot;container-title-short&quot;: &quot;&quot;}, &quot;isTemporary&quot;: false}]}, {&quot;citationID&quot;: &quot;MENDELEY_CITATION_b73195c3-2a95-4fd6-90c2-55e440f13a70&quot;, &quot;properties&quot;: {&quot;noteIndex&quot;: 0}, &quot;isEdited&quot;: false, &quot;manualOverride&quot;: {&quot;isManuallyOverridden&quot;: false, &quot;citeprocText&quot;: &quot;(Li et al., 2023)&quot;, &quot;manualOverrideText&quot;: &quot;&quot;}, &quot;citationItems&quot;: [{&quot;id&quot;: &quot;ITEM-ef62fa18-4b28-5ee1-a9e5-7cfba1f59cd4&quot;, &quot;itemData&quot;: {&quot;author&quot;: [{&quot;family&quot;: &quot;Li&quot;, &quot;given&quot;: &quot;Y.&quot;, &quot;parse-names&quot;: false, &quot;dropping-particle&quot;: &quot;&quot;, &quot;non-dropping-particle&quot;: &quot;&quot;}, {&quot;family&quot;: &quot;Li&quot;, &quot;given&quot;: &quot;Z.&quot;, &quot;parse-names&quot;: false, &quot;dropping-particle&quot;: &quot;&quot;, &quot;non-dropping-particle&quot;: &quot;&quot;}, {&quot;family&quot;: &quot;Zhang&quot;, &quot;given&quot;: &quot;K.&quot;, &quot;parse-names&quot;: false, &quot;dropping-particle&quot;: &quot;&quot;, &quot;non-dropping-particle&quot;: &quot;&quot;}, {&quot;family&quot;: &quot;Dan&quot;, &quot;given&quot;: &quot;R.&quot;, &quot;parse-names&quot;: false, &quot;dropping-particle&quot;: &quot;&quot;, &quot;non-dropping-particle&quot;: &quot;&quot;}, {&quot;family&quot;: &quot;Jiang&quot;, &quot;given&quot;: &quot;S.&quot;, &quot;parse-names&quot;: false, &quot;dropping-particle&quot;: &quot;&quot;, &quot;non-dropping-particle&quot;: &quot;&quot;}, {&quot;family&quot;: &quot;Zhang&quot;, &quot;given&quot;: &quot;Y.&quot;, &quot;parse-names&quot;: false, &quot;dropping-particle&quot;: &quot;&quot;, &quot;non-dropping-particle&quot;: &quot;&quot;}], &quot;issued&quot;: {&quot;date-parts&quot;: [[2023]]}, &quot;DOI&quot;: &quot;10.7759/cureus.40895&quot;, &quot;type&quot;: &quot;article-journal&quot;, &quot;title&quot;: &quot;ChatDoctor: A medical chat model fine-tuned on a large language model Meta-AI (LLaMA) using medical domain knowledge&quot;, &quot;container-title&quot;: &quot;Cureus&quot;, &quot;id&quot;: &quot;ITEM-ef62fa18-4b28-5ee1-a9e5-7cfba1f59cd4&quot;, &quot;container-title-short&quot;: &quot;&quot;}, &quot;isTemporary&quot;: false}]}, {&quot;citationID&quot;: &quot;MENDELEY_CITATION_78792325-0cfe-437b-b5ef-dd8ceb501465&quot;, &quot;properties&quot;: {&quot;noteIndex&quot;: 0}, &quot;isEdited&quot;: false, &quot;manualOverride&quot;: {&quot;isManuallyOverridden&quot;: false, &quot;citeprocText&quot;: &quot;(Zavala Guirado et al., 2024)&quot;, &quot;manualOverrideText&quot;: &quot;&quot;}, &quot;citationItems&quot;: [{&quot;id&quot;: &quot;ITEM-3f3a4849-619c-5059-b1e7-bedbf71c7f24&quot;, &quot;itemData&quot;: {&quot;author&quot;: [{&quot;family&quot;: &quot;Zavala Guirado&quot;, &quot;given&quot;: &quot;M. A.&quot;, &quot;parse-names&quot;: false, &quot;dropping-particle&quot;: &quot;&quot;, &quot;non-dropping-particle&quot;: &quot;&quot;}, {&quot;family&quot;: &quot;González Castro&quot;, &quot;given&quot;: &quot;I.&quot;, &quot;parse-names&quot;: false, &quot;dropping-particle&quot;: &quot;&quot;, &quot;non-dropping-particle&quot;: &quot;&quot;}, {&quot;family&quot;: &quot;Tapia Ruelas&quot;, &quot;given&quot;: &quot;C. S.&quot;, &quot;parse-names&quot;: false, &quot;dropping-particle&quot;: &quot;&quot;, &quot;non-dropping-particle&quot;: &quot;&quot;}, {&quot;family&quot;: &quot;Cota Valenzuela&quot;, &quot;given&quot;: &quot;L. V.&quot;, &quot;parse-names&quot;: false, &quot;dropping-particle&quot;: &quot;&quot;, &quot;non-dropping-particle&quot;: &quot;&quot;}, {&quot;family&quot;: &quot;Durón Ramos&quot;, &quot;given&quot;: &quot;M. F.&quot;, &quot;parse-names&quot;: false, &quot;dropping-particle&quot;: &quot;&quot;, &quot;non-dropping-particle&quot;: &quot;&quot;}], &quot;issued&quot;: {&quot;date-parts&quot;: [[2024]]}, &quot;DOI&quot;: &quot;10.23913/ride.v14i28.1878&quot;, &quot;type&quot;: &quot;article-journal&quot;, &quot;title&quot;: &quot;Propiedades psicométricas de una escala para medir la práctica docente universitaria en la modalidad híbrida&quot;, &quot;container-title&quot;: &quot;RIDE Revista Iberoamericana para la Investigación y el Desarrollo Educativo&quot;, &quot;volume&quot;: &quot;14&quot;, &quot;issue&quot;: &quot;28&quot;, &quot;id&quot;: &quot;ITEM-3f3a4849-619c-5059-b1e7-bedbf71c7f24&quot;, &quot;container-title-short&quot;: &quot;&quot;}, &quot;isTemporary&quot;: false}]}, {&quot;citationID&quot;: &quot;MENDELEY_CITATION_356c1fea-a54c-4c66-bc02-7335041c9701&quot;, &quot;properties&quot;: {&quot;noteIndex&quot;: 0}, &quot;isEdited&quot;: false, &quot;manualOverride&quot;: {&quot;isManuallyOverridden&quot;: false, &quot;citeprocText&quot;: &quot;(Chen y Guestrin, 2016)&quot;, &quot;manualOverrideText&quot;: &quot;&quot;}, &quot;citationItems&quot;: [{&quot;id&quot;: &quot;ITEM-15e61581-e955-52e7-b4fe-e53c650c3a2c&quot;, &quot;itemData&quot;: {&quot;author&quot;: [{&quot;family&quot;: &quot;Chen&quot;, &quot;given&quot;: &quot;T.&quot;, &quot;parse-names&quot;: false, &quot;dropping-particle&quot;: &quot;&quot;, &quot;non-dropping-particle&quot;: &quot;&quot;}, {&quot;family&quot;: &quot;Guestrin&quot;, &quot;given&quot;: &quot;C.&quot;, &quot;parse-names&quot;: false, &quot;dropping-particle&quot;: &quot;&quot;, &quot;non-dropping-particle&quot;: &quot;&quot;}], &quot;issued&quot;: {&quot;date-parts&quot;: [[2016]]}, &quot;DOI&quot;: &quot;10.1145/2939672.2939785&quot;, &quot;type&quot;: &quot;paper-conference&quot;, &quot;title&quot;: &quot;XGBoost: A scalable tree boosting system&quot;, &quot;container-title&quot;: &quot;Proceedings of the 22nd ACM SIGKDD International Conference on Knowledge Discovery and Data Mining&quot;, &quot;page&quot;: &quot;785-794&quot;, &quot;id&quot;: &quot;ITEM-15e61581-e955-52e7-b4fe-e53c650c3a2c&quot;, &quot;container-title-short&quot;: &quot;&quot;}, &quot;isTemporary&quot;: false}]}, {&quot;citationID&quot;: &quot;MENDELEY_CITATION_f89f2764-e227-44f1-ac90-561ea047c012&quot;, &quot;properties&quot;: {&quot;noteIndex&quot;: 0}, &quot;isEdited&quot;: false, &quot;manualOverride&quot;: {&quot;isManuallyOverridden&quot;: false, &quot;citeprocText&quot;: &quot;(Chen y Guestrin, 2016)&quot;, &quot;manualOverrideText&quot;: &quot;&quot;}, &quot;citationItems&quot;: [{&quot;id&quot;: &quot;ITEM-15e61581-e955-52e7-b4fe-e53c650c3a2c&quot;, &quot;itemData&quot;: {&quot;author&quot;: [{&quot;family&quot;: &quot;Chen&quot;, &quot;given&quot;: &quot;T.&quot;, &quot;parse-names&quot;: false, &quot;dropping-particle&quot;: &quot;&quot;, &quot;non-dropping-particle&quot;: &quot;&quot;}, {&quot;family&quot;: &quot;Guestrin&quot;, &quot;given&quot;: &quot;C.&quot;, &quot;parse-names&quot;: false, &quot;dropping-particle&quot;: &quot;&quot;, &quot;non-dropping-particle&quot;: &quot;&quot;}], &quot;issued&quot;: {&quot;date-parts&quot;: [[2016]]}, &quot;DOI&quot;: &quot;10.1145/2939672.2939785&quot;, &quot;type&quot;: &quot;paper-conference&quot;, &quot;title&quot;: &quot;XGBoost: A scalable tree boosting system&quot;, &quot;container-title&quot;: &quot;Proceedings of the 22nd ACM SIGKDD International Conference on Knowledge Discovery and Data Mining&quot;, &quot;page&quot;: &quot;785-794&quot;, &quot;id&quot;: &quot;ITEM-15e61581-e955-52e7-b4fe-e53c650c3a2c&quot;, &quot;container-title-short&quot;: &quot;&quot;}, &quot;isTemporary&quot;: false}]}, {&quot;citationID&quot;: &quot;MENDELEY_CITATION_1aa1d877-795e-41f0-80db-a1d7e2a0c7d1&quot;, &quot;properties&quot;: {&quot;noteIndex&quot;: 0}, &quot;isEdited&quot;: false, &quot;manualOverride&quot;: {&quot;isManuallyOverridden&quot;: false, &quot;citeprocText&quot;: &quot;(Cen et al., 2024; Nass et al., 2023)&quot;, &quot;manualOverrideText&quot;: &quot;&quot;}, &quot;citationItems&quot;: [{&quot;id&quot;: &quot;ITEM-fbe93c5f-260c-5b04-b4bc-393ef536cf4b&quot;, &quot;itemData&quot;: {&quot;author&quot;: [{&quot;family&quot;: &quot;Cen&quot;, &quot;given&quot;: &quot;C.&quot;, &quot;parse-names&quot;: false, &quot;dropping-particle&quot;: &quot;&quot;, &quot;non-dropping-particle&quot;: &quot;&quot;}, {&quot;family&quot;: &quot;Luo&quot;, &quot;given&quot;: &quot;G.&quot;, &quot;parse-names&quot;: false, &quot;dropping-particle&quot;: &quot;&quot;, &quot;non-dropping-particle&quot;: &quot;&quot;}, {&quot;family&quot;: &quot;Tian&quot;, &quot;given&quot;: &quot;Y.&quot;, &quot;parse-names&quot;: false, &quot;dropping-particle&quot;: &quot;&quot;, &quot;non-dropping-particle&quot;: &quot;&quot;}, {&quot;family&quot;: &quot;Fu&quot;, &quot;given&quot;: &quot;B.&quot;, &quot;parse-names&quot;: false, &quot;dropping-particle&quot;: &quot;&quot;, &quot;non-dropping-particle&quot;: &quot;&quot;}, {&quot;family&quot;: &quot;Chen&quot;, &quot;given&quot;: &quot;Y.&quot;, &quot;parse-names&quot;: false, &quot;dropping-particle&quot;: &quot;&quot;, &quot;non-dropping-particle&quot;: &quot;&quot;}, {&quot;family&quot;: &quot;Huang&quot;, &quot;given&quot;: &quot;S.&quot;, &quot;parse-names&quot;: false, &quot;dropping-particle&quot;: &quot;&quot;, &quot;non-dropping-particle&quot;: &quot;&quot;}, {&quot;family&quot;: &quot;Jiang&quot;, &quot;given&quot;: &quot;T.&quot;, &quot;parse-names&quot;: false, &quot;dropping-particle&quot;: &quot;&quot;, &quot;non-dropping-particle&quot;: &quot;&quot;}, {&quot;family&quot;: &quot;Huang&quot;, &quot;given&quot;: &quot;G.&quot;, &quot;parse-names&quot;: false, &quot;dropping-particle&quot;: &quot;&quot;, &quot;non-dropping-particle&quot;: &quot;&quot;}], &quot;issued&quot;: {&quot;date-parts&quot;: [[2024]]}, &quot;DOI&quot;: &quot;10.1057/s41599-024-03537-w&quot;, &quot;type&quot;: &quot;article-journal&quot;, &quot;title&quot;: &quot;Enhancing the dissemination of Cantonese Opera among youth via Bilibili: A study on intangible cultural heritage transmission&quot;, &quot;container-title&quot;: &quot;Humanities and Social Sciences Communications&quot;, &quot;volume&quot;: &quot;11&quot;, &quot;issue&quot;: &quot;1&quot;, &quot;page&quot;: &quot;1038&quot;, &quot;id&quot;: &quot;ITEM-fbe93c5f-260c-5b04-b4bc-393ef536cf4b&quot;, &quot;container-title-short&quot;: &quot;&quot;}, &quot;isTemporary&quot;: false}, {&quot;id&quot;: &quot;ITEM-b9bb7734-2112-5534-b5a9-0ea79b3bd04f&quot;, &quot;itemData&quot;: {&quot;author&quot;: [{&quot;family&quot;: &quot;Nass&quot;, &quot;given&quot;: &quot;O.&quot;, &quot;parse-names&quot;: false, &quot;dropping-particle&quot;: &quot;&quot;, &quot;non-dropping-particle&quot;: &quot;&quot;}, {&quot;family&quot;: &quot;Skuliabina&quot;, &quot;given&quot;: &quot;O.&quot;, &quot;parse-names&quot;: false, &quot;dropping-particle&quot;: &quot;&quot;, &quot;non-dropping-particle&quot;: &quot;&quot;}, {&quot;family&quot;: &quot;Bapiyev&quot;, &quot;given&quot;: &quot;I.&quot;, &quot;parse-names&quot;: false, &quot;dropping-particle&quot;: &quot;&quot;, &quot;non-dropping-particle&quot;: &quot;&quot;}, {&quot;family&quot;: &quot;Dnekeshev&quot;, &quot;given&quot;: &quot;A.&quot;, &quot;parse-names&quot;: false, &quot;dropping-particle&quot;: &quot;&quot;, &quot;non-dropping-particle&quot;: &quot;&quot;}, {&quot;family&quot;: &quot;Bekenova&quot;, &quot;given&quot;: &quot;S.&quot;, &quot;parse-names&quot;: false, &quot;dropping-particle&quot;: &quot;&quot;, &quot;non-dropping-particle&quot;: &quot;&quot;}, {&quot;family&quot;: &quot;Bekenova&quot;, &quot;given&quot;: &quot;A.&quot;, &quot;parse-names&quot;: false, &quot;dropping-particle&quot;: &quot;&quot;, &quot;non-dropping-particle&quot;: &quot;&quot;}], &quot;issued&quot;: {&quot;date-parts&quot;: [[2023]]}, &quot;DOI&quot;: &quot;10.1051/e3sconf/202338908003&quot;, &quot;type&quot;: &quot;article-journal&quot;, &quot;title&quot;: &quot;Blended learning as a promising direction of informatization of higher education&quot;, &quot;container-title&quot;: &quot;E3S Web of Conferences&quot;, &quot;volume&quot;: &quot;389&quot;, &quot;page&quot;: &quot;08003&quot;, &quot;id&quot;: &quot;ITEM-b9bb7734-2112-5534-b5a9-0ea79b3bd04f&quot;, &quot;container-title-short&quot;: &quot;&quot;}, &quot;isTemporary&quot;: false}]}, {&quot;citationID&quot;: &quot;MENDELEY_CITATION_0632e7d9-6b5d-4637-9ee9-e57c77722f5f&quot;, &quot;properties&quot;: {&quot;noteIndex&quot;: 0}, &quot;isEdited&quot;: false, &quot;manualOverride&quot;: {&quot;isManuallyOverridden&quot;: false, &quot;citeprocText&quot;: &quot;(Kung et al., 2023)&quot;, &quot;manualOverrideText&quot;: &quot;&quot;}, &quot;citationItems&quot;: [{&quot;id&quot;: &quot;ITEM-99395dc7-3112-55c2-b534-aefba14e6965&quot;, &quot;itemData&quot;: {&quot;author&quot;: [{&quot;family&quot;: &quot;Kung&quot;, &quot;given&quot;: &quot;T. H.&quot;, &quot;parse-names&quot;: false, &quot;dropping-particle&quot;: &quot;&quot;, &quot;non-dropping-particle&quot;: &quot;&quot;}, {&quot;family&quot;: &quot;Cheatham&quot;, &quot;given&quot;: &quot;M.&quot;, &quot;parse-names&quot;: false, &quot;dropping-particle&quot;: &quot;&quot;, &quot;non-dropping-particle&quot;: &quot;&quot;}, {&quot;family&quot;: &quot;Medenilla&quot;, &quot;given&quot;: &quot;A.&quot;, &quot;parse-names&quot;: false, &quot;dropping-particle&quot;: &quot;&quot;, &quot;non-dropping-particle&quot;: &quot;&quot;}, {&quot;family&quot;: &quot;Sillos&quot;, &quot;given&quot;: &quot;C.&quot;, &quot;parse-names&quot;: false, &quot;dropping-particle&quot;: &quot;&quot;, &quot;non-dropping-particle&quot;: &quot;&quot;}, {&quot;family&quot;: &quot;De Leon&quot;, &quot;given&quot;: &quot;L.&quot;, &quot;parse-names&quot;: false, &quot;dropping-particle&quot;: &quot;&quot;, &quot;non-dropping-particle&quot;: &quot;&quot;}, {&quot;family&quot;: &quot;Elepaño&quot;, &quot;given&quot;: &quot;C.&quot;, &quot;parse-names&quot;: false, &quot;dropping-particle&quot;: &quot;&quot;, &quot;non-dropping-particle&quot;: &quot;&quot;}, {&quot;family&quot;: &quot;Madriaga&quot;, &quot;given&quot;: &quot;M.&quot;, &quot;parse-names&quot;: false, &quot;dropping-particle&quot;: &quot;&quot;, &quot;non-dropping-particle&quot;: &quot;&quot;}, {&quot;family&quot;: &quot;Aggabao&quot;, &quot;given&quot;: &quot;R.&quot;, &quot;parse-names&quot;: false, &quot;dropping-particle&quot;: &quot;&quot;, &quot;non-dropping-particle&quot;: &quot;&quot;}, {&quot;family&quot;: &quot;Diaz-Candido&quot;, &quot;given&quot;: &quot;G.&quot;, &quot;parse-names&quot;: false, &quot;dropping-particle&quot;: &quot;&quot;, &quot;non-dropping-particle&quot;: &quot;&quot;}, {&quot;family&quot;: &quot;Maningo&quot;, &quot;given&quot;: &quot;J.&quot;, &quot;parse-names&quot;: false, &quot;dropping-particle&quot;: &quot;&quot;, &quot;non-dropping-particle&quot;: &quot;&quot;}, {&quot;family&quot;: &quot;Tseng&quot;, &quot;given&quot;: &quot;V.&quot;, &quot;parse-names&quot;: false, &quot;dropping-particle&quot;: &quot;&quot;, &quot;non-dropping-particle&quot;: &quot;&quot;}], &quot;issued&quot;: {&quot;date-parts&quot;: [[2023]]}, &quot;DOI&quot;: &quot;10.1371/journal.pdig.0000198&quot;, &quot;type&quot;: &quot;article-journal&quot;, &quot;title&quot;: &quot;Performance of ChatGPT on USMLE: Potential for AI-assisted medical education using large language models&quot;, &quot;container-title&quot;: &quot;PLOS Digital Health&quot;, &quot;volume&quot;: &quot;2&quot;, &quot;issue&quot;: &quot;2&quot;, &quot;page&quot;: &quot;e0000198&quot;, &quot;id&quot;: &quot;ITEM-99395dc7-3112-55c2-b534-aefba14e6965&quot;, &quot;container-title-short&quot;: &quot;&quot;}, &quot;isTemporary&quot;: false}]}, {&quot;citationID&quot;: &quot;MENDELEY_CITATION_cfac2018-6df3-4920-9dad-8f265149d08f&quot;, &quot;properties&quot;: {&quot;noteIndex&quot;: 0}, &quot;isEdited&quot;: false, &quot;manualOverride&quot;: {&quot;isManuallyOverridden&quot;: false, &quot;citeprocText&quot;: &quot;(Fernández et al., 2025; Navarro Forero et al., 2025)&quot;, &quot;manualOverrideText&quot;: &quot;&quot;}, &quot;citationItems&quot;: [{&quot;id&quot;: &quot;ITEM-6e797b0e-8270-559d-850f-c5042d0b3d16&quot;, &quot;itemData&quot;: {&quot;author&quot;: [{&quot;family&quot;: &quot;Fernández&quot;, &quot;given&quot;: &quot;J. M.&quot;, &quot;parse-names&quot;: false, &quot;dropping-particle&quot;: &quot;&quot;, &quot;non-dropping-particle&quot;: &quot;&quot;}, {&quot;family&quot;: &quot;Petrocelli&quot;, &quot;given&quot;: &quot;D. M.&quot;, &quot;parse-names&quot;: false, &quot;dropping-particle&quot;: &quot;&quot;, &quot;non-dropping-particle&quot;: &quot;&quot;}, {&quot;family&quot;: &quot;Matuk&quot;, &quot;given&quot;: &quot;R.&quot;, &quot;parse-names&quot;: false, &quot;dropping-particle&quot;: &quot;&quot;, &quot;non-dropping-particle&quot;: &quot;&quot;}, {&quot;family&quot;: &quot;Lanson&quot;, &quot;given&quot;: &quot;D.&quot;, &quot;parse-names&quot;: false, &quot;dropping-particle&quot;: &quot;&quot;, &quot;non-dropping-particle&quot;: &quot;&quot;}, {&quot;family&quot;: &quot;Zamudio&quot;, &quot;given&quot;: &quot;E.&quot;, &quot;parse-names&quot;: false, &quot;dropping-particle&quot;: &quot;&quot;, &quot;non-dropping-particle&quot;: &quot;&quot;}, {&quot;family&quot;: &quot;Cagnina&quot;, &quot;given&quot;: &quot;L. C.&quot;, &quot;parse-names&quot;: false, &quot;dropping-particle&quot;: &quot;&quot;, &quot;non-dropping-particle&quot;: &quot;&quot;}, {&quot;family&quot;: &quot;Gil Costa&quot;, &quot;given&quot;: &quot;G. V.&quot;, &quot;parse-names&quot;: false, &quot;dropping-particle&quot;: &quot;&quot;, &quot;non-dropping-particle&quot;: &quot;&quot;}, {&quot;family&quot;: &quot;Errecalde&quot;, &quot;given&quot;: &quot;M. L.&quot;, &quot;parse-names&quot;: false, &quot;dropping-particle&quot;: &quot;&quot;, &quot;non-dropping-particle&quot;: &quot;&quot;}], &quot;issued&quot;: {&quot;date-parts&quot;: [[2025]]}, &quot;URL&quot;: &quot;http://sedici.unlp.edu.ar/handle/10915/183892&quot;, &quot;type&quot;: &quot;paper-conference&quot;, &quot;title&quot;: &quot;Fine-tuning y adaptación de modelos de lenguaje abiertos en infraestructura HPC para aplicaciones de dominio específico&quot;, &quot;container-title&quot;: &quot;Libro de actas del XXVII Workshop de Investigadores en Ciencias de la Computación&quot;, &quot;page&quot;: &quot;72-76&quot;, &quot;publisher&quot;: &quot;Red de Universidades con Carreras en Informática&quot;, &quot;id&quot;: &quot;ITEM-6e797b0e-8270-559d-850f-c5042d0b3d16&quot;, &quot;container-title-short&quot;: &quot;&quot;}, &quot;isTemporary&quot;: false}, {&quot;id&quot;: &quot;ITEM-559494bb-9754-5dfe-91e6-ccf0c9ae12dc&quot;, &quot;itemData&quot;: {&quot;author&quot;: [{&quot;family&quot;: &quot;Navarro Forero&quot;, &quot;given&quot;: &quot;C. A.&quot;, &quot;parse-names&quot;: false, &quot;dropping-particle&quot;: &quot;&quot;, &quot;non-dropping-particle&quot;: &quot;&quot;}, {&quot;family&quot;: &quot;Hernández&quot;, &quot;given&quot;: &quot;M. A.&quot;, &quot;parse-names&quot;: false, &quot;dropping-particle&quot;: &quot;&quot;, &quot;non-dropping-particle&quot;: &quot;&quot;}, {&quot;family&quot;: &quot;Viloria&quot;, &quot;given&quot;: &quot;K. T.&quot;, &quot;parse-names&quot;: false, &quot;dropping-particle&quot;: &quot;&quot;, &quot;non-dropping-particle&quot;: &quot;&quot;}], &quot;issued&quot;: {&quot;date-parts&quot;: [[2025]]}, &quot;DOI&quot;: &quot;10.26507/paper.4223&quot;, &quot;type&quot;: &quot;paper-conference&quot;, &quot;title&quot;: &quot;Nuevas rutas de aprendizaje: adaptación de contenidos académicos a formatos audiovisuales para mejorar la preparación de los estudiantes&quot;, &quot;container-title&quot;: &quot;Encuentro Internacional de Educación en Ingeniería&quot;, &quot;publisher&quot;: &quot;Asociación Colombiana de Facultades de Ingeniería&quot;, &quot;id&quot;: &quot;ITEM-559494bb-9754-5dfe-91e6-ccf0c9ae12dc&quot;, &quot;container-title-short&quot;: &quot;&quot;}, &quot;isTemporary&quot;: false}]}, {&quot;citationID&quot;: &quot;MENDELEY_CITATION_7d98613c-23ce-4701-a09f-addd0e41f5bd&quot;, &quot;properties&quot;: {&quot;noteIndex&quot;: 0}, &quot;isEdited&quot;: false, &quot;manualOverride&quot;: {&quot;isManuallyOverridden&quot;: true, &quot;citeprocText&quot;: &quot;(Cisneros-Bravo et al., 2023)&quot;, &quot;manualOverrideText&quot;: &quot;Cisneros-Bravo et al. (2023)&quot;}, &quot;citationItems&quot;: [{&quot;id&quot;: &quot;ITEM-2c1f70fd-8745-538a-b99f-18d256f44b4f&quot;, &quot;itemData&quot;: {&quot;author&quot;: [{&quot;family&quot;: &quot;Cisneros-Bravo&quot;, &quot;given&quot;: &quot;B. E.&quot;, &quot;parse-names&quot;: false, &quot;dropping-particle&quot;: &quot;&quot;, &quot;non-dropping-particle&quot;: &quot;&quot;}, {&quot;family&quot;: &quot;Rodríguez-Aguilar&quot;, &quot;given&quot;: &quot;R. M.&quot;, &quot;parse-names&quot;: false, &quot;dropping-particle&quot;: &quot;&quot;, &quot;non-dropping-particle&quot;: &quot;&quot;}, {&quot;family&quot;: &quot;Niño-Membrillo&quot;, &quot;given&quot;: &quot;Y. E.&quot;, &quot;parse-names&quot;: false, &quot;dropping-particle&quot;: &quot;&quot;, &quot;non-dropping-particle&quot;: &quot;&quot;}, {&quot;family&quot;: &quot;Cuevas-Rasgado&quot;, &quot;given&quot;: &quot;A. D.&quot;, &quot;parse-names&quot;: false, &quot;dropping-particle&quot;: &quot;&quot;, &quot;non-dropping-particle&quot;: &quot;&quot;}], &quot;issued&quot;: {&quot;date-parts&quot;: [[2023]]}, &quot;DOI&quot;: &quot;10.23913/ride.v14i27.1715&quot;, &quot;type&quot;: &quot;article-journal&quot;, &quot;title&quot;: &quot;Falta de orientación vocacional como factor en la deserción universitaria. Caso de estudio: zona Oriente del Estado de México&quot;, &quot;container-title&quot;: &quot;RIDE Revista Iberoamericana para la Investigación y el Desarrollo Educativo&quot;, &quot;volume&quot;: &quot;14&quot;, &quot;issue&quot;: &quot;27&quot;, &quot;id&quot;: &quot;ITEM-2c1f70fd-8745-538a-b99f-18d256f44b4f&quot;, &quot;container-title-short&quot;: &quot;&quot;}, &quot;isTemporary&quot;: false}]}, {&quot;citationID&quot;: &quot;MENDELEY_CITATION_9537810d-0339-454b-8610-59db2ef28063&quot;, &quot;properties&quot;: {&quot;noteIndex&quot;: 0}, &quot;isEdited&quot;: false, &quot;manualOverride&quot;: {&quot;isManuallyOverridden&quot;: true, &quot;citeprocText&quot;: &quot;(Alejandro Jaramillo, 2024)&quot;, &quot;manualOverrideText&quot;: &quot;Alejandro Jaramillo (2024)&quot;}, &quot;citationItems&quot;: [{&quot;id&quot;: &quot;ITEM-48bd420c-bbe4-5e36-8528-5e5a4a98c378&quot;, &quot;itemData&quot;: {&quot;author&quot;: [{&quot;family&quot;: &quot;Alejandro Jaramillo&quot;, &quot;given&quot;: &quot;S. Y.&quot;, &quot;parse-names&quot;: false, &quot;dropping-particle&quot;: &quot;&quot;, &quot;non-dropping-particle&quot;: &quot;&quot;}], &quot;issued&quot;: {&quot;date-parts&quot;: [[2024]]}, &quot;DOI&quot;: &quot;10.29394/scientific.issn.2542-2987.2024.9.34.13.285-300&quot;, &quot;type&quot;: &quot;article-journal&quot;, &quot;title&quot;: &quot;Orientación vocacional y profesional: la inteligencia artificial y su impacto en la educación&quot;, &quot;container-title&quot;: &quot;Revista Scientific&quot;, &quot;volume&quot;: &quot;9&quot;, &quot;issue&quot;: &quot;34&quot;, &quot;page&quot;: &quot;285-300&quot;, &quot;id&quot;: &quot;ITEM-48bd420c-bbe4-5e36-8528-5e5a4a98c378&quot;, &quot;container-title-short&quot;: &quot;&quot;}, &quot;isTemporary&quot;: false}]}, {&quot;citationID&quot;: &quot;MENDELEY_CITATION_ad14c52c-14f9-4514-b30b-679146e4e68b&quot;, &quot;properties&quot;: {&quot;noteIndex&quot;: 0}, &quot;isEdited&quot;: false, &quot;manualOverride&quot;: {&quot;isManuallyOverridden&quot;: false, &quot;citeprocText&quot;: &quot;(Flores Meléndez et al., 2020)&quot;, &quot;manualOverrideText&quot;: &quot;&quot;}, &quot;citationItems&quot;: [{&quot;id&quot;: &quot;ITEM-25516478-e44c-5fcc-bc7e-03c8c680ebf5&quot;, &quot;itemData&quot;: {&quot;author&quot;: [{&quot;family&quot;: &quot;Flores Meléndez&quot;, &quot;given&quot;: &quot;M.&quot;, &quot;parse-names&quot;: false, &quot;dropping-particle&quot;: &quot;&quot;, &quot;non-dropping-particle&quot;: &quot;&quot;}, {&quot;family&quot;: &quot;Góngora Cortés&quot;, &quot;given&quot;: &quot;J. J.&quot;, &quot;parse-names&quot;: false, &quot;dropping-particle&quot;: &quot;&quot;, &quot;non-dropping-particle&quot;: &quot;&quot;}, {&quot;family&quot;: &quot;López Cabrera&quot;, &quot;given&quot;: &quot;M. V.&quot;, &quot;parse-names&quot;: false, &quot;dropping-particle&quot;: &quot;&quot;, &quot;non-dropping-particle&quot;: &quot;&quot;}, {&quot;family&quot;: &quot;Eraña Rojas&quot;, &quot;given&quot;: &quot;I. E.&quot;, &quot;parse-names&quot;: false, &quot;dropping-particle&quot;: &quot;&quot;, &quot;non-dropping-particle&quot;: &quot;&quot;}], &quot;issued&quot;: {&quot;date-parts&quot;: [[2020]]}, &quot;DOI&quot;: &quot;10.1016/j.edumed.2018.11.008&quot;, &quot;type&quot;: &quot;article-journal&quot;, &quot;title&quot;: &quot;The «call» of medicine. Use of new mentoring models for vocational orientation&quot;, &quot;container-title&quot;: &quot;Educación Médica&quot;, &quot;volume&quot;: &quot;21&quot;, &quot;issue&quot;: &quot;2&quot;, &quot;page&quot;: &quot;145-148&quot;, &quot;id&quot;: &quot;ITEM-25516478-e44c-5fcc-bc7e-03c8c680ebf5&quot;, &quot;container-title-short&quot;: &quot;&quot;}, &quot;isTemporary&quot;: false}]}, {&quot;citationID&quot;: &quot;MENDELEY_CITATION_56df8b42-c652-4637-b419-53e6273e1e8c&quot;, &quot;properties&quot;: {&quot;noteIndex&quot;: 0}, &quot;isEdited&quot;: false, &quot;manualOverride&quot;: {&quot;isManuallyOverridden&quot;: false, &quot;citeprocText&quot;: &quot;(Yupanqui Sanchez, 2024)&quot;, &quot;manualOverrideText&quot;: &quot;&quot;}, &quot;citationItems&quot;: [{&quot;id&quot;: &quot;ITEM-41aff42e-02f9-5cf8-bac7-1a6378feb8f5&quot;, &quot;itemData&quot;: {&quot;author&quot;: [{&quot;family&quot;: &quot;Yupanqui Sanchez&quot;, &quot;given&quot;: &quot;L. A.&quot;, &quot;parse-names&quot;: false, &quot;dropping-particle&quot;: &quot;&quot;, &quot;non-dropping-particle&quot;: &quot;&quot;}], &quot;issued&quot;: {&quot;date-parts&quot;: [[2024]]}, &quot;URL&quot;: &quot;https://repositorio.une.edu.pe/server/api/core/bitstreams/0a198466-0baf-4299-897b-90a22a49c958/content&quot;, &quot;type&quot;: &quot;thesis&quot;, &quot;title&quot;: &quot;Perfil del egresado y la formación profesional en estudiantes del último año de arquitectura de la Universidad Femenina del Sagrado Corazón, 2020&quot;, &quot;genre&quot;: &quot;Tesis de maestría&quot;, &quot;publisher&quot;: &quot;Universidad Nacional de Educación Enrique Guzmán y Valle&quot;, &quot;id&quot;: &quot;ITEM-41aff42e-02f9-5cf8-bac7-1a6378feb8f5&quot;, &quot;container-title-short&quot;: &quot;&quot;}, &quot;isTemporary&quot;: false}]}, {&quot;citationID&quot;: &quot;MENDELEY_CITATION_9fca19a1-c0e8-45ab-b631-614ff82a11f4&quot;, &quot;properties&quot;: {&quot;noteIndex&quot;: 0}, &quot;isEdited&quot;: false, &quot;manualOverride&quot;: {&quot;isManuallyOverridden&quot;: false, &quot;citeprocText&quot;: &quot;(Aguilar-Reyes et al., 2025)&quot;, &quot;manualOverrideText&quot;: &quot;&quot;}, &quot;citationItems&quot;: [{&quot;id&quot;: &quot;ITEM-8c9c99df-1678-5fab-b737-85f1e9842ee2&quot;, &quot;itemData&quot;: {&quot;author&quot;: [{&quot;family&quot;: &quot;Aguilar-Reyes&quot;, &quot;given&quot;: &quot;J. E.&quot;, &quot;parse-names&quot;: false, &quot;dropping-particle&quot;: &quot;&quot;, &quot;non-dropping-particle&quot;: &quot;&quot;}, {&quot;family&quot;: &quot;Mejía-Peñafiel&quot;, &quot;given&quot;: &quot;E. F.&quot;, &quot;parse-names&quot;: false, &quot;dropping-particle&quot;: &quot;&quot;, &quot;non-dropping-particle&quot;: &quot;&quot;}, {&quot;family&quot;: &quot;Morocho-Barrionuevo&quot;, &quot;given&quot;: &quot;T. P.&quot;, &quot;parse-names&quot;: false, &quot;dropping-particle&quot;: &quot;&quot;, &quot;non-dropping-particle&quot;: &quot;&quot;}, {&quot;family&quot;: &quot;Velasco-Castelo&quot;, &quot;given&quot;: &quot;G.-M.&quot;, &quot;parse-names&quot;: false, &quot;dropping-particle&quot;: &quot;&quot;, &quot;non-dropping-particle&quot;: &quot;&quot;}], &quot;issued&quot;: {&quot;date-parts&quot;: [[2025]]}, &quot;DOI&quot;: &quot;10.36390/telos271.08&quot;, &quot;type&quot;: &quot;article-journal&quot;, &quot;title&quot;: &quot;Estudio del rendimiento académico mediante la comparación de modelos de regresión y árboles de clasificación&quot;, &quot;container-title&quot;: &quot;Telos: Revista de Estudios Interdisciplinarios en Ciencias Sociales&quot;, &quot;volume&quot;: &quot;27&quot;, &quot;issue&quot;: &quot;1&quot;, &quot;page&quot;: &quot;94-115&quot;, &quot;id&quot;: &quot;ITEM-8c9c99df-1678-5fab-b737-85f1e9842ee2&quot;, &quot;container-title-short&quot;: &quot;&quot;}, &quot;isTemporary&quot;: false}]}, {&quot;citationID&quot;: &quot;MENDELEY_CITATION_67ffa1a1-2566-48b6-9698-2d1cdd7750c0&quot;, &quot;properties&quot;: {&quot;noteIndex&quot;: 0}, &quot;isEdited&quot;: false, &quot;manualOverride&quot;: {&quot;isManuallyOverridden&quot;: false, &quot;citeprocText&quot;: &quot;(Muñoz Pilozo et al., 2024; Sabando Moreira y Zambrano Montenegro, 2024)&quot;, &quot;manualOverrideText&quot;: &quot;&quot;}, &quot;citationItems&quot;: [{&quot;id&quot;: &quot;ITEM-61284f77-93cc-5f63-a665-e96ce95b70b6&quot;, &quot;itemData&quot;: {&quot;author&quot;: [{&quot;family&quot;: &quot;Muñoz Pilozo&quot;, &quot;given&quot;: &quot;A. G.&quot;, &quot;parse-names&quot;: false, &quot;dropping-particle&quot;: &quot;&quot;, &quot;non-dropping-particle&quot;: &quot;&quot;}, {&quot;family&quot;: &quot;Villalva Pilozo&quot;, &quot;given&quot;: &quot;A. M.&quot;, &quot;parse-names&quot;: false, &quot;dropping-particle&quot;: &quot;&quot;, &quot;non-dropping-particle&quot;: &quot;&quot;}, {&quot;family&quot;: &quot;Medina Castro&quot;, &quot;given&quot;: &quot;A. R.&quot;, &quot;parse-names&quot;: false, &quot;dropping-particle&quot;: &quot;&quot;, &quot;non-dropping-particle&quot;: &quot;&quot;}, {&quot;family&quot;: &quot;Pilozo Mendoza&quot;, &quot;given&quot;: &quot;J. J.&quot;, &quot;parse-names&quot;: false, &quot;dropping-particle&quot;: &quot;&quot;, &quot;non-dropping-particle&quot;: &quot;&quot;}], &quot;issued&quot;: {&quot;date-parts&quot;: [[2024]]}, &quot;DOI&quot;: &quot;10.29394/scientific.issn.2542-2987.2024.9.33.2.45-63&quot;, &quot;type&quot;: &quot;article-journal&quot;, &quot;title&quot;: &quot;Factores determinantes en el éxito del proceso de enseñanza-aprendizaje&quot;, &quot;container-title&quot;: &quot;Revista Scientific&quot;, &quot;volume&quot;: &quot;9&quot;, &quot;issue&quot;: &quot;33&quot;, &quot;page&quot;: &quot;45-63&quot;, &quot;id&quot;: &quot;ITEM-61284f77-93cc-5f63-a665-e96ce95b70b6&quot;, &quot;container-title-short&quot;: &quot;&quot;}, &quot;isTemporary&quot;: false}, {&quot;id&quot;: &quot;ITEM-a0688692-4e9a-5603-b80c-d3a280f7095d&quot;, &quot;itemData&quot;: {&quot;author&quot;: [{&quot;family&quot;: &quot;Sabando Moreira&quot;, &quot;given&quot;: &quot;P. A.&quot;, &quot;parse-names&quot;: false, &quot;dropping-particle&quot;: &quot;&quot;, &quot;non-dropping-particle&quot;: &quot;&quot;}, {&quot;family&quot;: &quot;Zambrano Montenegro&quot;, &quot;given&quot;: &quot;D. F.&quot;, &quot;parse-names&quot;: false, &quot;dropping-particle&quot;: &quot;&quot;, &quot;non-dropping-particle&quot;: &quot;&quot;}], &quot;issued&quot;: {&quot;date-parts&quot;: [[2024]]}, &quot;DOI&quot;: &quot;10.60100/rcmg.v5i2.245&quot;, &quot;type&quot;: &quot;article-journal&quot;, &quot;title&quot;: &quot;Técnicas de machine learning para predecir la deserción estudiantil universitaria: una revisión sistemática de la literatura&quot;, &quot;container-title&quot;: &quot;Revista Científica Multidisciplinar G-nerando&quot;, &quot;volume&quot;: &quot;5&quot;, &quot;issue&quot;: &quot;2&quot;, &quot;page&quot;: &quot;997-1023&quot;, &quot;id&quot;: &quot;ITEM-a0688692-4e9a-5603-b80c-d3a280f7095d&quot;, &quot;container-title-short&quot;: &quot;&quot;}, &quot;isTemporary&quot;: false}]}, {&quot;citationID&quot;: &quot;MENDELEY_CITATION_08ad9150-0350-47dc-8cca-6469e9667af8&quot;, &quot;properties&quot;: {&quot;noteIndex&quot;: 0}, &quot;isEdited&quot;: false, &quot;manualOverride&quot;: {&quot;isManuallyOverridden&quot;: false, &quot;citeprocText&quot;: &quot;(Jardón Gallegos et al., 2024)&quot;, &quot;manualOverrideText&quot;: &quot;&quot;}, &quot;citationItems&quot;: [{&quot;id&quot;: &quot;ITEM-32cbb7b1-4322-555e-b4d5-de0a8016f45b&quot;, &quot;itemData&quot;: {&quot;author&quot;: [{&quot;family&quot;: &quot;Jardón Gallegos&quot;, &quot;given&quot;: &quot;M. del C.&quot;, &quot;parse-names&quot;: false, &quot;dropping-particle&quot;: &quot;&quot;, &quot;non-dropping-particle&quot;: &quot;&quot;}, {&quot;family&quot;: &quot;Granizo Malusin&quot;, &quot;given&quot;: &quot;J. H.&quot;, &quot;parse-names&quot;: false, &quot;dropping-particle&quot;: &quot;&quot;, &quot;non-dropping-particle&quot;: &quot;&quot;}, {&quot;family&quot;: &quot;Yaselga Auz&quot;, &quot;given&quot;: &quot;W. F.&quot;, &quot;parse-names&quot;: false, &quot;dropping-particle&quot;: &quot;&quot;, &quot;non-dropping-particle&quot;: &quot;&quot;}, {&quot;family&quot;: &quot;Cocha Telenchana&quot;, &quot;given&quot;: &quot;M. G.&quot;, &quot;parse-names&quot;: false, &quot;dropping-particle&quot;: &quot;&quot;, &quot;non-dropping-particle&quot;: &quot;&quot;}], &quot;issued&quot;: {&quot;date-parts&quot;: [[2024]]}, &quot;DOI&quot;: &quot;10.59814/resofro.2024.4(4)338&quot;, &quot;type&quot;: &quot;article-journal&quot;, &quot;title&quot;: &quot;Impacto de los asistentes virtuales de inteligencia artificial en el rendimiento académico de estudiantes universitarios&quot;, &quot;container-title&quot;: &quot;Revista Social Fronteriza&quot;, &quot;volume&quot;: &quot;4&quot;, &quot;issue&quot;: &quot;4&quot;, &quot;page&quot;: &quot;e44338&quot;, &quot;id&quot;: &quot;ITEM-32cbb7b1-4322-555e-b4d5-de0a8016f45b&quot;, &quot;container-title-short&quot;: &quot;&quot;}, &quot;isTemporary&quot;: false}]}, {&quot;citationID&quot;: &quot;MENDELEY_CITATION_1466bf9d-2e91-4d09-b858-c7de752be026&quot;, &quot;properties&quot;: {&quot;noteIndex&quot;: 0}, &quot;isEdited&quot;: false, &quot;manualOverride&quot;: {&quot;isManuallyOverridden&quot;: false, &quot;citeprocText&quot;: &quot;(Escalante López et al., 2023)&quot;, &quot;manualOverrideText&quot;: &quot;&quot;}, &quot;citationItems&quot;: [{&quot;id&quot;: &quot;ITEM-04a17615-a429-5a99-899e-3433dd572883&quot;, &quot;itemData&quot;: {&quot;author&quot;: [{&quot;family&quot;: &quot;Escalante López&quot;, &quot;given&quot;: &quot;J. I.&quot;, &quot;parse-names&quot;: false, &quot;dropping-particle&quot;: &quot;&quot;, &quot;non-dropping-particle&quot;: &quot;&quot;}, {&quot;family&quot;: &quot;Medina Valderrama&quot;, &quot;given&quot;: &quot;C. J.&quot;, &quot;parse-names&quot;: false, &quot;dropping-particle&quot;: &quot;&quot;, &quot;non-dropping-particle&quot;: &quot;&quot;}, {&quot;family&quot;: &quot;Vásquez Muñoz&quot;, &quot;given&quot;: &quot;A.&quot;, &quot;parse-names&quot;: false, &quot;dropping-particle&quot;: &quot;&quot;, &quot;non-dropping-particle&quot;: &quot;&quot;}], &quot;issued&quot;: {&quot;date-parts&quot;: [[2023]]}, &quot;DOI&quot;: &quot;10.26495/rch.v7i1.2421&quot;, &quot;type&quot;: &quot;article-journal&quot;, &quot;title&quot;: &quot;La deserción universitaria: un problema no resuelto en el Perú&quot;, &quot;container-title&quot;: &quot;Hacedor - AIAPÆC&quot;, &quot;volume&quot;: &quot;7&quot;, &quot;issue&quot;: &quot;1&quot;, &quot;page&quot;: &quot;60-72&quot;, &quot;id&quot;: &quot;ITEM-04a17615-a429-5a99-899e-3433dd572883&quot;, &quot;container-title-short&quot;: &quot;&quot;}, &quot;isTemporary&quot;: false}]}, {&quot;citationID&quot;: &quot;MENDELEY_CITATION_d4cb7e29-9a59-4f7a-8d04-6e9162666c1f&quot;, &quot;properties&quot;: {&quot;noteIndex&quot;: 0}, &quot;isEdited&quot;: false, &quot;manualOverride&quot;: {&quot;isManuallyOverridden&quot;: false, &quot;citeprocText&quot;: &quot;(Rodas Zegarra de Escalante, 2024)&quot;, &quot;manualOverrideText&quot;: &quot;&quot;}, &quot;citationItems&quot;: [{&quot;id&quot;: &quot;ITEM-297823cb-c975-5def-8698-5545884294cd&quot;, &quot;itemData&quot;: {&quot;author&quot;: [{&quot;family&quot;: &quot;Rodas Zegarra de Escalante&quot;, &quot;given&quot;: &quot;A.&quot;, &quot;parse-names&quot;: false, &quot;dropping-particle&quot;: &quot;&quot;, &quot;non-dropping-particle&quot;: &quot;&quot;}], &quot;issued&quot;: {&quot;date-parts&quot;: [[2024]]}, &quot;URL&quot;: &quot;https://hdl.handle.net/20.500.12692/150276&quot;, &quot;type&quot;: &quot;thesis&quot;, &quot;title&quot;: &quot;Orientación vocacional y deserción universitaria en una universidad de Lima - 2024&quot;, &quot;genre&quot;: &quot;Tesis de maestría&quot;, &quot;publisher&quot;: &quot;Universidad César Vallejo&quot;, &quot;id&quot;: &quot;ITEM-297823cb-c975-5def-8698-5545884294cd&quot;, &quot;container-title-short&quot;: &quot;&quot;}, &quot;isTemporary&quot;: false}]}, {&quot;citationID&quot;: &quot;MENDELEY_CITATION_abd12c62-34a0-4725-904c-512b8def440e&quot;, &quot;properties&quot;: {&quot;noteIndex&quot;: 0}, &quot;isEdited&quot;: false, &quot;manualOverride&quot;: {&quot;isManuallyOverridden&quot;: true, &quot;citeprocText&quot;: &quot;(Torres-Delgado et al., 2024)&quot;, &quot;manualOverrideText&quot;: &quot;Torres-Delgado et al. (2024)&quot;}, &quot;citationItems&quot;: [{&quot;id&quot;: &quot;ITEM-803eec7d-bbb2-5fea-bb8c-5ccdb2039b68&quot;, &quot;itemData&quot;: {&quot;author&quot;: [{&quot;family&quot;: &quot;Torres-Delgado&quot;, &quot;given&quot;: &quot;G.&quot;, &quot;parse-names&quot;: false, &quot;dropping-particle&quot;: &quot;&quot;, &quot;non-dropping-particle&quot;: &quot;&quot;}, {&quot;family&quot;: &quot;Ramos-Pulido&quot;, &quot;given&quot;: &quot;S.&quot;, &quot;parse-names&quot;: false, &quot;dropping-particle&quot;: &quot;&quot;, &quot;non-dropping-particle&quot;: &quot;&quot;}, {&quot;family&quot;: &quot;Hernández-Gress&quot;, &quot;given&quot;: &quot;N.&quot;, &quot;parse-names&quot;: false, &quot;dropping-particle&quot;: &quot;&quot;, &quot;non-dropping-particle&quot;: &quot;&quot;}], &quot;issued&quot;: {&quot;date-parts&quot;: [[2024]]}, &quot;DOI&quot;: &quot;10.3390/engproc2024074074&quot;, &quot;type&quot;: &quot;article-journal&quot;, &quot;title&quot;: &quot;Satisfaction with research-based learning and academic performance by big data analysis&quot;, &quot;container-title&quot;: &quot;Engineering Proceedings&quot;, &quot;volume&quot;: &quot;74&quot;, &quot;issue&quot;: &quot;1&quot;, &quot;page&quot;: &quot;74&quot;, &quot;id&quot;: &quot;ITEM-803eec7d-bbb2-5fea-bb8c-5ccdb2039b68&quot;, &quot;container-title-short&quot;: &quot;&quot;}, &quot;isTemporary&quot;: false}]}, {&quot;citationID&quot;: &quot;MENDELEY_CITATION_55d139cd-d17c-4295-aa64-ed6faffac319&quot;, &quot;properties&quot;: {&quot;noteIndex&quot;: 0}, &quot;isEdited&quot;: false, &quot;manualOverride&quot;: {&quot;isManuallyOverridden&quot;: false, &quot;citeprocText&quot;: &quot;(Ramos-Rivera et al., 2025; Sancho Escrivá et al., 2020)&quot;, &quot;manualOverrideText&quot;: &quot;&quot;}, &quot;citationItems&quot;: [{&quot;id&quot;: &quot;ITEM-9143f651-ed9a-563c-92fe-37d934b09213&quot;, &quot;itemData&quot;: {&quot;author&quot;: [{&quot;family&quot;: &quot;Ramos-Rivera&quot;, &quot;given&quot;: &quot;R. E.&quot;, &quot;parse-names&quot;: false, &quot;dropping-particle&quot;: &quot;&quot;, &quot;non-dropping-particle&quot;: &quot;&quot;}, {&quot;family&quot;: &quot;Santana Mancilla&quot;, &quot;given&quot;: &quot;P. C.&quot;, &quot;parse-names&quot;: false, &quot;dropping-particle&quot;: &quot;&quot;, &quot;non-dropping-particle&quot;: &quot;&quot;}, {&quot;family&quot;: &quot;García-Mancilla&quot;, &quot;given&quot;: &quot;J.&quot;, &quot;parse-names&quot;: false, &quot;dropping-particle&quot;: &quot;&quot;, &quot;non-dropping-particle&quot;: &quot;&quot;}, {&quot;family&quot;: &quot;Gaytán-Lugo&quot;, &quot;given&quot;: &quot;L. S.&quot;, &quot;parse-names&quot;: false, &quot;dropping-particle&quot;: &quot;&quot;, &quot;non-dropping-particle&quot;: &quot;&quot;}], &quot;issued&quot;: {&quot;date-parts&quot;: [[2025]]}, &quot;DOI&quot;: &quot;10.29105/innoacad.v1i2.36&quot;, &quot;type&quot;: &quot;article-journal&quot;, &quot;title&quot;: &quot;Modelos de lenguaje en educación: inteligencia artificial generativa para optimizar el análisis del desempeño docente&quot;, &quot;container-title&quot;: &quot;Innovación Académica, Universidad Autónoma de Nuevo León&quot;, &quot;volume&quot;: &quot;1&quot;, &quot;issue&quot;: &quot;2&quot;, &quot;page&quot;: &quot;70-81&quot;, &quot;id&quot;: &quot;ITEM-9143f651-ed9a-563c-92fe-37d934b09213&quot;, &quot;container-title-short&quot;: &quot;&quot;}, &quot;isTemporary&quot;: false}, {&quot;id&quot;: &quot;ITEM-4d9769b2-c234-511d-ab8b-ba773efe38ec&quot;, &quot;itemData&quot;: {&quot;author&quot;: [{&quot;family&quot;: &quot;Sancho Escrivá&quot;, &quot;given&quot;: &quot;J. V.&quot;, &quot;parse-names&quot;: false, &quot;dropping-particle&quot;: &quot;&quot;, &quot;non-dropping-particle&quot;: &quot;&quot;}, {&quot;family&quot;: &quot;Fanjul Peyró&quot;, &quot;given&quot;: &quot;C.&quot;, &quot;parse-names&quot;: false, &quot;dropping-particle&quot;: &quot;&quot;, &quot;non-dropping-particle&quot;: &quot;&quot;}, {&quot;family&quot;: &quot;De la Iglesia Vayá&quot;, &quot;given&quot;: &quot;M.&quot;, &quot;parse-names&quot;: false, &quot;dropping-particle&quot;: &quot;&quot;, &quot;non-dropping-particle&quot;: &quot;&quot;}, {&quot;family&quot;: &quot;Montell&quot;, &quot;given&quot;: &quot;J. A.&quot;, &quot;parse-names&quot;: false, &quot;dropping-particle&quot;: &quot;&quot;, &quot;non-dropping-particle&quot;: &quot;&quot;}, {&quot;family&quot;: &quot;Escartí Fabra&quot;, &quot;given&quot;: &quot;M. J.&quot;, &quot;parse-names&quot;: false, &quot;dropping-particle&quot;: &quot;&quot;, &quot;non-dropping-particle&quot;: &quot;&quot;}], &quot;issued&quot;: {&quot;date-parts&quot;: [[2020]]}, &quot;DOI&quot;: &quot;10.35669/rcys.2020.10(1).19-41&quot;, &quot;type&quot;: &quot;article-journal&quot;, &quot;title&quot;: &quot;Aplicación de la inteligencia artificial con procesamiento del lenguaje natural para textos de investigación cualitativa en la relación médico-paciente con enfermedad mental mediante el uso de tecnologías móviles&quot;, &quot;container-title&quot;: &quot;Revista de Comunicación y Salud&quot;, &quot;volume&quot;: &quot;10&quot;, &quot;issue&quot;: &quot;1&quot;, &quot;page&quot;: &quot;19-41&quot;, &quot;id&quot;: &quot;ITEM-4d9769b2-c234-511d-ab8b-ba773efe38ec&quot;, &quot;container-title-short&quot;: &quot;&quot;}, &quot;isTemporary&quot;: false}]}, {&quot;citationID&quot;: &quot;MENDELEY_CITATION_b021a8cb-2232-453f-bbf0-16f93c69029e&quot;, &quot;properties&quot;: {&quot;noteIndex&quot;: 0}, &quot;isEdited&quot;: false, &quot;manualOverride&quot;: {&quot;isManuallyOverridden&quot;: true, &quot;citeprocText&quot;: &quot;(García Subies, 2021)&quot;, &quot;manualOverrideText&quot;: &quot;García Subies (2021)&quot;}, &quot;citationItems&quot;: [{&quot;id&quot;: &quot;ITEM-b59eaab8-9775-53c0-8c97-7339b6d70afc&quot;, &quot;itemData&quot;: {&quot;author&quot;: [{&quot;family&quot;: &quot;García Subies&quot;, &quot;given&quot;: &quot;G.&quot;, &quot;parse-names&quot;: false, &quot;dropping-particle&quot;: &quot;&quot;, &quot;non-dropping-particle&quot;: &quot;&quot;}], &quot;issued&quot;: {&quot;date-parts&quot;: [[2021]]}, &quot;URL&quot;: &quot;https://oa.upm.es/68623/&quot;, &quot;type&quot;: &quot;thesis&quot;, &quot;title&quot;: &quot;Modelos de Transformers para la clasificación de texto&quot;, &quot;genre&quot;: &quot;Tesis de maestría&quot;, &quot;publisher&quot;: &quot;Universidad Politécnica de Madrid&quot;, &quot;id&quot;: &quot;ITEM-b59eaab8-9775-53c0-8c97-7339b6d70afc&quot;, &quot;container-title-short&quot;: &quot;&quot;}, &quot;isTemporary&quot;: false}]}, {&quot;citationID&quot;: &quot;MENDELEY_CITATION_8d71de44-25a4-431a-91bf-588847b30c06&quot;, &quot;properties&quot;: {&quot;noteIndex&quot;: 0}, &quot;isEdited&quot;: false, &quot;manualOverride&quot;: {&quot;isManuallyOverridden&quot;: true, &quot;citeprocText&quot;: &quot;(Mena Guitarra, 2023)&quot;, &quot;manualOverrideText&quot;: &quot;Mena Guitarra (2023)&quot;}, &quot;citationItems&quot;: [{&quot;id&quot;: &quot;ITEM-b7bc5309-1149-55a6-8b1f-3e0d4086c429&quot;, &quot;itemData&quot;: {&quot;author&quot;: [{&quot;family&quot;: &quot;Mena Guitarra&quot;, &quot;given&quot;: &quot;S. D.&quot;, &quot;parse-names&quot;: false, &quot;dropping-particle&quot;: &quot;&quot;, &quot;non-dropping-particle&quot;: &quot;&quot;}], &quot;issued&quot;: {&quot;date-parts&quot;: [[2023]]}, &quot;URL&quot;: &quot;https://repositorio.usfq.edu.ec/handle/23000/13665&quot;, &quot;type&quot;: &quot;thesis&quot;, &quot;title&quot;: &quot;Usos y aplicaciones de modelos de lenguaje masivos en español&quot;, &quot;genre&quot;: &quot;Trabajo de titulación de pregrado&quot;, &quot;publisher&quot;: &quot;Universidad San Francisco de Quito&quot;, &quot;id&quot;: &quot;ITEM-b7bc5309-1149-55a6-8b1f-3e0d4086c429&quot;, &quot;container-title-short&quot;: &quot;&quot;}, &quot;isTemporary&quot;: false}]}, {&quot;citationID&quot;: &quot;MENDELEY_CITATION_5f372bcb-8986-44ba-8dca-34590a7feddf&quot;, &quot;properties&quot;: {&quot;noteIndex&quot;: 0}, &quot;isEdited&quot;: false, &quot;manualOverride&quot;: {&quot;isManuallyOverridden&quot;: true, &quot;citeprocText&quot;: &quot;(Hu et al., 2021)&quot;, &quot;manualOverrideText&quot;: &quot;Hu et al. (2021)&quot;}, &quot;citationItems&quot;: [{&quot;id&quot;: &quot;ITEM-74d30536-939b-537f-bec0-b59afedae2e3&quot;, &quot;itemData&quot;: {&quot;author&quot;: [{&quot;family&quot;: &quot;Hu&quot;, &quot;given&quot;: &quot;E. J.&quot;, &quot;parse-names&quot;: false, &quot;dropping-particle&quot;: &quot;&quot;, &quot;non-dropping-particle&quot;: &quot;&quot;}, {&quot;family&quot;: &quot;Shen&quot;, &quot;given&quot;: &quot;Y.&quot;, &quot;parse-names&quot;: false, &quot;dropping-particle&quot;: &quot;&quot;, &quot;non-dropping-particle&quot;: &quot;&quot;}, {&quot;family&quot;: &quot;Wallis&quot;, &quot;given&quot;: &quot;P.&quot;, &quot;parse-names&quot;: false, &quot;dropping-particle&quot;: &quot;&quot;, &quot;non-dropping-particle&quot;: &quot;&quot;}, {&quot;family&quot;: &quot;Allen-Zhu&quot;, &quot;given&quot;: &quot;Z.&quot;, &quot;parse-names&quot;: false, &quot;dropping-particle&quot;: &quot;&quot;, &quot;non-dropping-particle&quot;: &quot;&quot;}, {&quot;family&quot;: &quot;Li&quot;, &quot;given&quot;: &quot;Y.&quot;, &quot;parse-names&quot;: false, &quot;dropping-particle&quot;: &quot;&quot;, &quot;non-dropping-particle&quot;: &quot;&quot;}, {&quot;family&quot;: &quot;Wang&quot;, &quot;given&quot;: &quot;S.&quot;, &quot;parse-names&quot;: false, &quot;dropping-particle&quot;: &quot;&quot;, &quot;non-dropping-particle&quot;: &quot;&quot;}, {&quot;family&quot;: &quot;Wang&quot;, &quot;given&quot;: &quot;L.&quot;, &quot;parse-names&quot;: false, &quot;dropping-particle&quot;: &quot;&quot;, &quot;non-dropping-particle&quot;: &quot;&quot;}, {&quot;family&quot;: &quot;Chen&quot;, &quot;given&quot;: &quot;W.&quot;, &quot;parse-names&quot;: false, &quot;dropping-particle&quot;: &quot;&quot;, &quot;non-dropping-particle&quot;: &quot;&quot;}], &quot;issued&quot;: {&quot;date-parts&quot;: [[2021]]}, &quot;DOI&quot;: &quot;10.48550/arXiv.2106.09685&quot;, &quot;type&quot;: &quot;book&quot;, &quot;title&quot;: &quot;LoRA: Low-rank adaptation of large language models&quot;, &quot;publisher&quot;: &quot;arXiv&quot;, &quot;id&quot;: &quot;ITEM-74d30536-939b-537f-bec0-b59afedae2e3&quot;, &quot;container-title-short&quot;: &quot;&quot;}, &quot;isTemporary&quot;: false}]}, {&quot;citationID&quot;: &quot;MENDELEY_CITATION_05b5e119-1118-458a-a21d-376849961423&quot;, &quot;properties&quot;: {&quot;noteIndex&quot;: 0}, &quot;isEdited&quot;: false, &quot;manualOverride&quot;: {&quot;isManuallyOverridden&quot;: true, &quot;citeprocText&quot;: &quot;(Dettmers et al., 2023)&quot;, &quot;manualOverrideText&quot;: &quot;Dettmers et al. (2023)&quot;}, &quot;citationItems&quot;: [{&quot;id&quot;: &quot;ITEM-66ff8277-e9ea-5605-b98c-71a6ac2aa4a6&quot;, &quot;itemData&quot;: {&quot;author&quot;: [{&quot;family&quot;: &quot;Dettmers&quot;, &quot;given&quot;: &quot;T.&quot;, &quot;parse-names&quot;: false, &quot;dropping-particle&quot;: &quot;&quot;, &quot;non-dropping-particle&quot;: &quot;&quot;}, {&quot;family&quot;: &quot;Pagnoni&quot;, &quot;given&quot;: &quot;A.&quot;, &quot;parse-names&quot;: false, &quot;dropping-particle&quot;: &quot;&quot;, &quot;non-dropping-particle&quot;: &quot;&quot;}, {&quot;family&quot;: &quot;Holtzman&quot;, &quot;given&quot;: &quot;A.&quot;, &quot;parse-names&quot;: false, &quot;dropping-particle&quot;: &quot;&quot;, &quot;non-dropping-particle&quot;: &quot;&quot;}, {&quot;family&quot;: &quot;Zettlemoyer&quot;, &quot;given&quot;: &quot;L.&quot;, &quot;parse-names&quot;: false, &quot;dropping-particle&quot;: &quot;&quot;, &quot;non-dropping-particle&quot;: &quot;&quot;}], &quot;issued&quot;: {&quot;date-parts&quot;: [[2023]]}, &quot;DOI&quot;: &quot;10.48550/arXiv.2305.14314&quot;, &quot;type&quot;: &quot;paper-conference&quot;, &quot;title&quot;: &quot;QLoRA: Efficient finetuning of quantized LLMs&quot;, &quot;container-title&quot;: &quot;Advances in Neural Information Processing Systems 36&quot;, &quot;id&quot;: &quot;ITEM-66ff8277-e9ea-5605-b98c-71a6ac2aa4a6&quot;, &quot;container-title-short&quot;: &quot;&quot;}, &quot;isTemporary&quot;: false}]}, {&quot;citationID&quot;: &quot;MENDELEY_CITATION_fb9323b2-76d6-46cd-8a48-08515ad50665&quot;, &quot;properties&quot;: {&quot;noteIndex&quot;: 0}, &quot;isEdited&quot;: false, &quot;manualOverride&quot;: {&quot;isManuallyOverridden&quot;: true, &quot;citeprocText&quot;: &quot;(León Caranqui, 2023)&quot;, &quot;manualOverrideText&quot;: &quot;León Caranqui (2023)&quot;}, &quot;citationItems&quot;: [{&quot;id&quot;: &quot;ITEM-d8e93493-d1e9-5c21-8fb9-fe318b95db8c&quot;, &quot;itemData&quot;: {&quot;author&quot;: [{&quot;family&quot;: &quot;León Caranqui&quot;, &quot;given&quot;: &quot;J. A.&quot;, &quot;parse-names&quot;: false, &quot;dropping-particle&quot;: &quot;&quot;, &quot;non-dropping-particle&quot;: &quot;&quot;}], &quot;issued&quot;: {&quot;date-parts&quot;: [[2023]]}, &quot;URL&quot;: &quot;https://repositorio.usfq.edu.ec/handle/23000/13497&quot;, &quot;type&quot;: &quot;thesis&quot;, &quot;title&quot;: &quot;URKU: Adaptación de LLaMA 2 para la generación de texto en kichwa usando técnicas de Low-Rank Adaptation (LoRA)&quot;, &quot;genre&quot;: &quot;Trabajo de titulación de pregrado&quot;, &quot;publisher&quot;: &quot;Universidad San Francisco de Quito&quot;, &quot;id&quot;: &quot;ITEM-d8e93493-d1e9-5c21-8fb9-fe318b95db8c&quot;, &quot;container-title-short&quot;: &quot;&quot;}, &quot;isTemporary&quot;: false}]}, {&quot;citationID&quot;: &quot;MENDELEY_CITATION_98e61d60-6026-40fc-9d32-96ad434d211c&quot;, &quot;properties&quot;: {&quot;noteIndex&quot;: 0}, &quot;isEdited&quot;: false, &quot;manualOverride&quot;: {&quot;isManuallyOverridden&quot;: true, &quot;citeprocText&quot;: &quot;(Castejón Lozano, 2025)&quot;, &quot;manualOverrideText&quot;: &quot;Castejón Lozano (2025)&quot;}, &quot;citationItems&quot;: [{&quot;id&quot;: &quot;ITEM-aa8f5a87-f00c-54b4-9f0b-476652320c5d&quot;, &quot;itemData&quot;: {&quot;author&quot;: [{&quot;family&quot;: &quot;Castejón Lozano&quot;, &quot;given&quot;: &quot;F.&quot;, &quot;parse-names&quot;: false, &quot;dropping-particle&quot;: &quot;&quot;, &quot;non-dropping-particle&quot;: &quot;&quot;}], &quot;issued&quot;: {&quot;date-parts&quot;: [[2025]]}, &quot;URL&quot;: &quot;https://oa.upm.es/90917/&quot;, &quot;type&quot;: &quot;thesis&quot;, &quot;title&quot;: &quot;SoroIA: Diseño e implementación de un sistema conversacional basado en modelos grandes de lenguaje para el Museo Sorolla&quot;, &quot;genre&quot;: &quot;Tesis de maestría&quot;, &quot;publisher&quot;: &quot;Universidad Politécnica de Madrid&quot;, &quot;id&quot;: &quot;ITEM-aa8f5a87-f00c-54b4-9f0b-476652320c5d&quot;, &quot;container-title-short&quot;: &quot;&quot;}, &quot;isTemporary&quot;: false}]}, {&quot;citationID&quot;: &quot;MENDELEY_CITATION_17e110ea-44c4-4b33-8bd7-9652ee453839&quot;, &quot;properties&quot;: {&quot;noteIndex&quot;: 0}, &quot;isEdited&quot;: false, &quot;manualOverride&quot;: {&quot;isManuallyOverridden&quot;: true, &quot;citeprocText&quot;: &quot;(Fang et al., 2024)&quot;, &quot;manualOverrideText&quot;: &quot;Fang et al. (2024)&quot;}, &quot;citationItems&quot;: [{&quot;id&quot;: &quot;ITEM-5007b438-b37f-541e-8fca-2748edacc281&quot;, &quot;itemData&quot;: {&quot;author&quot;: [{&quot;family&quot;: &quot;Fang&quot;, &quot;given&quot;: &quot;X.&quot;, &quot;parse-names&quot;: false, &quot;dropping-particle&quot;: &quot;&quot;, &quot;non-dropping-particle&quot;: &quot;&quot;}, {&quot;family&quot;: &quot;Xu&quot;, &quot;given&quot;: &quot;W.&quot;, &quot;parse-names&quot;: false, &quot;dropping-particle&quot;: &quot;&quot;, &quot;non-dropping-particle&quot;: &quot;&quot;}, {&quot;family&quot;: &quot;Tan&quot;, &quot;given&quot;: &quot;F. A.&quot;, &quot;parse-names&quot;: false, &quot;dropping-particle&quot;: &quot;&quot;, &quot;non-dropping-particle&quot;: &quot;&quot;}, {&quot;family&quot;: &quot;Zhang&quot;, &quot;given&quot;: &quot;J.&quot;, &quot;parse-names&quot;: false, &quot;dropping-particle&quot;: &quot;&quot;, &quot;non-dropping-particle&quot;: &quot;&quot;}, {&quot;family&quot;: &quot;Hu&quot;, &quot;given&quot;: &quot;Z.&quot;, &quot;parse-names&quot;: false, &quot;dropping-particle&quot;: &quot;&quot;, &quot;non-dropping-particle&quot;: &quot;&quot;}, {&quot;family&quot;: &quot;Qi&quot;, &quot;given&quot;: &quot;Y.&quot;, &quot;parse-names&quot;: false, &quot;dropping-particle&quot;: &quot;&quot;, &quot;non-dropping-particle&quot;: &quot;&quot;}, {&quot;family&quot;: &quot;Nickleach&quot;, &quot;given&quot;: &quot;S.&quot;, &quot;parse-names&quot;: false, &quot;dropping-particle&quot;: &quot;&quot;, &quot;non-dropping-particle&quot;: &quot;&quot;}, {&quot;family&quot;: &quot;Socolinsky&quot;, &quot;given&quot;: &quot;D.&quot;, &quot;parse-names&quot;: false, &quot;dropping-particle&quot;: &quot;&quot;, &quot;non-dropping-particle&quot;: &quot;&quot;}, {&quot;family&quot;: &quot;Sengamedu&quot;, &quot;given&quot;: &quot;S.&quot;, &quot;parse-names&quot;: false, &quot;dropping-particle&quot;: &quot;&quot;, &quot;non-dropping-particle&quot;: &quot;&quot;}, {&quot;family&quot;: &quot;Faloutsos&quot;, &quot;given&quot;: &quot;C.&quot;, &quot;parse-names&quot;: false, &quot;dropping-particle&quot;: &quot;&quot;, &quot;non-dropping-particle&quot;: &quot;&quot;}], &quot;issued&quot;: {&quot;date-parts&quot;: [[2024]]}, &quot;URL&quot;: &quot;http://arxiv.org/abs/2402.17944&quot;, &quot;type&quot;: &quot;article-journal&quot;, &quot;title&quot;: &quot;Large language models (LLMs) on tabular data: Prediction, generation, and understanding. A survey&quot;, &quot;container-title&quot;: &quot;Transactions on Machine Learning Research&quot;, &quot;id&quot;: &quot;ITEM-5007b438-b37f-541e-8fca-2748edacc281&quot;, &quot;container-title-short&quot;: &quot;&quot;}, &quot;isTemporary&quot;: false}]}, {&quot;citationID&quot;: &quot;MENDELEY_CITATION_b8a39a3f-a553-491e-8e13-626f7e96b658&quot;, &quot;properties&quot;: {&quot;noteIndex&quot;: 0}, &quot;isEdited&quot;: false, &quot;manualOverride&quot;: {&quot;isManuallyOverridden&quot;: true, &quot;citeprocText&quot;: &quot;(Fernández et al., 2025)&quot;, &quot;manualOverrideText&quot;: &quot;Fernández et al. (2025)&quot;}, &quot;citationItems&quot;: [{&quot;id&quot;: &quot;ITEM-6e797b0e-8270-559d-850f-c5042d0b3d16&quot;, &quot;itemData&quot;: {&quot;author&quot;: [{&quot;family&quot;: &quot;Fernández&quot;, &quot;given&quot;: &quot;J. M.&quot;, &quot;parse-names&quot;: false, &quot;dropping-particle&quot;: &quot;&quot;, &quot;non-dropping-particle&quot;: &quot;&quot;}, {&quot;family&quot;: &quot;Petrocelli&quot;, &quot;given&quot;: &quot;D. M.&quot;, &quot;parse-names&quot;: false, &quot;dropping-particle&quot;: &quot;&quot;, &quot;non-dropping-particle&quot;: &quot;&quot;}, {&quot;family&quot;: &quot;Matuk&quot;, &quot;given&quot;: &quot;R.&quot;, &quot;parse-names&quot;: false, &quot;dropping-particle&quot;: &quot;&quot;, &quot;non-dropping-particle&quot;: &quot;&quot;}, {&quot;family&quot;: &quot;Lanson&quot;, &quot;given&quot;: &quot;D.&quot;, &quot;parse-names&quot;: false, &quot;dropping-particle&quot;: &quot;&quot;, &quot;non-dropping-particle&quot;: &quot;&quot;}, {&quot;family&quot;: &quot;Zamudio&quot;, &quot;given&quot;: &quot;E.&quot;, &quot;parse-names&quot;: false, &quot;dropping-particle&quot;: &quot;&quot;, &quot;non-dropping-particle&quot;: &quot;&quot;}, {&quot;family&quot;: &quot;Cagnina&quot;, &quot;given&quot;: &quot;L. C.&quot;, &quot;parse-names&quot;: false, &quot;dropping-particle&quot;: &quot;&quot;, &quot;non-dropping-particle&quot;: &quot;&quot;}, {&quot;family&quot;: &quot;Gil Costa&quot;, &quot;given&quot;: &quot;G. V.&quot;, &quot;parse-names&quot;: false, &quot;dropping-particle&quot;: &quot;&quot;, &quot;non-dropping-particle&quot;: &quot;&quot;}, {&quot;family&quot;: &quot;Errecalde&quot;, &quot;given&quot;: &quot;M. L.&quot;, &quot;parse-names&quot;: false, &quot;dropping-particle&quot;: &quot;&quot;, &quot;non-dropping-particle&quot;: &quot;&quot;}], &quot;issued&quot;: {&quot;date-parts&quot;: [[2025]]}, &quot;URL&quot;: &quot;http://sedici.unlp.edu.ar/handle/10915/183892&quot;, &quot;type&quot;: &quot;paper-conference&quot;, &quot;title&quot;: &quot;Fine-tuning y adaptación de modelos de lenguaje abiertos en infraestructura HPC para aplicaciones de dominio específico&quot;, &quot;container-title&quot;: &quot;Libro de actas del XXVII Workshop de Investigadores en Ciencias de la Computación&quot;, &quot;page&quot;: &quot;72-76&quot;, &quot;publisher&quot;: &quot;Red de Universidades con Carreras en Informática&quot;, &quot;id&quot;: &quot;ITEM-6e797b0e-8270-559d-850f-c5042d0b3d16&quot;, &quot;container-title-short&quot;: &quot;&quot;}, &quot;isTemporary&quot;: false}]}, {&quot;citationID&quot;: &quot;MENDELEY_CITATION_5d59d7ae-a8e9-4621-a4a5-1dc7aac72b2e&quot;, &quot;properties&quot;: {&quot;noteIndex&quot;: 0}, &quot;isEdited&quot;: false, &quot;manualOverride&quot;: {&quot;isManuallyOverridden&quot;: true, &quot;citeprocText&quot;: &quot;(Fernández et al., 2025)&quot;, &quot;manualOverrideText&quot;: &quot;Fernández et al. (2025)&quot;}, &quot;citationItems&quot;: [{&quot;id&quot;: &quot;ITEM-6e797b0e-8270-559d-850f-c5042d0b3d16&quot;, &quot;itemData&quot;: {&quot;author&quot;: [{&quot;family&quot;: &quot;Fernández&quot;, &quot;given&quot;: &quot;J. M.&quot;, &quot;parse-names&quot;: false, &quot;dropping-particle&quot;: &quot;&quot;, &quot;non-dropping-particle&quot;: &quot;&quot;}, {&quot;family&quot;: &quot;Petrocelli&quot;, &quot;given&quot;: &quot;D. M.&quot;, &quot;parse-names&quot;: false, &quot;dropping-particle&quot;: &quot;&quot;, &quot;non-dropping-particle&quot;: &quot;&quot;}, {&quot;family&quot;: &quot;Matuk&quot;, &quot;given&quot;: &quot;R.&quot;, &quot;parse-names&quot;: false, &quot;dropping-particle&quot;: &quot;&quot;, &quot;non-dropping-particle&quot;: &quot;&quot;}, {&quot;family&quot;: &quot;Lanson&quot;, &quot;given&quot;: &quot;D.&quot;, &quot;parse-names&quot;: false, &quot;dropping-particle&quot;: &quot;&quot;, &quot;non-dropping-particle&quot;: &quot;&quot;}, {&quot;family&quot;: &quot;Zamudio&quot;, &quot;given&quot;: &quot;E.&quot;, &quot;parse-names&quot;: false, &quot;dropping-particle&quot;: &quot;&quot;, &quot;non-dropping-particle&quot;: &quot;&quot;}, {&quot;family&quot;: &quot;Cagnina&quot;, &quot;given&quot;: &quot;L. C.&quot;, &quot;parse-names&quot;: false, &quot;dropping-particle&quot;: &quot;&quot;, &quot;non-dropping-particle&quot;: &quot;&quot;}, {&quot;family&quot;: &quot;Gil Costa&quot;, &quot;given&quot;: &quot;G. V.&quot;, &quot;parse-names&quot;: false, &quot;dropping-particle&quot;: &quot;&quot;, &quot;non-dropping-particle&quot;: &quot;&quot;}, {&quot;family&quot;: &quot;Errecalde&quot;, &quot;given&quot;: &quot;M. L.&quot;, &quot;parse-names&quot;: false, &quot;dropping-particle&quot;: &quot;&quot;, &quot;non-dropping-particle&quot;: &quot;&quot;}], &quot;issued&quot;: {&quot;date-parts&quot;: [[2025]]}, &quot;URL&quot;: &quot;http://sedici.unlp.edu.ar/handle/10915/183892&quot;, &quot;type&quot;: &quot;paper-conference&quot;, &quot;title&quot;: &quot;Fine-tuning y adaptación de modelos de lenguaje abiertos en infraestructura HPC para aplicaciones de dominio específico&quot;, &quot;container-title&quot;: &quot;Libro de actas del XXVII Workshop de Investigadores en Ciencias de la Computación&quot;, &quot;page&quot;: &quot;72-76&quot;, &quot;publisher&quot;: &quot;Red de Universidades con Carreras en Informática&quot;, &quot;id&quot;: &quot;ITEM-6e797b0e-8270-559d-850f-c5042d0b3d16&quot;, &quot;container-title-short&quot;: &quot;&quot;}, &quot;isTemporary&quot;: false}]}, {&quot;citationID&quot;: &quot;MENDELEY_CITATION_5057babf-c197-4020-a344-785719ce3410&quot;, &quot;properties&quot;: {&quot;noteIndex&quot;: 0}, &quot;isEdited&quot;: false, &quot;manualOverride&quot;: {&quot;isManuallyOverridden&quot;: true, &quot;citeprocText&quot;: &quot;(Ramos-Rivera et al., 2025)&quot;, &quot;manualOverrideText&quot;: &quot;Ramos-Rivera et al. (2025)&quot;}, &quot;citationItems&quot;: [{&quot;id&quot;: &quot;ITEM-9143f651-ed9a-563c-92fe-37d934b09213&quot;, &quot;itemData&quot;: {&quot;author&quot;: [{&quot;family&quot;: &quot;Ramos-Rivera&quot;, &quot;given&quot;: &quot;R. E.&quot;, &quot;parse-names&quot;: false, &quot;dropping-particle&quot;: &quot;&quot;, &quot;non-dropping-particle&quot;: &quot;&quot;}, {&quot;family&quot;: &quot;Santana Mancilla&quot;, &quot;given&quot;: &quot;P. C.&quot;, &quot;parse-names&quot;: false, &quot;dropping-particle&quot;: &quot;&quot;, &quot;non-dropping-particle&quot;: &quot;&quot;}, {&quot;family&quot;: &quot;García-Mancilla&quot;, &quot;given&quot;: &quot;J.&quot;, &quot;parse-names&quot;: false, &quot;dropping-particle&quot;: &quot;&quot;, &quot;non-dropping-particle&quot;: &quot;&quot;}, {&quot;family&quot;: &quot;Gaytán-Lugo&quot;, &quot;given&quot;: &quot;L. S.&quot;, &quot;parse-names&quot;: false, &quot;dropping-particle&quot;: &quot;&quot;, &quot;non-dropping-particle&quot;: &quot;&quot;}], &quot;issued&quot;: {&quot;date-parts&quot;: [[2025]]}, &quot;DOI&quot;: &quot;10.29105/innoacad.v1i2.36&quot;, &quot;type&quot;: &quot;article-journal&quot;, &quot;title&quot;: &quot;Modelos de lenguaje en educación: inteligencia artificial generativa para optimizar el análisis del desempeño docente&quot;, &quot;container-title&quot;: &quot;Innovación Académica, Universidad Autónoma de Nuevo León&quot;, &quot;volume&quot;: &quot;1&quot;, &quot;issue&quot;: &quot;2&quot;, &quot;page&quot;: &quot;70-81&quot;, &quot;id&quot;: &quot;ITEM-9143f651-ed9a-563c-92fe-37d934b09213&quot;, &quot;container-title-short&quot;: &quot;&quot;}, &quot;isTemporary&quot;: false}]}, {&quot;citationID&quot;: &quot;MENDELEY_CITATION_fe44de18-ca0f-4d86-be0d-36f842a4ef9e&quot;, &quot;properties&quot;: {&quot;noteIndex&quot;: 0}, &quot;isEdited&quot;: false, &quot;manualOverride&quot;: {&quot;isManuallyOverridden&quot;: true, &quot;citeprocText&quot;: &quot;(Millán Gordillo, 2025)&quot;, &quot;manualOverrideText&quot;: &quot;Millán Gordillo (2025)&quot;}, &quot;citationItems&quot;: [{&quot;id&quot;: &quot;ITEM-d048a752-48c5-509f-92fd-95097e22963d&quot;, &quot;itemData&quot;: {&quot;author&quot;: [{&quot;family&quot;: &quot;Millán Gordillo&quot;, &quot;given&quot;: &quot;M.&quot;, &quot;parse-names&quot;: false, &quot;dropping-particle&quot;: &quot;&quot;, &quot;non-dropping-particle&quot;: &quot;&quot;}], &quot;issued&quot;: {&quot;date-parts&quot;: [[2025]]}, &quot;URL&quot;: &quot;https://repositorio.uloyola.es/bitstream/handle/20.500.12412/6735/TFM%20Mar%C3%ADa%20Mill%C3%A1n.pdf&quot;, &quot;type&quot;: &quot;thesis&quot;, &quot;title&quot;: &quot;Estudio comparativo de sistemas de recomendación mediante filtrado colaborativo, basado en contenido y propuestas híbridas&quot;, &quot;genre&quot;: &quot;Tesis de maestría&quot;, &quot;publisher&quot;: &quot;Universidad Loyola Andalucía&quot;, &quot;id&quot;: &quot;ITEM-d048a752-48c5-509f-92fd-95097e22963d&quot;, &quot;container-title-short&quot;: &quot;&quot;}, &quot;isTemporary&quot;: false}]}, {&quot;citationID&quot;: &quot;MENDELEY_CITATION_b6ac99a4-b72b-4490-b1d0-71781d5a99de&quot;, &quot;properties&quot;: {&quot;noteIndex&quot;: 0}, &quot;isEdited&quot;: false, &quot;manualOverride&quot;: {&quot;isManuallyOverridden&quot;: true, &quot;citeprocText&quot;: &quot;(Martínez Sixto et al., 2025)&quot;, &quot;manualOverrideText&quot;: &quot;Martínez Sixto et al. (2025)&quot;}, &quot;citationItems&quot;: [{&quot;id&quot;: &quot;ITEM-e9427164-f851-5ff7-a1c3-eb7ce5a7d720&quot;, &quot;itemData&quot;: {&quot;author&quot;: [{&quot;family&quot;: &quot;Martínez Sixto&quot;, &quot;given&quot;: &quot;L.&quot;, &quot;parse-names&quot;: false, &quot;dropping-particle&quot;: &quot;&quot;, &quot;non-dropping-particle&quot;: &quot;&quot;}, {&quot;family&quot;: &quot;Fernández y Fernández&quot;, &quot;given&quot;: &quot;C. A.&quot;, &quot;parse-names&quot;: false, &quot;dropping-particle&quot;: &quot;&quot;, &quot;non-dropping-particle&quot;: &quot;&quot;}, {&quot;family&quot;: &quot;Millán Hernández&quot;, &quot;given&quot;: &quot;C. E.&quot;, &quot;parse-names&quot;: false, &quot;dropping-particle&quot;: &quot;&quot;, &quot;non-dropping-particle&quot;: &quot;&quot;}], &quot;issued&quot;: {&quot;date-parts&quot;: [[2025]]}, &quot;DOI&quot;: &quot;10.36825/riti.13.31.007&quot;, &quot;type&quot;: &quot;article-journal&quot;, &quot;title&quot;: &quot;Comparación del desempeño de LLMs en la generación de diagramas de clases UML mediante un sistema RAG&quot;, &quot;container-title&quot;: &quot;Revista de Investigación en Tecnologías de la Información&quot;, &quot;volume&quot;: &quot;13&quot;, &quot;issue&quot;: &quot;31&quot;, &quot;page&quot;: &quot;64-79&quot;, &quot;id&quot;: &quot;ITEM-e9427164-f851-5ff7-a1c3-eb7ce5a7d720&quot;, &quot;container-title-short&quot;: &quot;&quot;}, &quot;isTemporary&quot;: false}]}, {&quot;citationID&quot;: &quot;MENDELEY_CITATION_fc15163a-a6ea-4921-9fd5-cf4fc4a94780&quot;, &quot;properties&quot;: {&quot;noteIndex&quot;: 0}, &quot;isEdited&quot;: false, &quot;manualOverride&quot;: {&quot;isManuallyOverridden&quot;: true, &quot;citeprocText&quot;: &quot;(Cisneros-Bravo et al., 2023)&quot;, &quot;manualOverrideText&quot;: &quot;Cisneros-Bravo et al. (2023)&quot;}, &quot;citationItems&quot;: [{&quot;id&quot;: &quot;ITEM-2c1f70fd-8745-538a-b99f-18d256f44b4f&quot;, &quot;itemData&quot;: {&quot;author&quot;: [{&quot;family&quot;: &quot;Cisneros-Bravo&quot;, &quot;given&quot;: &quot;B. E.&quot;, &quot;parse-names&quot;: false, &quot;dropping-particle&quot;: &quot;&quot;, &quot;non-dropping-particle&quot;: &quot;&quot;}, {&quot;family&quot;: &quot;Rodríguez-Aguilar&quot;, &quot;given&quot;: &quot;R. M.&quot;, &quot;parse-names&quot;: false, &quot;dropping-particle&quot;: &quot;&quot;, &quot;non-dropping-particle&quot;: &quot;&quot;}, {&quot;family&quot;: &quot;Niño-Membrillo&quot;, &quot;given&quot;: &quot;Y. E.&quot;, &quot;parse-names&quot;: false, &quot;dropping-particle&quot;: &quot;&quot;, &quot;non-dropping-particle&quot;: &quot;&quot;}, {&quot;family&quot;: &quot;Cuevas-Rasgado&quot;, &quot;given&quot;: &quot;A. D.&quot;, &quot;parse-names&quot;: false, &quot;dropping-particle&quot;: &quot;&quot;, &quot;non-dropping-particle&quot;: &quot;&quot;}], &quot;issued&quot;: {&quot;date-parts&quot;: [[2023]]}, &quot;DOI&quot;: &quot;10.23913/ride.v14i27.1715&quot;, &quot;type&quot;: &quot;article-journal&quot;, &quot;title&quot;: &quot;Falta de orientación vocacional como factor en la deserción universitaria. Caso de estudio: zona Oriente del Estado de México&quot;, &quot;container-title&quot;: &quot;RIDE Revista Iberoamericana para la Investigación y el Desarrollo Educativo&quot;, &quot;volume&quot;: &quot;14&quot;, &quot;issue&quot;: &quot;27&quot;, &quot;id&quot;: &quot;ITEM-2c1f70fd-8745-538a-b99f-18d256f44b4f&quot;, &quot;container-title-short&quot;: &quot;&quot;}, &quot;isTemporary&quot;: false}]}, {&quot;citationID&quot;: &quot;MENDELEY_CITATION_83753edf-b524-4bb6-89f3-c2b7e2876fac&quot;, &quot;properties&quot;: {&quot;noteIndex&quot;: 0}, &quot;isEdited&quot;: false, &quot;manualOverride&quot;: {&quot;isManuallyOverridden&quot;: true, &quot;citeprocText&quot;: &quot;(Carballo-Mendívil et al., 2025)&quot;, &quot;manualOverrideText&quot;: &quot;Carballo-Mendívil et al. (2025)&quot;}, &quot;citationItems&quot;: [{&quot;id&quot;: &quot;ITEM-4755bb51-baf5-5536-8cda-5af1c04a59c8&quot;, &quot;itemData&quot;: {&quot;author&quot;: [{&quot;family&quot;: &quot;Carballo-Mendívil&quot;, &quot;given&quot;: &quot;B.&quot;, &quot;parse-names&quot;: false, &quot;dropping-particle&quot;: &quot;&quot;, &quot;non-dropping-particle&quot;: &quot;&quot;}, {&quot;family&quot;: &quot;Arellano-González&quot;, &quot;given&quot;: &quot;A.&quot;, &quot;parse-names&quot;: false, &quot;dropping-particle&quot;: &quot;&quot;, &quot;non-dropping-particle&quot;: &quot;&quot;}, {&quot;family&quot;: &quot;Ríos-Vázquez&quot;, &quot;given&quot;: &quot;N. J.&quot;, &quot;parse-names&quot;: false, &quot;dropping-particle&quot;: &quot;&quot;, &quot;non-dropping-particle&quot;: &quot;&quot;}, {&quot;family&quot;: &quot;Lizardi-Duarte&quot;, &quot;given&quot;: &quot;M. del P.&quot;, &quot;parse-names&quot;: false, &quot;dropping-particle&quot;: &quot;&quot;, &quot;non-dropping-particle&quot;: &quot;&quot;}], &quot;issued&quot;: {&quot;date-parts&quot;: [[2025]]}, &quot;DOI&quot;: &quot;10.3390/app15169202&quot;, &quot;type&quot;: &quot;article-journal&quot;, &quot;title&quot;: &quot;Predicting student dropout from day one: XGBoost-based early warning system using pre-enrollment data&quot;, &quot;container-title&quot;: &quot;Applied Sciences&quot;, &quot;volume&quot;: &quot;15&quot;, &quot;issue&quot;: &quot;16&quot;, &quot;page&quot;: &quot;9202&quot;, &quot;id&quot;: &quot;ITEM-4755bb51-baf5-5536-8cda-5af1c04a59c8&quot;, &quot;container-title-short&quot;: &quot;&quot;}, &quot;isTemporary&quot;: false}]}, {&quot;citationID&quot;: &quot;MENDELEY_CITATION_634ce56f-62fe-49fa-bfeb-d6e2d736479b&quot;, &quot;properties&quot;: {&quot;noteIndex&quot;: 0}, &quot;isEdited&quot;: false, &quot;manualOverride&quot;: {&quot;isManuallyOverridden&quot;: true, &quot;citeprocText&quot;: &quot;(Marroquin Balarezo et al., 2024)&quot;, &quot;manualOverrideText&quot;: &quot;Marroquin Balarezo et al. (2024)&quot;}, &quot;citationItems&quot;: [{&quot;id&quot;: &quot;ITEM-134638ce-38e8-5ef9-b94c-3755a5e14dbc&quot;, &quot;itemData&quot;: {&quot;author&quot;: [{&quot;family&quot;: &quot;Marroquin Balarezo&quot;, &quot;given&quot;: &quot;M. P.&quot;, &quot;parse-names&quot;: false, &quot;dropping-particle&quot;: &quot;&quot;, &quot;non-dropping-particle&quot;: &quot;&quot;}, {&quot;family&quot;: &quot;Ambia Hurtado&quot;, &quot;given&quot;: &quot;W. A.&quot;, &quot;parse-names&quot;: false, &quot;dropping-particle&quot;: &quot;&quot;, &quot;non-dropping-particle&quot;: &quot;&quot;}, {&quot;family&quot;: &quot;Gutierrez Churata&quot;, &quot;given&quot;: &quot;H. F.&quot;, &quot;parse-names&quot;: false, &quot;dropping-particle&quot;: &quot;&quot;, &quot;non-dropping-particle&quot;: &quot;&quot;}, {&quot;family&quot;: &quot;Salcedo Atiquipa&quot;, &quot;given&quot;: &quot;E. F.&quot;, &quot;parse-names&quot;: false, &quot;dropping-particle&quot;: &quot;&quot;, &quot;non-dropping-particle&quot;: &quot;&quot;}, {&quot;family&quot;: &quot;Tipiana Felix&quot;, &quot;given&quot;: &quot;R. E.&quot;, &quot;parse-names&quot;: false, &quot;dropping-particle&quot;: &quot;&quot;, &quot;non-dropping-particle&quot;: &quot;&quot;}], &quot;issued&quot;: {&quot;date-parts&quot;: [[2024]]}, &quot;URL&quot;: &quot;http://hdl.handle.net/10757/684330&quot;, &quot;type&quot;: &quot;thesis&quot;, &quot;title&quot;: &quot;Diseño de un asistente inteligente RAG para la Comisión de Eliminación de Barreras Burocráticas de INDECOPI-2024&quot;, &quot;genre&quot;: &quot;Tesis de maestría&quot;, &quot;publisher&quot;: &quot;Universidad Peruana de Ciencias Aplicadas&quot;, &quot;id&quot;: &quot;ITEM-134638ce-38e8-5ef9-b94c-3755a5e14dbc&quot;, &quot;container-title-short&quot;: &quot;&quot;}, &quot;isTemporary&quot;: false}]}, {&quot;citationID&quot;: &quot;MENDELEY_CITATION_768d30fc-baeb-41e5-ae8a-7812792bbc66&quot;, &quot;properties&quot;: {&quot;noteIndex&quot;: 0}, &quot;isEdited&quot;: false, &quot;manualOverride&quot;: {&quot;isManuallyOverridden&quot;: true, &quot;citeprocText&quot;: &quot;(Yataco Cañari y Jacha Rojas, 2024)&quot;, &quot;manualOverrideText&quot;: &quot;Yataco Cañari y Jacha Rojas (2024)&quot;}, &quot;citationItems&quot;: [{&quot;id&quot;: &quot;ITEM-02ada8e7-47d2-5940-ab09-a30ce56e4fb6&quot;, &quot;itemData&quot;: {&quot;author&quot;: [{&quot;family&quot;: &quot;Yataco Cañari&quot;, &quot;given&quot;: &quot;W.&quot;, &quot;parse-names&quot;: false, &quot;dropping-particle&quot;: &quot;&quot;, &quot;non-dropping-particle&quot;: &quot;&quot;}, {&quot;family&quot;: &quot;Jacha Rojas&quot;, &quot;given&quot;: &quot;J. P.&quot;, &quot;parse-names&quot;: false, &quot;dropping-particle&quot;: &quot;&quot;, &quot;non-dropping-particle&quot;: &quot;&quot;}], &quot;issued&quot;: {&quot;date-parts&quot;: [[2024]]}, &quot;URL&quot;: &quot;https://hdl.handle.net/20.500.12840/7597&quot;, &quot;type&quot;: &quot;thesis&quot;, &quot;title&quot;: &quot;Modelo machine learning para predicción de deserción estudiantil&quot;, &quot;genre&quot;: &quot;Trabajo académico de segunda especialidad&quot;, &quot;publisher&quot;: &quot;Universidad Peruana Unión&quot;, &quot;id&quot;: &quot;ITEM-02ada8e7-47d2-5940-ab09-a30ce56e4fb6&quot;, &quot;container-title-short&quot;: &quot;&quot;}, &quot;isTemporary&quot;: false}]}, {&quot;citationID&quot;: &quot;MENDELEY_CITATION_1dfbd422-0869-4c95-beb4-73a8f13b9673&quot;, &quot;properties&quot;: {&quot;noteIndex&quot;: 0}, &quot;isEdited&quot;: false, &quot;manualOverride&quot;: {&quot;isManuallyOverridden&quot;: true, &quot;citeprocText&quot;: &quot;(Guadalupe Mori, 2025)&quot;, &quot;manualOverrideText&quot;: &quot;Guadalupe Mori (2025)&quot;}, &quot;citationItems&quot;: [{&quot;id&quot;: &quot;ITEM-745e87b9-5edd-56c2-99e9-42f2290e8c38&quot;, &quot;itemData&quot;: {&quot;author&quot;: [{&quot;family&quot;: &quot;Guadalupe Mori&quot;, &quot;given&quot;: &quot;V. H.&quot;, &quot;parse-names&quot;: false, &quot;dropping-particle&quot;: &quot;&quot;, &quot;non-dropping-particle&quot;: &quot;&quot;}], &quot;issued&quot;: {&quot;date-parts&quot;: [[2025]]}, &quot;URL&quot;: &quot;https://hdl.handle.net/20.500.13084/10839&quot;, &quot;type&quot;: &quot;thesis&quot;, &quot;title&quot;: &quot;Modelo predictivo basado en machine learning para la reducción de la deserción estudiantil en las universidades privadas del Perú: caso Universidad Privada San Juan Bautista&quot;, &quot;genre&quot;: &quot;Tesis doctoral&quot;, &quot;publisher&quot;: &quot;Universidad Nacional Federico Villarreal&quot;, &quot;id&quot;: &quot;ITEM-745e87b9-5edd-56c2-99e9-42f2290e8c38&quot;, &quot;container-title-short&quot;: &quot;&quot;}, &quot;isTemporary&quot;: false}]}, {&quot;citationID&quot;: &quot;MENDELEY_CITATION_05cd8854-7f1e-4fe8-bf6c-1f06cdd4fedf&quot;, &quot;properties&quot;: {&quot;noteIndex&quot;: 0}, &quot;isEdited&quot;: false, &quot;manualOverride&quot;: {&quot;isManuallyOverridden&quot;: true, &quot;citeprocText&quot;: &quot;(Rodas Zegarra de Escalante, 2024)&quot;, &quot;manualOverrideText&quot;: &quot;Rodas Zegarra de Escalante (2024)&quot;}, &quot;citationItems&quot;: [{&quot;id&quot;: &quot;ITEM-297823cb-c975-5def-8698-5545884294cd&quot;, &quot;itemData&quot;: {&quot;author&quot;: [{&quot;family&quot;: &quot;Rodas Zegarra de Escalante&quot;, &quot;given&quot;: &quot;A.&quot;, &quot;parse-names&quot;: false, &quot;dropping-particle&quot;: &quot;&quot;, &quot;non-dropping-particle&quot;: &quot;&quot;}], &quot;issued&quot;: {&quot;date-parts&quot;: [[2024]]}, &quot;URL&quot;: &quot;https://hdl.handle.net/20.500.12692/150276&quot;, &quot;type&quot;: &quot;thesis&quot;, &quot;title&quot;: &quot;Orientación vocacional y deserción universitaria en una universidad de Lima - 2024&quot;, &quot;genre&quot;: &quot;Tesis de maestría&quot;, &quot;publisher&quot;: &quot;Universidad César Vallejo&quot;, &quot;id&quot;: &quot;ITEM-297823cb-c975-5def-8698-5545884294cd&quot;, &quot;container-title-short&quot;: &quot;&quot;}, &quot;isTemporary&quot;: false}]}, {&quot;citationID&quot;: &quot;MENDELEY_CITATION_a124bf84-de92-4faa-9f8c-74102a36ef66&quot;, &quot;properties&quot;: {&quot;noteIndex&quot;: 0}, &quot;isEdited&quot;: false, &quot;manualOverride&quot;: {&quot;isManuallyOverridden&quot;: true, &quot;citeprocText&quot;: &quot;(Velasquez Velasquez, 2023)&quot;, &quot;manualOverrideText&quot;: &quot;Velasquez Velasquez (2023)&quot;}, &quot;citationItems&quot;: [{&quot;id&quot;: &quot;ITEM-051a1e9e-f6d9-5b1f-b8af-a7a21172dd72&quot;, &quot;itemData&quot;: {&quot;author&quot;: [{&quot;family&quot;: &quot;Velasquez Velasquez&quot;, &quot;given&quot;: &quot;S. D.&quot;, &quot;parse-names&quot;: false, &quot;dropping-particle&quot;: &quot;&quot;, &quot;non-dropping-particle&quot;: &quot;&quot;}], &quot;issued&quot;: {&quot;date-parts&quot;: [[2023]]}, &quot;URL&quot;: &quot;http://hdl.handle.net/20.500.12423/6921&quot;, &quot;type&quot;: &quot;thesis&quot;, &quot;title&quot;: &quot;La inteligencia artificial aplicada al sector educativo: una revisión sistemática de la literatura&quot;, &quot;genre&quot;: &quot;Trabajo de investigación de bachiller&quot;, &quot;publisher&quot;: &quot;Universidad Católica Santo Toribio de Mogrovejo&quot;, &quot;id&quot;: &quot;ITEM-051a1e9e-f6d9-5b1f-b8af-a7a21172dd72&quot;, &quot;container-title-short&quot;: &quot;&quot;}, &quot;isTemporary&quot;: false}]}, {&quot;citationID&quot;: &quot;MENDELEY_CITATION_2d0dd3e8-f997-4358-8825-0a35bacb1f5a&quot;, &quot;properties&quot;: {&quot;noteIndex&quot;: 0}, &quot;isEdited&quot;: false, &quot;manualOverride&quot;: {&quot;isManuallyOverridden&quot;: true, &quot;citeprocText&quot;: &quot;(Rodríguez Chipana, 2023)&quot;, &quot;manualOverrideText&quot;: &quot;Rodríguez Chipana (2023)&quot;}, &quot;citationItems&quot;: [{&quot;id&quot;: &quot;ITEM-58b6c010-e169-5596-822d-32c0b401cede&quot;, &quot;itemData&quot;: {&quot;author&quot;: [{&quot;family&quot;: &quot;Rodríguez Chipana&quot;, &quot;given&quot;: &quot;Y. M.&quot;, &quot;parse-names&quot;: false, &quot;dropping-particle&quot;: &quot;&quot;, &quot;non-dropping-particle&quot;: &quot;&quot;}], &quot;issued&quot;: {&quot;date-parts&quot;: [[2023]]}, &quot;URL&quot;: &quot;https://hdl.handle.net/20.500.12990/13324&quot;, &quot;type&quot;: &quot;thesis&quot;, &quot;title&quot;: &quot;Inteligencia artificial y rendimiento académico de los estudiantes de educación superior en la región Puno, 2022&quot;, &quot;genre&quot;: &quot;Tesis de maestría&quot;, &quot;publisher&quot;: &quot;Universidad Alas Peruanas&quot;, &quot;id&quot;: &quot;ITEM-58b6c010-e169-5596-822d-32c0b401cede&quot;, &quot;container-title-short&quot;: &quot;&quot;}, &quot;isTemporary&quot;: false}]}, {&quot;citationID&quot;: &quot;MENDELEY_CITATION_faa56043-f750-4248-a9fa-030814ae4d47&quot;, &quot;properties&quot;: {&quot;noteIndex&quot;: 0}, &quot;isEdited&quot;: false, &quot;manualOverride&quot;: {&quot;isManuallyOverridden&quot;: false, &quot;citeprocText&quot;: &quot;(Ferreyra et al., 2017)&quot;, &quot;manualOverrideText&quot;: &quot;&quot;}, &quot;citationItems&quot;: [{&quot;id&quot;: &quot;ITEM-a8f89f0e-10eb-5ccf-9b3b-e67a23b9a467&quot;, &quot;itemData&quot;: {&quot;author&quot;: [{&quot;family&quot;: &quot;Ferreyra&quot;, &quot;given&quot;: &quot;M. M.&quot;, &quot;parse-names&quot;: false, &quot;dropping-particle&quot;: &quot;&quot;, &quot;non-dropping-particle&quot;: &quot;&quot;}, {&quot;family&quot;: &quot;Avitabile&quot;, &quot;given&quot;: &quot;C.&quot;, &quot;parse-names&quot;: false, &quot;dropping-particle&quot;: &quot;&quot;, &quot;non-dropping-particle&quot;: &quot;&quot;}, {&quot;family&quot;: &quot;Botero Álvarez&quot;, &quot;given&quot;: &quot;J.&quot;, &quot;parse-names&quot;: false, &quot;dropping-particle&quot;: &quot;&quot;, &quot;non-dropping-particle&quot;: &quot;&quot;}, {&quot;family&quot;: &quot;Haimovich Paz&quot;, &quot;given&quot;: &quot;F.&quot;, &quot;parse-names&quot;: false, &quot;dropping-particle&quot;: &quot;&quot;, &quot;non-dropping-particle&quot;: &quot;&quot;}, {&quot;family&quot;: &quot;Urzúa&quot;, &quot;given&quot;: &quot;S.&quot;, &quot;parse-names&quot;: false, &quot;dropping-particle&quot;: &quot;&quot;, &quot;non-dropping-particle&quot;: &quot;&quot;}], &quot;issued&quot;: {&quot;date-parts&quot;: [[2017]]}, &quot;DOI&quot;: &quot;10.1596/978-1-4648-1014-5&quot;, &quot;type&quot;: &quot;book&quot;, &quot;title&quot;: &quot;Momento decisivo: la educación superior en América Latina y el Caribe&quot;, &quot;publisher&quot;: &quot;Banco Mundial&quot;, &quot;id&quot;: &quot;ITEM-a8f89f0e-10eb-5ccf-9b3b-e67a23b9a467&quot;, &quot;container-title-short&quot;: &quot;&quot;}, &quot;isTemporary&quot;: false}]}, {&quot;citationID&quot;: &quot;MENDELEY_CITATION_d9bf869c-6465-4dd0-b123-d42648734017&quot;, &quot;properties&quot;: {&quot;noteIndex&quot;: 0}, &quot;isEdited&quot;: false, &quot;manualOverride&quot;: {&quot;isManuallyOverridden&quot;: true, &quot;citeprocText&quot;: &quot;(Escalante López et al., 2023)&quot;, &quot;manualOverrideText&quot;: &quot;(Behr et al., 2020, como se citó en Escalante López et al., 2023)&quot;}, &quot;citationItems&quot;: [{&quot;id&quot;: &quot;ITEM-04a17615-a429-5a99-899e-3433dd572883&quot;, &quot;itemData&quot;: {&quot;author&quot;: [{&quot;family&quot;: &quot;Escalante López&quot;, &quot;given&quot;: &quot;J. I.&quot;, &quot;parse-names&quot;: false, &quot;dropping-particle&quot;: &quot;&quot;, &quot;non-dropping-particle&quot;: &quot;&quot;}, {&quot;family&quot;: &quot;Medina Valderrama&quot;, &quot;given&quot;: &quot;C. J.&quot;, &quot;parse-names&quot;: false, &quot;dropping-particle&quot;: &quot;&quot;, &quot;non-dropping-particle&quot;: &quot;&quot;}, {&quot;family&quot;: &quot;Vásquez Muñoz&quot;, &quot;given&quot;: &quot;A.&quot;, &quot;parse-names&quot;: false, &quot;dropping-particle&quot;: &quot;&quot;, &quot;non-dropping-particle&quot;: &quot;&quot;}], &quot;issued&quot;: {&quot;date-parts&quot;: [[2023]]}, &quot;DOI&quot;: &quot;10.26495/rch.v7i1.2421&quot;, &quot;type&quot;: &quot;article-journal&quot;, &quot;title&quot;: &quot;La deserción universitaria: un problema no resuelto en el Perú&quot;, &quot;container-title&quot;: &quot;Hacedor - AIAPÆC&quot;, &quot;volume&quot;: &quot;7&quot;, &quot;issue&quot;: &quot;1&quot;, &quot;page&quot;: &quot;60-72&quot;, &quot;id&quot;: &quot;ITEM-04a17615-a429-5a99-899e-3433dd572883&quot;, &quot;container-title-short&quot;: &quot;&quot;}, &quot;isTemporary&quot;: false}]}, {&quot;citationID&quot;: &quot;MENDELEY_CITATION_f78162d5-ad28-4739-84ac-771c1c2bf0e3&quot;, &quot;properties&quot;: {&quot;noteIndex&quot;: 0}, &quot;isEdited&quot;: false, &quot;manualOverride&quot;: {&quot;isManuallyOverridden&quot;: false, &quot;citeprocText&quot;: &quot;(Superintendencia Nacional de Educación Superior Universitaria, 2020)&quot;, &quot;manualOverrideText&quot;: &quot;&quot;}, &quot;citationItems&quot;: [{&quot;id&quot;: &quot;ITEM-a2cb132e-528c-5815-9af3-ec6970dc84a9&quot;, &quot;itemData&quot;: {&quot;author&quot;: [{&quot;literal&quot;: &quot;Superintendencia Nacional de Educación Superior Universitaria&quot;}], &quot;issued&quot;: {&quot;date-parts&quot;: [[2020]]}, &quot;URL&quot;: &quot;https://hdl.handle.net/20.500.12799/6911&quot;, &quot;type&quot;: &quot;book&quot;, &quot;title&quot;: &quot;II Informe bienal sobre la realidad universitaria en el Perú&quot;, &quot;publisher&quot;: &quot;SUNEDU&quot;, &quot;id&quot;: &quot;ITEM-a2cb132e-528c-5815-9af3-ec6970dc84a9&quot;, &quot;container-title-short&quot;: &quot;&quot;}, &quot;isTemporary&quot;: false}]}, {&quot;citationID&quot;: &quot;MENDELEY_CITATION_987b9027-1ddb-4903-b4de-3c907e4bdd17&quot;, &quot;properties&quot;: {&quot;noteIndex&quot;: 0}, &quot;isEdited&quot;: false, &quot;manualOverride&quot;: {&quot;isManuallyOverridden&quot;: true, &quot;citeprocText&quot;: &quot;(Escalante López et al., 2023)&quot;, &quot;manualOverrideText&quot;: &quot;Escalante López et al. (2023)&quot;}, &quot;citationItems&quot;: [{&quot;id&quot;: &quot;ITEM-04a17615-a429-5a99-899e-3433dd572883&quot;, &quot;itemData&quot;: {&quot;author&quot;: [{&quot;family&quot;: &quot;Escalante López&quot;, &quot;given&quot;: &quot;J. I.&quot;, &quot;parse-names&quot;: false, &quot;dropping-particle&quot;: &quot;&quot;, &quot;non-dropping-particle&quot;: &quot;&quot;}, {&quot;family&quot;: &quot;Medina Valderrama&quot;, &quot;given&quot;: &quot;C. J.&quot;, &quot;parse-names&quot;: false, &quot;dropping-particle&quot;: &quot;&quot;, &quot;non-dropping-particle&quot;: &quot;&quot;}, {&quot;family&quot;: &quot;Vásquez Muñoz&quot;, &quot;given&quot;: &quot;A.&quot;, &quot;parse-names&quot;: false, &quot;dropping-particle&quot;: &quot;&quot;, &quot;non-dropping-particle&quot;: &quot;&quot;}], &quot;issued&quot;: {&quot;date-parts&quot;: [[2023]]}, &quot;DOI&quot;: &quot;10.26495/rch.v7i1.2421&quot;, &quot;type&quot;: &quot;article-journal&quot;, &quot;title&quot;: &quot;La deserción universitaria: un problema no resuelto en el Perú&quot;, &quot;container-title&quot;: &quot;Hacedor - AIAPÆC&quot;, &quot;volume&quot;: &quot;7&quot;, &quot;issue&quot;: &quot;1&quot;, &quot;page&quot;: &quot;60-72&quot;, &quot;id&quot;: &quot;ITEM-04a17615-a429-5a99-899e-3433dd572883&quot;, &quot;container-title-short&quot;: &quot;&quot;}, &quot;isTemporary&quot;: false}]}, {&quot;citationID&quot;: &quot;MENDELEY_CITATION_4ddeaae7-9b96-4a9a-92bc-1e6747bca0b1&quot;, &quot;properties&quot;: {&quot;noteIndex&quot;: 0}, &quot;isEdited&quot;: false, &quot;manualOverride&quot;: {&quot;isManuallyOverridden&quot;: false, &quot;citeprocText&quot;: &quot;(Escobar-Mamani y Cuentas Yupanqui, 2024)&quot;, &quot;manualOverrideText&quot;: &quot;&quot;}, &quot;citationItems&quot;: [{&quot;id&quot;: &quot;ITEM-16534d55-37e8-5587-acfc-b1576f3e003e&quot;, &quot;itemData&quot;: {&quot;author&quot;: [{&quot;family&quot;: &quot;Escobar-Mamani&quot;, &quot;given&quot;: &quot;F.&quot;, &quot;parse-names&quot;: false, &quot;dropping-particle&quot;: &quot;&quot;, &quot;non-dropping-particle&quot;: &quot;&quot;}, {&quot;family&quot;: &quot;Cuentas Yupanqui&quot;, &quot;given&quot;: &quot;S. R.&quot;, &quot;parse-names&quot;: false, &quot;dropping-particle&quot;: &quot;&quot;, &quot;non-dropping-particle&quot;: &quot;&quot;}], &quot;issued&quot;: {&quot;date-parts&quot;: [[2024]]}, &quot;DOI&quot;: &quot;10.70123/jht.7&quot;, &quot;type&quot;: &quot;article-journal&quot;, &quot;title&quot;: &quot;Situación académica de estudiantes con matrícula regular y en riesgo académico en la Universidad Nacional del Altiplano, 2023-II&quot;, &quot;container-title&quot;: &quot;Journal of Humanities Titicaca&quot;, &quot;volume&quot;: &quot;2&quot;, &quot;issue&quot;: &quot;1&quot;, &quot;page&quot;: &quot;66-88&quot;, &quot;id&quot;: &quot;ITEM-16534d55-37e8-5587-acfc-b1576f3e003e&quot;, &quot;container-title-short&quot;: &quot;&quot;}, &quot;isTemporary&quot;: false}]}, {&quot;citationID&quot;: &quot;MENDELEY_CITATION_47dcb13e-bdd0-4722-adfa-0d327abc2daa&quot;, &quot;properties&quot;: {&quot;noteIndex&quot;: 0}, &quot;isEdited&quot;: false, &quot;manualOverride&quot;: {&quot;isManuallyOverridden&quot;: false, &quot;citeprocText&quot;: &quot;(Rodríguez Chipana, 2023)&quot;, &quot;manualOverrideText&quot;: &quot;&quot;}, &quot;citationItems&quot;: [{&quot;id&quot;: &quot;ITEM-58b6c010-e169-5596-822d-32c0b401cede&quot;, &quot;itemData&quot;: {&quot;author&quot;: [{&quot;family&quot;: &quot;Rodríguez Chipana&quot;, &quot;given&quot;: &quot;Y. M.&quot;, &quot;parse-names&quot;: false, &quot;dropping-particle&quot;: &quot;&quot;, &quot;non-dropping-particle&quot;: &quot;&quot;}], &quot;issued&quot;: {&quot;date-parts&quot;: [[2023]]}, &quot;URL&quot;: &quot;https://hdl.handle.net/20.500.12990/13324&quot;, &quot;type&quot;: &quot;thesis&quot;, &quot;title&quot;: &quot;Inteligencia artificial y rendimiento académico de los estudiantes de educación superior en la región Puno, 2022&quot;, &quot;genre&quot;: &quot;Tesis de maestría&quot;, &quot;publisher&quot;: &quot;Universidad Alas Peruanas&quot;, &quot;id&quot;: &quot;ITEM-58b6c010-e169-5596-822d-32c0b401cede&quot;, &quot;container-title-short&quot;: &quot;&quot;}, &quot;isTemporary&quot;: false}]}, {&quot;citationID&quot;: &quot;MENDELEY_CITATION_80a76817-4681-40b0-9225-2afdcb9d5324&quot;, &quot;properties&quot;: {&quot;noteIndex&quot;: 0}, &quot;isEdited&quot;: false, &quot;manualOverride&quot;: {&quot;isManuallyOverridden&quot;: false, &quot;citeprocText&quot;: &quot;(Rodas Zegarra de Escalante, 2024)&quot;, &quot;manualOverrideText&quot;: &quot;&quot;}, &quot;citationItems&quot;: [{&quot;id&quot;: &quot;ITEM-297823cb-c975-5def-8698-5545884294cd&quot;, &quot;itemData&quot;: {&quot;author&quot;: [{&quot;family&quot;: &quot;Rodas Zegarra de Escalante&quot;, &quot;given&quot;: &quot;A.&quot;, &quot;parse-names&quot;: false, &quot;dropping-particle&quot;: &quot;&quot;, &quot;non-dropping-particle&quot;: &quot;&quot;}], &quot;issued&quot;: {&quot;date-parts&quot;: [[2024]]}, &quot;URL&quot;: &quot;https://hdl.handle.net/20.500.12692/150276&quot;, &quot;type&quot;: &quot;thesis&quot;, &quot;title&quot;: &quot;Orientación vocacional y deserción universitaria en una universidad de Lima - 2024&quot;, &quot;genre&quot;: &quot;Tesis de maestría&quot;, &quot;publisher&quot;: &quot;Universidad César Vallejo&quot;, &quot;id&quot;: &quot;ITEM-297823cb-c975-5def-8698-5545884294cd&quot;, &quot;container-title-short&quot;: &quot;&quot;}, &quot;isTemporary&quot;: false}]}, {&quot;citationID&quot;: &quot;MENDELEY_CITATION_e04da67b-5c3a-4b5e-98df-b004280b1d90&quot;, &quot;properties&quot;: {&quot;noteIndex&quot;: 0}, &quot;isEdited&quot;: false, &quot;manualOverride&quot;: {&quot;isManuallyOverridden&quot;: false, &quot;citeprocText&quot;: &quot;(Mann y Whitney, 1947)&quot;, &quot;manualOverrideText&quot;: &quot;&quot;}, &quot;citationItems&quot;: [{&quot;id&quot;: &quot;ITEM-a0bf7f6d-c22f-50eb-b4cf-1a6eaba16e92&quot;, &quot;itemData&quot;: {&quot;author&quot;: [{&quot;family&quot;: &quot;Mann&quot;, &quot;given&quot;: &quot;H. B.&quot;, &quot;parse-names&quot;: false, &quot;dropping-particle&quot;: &quot;&quot;, &quot;non-dropping-particle&quot;: &quot;&quot;}, {&quot;family&quot;: &quot;Whitney&quot;, &quot;given&quot;: &quot;D. R.&quot;, &quot;parse-names&quot;: false, &quot;dropping-particle&quot;: &quot;&quot;, &quot;non-dropping-particle&quot;: &quot;&quot;}], &quot;issued&quot;: {&quot;date-parts&quot;: [[1947]]}, &quot;DOI&quot;: &quot;10.1214/aoms/1177730491&quot;, &quot;type&quot;: &quot;article-journal&quot;, &quot;title&quot;: &quot;On a test of whether one of two random variables is stochastically larger than the other&quot;, &quot;container-title&quot;: &quot;The Annals of Mathematical Statistics&quot;, &quot;volume&quot;: &quot;18&quot;, &quot;issue&quot;: &quot;1&quot;, &quot;page&quot;: &quot;50-60&quot;, &quot;id&quot;: &quot;ITEM-a0bf7f6d-c22f-50eb-b4cf-1a6eaba16e92&quot;, &quot;container-title-short&quot;: &quot;&quot;}, &quot;isTemporary&quot;: false}]}, {&quot;citationID&quot;: &quot;MENDELEY_CITATION_43e20c88-d260-4455-92b6-3d826dd8c189&quot;, &quot;properties&quot;: {&quot;noteIndex&quot;: 0}, &quot;isEdited&quot;: false, &quot;manualOverride&quot;: {&quot;isManuallyOverridden&quot;: false, &quot;citeprocText&quot;: &quot;(Cliff, 1993)&quot;, &quot;manualOverrideText&quot;: &quot;&quot;}, &quot;citationItems&quot;: [{&quot;id&quot;: &quot;ITEM-02d3d39e-1c5a-533a-844d-5bb46c2ecac4&quot;, &quot;itemData&quot;: {&quot;author&quot;: [{&quot;family&quot;: &quot;Cliff&quot;, &quot;given&quot;: &quot;N.&quot;, &quot;parse-names&quot;: false, &quot;dropping-particle&quot;: &quot;&quot;, &quot;non-dropping-particle&quot;: &quot;&quot;}], &quot;issued&quot;: {&quot;date-parts&quot;: [[1993]]}, &quot;DOI&quot;: &quot;10.1037/0033-2909.114.3.494&quot;, &quot;type&quot;: &quot;article-journal&quot;, &quot;title&quot;: &quot;Dominance statistics: Ordinal analyses to answer ordinal questions&quot;, &quot;container-title&quot;: &quot;Psychological Bulletin&quot;, &quot;volume&quot;: &quot;114&quot;, &quot;issue&quot;: &quot;3&quot;, &quot;page&quot;: &quot;494-509&quot;, &quot;id&quot;: &quot;ITEM-02d3d39e-1c5a-533a-844d-5bb46c2ecac4&quot;, &quot;container-title-short&quot;: &quot;&quot;}, &quot;isTemporary&quot;: false}]}, {&quot;citationID&quot;: &quot;MENDELEY_CITATION_6e4beefc-a7f1-4e91-9793-53dd68dd1ee8&quot;, &quot;properties&quot;: {&quot;noteIndex&quot;: 0}, &quot;isEdited&quot;: false, &quot;manualOverride&quot;: {&quot;isManuallyOverridden&quot;: false, &quot;citeprocText&quot;: &quot;(Cramér, 1946)&quot;, &quot;manualOverrideText&quot;: &quot;&quot;}, &quot;citationItems&quot;: [{&quot;id&quot;: &quot;ITEM-8c327639-514d-536d-95ba-80d06d096139&quot;, &quot;itemData&quot;: {&quot;author&quot;: [{&quot;family&quot;: &quot;Cramér&quot;, &quot;given&quot;: &quot;H.&quot;, &quot;parse-names&quot;: false, &quot;dropping-particle&quot;: &quot;&quot;, &quot;non-dropping-particle&quot;: &quot;&quot;}], &quot;issued&quot;: {&quot;date-parts&quot;: [[1946]]}, &quot;DOI&quot;: &quot;10.1515/9781400883868&quot;, &quot;type&quot;: &quot;book&quot;, &quot;title&quot;: &quot;Mathematical methods of statistics&quot;, &quot;publisher&quot;: &quot;Princeton University Press&quot;, &quot;id&quot;: &quot;ITEM-8c327639-514d-536d-95ba-80d06d096139&quot;, &quot;container-title-short&quot;: &quot;&quot;}, &quot;isTemporary&quot;: false}]}, {&quot;citationID&quot;: &quot;MENDELEY_CITATION_a9e8ce77-041e-4fbe-af3e-2901ed20741b&quot;, &quot;properties&quot;: {&quot;noteIndex&quot;: 0}, &quot;isEdited&quot;: false, &quot;manualOverride&quot;: {&quot;isManuallyOverridden&quot;: false, &quot;citeprocText&quot;: &quot;(Hanley y McNeil, 1982)&quot;, &quot;manualOverrideText&quot;: &quot;&quot;}, &quot;citationItems&quot;: [{&quot;id&quot;: &quot;ITEM-ba297aa3-b2fc-5a21-87eb-bc760183eab4&quot;, &quot;itemData&quot;: {&quot;author&quot;: [{&quot;family&quot;: &quot;Hanley&quot;, &quot;given&quot;: &quot;J. A.&quot;, &quot;parse-names&quot;: false, &quot;dropping-particle&quot;: &quot;&quot;, &quot;non-dropping-particle&quot;: &quot;&quot;}, {&quot;family&quot;: &quot;McNeil&quot;, &quot;given&quot;: &quot;B. J.&quot;, &quot;parse-names&quot;: false, &quot;dropping-particle&quot;: &quot;&quot;, &quot;non-dropping-particle&quot;: &quot;&quot;}], &quot;issued&quot;: {&quot;date-parts&quot;: [[1982]]}, &quot;DOI&quot;: &quot;10.1148/radiology.143.1.7063747&quot;, &quot;type&quot;: &quot;article-journal&quot;, &quot;title&quot;: &quot;The meaning and use of the area under a receiver operating characteristic (ROC) curve&quot;, &quot;container-title&quot;: &quot;Radiology&quot;, &quot;volume&quot;: &quot;143&quot;, &quot;issue&quot;: &quot;1&quot;, &quot;page&quot;: &quot;29-36&quot;, &quot;id&quot;: &quot;ITEM-ba297aa3-b2fc-5a21-87eb-bc760183eab4&quot;, &quot;container-title-short&quot;: &quot;&quot;}, &quot;isTemporary&quot;: false}]}, {&quot;citationID&quot;: &quot;MENDELEY_CITATION_c1a58538-8461-4ea1-b8fb-06b556fcfa6f&quot;, &quot;properties&quot;: {&quot;noteIndex&quot;: 0}, &quot;isEdited&quot;: false, &quot;manualOverride&quot;: {&quot;isManuallyOverridden&quot;: false, &quot;citeprocText&quot;: &quot;(Saito y Rehmsmeier, 2015)&quot;, &quot;manualOverrideText&quot;: &quot;&quot;}, &quot;citationItems&quot;: [{&quot;id&quot;: &quot;ITEM-bc916a3b-0d2f-54f4-bce7-658872a179e1&quot;, &quot;itemData&quot;: {&quot;author&quot;: [{&quot;family&quot;: &quot;Saito&quot;, &quot;given&quot;: &quot;T.&quot;, &quot;parse-names&quot;: false, &quot;dropping-particle&quot;: &quot;&quot;, &quot;non-dropping-particle&quot;: &quot;&quot;}, {&quot;family&quot;: &quot;Rehmsmeier&quot;, &quot;given&quot;: &quot;M.&quot;, &quot;parse-names&quot;: false, &quot;dropping-particle&quot;: &quot;&quot;, &quot;non-dropping-particle&quot;: &quot;&quot;}], &quot;issued&quot;: {&quot;date-parts&quot;: [[2015]]}, &quot;DOI&quot;: &quot;10.1371/journal.pone.0118432&quot;, &quot;type&quot;: &quot;article-journal&quot;, &quot;title&quot;: &quot;The precision-recall plot is more informative than the ROC plot when evaluating binary classifiers on imbalanced datasets&quot;, &quot;container-title&quot;: &quot;PLOS ONE&quot;, &quot;volume&quot;: &quot;10&quot;, &quot;issue&quot;: &quot;3&quot;, &quot;page&quot;: &quot;e0118432&quot;, &quot;id&quot;: &quot;ITEM-bc916a3b-0d2f-54f4-bce7-658872a179e1&quot;, &quot;container-title-short&quot;: &quot;&quot;}, &quot;isTemporary&quot;: false}]}, {&quot;citationID&quot;: &quot;MENDELEY_CITATION_fb250e9b-d9ce-40f3-93ad-a648c8b0ec9b&quot;, &quot;properties&quot;: {&quot;noteIndex&quot;: 0}, &quot;isEdited&quot;: false, &quot;manualOverride&quot;: {&quot;isManuallyOverridden&quot;: false, &quot;citeprocText&quot;: &quot;(Zadrozny y Elkan, 2002)&quot;, &quot;manualOverrideText&quot;: &quot;&quot;}, &quot;citationItems&quot;: [{&quot;id&quot;: &quot;ITEM-298cf3e0-fabe-51a7-a6b1-d18f99476527&quot;, &quot;itemData&quot;: {&quot;author&quot;: [{&quot;family&quot;: &quot;Zadrozny&quot;, &quot;given&quot;: &quot;B.&quot;, &quot;parse-names&quot;: false, &quot;dropping-particle&quot;: &quot;&quot;, &quot;non-dropping-particle&quot;: &quot;&quot;}, {&quot;family&quot;: &quot;Elkan&quot;, &quot;given&quot;: &quot;C.&quot;, &quot;parse-names&quot;: false, &quot;dropping-particle&quot;: &quot;&quot;, &quot;non-dropping-particle&quot;: &quot;&quot;}], &quot;issued&quot;: {&quot;date-parts&quot;: [[2002]]}, &quot;DOI&quot;: &quot;10.1145/775047.775151&quot;, &quot;type&quot;: &quot;paper-conference&quot;, &quot;title&quot;: &quot;Transforming classifier scores into accurate multiclass probability estimates&quot;, &quot;container-title&quot;: &quot;Proceedings of the Eighth ACM SIGKDD International Conference on Knowledge Discovery and Data Mining&quot;, &quot;page&quot;: &quot;694-699&quot;, &quot;id&quot;: &quot;ITEM-298cf3e0-fabe-51a7-a6b1-d18f99476527&quot;, &quot;container-title-short&quot;: &quot;&quot;}, &quot;isTemporary&quot;: false}]}, {&quot;citationID&quot;: &quot;MENDELEY_CITATION_618d91c3-1fd4-4f7b-b581-ebd7f0d308df&quot;, &quot;properties&quot;: {&quot;noteIndex&quot;: 0}, &quot;isEdited&quot;: false, &quot;manualOverride&quot;: {&quot;isManuallyOverridden&quot;: false, &quot;citeprocText&quot;: &quot;(Brier, 1950)&quot;, &quot;manualOverrideText&quot;: &quot;&quot;}, &quot;citationItems&quot;: [{&quot;id&quot;: &quot;ITEM-776f22b4-afe8-5194-a1b7-5e15e5c48ed3&quot;, &quot;itemData&quot;: {&quot;author&quot;: [{&quot;family&quot;: &quot;Brier&quot;, &quot;given&quot;: &quot;G. W.&quot;, &quot;parse-names&quot;: false, &quot;dropping-particle&quot;: &quot;&quot;, &quot;non-dropping-particle&quot;: &quot;&quot;}], &quot;issued&quot;: {&quot;date-parts&quot;: [[1950]]}, &quot;DOI&quot;: &quot;10.1175/1520-0493(1950)078&lt;0001:VOFEIT&gt;2.0.CO;2&quot;, &quot;type&quot;: &quot;article-journal&quot;, &quot;title&quot;: &quot;Verification of forecasts expressed in terms of probability&quot;, &quot;container-title&quot;: &quot;Monthly Weather Review&quot;, &quot;volume&quot;: &quot;78&quot;, &quot;issue&quot;: &quot;1&quot;, &quot;page&quot;: &quot;1-3&quot;, &quot;id&quot;: &quot;ITEM-776f22b4-afe8-5194-a1b7-5e15e5c48ed3&quot;, &quot;container-title-short&quot;: &quot;&quot;}, &quot;isTemporary&quot;: false}]}, {&quot;citationID&quot;: &quot;MENDELEY_CITATION_7bf239c8-2a92-4b28-9bb4-83cd84f3acf7&quot;, &quot;properties&quot;: {&quot;noteIndex&quot;: 0}, &quot;isEdited&quot;: false, &quot;manualOverride&quot;: {&quot;isManuallyOverridden&quot;: false, &quot;citeprocText&quot;: &quot;(Lin, 2004)&quot;, &quot;manualOverrideText&quot;: &quot;&quot;}, &quot;citationItems&quot;: [{&quot;id&quot;: &quot;ITEM-4c670ef2-d773-5121-82ef-8d74a63fa86e&quot;, &quot;itemData&quot;: {&quot;author&quot;: [{&quot;family&quot;: &quot;Lin&quot;, &quot;given&quot;: &quot;C.-Y.&quot;, &quot;parse-names&quot;: false, &quot;dropping-particle&quot;: &quot;&quot;, &quot;non-dropping-particle&quot;: &quot;&quot;}], &quot;issued&quot;: {&quot;date-parts&quot;: [[2004]]}, &quot;URL&quot;: &quot;https://aclanthology.org/W04-1013/&quot;, &quot;type&quot;: &quot;paper-conference&quot;, &quot;title&quot;: &quot;ROUGE: A package for automatic evaluation of summaries&quot;, &quot;container-title&quot;: &quot;Text Summarization Branches Out&quot;, &quot;page&quot;: &quot;74-81&quot;, &quot;publisher&quot;: &quot;Association for Computational Linguistics&quot;, &quot;id&quot;: &quot;ITEM-4c670ef2-d773-5121-82ef-8d74a63fa86e&quot;, &quot;container-title-short&quot;: &quot;&quot;}, &quot;isTemporary&quot;: false}]}, {&quot;citationID&quot;: &quot;MENDELEY_CITATION_a907b2cf-0b35-49be-b3fa-cd3c38666fd7&quot;, &quot;properties&quot;: {&quot;noteIndex&quot;: 0}, &quot;isEdited&quot;: false, &quot;manualOverride&quot;: {&quot;isManuallyOverridden&quot;: false, &quot;citeprocText&quot;: &quot;(Zhang et al., 2020)&quot;, &quot;manualOverrideText&quot;: &quot;&quot;}, &quot;citationItems&quot;: [{&quot;id&quot;: &quot;ITEM-b52ef349-b8ca-5686-84a5-ee1e80905b85&quot;, &quot;itemData&quot;: {&quot;author&quot;: [{&quot;family&quot;: &quot;Zhang&quot;, &quot;given&quot;: &quot;T.&quot;, &quot;parse-names&quot;: false, &quot;dropping-particle&quot;: &quot;&quot;, &quot;non-dropping-particle&quot;: &quot;&quot;}, {&quot;family&quot;: &quot;Kishore&quot;, &quot;given&quot;: &quot;V.&quot;, &quot;parse-names&quot;: false, &quot;dropping-particle&quot;: &quot;&quot;, &quot;non-dropping-particle&quot;: &quot;&quot;}, {&quot;family&quot;: &quot;Wu&quot;, &quot;given&quot;: &quot;F.&quot;, &quot;parse-names&quot;: false, &quot;dropping-particle&quot;: &quot;&quot;, &quot;non-dropping-particle&quot;: &quot;&quot;}, {&quot;family&quot;: &quot;Weinberger&quot;, &quot;given&quot;: &quot;K. Q.&quot;, &quot;parse-names&quot;: false, &quot;dropping-particle&quot;: &quot;&quot;, &quot;non-dropping-particle&quot;: &quot;&quot;}, {&quot;family&quot;: &quot;Artzi&quot;, &quot;given&quot;: &quot;Y.&quot;, &quot;parse-names&quot;: false, &quot;dropping-particle&quot;: &quot;&quot;, &quot;non-dropping-particle&quot;: &quot;&quot;}], &quot;issued&quot;: {&quot;date-parts&quot;: [[2020]]}, &quot;DOI&quot;: &quot;10.48550/arXiv.1904.09675&quot;, &quot;type&quot;: &quot;paper-conference&quot;, &quot;title&quot;: &quot;BERTScore: Evaluating text generation with BERT&quot;, &quot;container-title&quot;: &quot;International Conference on Learning Representations&quot;, &quot;id&quot;: &quot;ITEM-b52ef349-b8ca-5686-84a5-ee1e80905b85&quot;, &quot;container-title-short&quot;: &quot;&quot;}, &quot;isTemporary&quot;: false}]}, {&quot;citationID&quot;: &quot;MENDELEY_CITATION_4426d7b6-20ab-407f-93ed-f040abfd36e8&quot;, &quot;properties&quot;: {&quot;noteIndex&quot;: 0}, &quot;isEdited&quot;: false, &quot;manualOverride&quot;: {&quot;isManuallyOverridden&quot;: false, &quot;citeprocText&quot;: &quot;(Järvelin y Kekäläinen, 2002)&quot;, &quot;manualOverrideText&quot;: &quot;&quot;}, &quot;citationItems&quot;: [{&quot;id&quot;: &quot;ITEM-09731480-e571-5a92-baf1-09e43623c231&quot;, &quot;itemData&quot;: {&quot;author&quot;: [{&quot;family&quot;: &quot;Järvelin&quot;, &quot;given&quot;: &quot;K.&quot;, &quot;parse-names&quot;: false, &quot;dropping-particle&quot;: &quot;&quot;, &quot;non-dropping-particle&quot;: &quot;&quot;}, {&quot;family&quot;: &quot;Kekäläinen&quot;, &quot;given&quot;: &quot;J.&quot;, &quot;parse-names&quot;: false, &quot;dropping-particle&quot;: &quot;&quot;, &quot;non-dropping-particle&quot;: &quot;&quot;}], &quot;issued&quot;: {&quot;date-parts&quot;: [[2002]]}, &quot;DOI&quot;: &quot;10.1145/582415.582418&quot;, &quot;type&quot;: &quot;article-journal&quot;, &quot;title&quot;: &quot;Cumulated gain-based evaluation of IR techniques&quot;, &quot;container-title&quot;: &quot;ACM Transactions on Information Systems&quot;, &quot;volume&quot;: &quot;20&quot;, &quot;issue&quot;: &quot;4&quot;, &quot;page&quot;: &quot;422-446&quot;, &quot;id&quot;: &quot;ITEM-09731480-e571-5a92-baf1-09e43623c231&quot;, &quot;container-title-short&quot;: &quot;&quot;}, &quot;isTemporary&quot;: false}]}, {&quot;citationID&quot;: &quot;MENDELEY_CITATION_f2bb6ea9-420f-419b-9db0-726a229073ff&quot;, &quot;properties&quot;: {&quot;noteIndex&quot;: 0}, &quot;isEdited&quot;: false, &quot;manualOverride&quot;: {&quot;isManuallyOverridden&quot;: false, &quot;citeprocText&quot;: &quot;(Voorhees, 1999)&quot;, &quot;manualOverrideText&quot;: &quot;&quot;}, &quot;citationItems&quot;: [{&quot;id&quot;: &quot;ITEM-fa3f1674-ed35-5374-b5d7-e3539fabe107&quot;, &quot;itemData&quot;: {&quot;author&quot;: [{&quot;family&quot;: &quot;Voorhees&quot;, &quot;given&quot;: &quot;E. M.&quot;, &quot;parse-names&quot;: false, &quot;dropping-particle&quot;: &quot;&quot;, &quot;non-dropping-particle&quot;: &quot;&quot;}], &quot;issued&quot;: {&quot;date-parts&quot;: [[1999]]}, &quot;URL&quot;: &quot;https://trec.nist.gov/pubs/trec8/papers/qa_report.pdf&quot;, &quot;type&quot;: &quot;paper-conference&quot;, &quot;title&quot;: &quot;The TREC-8 question answering track report&quot;, &quot;container-title&quot;: &quot;Proceedings of the Eighth Text REtrieval Conference&quot;, &quot;page&quot;: &quot;77-82&quot;, &quot;publisher&quot;: &quot;National Institute of Standards and Technology&quot;, &quot;id&quot;: &quot;ITEM-fa3f1674-ed35-5374-b5d7-e3539fabe107&quot;, &quot;container-title-short&quot;: &quot;&quot;}, &quot;isTemporary&quot;: false}]}, {&quot;citationID&quot;: &quot;MENDELEY_CITATION_784047d3-4dcb-42e0-9e9f-47dec0616d5f&quot;, &quot;properties&quot;: {&quot;noteIndex&quot;: 0}, &quot;isEdited&quot;: false, &quot;manualOverride&quot;: {&quot;isManuallyOverridden&quot;: false, &quot;citeprocText&quot;: &quot;(Wilcoxon, 1945)&quot;, &quot;manualOverrideText&quot;: &quot;&quot;}, &quot;citationItems&quot;: [{&quot;id&quot;: &quot;ITEM-612bd905-97c5-5cb0-a005-be28dbc83ac1&quot;, &quot;itemData&quot;: {&quot;author&quot;: [{&quot;family&quot;: &quot;Wilcoxon&quot;, &quot;given&quot;: &quot;F.&quot;, &quot;parse-names&quot;: false, &quot;dropping-particle&quot;: &quot;&quot;, &quot;non-dropping-particle&quot;: &quot;&quot;}], &quot;issued&quot;: {&quot;date-parts&quot;: [[1945]]}, &quot;DOI&quot;: &quot;10.2307/3001968&quot;, &quot;type&quot;: &quot;article-journal&quot;, &quot;title&quot;: &quot;Individual comparisons by ranking methods&quot;, &quot;container-title&quot;: &quot;Biometrics Bulletin&quot;, &quot;volume&quot;: &quot;1&quot;, &quot;issue&quot;: &quot;6&quot;, &quot;page&quot;: &quot;80-83&quot;, &quot;id&quot;: &quot;ITEM-612bd905-97c5-5cb0-a005-be28dbc83ac1&quot;, &quot;container-title-short&quot;: &quot;&quot;}, &quot;isTemporary&quot;: false}]}, {&quot;citationID&quot;: &quot;MENDELEY_CITATION_872bc701-fcad-4d27-a7d4-8d407c880d63&quot;, &quot;properties&quot;: {&quot;noteIndex&quot;: 0}, &quot;isEdited&quot;: false, &quot;manualOverride&quot;: {&quot;isManuallyOverridden&quot;: true, &quot;citeprocText&quot;: &quot;(Carballo-Mendívil et al., 2025)&quot;, &quot;manualOverrideText&quot;: &quot;Carballo-Mendívil et al. (2025)&quot;}, &quot;citationItems&quot;: [{&quot;id&quot;: &quot;ITEM-4755bb51-baf5-5536-8cda-5af1c04a59c8&quot;, &quot;itemData&quot;: {&quot;author&quot;: [{&quot;family&quot;: &quot;Carballo-Mendívil&quot;, &quot;given&quot;: &quot;B.&quot;, &quot;parse-names&quot;: false, &quot;dropping-particle&quot;: &quot;&quot;, &quot;non-dropping-particle&quot;: &quot;&quot;}, {&quot;family&quot;: &quot;Arellano-González&quot;, &quot;given&quot;: &quot;A.&quot;, &quot;parse-names&quot;: false, &quot;dropping-particle&quot;: &quot;&quot;, &quot;non-dropping-particle&quot;: &quot;&quot;}, {&quot;family&quot;: &quot;Ríos-Vázquez&quot;, &quot;given&quot;: &quot;N. J.&quot;, &quot;parse-names&quot;: false, &quot;dropping-particle&quot;: &quot;&quot;, &quot;non-dropping-particle&quot;: &quot;&quot;}, {&quot;family&quot;: &quot;Lizardi-Duarte&quot;, &quot;given&quot;: &quot;M. del P.&quot;, &quot;parse-names&quot;: false, &quot;dropping-particle&quot;: &quot;&quot;, &quot;non-dropping-particle&quot;: &quot;&quot;}], &quot;issued&quot;: {&quot;date-parts&quot;: [[2025]]}, &quot;DOI&quot;: &quot;10.3390/app15169202&quot;, &quot;type&quot;: &quot;article-journal&quot;, &quot;title&quot;: &quot;Predicting student dropout from day one: XGBoost-based early warning system using pre-enrollment data&quot;, &quot;container-title&quot;: &quot;Applied Sciences&quot;, &quot;volume&quot;: &quot;15&quot;, &quot;issue&quot;: &quot;16&quot;, &quot;page&quot;: &quot;9202&quot;, &quot;id&quot;: &quot;ITEM-4755bb51-baf5-5536-8cda-5af1c04a59c8&quot;, &quot;container-title-short&quot;: &quot;&quot;}, &quot;isTemporary&quot;: false}]}, {&quot;citationID&quot;: &quot;MENDELEY_CITATION_931de423-1147-4c74-93e4-85807b659775&quot;, &quot;properties&quot;: {&quot;noteIndex&quot;: 0}, &quot;isEdited&quot;: false, &quot;manualOverride&quot;: {&quot;isManuallyOverridden&quot;: true, &quot;citeprocText&quot;: &quot;(Guadalupe Mori, 2025)&quot;, &quot;manualOverrideText&quot;: &quot;Guadalupe Mori (2025)&quot;}, &quot;citationItems&quot;: [{&quot;id&quot;: &quot;ITEM-745e87b9-5edd-56c2-99e9-42f2290e8c38&quot;, &quot;itemData&quot;: {&quot;author&quot;: [{&quot;family&quot;: &quot;Guadalupe Mori&quot;, &quot;given&quot;: &quot;V. H.&quot;, &quot;parse-names&quot;: false, &quot;dropping-particle&quot;: &quot;&quot;, &quot;non-dropping-particle&quot;: &quot;&quot;}], &quot;issued&quot;: {&quot;date-parts&quot;: [[2025]]}, &quot;URL&quot;: &quot;https://hdl.handle.net/20.500.13084/10839&quot;, &quot;type&quot;: &quot;thesis&quot;, &quot;title&quot;: &quot;Modelo predictivo basado en machine learning para la reducción de la deserción estudiantil en las universidades privadas del Perú: caso Universidad Privada San Juan Bautista&quot;, &quot;genre&quot;: &quot;Tesis doctoral&quot;, &quot;publisher&quot;: &quot;Universidad Nacional Federico Villarreal&quot;, &quot;id&quot;: &quot;ITEM-745e87b9-5edd-56c2-99e9-42f2290e8c38&quot;, &quot;container-title-short&quot;: &quot;&quot;}, &quot;isTemporary&quot;: false}]}, {&quot;citationID&quot;: &quot;MENDELEY_CITATION_e471fd14-d813-4d24-98e0-8f6884ace55e&quot;, &quot;properties&quot;: {&quot;noteIndex&quot;: 0}, &quot;isEdited&quot;: false, &quot;manualOverride&quot;: {&quot;isManuallyOverridden&quot;: true, &quot;citeprocText&quot;: &quot;(Carballo-Mendívil et al., 2025)&quot;, &quot;manualOverrideText&quot;: &quot;Carballo-Mendívil et al. (2025)&quot;}, &quot;citationItems&quot;: [{&quot;id&quot;: &quot;ITEM-4755bb51-baf5-5536-8cda-5af1c04a59c8&quot;, &quot;itemData&quot;: {&quot;author&quot;: [{&quot;family&quot;: &quot;Carballo-Mendívil&quot;, &quot;given&quot;: &quot;B.&quot;, &quot;parse-names&quot;: false, &quot;dropping-particle&quot;: &quot;&quot;, &quot;non-dropping-particle&quot;: &quot;&quot;}, {&quot;family&quot;: &quot;Arellano-González&quot;, &quot;given&quot;: &quot;A.&quot;, &quot;parse-names&quot;: false, &quot;dropping-particle&quot;: &quot;&quot;, &quot;non-dropping-particle&quot;: &quot;&quot;}, {&quot;family&quot;: &quot;Ríos-Vázquez&quot;, &quot;given&quot;: &quot;N. J.&quot;, &quot;parse-names&quot;: false, &quot;dropping-particle&quot;: &quot;&quot;, &quot;non-dropping-particle&quot;: &quot;&quot;}, {&quot;family&quot;: &quot;Lizardi-Duarte&quot;, &quot;given&quot;: &quot;M. del P.&quot;, &quot;parse-names&quot;: false, &quot;dropping-particle&quot;: &quot;&quot;, &quot;non-dropping-particle&quot;: &quot;&quot;}], &quot;issued&quot;: {&quot;date-parts&quot;: [[2025]]}, &quot;DOI&quot;: &quot;10.3390/app15169202&quot;, &quot;type&quot;: &quot;article-journal&quot;, &quot;title&quot;: &quot;Predicting student dropout from day one: XGBoost-based early warning system using pre-enrollment data&quot;, &quot;container-title&quot;: &quot;Applied Sciences&quot;, &quot;volume&quot;: &quot;15&quot;, &quot;issue&quot;: &quot;16&quot;, &quot;page&quot;: &quot;9202&quot;, &quot;id&quot;: &quot;ITEM-4755bb51-baf5-5536-8cda-5af1c04a59c8&quot;, &quot;container-title-short&quot;: &quot;&quot;}, &quot;isTemporary&quot;: false}]}, {&quot;citationID&quot;: &quot;MENDELEY_CITATION_959e1311-f2b7-402c-83f9-2be69e981725&quot;, &quot;properties&quot;: {&quot;noteIndex&quot;: 0}, &quot;isEdited&quot;: false, &quot;manualOverride&quot;: {&quot;isManuallyOverridden&quot;: true, &quot;citeprocText&quot;: &quot;(Yataco Cañari y Jacha Rojas, 2024)&quot;, &quot;manualOverrideText&quot;: &quot;Yataco Cañari y Jacha Rojas (2024)&quot;}, &quot;citationItems&quot;: [{&quot;id&quot;: &quot;ITEM-02ada8e7-47d2-5940-ab09-a30ce56e4fb6&quot;, &quot;itemData&quot;: {&quot;author&quot;: [{&quot;family&quot;: &quot;Yataco Cañari&quot;, &quot;given&quot;: &quot;W.&quot;, &quot;parse-names&quot;: false, &quot;dropping-particle&quot;: &quot;&quot;, &quot;non-dropping-particle&quot;: &quot;&quot;}, {&quot;family&quot;: &quot;Jacha Rojas&quot;, &quot;given&quot;: &quot;J. P.&quot;, &quot;parse-names&quot;: false, &quot;dropping-particle&quot;: &quot;&quot;, &quot;non-dropping-particle&quot;: &quot;&quot;}], &quot;issued&quot;: {&quot;date-parts&quot;: [[2024]]}, &quot;URL&quot;: &quot;https://hdl.handle.net/20.500.12840/7597&quot;, &quot;type&quot;: &quot;thesis&quot;, &quot;title&quot;: &quot;Modelo machine learning para predicción de deserción estudiantil&quot;, &quot;genre&quot;: &quot;Trabajo académico de segunda especialidad&quot;, &quot;publisher&quot;: &quot;Universidad Peruana Unión&quot;, &quot;id&quot;: &quot;ITEM-02ada8e7-47d2-5940-ab09-a30ce56e4fb6&quot;, &quot;container-title-short&quot;: &quot;&quot;}, &quot;isTemporary&quot;: false}]}, {&quot;citationID&quot;: &quot;MENDELEY_CITATION_df98d636-8404-4ebe-9b3d-d65035d0470c&quot;, &quot;properties&quot;: {&quot;noteIndex&quot;: 0}, &quot;isEdited&quot;: false, &quot;manualOverride&quot;: {&quot;isManuallyOverridden&quot;: true, &quot;citeprocText&quot;: &quot;(Aguilar-Reyes et al., 2025)&quot;, &quot;manualOverrideText&quot;: &quot;Aguilar-Reyes et al. (2025)&quot;}, &quot;citationItems&quot;: [{&quot;id&quot;: &quot;ITEM-8c9c99df-1678-5fab-b737-85f1e9842ee2&quot;, &quot;itemData&quot;: {&quot;author&quot;: [{&quot;family&quot;: &quot;Aguilar-Reyes&quot;, &quot;given&quot;: &quot;J. E.&quot;, &quot;parse-names&quot;: false, &quot;dropping-particle&quot;: &quot;&quot;, &quot;non-dropping-particle&quot;: &quot;&quot;}, {&quot;family&quot;: &quot;Mejía-Peñafiel&quot;, &quot;given&quot;: &quot;E. F.&quot;, &quot;parse-names&quot;: false, &quot;dropping-particle&quot;: &quot;&quot;, &quot;non-dropping-particle&quot;: &quot;&quot;}, {&quot;family&quot;: &quot;Morocho-Barrionuevo&quot;, &quot;given&quot;: &quot;T. P.&quot;, &quot;parse-names&quot;: false, &quot;dropping-particle&quot;: &quot;&quot;, &quot;non-dropping-particle&quot;: &quot;&quot;}, {&quot;family&quot;: &quot;Velasco-Castelo&quot;, &quot;given&quot;: &quot;G.-M.&quot;, &quot;parse-names&quot;: false, &quot;dropping-particle&quot;: &quot;&quot;, &quot;non-dropping-particle&quot;: &quot;&quot;}], &quot;issued&quot;: {&quot;date-parts&quot;: [[2025]]}, &quot;DOI&quot;: &quot;10.36390/telos271.08&quot;, &quot;type&quot;: &quot;article-journal&quot;, &quot;title&quot;: &quot;Estudio del rendimiento académico mediante la comparación de modelos de regresión y árboles de clasificación&quot;, &quot;container-title&quot;: &quot;Telos: Revista de Estudios Interdisciplinarios en Ciencias Sociales&quot;, &quot;volume&quot;: &quot;27&quot;, &quot;issue&quot;: &quot;1&quot;, &quot;page&quot;: &quot;94-115&quot;, &quot;id&quot;: &quot;ITEM-8c9c99df-1678-5fab-b737-85f1e9842ee2&quot;, &quot;container-title-short&quot;: &quot;&quot;}, &quot;isTemporary&quot;: false}]}, {&quot;citationID&quot;: &quot;MENDELEY_CITATION_de15630c-2613-462c-bd07-a80753ec0afe&quot;, &quot;properties&quot;: {&quot;noteIndex&quot;: 0}, &quot;isEdited&quot;: false, &quot;manualOverride&quot;: {&quot;isManuallyOverridden&quot;: true, &quot;citeprocText&quot;: &quot;(Fang et al., 2024)&quot;, &quot;manualOverrideText&quot;: &quot;Fang et al. (2024)&quot;}, &quot;citationItems&quot;: [{&quot;id&quot;: &quot;ITEM-5007b438-b37f-541e-8fca-2748edacc281&quot;, &quot;itemData&quot;: {&quot;author&quot;: [{&quot;family&quot;: &quot;Fang&quot;, &quot;given&quot;: &quot;X.&quot;, &quot;parse-names&quot;: false, &quot;dropping-particle&quot;: &quot;&quot;, &quot;non-dropping-particle&quot;: &quot;&quot;}, {&quot;family&quot;: &quot;Xu&quot;, &quot;given&quot;: &quot;W.&quot;, &quot;parse-names&quot;: false, &quot;dropping-particle&quot;: &quot;&quot;, &quot;non-dropping-particle&quot;: &quot;&quot;}, {&quot;family&quot;: &quot;Tan&quot;, &quot;given&quot;: &quot;F. A.&quot;, &quot;parse-names&quot;: false, &quot;dropping-particle&quot;: &quot;&quot;, &quot;non-dropping-particle&quot;: &quot;&quot;}, {&quot;family&quot;: &quot;Zhang&quot;, &quot;given&quot;: &quot;J.&quot;, &quot;parse-names&quot;: false, &quot;dropping-particle&quot;: &quot;&quot;, &quot;non-dropping-particle&quot;: &quot;&quot;}, {&quot;family&quot;: &quot;Hu&quot;, &quot;given&quot;: &quot;Z.&quot;, &quot;parse-names&quot;: false, &quot;dropping-particle&quot;: &quot;&quot;, &quot;non-dropping-particle&quot;: &quot;&quot;}, {&quot;family&quot;: &quot;Qi&quot;, &quot;given&quot;: &quot;Y.&quot;, &quot;parse-names&quot;: false, &quot;dropping-particle&quot;: &quot;&quot;, &quot;non-dropping-particle&quot;: &quot;&quot;}, {&quot;family&quot;: &quot;Nickleach&quot;, &quot;given&quot;: &quot;S.&quot;, &quot;parse-names&quot;: false, &quot;dropping-particle&quot;: &quot;&quot;, &quot;non-dropping-particle&quot;: &quot;&quot;}, {&quot;family&quot;: &quot;Socolinsky&quot;, &quot;given&quot;: &quot;D.&quot;, &quot;parse-names&quot;: false, &quot;dropping-particle&quot;: &quot;&quot;, &quot;non-dropping-particle&quot;: &quot;&quot;}, {&quot;family&quot;: &quot;Sengamedu&quot;, &quot;given&quot;: &quot;S.&quot;, &quot;parse-names&quot;: false, &quot;dropping-particle&quot;: &quot;&quot;, &quot;non-dropping-particle&quot;: &quot;&quot;}, {&quot;family&quot;: &quot;Faloutsos&quot;, &quot;given&quot;: &quot;C.&quot;, &quot;parse-names&quot;: false, &quot;dropping-particle&quot;: &quot;&quot;, &quot;non-dropping-particle&quot;: &quot;&quot;}], &quot;issued&quot;: {&quot;date-parts&quot;: [[2024]]}, &quot;URL&quot;: &quot;http://arxiv.org/abs/2402.17944&quot;, &quot;type&quot;: &quot;article-journal&quot;, &quot;title&quot;: &quot;Large language models (LLMs) on tabular data: Prediction, generation, and understanding. A survey&quot;, &quot;container-title&quot;: &quot;Transactions on Machine Learning Research&quot;, &quot;id&quot;: &quot;ITEM-5007b438-b37f-541e-8fca-2748edacc281&quot;, &quot;container-title-short&quot;: &quot;&quot;}, &quot;isTemporary&quot;: false}]}, {&quot;citationID&quot;: &quot;MENDELEY_CITATION_d8e70e3e-92ff-40b1-88da-f0df1c307282&quot;, &quot;properties&quot;: {&quot;noteIndex&quot;: 0}, &quot;isEdited&quot;: false, &quot;manualOverride&quot;: {&quot;isManuallyOverridden&quot;: false, &quot;citeprocText&quot;: &quot;(Cisneros-Bravo et al., 2023; Rodas Zegarra de Escalante, 2024)&quot;, &quot;manualOverrideText&quot;: &quot;&quot;}, &quot;citationItems&quot;: [{&quot;id&quot;: &quot;ITEM-2c1f70fd-8745-538a-b99f-18d256f44b4f&quot;, &quot;itemData&quot;: {&quot;author&quot;: [{&quot;family&quot;: &quot;Cisneros-Bravo&quot;, &quot;given&quot;: &quot;B. E.&quot;, &quot;parse-names&quot;: false, &quot;dropping-particle&quot;: &quot;&quot;, &quot;non-dropping-particle&quot;: &quot;&quot;}, {&quot;family&quot;: &quot;Rodríguez-Aguilar&quot;, &quot;given&quot;: &quot;R. M.&quot;, &quot;parse-names&quot;: false, &quot;dropping-particle&quot;: &quot;&quot;, &quot;non-dropping-particle&quot;: &quot;&quot;}, {&quot;family&quot;: &quot;Niño-Membrillo&quot;, &quot;given&quot;: &quot;Y. E.&quot;, &quot;parse-names&quot;: false, &quot;dropping-particle&quot;: &quot;&quot;, &quot;non-dropping-particle&quot;: &quot;&quot;}, {&quot;family&quot;: &quot;Cuevas-Rasgado&quot;, &quot;given&quot;: &quot;A. D.&quot;, &quot;parse-names&quot;: false, &quot;dropping-particle&quot;: &quot;&quot;, &quot;non-dropping-particle&quot;: &quot;&quot;}], &quot;issued&quot;: {&quot;date-parts&quot;: [[2023]]}, &quot;DOI&quot;: &quot;10.23913/ride.v14i27.1715&quot;, &quot;type&quot;: &quot;article-journal&quot;, &quot;title&quot;: &quot;Falta de orientación vocacional como factor en la deserción universitaria. Caso de estudio: zona Oriente del Estado de México&quot;, &quot;container-title&quot;: &quot;RIDE Revista Iberoamericana para la Investigación y el Desarrollo Educativo&quot;, &quot;volume&quot;: &quot;14&quot;, &quot;issue&quot;: &quot;27&quot;, &quot;id&quot;: &quot;ITEM-2c1f70fd-8745-538a-b99f-18d256f44b4f&quot;, &quot;container-title-short&quot;: &quot;&quot;}, &quot;isTemporary&quot;: false}, {&quot;id&quot;: &quot;ITEM-297823cb-c975-5def-8698-5545884294cd&quot;, &quot;itemData&quot;: {&quot;author&quot;: [{&quot;family&quot;: &quot;Rodas Zegarra de Escalante&quot;, &quot;given&quot;: &quot;A.&quot;, &quot;parse-names&quot;: false, &quot;dropping-particle&quot;: &quot;&quot;, &quot;non-dropping-particle&quot;: &quot;&quot;}], &quot;issued&quot;: {&quot;date-parts&quot;: [[2024]]}, &quot;URL&quot;: &quot;https://hdl.handle.net/20.500.12692/150276&quot;, &quot;type&quot;: &quot;thesis&quot;, &quot;title&quot;: &quot;Orientación vocacional y deserción universitaria en una universidad de Lima - 2024&quot;, &quot;genre&quot;: &quot;Tesis de maestría&quot;, &quot;publisher&quot;: &quot;Universidad César Vallejo&quot;, &quot;id&quot;: &quot;ITEM-297823cb-c975-5def-8698-5545884294cd&quot;, &quot;container-title-short&quot;: &quot;&quot;}, &quot;isTemporary&quot;: false}]}, {&quot;citationID&quot;: &quot;MENDELEY_CITATION_aa15840c-f0d0-425c-866b-9cd7194ab607&quot;, &quot;properties&quot;: {&quot;noteIndex&quot;: 0}, &quot;isEdited&quot;: false, &quot;manualOverride&quot;: {&quot;isManuallyOverridden&quot;: true, &quot;citeprocText&quot;: &quot;(Millán Gordillo, 2025)&quot;, &quot;manualOverrideText&quot;: &quot;Millán Gordillo (2025)&quot;}, &quot;citationItems&quot;: [{&quot;id&quot;: &quot;ITEM-d048a752-48c5-509f-92fd-95097e22963d&quot;, &quot;itemData&quot;: {&quot;author&quot;: [{&quot;family&quot;: &quot;Millán Gordillo&quot;, &quot;given&quot;: &quot;M.&quot;, &quot;parse-names&quot;: false, &quot;dropping-particle&quot;: &quot;&quot;, &quot;non-dropping-particle&quot;: &quot;&quot;}], &quot;issued&quot;: {&quot;date-parts&quot;: [[2025]]}, &quot;URL&quot;: &quot;https://repositorio.uloyola.es/bitstream/handle/20.500.12412/6735/TFM%20Mar%C3%ADa%20Mill%C3%A1n.pdf&quot;, &quot;type&quot;: &quot;thesis&quot;, &quot;title&quot;: &quot;Estudio comparativo de sistemas de recomendación mediante filtrado colaborativo, basado en contenido y propuestas híbridas&quot;, &quot;genre&quot;: &quot;Tesis de maestría&quot;, &quot;publisher&quot;: &quot;Universidad Loyola Andalucía&quot;, &quot;id&quot;: &quot;ITEM-d048a752-48c5-509f-92fd-95097e22963d&quot;, &quot;container-title-short&quot;: &quot;&quot;}, &quot;isTemporary&quot;: false}]}, {&quot;citationID&quot;: &quot;MENDELEY_CITATION_17018fda-4e5b-4f12-b6ff-0388dee5ed09&quot;, &quot;properties&quot;: {&quot;noteIndex&quot;: 0}, &quot;isEdited&quot;: false, &quot;manualOverride&quot;: {&quot;isManuallyOverridden&quot;: true, &quot;citeprocText&quot;: &quot;(León Caranqui, 2023)&quot;, &quot;manualOverrideText&quot;: &quot;León Caranqui (2023)&quot;}, &quot;citationItems&quot;: [{&quot;id&quot;: &quot;ITEM-d8e93493-d1e9-5c21-8fb9-fe318b95db8c&quot;, &quot;itemData&quot;: {&quot;author&quot;: [{&quot;family&quot;: &quot;León Caranqui&quot;, &quot;given&quot;: &quot;J. A.&quot;, &quot;parse-names&quot;: false, &quot;dropping-particle&quot;: &quot;&quot;, &quot;non-dropping-particle&quot;: &quot;&quot;}], &quot;issued&quot;: {&quot;date-parts&quot;: [[2023]]}, &quot;URL&quot;: &quot;https://repositorio.usfq.edu.ec/handle/23000/13497&quot;, &quot;type&quot;: &quot;thesis&quot;, &quot;title&quot;: &quot;URKU: Adaptación de LLaMA 2 para la generación de texto en kichwa usando técnicas de Low-Rank Adaptation (LoRA)&quot;, &quot;genre&quot;: &quot;Trabajo de titulación de pregrado&quot;, &quot;publisher&quot;: &quot;Universidad San Francisco de Quito&quot;, &quot;id&quot;: &quot;ITEM-d8e93493-d1e9-5c21-8fb9-fe318b95db8c&quot;, &quot;container-title-short&quot;: &quot;&quot;}, &quot;isTemporary&quot;: false}]}, {&quot;citationID&quot;: &quot;MENDELEY_CITATION_e156688a-9ccf-47df-a451-0576ae3281a9&quot;, &quot;properties&quot;: {&quot;noteIndex&quot;: 0}, &quot;isEdited&quot;: false, &quot;manualOverride&quot;: {&quot;isManuallyOverridden&quot;: true, &quot;citeprocText&quot;: &quot;(Mena Guitarra, 2023)&quot;, &quot;manualOverrideText&quot;: &quot;Mena Guitarra (2023)&quot;}, &quot;citationItems&quot;: [{&quot;id&quot;: &quot;ITEM-b7bc5309-1149-55a6-8b1f-3e0d4086c429&quot;, &quot;itemData&quot;: {&quot;author&quot;: [{&quot;family&quot;: &quot;Mena Guitarra&quot;, &quot;given&quot;: &quot;S. D.&quot;, &quot;parse-names&quot;: false, &quot;dropping-particle&quot;: &quot;&quot;, &quot;non-dropping-particle&quot;: &quot;&quot;}], &quot;issued&quot;: {&quot;date-parts&quot;: [[2023]]}, &quot;URL&quot;: &quot;https://repositorio.usfq.edu.ec/handle/23000/13665&quot;, &quot;type&quot;: &quot;thesis&quot;, &quot;title&quot;: &quot;Usos y aplicaciones de modelos de lenguaje masivos en español&quot;, &quot;genre&quot;: &quot;Trabajo de titulación de pregrado&quot;, &quot;publisher&quot;: &quot;Universidad San Francisco de Quito&quot;, &quot;id&quot;: &quot;ITEM-b7bc5309-1149-55a6-8b1f-3e0d4086c429&quot;, &quot;container-title-short&quot;: &quot;&quot;}, &quot;isTemporary&quot;: false}]}, {&quot;citationID&quot;: &quot;MENDELEY_CITATION_879f36a3-0d8d-4c77-9de0-b1c72c68f0fa&quot;, &quot;properties&quot;: {&quot;noteIndex&quot;: 0}, &quot;isEdited&quot;: false, &quot;manualOverride&quot;: {&quot;isManuallyOverridden&quot;: true, &quot;citeprocText&quot;: &quot;(Dettmers et al., 2023)&quot;, &quot;manualOverrideText&quot;: &quot;Dettmers et al. (2023)&quot;}, &quot;citationItems&quot;: [{&quot;id&quot;: &quot;ITEM-66ff8277-e9ea-5605-b98c-71a6ac2aa4a6&quot;, &quot;itemData&quot;: {&quot;author&quot;: [{&quot;family&quot;: &quot;Dettmers&quot;, &quot;given&quot;: &quot;T.&quot;, &quot;parse-names&quot;: false, &quot;dropping-particle&quot;: &quot;&quot;, &quot;non-dropping-particle&quot;: &quot;&quot;}, {&quot;family&quot;: &quot;Pagnoni&quot;, &quot;given&quot;: &quot;A.&quot;, &quot;parse-names&quot;: false, &quot;dropping-particle&quot;: &quot;&quot;, &quot;non-dropping-particle&quot;: &quot;&quot;}, {&quot;family&quot;: &quot;Holtzman&quot;, &quot;given&quot;: &quot;A.&quot;, &quot;parse-names&quot;: false, &quot;dropping-particle&quot;: &quot;&quot;, &quot;non-dropping-particle&quot;: &quot;&quot;}, {&quot;family&quot;: &quot;Zettlemoyer&quot;, &quot;given&quot;: &quot;L.&quot;, &quot;parse-names&quot;: false, &quot;dropping-particle&quot;: &quot;&quot;, &quot;non-dropping-particle&quot;: &quot;&quot;}], &quot;issued&quot;: {&quot;date-parts&quot;: [[2023]]}, &quot;DOI&quot;: &quot;10.48550/arXiv.2305.14314&quot;, &quot;type&quot;: &quot;paper-conference&quot;, &quot;title&quot;: &quot;QLoRA: Efficient finetuning of quantized LLMs&quot;, &quot;container-title&quot;: &quot;Advances in Neural Information Processing Systems 36&quot;, &quot;id&quot;: &quot;ITEM-66ff8277-e9ea-5605-b98c-71a6ac2aa4a6&quot;, &quot;container-title-short&quot;: &quot;&quot;}, &quot;isTemporary&quot;: false}]}, {&quot;citationID&quot;: &quot;MENDELEY_CITATION_eb90c2d4-0481-4ebc-b671-8e74ae34e385&quot;, &quot;properties&quot;: {&quot;noteIndex&quot;: 0}, &quot;isEdited&quot;: false, &quot;manualOverride&quot;: {&quot;isManuallyOverridden&quot;: true, &quot;citeprocText&quot;: &quot;(Hu et al., 2021)&quot;, &quot;manualOverrideText&quot;: &quot;Hu et al. (2021)&quot;}, &quot;citationItems&quot;: [{&quot;id&quot;: &quot;ITEM-74d30536-939b-537f-bec0-b59afedae2e3&quot;, &quot;itemData&quot;: {&quot;author&quot;: [{&quot;family&quot;: &quot;Hu&quot;, &quot;given&quot;: &quot;E. J.&quot;, &quot;parse-names&quot;: false, &quot;dropping-particle&quot;: &quot;&quot;, &quot;non-dropping-particle&quot;: &quot;&quot;}, {&quot;family&quot;: &quot;Shen&quot;, &quot;given&quot;: &quot;Y.&quot;, &quot;parse-names&quot;: false, &quot;dropping-particle&quot;: &quot;&quot;, &quot;non-dropping-particle&quot;: &quot;&quot;}, {&quot;family&quot;: &quot;Wallis&quot;, &quot;given&quot;: &quot;P.&quot;, &quot;parse-names&quot;: false, &quot;dropping-particle&quot;: &quot;&quot;, &quot;non-dropping-particle&quot;: &quot;&quot;}, {&quot;family&quot;: &quot;Allen-Zhu&quot;, &quot;given&quot;: &quot;Z.&quot;, &quot;parse-names&quot;: false, &quot;dropping-particle&quot;: &quot;&quot;, &quot;non-dropping-particle&quot;: &quot;&quot;}, {&quot;family&quot;: &quot;Li&quot;, &quot;given&quot;: &quot;Y.&quot;, &quot;parse-names&quot;: false, &quot;dropping-particle&quot;: &quot;&quot;, &quot;non-dropping-particle&quot;: &quot;&quot;}, {&quot;family&quot;: &quot;Wang&quot;, &quot;given&quot;: &quot;S.&quot;, &quot;parse-names&quot;: false, &quot;dropping-particle&quot;: &quot;&quot;, &quot;non-dropping-particle&quot;: &quot;&quot;}, {&quot;family&quot;: &quot;Wang&quot;, &quot;given&quot;: &quot;L.&quot;, &quot;parse-names&quot;: false, &quot;dropping-particle&quot;: &quot;&quot;, &quot;non-dropping-particle&quot;: &quot;&quot;}, {&quot;family&quot;: &quot;Chen&quot;, &quot;given&quot;: &quot;W.&quot;, &quot;parse-names&quot;: false, &quot;dropping-particle&quot;: &quot;&quot;, &quot;non-dropping-particle&quot;: &quot;&quot;}], &quot;issued&quot;: {&quot;date-parts&quot;: [[2021]]}, &quot;DOI&quot;: &quot;10.48550/arXiv.2106.09685&quot;, &quot;type&quot;: &quot;book&quot;, &quot;title&quot;: &quot;LoRA: Low-rank adaptation of large language models&quot;, &quot;publisher&quot;: &quot;arXiv&quot;, &quot;id&quot;: &quot;ITEM-74d30536-939b-537f-bec0-b59afedae2e3&quot;, &quot;container-title-short&quot;: &quot;&quot;}, &quot;isTemporary&quot;: false}]}, {&quot;citationID&quot;: &quot;MENDELEY_CITATION_09eaf23d-65e2-4b65-a101-d170549be459&quot;, &quot;properties&quot;: {&quot;noteIndex&quot;: 0}, &quot;isEdited&quot;: false, &quot;manualOverride&quot;: {&quot;isManuallyOverridden&quot;: true, &quot;citeprocText&quot;: &quot;(Dettmers et al., 2023)&quot;, &quot;manualOverrideText&quot;: &quot;Dettmers et al. (2023)&quot;}, &quot;citationItems&quot;: [{&quot;id&quot;: &quot;ITEM-66ff8277-e9ea-5605-b98c-71a6ac2aa4a6&quot;, &quot;itemData&quot;: {&quot;author&quot;: [{&quot;family&quot;: &quot;Dettmers&quot;, &quot;given&quot;: &quot;T.&quot;, &quot;parse-names&quot;: false, &quot;dropping-particle&quot;: &quot;&quot;, &quot;non-dropping-particle&quot;: &quot;&quot;}, {&quot;family&quot;: &quot;Pagnoni&quot;, &quot;given&quot;: &quot;A.&quot;, &quot;parse-names&quot;: false, &quot;dropping-particle&quot;: &quot;&quot;, &quot;non-dropping-particle&quot;: &quot;&quot;}, {&quot;family&quot;: &quot;Holtzman&quot;, &quot;given&quot;: &quot;A.&quot;, &quot;parse-names&quot;: false, &quot;dropping-particle&quot;: &quot;&quot;, &quot;non-dropping-particle&quot;: &quot;&quot;}, {&quot;family&quot;: &quot;Zettlemoyer&quot;, &quot;given&quot;: &quot;L.&quot;, &quot;parse-names&quot;: false, &quot;dropping-particle&quot;: &quot;&quot;, &quot;non-dropping-particle&quot;: &quot;&quot;}], &quot;issued&quot;: {&quot;date-parts&quot;: [[2023]]}, &quot;DOI&quot;: &quot;10.48550/arXiv.2305.14314&quot;, &quot;type&quot;: &quot;paper-conference&quot;, &quot;title&quot;: &quot;QLoRA: Efficient finetuning of quantized LLMs&quot;, &quot;container-title&quot;: &quot;Advances in Neural Information Processing Systems 36&quot;, &quot;id&quot;: &quot;ITEM-66ff8277-e9ea-5605-b98c-71a6ac2aa4a6&quot;, &quot;container-title-short&quot;: &quot;&quot;}, &quot;isTemporary&quot;: false}]}, {&quot;citationID&quot;: &quot;MENDELEY_CITATION_45b7e60b-5683-4f67-81a8-76bc18563673&quot;, &quot;properties&quot;: {&quot;noteIndex&quot;: 0}, &quot;isEdited&quot;: false, &quot;manualOverride&quot;: {&quot;isManuallyOverridden&quot;: true, &quot;citeprocText&quot;: &quot;(Mena Guitarra, 2023)&quot;, &quot;manualOverrideText&quot;: &quot;Mena Guitarra (2023)&quot;}, &quot;citationItems&quot;: [{&quot;id&quot;: &quot;ITEM-b7bc5309-1149-55a6-8b1f-3e0d4086c429&quot;, &quot;itemData&quot;: {&quot;author&quot;: [{&quot;family&quot;: &quot;Mena Guitarra&quot;, &quot;given&quot;: &quot;S. D.&quot;, &quot;parse-names&quot;: false, &quot;dropping-particle&quot;: &quot;&quot;, &quot;non-dropping-particle&quot;: &quot;&quot;}], &quot;issued&quot;: {&quot;date-parts&quot;: [[2023]]}, &quot;URL&quot;: &quot;https://repositorio.usfq.edu.ec/handle/23000/13665&quot;, &quot;type&quot;: &quot;thesis&quot;, &quot;title&quot;: &quot;Usos y aplicaciones de modelos de lenguaje masivos en español&quot;, &quot;genre&quot;: &quot;Trabajo de titulación de pregrado&quot;, &quot;publisher&quot;: &quot;Universidad San Francisco de Quito&quot;, &quot;id&quot;: &quot;ITEM-b7bc5309-1149-55a6-8b1f-3e0d4086c429&quot;, &quot;container-title-short&quot;: &quot;&quot;}, &quot;isTemporary&quot;: false}]}, {&quot;citationID&quot;: &quot;MENDELEY_CITATION_c6bdca53-14be-4a8b-ab91-847dc1f8799b&quot;, &quot;properties&quot;: {&quot;noteIndex&quot;: 0}, &quot;isEdited&quot;: false, &quot;manualOverride&quot;: {&quot;isManuallyOverridden&quot;: true, &quot;citeprocText&quot;: &quot;(Martínez Sixto et al., 2025)&quot;, &quot;manualOverrideText&quot;: &quot;Martínez Sixto et al. (2025)&quot;}, &quot;citationItems&quot;: [{&quot;id&quot;: &quot;ITEM-e9427164-f851-5ff7-a1c3-eb7ce5a7d720&quot;, &quot;itemData&quot;: {&quot;author&quot;: [{&quot;family&quot;: &quot;Martínez Sixto&quot;, &quot;given&quot;: &quot;L.&quot;, &quot;parse-names&quot;: false, &quot;dropping-particle&quot;: &quot;&quot;, &quot;non-dropping-particle&quot;: &quot;&quot;}, {&quot;family&quot;: &quot;Fernández y Fernández&quot;, &quot;given&quot;: &quot;C. A.&quot;, &quot;parse-names&quot;: false, &quot;dropping-particle&quot;: &quot;&quot;, &quot;non-dropping-particle&quot;: &quot;&quot;}, {&quot;family&quot;: &quot;Millán Hernández&quot;, &quot;given&quot;: &quot;C. E.&quot;, &quot;parse-names&quot;: false, &quot;dropping-particle&quot;: &quot;&quot;, &quot;non-dropping-particle&quot;: &quot;&quot;}], &quot;issued&quot;: {&quot;date-parts&quot;: [[2025]]}, &quot;DOI&quot;: &quot;10.36825/riti.13.31.007&quot;, &quot;type&quot;: &quot;article-journal&quot;, &quot;title&quot;: &quot;Comparación del desempeño de LLMs en la generación de diagramas de clases UML mediante un sistema RAG&quot;, &quot;container-title&quot;: &quot;Revista de Investigación en Tecnologías de la Información&quot;, &quot;volume&quot;: &quot;13&quot;, &quot;issue&quot;: &quot;31&quot;, &quot;page&quot;: &quot;64-79&quot;, &quot;id&quot;: &quot;ITEM-e9427164-f851-5ff7-a1c3-eb7ce5a7d720&quot;, &quot;container-title-short&quot;: &quot;&quot;}, &quot;isTemporary&quot;: false}]}, {&quot;citationID&quot;: &quot;MENDELEY_CITATION_ceb4894c-d8fb-41b6-a841-d63b5b6df821&quot;, &quot;properties&quot;: {&quot;noteIndex&quot;: 0}, &quot;isEdited&quot;: false, &quot;manualOverride&quot;: {&quot;isManuallyOverridden&quot;: true, &quot;citeprocText&quot;: &quot;(Millán Gordillo, 2025)&quot;, &quot;manualOverrideText&quot;: &quot;Millán Gordillo (2025)&quot;}, &quot;citationItems&quot;: [{&quot;id&quot;: &quot;ITEM-d048a752-48c5-509f-92fd-95097e22963d&quot;, &quot;itemData&quot;: {&quot;author&quot;: [{&quot;family&quot;: &quot;Millán Gordillo&quot;, &quot;given&quot;: &quot;M.&quot;, &quot;parse-names&quot;: false, &quot;dropping-particle&quot;: &quot;&quot;, &quot;non-dropping-particle&quot;: &quot;&quot;}], &quot;issued&quot;: {&quot;date-parts&quot;: [[2025]]}, &quot;URL&quot;: &quot;https://repositorio.uloyola.es/bitstream/handle/20.500.12412/6735/TFM%20Mar%C3%ADa%20Mill%C3%A1n.pdf&quot;, &quot;type&quot;: &quot;thesis&quot;, &quot;title&quot;: &quot;Estudio comparativo de sistemas de recomendación mediante filtrado colaborativo, basado en contenido y propuestas híbridas&quot;, &quot;genre&quot;: &quot;Tesis de maestría&quot;, &quot;publisher&quot;: &quot;Universidad Loyola Andalucía&quot;, &quot;id&quot;: &quot;ITEM-d048a752-48c5-509f-92fd-95097e22963d&quot;, &quot;container-title-short&quot;: &quot;&quot;}, &quot;isTemporary&quot;: false}]}, {&quot;citationID&quot;: &quot;MENDELEY_CITATION_3bde3d07-0e9b-44ac-a112-dd9dc4559f30&quot;, &quot;properties&quot;: {&quot;noteIndex&quot;: 0}, &quot;isEdited&quot;: false, &quot;manualOverride&quot;: {&quot;isManuallyOverridden&quot;: true, &quot;citeprocText&quot;: &quot;(Castejón Lozano, 2025)&quot;, &quot;manualOverrideText&quot;: &quot;Castejón Lozano (2025)&quot;}, &quot;citationItems&quot;: [{&quot;id&quot;: &quot;ITEM-aa8f5a87-f00c-54b4-9f0b-476652320c5d&quot;, &quot;itemData&quot;: {&quot;author&quot;: [{&quot;family&quot;: &quot;Castejón Lozano&quot;, &quot;given&quot;: &quot;F.&quot;, &quot;parse-names&quot;: false, &quot;dropping-particle&quot;: &quot;&quot;, &quot;non-dropping-particle&quot;: &quot;&quot;}], &quot;issued&quot;: {&quot;date-parts&quot;: [[2025]]}, &quot;URL&quot;: &quot;https://oa.upm.es/90917/&quot;, &quot;type&quot;: &quot;thesis&quot;, &quot;title&quot;: &quot;SoroIA: Diseño e implementación de un sistema conversacional basado en modelos grandes de lenguaje para el Museo Sorolla&quot;, &quot;genre&quot;: &quot;Tesis de maestría&quot;, &quot;publisher&quot;: &quot;Universidad Politécnica de Madrid&quot;, &quot;id&quot;: &quot;ITEM-aa8f5a87-f00c-54b4-9f0b-476652320c5d&quot;, &quot;container-title-short&quot;: &quot;&quot;}, &quot;isTemporary&quot;: false}]}, {&quot;citationID&quot;: &quot;MENDELEY_CITATION_518f2fe0-e911-426a-b9b8-28941886597e&quot;, &quot;properties&quot;: {&quot;noteIndex&quot;: 0}, &quot;isEdited&quot;: false, &quot;manualOverride&quot;: {&quot;isManuallyOverridden&quot;: true, &quot;citeprocText&quot;: &quot;(León Caranqui, 2023)&quot;, &quot;manualOverrideText&quot;: &quot;León Caranqui (2023)&quot;}, &quot;citationItems&quot;: [{&quot;id&quot;: &quot;ITEM-d8e93493-d1e9-5c21-8fb9-fe318b95db8c&quot;, &quot;itemData&quot;: {&quot;author&quot;: [{&quot;family&quot;: &quot;León Caranqui&quot;, &quot;given&quot;: &quot;J. A.&quot;, &quot;parse-names&quot;: false, &quot;dropping-particle&quot;: &quot;&quot;, &quot;non-dropping-particle&quot;: &quot;&quot;}], &quot;issued&quot;: {&quot;date-parts&quot;: [[2023]]}, &quot;URL&quot;: &quot;https://repositorio.usfq.edu.ec/handle/23000/13497&quot;, &quot;type&quot;: &quot;thesis&quot;, &quot;title&quot;: &quot;URKU: Adaptación de LLaMA 2 para la generación de texto en kichwa usando técnicas de Low-Rank Adaptation (LoRA)&quot;, &quot;genre&quot;: &quot;Trabajo de titulación de pregrado&quot;, &quot;publisher&quot;: &quot;Universidad San Francisco de Quito&quot;, &quot;id&quot;: &quot;ITEM-d8e93493-d1e9-5c21-8fb9-fe318b95db8c&quot;, &quot;container-title-short&quot;: &quot;&quot;}, &quot;isTemporary&quot;: false}]}]"/>
+    <we:property name="MENDELEY_CITATIONS_LOCALE_CODE" value="&quot;es-ES&quot;"/>
+    <we:property name="MENDELEY_CITATIONS_STYLE" value="{&quot;id&quot;: &quot;https://www.zotero.org/styles/apa-no-ampersand&quot;, &quot;title&quot;: &quot;American Psychological Association 7th edition (no ampersand)&quot;, &quot;format&quot;: &quot;author-date&quot;, &quot;defaultLocale&quot;: null, &quot;isLocaleCodeValid&quot;: true}"/>
+  </we:properties>
+  <we:bindings/>
+  <we:snapshot xmlns:r="http://schemas.openxmlformats.org/officeDocument/2006/relationships"/>
+</we:webextension>
+</file>
+
 <file path=customXml/item1.xml><?xml version="1.0" encoding="utf-8"?>
 <b:Sources xmlns:b="http://schemas.openxmlformats.org/officeDocument/2006/bibliography" xmlns="http://schemas.openxmlformats.org/officeDocument/2006/bibliography" SelectedStyle="\APASixthEditionOfficeOnline.xsl" StyleName="APA" Version="6"/>
 </file>

</xml_diff>

<commit_message>
Elimina el antecedente no respaldado y amplía los resultados
- Se elimina el párrafo que atribuía a Fernández et al. (2025) tutores
  entrenados con GSM8K, porque ese trabajo no lo respalda.
- pipeline/09_complementos.py genera la caracterización de las
  postulaciones, la tasa de ingreso según el promedio de quinto de
  secundaria y la curva de calibración, verificando que las predicciones
  coinciden con 03_resultados.py.
- El borrador incorpora la Tabla 4 y las Figuras 4 y 7 con su
  interpretación, y dos párrafos de discusión sobre limitaciones e
  implicancias. Se renumeran las referencias a tablas y figuras.
- La extensión del RESUMEN a la última referencia pasa a 63 páginas.

Co-Authored-By: Claude Opus 5.5 <noreply@anthropic.com>
Claude-Session: https://claude.ai/code/session_01DtqH3frdJcwNPf5uAWNPX3
</commit_message>
<xml_diff>
--- a/Borrador_Tesis_CareER-GPT_EPG_UNA.docx
+++ b/Borrador_Tesis_CareER-GPT_EPG_UNA.docx
@@ -5935,8 +5935,8 @@
       </w:r>
       <w:sdt>
         <w:sdtPr>
-          <w:tag w:val="MENDELEY_CITATION_v3_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"/>
-          <w:id w:val="-439780185"/>
+          <w:tag w:val="MENDELEY_CITATION_v3_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"/>
+          <w:id w:val="-1911828948"/>
         </w:sdtPr>
         <w:sdtContent>
           <w:r>
@@ -5957,8 +5957,8 @@
       </w:r>
       <w:sdt>
         <w:sdtPr>
-          <w:tag w:val="MENDELEY_CITATION_v3_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"/>
-          <w:id w:val="-743944921"/>
+          <w:tag w:val="MENDELEY_CITATION_v3_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"/>
+          <w:id w:val="-1481424683"/>
         </w:sdtPr>
         <w:sdtContent>
           <w:r>
@@ -5987,8 +5987,8 @@
       </w:r>
       <w:sdt>
         <w:sdtPr>
-          <w:tag w:val="MENDELEY_CITATION_v3_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"/>
-          <w:id w:val="625315701"/>
+          <w:tag w:val="MENDELEY_CITATION_v3_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"/>
+          <w:id w:val="-1479108962"/>
         </w:sdtPr>
         <w:sdtContent>
           <w:r>
@@ -6001,8 +6001,8 @@
       </w:r>
       <w:sdt>
         <w:sdtPr>
-          <w:tag w:val="MENDELEY_CITATION_v3_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"/>
-          <w:id w:val="-953853817"/>
+          <w:tag w:val="MENDELEY_CITATION_v3_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"/>
+          <w:id w:val="-695879134"/>
         </w:sdtPr>
         <w:sdtContent>
           <w:r>
@@ -6015,8 +6015,8 @@
       </w:r>
       <w:sdt>
         <w:sdtPr>
-          <w:tag w:val="MENDELEY_CITATION_v3_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"/>
-          <w:id w:val="569245060"/>
+          <w:tag w:val="MENDELEY_CITATION_v3_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"/>
+          <w:id w:val="-471359499"/>
         </w:sdtPr>
         <w:sdtContent>
           <w:r>
@@ -6029,8 +6029,8 @@
       </w:r>
       <w:sdt>
         <w:sdtPr>
-          <w:tag w:val="MENDELEY_CITATION_v3_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"/>
-          <w:id w:val="-1853717557"/>
+          <w:tag w:val="MENDELEY_CITATION_v3_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"/>
+          <w:id w:val="1533235861"/>
         </w:sdtPr>
         <w:sdtContent>
           <w:r>
@@ -6051,8 +6051,8 @@
       </w:r>
       <w:sdt>
         <w:sdtPr>
-          <w:tag w:val="MENDELEY_CITATION_v3_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"/>
-          <w:id w:val="766315322"/>
+          <w:tag w:val="MENDELEY_CITATION_v3_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"/>
+          <w:id w:val="1616651382"/>
         </w:sdtPr>
         <w:sdtContent>
           <w:r>
@@ -6281,8 +6281,8 @@
       </w:r>
       <w:sdt>
         <w:sdtPr>
-          <w:tag w:val="MENDELEY_CITATION_v3_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"/>
-          <w:id w:val="701335161"/>
+          <w:tag w:val="MENDELEY_CITATION_v3_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"/>
+          <w:id w:val="906612251"/>
         </w:sdtPr>
         <w:sdtContent>
           <w:r>
@@ -6303,8 +6303,8 @@
       </w:r>
       <w:sdt>
         <w:sdtPr>
-          <w:tag w:val="MENDELEY_CITATION_v3_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"/>
-          <w:id w:val="2067181063"/>
+          <w:tag w:val="MENDELEY_CITATION_v3_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"/>
+          <w:id w:val="1174795491"/>
         </w:sdtPr>
         <w:sdtContent>
           <w:r>
@@ -6330,8 +6330,8 @@
       </w:pPr>
       <w:sdt>
         <w:sdtPr>
-          <w:tag w:val="MENDELEY_CITATION_v3_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"/>
-          <w:id w:val="-134773242"/>
+          <w:tag w:val="MENDELEY_CITATION_v3_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"/>
+          <w:id w:val="1744677723"/>
         </w:sdtPr>
         <w:sdtContent>
           <w:r>
@@ -6344,8 +6344,8 @@
       </w:r>
       <w:sdt>
         <w:sdtPr>
-          <w:tag w:val="MENDELEY_CITATION_v3_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"/>
-          <w:id w:val="1324554743"/>
+          <w:tag w:val="MENDELEY_CITATION_v3_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"/>
+          <w:id w:val="1119415121"/>
         </w:sdtPr>
         <w:sdtContent>
           <w:r>
@@ -6366,8 +6366,8 @@
       </w:r>
       <w:sdt>
         <w:sdtPr>
-          <w:tag w:val="MENDELEY_CITATION_v3_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"/>
-          <w:id w:val="296043143"/>
+          <w:tag w:val="MENDELEY_CITATION_v3_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"/>
+          <w:id w:val="-463522673"/>
         </w:sdtPr>
         <w:sdtContent>
           <w:r>
@@ -6659,8 +6659,8 @@
       </w:r>
       <w:sdt>
         <w:sdtPr>
-          <w:tag w:val="MENDELEY_CITATION_v3_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"/>
-          <w:id w:val="870425057"/>
+          <w:tag w:val="MENDELEY_CITATION_v3_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"/>
+          <w:id w:val="908347968"/>
         </w:sdtPr>
         <w:sdtContent>
           <w:r>
@@ -6689,8 +6689,8 @@
       </w:r>
       <w:sdt>
         <w:sdtPr>
-          <w:tag w:val="MENDELEY_CITATION_v3_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"/>
-          <w:id w:val="-903140013"/>
+          <w:tag w:val="MENDELEY_CITATION_v3_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"/>
+          <w:id w:val="780637131"/>
         </w:sdtPr>
         <w:sdtContent>
           <w:r>
@@ -6703,8 +6703,8 @@
       </w:r>
       <w:sdt>
         <w:sdtPr>
-          <w:tag w:val="MENDELEY_CITATION_v3_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"/>
-          <w:id w:val="-980351901"/>
+          <w:tag w:val="MENDELEY_CITATION_v3_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"/>
+          <w:id w:val="-1172695447"/>
         </w:sdtPr>
         <w:sdtContent>
           <w:r>
@@ -6725,8 +6725,8 @@
       </w:r>
       <w:sdt>
         <w:sdtPr>
-          <w:tag w:val="MENDELEY_CITATION_v3_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"/>
-          <w:id w:val="-1234098095"/>
+          <w:tag w:val="MENDELEY_CITATION_v3_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"/>
+          <w:id w:val="-1692328826"/>
         </w:sdtPr>
         <w:sdtContent>
           <w:r>
@@ -6980,8 +6980,8 @@
       </w:r>
       <w:sdt>
         <w:sdtPr>
-          <w:tag w:val="MENDELEY_CITATION_v3_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"/>
-          <w:id w:val="-557246054"/>
+          <w:tag w:val="MENDELEY_CITATION_v3_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"/>
+          <w:id w:val="-1955732651"/>
         </w:sdtPr>
         <w:sdtContent>
           <w:r>
@@ -7010,8 +7010,8 @@
       </w:r>
       <w:sdt>
         <w:sdtPr>
-          <w:tag w:val="MENDELEY_CITATION_v3_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"/>
-          <w:id w:val="-1567426329"/>
+          <w:tag w:val="MENDELEY_CITATION_v3_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"/>
+          <w:id w:val="-598000882"/>
         </w:sdtPr>
         <w:sdtContent>
           <w:r>
@@ -7040,8 +7040,8 @@
       </w:r>
       <w:sdt>
         <w:sdtPr>
-          <w:tag w:val="MENDELEY_CITATION_v3_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"/>
-          <w:id w:val="112707111"/>
+          <w:tag w:val="MENDELEY_CITATION_v3_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"/>
+          <w:id w:val="-1520642611"/>
         </w:sdtPr>
         <w:sdtContent>
           <w:r>
@@ -7070,8 +7070,8 @@
       </w:r>
       <w:sdt>
         <w:sdtPr>
-          <w:tag w:val="MENDELEY_CITATION_v3_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"/>
-          <w:id w:val="-2017713755"/>
+          <w:tag w:val="MENDELEY_CITATION_v3_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"/>
+          <w:id w:val="499125968"/>
         </w:sdtPr>
         <w:sdtContent>
           <w:r>
@@ -7084,8 +7084,8 @@
       </w:r>
       <w:sdt>
         <w:sdtPr>
-          <w:tag w:val="MENDELEY_CITATION_v3_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"/>
-          <w:id w:val="-440297799"/>
+          <w:tag w:val="MENDELEY_CITATION_v3_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"/>
+          <w:id w:val="-703535376"/>
         </w:sdtPr>
         <w:sdtContent>
           <w:r>
@@ -7098,8 +7098,8 @@
       </w:r>
       <w:sdt>
         <w:sdtPr>
-          <w:tag w:val="MENDELEY_CITATION_v3_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"/>
-          <w:id w:val="856900137"/>
+          <w:tag w:val="MENDELEY_CITATION_v3_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"/>
+          <w:id w:val="-1911524834"/>
         </w:sdtPr>
         <w:sdtContent>
           <w:r>
@@ -7128,8 +7128,8 @@
       </w:r>
       <w:sdt>
         <w:sdtPr>
-          <w:tag w:val="MENDELEY_CITATION_v3_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"/>
-          <w:id w:val="-691676324"/>
+          <w:tag w:val="MENDELEY_CITATION_v3_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"/>
+          <w:id w:val="2096910207"/>
         </w:sdtPr>
         <w:sdtContent>
           <w:r>
@@ -7158,8 +7158,8 @@
       </w:r>
       <w:sdt>
         <w:sdtPr>
-          <w:tag w:val="MENDELEY_CITATION_v3_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"/>
-          <w:id w:val="-607152571"/>
+          <w:tag w:val="MENDELEY_CITATION_v3_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"/>
+          <w:id w:val="-1649088385"/>
         </w:sdtPr>
         <w:sdtContent>
           <w:r>
@@ -7180,8 +7180,8 @@
       </w:r>
       <w:sdt>
         <w:sdtPr>
-          <w:tag w:val="MENDELEY_CITATION_v3_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"/>
-          <w:id w:val="-821877571"/>
+          <w:tag w:val="MENDELEY_CITATION_v3_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"/>
+          <w:id w:val="1151375402"/>
         </w:sdtPr>
         <w:sdtContent>
           <w:r>
@@ -7210,8 +7210,8 @@
       </w:r>
       <w:sdt>
         <w:sdtPr>
-          <w:tag w:val="MENDELEY_CITATION_v3_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"/>
-          <w:id w:val="641409257"/>
+          <w:tag w:val="MENDELEY_CITATION_v3_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"/>
+          <w:id w:val="1375850576"/>
         </w:sdtPr>
         <w:sdtContent>
           <w:r>
@@ -7224,8 +7224,8 @@
       </w:r>
       <w:sdt>
         <w:sdtPr>
-          <w:tag w:val="MENDELEY_CITATION_v3_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"/>
-          <w:id w:val="941514233"/>
+          <w:tag w:val="MENDELEY_CITATION_v3_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"/>
+          <w:id w:val="1924329087"/>
         </w:sdtPr>
         <w:sdtContent>
           <w:r>
@@ -7238,8 +7238,8 @@
       </w:r>
       <w:sdt>
         <w:sdtPr>
-          <w:tag w:val="MENDELEY_CITATION_v3_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"/>
-          <w:id w:val="1764550918"/>
+          <w:tag w:val="MENDELEY_CITATION_v3_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"/>
+          <w:id w:val="-694100343"/>
         </w:sdtPr>
         <w:sdtContent>
           <w:r>
@@ -7268,8 +7268,8 @@
       </w:r>
       <w:sdt>
         <w:sdtPr>
-          <w:tag w:val="MENDELEY_CITATION_v3_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"/>
-          <w:id w:val="-1467420585"/>
+          <w:tag w:val="MENDELEY_CITATION_v3_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"/>
+          <w:id w:val="-1003516337"/>
         </w:sdtPr>
         <w:sdtContent>
           <w:r>
@@ -7298,8 +7298,8 @@
       </w:r>
       <w:sdt>
         <w:sdtPr>
-          <w:tag w:val="MENDELEY_CITATION_v3_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"/>
-          <w:id w:val="1821712189"/>
+          <w:tag w:val="MENDELEY_CITATION_v3_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"/>
+          <w:id w:val="2133713351"/>
         </w:sdtPr>
         <w:sdtContent>
           <w:r>
@@ -7439,8 +7439,8 @@
       </w:pPr>
       <w:sdt>
         <w:sdtPr>
-          <w:tag w:val="MENDELEY_CITATION_v3_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"/>
-          <w:id w:val="979317874"/>
+          <w:tag w:val="MENDELEY_CITATION_v3_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"/>
+          <w:id w:val="-350246742"/>
         </w:sdtPr>
         <w:sdtContent>
           <w:r>
@@ -7458,8 +7458,8 @@
       </w:pPr>
       <w:sdt>
         <w:sdtPr>
-          <w:tag w:val="MENDELEY_CITATION_v3_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"/>
-          <w:id w:val="-1279429732"/>
+          <w:tag w:val="MENDELEY_CITATION_v3_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"/>
+          <w:id w:val="633752192"/>
         </w:sdtPr>
         <w:sdtContent>
           <w:r>
@@ -7477,8 +7477,8 @@
       </w:pPr>
       <w:sdt>
         <w:sdtPr>
-          <w:tag w:val="MENDELEY_CITATION_v3_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"/>
-          <w:id w:val="-395249232"/>
+          <w:tag w:val="MENDELEY_CITATION_v3_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"/>
+          <w:id w:val="-1103028020"/>
         </w:sdtPr>
         <w:sdtContent>
           <w:r>
@@ -7496,8 +7496,8 @@
       </w:pPr>
       <w:sdt>
         <w:sdtPr>
-          <w:tag w:val="MENDELEY_CITATION_v3_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"/>
-          <w:id w:val="-1139687701"/>
+          <w:tag w:val="MENDELEY_CITATION_v3_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"/>
+          <w:id w:val="187373343"/>
         </w:sdtPr>
         <w:sdtContent>
           <w:r>
@@ -7515,8 +7515,8 @@
       </w:pPr>
       <w:sdt>
         <w:sdtPr>
-          <w:tag w:val="MENDELEY_CITATION_v3_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"/>
-          <w:id w:val="1345000153"/>
+          <w:tag w:val="MENDELEY_CITATION_v3_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"/>
+          <w:id w:val="-1681173677"/>
         </w:sdtPr>
         <w:sdtContent>
           <w:r>
@@ -7534,8 +7534,8 @@
       </w:pPr>
       <w:sdt>
         <w:sdtPr>
-          <w:tag w:val="MENDELEY_CITATION_v3_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"/>
-          <w:id w:val="20826988"/>
+          <w:tag w:val="MENDELEY_CITATION_v3_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"/>
+          <w:id w:val="480473521"/>
         </w:sdtPr>
         <w:sdtContent>
           <w:r>
@@ -7553,8 +7553,8 @@
       </w:pPr>
       <w:sdt>
         <w:sdtPr>
-          <w:tag w:val="MENDELEY_CITATION_v3_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"/>
-          <w:id w:val="902448716"/>
+          <w:tag w:val="MENDELEY_CITATION_v3_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"/>
+          <w:id w:val="859901446"/>
         </w:sdtPr>
         <w:sdtContent>
           <w:r>
@@ -7572,8 +7572,8 @@
       </w:pPr>
       <w:sdt>
         <w:sdtPr>
-          <w:tag w:val="MENDELEY_CITATION_v3_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"/>
-          <w:id w:val="1118915131"/>
+          <w:tag w:val="MENDELEY_CITATION_v3_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"/>
+          <w:id w:val="-1592474966"/>
         </w:sdtPr>
         <w:sdtContent>
           <w:r>
@@ -7582,29 +7582,26 @@
         </w:sdtContent>
       </w:sdt>
       <w:r>
-        <w:t xml:space="preserve"> estudiaron el ajuste fino de modelos de lenguaje para convertirlos en tutores de matemática y física en educación básica, entrenándolos con problemas específicos como los del conjunto GSM8K. Los resultados mostraron que el ajuste fino mejora la precisión en la resolución de problemas y la claridad con que el modelo explica los conceptos, lo que lo convierte en una herramienta educativa valiosa en ciencias.</w:t>
+        <w:t xml:space="preserve"> optimizaron grandes modelos de lenguaje mediante técnicas de ajuste eficiente sobre infraestructura de alto rendimiento, como el supercomputador Clementina XXI, con el objetivo de mejorar la eficiencia computacional y el rendimiento en seguridad, biología y educación. Emplearon LoRA, QLoRA, ajuste con adaptadores y mezcla de expertos, evaluaron la eficacia de estas técnicas y establecieron repositorios abiertos para la reproducibilidad, reduciendo el costo y la duración del entrenamiento.</w:t>
       </w:r>
     </w:p>
     <w:p>
       <w:pPr>
         <w:pStyle w:val="NORML3"/>
       </w:pPr>
-      <w:r>
-        <w:t xml:space="preserve">En otro estudio, </w:t>
-      </w:r>
       <w:sdt>
         <w:sdtPr>
-          <w:tag w:val="MENDELEY_CITATION_v3_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"/>
-          <w:id w:val="-299212047"/>
+          <w:tag w:val="MENDELEY_CITATION_v3_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"/>
+          <w:id w:val="1765719222"/>
         </w:sdtPr>
         <w:sdtContent>
           <w:r>
-            <w:t xml:space="preserve">Fernández et al. (2025)</w:t>
+            <w:t xml:space="preserve">Ramos-Rivera et al. (2025)</w:t>
           </w:r>
         </w:sdtContent>
       </w:sdt>
       <w:r>
-        <w:t xml:space="preserve"> optimizaron grandes modelos de lenguaje mediante técnicas de ajuste eficiente sobre infraestructura de alto rendimiento, como el supercomputador Clementina XXI, con el objetivo de mejorar la eficiencia computacional y el rendimiento en seguridad, biología y educación. Emplearon LoRA, QLoRA, ajuste con adaptadores y mezcla de expertos, evaluaron la eficacia de estas técnicas y establecieron repositorios abiertos para la reproducibilidad, reduciendo el costo y la duración del entrenamiento.</w:t>
+        <w:t xml:space="preserve"> analizaron la aplicación de modelos de lenguaje grandes para mejorar el análisis de las respuestas abiertas en la evaluación del desempeño docente. Mediante modelos específicos de dominio, modelos de lenguaje pequeños y modelos en la nube con menos iteraciones de entrenamiento, buscaron mitigar las alucinaciones. Los resultados indicaron que los LLM reducen sustancialmente el tiempo de procesamiento de las evaluaciones y mejoran la toma de decisiones en las instituciones educativas.</w:t>
       </w:r>
     </w:p>
     <w:p>
@@ -7613,17 +7610,17 @@
       </w:pPr>
       <w:sdt>
         <w:sdtPr>
-          <w:tag w:val="MENDELEY_CITATION_v3_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"/>
-          <w:id w:val="-186218481"/>
+          <w:tag w:val="MENDELEY_CITATION_v3_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"/>
+          <w:id w:val="-1943538124"/>
         </w:sdtPr>
         <w:sdtContent>
           <w:r>
-            <w:t xml:space="preserve">Ramos-Rivera et al. (2025)</w:t>
+            <w:t xml:space="preserve">Millán Gordillo (2025)</w:t>
           </w:r>
         </w:sdtContent>
       </w:sdt>
       <w:r>
-        <w:t xml:space="preserve"> analizaron la aplicación de modelos de lenguaje grandes para mejorar el análisis de las respuestas abiertas en la evaluación del desempeño docente. Mediante modelos específicos de dominio, modelos de lenguaje pequeños y modelos en la nube con menos iteraciones de entrenamiento, buscaron mitigar las alucinaciones. Los resultados indicaron que los LLM reducen sustancialmente el tiempo de procesamiento de las evaluaciones y mejoran la toma de decisiones en las instituciones educativas.</w:t>
+        <w:t xml:space="preserve">, en el estudio "Estudio comparativo de sistemas de recomendación mediante filtrado colaborativo, basado en contenido y propuestas híbridas", comparó el rendimiento de los tres tipos de sistemas con datos de Goodreads que incluyeron 93 398 libros, 34 919 254 interacciones y 2 389 900 reseñas. Los modelos híbridos mejoraron la calidad de las recomendaciones al superar la sobreespecialización y la escasez de datos, y concluyó que combinan eficientemente ambos enfoques con mejoras en precisión, diversidad y adaptabilidad.</w:t>
       </w:r>
     </w:p>
     <w:p>
@@ -7632,17 +7629,17 @@
       </w:pPr>
       <w:sdt>
         <w:sdtPr>
-          <w:tag w:val="MENDELEY_CITATION_v3_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"/>
-          <w:id w:val="-1157141702"/>
+          <w:tag w:val="MENDELEY_CITATION_v3_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"/>
+          <w:id w:val="-100312186"/>
         </w:sdtPr>
         <w:sdtContent>
           <w:r>
-            <w:t xml:space="preserve">Millán Gordillo (2025)</w:t>
+            <w:t xml:space="preserve">Martínez Sixto et al. (2025)</w:t>
           </w:r>
         </w:sdtContent>
       </w:sdt>
       <w:r>
-        <w:t xml:space="preserve">, en el estudio "Estudio comparativo de sistemas de recomendación mediante filtrado colaborativo, basado en contenido y propuestas híbridas", comparó el rendimiento de los tres tipos de sistemas con datos de Goodreads que incluyeron 93 398 libros, 34 919 254 interacciones y 2 389 900 reseñas. Los modelos híbridos mejoraron la calidad de las recomendaciones al superar la sobreespecialización y la escasez de datos, y concluyó que combinan eficientemente ambos enfoques con mejoras en precisión, diversidad y adaptabilidad.</w:t>
+        <w:t xml:space="preserve"> evaluaron el desempeño de seis modelos de lenguaje grandes dentro de un sistema de generación aumentada por recuperación para producir diagramas de clases UML a partir de historias de usuario. Entre los modelos evaluados figuraron Gemini 2.5 Pro, Claude Sonnet 4, GPT-4 y Llama 3.2. Claude Sonnet 4, Gemini 2.5 Pro y GPT-4 obtuvieron el mejor desempeño, y el estudio mostró que la efectividad de RAG depende en gran medida de la calidad y relevancia del contexto recuperado.</w:t>
       </w:r>
     </w:p>
     <w:p>
@@ -7651,17 +7648,17 @@
       </w:pPr>
       <w:sdt>
         <w:sdtPr>
-          <w:tag w:val="MENDELEY_CITATION_v3_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"/>
-          <w:id w:val="-638811627"/>
+          <w:tag w:val="MENDELEY_CITATION_v3_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"/>
+          <w:id w:val="1567409311"/>
         </w:sdtPr>
         <w:sdtContent>
           <w:r>
-            <w:t xml:space="preserve">Martínez Sixto et al. (2025)</w:t>
+            <w:t xml:space="preserve">Cisneros-Bravo et al. (2023)</w:t>
           </w:r>
         </w:sdtContent>
       </w:sdt>
       <w:r>
-        <w:t xml:space="preserve"> evaluaron el desempeño de seis modelos de lenguaje grandes dentro de un sistema de generación aumentada por recuperación para producir diagramas de clases UML a partir de historias de usuario. Entre los modelos evaluados figuraron Gemini 2.5 Pro, Claude Sonnet 4, GPT-4 y Llama 3.2. Claude Sonnet 4, Gemini 2.5 Pro y GPT-4 obtuvieron el mejor desempeño, y el estudio mostró que la efectividad de RAG depende en gran medida de la calidad y relevancia del contexto recuperado.</w:t>
+        <w:t xml:space="preserve"> exploraron cómo la falta de orientación vocacional influye en la deserción universitaria. Mediante una metodología mixta encuestaron a 231 estudiantes de bachillerato: el 36.8 % no había recibido orientación vocacional y el 87 % manifestó interés en contar con herramientas de orientación. Concluyeron que la falta de orientación es un factor clave de la deserción y que deben fortalecerse estas herramientas en el nivel medio superior.</w:t>
       </w:r>
     </w:p>
     <w:p>
@@ -7670,27 +7667,8 @@
       </w:pPr>
       <w:sdt>
         <w:sdtPr>
-          <w:tag w:val="MENDELEY_CITATION_v3_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"/>
-          <w:id w:val="-723253467"/>
-        </w:sdtPr>
-        <w:sdtContent>
-          <w:r>
-            <w:t xml:space="preserve">Cisneros-Bravo et al. (2023)</w:t>
-          </w:r>
-        </w:sdtContent>
-      </w:sdt>
-      <w:r>
-        <w:t xml:space="preserve"> exploraron cómo la falta de orientación vocacional influye en la deserción universitaria. Mediante una metodología mixta encuestaron a 231 estudiantes de bachillerato: el 36.8 % no había recibido orientación vocacional y el 87 % manifestó interés en contar con herramientas de orientación. Concluyeron que la falta de orientación es un factor clave de la deserción y que deben fortalecerse estas herramientas en el nivel medio superior.</w:t>
-      </w:r>
-    </w:p>
-    <w:p>
-      <w:pPr>
-        <w:pStyle w:val="NORML3"/>
-      </w:pPr>
-      <w:sdt>
-        <w:sdtPr>
-          <w:tag w:val="MENDELEY_CITATION_v3_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"/>
-          <w:id w:val="-1576282367"/>
+          <w:tag w:val="MENDELEY_CITATION_v3_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"/>
+          <w:id w:val="1008338381"/>
         </w:sdtPr>
         <w:sdtContent>
           <w:r>
@@ -7728,8 +7706,8 @@
       </w:pPr>
       <w:sdt>
         <w:sdtPr>
-          <w:tag w:val="MENDELEY_CITATION_v3_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"/>
-          <w:id w:val="980771596"/>
+          <w:tag w:val="MENDELEY_CITATION_v3_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"/>
+          <w:id w:val="780947949"/>
         </w:sdtPr>
         <w:sdtContent>
           <w:r>
@@ -7747,8 +7725,8 @@
       </w:pPr>
       <w:sdt>
         <w:sdtPr>
-          <w:tag w:val="MENDELEY_CITATION_v3_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"/>
-          <w:id w:val="294075181"/>
+          <w:tag w:val="MENDELEY_CITATION_v3_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"/>
+          <w:id w:val="-1043721924"/>
         </w:sdtPr>
         <w:sdtContent>
           <w:r>
@@ -7766,8 +7744,8 @@
       </w:pPr>
       <w:sdt>
         <w:sdtPr>
-          <w:tag w:val="MENDELEY_CITATION_v3_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"/>
-          <w:id w:val="40166710"/>
+          <w:tag w:val="MENDELEY_CITATION_v3_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"/>
+          <w:id w:val="-511237787"/>
         </w:sdtPr>
         <w:sdtContent>
           <w:r>
@@ -7785,8 +7763,8 @@
       </w:pPr>
       <w:sdt>
         <w:sdtPr>
-          <w:tag w:val="MENDELEY_CITATION_v3_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"/>
-          <w:id w:val="943547471"/>
+          <w:tag w:val="MENDELEY_CITATION_v3_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"/>
+          <w:id w:val="-642170720"/>
         </w:sdtPr>
         <w:sdtContent>
           <w:r>
@@ -7804,8 +7782,8 @@
       </w:pPr>
       <w:sdt>
         <w:sdtPr>
-          <w:tag w:val="MENDELEY_CITATION_v3_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"/>
-          <w:id w:val="1984066481"/>
+          <w:tag w:val="MENDELEY_CITATION_v3_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"/>
+          <w:id w:val="-816462353"/>
         </w:sdtPr>
         <w:sdtContent>
           <w:r>
@@ -7842,8 +7820,8 @@
       </w:pPr>
       <w:sdt>
         <w:sdtPr>
-          <w:tag w:val="MENDELEY_CITATION_v3_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"/>
-          <w:id w:val="-1918949914"/>
+          <w:tag w:val="MENDELEY_CITATION_v3_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"/>
+          <w:id w:val="-704531920"/>
         </w:sdtPr>
         <w:sdtContent>
           <w:r>
@@ -7953,8 +7931,8 @@
       </w:r>
       <w:sdt>
         <w:sdtPr>
-          <w:tag w:val="MENDELEY_CITATION_v3_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"/>
-          <w:id w:val="1936843724"/>
+          <w:tag w:val="MENDELEY_CITATION_v3_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"/>
+          <w:id w:val="-2125421354"/>
         </w:sdtPr>
         <w:sdtContent>
           <w:r>
@@ -7967,8 +7945,8 @@
       </w:r>
       <w:sdt>
         <w:sdtPr>
-          <w:tag w:val="MENDELEY_CITATION_v3_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"/>
-          <w:id w:val="-1716161159"/>
+          <w:tag w:val="MENDELEY_CITATION_v3_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"/>
+          <w:id w:val="-1767021784"/>
         </w:sdtPr>
         <w:sdtContent>
           <w:r>
@@ -7989,8 +7967,8 @@
       </w:r>
       <w:sdt>
         <w:sdtPr>
-          <w:tag w:val="MENDELEY_CITATION_v3_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"/>
-          <w:id w:val="875948172"/>
+          <w:tag w:val="MENDELEY_CITATION_v3_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"/>
+          <w:id w:val="-1637813373"/>
         </w:sdtPr>
         <w:sdtContent>
           <w:r>
@@ -8003,8 +7981,8 @@
       </w:r>
       <w:sdt>
         <w:sdtPr>
-          <w:tag w:val="MENDELEY_CITATION_v3_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"/>
-          <w:id w:val="-369095467"/>
+          <w:tag w:val="MENDELEY_CITATION_v3_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"/>
+          <w:id w:val="1577047155"/>
         </w:sdtPr>
         <w:sdtContent>
           <w:r>
@@ -8025,8 +8003,8 @@
       </w:r>
       <w:sdt>
         <w:sdtPr>
-          <w:tag w:val="MENDELEY_CITATION_v3_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"/>
-          <w:id w:val="318749974"/>
+          <w:tag w:val="MENDELEY_CITATION_v3_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"/>
+          <w:id w:val="-5657282"/>
         </w:sdtPr>
         <w:sdtContent>
           <w:r>
@@ -8039,8 +8017,8 @@
       </w:r>
       <w:sdt>
         <w:sdtPr>
-          <w:tag w:val="MENDELEY_CITATION_v3_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"/>
-          <w:id w:val="1880488820"/>
+          <w:tag w:val="MENDELEY_CITATION_v3_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"/>
+          <w:id w:val="129365365"/>
         </w:sdtPr>
         <w:sdtContent>
           <w:r>
@@ -8223,8 +8201,8 @@
       </w:r>
       <w:sdt>
         <w:sdtPr>
-          <w:tag w:val="MENDELEY_CITATION_v3_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"/>
-          <w:id w:val="-367224100"/>
+          <w:tag w:val="MENDELEY_CITATION_v3_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"/>
+          <w:id w:val="1532231617"/>
         </w:sdtPr>
         <w:sdtContent>
           <w:r>
@@ -9276,8 +9254,8 @@
       </w:r>
       <w:sdt>
         <w:sdtPr>
-          <w:tag w:val="MENDELEY_CITATION_v3_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"/>
-          <w:id w:val="-1908534228"/>
+          <w:tag w:val="MENDELEY_CITATION_v3_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"/>
+          <w:id w:val="1361702930"/>
         </w:sdtPr>
         <w:sdtContent>
           <w:r>
@@ -9290,8 +9268,8 @@
       </w:r>
       <w:sdt>
         <w:sdtPr>
-          <w:tag w:val="MENDELEY_CITATION_v3_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"/>
-          <w:id w:val="580771383"/>
+          <w:tag w:val="MENDELEY_CITATION_v3_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"/>
+          <w:id w:val="-38962519"/>
         </w:sdtPr>
         <w:sdtContent>
           <w:r>
@@ -9479,8 +9457,8 @@
       </w:r>
       <w:sdt>
         <w:sdtPr>
-          <w:tag w:val="MENDELEY_CITATION_v3_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"/>
-          <w:id w:val="494858024"/>
+          <w:tag w:val="MENDELEY_CITATION_v3_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"/>
+          <w:id w:val="-249586353"/>
         </w:sdtPr>
         <w:sdtContent>
           <w:r>
@@ -9570,8 +9548,8 @@
       </w:r>
       <w:sdt>
         <w:sdtPr>
-          <w:tag w:val="MENDELEY_CITATION_v3_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"/>
-          <w:id w:val="-720301293"/>
+          <w:tag w:val="MENDELEY_CITATION_v3_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"/>
+          <w:id w:val="-92580154"/>
         </w:sdtPr>
         <w:sdtContent>
           <w:r>
@@ -9656,8 +9634,8 @@
       </w:r>
       <w:sdt>
         <w:sdtPr>
-          <w:tag w:val="MENDELEY_CITATION_v3_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"/>
-          <w:id w:val="-1090967872"/>
+          <w:tag w:val="MENDELEY_CITATION_v3_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"/>
+          <w:id w:val="1520315978"/>
         </w:sdtPr>
         <w:sdtContent>
           <w:r>
@@ -9719,8 +9697,8 @@
       </w:r>
       <w:sdt>
         <w:sdtPr>
-          <w:tag w:val="MENDELEY_CITATION_v3_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"/>
-          <w:id w:val="-1954207955"/>
+          <w:tag w:val="MENDELEY_CITATION_v3_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"/>
+          <w:id w:val="-1229827982"/>
         </w:sdtPr>
         <w:sdtContent>
           <w:r>
@@ -9733,8 +9711,8 @@
       </w:r>
       <w:sdt>
         <w:sdtPr>
-          <w:tag w:val="MENDELEY_CITATION_v3_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"/>
-          <w:id w:val="277466213"/>
+          <w:tag w:val="MENDELEY_CITATION_v3_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"/>
+          <w:id w:val="1753648518"/>
         </w:sdtPr>
         <w:sdtContent>
           <w:r>
@@ -10118,8 +10096,8 @@
       </w:r>
       <w:sdt>
         <w:sdtPr>
-          <w:tag w:val="MENDELEY_CITATION_v3_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"/>
-          <w:id w:val="-1651113206"/>
+          <w:tag w:val="MENDELEY_CITATION_v3_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"/>
+          <w:id w:val="-645984922"/>
         </w:sdtPr>
         <w:sdtContent>
           <w:r>
@@ -10229,8 +10207,8 @@
       </w:r>
       <w:sdt>
         <w:sdtPr>
-          <w:tag w:val="MENDELEY_CITATION_v3_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"/>
-          <w:id w:val="-2103205486"/>
+          <w:tag w:val="MENDELEY_CITATION_v3_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"/>
+          <w:id w:val="853246330"/>
         </w:sdtPr>
         <w:sdtContent>
           <w:r>
@@ -10622,8 +10600,8 @@
       </w:r>
       <w:sdt>
         <w:sdtPr>
-          <w:tag w:val="MENDELEY_CITATION_v3_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"/>
-          <w:id w:val="-2057606780"/>
+          <w:tag w:val="MENDELEY_CITATION_v3_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"/>
+          <w:id w:val="-2124726098"/>
         </w:sdtPr>
         <w:sdtContent>
           <w:r>
@@ -10779,8 +10757,8 @@
       </w:r>
       <w:sdt>
         <w:sdtPr>
-          <w:tag w:val="MENDELEY_CITATION_v3_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"/>
-          <w:id w:val="760857000"/>
+          <w:tag w:val="MENDELEY_CITATION_v3_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"/>
+          <w:id w:val="-119175746"/>
         </w:sdtPr>
         <w:sdtContent>
           <w:r>
@@ -10926,8 +10904,8 @@
       </w:r>
       <w:sdt>
         <w:sdtPr>
-          <w:tag w:val="MENDELEY_CITATION_v3_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"/>
-          <w:id w:val="-970806238"/>
+          <w:tag w:val="MENDELEY_CITATION_v3_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"/>
+          <w:id w:val="420589934"/>
         </w:sdtPr>
         <w:sdtContent>
           <w:r>
@@ -12418,6 +12396,2043 @@
     </w:p>
     <w:p>
       <w:pPr>
+        <w:pStyle w:val="NORML3"/>
+      </w:pPr>
+      <w:r>
+        <w:t xml:space="preserve">La Tabla 4 describe las características de las postulaciones analizadas. El 52.2 % correspondió a mujeres y el 47.8 % a varones, con tasas de ingreso similares, de 11.68 % y 11.28 %. El 86.1 % procedió de colegios públicos y el 30.0 % de colegios rurales, cuya tasa de ingreso fue de 10.05 %, frente a 12.17 % en los urbanos. El 41.2 % declaró una lengua materna originaria, quechua o aimara, sin diferencias marcadas en el ingreso. La mayor diferencia se observó según la preparación preuniversitaria: quienes se prepararon en CEPREUNA alcanzaron una tasa de 16.90 %, frente a 6.93 % de quienes no tuvieron preparación. Por área, el ingreso fue mayor en ingenierías, con 13.39 %, lo que refleja diferencias en la relación entre vacantes y postulantes de cada área.</w:t>
+      </w:r>
+    </w:p>
+    <w:p>
+      <w:pPr>
+        <w:pStyle w:val="TITTBFGL3"/>
+      </w:pPr>
+      <w:r>
+        <w:t xml:space="preserve">Tabla </w:t>
+      </w:r>
+      <w:fldSimple w:instr=" SEQ Tabla \* ARABIC ">
+        <w:r>
+          <w:rPr>
+            <w:noProof/>
+          </w:rPr>
+          <w:t>4</w:t>
+        </w:r>
+      </w:fldSimple>
+      <w:r>
+        <w:t xml:space="preserve"> </w:t>
+      </w:r>
+      <w:r>
+        <w:br/>
+      </w:r>
+      <w:r>
+        <w:rPr>
+          <w:b w:val="0"/>
+          <w:i/>
+        </w:rPr>
+        <w:t>Características de las postulaciones analizadas y tasa de ingreso según grupo, 2021-I a 2025-II</w:t>
+      </w:r>
+    </w:p>
+    <w:tbl>
+      <w:tblPr>
+        <w:tblStyle w:val="Tablaconcuadrcula"/>
+        <w:tblW w:w="7794" w:type="dxa"/>
+        <w:tblInd w:w="709" w:type="dxa"/>
+        <w:tblBorders>
+          <w:top w:val="none" w:sz="0" w:space="0" w:color="auto"/>
+          <w:left w:val="none" w:sz="0" w:space="0" w:color="auto"/>
+          <w:bottom w:val="none" w:sz="0" w:space="0" w:color="auto"/>
+          <w:right w:val="none" w:sz="0" w:space="0" w:color="auto"/>
+          <w:insideH w:val="none" w:sz="0" w:space="0" w:color="auto"/>
+          <w:insideV w:val="none" w:sz="0" w:space="0" w:color="auto"/>
+        </w:tblBorders>
+        <w:tblLayout w:type="fixed"/>
+      </w:tblPr>
+      <w:tblGrid>
+        <w:gridCol w:w="2649"/>
+        <w:gridCol w:w="1715"/>
+        <w:gridCol w:w="1715"/>
+        <w:gridCol w:w="1715"/>
+      </w:tblGrid>
+      <w:tr>
+        <w:trPr>
+          <w:tblHeader/>
+        </w:trPr>
+        <w:tc>
+          <w:tcPr>
+            <w:tcW w:w="2649" w:type="dxa"/>
+            <w:tcBorders>
+              <w:top w:val="single" w:sz="4" w:space="0" w:color="auto"/>
+              <w:bottom w:val="single" w:sz="4" w:space="0" w:color="auto"/>
+            </w:tcBorders>
+            <w:vAlign w:val="center"/>
+          </w:tcPr>
+          <w:p>
+            <w:pPr>
+              <w:pStyle w:val="CONTTBFB"/>
+              <w:jc w:val="center"/>
+            </w:pPr>
+            <w:r>
+              <w:rPr>
+                <w:b/>
+              </w:rPr>
+              <w:t xml:space="preserve">Variable y categoría</w:t>
+            </w:r>
+          </w:p>
+        </w:tc>
+        <w:tc>
+          <w:tcPr>
+            <w:tcW w:w="1715" w:type="dxa"/>
+            <w:tcBorders>
+              <w:top w:val="single" w:sz="4" w:space="0" w:color="auto"/>
+              <w:bottom w:val="single" w:sz="4" w:space="0" w:color="auto"/>
+            </w:tcBorders>
+            <w:vAlign w:val="center"/>
+          </w:tcPr>
+          <w:p>
+            <w:pPr>
+              <w:pStyle w:val="CONTTBFB"/>
+              <w:jc w:val="center"/>
+            </w:pPr>
+            <w:r>
+              <w:rPr>
+                <w:b/>
+              </w:rPr>
+              <w:t xml:space="preserve">Postulaciones</w:t>
+            </w:r>
+          </w:p>
+        </w:tc>
+        <w:tc>
+          <w:tcPr>
+            <w:tcW w:w="1715" w:type="dxa"/>
+            <w:tcBorders>
+              <w:top w:val="single" w:sz="4" w:space="0" w:color="auto"/>
+              <w:bottom w:val="single" w:sz="4" w:space="0" w:color="auto"/>
+            </w:tcBorders>
+            <w:vAlign w:val="center"/>
+          </w:tcPr>
+          <w:p>
+            <w:pPr>
+              <w:pStyle w:val="CONTTBFB"/>
+              <w:jc w:val="center"/>
+            </w:pPr>
+            <w:r>
+              <w:rPr>
+                <w:b/>
+              </w:rPr>
+              <w:t xml:space="preserve">%</w:t>
+            </w:r>
+          </w:p>
+        </w:tc>
+        <w:tc>
+          <w:tcPr>
+            <w:tcW w:w="1715" w:type="dxa"/>
+            <w:tcBorders>
+              <w:top w:val="single" w:sz="4" w:space="0" w:color="auto"/>
+              <w:bottom w:val="single" w:sz="4" w:space="0" w:color="auto"/>
+            </w:tcBorders>
+            <w:vAlign w:val="center"/>
+          </w:tcPr>
+          <w:p>
+            <w:pPr>
+              <w:pStyle w:val="CONTTBFB"/>
+              <w:jc w:val="center"/>
+            </w:pPr>
+            <w:r>
+              <w:rPr>
+                <w:b/>
+              </w:rPr>
+              <w:t xml:space="preserve">Tasa de ingreso (%)</w:t>
+            </w:r>
+          </w:p>
+        </w:tc>
+      </w:tr>
+      <w:tr>
+        <w:trPr>
+          <w:cantSplit/>
+        </w:trPr>
+        <w:tc>
+          <w:tcPr>
+            <w:tcW w:w="2649" w:type="dxa"/>
+            <w:tcBorders/>
+            <w:vAlign w:val="center"/>
+          </w:tcPr>
+          <w:p>
+            <w:pPr>
+              <w:pStyle w:val="CONTTBFB"/>
+              <w:jc w:val="left"/>
+            </w:pPr>
+            <w:r>
+              <w:t xml:space="preserve">Sexo:</w:t>
+            </w:r>
+          </w:p>
+        </w:tc>
+        <w:tc>
+          <w:tcPr>
+            <w:tcW w:w="1715" w:type="dxa"/>
+            <w:tcBorders/>
+            <w:vAlign w:val="center"/>
+          </w:tcPr>
+          <w:p>
+            <w:pPr>
+              <w:pStyle w:val="CONTTBFB"/>
+              <w:jc w:val="center"/>
+            </w:pPr>
+            <w:r>
+              <w:t xml:space="preserve"/>
+            </w:r>
+          </w:p>
+        </w:tc>
+        <w:tc>
+          <w:tcPr>
+            <w:tcW w:w="1715" w:type="dxa"/>
+            <w:tcBorders/>
+            <w:vAlign w:val="center"/>
+          </w:tcPr>
+          <w:p>
+            <w:pPr>
+              <w:pStyle w:val="CONTTBFB"/>
+              <w:jc w:val="center"/>
+            </w:pPr>
+            <w:r>
+              <w:t xml:space="preserve"/>
+            </w:r>
+          </w:p>
+        </w:tc>
+        <w:tc>
+          <w:tcPr>
+            <w:tcW w:w="1715" w:type="dxa"/>
+            <w:tcBorders/>
+            <w:vAlign w:val="center"/>
+          </w:tcPr>
+          <w:p>
+            <w:pPr>
+              <w:pStyle w:val="CONTTBFB"/>
+              <w:jc w:val="center"/>
+            </w:pPr>
+            <w:r>
+              <w:t xml:space="preserve"/>
+            </w:r>
+          </w:p>
+        </w:tc>
+      </w:tr>
+      <w:tr>
+        <w:trPr>
+          <w:cantSplit/>
+        </w:trPr>
+        <w:tc>
+          <w:tcPr>
+            <w:tcW w:w="2649" w:type="dxa"/>
+            <w:tcBorders/>
+            <w:vAlign w:val="center"/>
+          </w:tcPr>
+          <w:p>
+            <w:pPr>
+              <w:pStyle w:val="CONTTBFB"/>
+              <w:jc w:val="left"/>
+            </w:pPr>
+            <w:r>
+              <w:t xml:space="preserve">   Femenino</w:t>
+            </w:r>
+          </w:p>
+        </w:tc>
+        <w:tc>
+          <w:tcPr>
+            <w:tcW w:w="1715" w:type="dxa"/>
+            <w:tcBorders/>
+            <w:vAlign w:val="center"/>
+          </w:tcPr>
+          <w:p>
+            <w:pPr>
+              <w:pStyle w:val="CONTTBFB"/>
+              <w:jc w:val="center"/>
+            </w:pPr>
+            <w:r>
+              <w:t xml:space="preserve">22 007</w:t>
+            </w:r>
+          </w:p>
+        </w:tc>
+        <w:tc>
+          <w:tcPr>
+            <w:tcW w:w="1715" w:type="dxa"/>
+            <w:tcBorders/>
+            <w:vAlign w:val="center"/>
+          </w:tcPr>
+          <w:p>
+            <w:pPr>
+              <w:pStyle w:val="CONTTBFB"/>
+              <w:jc w:val="center"/>
+            </w:pPr>
+            <w:r>
+              <w:t xml:space="preserve">52.2</w:t>
+            </w:r>
+          </w:p>
+        </w:tc>
+        <w:tc>
+          <w:tcPr>
+            <w:tcW w:w="1715" w:type="dxa"/>
+            <w:tcBorders/>
+            <w:vAlign w:val="center"/>
+          </w:tcPr>
+          <w:p>
+            <w:pPr>
+              <w:pStyle w:val="CONTTBFB"/>
+              <w:jc w:val="center"/>
+            </w:pPr>
+            <w:r>
+              <w:t xml:space="preserve">11.68</w:t>
+            </w:r>
+          </w:p>
+        </w:tc>
+      </w:tr>
+      <w:tr>
+        <w:trPr>
+          <w:cantSplit/>
+        </w:trPr>
+        <w:tc>
+          <w:tcPr>
+            <w:tcW w:w="2649" w:type="dxa"/>
+            <w:tcBorders/>
+            <w:vAlign w:val="center"/>
+          </w:tcPr>
+          <w:p>
+            <w:pPr>
+              <w:pStyle w:val="CONTTBFB"/>
+              <w:jc w:val="left"/>
+            </w:pPr>
+            <w:r>
+              <w:t xml:space="preserve">   Masculino</w:t>
+            </w:r>
+          </w:p>
+        </w:tc>
+        <w:tc>
+          <w:tcPr>
+            <w:tcW w:w="1715" w:type="dxa"/>
+            <w:tcBorders/>
+            <w:vAlign w:val="center"/>
+          </w:tcPr>
+          <w:p>
+            <w:pPr>
+              <w:pStyle w:val="CONTTBFB"/>
+              <w:jc w:val="center"/>
+            </w:pPr>
+            <w:r>
+              <w:t xml:space="preserve">20 149</w:t>
+            </w:r>
+          </w:p>
+        </w:tc>
+        <w:tc>
+          <w:tcPr>
+            <w:tcW w:w="1715" w:type="dxa"/>
+            <w:tcBorders/>
+            <w:vAlign w:val="center"/>
+          </w:tcPr>
+          <w:p>
+            <w:pPr>
+              <w:pStyle w:val="CONTTBFB"/>
+              <w:jc w:val="center"/>
+            </w:pPr>
+            <w:r>
+              <w:t xml:space="preserve">47.8</w:t>
+            </w:r>
+          </w:p>
+        </w:tc>
+        <w:tc>
+          <w:tcPr>
+            <w:tcW w:w="1715" w:type="dxa"/>
+            <w:tcBorders/>
+            <w:vAlign w:val="center"/>
+          </w:tcPr>
+          <w:p>
+            <w:pPr>
+              <w:pStyle w:val="CONTTBFB"/>
+              <w:jc w:val="center"/>
+            </w:pPr>
+            <w:r>
+              <w:t xml:space="preserve">11.28</w:t>
+            </w:r>
+          </w:p>
+        </w:tc>
+      </w:tr>
+      <w:tr>
+        <w:trPr>
+          <w:cantSplit/>
+        </w:trPr>
+        <w:tc>
+          <w:tcPr>
+            <w:tcW w:w="2649" w:type="dxa"/>
+            <w:tcBorders/>
+            <w:vAlign w:val="center"/>
+          </w:tcPr>
+          <w:p>
+            <w:pPr>
+              <w:pStyle w:val="CONTTBFB"/>
+              <w:jc w:val="left"/>
+            </w:pPr>
+            <w:r>
+              <w:t xml:space="preserve">Área del colegio:</w:t>
+            </w:r>
+          </w:p>
+        </w:tc>
+        <w:tc>
+          <w:tcPr>
+            <w:tcW w:w="1715" w:type="dxa"/>
+            <w:tcBorders/>
+            <w:vAlign w:val="center"/>
+          </w:tcPr>
+          <w:p>
+            <w:pPr>
+              <w:pStyle w:val="CONTTBFB"/>
+              <w:jc w:val="center"/>
+            </w:pPr>
+            <w:r>
+              <w:t xml:space="preserve"/>
+            </w:r>
+          </w:p>
+        </w:tc>
+        <w:tc>
+          <w:tcPr>
+            <w:tcW w:w="1715" w:type="dxa"/>
+            <w:tcBorders/>
+            <w:vAlign w:val="center"/>
+          </w:tcPr>
+          <w:p>
+            <w:pPr>
+              <w:pStyle w:val="CONTTBFB"/>
+              <w:jc w:val="center"/>
+            </w:pPr>
+            <w:r>
+              <w:t xml:space="preserve"/>
+            </w:r>
+          </w:p>
+        </w:tc>
+        <w:tc>
+          <w:tcPr>
+            <w:tcW w:w="1715" w:type="dxa"/>
+            <w:tcBorders/>
+            <w:vAlign w:val="center"/>
+          </w:tcPr>
+          <w:p>
+            <w:pPr>
+              <w:pStyle w:val="CONTTBFB"/>
+              <w:jc w:val="center"/>
+            </w:pPr>
+            <w:r>
+              <w:t xml:space="preserve"/>
+            </w:r>
+          </w:p>
+        </w:tc>
+      </w:tr>
+      <w:tr>
+        <w:trPr>
+          <w:cantSplit/>
+        </w:trPr>
+        <w:tc>
+          <w:tcPr>
+            <w:tcW w:w="2649" w:type="dxa"/>
+            <w:tcBorders/>
+            <w:vAlign w:val="center"/>
+          </w:tcPr>
+          <w:p>
+            <w:pPr>
+              <w:pStyle w:val="CONTTBFB"/>
+              <w:jc w:val="left"/>
+            </w:pPr>
+            <w:r>
+              <w:t xml:space="preserve">   Urbana</w:t>
+            </w:r>
+          </w:p>
+        </w:tc>
+        <w:tc>
+          <w:tcPr>
+            <w:tcW w:w="1715" w:type="dxa"/>
+            <w:tcBorders/>
+            <w:vAlign w:val="center"/>
+          </w:tcPr>
+          <w:p>
+            <w:pPr>
+              <w:pStyle w:val="CONTTBFB"/>
+              <w:jc w:val="center"/>
+            </w:pPr>
+            <w:r>
+              <w:t xml:space="preserve">27 712</w:t>
+            </w:r>
+          </w:p>
+        </w:tc>
+        <w:tc>
+          <w:tcPr>
+            <w:tcW w:w="1715" w:type="dxa"/>
+            <w:tcBorders/>
+            <w:vAlign w:val="center"/>
+          </w:tcPr>
+          <w:p>
+            <w:pPr>
+              <w:pStyle w:val="CONTTBFB"/>
+              <w:jc w:val="center"/>
+            </w:pPr>
+            <w:r>
+              <w:t xml:space="preserve">65.7</w:t>
+            </w:r>
+          </w:p>
+        </w:tc>
+        <w:tc>
+          <w:tcPr>
+            <w:tcW w:w="1715" w:type="dxa"/>
+            <w:tcBorders/>
+            <w:vAlign w:val="center"/>
+          </w:tcPr>
+          <w:p>
+            <w:pPr>
+              <w:pStyle w:val="CONTTBFB"/>
+              <w:jc w:val="center"/>
+            </w:pPr>
+            <w:r>
+              <w:t xml:space="preserve">12.17</w:t>
+            </w:r>
+          </w:p>
+        </w:tc>
+      </w:tr>
+      <w:tr>
+        <w:trPr>
+          <w:cantSplit/>
+        </w:trPr>
+        <w:tc>
+          <w:tcPr>
+            <w:tcW w:w="2649" w:type="dxa"/>
+            <w:tcBorders/>
+            <w:vAlign w:val="center"/>
+          </w:tcPr>
+          <w:p>
+            <w:pPr>
+              <w:pStyle w:val="CONTTBFB"/>
+              <w:jc w:val="left"/>
+            </w:pPr>
+            <w:r>
+              <w:t xml:space="preserve">   Rural</w:t>
+            </w:r>
+          </w:p>
+        </w:tc>
+        <w:tc>
+          <w:tcPr>
+            <w:tcW w:w="1715" w:type="dxa"/>
+            <w:tcBorders/>
+            <w:vAlign w:val="center"/>
+          </w:tcPr>
+          <w:p>
+            <w:pPr>
+              <w:pStyle w:val="CONTTBFB"/>
+              <w:jc w:val="center"/>
+            </w:pPr>
+            <w:r>
+              <w:t xml:space="preserve">12 663</w:t>
+            </w:r>
+          </w:p>
+        </w:tc>
+        <w:tc>
+          <w:tcPr>
+            <w:tcW w:w="1715" w:type="dxa"/>
+            <w:tcBorders/>
+            <w:vAlign w:val="center"/>
+          </w:tcPr>
+          <w:p>
+            <w:pPr>
+              <w:pStyle w:val="CONTTBFB"/>
+              <w:jc w:val="center"/>
+            </w:pPr>
+            <w:r>
+              <w:t xml:space="preserve">30.0</w:t>
+            </w:r>
+          </w:p>
+        </w:tc>
+        <w:tc>
+          <w:tcPr>
+            <w:tcW w:w="1715" w:type="dxa"/>
+            <w:tcBorders/>
+            <w:vAlign w:val="center"/>
+          </w:tcPr>
+          <w:p>
+            <w:pPr>
+              <w:pStyle w:val="CONTTBFB"/>
+              <w:jc w:val="center"/>
+            </w:pPr>
+            <w:r>
+              <w:t xml:space="preserve">10.05</w:t>
+            </w:r>
+          </w:p>
+        </w:tc>
+      </w:tr>
+      <w:tr>
+        <w:trPr>
+          <w:cantSplit/>
+        </w:trPr>
+        <w:tc>
+          <w:tcPr>
+            <w:tcW w:w="2649" w:type="dxa"/>
+            <w:tcBorders/>
+            <w:vAlign w:val="center"/>
+          </w:tcPr>
+          <w:p>
+            <w:pPr>
+              <w:pStyle w:val="CONTTBFB"/>
+              <w:jc w:val="left"/>
+            </w:pPr>
+            <w:r>
+              <w:t xml:space="preserve">   No registrado</w:t>
+            </w:r>
+          </w:p>
+        </w:tc>
+        <w:tc>
+          <w:tcPr>
+            <w:tcW w:w="1715" w:type="dxa"/>
+            <w:tcBorders/>
+            <w:vAlign w:val="center"/>
+          </w:tcPr>
+          <w:p>
+            <w:pPr>
+              <w:pStyle w:val="CONTTBFB"/>
+              <w:jc w:val="center"/>
+            </w:pPr>
+            <w:r>
+              <w:t xml:space="preserve">1 781</w:t>
+            </w:r>
+          </w:p>
+        </w:tc>
+        <w:tc>
+          <w:tcPr>
+            <w:tcW w:w="1715" w:type="dxa"/>
+            <w:tcBorders/>
+            <w:vAlign w:val="center"/>
+          </w:tcPr>
+          <w:p>
+            <w:pPr>
+              <w:pStyle w:val="CONTTBFB"/>
+              <w:jc w:val="center"/>
+            </w:pPr>
+            <w:r>
+              <w:t xml:space="preserve">4.2</w:t>
+            </w:r>
+          </w:p>
+        </w:tc>
+        <w:tc>
+          <w:tcPr>
+            <w:tcW w:w="1715" w:type="dxa"/>
+            <w:tcBorders/>
+            <w:vAlign w:val="center"/>
+          </w:tcPr>
+          <w:p>
+            <w:pPr>
+              <w:pStyle w:val="CONTTBFB"/>
+              <w:jc w:val="center"/>
+            </w:pPr>
+            <w:r>
+              <w:t xml:space="preserve">11.12</w:t>
+            </w:r>
+          </w:p>
+        </w:tc>
+      </w:tr>
+      <w:tr>
+        <w:trPr>
+          <w:cantSplit/>
+        </w:trPr>
+        <w:tc>
+          <w:tcPr>
+            <w:tcW w:w="2649" w:type="dxa"/>
+            <w:tcBorders/>
+            <w:vAlign w:val="center"/>
+          </w:tcPr>
+          <w:p>
+            <w:pPr>
+              <w:pStyle w:val="CONTTBFB"/>
+              <w:jc w:val="left"/>
+            </w:pPr>
+            <w:r>
+              <w:t xml:space="preserve">Gestión del colegio:</w:t>
+            </w:r>
+          </w:p>
+        </w:tc>
+        <w:tc>
+          <w:tcPr>
+            <w:tcW w:w="1715" w:type="dxa"/>
+            <w:tcBorders/>
+            <w:vAlign w:val="center"/>
+          </w:tcPr>
+          <w:p>
+            <w:pPr>
+              <w:pStyle w:val="CONTTBFB"/>
+              <w:jc w:val="center"/>
+            </w:pPr>
+            <w:r>
+              <w:t xml:space="preserve"/>
+            </w:r>
+          </w:p>
+        </w:tc>
+        <w:tc>
+          <w:tcPr>
+            <w:tcW w:w="1715" w:type="dxa"/>
+            <w:tcBorders/>
+            <w:vAlign w:val="center"/>
+          </w:tcPr>
+          <w:p>
+            <w:pPr>
+              <w:pStyle w:val="CONTTBFB"/>
+              <w:jc w:val="center"/>
+            </w:pPr>
+            <w:r>
+              <w:t xml:space="preserve"/>
+            </w:r>
+          </w:p>
+        </w:tc>
+        <w:tc>
+          <w:tcPr>
+            <w:tcW w:w="1715" w:type="dxa"/>
+            <w:tcBorders/>
+            <w:vAlign w:val="center"/>
+          </w:tcPr>
+          <w:p>
+            <w:pPr>
+              <w:pStyle w:val="CONTTBFB"/>
+              <w:jc w:val="center"/>
+            </w:pPr>
+            <w:r>
+              <w:t xml:space="preserve"/>
+            </w:r>
+          </w:p>
+        </w:tc>
+      </w:tr>
+      <w:tr>
+        <w:trPr>
+          <w:cantSplit/>
+        </w:trPr>
+        <w:tc>
+          <w:tcPr>
+            <w:tcW w:w="2649" w:type="dxa"/>
+            <w:tcBorders/>
+            <w:vAlign w:val="center"/>
+          </w:tcPr>
+          <w:p>
+            <w:pPr>
+              <w:pStyle w:val="CONTTBFB"/>
+              <w:jc w:val="left"/>
+            </w:pPr>
+            <w:r>
+              <w:t xml:space="preserve">   Pública</w:t>
+            </w:r>
+          </w:p>
+        </w:tc>
+        <w:tc>
+          <w:tcPr>
+            <w:tcW w:w="1715" w:type="dxa"/>
+            <w:tcBorders/>
+            <w:vAlign w:val="center"/>
+          </w:tcPr>
+          <w:p>
+            <w:pPr>
+              <w:pStyle w:val="CONTTBFB"/>
+              <w:jc w:val="center"/>
+            </w:pPr>
+            <w:r>
+              <w:t xml:space="preserve">36 307</w:t>
+            </w:r>
+          </w:p>
+        </w:tc>
+        <w:tc>
+          <w:tcPr>
+            <w:tcW w:w="1715" w:type="dxa"/>
+            <w:tcBorders/>
+            <w:vAlign w:val="center"/>
+          </w:tcPr>
+          <w:p>
+            <w:pPr>
+              <w:pStyle w:val="CONTTBFB"/>
+              <w:jc w:val="center"/>
+            </w:pPr>
+            <w:r>
+              <w:t xml:space="preserve">86.1</w:t>
+            </w:r>
+          </w:p>
+        </w:tc>
+        <w:tc>
+          <w:tcPr>
+            <w:tcW w:w="1715" w:type="dxa"/>
+            <w:tcBorders/>
+            <w:vAlign w:val="center"/>
+          </w:tcPr>
+          <w:p>
+            <w:pPr>
+              <w:pStyle w:val="CONTTBFB"/>
+              <w:jc w:val="center"/>
+            </w:pPr>
+            <w:r>
+              <w:t xml:space="preserve">11.33</w:t>
+            </w:r>
+          </w:p>
+        </w:tc>
+      </w:tr>
+      <w:tr>
+        <w:trPr>
+          <w:cantSplit/>
+        </w:trPr>
+        <w:tc>
+          <w:tcPr>
+            <w:tcW w:w="2649" w:type="dxa"/>
+            <w:tcBorders/>
+            <w:vAlign w:val="center"/>
+          </w:tcPr>
+          <w:p>
+            <w:pPr>
+              <w:pStyle w:val="CONTTBFB"/>
+              <w:jc w:val="left"/>
+            </w:pPr>
+            <w:r>
+              <w:t xml:space="preserve">   Privada</w:t>
+            </w:r>
+          </w:p>
+        </w:tc>
+        <w:tc>
+          <w:tcPr>
+            <w:tcW w:w="1715" w:type="dxa"/>
+            <w:tcBorders/>
+            <w:vAlign w:val="center"/>
+          </w:tcPr>
+          <w:p>
+            <w:pPr>
+              <w:pStyle w:val="CONTTBFB"/>
+              <w:jc w:val="center"/>
+            </w:pPr>
+            <w:r>
+              <w:t xml:space="preserve">5 446</w:t>
+            </w:r>
+          </w:p>
+        </w:tc>
+        <w:tc>
+          <w:tcPr>
+            <w:tcW w:w="1715" w:type="dxa"/>
+            <w:tcBorders/>
+            <w:vAlign w:val="center"/>
+          </w:tcPr>
+          <w:p>
+            <w:pPr>
+              <w:pStyle w:val="CONTTBFB"/>
+              <w:jc w:val="center"/>
+            </w:pPr>
+            <w:r>
+              <w:t xml:space="preserve">12.9</w:t>
+            </w:r>
+          </w:p>
+        </w:tc>
+        <w:tc>
+          <w:tcPr>
+            <w:tcW w:w="1715" w:type="dxa"/>
+            <w:tcBorders/>
+            <w:vAlign w:val="center"/>
+          </w:tcPr>
+          <w:p>
+            <w:pPr>
+              <w:pStyle w:val="CONTTBFB"/>
+              <w:jc w:val="center"/>
+            </w:pPr>
+            <w:r>
+              <w:t xml:space="preserve">12.63</w:t>
+            </w:r>
+          </w:p>
+        </w:tc>
+      </w:tr>
+      <w:tr>
+        <w:trPr>
+          <w:cantSplit/>
+        </w:trPr>
+        <w:tc>
+          <w:tcPr>
+            <w:tcW w:w="2649" w:type="dxa"/>
+            <w:tcBorders/>
+            <w:vAlign w:val="center"/>
+          </w:tcPr>
+          <w:p>
+            <w:pPr>
+              <w:pStyle w:val="CONTTBFB"/>
+              <w:jc w:val="left"/>
+            </w:pPr>
+            <w:r>
+              <w:t xml:space="preserve">   Pública de gestión privada</w:t>
+            </w:r>
+          </w:p>
+        </w:tc>
+        <w:tc>
+          <w:tcPr>
+            <w:tcW w:w="1715" w:type="dxa"/>
+            <w:tcBorders/>
+            <w:vAlign w:val="center"/>
+          </w:tcPr>
+          <w:p>
+            <w:pPr>
+              <w:pStyle w:val="CONTTBFB"/>
+              <w:jc w:val="center"/>
+            </w:pPr>
+            <w:r>
+              <w:t xml:space="preserve">403</w:t>
+            </w:r>
+          </w:p>
+        </w:tc>
+        <w:tc>
+          <w:tcPr>
+            <w:tcW w:w="1715" w:type="dxa"/>
+            <w:tcBorders/>
+            <w:vAlign w:val="center"/>
+          </w:tcPr>
+          <w:p>
+            <w:pPr>
+              <w:pStyle w:val="CONTTBFB"/>
+              <w:jc w:val="center"/>
+            </w:pPr>
+            <w:r>
+              <w:t xml:space="preserve">1.0</w:t>
+            </w:r>
+          </w:p>
+        </w:tc>
+        <w:tc>
+          <w:tcPr>
+            <w:tcW w:w="1715" w:type="dxa"/>
+            <w:tcBorders/>
+            <w:vAlign w:val="center"/>
+          </w:tcPr>
+          <w:p>
+            <w:pPr>
+              <w:pStyle w:val="CONTTBFB"/>
+              <w:jc w:val="center"/>
+            </w:pPr>
+            <w:r>
+              <w:t xml:space="preserve">10.17</w:t>
+            </w:r>
+          </w:p>
+        </w:tc>
+      </w:tr>
+      <w:tr>
+        <w:trPr>
+          <w:cantSplit/>
+        </w:trPr>
+        <w:tc>
+          <w:tcPr>
+            <w:tcW w:w="2649" w:type="dxa"/>
+            <w:tcBorders/>
+            <w:vAlign w:val="center"/>
+          </w:tcPr>
+          <w:p>
+            <w:pPr>
+              <w:pStyle w:val="CONTTBFB"/>
+              <w:jc w:val="left"/>
+            </w:pPr>
+            <w:r>
+              <w:t xml:space="preserve">Lengua materna:</w:t>
+            </w:r>
+          </w:p>
+        </w:tc>
+        <w:tc>
+          <w:tcPr>
+            <w:tcW w:w="1715" w:type="dxa"/>
+            <w:tcBorders/>
+            <w:vAlign w:val="center"/>
+          </w:tcPr>
+          <w:p>
+            <w:pPr>
+              <w:pStyle w:val="CONTTBFB"/>
+              <w:jc w:val="center"/>
+            </w:pPr>
+            <w:r>
+              <w:t xml:space="preserve"/>
+            </w:r>
+          </w:p>
+        </w:tc>
+        <w:tc>
+          <w:tcPr>
+            <w:tcW w:w="1715" w:type="dxa"/>
+            <w:tcBorders/>
+            <w:vAlign w:val="center"/>
+          </w:tcPr>
+          <w:p>
+            <w:pPr>
+              <w:pStyle w:val="CONTTBFB"/>
+              <w:jc w:val="center"/>
+            </w:pPr>
+            <w:r>
+              <w:t xml:space="preserve"/>
+            </w:r>
+          </w:p>
+        </w:tc>
+        <w:tc>
+          <w:tcPr>
+            <w:tcW w:w="1715" w:type="dxa"/>
+            <w:tcBorders/>
+            <w:vAlign w:val="center"/>
+          </w:tcPr>
+          <w:p>
+            <w:pPr>
+              <w:pStyle w:val="CONTTBFB"/>
+              <w:jc w:val="center"/>
+            </w:pPr>
+            <w:r>
+              <w:t xml:space="preserve"/>
+            </w:r>
+          </w:p>
+        </w:tc>
+      </w:tr>
+      <w:tr>
+        <w:trPr>
+          <w:cantSplit/>
+        </w:trPr>
+        <w:tc>
+          <w:tcPr>
+            <w:tcW w:w="2649" w:type="dxa"/>
+            <w:tcBorders/>
+            <w:vAlign w:val="center"/>
+          </w:tcPr>
+          <w:p>
+            <w:pPr>
+              <w:pStyle w:val="CONTTBFB"/>
+              <w:jc w:val="left"/>
+            </w:pPr>
+            <w:r>
+              <w:t xml:space="preserve">   Castellano</w:t>
+            </w:r>
+          </w:p>
+        </w:tc>
+        <w:tc>
+          <w:tcPr>
+            <w:tcW w:w="1715" w:type="dxa"/>
+            <w:tcBorders/>
+            <w:vAlign w:val="center"/>
+          </w:tcPr>
+          <w:p>
+            <w:pPr>
+              <w:pStyle w:val="CONTTBFB"/>
+              <w:jc w:val="center"/>
+            </w:pPr>
+            <w:r>
+              <w:t xml:space="preserve">20 031</w:t>
+            </w:r>
+          </w:p>
+        </w:tc>
+        <w:tc>
+          <w:tcPr>
+            <w:tcW w:w="1715" w:type="dxa"/>
+            <w:tcBorders/>
+            <w:vAlign w:val="center"/>
+          </w:tcPr>
+          <w:p>
+            <w:pPr>
+              <w:pStyle w:val="CONTTBFB"/>
+              <w:jc w:val="center"/>
+            </w:pPr>
+            <w:r>
+              <w:t xml:space="preserve">47.5</w:t>
+            </w:r>
+          </w:p>
+        </w:tc>
+        <w:tc>
+          <w:tcPr>
+            <w:tcW w:w="1715" w:type="dxa"/>
+            <w:tcBorders/>
+            <w:vAlign w:val="center"/>
+          </w:tcPr>
+          <w:p>
+            <w:pPr>
+              <w:pStyle w:val="CONTTBFB"/>
+              <w:jc w:val="center"/>
+            </w:pPr>
+            <w:r>
+              <w:t xml:space="preserve">11.75</w:t>
+            </w:r>
+          </w:p>
+        </w:tc>
+      </w:tr>
+      <w:tr>
+        <w:trPr>
+          <w:cantSplit/>
+        </w:trPr>
+        <w:tc>
+          <w:tcPr>
+            <w:tcW w:w="2649" w:type="dxa"/>
+            <w:tcBorders/>
+            <w:vAlign w:val="center"/>
+          </w:tcPr>
+          <w:p>
+            <w:pPr>
+              <w:pStyle w:val="CONTTBFB"/>
+              <w:jc w:val="left"/>
+            </w:pPr>
+            <w:r>
+              <w:t xml:space="preserve">   Quechua</w:t>
+            </w:r>
+          </w:p>
+        </w:tc>
+        <w:tc>
+          <w:tcPr>
+            <w:tcW w:w="1715" w:type="dxa"/>
+            <w:tcBorders/>
+            <w:vAlign w:val="center"/>
+          </w:tcPr>
+          <w:p>
+            <w:pPr>
+              <w:pStyle w:val="CONTTBFB"/>
+              <w:jc w:val="center"/>
+            </w:pPr>
+            <w:r>
+              <w:t xml:space="preserve">8 884</w:t>
+            </w:r>
+          </w:p>
+        </w:tc>
+        <w:tc>
+          <w:tcPr>
+            <w:tcW w:w="1715" w:type="dxa"/>
+            <w:tcBorders/>
+            <w:vAlign w:val="center"/>
+          </w:tcPr>
+          <w:p>
+            <w:pPr>
+              <w:pStyle w:val="CONTTBFB"/>
+              <w:jc w:val="center"/>
+            </w:pPr>
+            <w:r>
+              <w:t xml:space="preserve">21.1</w:t>
+            </w:r>
+          </w:p>
+        </w:tc>
+        <w:tc>
+          <w:tcPr>
+            <w:tcW w:w="1715" w:type="dxa"/>
+            <w:tcBorders/>
+            <w:vAlign w:val="center"/>
+          </w:tcPr>
+          <w:p>
+            <w:pPr>
+              <w:pStyle w:val="CONTTBFB"/>
+              <w:jc w:val="center"/>
+            </w:pPr>
+            <w:r>
+              <w:t xml:space="preserve">11.36</w:t>
+            </w:r>
+          </w:p>
+        </w:tc>
+      </w:tr>
+      <w:tr>
+        <w:trPr>
+          <w:cantSplit/>
+        </w:trPr>
+        <w:tc>
+          <w:tcPr>
+            <w:tcW w:w="2649" w:type="dxa"/>
+            <w:tcBorders/>
+            <w:vAlign w:val="center"/>
+          </w:tcPr>
+          <w:p>
+            <w:pPr>
+              <w:pStyle w:val="CONTTBFB"/>
+              <w:jc w:val="left"/>
+            </w:pPr>
+            <w:r>
+              <w:t xml:space="preserve">   Aimara</w:t>
+            </w:r>
+          </w:p>
+        </w:tc>
+        <w:tc>
+          <w:tcPr>
+            <w:tcW w:w="1715" w:type="dxa"/>
+            <w:tcBorders/>
+            <w:vAlign w:val="center"/>
+          </w:tcPr>
+          <w:p>
+            <w:pPr>
+              <w:pStyle w:val="CONTTBFB"/>
+              <w:jc w:val="center"/>
+            </w:pPr>
+            <w:r>
+              <w:t xml:space="preserve">8 473</w:t>
+            </w:r>
+          </w:p>
+        </w:tc>
+        <w:tc>
+          <w:tcPr>
+            <w:tcW w:w="1715" w:type="dxa"/>
+            <w:tcBorders/>
+            <w:vAlign w:val="center"/>
+          </w:tcPr>
+          <w:p>
+            <w:pPr>
+              <w:pStyle w:val="CONTTBFB"/>
+              <w:jc w:val="center"/>
+            </w:pPr>
+            <w:r>
+              <w:t xml:space="preserve">20.1</w:t>
+            </w:r>
+          </w:p>
+        </w:tc>
+        <w:tc>
+          <w:tcPr>
+            <w:tcW w:w="1715" w:type="dxa"/>
+            <w:tcBorders/>
+            <w:vAlign w:val="center"/>
+          </w:tcPr>
+          <w:p>
+            <w:pPr>
+              <w:pStyle w:val="CONTTBFB"/>
+              <w:jc w:val="center"/>
+            </w:pPr>
+            <w:r>
+              <w:t xml:space="preserve">11.22</w:t>
+            </w:r>
+          </w:p>
+        </w:tc>
+      </w:tr>
+      <w:tr>
+        <w:trPr>
+          <w:cantSplit/>
+        </w:trPr>
+        <w:tc>
+          <w:tcPr>
+            <w:tcW w:w="2649" w:type="dxa"/>
+            <w:tcBorders/>
+            <w:vAlign w:val="center"/>
+          </w:tcPr>
+          <w:p>
+            <w:pPr>
+              <w:pStyle w:val="CONTTBFB"/>
+              <w:jc w:val="left"/>
+            </w:pPr>
+            <w:r>
+              <w:t xml:space="preserve">   No registrado</w:t>
+            </w:r>
+          </w:p>
+        </w:tc>
+        <w:tc>
+          <w:tcPr>
+            <w:tcW w:w="1715" w:type="dxa"/>
+            <w:tcBorders/>
+            <w:vAlign w:val="center"/>
+          </w:tcPr>
+          <w:p>
+            <w:pPr>
+              <w:pStyle w:val="CONTTBFB"/>
+              <w:jc w:val="center"/>
+            </w:pPr>
+            <w:r>
+              <w:t xml:space="preserve">4 768</w:t>
+            </w:r>
+          </w:p>
+        </w:tc>
+        <w:tc>
+          <w:tcPr>
+            <w:tcW w:w="1715" w:type="dxa"/>
+            <w:tcBorders/>
+            <w:vAlign w:val="center"/>
+          </w:tcPr>
+          <w:p>
+            <w:pPr>
+              <w:pStyle w:val="CONTTBFB"/>
+              <w:jc w:val="center"/>
+            </w:pPr>
+            <w:r>
+              <w:t xml:space="preserve">11.3</w:t>
+            </w:r>
+          </w:p>
+        </w:tc>
+        <w:tc>
+          <w:tcPr>
+            <w:tcW w:w="1715" w:type="dxa"/>
+            <w:tcBorders/>
+            <w:vAlign w:val="center"/>
+          </w:tcPr>
+          <w:p>
+            <w:pPr>
+              <w:pStyle w:val="CONTTBFB"/>
+              <w:jc w:val="center"/>
+            </w:pPr>
+            <w:r>
+              <w:t xml:space="preserve">11.09</w:t>
+            </w:r>
+          </w:p>
+        </w:tc>
+      </w:tr>
+      <w:tr>
+        <w:trPr>
+          <w:cantSplit/>
+        </w:trPr>
+        <w:tc>
+          <w:tcPr>
+            <w:tcW w:w="2649" w:type="dxa"/>
+            <w:tcBorders/>
+            <w:vAlign w:val="center"/>
+          </w:tcPr>
+          <w:p>
+            <w:pPr>
+              <w:pStyle w:val="CONTTBFB"/>
+              <w:jc w:val="left"/>
+            </w:pPr>
+            <w:r>
+              <w:t xml:space="preserve">Preparación preuniversitaria:</w:t>
+            </w:r>
+          </w:p>
+        </w:tc>
+        <w:tc>
+          <w:tcPr>
+            <w:tcW w:w="1715" w:type="dxa"/>
+            <w:tcBorders/>
+            <w:vAlign w:val="center"/>
+          </w:tcPr>
+          <w:p>
+            <w:pPr>
+              <w:pStyle w:val="CONTTBFB"/>
+              <w:jc w:val="center"/>
+            </w:pPr>
+            <w:r>
+              <w:t xml:space="preserve"/>
+            </w:r>
+          </w:p>
+        </w:tc>
+        <w:tc>
+          <w:tcPr>
+            <w:tcW w:w="1715" w:type="dxa"/>
+            <w:tcBorders/>
+            <w:vAlign w:val="center"/>
+          </w:tcPr>
+          <w:p>
+            <w:pPr>
+              <w:pStyle w:val="CONTTBFB"/>
+              <w:jc w:val="center"/>
+            </w:pPr>
+            <w:r>
+              <w:t xml:space="preserve"/>
+            </w:r>
+          </w:p>
+        </w:tc>
+        <w:tc>
+          <w:tcPr>
+            <w:tcW w:w="1715" w:type="dxa"/>
+            <w:tcBorders/>
+            <w:vAlign w:val="center"/>
+          </w:tcPr>
+          <w:p>
+            <w:pPr>
+              <w:pStyle w:val="CONTTBFB"/>
+              <w:jc w:val="center"/>
+            </w:pPr>
+            <w:r>
+              <w:t xml:space="preserve"/>
+            </w:r>
+          </w:p>
+        </w:tc>
+      </w:tr>
+      <w:tr>
+        <w:trPr>
+          <w:cantSplit/>
+        </w:trPr>
+        <w:tc>
+          <w:tcPr>
+            <w:tcW w:w="2649" w:type="dxa"/>
+            <w:tcBorders/>
+            <w:vAlign w:val="center"/>
+          </w:tcPr>
+          <w:p>
+            <w:pPr>
+              <w:pStyle w:val="CONTTBFB"/>
+              <w:jc w:val="left"/>
+            </w:pPr>
+            <w:r>
+              <w:t xml:space="preserve">   Academia particular</w:t>
+            </w:r>
+          </w:p>
+        </w:tc>
+        <w:tc>
+          <w:tcPr>
+            <w:tcW w:w="1715" w:type="dxa"/>
+            <w:tcBorders/>
+            <w:vAlign w:val="center"/>
+          </w:tcPr>
+          <w:p>
+            <w:pPr>
+              <w:pStyle w:val="CONTTBFB"/>
+              <w:jc w:val="center"/>
+            </w:pPr>
+            <w:r>
+              <w:t xml:space="preserve">11 097</w:t>
+            </w:r>
+          </w:p>
+        </w:tc>
+        <w:tc>
+          <w:tcPr>
+            <w:tcW w:w="1715" w:type="dxa"/>
+            <w:tcBorders/>
+            <w:vAlign w:val="center"/>
+          </w:tcPr>
+          <w:p>
+            <w:pPr>
+              <w:pStyle w:val="CONTTBFB"/>
+              <w:jc w:val="center"/>
+            </w:pPr>
+            <w:r>
+              <w:t xml:space="preserve">26.3</w:t>
+            </w:r>
+          </w:p>
+        </w:tc>
+        <w:tc>
+          <w:tcPr>
+            <w:tcW w:w="1715" w:type="dxa"/>
+            <w:tcBorders/>
+            <w:vAlign w:val="center"/>
+          </w:tcPr>
+          <w:p>
+            <w:pPr>
+              <w:pStyle w:val="CONTTBFB"/>
+              <w:jc w:val="center"/>
+            </w:pPr>
+            <w:r>
+              <w:t xml:space="preserve">11.01</w:t>
+            </w:r>
+          </w:p>
+        </w:tc>
+      </w:tr>
+      <w:tr>
+        <w:trPr>
+          <w:cantSplit/>
+        </w:trPr>
+        <w:tc>
+          <w:tcPr>
+            <w:tcW w:w="2649" w:type="dxa"/>
+            <w:tcBorders/>
+            <w:vAlign w:val="center"/>
+          </w:tcPr>
+          <w:p>
+            <w:pPr>
+              <w:pStyle w:val="CONTTBFB"/>
+              <w:jc w:val="left"/>
+            </w:pPr>
+            <w:r>
+              <w:t xml:space="preserve">   CEPREUNA</w:t>
+            </w:r>
+          </w:p>
+        </w:tc>
+        <w:tc>
+          <w:tcPr>
+            <w:tcW w:w="1715" w:type="dxa"/>
+            <w:tcBorders/>
+            <w:vAlign w:val="center"/>
+          </w:tcPr>
+          <w:p>
+            <w:pPr>
+              <w:pStyle w:val="CONTTBFB"/>
+              <w:jc w:val="center"/>
+            </w:pPr>
+            <w:r>
+              <w:t xml:space="preserve">9 466</w:t>
+            </w:r>
+          </w:p>
+        </w:tc>
+        <w:tc>
+          <w:tcPr>
+            <w:tcW w:w="1715" w:type="dxa"/>
+            <w:tcBorders/>
+            <w:vAlign w:val="center"/>
+          </w:tcPr>
+          <w:p>
+            <w:pPr>
+              <w:pStyle w:val="CONTTBFB"/>
+              <w:jc w:val="center"/>
+            </w:pPr>
+            <w:r>
+              <w:t xml:space="preserve">22.5</w:t>
+            </w:r>
+          </w:p>
+        </w:tc>
+        <w:tc>
+          <w:tcPr>
+            <w:tcW w:w="1715" w:type="dxa"/>
+            <w:tcBorders/>
+            <w:vAlign w:val="center"/>
+          </w:tcPr>
+          <w:p>
+            <w:pPr>
+              <w:pStyle w:val="CONTTBFB"/>
+              <w:jc w:val="center"/>
+            </w:pPr>
+            <w:r>
+              <w:t xml:space="preserve">16.90</w:t>
+            </w:r>
+          </w:p>
+        </w:tc>
+      </w:tr>
+      <w:tr>
+        <w:trPr>
+          <w:cantSplit/>
+        </w:trPr>
+        <w:tc>
+          <w:tcPr>
+            <w:tcW w:w="2649" w:type="dxa"/>
+            <w:tcBorders/>
+            <w:vAlign w:val="center"/>
+          </w:tcPr>
+          <w:p>
+            <w:pPr>
+              <w:pStyle w:val="CONTTBFB"/>
+              <w:jc w:val="left"/>
+            </w:pPr>
+            <w:r>
+              <w:t xml:space="preserve">   Autoestudio</w:t>
+            </w:r>
+          </w:p>
+        </w:tc>
+        <w:tc>
+          <w:tcPr>
+            <w:tcW w:w="1715" w:type="dxa"/>
+            <w:tcBorders/>
+            <w:vAlign w:val="center"/>
+          </w:tcPr>
+          <w:p>
+            <w:pPr>
+              <w:pStyle w:val="CONTTBFB"/>
+              <w:jc w:val="center"/>
+            </w:pPr>
+            <w:r>
+              <w:t xml:space="preserve">7 957</w:t>
+            </w:r>
+          </w:p>
+        </w:tc>
+        <w:tc>
+          <w:tcPr>
+            <w:tcW w:w="1715" w:type="dxa"/>
+            <w:tcBorders/>
+            <w:vAlign w:val="center"/>
+          </w:tcPr>
+          <w:p>
+            <w:pPr>
+              <w:pStyle w:val="CONTTBFB"/>
+              <w:jc w:val="center"/>
+            </w:pPr>
+            <w:r>
+              <w:t xml:space="preserve">18.9</w:t>
+            </w:r>
+          </w:p>
+        </w:tc>
+        <w:tc>
+          <w:tcPr>
+            <w:tcW w:w="1715" w:type="dxa"/>
+            <w:tcBorders/>
+            <w:vAlign w:val="center"/>
+          </w:tcPr>
+          <w:p>
+            <w:pPr>
+              <w:pStyle w:val="CONTTBFB"/>
+              <w:jc w:val="center"/>
+            </w:pPr>
+            <w:r>
+              <w:t xml:space="preserve">9.43</w:t>
+            </w:r>
+          </w:p>
+        </w:tc>
+      </w:tr>
+      <w:tr>
+        <w:trPr>
+          <w:cantSplit/>
+        </w:trPr>
+        <w:tc>
+          <w:tcPr>
+            <w:tcW w:w="2649" w:type="dxa"/>
+            <w:tcBorders/>
+            <w:vAlign w:val="center"/>
+          </w:tcPr>
+          <w:p>
+            <w:pPr>
+              <w:pStyle w:val="CONTTBFB"/>
+              <w:jc w:val="left"/>
+            </w:pPr>
+            <w:r>
+              <w:t xml:space="preserve">   No registrado</w:t>
+            </w:r>
+          </w:p>
+        </w:tc>
+        <w:tc>
+          <w:tcPr>
+            <w:tcW w:w="1715" w:type="dxa"/>
+            <w:tcBorders/>
+            <w:vAlign w:val="center"/>
+          </w:tcPr>
+          <w:p>
+            <w:pPr>
+              <w:pStyle w:val="CONTTBFB"/>
+              <w:jc w:val="center"/>
+            </w:pPr>
+            <w:r>
+              <w:t xml:space="preserve">6 382</w:t>
+            </w:r>
+          </w:p>
+        </w:tc>
+        <w:tc>
+          <w:tcPr>
+            <w:tcW w:w="1715" w:type="dxa"/>
+            <w:tcBorders/>
+            <w:vAlign w:val="center"/>
+          </w:tcPr>
+          <w:p>
+            <w:pPr>
+              <w:pStyle w:val="CONTTBFB"/>
+              <w:jc w:val="center"/>
+            </w:pPr>
+            <w:r>
+              <w:t xml:space="preserve">15.1</w:t>
+            </w:r>
+          </w:p>
+        </w:tc>
+        <w:tc>
+          <w:tcPr>
+            <w:tcW w:w="1715" w:type="dxa"/>
+            <w:tcBorders/>
+            <w:vAlign w:val="center"/>
+          </w:tcPr>
+          <w:p>
+            <w:pPr>
+              <w:pStyle w:val="CONTTBFB"/>
+              <w:jc w:val="center"/>
+            </w:pPr>
+            <w:r>
+              <w:t xml:space="preserve">8.79</w:t>
+            </w:r>
+          </w:p>
+        </w:tc>
+      </w:tr>
+      <w:tr>
+        <w:trPr>
+          <w:cantSplit/>
+        </w:trPr>
+        <w:tc>
+          <w:tcPr>
+            <w:tcW w:w="2649" w:type="dxa"/>
+            <w:tcBorders/>
+            <w:vAlign w:val="center"/>
+          </w:tcPr>
+          <w:p>
+            <w:pPr>
+              <w:pStyle w:val="CONTTBFB"/>
+              <w:jc w:val="left"/>
+            </w:pPr>
+            <w:r>
+              <w:t xml:space="preserve">   Ninguna</w:t>
+            </w:r>
+          </w:p>
+        </w:tc>
+        <w:tc>
+          <w:tcPr>
+            <w:tcW w:w="1715" w:type="dxa"/>
+            <w:tcBorders/>
+            <w:vAlign w:val="center"/>
+          </w:tcPr>
+          <w:p>
+            <w:pPr>
+              <w:pStyle w:val="CONTTBFB"/>
+              <w:jc w:val="center"/>
+            </w:pPr>
+            <w:r>
+              <w:t xml:space="preserve">3 855</w:t>
+            </w:r>
+          </w:p>
+        </w:tc>
+        <w:tc>
+          <w:tcPr>
+            <w:tcW w:w="1715" w:type="dxa"/>
+            <w:tcBorders/>
+            <w:vAlign w:val="center"/>
+          </w:tcPr>
+          <w:p>
+            <w:pPr>
+              <w:pStyle w:val="CONTTBFB"/>
+              <w:jc w:val="center"/>
+            </w:pPr>
+            <w:r>
+              <w:t xml:space="preserve">9.1</w:t>
+            </w:r>
+          </w:p>
+        </w:tc>
+        <w:tc>
+          <w:tcPr>
+            <w:tcW w:w="1715" w:type="dxa"/>
+            <w:tcBorders/>
+            <w:vAlign w:val="center"/>
+          </w:tcPr>
+          <w:p>
+            <w:pPr>
+              <w:pStyle w:val="CONTTBFB"/>
+              <w:jc w:val="center"/>
+            </w:pPr>
+            <w:r>
+              <w:t xml:space="preserve">6.93</w:t>
+            </w:r>
+          </w:p>
+        </w:tc>
+      </w:tr>
+      <w:tr>
+        <w:trPr>
+          <w:cantSplit/>
+        </w:trPr>
+        <w:tc>
+          <w:tcPr>
+            <w:tcW w:w="2649" w:type="dxa"/>
+            <w:tcBorders/>
+            <w:vAlign w:val="center"/>
+          </w:tcPr>
+          <w:p>
+            <w:pPr>
+              <w:pStyle w:val="CONTTBFB"/>
+              <w:jc w:val="left"/>
+            </w:pPr>
+            <w:r>
+              <w:t xml:space="preserve">   CEPREUNA en un ciclo previo</w:t>
+            </w:r>
+          </w:p>
+        </w:tc>
+        <w:tc>
+          <w:tcPr>
+            <w:tcW w:w="1715" w:type="dxa"/>
+            <w:tcBorders/>
+            <w:vAlign w:val="center"/>
+          </w:tcPr>
+          <w:p>
+            <w:pPr>
+              <w:pStyle w:val="CONTTBFB"/>
+              <w:jc w:val="center"/>
+            </w:pPr>
+            <w:r>
+              <w:t xml:space="preserve">3 399</w:t>
+            </w:r>
+          </w:p>
+        </w:tc>
+        <w:tc>
+          <w:tcPr>
+            <w:tcW w:w="1715" w:type="dxa"/>
+            <w:tcBorders/>
+            <w:vAlign w:val="center"/>
+          </w:tcPr>
+          <w:p>
+            <w:pPr>
+              <w:pStyle w:val="CONTTBFB"/>
+              <w:jc w:val="center"/>
+            </w:pPr>
+            <w:r>
+              <w:t xml:space="preserve">8.1</w:t>
+            </w:r>
+          </w:p>
+        </w:tc>
+        <w:tc>
+          <w:tcPr>
+            <w:tcW w:w="1715" w:type="dxa"/>
+            <w:tcBorders/>
+            <w:vAlign w:val="center"/>
+          </w:tcPr>
+          <w:p>
+            <w:pPr>
+              <w:pStyle w:val="CONTTBFB"/>
+              <w:jc w:val="center"/>
+            </w:pPr>
+            <w:r>
+              <w:t xml:space="preserve">13.03</w:t>
+            </w:r>
+          </w:p>
+        </w:tc>
+      </w:tr>
+      <w:tr>
+        <w:trPr>
+          <w:cantSplit/>
+        </w:trPr>
+        <w:tc>
+          <w:tcPr>
+            <w:tcW w:w="2649" w:type="dxa"/>
+            <w:tcBorders/>
+            <w:vAlign w:val="center"/>
+          </w:tcPr>
+          <w:p>
+            <w:pPr>
+              <w:pStyle w:val="CONTTBFB"/>
+              <w:jc w:val="left"/>
+            </w:pPr>
+            <w:r>
+              <w:t xml:space="preserve">Área del programa postulado:</w:t>
+            </w:r>
+          </w:p>
+        </w:tc>
+        <w:tc>
+          <w:tcPr>
+            <w:tcW w:w="1715" w:type="dxa"/>
+            <w:tcBorders/>
+            <w:vAlign w:val="center"/>
+          </w:tcPr>
+          <w:p>
+            <w:pPr>
+              <w:pStyle w:val="CONTTBFB"/>
+              <w:jc w:val="center"/>
+            </w:pPr>
+            <w:r>
+              <w:t xml:space="preserve"/>
+            </w:r>
+          </w:p>
+        </w:tc>
+        <w:tc>
+          <w:tcPr>
+            <w:tcW w:w="1715" w:type="dxa"/>
+            <w:tcBorders/>
+            <w:vAlign w:val="center"/>
+          </w:tcPr>
+          <w:p>
+            <w:pPr>
+              <w:pStyle w:val="CONTTBFB"/>
+              <w:jc w:val="center"/>
+            </w:pPr>
+            <w:r>
+              <w:t xml:space="preserve"/>
+            </w:r>
+          </w:p>
+        </w:tc>
+        <w:tc>
+          <w:tcPr>
+            <w:tcW w:w="1715" w:type="dxa"/>
+            <w:tcBorders/>
+            <w:vAlign w:val="center"/>
+          </w:tcPr>
+          <w:p>
+            <w:pPr>
+              <w:pStyle w:val="CONTTBFB"/>
+              <w:jc w:val="center"/>
+            </w:pPr>
+            <w:r>
+              <w:t xml:space="preserve"/>
+            </w:r>
+          </w:p>
+        </w:tc>
+      </w:tr>
+      <w:tr>
+        <w:trPr>
+          <w:cantSplit/>
+        </w:trPr>
+        <w:tc>
+          <w:tcPr>
+            <w:tcW w:w="2649" w:type="dxa"/>
+            <w:tcBorders/>
+            <w:vAlign w:val="center"/>
+          </w:tcPr>
+          <w:p>
+            <w:pPr>
+              <w:pStyle w:val="CONTTBFB"/>
+              <w:jc w:val="left"/>
+            </w:pPr>
+            <w:r>
+              <w:t xml:space="preserve">   Sociales</w:t>
+            </w:r>
+          </w:p>
+        </w:tc>
+        <w:tc>
+          <w:tcPr>
+            <w:tcW w:w="1715" w:type="dxa"/>
+            <w:tcBorders/>
+            <w:vAlign w:val="center"/>
+          </w:tcPr>
+          <w:p>
+            <w:pPr>
+              <w:pStyle w:val="CONTTBFB"/>
+              <w:jc w:val="center"/>
+            </w:pPr>
+            <w:r>
+              <w:t xml:space="preserve">19 189</w:t>
+            </w:r>
+          </w:p>
+        </w:tc>
+        <w:tc>
+          <w:tcPr>
+            <w:tcW w:w="1715" w:type="dxa"/>
+            <w:tcBorders/>
+            <w:vAlign w:val="center"/>
+          </w:tcPr>
+          <w:p>
+            <w:pPr>
+              <w:pStyle w:val="CONTTBFB"/>
+              <w:jc w:val="center"/>
+            </w:pPr>
+            <w:r>
+              <w:t xml:space="preserve">45.5</w:t>
+            </w:r>
+          </w:p>
+        </w:tc>
+        <w:tc>
+          <w:tcPr>
+            <w:tcW w:w="1715" w:type="dxa"/>
+            <w:tcBorders/>
+            <w:vAlign w:val="center"/>
+          </w:tcPr>
+          <w:p>
+            <w:pPr>
+              <w:pStyle w:val="CONTTBFB"/>
+              <w:jc w:val="center"/>
+            </w:pPr>
+            <w:r>
+              <w:t xml:space="preserve">10.76</w:t>
+            </w:r>
+          </w:p>
+        </w:tc>
+      </w:tr>
+      <w:tr>
+        <w:trPr>
+          <w:cantSplit/>
+        </w:trPr>
+        <w:tc>
+          <w:tcPr>
+            <w:tcW w:w="2649" w:type="dxa"/>
+            <w:tcBorders/>
+            <w:vAlign w:val="center"/>
+          </w:tcPr>
+          <w:p>
+            <w:pPr>
+              <w:pStyle w:val="CONTTBFB"/>
+              <w:jc w:val="left"/>
+            </w:pPr>
+            <w:r>
+              <w:t xml:space="preserve">   Ingenierías</w:t>
+            </w:r>
+          </w:p>
+        </w:tc>
+        <w:tc>
+          <w:tcPr>
+            <w:tcW w:w="1715" w:type="dxa"/>
+            <w:tcBorders/>
+            <w:vAlign w:val="center"/>
+          </w:tcPr>
+          <w:p>
+            <w:pPr>
+              <w:pStyle w:val="CONTTBFB"/>
+              <w:jc w:val="center"/>
+            </w:pPr>
+            <w:r>
+              <w:t xml:space="preserve">13 203</w:t>
+            </w:r>
+          </w:p>
+        </w:tc>
+        <w:tc>
+          <w:tcPr>
+            <w:tcW w:w="1715" w:type="dxa"/>
+            <w:tcBorders/>
+            <w:vAlign w:val="center"/>
+          </w:tcPr>
+          <w:p>
+            <w:pPr>
+              <w:pStyle w:val="CONTTBFB"/>
+              <w:jc w:val="center"/>
+            </w:pPr>
+            <w:r>
+              <w:t xml:space="preserve">31.3</w:t>
+            </w:r>
+          </w:p>
+        </w:tc>
+        <w:tc>
+          <w:tcPr>
+            <w:tcW w:w="1715" w:type="dxa"/>
+            <w:tcBorders/>
+            <w:vAlign w:val="center"/>
+          </w:tcPr>
+          <w:p>
+            <w:pPr>
+              <w:pStyle w:val="CONTTBFB"/>
+              <w:jc w:val="center"/>
+            </w:pPr>
+            <w:r>
+              <w:t xml:space="preserve">13.39</w:t>
+            </w:r>
+          </w:p>
+        </w:tc>
+      </w:tr>
+      <w:tr>
+        <w:trPr>
+          <w:cantSplit/>
+        </w:trPr>
+        <w:tc>
+          <w:tcPr>
+            <w:tcW w:w="2649" w:type="dxa"/>
+            <w:tcBorders>
+              <w:bottom w:val="single" w:sz="4" w:space="0" w:color="auto"/>
+            </w:tcBorders>
+            <w:vAlign w:val="center"/>
+          </w:tcPr>
+          <w:p>
+            <w:pPr>
+              <w:pStyle w:val="CONTTBFB"/>
+              <w:jc w:val="left"/>
+            </w:pPr>
+            <w:r>
+              <w:t xml:space="preserve">   Biomédicas</w:t>
+            </w:r>
+          </w:p>
+        </w:tc>
+        <w:tc>
+          <w:tcPr>
+            <w:tcW w:w="1715" w:type="dxa"/>
+            <w:tcBorders>
+              <w:bottom w:val="single" w:sz="4" w:space="0" w:color="auto"/>
+            </w:tcBorders>
+            <w:vAlign w:val="center"/>
+          </w:tcPr>
+          <w:p>
+            <w:pPr>
+              <w:pStyle w:val="CONTTBFB"/>
+              <w:jc w:val="center"/>
+            </w:pPr>
+            <w:r>
+              <w:t xml:space="preserve">9 764</w:t>
+            </w:r>
+          </w:p>
+        </w:tc>
+        <w:tc>
+          <w:tcPr>
+            <w:tcW w:w="1715" w:type="dxa"/>
+            <w:tcBorders>
+              <w:bottom w:val="single" w:sz="4" w:space="0" w:color="auto"/>
+            </w:tcBorders>
+            <w:vAlign w:val="center"/>
+          </w:tcPr>
+          <w:p>
+            <w:pPr>
+              <w:pStyle w:val="CONTTBFB"/>
+              <w:jc w:val="center"/>
+            </w:pPr>
+            <w:r>
+              <w:t xml:space="preserve">23.2</w:t>
+            </w:r>
+          </w:p>
+        </w:tc>
+        <w:tc>
+          <w:tcPr>
+            <w:tcW w:w="1715" w:type="dxa"/>
+            <w:tcBorders>
+              <w:bottom w:val="single" w:sz="4" w:space="0" w:color="auto"/>
+            </w:tcBorders>
+            <w:vAlign w:val="center"/>
+          </w:tcPr>
+          <w:p>
+            <w:pPr>
+              <w:pStyle w:val="CONTTBFB"/>
+              <w:jc w:val="center"/>
+            </w:pPr>
+            <w:r>
+              <w:t xml:space="preserve">10.35</w:t>
+            </w:r>
+          </w:p>
+        </w:tc>
+      </w:tr>
+    </w:tbl>
+    <w:p>
+      <w:pPr>
+        <w:pStyle w:val="NotasL3"/>
+      </w:pPr>
+      <w:r>
+        <w:rPr>
+          <w:i/>
+        </w:rPr>
+        <w:t xml:space="preserve">Nota.</w:t>
+      </w:r>
+      <w:r>
+        <w:t xml:space="preserve"> Porcentajes respecto de las 42 156 postulaciones del conjunto analítico. "No registrado" agrupa los valores faltantes. Elaboración propia con datos de la Oficina de Admisión de la UNA-Puno y del SIAGIE.</w:t>
+      </w:r>
+    </w:p>
+    <w:p>
+      <w:pPr>
         <w:pStyle w:val="Ttulo3"/>
       </w:pPr>
       <w:r>
@@ -12437,7 +14452,7 @@
         <w:pStyle w:val="NORML4L5"/>
       </w:pPr>
       <w:r>
-        <w:t xml:space="preserve">La Tabla 4 muestra que los ingresantes presentaron promedios de secundaria significativamente mayores que los no ingresantes en todas las áreas curriculares (p &lt; .001). El mayor tamaño del efecto correspondió al promedio de quinto grado, con un delta de Cliff de 0.414, magnitud media, seguido del promedio de secundaria (0.393). Los ingresantes acumularon también menos áreas desaprobadas. En cambio, la edad, los años desde el egreso, las postulaciones anteriores y el tamaño del hogar no se asociaron con el ingreso (p &gt; .05).</w:t>
+        <w:t xml:space="preserve">La Tabla 5 muestra que los ingresantes presentaron promedios de secundaria significativamente mayores que los no ingresantes en todas las áreas curriculares (p &lt; .001). El mayor tamaño del efecto correspondió al promedio de quinto grado, con un delta de Cliff de 0.414, magnitud media, seguido del promedio de secundaria (0.393). Los ingresantes acumularon también menos áreas desaprobadas. En cambio, la edad, los años desde el egreso, las postulaciones anteriores y el tamaño del hogar no se asociaron con el ingreso (p &gt; .05).</w:t>
       </w:r>
     </w:p>
     <w:p>
@@ -12452,7 +14467,7 @@
           <w:rPr>
             <w:noProof/>
           </w:rPr>
-          <w:t>4</w:t>
+          <w:t>5</w:t>
         </w:r>
       </w:fldSimple>
       <w:r>
@@ -14191,7 +16206,7 @@
         <w:pStyle w:val="NORML4L5"/>
       </w:pPr>
       <w:r>
-        <w:t xml:space="preserve">Entre las variables categóricas (Tabla 5), la preparación preuniversitaria mostró la asociación más fuerte con el ingreso (V = 0.102), seguida del acceso a internet, el estudio previo en CEPREUNA y la disponibilidad de computadora en el hogar. El área y la gestión del colegio y el ingreso familiar se asociaron de forma significativa pero débil, mientras que el sexo, la lengua materna y el nivel educativo de la madre no mostraron asociación significativa. En conjunto, el rendimiento escolar previo y el acceso a recursos de preparación y tecnológicos son los factores que mejor diferencian a los ingresantes.</w:t>
+        <w:t xml:space="preserve">Entre las variables categóricas (Tabla 6), la preparación preuniversitaria mostró la asociación más fuerte con el ingreso (V = 0.102), seguida del acceso a internet, el estudio previo en CEPREUNA y la disponibilidad de computadora en el hogar. El área y la gestión del colegio y el ingreso familiar se asociaron de forma significativa pero débil, mientras que el sexo, la lengua materna y el nivel educativo de la madre no mostraron asociación significativa. En conjunto, el rendimiento escolar previo y el acceso a recursos de preparación y tecnológicos son los factores que mejor diferencian a los ingresantes.</w:t>
       </w:r>
     </w:p>
     <w:p>
@@ -14206,7 +16221,7 @@
           <w:rPr>
             <w:noProof/>
           </w:rPr>
-          <w:t>5</w:t>
+          <w:t>6</w:t>
         </w:r>
       </w:fldSimple>
       <w:r>
@@ -15502,6 +17517,103 @@
     </w:p>
     <w:p>
       <w:pPr>
+        <w:pStyle w:val="NORML4L5"/>
+      </w:pPr>
+      <w:r>
+        <w:t xml:space="preserve">La Figura 4 muestra que la tasa de ingreso crece de forma sostenida con el promedio de quinto de secundaria: pasa de 1.2 % en quienes obtuvieron 12 a 11.0 % con 14, 22.1 % con 15 y 40.0 % con 16 o más, es decir, 3.5 veces la tasa global. Ningún postulante con promedio menor a 12 ingresó. Esta relación gradual, sin saltos abruptos, anticipa que el promedio de quinto grado sea el predictor de mayor peso del modelo, y muestra a la vez que incluso en el tramo más alto la mayoría no ingresa, lo que limita la capacidad de cualquier modelo basado solo en el historial escolar.</w:t>
+      </w:r>
+    </w:p>
+    <w:p>
+      <w:pPr>
+        <w:pStyle w:val="TITTBFGL4L5"/>
+      </w:pPr>
+      <w:r>
+        <w:t xml:space="preserve">Figura </w:t>
+      </w:r>
+      <w:fldSimple w:instr=" SEQ Figura \* ARABIC ">
+        <w:r>
+          <w:rPr>
+            <w:noProof/>
+          </w:rPr>
+          <w:t>4</w:t>
+        </w:r>
+      </w:fldSimple>
+      <w:r>
+        <w:t xml:space="preserve"> </w:t>
+      </w:r>
+      <w:r>
+        <w:br/>
+      </w:r>
+      <w:r>
+        <w:rPr>
+          <w:b w:val="0"/>
+          <w:i/>
+        </w:rPr>
+        <w:t>Tasa de ingreso según el promedio de quinto de secundaria, 2021-I a 2025-II</w:t>
+      </w:r>
+    </w:p>
+    <w:p xmlns:a="http://schemas.openxmlformats.org/drawingml/2006/main" xmlns:pic="http://schemas.openxmlformats.org/drawingml/2006/picture">
+      <w:pPr>
+        <w:pStyle w:val="CONTTBFB"/>
+        <w:ind w:left="1418"/>
+      </w:pPr>
+      <w:r>
+        <w:rPr>
+          <w:noProof/>
+        </w:rPr>
+        <w:drawing>
+          <wp:inline distT="0" distB="0" distL="0" distR="0">
+            <wp:extent cx="4407535" cy="2266732"/>
+            <wp:effectExtent l="0" t="0" r="0" b="0"/>
+            <wp:docPr id="5004" name="Figura 5004"/>
+            <wp:cNvGraphicFramePr>
+              <a:graphicFrameLocks noChangeAspect="1"/>
+            </wp:cNvGraphicFramePr>
+            <a:graphic>
+              <a:graphicData uri="http://schemas.openxmlformats.org/drawingml/2006/picture">
+                <pic:pic>
+                  <pic:nvPicPr>
+                    <pic:cNvPr id="5004" name="careergpt_fig_tasa_promedio.png"/>
+                    <pic:cNvPicPr/>
+                  </pic:nvPicPr>
+                  <pic:blipFill>
+                    <a:blip r:embed="rId21"/>
+                    <a:stretch>
+                      <a:fillRect/>
+                    </a:stretch>
+                  </pic:blipFill>
+                  <pic:spPr>
+                    <a:xfrm>
+                      <a:off x="0" y="0"/>
+                      <a:ext cx="4407535" cy="2266732"/>
+                    </a:xfrm>
+                    <a:prstGeom prst="rect">
+                      <a:avLst/>
+                    </a:prstGeom>
+                  </pic:spPr>
+                </pic:pic>
+              </a:graphicData>
+            </a:graphic>
+          </wp:inline>
+        </w:drawing>
+      </w:r>
+    </w:p>
+    <w:p>
+      <w:pPr>
+        <w:pStyle w:val="NotasL4L5"/>
+      </w:pPr>
+      <w:r>
+        <w:rPr>
+          <w:i/>
+        </w:rPr>
+        <w:t xml:space="preserve">Nota.</w:t>
+      </w:r>
+      <w:r>
+        <w:t xml:space="preserve"> Promedio anual de quinto grado en escala vigesimal, agrupado por su parte entera. Los extremos con pocos casos se agrupan en "Menos de 12" y "16 o más". La línea punteada indica la tasa global. Elaboración propia con datos de la UNA-Puno y del SIAGIE.</w:t>
+      </w:r>
+    </w:p>
+    <w:p>
+      <w:pPr>
         <w:pStyle w:val="Ttulo4"/>
       </w:pPr>
       <w:r>
@@ -15513,7 +17625,7 @@
         <w:pStyle w:val="NORML4L5"/>
       </w:pPr>
       <w:r>
-        <w:t xml:space="preserve">La Tabla 6 compara el modelo XGBoost con las referencias. El clasificador trivial, que predice siempre que el postulante no ingresa, obtiene una exactitud de 88.51 % sin identificar a ningún ingresante, lo que demuestra que la exactitud no es una métrica adecuada en este problema. El XGBoost alcanzó un AUC-ROC de 0.754 y un AUC-PR de 0.292, equivalente a 2.5 veces la tasa base. En el umbral que maximiza el F1 (0.612) identificó al 50.7 % de los ingresantes, con una precisión de 27.6 %.</w:t>
+        <w:t xml:space="preserve">La Tabla 7 compara el modelo XGBoost con las referencias. El clasificador trivial, que predice siempre que el postulante no ingresa, obtiene una exactitud de 88.51 % sin identificar a ningún ingresante, lo que demuestra que la exactitud no es una métrica adecuada en este problema. El XGBoost alcanzó un AUC-ROC de 0.754 y un AUC-PR de 0.292, equivalente a 2.5 veces la tasa base. En el umbral que maximiza el F1 (0.612) identificó al 50.7 % de los ingresantes, con una precisión de 27.6 %.</w:t>
       </w:r>
     </w:p>
     <w:p>
@@ -15528,7 +17640,7 @@
           <w:rPr>
             <w:noProof/>
           </w:rPr>
-          <w:t>6</w:t>
+          <w:t>7</w:t>
         </w:r>
       </w:fldSimple>
       <w:r>
@@ -16101,7 +18213,7 @@
         <w:pStyle w:val="NORML4L5"/>
       </w:pPr>
       <w:r>
-        <w:t xml:space="preserve">La Tabla 7 muestra que el desempeño fue estable entre pliegues, con una desviación estándar del AUC-ROC de 0.0047. La regresión logística obtuvo un AUC-ROC ligeramente superior al del XGBoost, con una diferencia media de 0.0014 que, aunque estadísticamente significativa (t(4) = -2.99, p = .040), carece de relevancia práctica. La Figura 4 presenta las curvas correspondientes.</w:t>
+        <w:t xml:space="preserve">La Tabla 8 muestra que el desempeño fue estable entre pliegues, con una desviación estándar del AUC-ROC de 0.0047. La regresión logística obtuvo un AUC-ROC ligeramente superior al del XGBoost, con una diferencia media de 0.0014 que, aunque estadísticamente significativa (t(4) = -2.99, p = .040), carece de relevancia práctica. La Figura 5 presenta las curvas correspondientes.</w:t>
       </w:r>
     </w:p>
     <w:p>
@@ -16116,7 +18228,7 @@
           <w:rPr>
             <w:noProof/>
           </w:rPr>
-          <w:t>7</w:t>
+          <w:t>8</w:t>
         </w:r>
       </w:fldSimple>
       <w:r>
@@ -17136,7 +19248,7 @@
           <w:rPr>
             <w:noProof/>
           </w:rPr>
-          <w:t>4</w:t>
+          <w:t>5</w:t>
         </w:r>
       </w:fldSimple>
       <w:r>
@@ -17166,7 +19278,7 @@
           <wp:inline distT="0" distB="0" distL="0" distR="0">
             <wp:extent cx="4407535" cy="1860959"/>
             <wp:effectExtent l="0" t="0" r="0" b="0"/>
-            <wp:docPr id="5004" name="Figura 5004"/>
+            <wp:docPr id="5005" name="Figura 5005"/>
             <wp:cNvGraphicFramePr>
               <a:graphicFrameLocks noChangeAspect="1"/>
             </wp:cNvGraphicFramePr>
@@ -17174,11 +19286,11 @@
               <a:graphicData uri="http://schemas.openxmlformats.org/drawingml/2006/picture">
                 <pic:pic>
                   <pic:nvPicPr>
-                    <pic:cNvPr id="5004" name="careergpt_fig_roc_pr.png"/>
+                    <pic:cNvPr id="5005" name="careergpt_fig_roc_pr.png"/>
                     <pic:cNvPicPr/>
                   </pic:nvPicPr>
                   <pic:blipFill>
-                    <a:blip r:embed="rId21"/>
+                    <a:blip r:embed="rId22"/>
                     <a:stretch>
                       <a:fillRect/>
                     </a:stretch>
@@ -17234,7 +19346,7 @@
         <w:pStyle w:val="NORML4L5"/>
       </w:pPr>
       <w:r>
-        <w:t xml:space="preserve">La Figura 5 muestra que el promedio de quinto de secundaria (11.1 % de la ganancia) y el promedio de secundaria (7.4 %) fueron los predictores de mayor peso, seguidos del perfil verbal, del equipamiento tecnológico del hogar, de la tasa previa de ingreso del programa, de la preparación preuniversitaria y del perfil cuantitativo. Estos resultados son consistentes con el análisis bivariado de las Tablas 4 y 5.</w:t>
+        <w:t xml:space="preserve">La Figura 6 muestra que el promedio de quinto de secundaria (11.1 % de la ganancia) y el promedio de secundaria (7.4 %) fueron los predictores de mayor peso, seguidos del perfil verbal, del equipamiento tecnológico del hogar, de la tasa previa de ingreso del programa, de la preparación preuniversitaria y del perfil cuantitativo. Estos resultados son consistentes con el análisis bivariado de las Tablas 5 y 6.</w:t>
       </w:r>
     </w:p>
     <w:p>
@@ -17249,7 +19361,7 @@
           <w:rPr>
             <w:noProof/>
           </w:rPr>
-          <w:t>5</w:t>
+          <w:t>6</w:t>
         </w:r>
       </w:fldSimple>
       <w:r>
@@ -17279,7 +19391,7 @@
           <wp:inline distT="0" distB="0" distL="0" distR="0">
             <wp:extent cx="4407535" cy="2693493"/>
             <wp:effectExtent l="0" t="0" r="0" b="0"/>
-            <wp:docPr id="5005" name="Figura 5005"/>
+            <wp:docPr id="5006" name="Figura 5006"/>
             <wp:cNvGraphicFramePr>
               <a:graphicFrameLocks noChangeAspect="1"/>
             </wp:cNvGraphicFramePr>
@@ -17287,11 +19399,11 @@
               <a:graphicData uri="http://schemas.openxmlformats.org/drawingml/2006/picture">
                 <pic:pic>
                   <pic:nvPicPr>
-                    <pic:cNvPr id="5005" name="careergpt_fig_importancia.png"/>
+                    <pic:cNvPr id="5006" name="careergpt_fig_importancia.png"/>
                     <pic:cNvPicPr/>
                   </pic:nvPicPr>
                   <pic:blipFill>
-                    <a:blip r:embed="rId22"/>
+                    <a:blip r:embed="rId23"/>
                     <a:stretch>
                       <a:fillRect/>
                     </a:stretch>
@@ -17339,7 +19451,7 @@
         <w:pStyle w:val="NORML4L5"/>
       </w:pPr>
       <w:r>
-        <w:t xml:space="preserve">La Tabla 8 muestra que el modelo discrimina con similar eficacia en ambos grupos, con AUC-ROC de 0.759 en el área rural y 0.751 en la urbana. Sin embargo, la tasa de falsos negativos fue de 54.20 % en los colegios rurales frente a 47.09 % en los urbanos, una brecha de 7.11 puntos estadísticamente significativa (χ² = 18.40, p &lt; .001). Es decir, entre quienes efectivamente ingresaron, el modelo asignó baja probabilidad con mayor frecuencia a los procedentes de colegios rurales, por lo que su uso orientador sin corrección desalentaría de forma desproporcionada a este grupo.</w:t>
+        <w:t xml:space="preserve">La Tabla 9 muestra que el modelo discrimina con similar eficacia en ambos grupos, con AUC-ROC de 0.759 en el área rural y 0.751 en la urbana. Sin embargo, la tasa de falsos negativos fue de 54.20 % en los colegios rurales frente a 47.09 % en los urbanos, una brecha de 7.11 puntos estadísticamente significativa (χ² = 18.40, p &lt; .001). Es decir, entre quienes efectivamente ingresaron, el modelo asignó baja probabilidad con mayor frecuencia a los procedentes de colegios rurales, por lo que su uso orientador sin corrección desalentaría de forma desproporcionada a este grupo.</w:t>
       </w:r>
     </w:p>
     <w:p>
@@ -17354,7 +19466,7 @@
           <w:rPr>
             <w:noProof/>
           </w:rPr>
-          <w:t>8</w:t>
+          <w:t>9</w:t>
         </w:r>
       </w:fldSimple>
       <w:r>
@@ -17851,7 +19963,15 @@
         <w:pStyle w:val="NORML4L5"/>
       </w:pPr>
       <w:r>
-        <w:t xml:space="preserve">A partir del modelo final se estimó, para cada postulante, la probabilidad de ingreso en los programas de su área académica, lo que permite ordenarlos. La Tabla 9 presenta un caso ilustrativo del rankeo obtenido, que constituye la entrada del modelo de lenguaje. La calibración isotónica redujo el puntaje de Brier de 0.194 a 0.092 y llevó la probabilidad media estimada de 0.406 a 0.115, igual a la tasa observada, por lo que las probabilidades presentadas al postulante reflejan frecuencias reales de ingreso.</w:t>
+        <w:t xml:space="preserve">A partir del modelo final se estimó, para cada postulante, la probabilidad de ingreso en los programas de su área académica, lo que permite ordenarlos. La Tabla 10 presenta un caso ilustrativo del rankeo obtenido, que constituye la entrada del modelo de lenguaje. La calibración isotónica redujo el puntaje de Brier de 0.194 a 0.092 y llevó la probabilidad media estimada de 0.406 a 0.115, igual a la tasa observada, por lo que las probabilidades presentadas al postulante reflejan frecuencias reales de ingreso.</w:t>
+      </w:r>
+    </w:p>
+    <w:p>
+      <w:pPr>
+        <w:pStyle w:val="NORML4L5"/>
+      </w:pPr>
+      <w:r>
+        <w:t xml:space="preserve">La Figura 7 presenta la curva de calibración. Antes de calibrar, el modelo sobrestimaba de forma sistemática la probabilidad de ingreso, como efecto de la ponderación de la clase minoritaria usada durante el entrenamiento: en el decil con mayor probabilidad estimada, en promedio 0.79, ingresó solo el 33.5 % de los postulantes. Tras la calibración isotónica, la curva se superpone con la diagonal y el puntaje de Brier baja de 0.194 a 0.092. Dado que la calibración se ajustó sobre las mismas predicciones fuera de pliegue que se evalúan, esta concordancia corresponde a un ajuste dentro de la muestra. En una implementación, el calibrador debe estimarse con postulaciones de un periodo independiente.</w:t>
       </w:r>
     </w:p>
     <w:p>
@@ -17859,6 +19979,95 @@
         <w:pStyle w:val="TITTBFGL4L5"/>
       </w:pPr>
       <w:r>
+        <w:t xml:space="preserve">Figura </w:t>
+      </w:r>
+      <w:fldSimple w:instr=" SEQ Figura \* ARABIC ">
+        <w:r>
+          <w:rPr>
+            <w:noProof/>
+          </w:rPr>
+          <w:t>7</w:t>
+        </w:r>
+      </w:fldSimple>
+      <w:r>
+        <w:t xml:space="preserve"> </w:t>
+      </w:r>
+      <w:r>
+        <w:br/>
+      </w:r>
+      <w:r>
+        <w:rPr>
+          <w:b w:val="0"/>
+          <w:i/>
+        </w:rPr>
+        <w:t>Curva de calibración del modelo XGBoost antes y después de la calibración isotónica</w:t>
+      </w:r>
+    </w:p>
+    <w:p xmlns:a="http://schemas.openxmlformats.org/drawingml/2006/main" xmlns:pic="http://schemas.openxmlformats.org/drawingml/2006/picture">
+      <w:pPr>
+        <w:pStyle w:val="CONTTBFB"/>
+        <w:ind w:left="1418"/>
+      </w:pPr>
+      <w:r>
+        <w:rPr>
+          <w:noProof/>
+        </w:rPr>
+        <w:drawing>
+          <wp:inline distT="0" distB="0" distL="0" distR="0">
+            <wp:extent cx="4407535" cy="3463063"/>
+            <wp:effectExtent l="0" t="0" r="0" b="0"/>
+            <wp:docPr id="5007" name="Figura 5007"/>
+            <wp:cNvGraphicFramePr>
+              <a:graphicFrameLocks noChangeAspect="1"/>
+            </wp:cNvGraphicFramePr>
+            <a:graphic>
+              <a:graphicData uri="http://schemas.openxmlformats.org/drawingml/2006/picture">
+                <pic:pic>
+                  <pic:nvPicPr>
+                    <pic:cNvPr id="5007" name="careergpt_fig_calibracion.png"/>
+                    <pic:cNvPicPr/>
+                  </pic:nvPicPr>
+                  <pic:blipFill>
+                    <a:blip r:embed="rId24"/>
+                    <a:stretch>
+                      <a:fillRect/>
+                    </a:stretch>
+                  </pic:blipFill>
+                  <pic:spPr>
+                    <a:xfrm>
+                      <a:off x="0" y="0"/>
+                      <a:ext cx="4407535" cy="3463063"/>
+                    </a:xfrm>
+                    <a:prstGeom prst="rect">
+                      <a:avLst/>
+                    </a:prstGeom>
+                  </pic:spPr>
+                </pic:pic>
+              </a:graphicData>
+            </a:graphic>
+          </wp:inline>
+        </w:drawing>
+      </w:r>
+    </w:p>
+    <w:p>
+      <w:pPr>
+        <w:pStyle w:val="NotasL4L5"/>
+      </w:pPr>
+      <w:r>
+        <w:rPr>
+          <w:i/>
+        </w:rPr>
+        <w:t xml:space="preserve">Nota.</w:t>
+      </w:r>
+      <w:r>
+        <w:t xml:space="preserve"> Proporción observada de ingreso en diez grupos de igual tamaño ordenados por la probabilidad estimada, a partir de las predicciones fuera de pliegue. La línea punteada indica la calibración perfecta. Elaboración propia.</w:t>
+      </w:r>
+    </w:p>
+    <w:p>
+      <w:pPr>
+        <w:pStyle w:val="TITTBFGL4L5"/>
+      </w:pPr>
+      <w:r>
         <w:t xml:space="preserve">Tabla </w:t>
       </w:r>
       <w:fldSimple w:instr=" SEQ Tabla \* ARABIC ">
@@ -17866,7 +20075,7 @@
           <w:rPr>
             <w:noProof/>
           </w:rPr>
-          <w:t>9</w:t>
+          <w:t>10</w:t>
         </w:r>
       </w:fldSimple>
       <w:r>
@@ -18167,7 +20376,7 @@
         <w:pStyle w:val="NORML3"/>
       </w:pPr>
       <w:r>
-        <w:t xml:space="preserve">Se generó el corpus CareER-Dataset con 34 648 pares de instrucción y respuesta, uno por persona. La Tabla 10 muestra su distribución en las particiones, con longitudes medias de instrucción y respuesta prácticamente idénticas entre ellas. El vocabulario de las respuestas comprende 243 términos distintos y el programa recomendado en primer lugar abarca 18 programas diferentes.</w:t>
+        <w:t xml:space="preserve">Se generó el corpus CareER-Dataset con 34 648 pares de instrucción y respuesta, uno por persona. La Tabla 11 muestra su distribución en las particiones, con longitudes medias de instrucción y respuesta prácticamente idénticas entre ellas. El vocabulario de las respuestas comprende 243 términos distintos y el programa recomendado en primer lugar abarca 18 programas diferentes.</w:t>
       </w:r>
     </w:p>
     <w:p>
@@ -18182,7 +20391,7 @@
           <w:rPr>
             <w:noProof/>
           </w:rPr>
-          <w:t>10</w:t>
+          <w:t>11</w:t>
         </w:r>
       </w:fldSimple>
       <w:r>
@@ -18617,7 +20826,7 @@
         <w:pStyle w:val="NORML3"/>
       </w:pPr>
       <w:r>
-        <w:t xml:space="preserve">Como se observa en la Tabla 11, no se encontraron diferencias significativas entre las particiones en la distribución del área del colegio, el sexo ni el área del programa (p &gt; .05), lo que confirma que el corpus está balanceado. Dado que incluye a la totalidad de personas analizables, reproduce la distribución de la población. La coherencia fue de 100.0 %: en todos los pares el programa recomendado coincide con el de mayor probabilidad consignado en la instrucción. La Tabla 12 presenta un par de ejemplo.</w:t>
+        <w:t xml:space="preserve">Como se observa en la Tabla 12, no se encontraron diferencias significativas entre las particiones en la distribución del área del colegio, el sexo ni el área del programa (p &gt; .05), lo que confirma que el corpus está balanceado. Dado que incluye a la totalidad de personas analizables, reproduce la distribución de la población. La coherencia fue de 100.0 %: en todos los pares el programa recomendado coincide con el de mayor probabilidad consignado en la instrucción. La Tabla 13 presenta un par de ejemplo.</w:t>
       </w:r>
     </w:p>
     <w:p>
@@ -18632,7 +20841,7 @@
           <w:rPr>
             <w:noProof/>
           </w:rPr>
-          <w:t>11</w:t>
+          <w:t>12</w:t>
         </w:r>
       </w:fldSimple>
       <w:r>
@@ -18932,7 +21141,7 @@
           <w:rPr>
             <w:noProof/>
           </w:rPr>
-          <w:t>12</w:t>
+          <w:t>13</w:t>
         </w:r>
       </w:fldSimple>
       <w:r>
@@ -19406,7 +21615,7 @@
         <w:pStyle w:val="NORML4L5"/>
       </w:pPr>
       <w:r>
-        <w:t xml:space="preserve">El ajuste se ejecutó en una GPU Tesla T4 de Google Colab sobre 6 000 pares de la partición de entrenamiento, durante 1 época y 375 pasos de optimización. Los adaptadores LoRA sumaron 4 358 144 parámetros entrenables, cerca del 0.3 % del modelo, y el entrenamiento tomó 33.6 minutos en la condición híbrida y 27.8 minutos en la condición sin componente tabular. Como muestran la Tabla 13 y la Figura 6, en la condición híbrida la pérdida de validación descendió a 0.0001 al final del entrenamiento, mientras que en la condición sin componente tabular se estabilizó en 0.0595. La cercanía entre la pérdida de entrenamiento y la de validación en ambas condiciones indica que no hubo sobreajuste. La pérdida residual de la condición sin componente tabular corresponde a las probabilidades y programas que el modelo no puede inferir sin el ranking.</w:t>
+        <w:t xml:space="preserve">El ajuste se ejecutó en una GPU Tesla T4 de Google Colab sobre 6 000 pares de la partición de entrenamiento, durante 1 época y 375 pasos de optimización. Los adaptadores LoRA sumaron 4 358 144 parámetros entrenables, cerca del 0.3 % del modelo, y el entrenamiento tomó 33.6 minutos en la condición híbrida y 27.8 minutos en la condición sin componente tabular. Como muestran la Tabla 14 y la Figura 8, en la condición híbrida la pérdida de validación descendió a 0.0001 al final del entrenamiento, mientras que en la condición sin componente tabular se estabilizó en 0.0595. La cercanía entre la pérdida de entrenamiento y la de validación en ambas condiciones indica que no hubo sobreajuste. La pérdida residual de la condición sin componente tabular corresponde a las probabilidades y programas que el modelo no puede inferir sin el ranking.</w:t>
       </w:r>
     </w:p>
     <w:p>
@@ -19421,7 +21630,7 @@
           <w:rPr>
             <w:noProof/>
           </w:rPr>
-          <w:t>13</w:t>
+          <w:t>14</w:t>
         </w:r>
       </w:fldSimple>
       <w:r>
@@ -19917,7 +22126,7 @@
           <w:rPr>
             <w:noProof/>
           </w:rPr>
-          <w:t>6</w:t>
+          <w:t>8</w:t>
         </w:r>
       </w:fldSimple>
       <w:r>
@@ -19947,7 +22156,7 @@
           <wp:inline distT="0" distB="0" distL="0" distR="0">
             <wp:extent cx="4407535" cy="2266732"/>
             <wp:effectExtent l="0" t="0" r="0" b="0"/>
-            <wp:docPr id="5006" name="Figura 5006"/>
+            <wp:docPr id="5008" name="Figura 5008"/>
             <wp:cNvGraphicFramePr>
               <a:graphicFrameLocks noChangeAspect="1"/>
             </wp:cNvGraphicFramePr>
@@ -19955,11 +22164,11 @@
               <a:graphicData uri="http://schemas.openxmlformats.org/drawingml/2006/picture">
                 <pic:pic>
                   <pic:nvPicPr>
-                    <pic:cNvPr id="5006" name="careergpt_fig_perdida.png"/>
+                    <pic:cNvPr id="5008" name="careergpt_fig_perdida.png"/>
                     <pic:cNvPicPr/>
                   </pic:nvPicPr>
                   <pic:blipFill>
-                    <a:blip r:embed="rId23"/>
+                    <a:blip r:embed="rId25"/>
                     <a:stretch>
                       <a:fillRect/>
                     </a:stretch>
@@ -20007,7 +22216,7 @@
         <w:pStyle w:val="NORML4L5"/>
       </w:pPr>
       <w:r>
-        <w:t xml:space="preserve">Se generaron rutas para 300 pares de la partición de prueba, correspondientes a personas no vistas durante el entrenamiento. El modelo CareER-GPT obtuvo un ROUGE-L de 1.000, un BERTScore F1 de 1.000 y una coherencia de 1.000, y el 100.0 % de sus rutas coincidió literalmente con la respuesta de referencia. Este resultado se explica porque las referencias del corpus se construyeron con una estructura fija a partir del ranking del componente tabular, de modo que el modelo aprendió a trasladar con exactitud las probabilidades y los programas recibidos a una ruta redactada. La Tabla 14 presenta un ejemplo de las rutas generadas en cada condición.</w:t>
+        <w:t xml:space="preserve">Se generaron rutas para 300 pares de la partición de prueba, correspondientes a personas no vistas durante el entrenamiento. El modelo CareER-GPT obtuvo un ROUGE-L de 1.000, un BERTScore F1 de 1.000 y una coherencia de 1.000, y el 100.0 % de sus rutas coincidió literalmente con la respuesta de referencia. Este resultado se explica porque las referencias del corpus se construyeron con una estructura fija a partir del ranking del componente tabular, de modo que el modelo aprendió a trasladar con exactitud las probabilidades y los programas recibidos a una ruta redactada. La Tabla 15 presenta un ejemplo de las rutas generadas en cada condición.</w:t>
       </w:r>
     </w:p>
     <w:p>
@@ -20022,7 +22231,7 @@
           <w:rPr>
             <w:noProof/>
           </w:rPr>
-          <w:t>14</w:t>
+          <w:t>15</w:t>
         </w:r>
       </w:fldSimple>
       <w:r>
@@ -20629,7 +22838,7 @@
         <w:pStyle w:val="NORML4L5"/>
       </w:pPr>
       <w:r>
-        <w:t xml:space="preserve">Se evaluó el rankeo sobre 4 843 ingresantes, con un promedio de 9.8 programas candidatos por persona. La Tabla 15 y la Figura 7 muestran que el XGBoost superó al orden aleatorio en todas las métricas, con un MRR de 0.353 frente a 0.299, y ubicó el programa de ingreso en la primera posición en el 18.5 % de los casos, frente al 10.3 % esperado al azar. Sin embargo, el orden por popularidad, basado solo en la tasa histórica de ingreso de cada programa, obtuvo un MRR de 0.362, superior al del XGBoost en 2.5 %. No obstante, la diferencia no fue estadísticamente significativa según la prueba de Wilcoxon (W = 1 607 194, p = .292), con un tamaño del efecto despreciable (r = 0.015), por lo que ambos métodos ordenan los programas de forma equivalente.</w:t>
+        <w:t xml:space="preserve">Se evaluó el rankeo sobre 4 843 ingresantes, con un promedio de 9.8 programas candidatos por persona. La Tabla 16 y la Figura 9 muestran que el XGBoost superó al orden aleatorio en todas las métricas, con un MRR de 0.353 frente a 0.299, y ubicó el programa de ingreso en la primera posición en el 18.5 % de los casos, frente al 10.3 % esperado al azar. Sin embargo, el orden por popularidad, basado solo en la tasa histórica de ingreso de cada programa, obtuvo un MRR de 0.362, superior al del XGBoost en 2.5 %. No obstante, la diferencia no fue estadísticamente significativa según la prueba de Wilcoxon (W = 1 607 194, p = .292), con un tamaño del efecto despreciable (r = 0.015), por lo que ambos métodos ordenan los programas de forma equivalente.</w:t>
       </w:r>
     </w:p>
     <w:p>
@@ -20644,7 +22853,7 @@
           <w:rPr>
             <w:noProof/>
           </w:rPr>
-          <w:t>15</w:t>
+          <w:t>16</w:t>
         </w:r>
       </w:fldSimple>
       <w:r>
@@ -21271,7 +23480,7 @@
           <w:rPr>
             <w:noProof/>
           </w:rPr>
-          <w:t>7</w:t>
+          <w:t>9</w:t>
         </w:r>
       </w:fldSimple>
       <w:r>
@@ -21301,7 +23510,7 @@
           <wp:inline distT="0" distB="0" distL="0" distR="0">
             <wp:extent cx="4407535" cy="2326199"/>
             <wp:effectExtent l="0" t="0" r="0" b="0"/>
-            <wp:docPr id="5007" name="Figura 5007"/>
+            <wp:docPr id="5009" name="Figura 5009"/>
             <wp:cNvGraphicFramePr>
               <a:graphicFrameLocks noChangeAspect="1"/>
             </wp:cNvGraphicFramePr>
@@ -21309,11 +23518,11 @@
               <a:graphicData uri="http://schemas.openxmlformats.org/drawingml/2006/picture">
                 <pic:pic>
                   <pic:nvPicPr>
-                    <pic:cNvPr id="5007" name="careergpt_fig_ranking.png"/>
+                    <pic:cNvPr id="5009" name="careergpt_fig_ranking.png"/>
                     <pic:cNvPicPr/>
                   </pic:nvPicPr>
                   <pic:blipFill>
-                    <a:blip r:embed="rId24"/>
+                    <a:blip r:embed="rId26"/>
                     <a:stretch>
                       <a:fillRect/>
                     </a:stretch>
@@ -21353,7 +23562,7 @@
         <w:pStyle w:val="NORML4L5"/>
       </w:pPr>
       <w:r>
-        <w:t xml:space="preserve">La Tabla 16 muestra que, a diferencia de lo observado en la clasificación, el rankeo no perjudicó a los postulantes de colegios rurales: sus métricas fueron iguales o ligeramente superiores a las de los urbanos.</w:t>
+        <w:t xml:space="preserve">La Tabla 17 muestra que, a diferencia de lo observado en la clasificación, el rankeo no perjudicó a los postulantes de colegios rurales: sus métricas fueron iguales o ligeramente superiores a las de los urbanos.</w:t>
       </w:r>
     </w:p>
     <w:p>
@@ -21368,7 +23577,7 @@
           <w:rPr>
             <w:noProof/>
           </w:rPr>
-          <w:t>16</w:t>
+          <w:t>17</w:t>
         </w:r>
       </w:fldSimple>
       <w:r>
@@ -21865,7 +24074,7 @@
         <w:pStyle w:val="NORML4L5"/>
       </w:pPr>
       <w:r>
-        <w:t xml:space="preserve">La Tabla 17 compara las tres condiciones sobre los mismos 300 pares de prueba. El modelo base sin ajuste obtuvo una métrica combinada de 0.336: generó textos extensos, con formato propio y sin respetar el orden del ranking, con una coherencia de 0.233. El modelo ajustado sin el componente tabular alcanzó 0.890. Reprodujo la estructura de la ruta, con un ROUGE-L de 0.877, cercano al de 0.836 que comparten referencias de personas distintas, pero al no conocer las probabilidades recomendó un programa distinto o en otro orden en el 18.7 % de los casos. La arquitectura híbrida alcanzó 1.000, con intervalos de confianza que no se superponen con los de las otras condiciones.</w:t>
+        <w:t xml:space="preserve">La Tabla 18 compara las tres condiciones sobre los mismos 300 pares de prueba. El modelo base sin ajuste obtuvo una métrica combinada de 0.336: generó textos extensos, con formato propio y sin respetar el orden del ranking, con una coherencia de 0.233. El modelo ajustado sin el componente tabular alcanzó 0.890. Reprodujo la estructura de la ruta, con un ROUGE-L de 0.877, cercano al de 0.836 que comparten referencias de personas distintas, pero al no conocer las probabilidades recomendó un programa distinto o en otro orden en el 18.7 % de los casos. La arquitectura híbrida alcanzó 1.000, con intervalos de confianza que no se superponen con los de las otras condiciones.</w:t>
       </w:r>
     </w:p>
     <w:p>
@@ -21880,7 +24089,7 @@
           <w:rPr>
             <w:noProof/>
           </w:rPr>
-          <w:t>17</w:t>
+          <w:t>18</w:t>
         </w:r>
       </w:fldSimple>
       <w:r>
@@ -22577,7 +24786,7 @@
         <w:pStyle w:val="NORML4L5"/>
       </w:pPr>
       <w:r>
-        <w:t xml:space="preserve">La Tabla 18 presenta el contraste de la mejora. Las diferencias por par no siguieron una distribución normal según la prueba de Shapiro-Wilk (p &lt; .001), por lo que se aplicó la prueba de rangos con signo de Wilcoxon unilateral. La arquitectura híbrida superó al modelo base en 197.8 % y al modelo ajustado sin componente tabular en 12.4 %, en ambos casos con p &lt; .001 y un tamaño del efecto grande (r = 0.867 en ambas comparaciones).</w:t>
+        <w:t xml:space="preserve">La Tabla 19 presenta el contraste de la mejora. Las diferencias por par no siguieron una distribución normal según la prueba de Shapiro-Wilk (p &lt; .001), por lo que se aplicó la prueba de rangos con signo de Wilcoxon unilateral. La arquitectura híbrida superó al modelo base en 197.8 % y al modelo ajustado sin componente tabular en 12.4 %, en ambos casos con p &lt; .001 y un tamaño del efecto grande (r = 0.867 en ambas comparaciones).</w:t>
       </w:r>
     </w:p>
     <w:p>
@@ -22592,7 +24801,7 @@
           <w:rPr>
             <w:noProof/>
           </w:rPr>
-          <w:t>18</w:t>
+          <w:t>19</w:t>
         </w:r>
       </w:fldSimple>
       <w:r>
@@ -23200,8 +25409,8 @@
       </w:r>
       <w:sdt>
         <w:sdtPr>
-          <w:tag w:val="MENDELEY_CITATION_v3_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"/>
-          <w:id w:val="1367913345"/>
+          <w:tag w:val="MENDELEY_CITATION_v3_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"/>
+          <w:id w:val="1538357725"/>
         </w:sdtPr>
         <w:sdtContent>
           <w:r>
@@ -23222,8 +25431,8 @@
       </w:r>
       <w:sdt>
         <w:sdtPr>
-          <w:tag w:val="MENDELEY_CITATION_v3_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"/>
-          <w:id w:val="496311358"/>
+          <w:tag w:val="MENDELEY_CITATION_v3_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"/>
+          <w:id w:val="5102572"/>
         </w:sdtPr>
         <w:sdtContent>
           <w:r>
@@ -23236,8 +25445,8 @@
       </w:r>
       <w:sdt>
         <w:sdtPr>
-          <w:tag w:val="MENDELEY_CITATION_v3_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"/>
-          <w:id w:val="-492136592"/>
+          <w:tag w:val="MENDELEY_CITATION_v3_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"/>
+          <w:id w:val="45015499"/>
         </w:sdtPr>
         <w:sdtContent>
           <w:r>
@@ -23250,8 +25459,8 @@
       </w:r>
       <w:sdt>
         <w:sdtPr>
-          <w:tag w:val="MENDELEY_CITATION_v3_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"/>
-          <w:id w:val="-2115135381"/>
+          <w:tag w:val="MENDELEY_CITATION_v3_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"/>
+          <w:id w:val="-1133018668"/>
         </w:sdtPr>
         <w:sdtContent>
           <w:r>
@@ -23272,8 +25481,8 @@
       </w:r>
       <w:sdt>
         <w:sdtPr>
-          <w:tag w:val="MENDELEY_CITATION_v3_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"/>
-          <w:id w:val="2053906104"/>
+          <w:tag w:val="MENDELEY_CITATION_v3_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"/>
+          <w:id w:val="-1627391272"/>
         </w:sdtPr>
         <w:sdtContent>
           <w:r>
@@ -23286,8 +25495,8 @@
       </w:r>
       <w:sdt>
         <w:sdtPr>
-          <w:tag w:val="MENDELEY_CITATION_v3_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"/>
-          <w:id w:val="72961135"/>
+          <w:tag w:val="MENDELEY_CITATION_v3_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"/>
+          <w:id w:val="612876438"/>
         </w:sdtPr>
         <w:sdtContent>
           <w:r>
@@ -23308,8 +25517,8 @@
       </w:r>
       <w:sdt>
         <w:sdtPr>
-          <w:tag w:val="MENDELEY_CITATION_v3_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"/>
-          <w:id w:val="944405901"/>
+          <w:tag w:val="MENDELEY_CITATION_v3_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"/>
+          <w:id w:val="-1571101920"/>
         </w:sdtPr>
         <w:sdtContent>
           <w:r>
@@ -23330,8 +25539,8 @@
       </w:r>
       <w:sdt>
         <w:sdtPr>
-          <w:tag w:val="MENDELEY_CITATION_v3_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"/>
-          <w:id w:val="-1691924039"/>
+          <w:tag w:val="MENDELEY_CITATION_v3_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"/>
+          <w:id w:val="1796069583"/>
         </w:sdtPr>
         <w:sdtContent>
           <w:r>
@@ -23352,8 +25561,8 @@
       </w:r>
       <w:sdt>
         <w:sdtPr>
-          <w:tag w:val="MENDELEY_CITATION_v3_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"/>
-          <w:id w:val="805325086"/>
+          <w:tag w:val="MENDELEY_CITATION_v3_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"/>
+          <w:id w:val="2075745089"/>
         </w:sdtPr>
         <w:sdtContent>
           <w:r>
@@ -23366,8 +25575,8 @@
       </w:r>
       <w:sdt>
         <w:sdtPr>
-          <w:tag w:val="MENDELEY_CITATION_v3_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"/>
-          <w:id w:val="1049878267"/>
+          <w:tag w:val="MENDELEY_CITATION_v3_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"/>
+          <w:id w:val="1510263611"/>
         </w:sdtPr>
         <w:sdtContent>
           <w:r>
@@ -23380,8 +25589,8 @@
       </w:r>
       <w:sdt>
         <w:sdtPr>
-          <w:tag w:val="MENDELEY_CITATION_v3_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"/>
-          <w:id w:val="1665745616"/>
+          <w:tag w:val="MENDELEY_CITATION_v3_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"/>
+          <w:id w:val="-1954131682"/>
         </w:sdtPr>
         <w:sdtContent>
           <w:r>
@@ -23402,8 +25611,8 @@
       </w:r>
       <w:sdt>
         <w:sdtPr>
-          <w:tag w:val="MENDELEY_CITATION_v3_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"/>
-          <w:id w:val="-1114220807"/>
+          <w:tag w:val="MENDELEY_CITATION_v3_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"/>
+          <w:id w:val="148105330"/>
         </w:sdtPr>
         <w:sdtContent>
           <w:r>
@@ -23416,8 +25625,8 @@
       </w:r>
       <w:sdt>
         <w:sdtPr>
-          <w:tag w:val="MENDELEY_CITATION_v3_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"/>
-          <w:id w:val="-1042845914"/>
+          <w:tag w:val="MENDELEY_CITATION_v3_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"/>
+          <w:id w:val="-377138394"/>
         </w:sdtPr>
         <w:sdtContent>
           <w:r>
@@ -23430,8 +25639,8 @@
       </w:r>
       <w:sdt>
         <w:sdtPr>
-          <w:tag w:val="MENDELEY_CITATION_v3_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"/>
-          <w:id w:val="638433179"/>
+          <w:tag w:val="MENDELEY_CITATION_v3_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"/>
+          <w:id w:val="-1290633024"/>
         </w:sdtPr>
         <w:sdtContent>
           <w:r>
@@ -23452,8 +25661,8 @@
       </w:r>
       <w:sdt>
         <w:sdtPr>
-          <w:tag w:val="MENDELEY_CITATION_v3_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"/>
-          <w:id w:val="-1468160619"/>
+          <w:tag w:val="MENDELEY_CITATION_v3_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"/>
+          <w:id w:val="1499022848"/>
         </w:sdtPr>
         <w:sdtContent>
           <w:r>
@@ -23466,8 +25675,8 @@
       </w:r>
       <w:sdt>
         <w:sdtPr>
-          <w:tag w:val="MENDELEY_CITATION_v3_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"/>
-          <w:id w:val="-1513265289"/>
+          <w:tag w:val="MENDELEY_CITATION_v3_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"/>
+          <w:id w:val="1042418779"/>
         </w:sdtPr>
         <w:sdtContent>
           <w:r>
@@ -23480,8 +25689,8 @@
       </w:r>
       <w:sdt>
         <w:sdtPr>
-          <w:tag w:val="MENDELEY_CITATION_v3_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"/>
-          <w:id w:val="-1791326862"/>
+          <w:tag w:val="MENDELEY_CITATION_v3_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"/>
+          <w:id w:val="2095182127"/>
         </w:sdtPr>
         <w:sdtContent>
           <w:r>
@@ -23502,8 +25711,8 @@
       </w:r>
       <w:sdt>
         <w:sdtPr>
-          <w:tag w:val="MENDELEY_CITATION_v3_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"/>
-          <w:id w:val="-1424229125"/>
+          <w:tag w:val="MENDELEY_CITATION_v3_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"/>
+          <w:id w:val="-682061882"/>
         </w:sdtPr>
         <w:sdtContent>
           <w:r>
@@ -23513,6 +25722,22 @@
       </w:sdt>
       <w:r>
         <w:t xml:space="preserve">, que destacó la calidad del corpus como factor clave.</w:t>
+      </w:r>
+    </w:p>
+    <w:p>
+      <w:pPr>
+        <w:pStyle w:val="NORML12"/>
+      </w:pPr>
+      <w:r>
+        <w:t xml:space="preserve">El estudio presenta otras limitaciones que acotan el alcance de sus conclusiones. Primero, los predictores se restringen a la información administrativa disponible antes del examen, sin medidas de motivación, intereses vocacionales ni de la preparación específica para cada área, que probablemente explican parte de la variabilidad no capturada por el modelo. Segundo, se excluyó el 10.0 % de postulaciones sin historial escolar emparejable en el SIAGIE, cuyo perfil puede diferir del analizado, por lo que los resultados describen a los postulantes con historial en la educación secundaria registrada en el SIAGIE. Tercero, los datos provienen de una sola universidad, y la validez de la arquitectura en otras instituciones debe comprobarse. Cuarto, las asociaciones encontradas, como la mayor tasa de ingreso de quienes se prepararon en el CEPREUNA, son descriptivas y no permiten atribuir efectos causales, ya que quienes eligen cada modalidad de preparación pueden diferir en otras características.</w:t>
+      </w:r>
+    </w:p>
+    <w:p>
+      <w:pPr>
+        <w:pStyle w:val="NORML12"/>
+      </w:pPr>
+      <w:r>
+        <w:t xml:space="preserve">En términos prácticos, los resultados sugieren que la arquitectura puede aportar a la orientación vocacional de la UNA-Puno si se usa como herramienta informativa y no como filtro. Las probabilidades calibradas permiten comunicar al postulante una expectativa realista de ingreso por programa, y el componente lingüístico traduce esa información en una ruta comprensible. Sin embargo, la brecha en la tasa de falsos negativos de los colegios rurales obliga a acompañar cualquier uso institucional con un monitoreo periódico de las métricas de error por grupo y con la participación de orientadores que interpreten las recomendaciones junto con el postulante.</w:t>
       </w:r>
     </w:p>
     <w:p>
@@ -23714,7 +25939,7 @@
     <w:sdt>
       <w:sdtPr>
         <w:tag w:val="MENDELEY_BIBLIOGRAPHY"/>
-        <w:id w:val="607292351"/>
+        <w:id w:val="-1161959277"/>
       </w:sdtPr>
       <w:sdtContent>
         <w:p>
@@ -34061,8 +36286,8 @@
   </we:alternateReferences>
   <we:properties>
     <we:property name="MENDELEY_BIBLIOGRAPHY_IS_DIRTY" value="false"/>
-    <we:property name="MENDELEY_BIBLIOGRAPHY_LAST_MODIFIED" value="1790906303426"/>
-    <we:property name="MENDELEY_CITATIONS" value="[{&quot;citationID&quot;: &quot;MENDELEY_CITATION_f0dc5cb2-23c3-4684-b02c-cd58112354e5&quot;, &quot;properties&quot;: {&quot;noteIndex&quot;: 0}, &quot;isEdited&quot;: false, &quot;manualOverride&quot;: {&quot;isManuallyOverridden&quot;: false, &quot;citeprocText&quot;: &quot;(Millán Gordillo, 2025)&quot;, &quot;manualOverrideText&quot;: &quot;&quot;}, &quot;citationItems&quot;: [{&quot;id&quot;: &quot;ITEM-d048a752-48c5-509f-92fd-95097e22963d&quot;, &quot;itemData&quot;: {&quot;author&quot;: [{&quot;family&quot;: &quot;Millán Gordillo&quot;, &quot;given&quot;: &quot;M.&quot;, &quot;parse-names&quot;: false, &quot;dropping-particle&quot;: &quot;&quot;, &quot;non-dropping-particle&quot;: &quot;&quot;}], &quot;issued&quot;: {&quot;date-parts&quot;: [[2025]]}, &quot;URL&quot;: &quot;https://repositorio.uloyola.es/bitstream/handle/20.500.12412/6735/TFM%20Mar%C3%ADa%20Mill%C3%A1n.pdf&quot;, &quot;type&quot;: &quot;thesis&quot;, &quot;title&quot;: &quot;Estudio comparativo de sistemas de recomendación mediante filtrado colaborativo, basado en contenido y propuestas híbridas&quot;, &quot;genre&quot;: &quot;Tesis de maestría&quot;, &quot;publisher&quot;: &quot;Universidad Loyola Andalucía&quot;, &quot;id&quot;: &quot;ITEM-d048a752-48c5-509f-92fd-95097e22963d&quot;, &quot;container-title-short&quot;: &quot;&quot;}, &quot;isTemporary&quot;: false}]}, {&quot;citationID&quot;: &quot;MENDELEY_CITATION_0bf8e675-f566-4542-9238-a438b2e1bfcc&quot;, &quot;properties&quot;: {&quot;noteIndex&quot;: 0}, &quot;isEdited&quot;: false, &quot;manualOverride&quot;: {&quot;isManuallyOverridden&quot;: false, &quot;citeprocText&quot;: &quot;(Zheng et al., 2023)&quot;, &quot;manualOverrideText&quot;: &quot;&quot;}, &quot;citationItems&quot;: [{&quot;id&quot;: &quot;ITEM-658ab4b7-6469-5fa3-999a-4ffd7c7cd3d0&quot;, &quot;itemData&quot;: {&quot;author&quot;: [{&quot;family&quot;: &quot;Zheng&quot;, &quot;given&quot;: &quot;L.&quot;, &quot;parse-names&quot;: false, &quot;dropping-particle&quot;: &quot;&quot;, &quot;non-dropping-particle&quot;: &quot;&quot;}, {&quot;family&quot;: &quot;Chiang&quot;, &quot;given&quot;: &quot;W.-L.&quot;, &quot;parse-names&quot;: false, &quot;dropping-particle&quot;: &quot;&quot;, &quot;non-dropping-particle&quot;: &quot;&quot;}, {&quot;family&quot;: &quot;Sheng&quot;, &quot;given&quot;: &quot;Y.&quot;, &quot;parse-names&quot;: false, &quot;dropping-particle&quot;: &quot;&quot;, &quot;non-dropping-particle&quot;: &quot;&quot;}, {&quot;family&quot;: &quot;Zhuang&quot;, &quot;given&quot;: &quot;S.&quot;, &quot;parse-names&quot;: false, &quot;dropping-particle&quot;: &quot;&quot;, &quot;non-dropping-particle&quot;: &quot;&quot;}, {&quot;family&quot;: &quot;Wu&quot;, &quot;given&quot;: &quot;Z.&quot;, &quot;parse-names&quot;: false, &quot;dropping-particle&quot;: &quot;&quot;, &quot;non-dropping-particle&quot;: &quot;&quot;}, {&quot;family&quot;: &quot;Zhuang&quot;, &quot;given&quot;: &quot;Y.&quot;, &quot;parse-names&quot;: false, &quot;dropping-particle&quot;: &quot;&quot;, &quot;non-dropping-particle&quot;: &quot;&quot;}, {&quot;family&quot;: &quot;Lin&quot;, &quot;given&quot;: &quot;Z.&quot;, &quot;parse-names&quot;: false, &quot;dropping-particle&quot;: &quot;&quot;, &quot;non-dropping-particle&quot;: &quot;&quot;}, {&quot;family&quot;: &quot;Li&quot;, &quot;given&quot;: &quot;Z.&quot;, &quot;parse-names&quot;: false, &quot;dropping-particle&quot;: &quot;&quot;, &quot;non-dropping-particle&quot;: &quot;&quot;}, {&quot;family&quot;: &quot;Li&quot;, &quot;given&quot;: &quot;D.&quot;, &quot;parse-names&quot;: false, &quot;dropping-particle&quot;: &quot;&quot;, &quot;non-dropping-particle&quot;: &quot;&quot;}, {&quot;family&quot;: &quot;Xing&quot;, &quot;given&quot;: &quot;E. P.&quot;, &quot;parse-names&quot;: false, &quot;dropping-particle&quot;: &quot;&quot;, &quot;non-dropping-particle&quot;: &quot;&quot;}, {&quot;family&quot;: &quot;Zhang&quot;, &quot;given&quot;: &quot;H.&quot;, &quot;parse-names&quot;: false, &quot;dropping-particle&quot;: &quot;&quot;, &quot;non-dropping-particle&quot;: &quot;&quot;}, {&quot;family&quot;: &quot;Gonzalez&quot;, &quot;given&quot;: &quot;J. E.&quot;, &quot;parse-names&quot;: false, &quot;dropping-particle&quot;: &quot;&quot;, &quot;non-dropping-particle&quot;: &quot;&quot;}, {&quot;family&quot;: &quot;Stoica&quot;, &quot;given&quot;: &quot;I.&quot;, &quot;parse-names&quot;: false, &quot;dropping-particle&quot;: &quot;&quot;, &quot;non-dropping-particle&quot;: &quot;&quot;}], &quot;issued&quot;: {&quot;date-parts&quot;: [[2023]]}, &quot;DOI&quot;: &quot;10.48550/arXiv.2306.05685&quot;, &quot;type&quot;: &quot;book&quot;, &quot;title&quot;: &quot;Judging LLM-as-a-judge with MT-Bench and Chatbot Arena&quot;, &quot;publisher&quot;: &quot;arXiv&quot;, &quot;id&quot;: &quot;ITEM-658ab4b7-6469-5fa3-999a-4ffd7c7cd3d0&quot;, &quot;container-title-short&quot;: &quot;&quot;}, &quot;isTemporary&quot;: false}]}, {&quot;citationID&quot;: &quot;MENDELEY_CITATION_da31558b-45c6-470f-9f2f-c4322570e040&quot;, &quot;properties&quot;: {&quot;noteIndex&quot;: 0}, &quot;isEdited&quot;: false, &quot;manualOverride&quot;: {&quot;isManuallyOverridden&quot;: true, &quot;citeprocText&quot;: &quot;(Song et al., 2025)&quot;, &quot;manualOverrideText&quot;: &quot;Song et al. (2025)&quot;}, &quot;citationItems&quot;: [{&quot;id&quot;: &quot;ITEM-e0e22fed-4a06-55b1-8d82-b72075b7c2d9&quot;, &quot;itemData&quot;: {&quot;author&quot;: [{&quot;family&quot;: &quot;Song&quot;, &quot;given&quot;: &quot;Y.&quot;, &quot;parse-names&quot;: false, &quot;dropping-particle&quot;: &quot;&quot;, &quot;non-dropping-particle&quot;: &quot;&quot;}, {&quot;family&quot;: &quot;Lv&quot;, &quot;given&quot;: &quot;C.&quot;, &quot;parse-names&quot;: false, &quot;dropping-particle&quot;: &quot;&quot;, &quot;non-dropping-particle&quot;: &quot;&quot;}, {&quot;family&quot;: &quot;Zhu&quot;, &quot;given&quot;: &quot;K.&quot;, &quot;parse-names&quot;: false, &quot;dropping-particle&quot;: &quot;&quot;, &quot;non-dropping-particle&quot;: &quot;&quot;}, {&quot;family&quot;: &quot;Qiu&quot;, &quot;given&quot;: &quot;X.&quot;, &quot;parse-names&quot;: false, &quot;dropping-particle&quot;: &quot;&quot;, &quot;non-dropping-particle&quot;: &quot;&quot;}], &quot;issued&quot;: {&quot;date-parts&quot;: [[2025]]}, &quot;DOI&quot;: &quot;10.1007/s10791-025-09663-6&quot;, &quot;type&quot;: &quot;article-journal&quot;, &quot;title&quot;: &quot;LoRA fine-tuning of Llama3 large model for intelligent fishery field&quot;, &quot;container-title&quot;: &quot;Discover Computing&quot;, &quot;volume&quot;: &quot;28&quot;, &quot;issue&quot;: &quot;1&quot;, &quot;page&quot;: &quot;135&quot;, &quot;id&quot;: &quot;ITEM-e0e22fed-4a06-55b1-8d82-b72075b7c2d9&quot;, &quot;container-title-short&quot;: &quot;&quot;}, &quot;isTemporary&quot;: false}]}, {&quot;citationID&quot;: &quot;MENDELEY_CITATION_7cde0212-c4a7-4a97-a51e-89469bd13a2e&quot;, &quot;properties&quot;: {&quot;noteIndex&quot;: 0}, &quot;isEdited&quot;: false, &quot;manualOverride&quot;: {&quot;isManuallyOverridden&quot;: true, &quot;citeprocText&quot;: &quot;(Zhang et al., 2025)&quot;, &quot;manualOverrideText&quot;: &quot;Zhang et al. (2025)&quot;}, &quot;citationItems&quot;: [{&quot;id&quot;: &quot;ITEM-1b18d17f-3a57-568c-a65a-b5824a81dd38&quot;, &quot;itemData&quot;: {&quot;author&quot;: [{&quot;family&quot;: &quot;Zhang&quot;, &quot;given&quot;: &quot;J. C.&quot;, &quot;parse-names&quot;: false, &quot;dropping-particle&quot;: &quot;&quot;, &quot;non-dropping-particle&quot;: &quot;&quot;}, {&quot;family&quot;: &quot;Xiong&quot;, &quot;given&quot;: &quot;Y. J.&quot;, &quot;parse-names&quot;: false, &quot;dropping-particle&quot;: &quot;&quot;, &quot;non-dropping-particle&quot;: &quot;&quot;}, {&quot;family&quot;: &quot;Xia&quot;, &quot;given&quot;: &quot;C. M.&quot;, &quot;parse-names&quot;: false, &quot;dropping-particle&quot;: &quot;&quot;, &quot;non-dropping-particle&quot;: &quot;&quot;}, {&quot;family&quot;: &quot;Zhu&quot;, &quot;given&quot;: &quot;D. H.&quot;, &quot;parse-names&quot;: false, &quot;dropping-particle&quot;: &quot;&quot;, &quot;non-dropping-particle&quot;: &quot;&quot;}, {&quot;family&quot;: &quot;Zhan&quot;, &quot;given&quot;: &quot;H. J.&quot;, &quot;parse-names&quot;: false, &quot;dropping-particle&quot;: &quot;&quot;, &quot;non-dropping-particle&quot;: &quot;&quot;}], &quot;issued&quot;: {&quot;date-parts&quot;: [[2025]]}, &quot;DOI&quot;: &quot;10.1016/j.neucom.2025.130859&quot;, &quot;type&quot;: &quot;article-journal&quot;, &quot;title&quot;: &quot;LoRA2: Multi-scale low-rank approximations for fine-tuning large language models&quot;, &quot;container-title&quot;: &quot;Neurocomputing&quot;, &quot;volume&quot;: &quot;650&quot;, &quot;page&quot;: &quot;130859&quot;, &quot;id&quot;: &quot;ITEM-1b18d17f-3a57-568c-a65a-b5824a81dd38&quot;, &quot;container-title-short&quot;: &quot;&quot;}, &quot;isTemporary&quot;: false}]}, {&quot;citationID&quot;: &quot;MENDELEY_CITATION_543ee096-5ba2-46c5-bf0d-f634106b7077&quot;, &quot;properties&quot;: {&quot;noteIndex&quot;: 0}, &quot;isEdited&quot;: false, &quot;manualOverride&quot;: {&quot;isManuallyOverridden&quot;: false, &quot;citeprocText&quot;: &quot;(Gao et al., 2026; Liu et al., 2026)&quot;, &quot;manualOverrideText&quot;: &quot;&quot;}, &quot;citationItems&quot;: [{&quot;id&quot;: &quot;ITEM-d320fd95-a78e-5478-a293-ab29c9647d86&quot;, &quot;itemData&quot;: {&quot;author&quot;: [{&quot;family&quot;: &quot;Gao&quot;, &quot;given&quot;: &quot;D.&quot;, &quot;parse-names&quot;: false, &quot;dropping-particle&quot;: &quot;&quot;, &quot;non-dropping-particle&quot;: &quot;&quot;}, {&quot;family&quot;: &quot;Chen&quot;, &quot;given&quot;: &quot;S.&quot;, &quot;parse-names&quot;: false, &quot;dropping-particle&quot;: &quot;&quot;, &quot;non-dropping-particle&quot;: &quot;&quot;}, {&quot;family&quot;: &quot;Yang&quot;, &quot;given&quot;: &quot;Z.&quot;, &quot;parse-names&quot;: false, &quot;dropping-particle&quot;: &quot;&quot;, &quot;non-dropping-particle&quot;: &quot;&quot;}, {&quot;family&quot;: &quot;Yang&quot;, &quot;given&quot;: &quot;L.&quot;, &quot;parse-names&quot;: false, &quot;dropping-particle&quot;: &quot;&quot;, &quot;non-dropping-particle&quot;: &quot;&quot;}, {&quot;family&quot;: &quot;Gao&quot;, &quot;given&quot;: &quot;H.&quot;, &quot;parse-names&quot;: false, &quot;dropping-particle&quot;: &quot;&quot;, &quot;non-dropping-particle&quot;: &quot;&quot;}, {&quot;family&quot;: &quot;Wu&quot;, &quot;given&quot;: &quot;M.&quot;, &quot;parse-names&quot;: false, &quot;dropping-particle&quot;: &quot;&quot;, &quot;non-dropping-particle&quot;: &quot;&quot;}, {&quot;family&quot;: &quot;Yu&quot;, &quot;given&quot;: &quot;S.&quot;, &quot;parse-names&quot;: false, &quot;dropping-particle&quot;: &quot;&quot;, &quot;non-dropping-particle&quot;: &quot;&quot;}, {&quot;family&quot;: &quot;Xuan&quot;, &quot;given&quot;: &quot;Q.&quot;, &quot;parse-names&quot;: false, &quot;dropping-particle&quot;: &quot;&quot;, &quot;non-dropping-particle&quot;: &quot;&quot;}, {&quot;family&quot;: &quot;Zhang&quot;, &quot;given&quot;: &quot;W.&quot;, &quot;parse-names&quot;: false, &quot;dropping-particle&quot;: &quot;&quot;, &quot;non-dropping-particle&quot;: &quot;&quot;}, {&quot;family&quot;: &quot;Yang&quot;, &quot;given&quot;: &quot;L.&quot;, &quot;parse-names&quot;: false, &quot;dropping-particle&quot;: &quot;&quot;, &quot;non-dropping-particle&quot;: &quot;&quot;}, {&quot;family&quot;: &quot;Cai&quot;, &quot;given&quot;: &quot;X.&quot;, &quot;parse-names&quot;: false, &quot;dropping-particle&quot;: &quot;&quot;, &quot;non-dropping-particle&quot;: &quot;&quot;}], &quot;issued&quot;: {&quot;date-parts&quot;: [[2026]]}, &quot;DOI&quot;: &quot;10.1016/j.eswa.2025.129486&quot;, &quot;type&quot;: &quot;article-journal&quot;, &quot;title&quot;: &quot;MLoRA+: Transformer-fusion mixture-of-LoRA network for multi-domain click-through rate prediction&quot;, &quot;container-title&quot;: &quot;Expert Systems with Applications&quot;, &quot;volume&quot;: &quot;297&quot;, &quot;page&quot;: &quot;129486&quot;, &quot;id&quot;: &quot;ITEM-d320fd95-a78e-5478-a293-ab29c9647d86&quot;, &quot;container-title-short&quot;: &quot;&quot;}, &quot;isTemporary&quot;: false}, {&quot;id&quot;: &quot;ITEM-b4080137-1a47-52cd-9e37-0f8562cb0792&quot;, &quot;itemData&quot;: {&quot;author&quot;: [{&quot;family&quot;: &quot;Liu&quot;, &quot;given&quot;: &quot;Z.&quot;, &quot;parse-names&quot;: false, &quot;dropping-particle&quot;: &quot;&quot;, &quot;non-dropping-particle&quot;: &quot;&quot;}, {&quot;family&quot;: &quot;Liu&quot;, &quot;given&quot;: &quot;Z.&quot;, &quot;parse-names&quot;: false, &quot;dropping-particle&quot;: &quot;&quot;, &quot;non-dropping-particle&quot;: &quot;&quot;}, {&quot;family&quot;: &quot;Feng&quot;, &quot;given&quot;: &quot;R.&quot;, &quot;parse-names&quot;: false, &quot;dropping-particle&quot;: &quot;&quot;, &quot;non-dropping-particle&quot;: &quot;&quot;}, {&quot;family&quot;: &quot;Feng&quot;, &quot;given&quot;: &quot;P.&quot;, &quot;parse-names&quot;: false, &quot;dropping-particle&quot;: &quot;&quot;, &quot;non-dropping-particle&quot;: &quot;&quot;}, {&quot;family&quot;: &quot;Chu&quot;, &quot;given&quot;: &quot;J.&quot;, &quot;parse-names&quot;: false, &quot;dropping-particle&quot;: &quot;&quot;, &quot;non-dropping-particle&quot;: &quot;&quot;}, {&quot;family&quot;: &quot;Peng&quot;, &quot;given&quot;: &quot;X.&quot;, &quot;parse-names&quot;: false, &quot;dropping-particle&quot;: &quot;&quot;, &quot;non-dropping-particle&quot;: &quot;&quot;}], &quot;issued&quot;: {&quot;date-parts&quot;: [[2026]]}, &quot;DOI&quot;: &quot;10.1016/j.snb.2025.138644&quot;, &quot;type&quot;: &quot;article-journal&quot;, &quot;title&quot;: &quot;LoRA-TCN: A pre-trained/fine-tuning learning paradigm for drift adaptation&quot;, &quot;container-title&quot;: &quot;Sensors and Actuators B: Chemical&quot;, &quot;volume&quot;: &quot;446&quot;, &quot;page&quot;: &quot;138644&quot;, &quot;id&quot;: &quot;ITEM-b4080137-1a47-52cd-9e37-0f8562cb0792&quot;, &quot;container-title-short&quot;: &quot;&quot;}, &quot;isTemporary&quot;: false}]}, {&quot;citationID&quot;: &quot;MENDELEY_CITATION_4a96d978-6bde-4b36-b510-167b5d7f4396&quot;, &quot;properties&quot;: {&quot;noteIndex&quot;: 0}, &quot;isEdited&quot;: false, &quot;manualOverride&quot;: {&quot;isManuallyOverridden&quot;: false, &quot;citeprocText&quot;: &quot;(Dettmers et al., 2023)&quot;, &quot;manualOverrideText&quot;: &quot;&quot;}, &quot;citationItems&quot;: [{&quot;id&quot;: &quot;ITEM-66ff8277-e9ea-5605-b98c-71a6ac2aa4a6&quot;, &quot;itemData&quot;: {&quot;author&quot;: [{&quot;family&quot;: &quot;Dettmers&quot;, &quot;given&quot;: &quot;T.&quot;, &quot;parse-names&quot;: false, &quot;dropping-particle&quot;: &quot;&quot;, &quot;non-dropping-particle&quot;: &quot;&quot;}, {&quot;family&quot;: &quot;Pagnoni&quot;, &quot;given&quot;: &quot;A.&quot;, &quot;parse-names&quot;: false, &quot;dropping-particle&quot;: &quot;&quot;, &quot;non-dropping-particle&quot;: &quot;&quot;}, {&quot;family&quot;: &quot;Holtzman&quot;, &quot;given&quot;: &quot;A.&quot;, &quot;parse-names&quot;: false, &quot;dropping-particle&quot;: &quot;&quot;, &quot;non-dropping-particle&quot;: &quot;&quot;}, {&quot;family&quot;: &quot;Zettlemoyer&quot;, &quot;given&quot;: &quot;L.&quot;, &quot;parse-names&quot;: false, &quot;dropping-particle&quot;: &quot;&quot;, &quot;non-dropping-particle&quot;: &quot;&quot;}], &quot;issued&quot;: {&quot;date-parts&quot;: [[2023]]}, &quot;DOI&quot;: &quot;10.48550/arXiv.2305.14314&quot;, &quot;type&quot;: &quot;paper-conference&quot;, &quot;title&quot;: &quot;QLoRA: Efficient finetuning of quantized LLMs&quot;, &quot;container-title&quot;: &quot;Advances in Neural Information Processing Systems 36&quot;, &quot;id&quot;: &quot;ITEM-66ff8277-e9ea-5605-b98c-71a6ac2aa4a6&quot;, &quot;container-title-short&quot;: &quot;&quot;}, &quot;isTemporary&quot;: false}]}, {&quot;citationID&quot;: &quot;MENDELEY_CITATION_8c2b9d6d-dbe2-4811-9d6e-252e9db94251&quot;, &quot;properties&quot;: {&quot;noteIndex&quot;: 0}, &quot;isEdited&quot;: false, &quot;manualOverride&quot;: {&quot;isManuallyOverridden&quot;: false, &quot;citeprocText&quot;: &quot;(Hu et al., 2021)&quot;, &quot;manualOverrideText&quot;: &quot;&quot;}, &quot;citationItems&quot;: [{&quot;id&quot;: &quot;ITEM-74d30536-939b-537f-bec0-b59afedae2e3&quot;, &quot;itemData&quot;: {&quot;author&quot;: [{&quot;family&quot;: &quot;Hu&quot;, &quot;given&quot;: &quot;E. J.&quot;, &quot;parse-names&quot;: false, &quot;dropping-particle&quot;: &quot;&quot;, &quot;non-dropping-particle&quot;: &quot;&quot;}, {&quot;family&quot;: &quot;Shen&quot;, &quot;given&quot;: &quot;Y.&quot;, &quot;parse-names&quot;: false, &quot;dropping-particle&quot;: &quot;&quot;, &quot;non-dropping-particle&quot;: &quot;&quot;}, {&quot;family&quot;: &quot;Wallis&quot;, &quot;given&quot;: &quot;P.&quot;, &quot;parse-names&quot;: false, &quot;dropping-particle&quot;: &quot;&quot;, &quot;non-dropping-particle&quot;: &quot;&quot;}, {&quot;family&quot;: &quot;Allen-Zhu&quot;, &quot;given&quot;: &quot;Z.&quot;, &quot;parse-names&quot;: false, &quot;dropping-particle&quot;: &quot;&quot;, &quot;non-dropping-particle&quot;: &quot;&quot;}, {&quot;family&quot;: &quot;Li&quot;, &quot;given&quot;: &quot;Y.&quot;, &quot;parse-names&quot;: false, &quot;dropping-particle&quot;: &quot;&quot;, &quot;non-dropping-particle&quot;: &quot;&quot;}, {&quot;family&quot;: &quot;Wang&quot;, &quot;given&quot;: &quot;S.&quot;, &quot;parse-names&quot;: false, &quot;dropping-particle&quot;: &quot;&quot;, &quot;non-dropping-particle&quot;: &quot;&quot;}, {&quot;family&quot;: &quot;Wang&quot;, &quot;given&quot;: &quot;L.&quot;, &quot;parse-names&quot;: false, &quot;dropping-particle&quot;: &quot;&quot;, &quot;non-dropping-particle&quot;: &quot;&quot;}, {&quot;family&quot;: &quot;Chen&quot;, &quot;given&quot;: &quot;W.&quot;, &quot;parse-names&quot;: false, &quot;dropping-particle&quot;: &quot;&quot;, &quot;non-dropping-particle&quot;: &quot;&quot;}], &quot;issued&quot;: {&quot;date-parts&quot;: [[2021]]}, &quot;DOI&quot;: &quot;10.48550/arXiv.2106.09685&quot;, &quot;type&quot;: &quot;book&quot;, &quot;title&quot;: &quot;LoRA: Low-rank adaptation of large language models&quot;, &quot;publisher&quot;: &quot;arXiv&quot;, &quot;id&quot;: &quot;ITEM-74d30536-939b-537f-bec0-b59afedae2e3&quot;, &quot;container-title-short&quot;: &quot;&quot;}, &quot;isTemporary&quot;: false}]}, {&quot;citationID&quot;: &quot;MENDELEY_CITATION_ebbb81cd-3f8a-4604-b53f-0330d552f160&quot;, &quot;properties&quot;: {&quot;noteIndex&quot;: 0}, &quot;isEdited&quot;: false, &quot;manualOverride&quot;: {&quot;isManuallyOverridden&quot;: true, &quot;citeprocText&quot;: &quot;(Hu et al., 2021)&quot;, &quot;manualOverrideText&quot;: &quot;Hu et al. (2021)&quot;}, &quot;citationItems&quot;: [{&quot;id&quot;: &quot;ITEM-74d30536-939b-537f-bec0-b59afedae2e3&quot;, &quot;itemData&quot;: {&quot;author&quot;: [{&quot;family&quot;: &quot;Hu&quot;, &quot;given&quot;: &quot;E. J.&quot;, &quot;parse-names&quot;: false, &quot;dropping-particle&quot;: &quot;&quot;, &quot;non-dropping-particle&quot;: &quot;&quot;}, {&quot;family&quot;: &quot;Shen&quot;, &quot;given&quot;: &quot;Y.&quot;, &quot;parse-names&quot;: false, &quot;dropping-particle&quot;: &quot;&quot;, &quot;non-dropping-particle&quot;: &quot;&quot;}, {&quot;family&quot;: &quot;Wallis&quot;, &quot;given&quot;: &quot;P.&quot;, &quot;parse-names&quot;: false, &quot;dropping-particle&quot;: &quot;&quot;, &quot;non-dropping-particle&quot;: &quot;&quot;}, {&quot;family&quot;: &quot;Allen-Zhu&quot;, &quot;given&quot;: &quot;Z.&quot;, &quot;parse-names&quot;: false, &quot;dropping-particle&quot;: &quot;&quot;, &quot;non-dropping-particle&quot;: &quot;&quot;}, {&quot;family&quot;: &quot;Li&quot;, &quot;given&quot;: &quot;Y.&quot;, &quot;parse-names&quot;: false, &quot;dropping-particle&quot;: &quot;&quot;, &quot;non-dropping-particle&quot;: &quot;&quot;}, {&quot;family&quot;: &quot;Wang&quot;, &quot;given&quot;: &quot;S.&quot;, &quot;parse-names&quot;: false, &quot;dropping-particle&quot;: &quot;&quot;, &quot;non-dropping-particle&quot;: &quot;&quot;}, {&quot;family&quot;: &quot;Wang&quot;, &quot;given&quot;: &quot;L.&quot;, &quot;parse-names&quot;: false, &quot;dropping-particle&quot;: &quot;&quot;, &quot;non-dropping-particle&quot;: &quot;&quot;}, {&quot;family&quot;: &quot;Chen&quot;, &quot;given&quot;: &quot;W.&quot;, &quot;parse-names&quot;: false, &quot;dropping-particle&quot;: &quot;&quot;, &quot;non-dropping-particle&quot;: &quot;&quot;}], &quot;issued&quot;: {&quot;date-parts&quot;: [[2021]]}, &quot;DOI&quot;: &quot;10.48550/arXiv.2106.09685&quot;, &quot;type&quot;: &quot;book&quot;, &quot;title&quot;: &quot;LoRA: Low-rank adaptation of large language models&quot;, &quot;publisher&quot;: &quot;arXiv&quot;, &quot;id&quot;: &quot;ITEM-74d30536-939b-537f-bec0-b59afedae2e3&quot;, &quot;container-title-short&quot;: &quot;&quot;}, &quot;isTemporary&quot;: false}]}, {&quot;citationID&quot;: &quot;MENDELEY_CITATION_86a27299-278c-4305-a9d3-0575846e50f9&quot;, &quot;properties&quot;: {&quot;noteIndex&quot;: 0}, &quot;isEdited&quot;: false, &quot;manualOverride&quot;: {&quot;isManuallyOverridden&quot;: false, &quot;citeprocText&quot;: &quot;(Dettmers et al., 2023)&quot;, &quot;manualOverrideText&quot;: &quot;&quot;}, &quot;citationItems&quot;: [{&quot;id&quot;: &quot;ITEM-66ff8277-e9ea-5605-b98c-71a6ac2aa4a6&quot;, &quot;itemData&quot;: {&quot;author&quot;: [{&quot;family&quot;: &quot;Dettmers&quot;, &quot;given&quot;: &quot;T.&quot;, &quot;parse-names&quot;: false, &quot;dropping-particle&quot;: &quot;&quot;, &quot;non-dropping-particle&quot;: &quot;&quot;}, {&quot;family&quot;: &quot;Pagnoni&quot;, &quot;given&quot;: &quot;A.&quot;, &quot;parse-names&quot;: false, &quot;dropping-particle&quot;: &quot;&quot;, &quot;non-dropping-particle&quot;: &quot;&quot;}, {&quot;family&quot;: &quot;Holtzman&quot;, &quot;given&quot;: &quot;A.&quot;, &quot;parse-names&quot;: false, &quot;dropping-particle&quot;: &quot;&quot;, &quot;non-dropping-particle&quot;: &quot;&quot;}, {&quot;family&quot;: &quot;Zettlemoyer&quot;, &quot;given&quot;: &quot;L.&quot;, &quot;parse-names&quot;: false, &quot;dropping-particle&quot;: &quot;&quot;, &quot;non-dropping-particle&quot;: &quot;&quot;}], &quot;issued&quot;: {&quot;date-parts&quot;: [[2023]]}, &quot;DOI&quot;: &quot;10.48550/arXiv.2305.14314&quot;, &quot;type&quot;: &quot;paper-conference&quot;, &quot;title&quot;: &quot;QLoRA: Efficient finetuning of quantized LLMs&quot;, &quot;container-title&quot;: &quot;Advances in Neural Information Processing Systems 36&quot;, &quot;id&quot;: &quot;ITEM-66ff8277-e9ea-5605-b98c-71a6ac2aa4a6&quot;, &quot;container-title-short&quot;: &quot;&quot;}, &quot;isTemporary&quot;: false}]}, {&quot;citationID&quot;: &quot;MENDELEY_CITATION_ce852990-1488-4a5b-a776-4003adb34b34&quot;, &quot;properties&quot;: {&quot;noteIndex&quot;: 0}, &quot;isEdited&quot;: false, &quot;manualOverride&quot;: {&quot;isManuallyOverridden&quot;: true, &quot;citeprocText&quot;: &quot;(Singhal et al., 2023)&quot;, &quot;manualOverrideText&quot;: &quot;Singhal et al. (2023)&quot;}, &quot;citationItems&quot;: [{&quot;id&quot;: &quot;ITEM-50da8b62-4567-5119-b691-5e46f77cae26&quot;, &quot;itemData&quot;: {&quot;author&quot;: [{&quot;family&quot;: &quot;Singhal&quot;, &quot;given&quot;: &quot;K.&quot;, &quot;parse-names&quot;: false, &quot;dropping-particle&quot;: &quot;&quot;, &quot;non-dropping-particle&quot;: &quot;&quot;}, {&quot;family&quot;: &quot;Azizi&quot;, &quot;given&quot;: &quot;S.&quot;, &quot;parse-names&quot;: false, &quot;dropping-particle&quot;: &quot;&quot;, &quot;non-dropping-particle&quot;: &quot;&quot;}, {&quot;family&quot;: &quot;Tu&quot;, &quot;given&quot;: &quot;T.&quot;, &quot;parse-names&quot;: false, &quot;dropping-particle&quot;: &quot;&quot;, &quot;non-dropping-particle&quot;: &quot;&quot;}, {&quot;family&quot;: &quot;Mahdavi&quot;, &quot;given&quot;: &quot;S. S.&quot;, &quot;parse-names&quot;: false, &quot;dropping-particle&quot;: &quot;&quot;, &quot;non-dropping-particle&quot;: &quot;&quot;}, {&quot;family&quot;: &quot;Wei&quot;, &quot;given&quot;: &quot;J.&quot;, &quot;parse-names&quot;: false, &quot;dropping-particle&quot;: &quot;&quot;, &quot;non-dropping-particle&quot;: &quot;&quot;}, {&quot;family&quot;: &quot;Chung&quot;, &quot;given&quot;: &quot;H. W.&quot;, &quot;parse-names&quot;: false, &quot;dropping-particle&quot;: &quot;&quot;, &quot;non-dropping-particle&quot;: &quot;&quot;}, {&quot;family&quot;: &quot;Scales&quot;, &quot;given&quot;: &quot;N.&quot;, &quot;parse-names&quot;: false, &quot;dropping-particle&quot;: &quot;&quot;, &quot;non-dropping-particle&quot;: &quot;&quot;}, {&quot;family&quot;: &quot;Tanwani&quot;, &quot;given&quot;: &quot;A.&quot;, &quot;parse-names&quot;: false, &quot;dropping-particle&quot;: &quot;&quot;, &quot;non-dropping-particle&quot;: &quot;&quot;}, {&quot;family&quot;: &quot;Cole-Lewis&quot;, &quot;given&quot;: &quot;H.&quot;, &quot;parse-names&quot;: false, &quot;dropping-particle&quot;: &quot;&quot;, &quot;non-dropping-particle&quot;: &quot;&quot;}, {&quot;family&quot;: &quot;Pfohl&quot;, &quot;given&quot;: &quot;S.&quot;, &quot;parse-names&quot;: false, &quot;dropping-particle&quot;: &quot;&quot;, &quot;non-dropping-particle&quot;: &quot;&quot;}, {&quot;family&quot;: &quot;Payne&quot;, &quot;given&quot;: &quot;P.&quot;, &quot;parse-names&quot;: false, &quot;dropping-particle&quot;: &quot;&quot;, &quot;non-dropping-particle&quot;: &quot;&quot;}, {&quot;family&quot;: &quot;Seneviratne&quot;, &quot;given&quot;: &quot;M.&quot;, &quot;parse-names&quot;: false, &quot;dropping-particle&quot;: &quot;&quot;, &quot;non-dropping-particle&quot;: &quot;&quot;}, {&quot;family&quot;: &quot;Gamble&quot;, &quot;given&quot;: &quot;P.&quot;, &quot;parse-names&quot;: false, &quot;dropping-particle&quot;: &quot;&quot;, &quot;non-dropping-particle&quot;: &quot;&quot;}, {&quot;family&quot;: &quot;Kelly&quot;, &quot;given&quot;: &quot;C.&quot;, &quot;parse-names&quot;: false, &quot;dropping-particle&quot;: &quot;&quot;, &quot;non-dropping-particle&quot;: &quot;&quot;}, {&quot;family&quot;: &quot;Babiker&quot;, &quot;given&quot;: &quot;A.&quot;, &quot;parse-names&quot;: false, &quot;dropping-particle&quot;: &quot;&quot;, &quot;non-dropping-particle&quot;: &quot;&quot;}, {&quot;family&quot;: &quot;Schärli&quot;, &quot;given&quot;: &quot;N.&quot;, &quot;parse-names&quot;: false, &quot;dropping-particle&quot;: &quot;&quot;, &quot;non-dropping-particle&quot;: &quot;&quot;}, {&quot;family&quot;: &quot;Chowdhery&quot;, &quot;given&quot;: &quot;A.&quot;, &quot;parse-names&quot;: false, &quot;dropping-particle&quot;: &quot;&quot;, &quot;non-dropping-particle&quot;: &quot;&quot;}, {&quot;family&quot;: &quot;Mansfield&quot;, &quot;given&quot;: &quot;P.&quot;, &quot;parse-names&quot;: false, &quot;dropping-particle&quot;: &quot;&quot;, &quot;non-dropping-particle&quot;: &quot;&quot;}, {&quot;family&quot;: &quot;Demner-Fushman&quot;, &quot;given&quot;: &quot;D.&quot;, &quot;parse-names&quot;: false, &quot;dropping-particle&quot;: &quot;&quot;, &quot;non-dropping-particle&quot;: &quot;&quot;}, {&quot;family&quot;: &quot;Natarajan&quot;, &quot;given&quot;: &quot;V.&quot;, &quot;parse-names&quot;: false, &quot;dropping-particle&quot;: &quot;&quot;, &quot;non-dropping-particle&quot;: &quot;&quot;}], &quot;issued&quot;: {&quot;date-parts&quot;: [[2023]]}, &quot;DOI&quot;: &quot;10.1038/s41586-023-06291-2&quot;, &quot;type&quot;: &quot;article-journal&quot;, &quot;title&quot;: &quot;Large language models encode clinical knowledge&quot;, &quot;container-title&quot;: &quot;Nature&quot;, &quot;volume&quot;: &quot;620&quot;, &quot;issue&quot;: &quot;7972&quot;, &quot;page&quot;: &quot;172-180&quot;, &quot;id&quot;: &quot;ITEM-50da8b62-4567-5119-b691-5e46f77cae26&quot;, &quot;container-title-short&quot;: &quot;&quot;}, &quot;isTemporary&quot;: false}]}, {&quot;citationID&quot;: &quot;MENDELEY_CITATION_5de94ccb-6a0c-4332-8702-21e63f95e5b6&quot;, &quot;properties&quot;: {&quot;noteIndex&quot;: 0}, &quot;isEdited&quot;: false, &quot;manualOverride&quot;: {&quot;isManuallyOverridden&quot;: true, &quot;citeprocText&quot;: &quot;(Negueruela Gómez, 2024; Zhang et al., 2026)&quot;, &quot;manualOverrideText&quot;: &quot;(Negueruela Gómez, 2024; H. Zhang et al., 2026)&quot;}, &quot;citationItems&quot;: [{&quot;id&quot;: &quot;ITEM-99b80702-9513-57fc-b45d-6af1c9999632&quot;, &quot;itemData&quot;: {&quot;author&quot;: [{&quot;family&quot;: &quot;Negueruela Gómez&quot;, &quot;given&quot;: &quot;I.&quot;, &quot;parse-names&quot;: false, &quot;dropping-particle&quot;: &quot;&quot;, &quot;non-dropping-particle&quot;: &quot;&quot;}], &quot;issued&quot;: {&quot;date-parts&quot;: [[2024]]}, &quot;URL&quot;: &quot;https://repositorio.unican.es/xmlui/handle/10902/33837&quot;, &quot;type&quot;: &quot;thesis&quot;, &quot;title&quot;: &quot;Análisis y evaluación de LLMs con técnicas RAG para el desarrollo y despliegue de un asistente virtual&quot;, &quot;genre&quot;: &quot;Trabajo de fin de estudios&quot;, &quot;publisher&quot;: &quot;Universidad de Cantabria&quot;, &quot;id&quot;: &quot;ITEM-99b80702-9513-57fc-b45d-6af1c9999632&quot;, &quot;container-title-short&quot;: &quot;&quot;}, &quot;isTemporary&quot;: false}, {&quot;id&quot;: &quot;ITEM-c14394b5-5d79-565b-92c8-bcd30bfc44ad&quot;, &quot;itemData&quot;: {&quot;author&quot;: [{&quot;family&quot;: &quot;Zhang&quot;, &quot;given&quot;: &quot;H.&quot;, &quot;parse-names&quot;: false, &quot;dropping-particle&quot;: &quot;&quot;, &quot;non-dropping-particle&quot;: &quot;&quot;}, {&quot;family&quot;: &quot;Li&quot;, &quot;given&quot;: &quot;Z.&quot;, &quot;parse-names&quot;: false, &quot;dropping-particle&quot;: &quot;&quot;, &quot;non-dropping-particle&quot;: &quot;&quot;}, {&quot;family&quot;: &quot;Liu&quot;, &quot;given&quot;: &quot;J.&quot;, &quot;parse-names&quot;: false, &quot;dropping-particle&quot;: &quot;&quot;, &quot;non-dropping-particle&quot;: &quot;&quot;}], &quot;issued&quot;: {&quot;date-parts&quot;: [[2026]]}, &quot;DOI&quot;: &quot;10.1016/j.patcog.2025.111992&quot;, &quot;type&quot;: &quot;article-journal&quot;, &quot;title&quot;: &quot;SceneLLM: Implicit language reasoning in LLM for dynamic scene graph generation&quot;, &quot;container-title&quot;: &quot;Pattern Recognition&quot;, &quot;volume&quot;: &quot;170&quot;, &quot;page&quot;: &quot;111992&quot;, &quot;id&quot;: &quot;ITEM-c14394b5-5d79-565b-92c8-bcd30bfc44ad&quot;, &quot;container-title-short&quot;: &quot;&quot;}, &quot;isTemporary&quot;: false}]}, {&quot;citationID&quot;: &quot;MENDELEY_CITATION_3d8b5c16-9cb0-45dd-b775-562098a47f50&quot;, &quot;properties&quot;: {&quot;noteIndex&quot;: 0}, &quot;isEdited&quot;: false, &quot;manualOverride&quot;: {&quot;isManuallyOverridden&quot;: false, &quot;citeprocText&quot;: &quot;(Vaswani et al., 2017)&quot;, &quot;manualOverrideText&quot;: &quot;&quot;}, &quot;citationItems&quot;: [{&quot;id&quot;: &quot;ITEM-17a82183-4067-5f24-9b07-243be6e2ad27&quot;, &quot;itemData&quot;: {&quot;author&quot;: [{&quot;family&quot;: &quot;Vaswani&quot;, &quot;given&quot;: &quot;A.&quot;, &quot;parse-names&quot;: false, &quot;dropping-particle&quot;: &quot;&quot;, &quot;non-dropping-particle&quot;: &quot;&quot;}, {&quot;family&quot;: &quot;Shazeer&quot;, &quot;given&quot;: &quot;N.&quot;, &quot;parse-names&quot;: false, &quot;dropping-particle&quot;: &quot;&quot;, &quot;non-dropping-particle&quot;: &quot;&quot;}, {&quot;family&quot;: &quot;Parmar&quot;, &quot;given&quot;: &quot;N.&quot;, &quot;parse-names&quot;: false, &quot;dropping-particle&quot;: &quot;&quot;, &quot;non-dropping-particle&quot;: &quot;&quot;}, {&quot;family&quot;: &quot;Uszkoreit&quot;, &quot;given&quot;: &quot;J.&quot;, &quot;parse-names&quot;: false, &quot;dropping-particle&quot;: &quot;&quot;, &quot;non-dropping-particle&quot;: &quot;&quot;}, {&quot;family&quot;: &quot;Jones&quot;, &quot;given&quot;: &quot;L.&quot;, &quot;parse-names&quot;: false, &quot;dropping-particle&quot;: &quot;&quot;, &quot;non-dropping-particle&quot;: &quot;&quot;}, {&quot;family&quot;: &quot;Gomez&quot;, &quot;given&quot;: &quot;A. N.&quot;, &quot;parse-names&quot;: false, &quot;dropping-particle&quot;: &quot;&quot;, &quot;non-dropping-particle&quot;: &quot;&quot;}, {&quot;family&quot;: &quot;Kaiser&quot;, &quot;given&quot;: &quot;Ł.&quot;, &quot;parse-names&quot;: false, &quot;dropping-particle&quot;: &quot;&quot;, &quot;non-dropping-particle&quot;: &quot;&quot;}, {&quot;family&quot;: &quot;Polosukhin&quot;, &quot;given&quot;: &quot;I.&quot;, &quot;parse-names&quot;: false, &quot;dropping-particle&quot;: &quot;&quot;, &quot;non-dropping-particle&quot;: &quot;&quot;}], &quot;issued&quot;: {&quot;date-parts&quot;: [[2017]]}, &quot;DOI&quot;: &quot;10.48550/arXiv.1706.03762&quot;, &quot;type&quot;: &quot;paper-conference&quot;, &quot;title&quot;: &quot;Attention is all you need&quot;, &quot;container-title&quot;: &quot;Advances in Neural Information Processing Systems 30&quot;, &quot;page&quot;: &quot;5998-6008&quot;, &quot;id&quot;: &quot;ITEM-17a82183-4067-5f24-9b07-243be6e2ad27&quot;, &quot;container-title-short&quot;: &quot;&quot;}, &quot;isTemporary&quot;: false}]}, {&quot;citationID&quot;: &quot;MENDELEY_CITATION_b73195c3-2a95-4fd6-90c2-55e440f13a70&quot;, &quot;properties&quot;: {&quot;noteIndex&quot;: 0}, &quot;isEdited&quot;: false, &quot;manualOverride&quot;: {&quot;isManuallyOverridden&quot;: false, &quot;citeprocText&quot;: &quot;(Li et al., 2023)&quot;, &quot;manualOverrideText&quot;: &quot;&quot;}, &quot;citationItems&quot;: [{&quot;id&quot;: &quot;ITEM-ef62fa18-4b28-5ee1-a9e5-7cfba1f59cd4&quot;, &quot;itemData&quot;: {&quot;author&quot;: [{&quot;family&quot;: &quot;Li&quot;, &quot;given&quot;: &quot;Y.&quot;, &quot;parse-names&quot;: false, &quot;dropping-particle&quot;: &quot;&quot;, &quot;non-dropping-particle&quot;: &quot;&quot;}, {&quot;family&quot;: &quot;Li&quot;, &quot;given&quot;: &quot;Z.&quot;, &quot;parse-names&quot;: false, &quot;dropping-particle&quot;: &quot;&quot;, &quot;non-dropping-particle&quot;: &quot;&quot;}, {&quot;family&quot;: &quot;Zhang&quot;, &quot;given&quot;: &quot;K.&quot;, &quot;parse-names&quot;: false, &quot;dropping-particle&quot;: &quot;&quot;, &quot;non-dropping-particle&quot;: &quot;&quot;}, {&quot;family&quot;: &quot;Dan&quot;, &quot;given&quot;: &quot;R.&quot;, &quot;parse-names&quot;: false, &quot;dropping-particle&quot;: &quot;&quot;, &quot;non-dropping-particle&quot;: &quot;&quot;}, {&quot;family&quot;: &quot;Jiang&quot;, &quot;given&quot;: &quot;S.&quot;, &quot;parse-names&quot;: false, &quot;dropping-particle&quot;: &quot;&quot;, &quot;non-dropping-particle&quot;: &quot;&quot;}, {&quot;family&quot;: &quot;Zhang&quot;, &quot;given&quot;: &quot;Y.&quot;, &quot;parse-names&quot;: false, &quot;dropping-particle&quot;: &quot;&quot;, &quot;non-dropping-particle&quot;: &quot;&quot;}], &quot;issued&quot;: {&quot;date-parts&quot;: [[2023]]}, &quot;DOI&quot;: &quot;10.7759/cureus.40895&quot;, &quot;type&quot;: &quot;article-journal&quot;, &quot;title&quot;: &quot;ChatDoctor: A medical chat model fine-tuned on a large language model Meta-AI (LLaMA) using medical domain knowledge&quot;, &quot;container-title&quot;: &quot;Cureus&quot;, &quot;id&quot;: &quot;ITEM-ef62fa18-4b28-5ee1-a9e5-7cfba1f59cd4&quot;, &quot;container-title-short&quot;: &quot;&quot;}, &quot;isTemporary&quot;: false}]}, {&quot;citationID&quot;: &quot;MENDELEY_CITATION_78792325-0cfe-437b-b5ef-dd8ceb501465&quot;, &quot;properties&quot;: {&quot;noteIndex&quot;: 0}, &quot;isEdited&quot;: false, &quot;manualOverride&quot;: {&quot;isManuallyOverridden&quot;: false, &quot;citeprocText&quot;: &quot;(Zavala Guirado et al., 2024)&quot;, &quot;manualOverrideText&quot;: &quot;&quot;}, &quot;citationItems&quot;: [{&quot;id&quot;: &quot;ITEM-3f3a4849-619c-5059-b1e7-bedbf71c7f24&quot;, &quot;itemData&quot;: {&quot;author&quot;: [{&quot;family&quot;: &quot;Zavala Guirado&quot;, &quot;given&quot;: &quot;M. A.&quot;, &quot;parse-names&quot;: false, &quot;dropping-particle&quot;: &quot;&quot;, &quot;non-dropping-particle&quot;: &quot;&quot;}, {&quot;family&quot;: &quot;González Castro&quot;, &quot;given&quot;: &quot;I.&quot;, &quot;parse-names&quot;: false, &quot;dropping-particle&quot;: &quot;&quot;, &quot;non-dropping-particle&quot;: &quot;&quot;}, {&quot;family&quot;: &quot;Tapia Ruelas&quot;, &quot;given&quot;: &quot;C. S.&quot;, &quot;parse-names&quot;: false, &quot;dropping-particle&quot;: &quot;&quot;, &quot;non-dropping-particle&quot;: &quot;&quot;}, {&quot;family&quot;: &quot;Cota Valenzuela&quot;, &quot;given&quot;: &quot;L. V.&quot;, &quot;parse-names&quot;: false, &quot;dropping-particle&quot;: &quot;&quot;, &quot;non-dropping-particle&quot;: &quot;&quot;}, {&quot;family&quot;: &quot;Durón Ramos&quot;, &quot;given&quot;: &quot;M. F.&quot;, &quot;parse-names&quot;: false, &quot;dropping-particle&quot;: &quot;&quot;, &quot;non-dropping-particle&quot;: &quot;&quot;}], &quot;issued&quot;: {&quot;date-parts&quot;: [[2024]]}, &quot;DOI&quot;: &quot;10.23913/ride.v14i28.1878&quot;, &quot;type&quot;: &quot;article-journal&quot;, &quot;title&quot;: &quot;Propiedades psicométricas de una escala para medir la práctica docente universitaria en la modalidad híbrida&quot;, &quot;container-title&quot;: &quot;RIDE Revista Iberoamericana para la Investigación y el Desarrollo Educativo&quot;, &quot;volume&quot;: &quot;14&quot;, &quot;issue&quot;: &quot;28&quot;, &quot;id&quot;: &quot;ITEM-3f3a4849-619c-5059-b1e7-bedbf71c7f24&quot;, &quot;container-title-short&quot;: &quot;&quot;}, &quot;isTemporary&quot;: false}]}, {&quot;citationID&quot;: &quot;MENDELEY_CITATION_356c1fea-a54c-4c66-bc02-7335041c9701&quot;, &quot;properties&quot;: {&quot;noteIndex&quot;: 0}, &quot;isEdited&quot;: false, &quot;manualOverride&quot;: {&quot;isManuallyOverridden&quot;: false, &quot;citeprocText&quot;: &quot;(Chen y Guestrin, 2016)&quot;, &quot;manualOverrideText&quot;: &quot;&quot;}, &quot;citationItems&quot;: [{&quot;id&quot;: &quot;ITEM-15e61581-e955-52e7-b4fe-e53c650c3a2c&quot;, &quot;itemData&quot;: {&quot;author&quot;: [{&quot;family&quot;: &quot;Chen&quot;, &quot;given&quot;: &quot;T.&quot;, &quot;parse-names&quot;: false, &quot;dropping-particle&quot;: &quot;&quot;, &quot;non-dropping-particle&quot;: &quot;&quot;}, {&quot;family&quot;: &quot;Guestrin&quot;, &quot;given&quot;: &quot;C.&quot;, &quot;parse-names&quot;: false, &quot;dropping-particle&quot;: &quot;&quot;, &quot;non-dropping-particle&quot;: &quot;&quot;}], &quot;issued&quot;: {&quot;date-parts&quot;: [[2016]]}, &quot;DOI&quot;: &quot;10.1145/2939672.2939785&quot;, &quot;type&quot;: &quot;paper-conference&quot;, &quot;title&quot;: &quot;XGBoost: A scalable tree boosting system&quot;, &quot;container-title&quot;: &quot;Proceedings of the 22nd ACM SIGKDD International Conference on Knowledge Discovery and Data Mining&quot;, &quot;page&quot;: &quot;785-794&quot;, &quot;id&quot;: &quot;ITEM-15e61581-e955-52e7-b4fe-e53c650c3a2c&quot;, &quot;container-title-short&quot;: &quot;&quot;}, &quot;isTemporary&quot;: false}]}, {&quot;citationID&quot;: &quot;MENDELEY_CITATION_f89f2764-e227-44f1-ac90-561ea047c012&quot;, &quot;properties&quot;: {&quot;noteIndex&quot;: 0}, &quot;isEdited&quot;: false, &quot;manualOverride&quot;: {&quot;isManuallyOverridden&quot;: false, &quot;citeprocText&quot;: &quot;(Chen y Guestrin, 2016)&quot;, &quot;manualOverrideText&quot;: &quot;&quot;}, &quot;citationItems&quot;: [{&quot;id&quot;: &quot;ITEM-15e61581-e955-52e7-b4fe-e53c650c3a2c&quot;, &quot;itemData&quot;: {&quot;author&quot;: [{&quot;family&quot;: &quot;Chen&quot;, &quot;given&quot;: &quot;T.&quot;, &quot;parse-names&quot;: false, &quot;dropping-particle&quot;: &quot;&quot;, &quot;non-dropping-particle&quot;: &quot;&quot;}, {&quot;family&quot;: &quot;Guestrin&quot;, &quot;given&quot;: &quot;C.&quot;, &quot;parse-names&quot;: false, &quot;dropping-particle&quot;: &quot;&quot;, &quot;non-dropping-particle&quot;: &quot;&quot;}], &quot;issued&quot;: {&quot;date-parts&quot;: [[2016]]}, &quot;DOI&quot;: &quot;10.1145/2939672.2939785&quot;, &quot;type&quot;: &quot;paper-conference&quot;, &quot;title&quot;: &quot;XGBoost: A scalable tree boosting system&quot;, &quot;container-title&quot;: &quot;Proceedings of the 22nd ACM SIGKDD International Conference on Knowledge Discovery and Data Mining&quot;, &quot;page&quot;: &quot;785-794&quot;, &quot;id&quot;: &quot;ITEM-15e61581-e955-52e7-b4fe-e53c650c3a2c&quot;, &quot;container-title-short&quot;: &quot;&quot;}, &quot;isTemporary&quot;: false}]}, {&quot;citationID&quot;: &quot;MENDELEY_CITATION_1aa1d877-795e-41f0-80db-a1d7e2a0c7d1&quot;, &quot;properties&quot;: {&quot;noteIndex&quot;: 0}, &quot;isEdited&quot;: false, &quot;manualOverride&quot;: {&quot;isManuallyOverridden&quot;: false, &quot;citeprocText&quot;: &quot;(Cen et al., 2024; Nass et al., 2023)&quot;, &quot;manualOverrideText&quot;: &quot;&quot;}, &quot;citationItems&quot;: [{&quot;id&quot;: &quot;ITEM-fbe93c5f-260c-5b04-b4bc-393ef536cf4b&quot;, &quot;itemData&quot;: {&quot;author&quot;: [{&quot;family&quot;: &quot;Cen&quot;, &quot;given&quot;: &quot;C.&quot;, &quot;parse-names&quot;: false, &quot;dropping-particle&quot;: &quot;&quot;, &quot;non-dropping-particle&quot;: &quot;&quot;}, {&quot;family&quot;: &quot;Luo&quot;, &quot;given&quot;: &quot;G.&quot;, &quot;parse-names&quot;: false, &quot;dropping-particle&quot;: &quot;&quot;, &quot;non-dropping-particle&quot;: &quot;&quot;}, {&quot;family&quot;: &quot;Tian&quot;, &quot;given&quot;: &quot;Y.&quot;, &quot;parse-names&quot;: false, &quot;dropping-particle&quot;: &quot;&quot;, &quot;non-dropping-particle&quot;: &quot;&quot;}, {&quot;family&quot;: &quot;Fu&quot;, &quot;given&quot;: &quot;B.&quot;, &quot;parse-names&quot;: false, &quot;dropping-particle&quot;: &quot;&quot;, &quot;non-dropping-particle&quot;: &quot;&quot;}, {&quot;family&quot;: &quot;Chen&quot;, &quot;given&quot;: &quot;Y.&quot;, &quot;parse-names&quot;: false, &quot;dropping-particle&quot;: &quot;&quot;, &quot;non-dropping-particle&quot;: &quot;&quot;}, {&quot;family&quot;: &quot;Huang&quot;, &quot;given&quot;: &quot;S.&quot;, &quot;parse-names&quot;: false, &quot;dropping-particle&quot;: &quot;&quot;, &quot;non-dropping-particle&quot;: &quot;&quot;}, {&quot;family&quot;: &quot;Jiang&quot;, &quot;given&quot;: &quot;T.&quot;, &quot;parse-names&quot;: false, &quot;dropping-particle&quot;: &quot;&quot;, &quot;non-dropping-particle&quot;: &quot;&quot;}, {&quot;family&quot;: &quot;Huang&quot;, &quot;given&quot;: &quot;G.&quot;, &quot;parse-names&quot;: false, &quot;dropping-particle&quot;: &quot;&quot;, &quot;non-dropping-particle&quot;: &quot;&quot;}], &quot;issued&quot;: {&quot;date-parts&quot;: [[2024]]}, &quot;DOI&quot;: &quot;10.1057/s41599-024-03537-w&quot;, &quot;type&quot;: &quot;article-journal&quot;, &quot;title&quot;: &quot;Enhancing the dissemination of Cantonese Opera among youth via Bilibili: A study on intangible cultural heritage transmission&quot;, &quot;container-title&quot;: &quot;Humanities and Social Sciences Communications&quot;, &quot;volume&quot;: &quot;11&quot;, &quot;issue&quot;: &quot;1&quot;, &quot;page&quot;: &quot;1038&quot;, &quot;id&quot;: &quot;ITEM-fbe93c5f-260c-5b04-b4bc-393ef536cf4b&quot;, &quot;container-title-short&quot;: &quot;&quot;}, &quot;isTemporary&quot;: false}, {&quot;id&quot;: &quot;ITEM-b9bb7734-2112-5534-b5a9-0ea79b3bd04f&quot;, &quot;itemData&quot;: {&quot;author&quot;: [{&quot;family&quot;: &quot;Nass&quot;, &quot;given&quot;: &quot;O.&quot;, &quot;parse-names&quot;: false, &quot;dropping-particle&quot;: &quot;&quot;, &quot;non-dropping-particle&quot;: &quot;&quot;}, {&quot;family&quot;: &quot;Skuliabina&quot;, &quot;given&quot;: &quot;O.&quot;, &quot;parse-names&quot;: false, &quot;dropping-particle&quot;: &quot;&quot;, &quot;non-dropping-particle&quot;: &quot;&quot;}, {&quot;family&quot;: &quot;Bapiyev&quot;, &quot;given&quot;: &quot;I.&quot;, &quot;parse-names&quot;: false, &quot;dropping-particle&quot;: &quot;&quot;, &quot;non-dropping-particle&quot;: &quot;&quot;}, {&quot;family&quot;: &quot;Dnekeshev&quot;, &quot;given&quot;: &quot;A.&quot;, &quot;parse-names&quot;: false, &quot;dropping-particle&quot;: &quot;&quot;, &quot;non-dropping-particle&quot;: &quot;&quot;}, {&quot;family&quot;: &quot;Bekenova&quot;, &quot;given&quot;: &quot;S.&quot;, &quot;parse-names&quot;: false, &quot;dropping-particle&quot;: &quot;&quot;, &quot;non-dropping-particle&quot;: &quot;&quot;}, {&quot;family&quot;: &quot;Bekenova&quot;, &quot;given&quot;: &quot;A.&quot;, &quot;parse-names&quot;: false, &quot;dropping-particle&quot;: &quot;&quot;, &quot;non-dropping-particle&quot;: &quot;&quot;}], &quot;issued&quot;: {&quot;date-parts&quot;: [[2023]]}, &quot;DOI&quot;: &quot;10.1051/e3sconf/202338908003&quot;, &quot;type&quot;: &quot;article-journal&quot;, &quot;title&quot;: &quot;Blended learning as a promising direction of informatization of higher education&quot;, &quot;container-title&quot;: &quot;E3S Web of Conferences&quot;, &quot;volume&quot;: &quot;389&quot;, &quot;page&quot;: &quot;08003&quot;, &quot;id&quot;: &quot;ITEM-b9bb7734-2112-5534-b5a9-0ea79b3bd04f&quot;, &quot;container-title-short&quot;: &quot;&quot;}, &quot;isTemporary&quot;: false}]}, {&quot;citationID&quot;: &quot;MENDELEY_CITATION_0632e7d9-6b5d-4637-9ee9-e57c77722f5f&quot;, &quot;properties&quot;: {&quot;noteIndex&quot;: 0}, &quot;isEdited&quot;: false, &quot;manualOverride&quot;: {&quot;isManuallyOverridden&quot;: false, &quot;citeprocText&quot;: &quot;(Kung et al., 2023)&quot;, &quot;manualOverrideText&quot;: &quot;&quot;}, &quot;citationItems&quot;: [{&quot;id&quot;: &quot;ITEM-99395dc7-3112-55c2-b534-aefba14e6965&quot;, &quot;itemData&quot;: {&quot;author&quot;: [{&quot;family&quot;: &quot;Kung&quot;, &quot;given&quot;: &quot;T. H.&quot;, &quot;parse-names&quot;: false, &quot;dropping-particle&quot;: &quot;&quot;, &quot;non-dropping-particle&quot;: &quot;&quot;}, {&quot;family&quot;: &quot;Cheatham&quot;, &quot;given&quot;: &quot;M.&quot;, &quot;parse-names&quot;: false, &quot;dropping-particle&quot;: &quot;&quot;, &quot;non-dropping-particle&quot;: &quot;&quot;}, {&quot;family&quot;: &quot;Medenilla&quot;, &quot;given&quot;: &quot;A.&quot;, &quot;parse-names&quot;: false, &quot;dropping-particle&quot;: &quot;&quot;, &quot;non-dropping-particle&quot;: &quot;&quot;}, {&quot;family&quot;: &quot;Sillos&quot;, &quot;given&quot;: &quot;C.&quot;, &quot;parse-names&quot;: false, &quot;dropping-particle&quot;: &quot;&quot;, &quot;non-dropping-particle&quot;: &quot;&quot;}, {&quot;family&quot;: &quot;De Leon&quot;, &quot;given&quot;: &quot;L.&quot;, &quot;parse-names&quot;: false, &quot;dropping-particle&quot;: &quot;&quot;, &quot;non-dropping-particle&quot;: &quot;&quot;}, {&quot;family&quot;: &quot;Elepaño&quot;, &quot;given&quot;: &quot;C.&quot;, &quot;parse-names&quot;: false, &quot;dropping-particle&quot;: &quot;&quot;, &quot;non-dropping-particle&quot;: &quot;&quot;}, {&quot;family&quot;: &quot;Madriaga&quot;, &quot;given&quot;: &quot;M.&quot;, &quot;parse-names&quot;: false, &quot;dropping-particle&quot;: &quot;&quot;, &quot;non-dropping-particle&quot;: &quot;&quot;}, {&quot;family&quot;: &quot;Aggabao&quot;, &quot;given&quot;: &quot;R.&quot;, &quot;parse-names&quot;: false, &quot;dropping-particle&quot;: &quot;&quot;, &quot;non-dropping-particle&quot;: &quot;&quot;}, {&quot;family&quot;: &quot;Diaz-Candido&quot;, &quot;given&quot;: &quot;G.&quot;, &quot;parse-names&quot;: false, &quot;dropping-particle&quot;: &quot;&quot;, &quot;non-dropping-particle&quot;: &quot;&quot;}, {&quot;family&quot;: &quot;Maningo&quot;, &quot;given&quot;: &quot;J.&quot;, &quot;parse-names&quot;: false, &quot;dropping-particle&quot;: &quot;&quot;, &quot;non-dropping-particle&quot;: &quot;&quot;}, {&quot;family&quot;: &quot;Tseng&quot;, &quot;given&quot;: &quot;V.&quot;, &quot;parse-names&quot;: false, &quot;dropping-particle&quot;: &quot;&quot;, &quot;non-dropping-particle&quot;: &quot;&quot;}], &quot;issued&quot;: {&quot;date-parts&quot;: [[2023]]}, &quot;DOI&quot;: &quot;10.1371/journal.pdig.0000198&quot;, &quot;type&quot;: &quot;article-journal&quot;, &quot;title&quot;: &quot;Performance of ChatGPT on USMLE: Potential for AI-assisted medical education using large language models&quot;, &quot;container-title&quot;: &quot;PLOS Digital Health&quot;, &quot;volume&quot;: &quot;2&quot;, &quot;issue&quot;: &quot;2&quot;, &quot;page&quot;: &quot;e0000198&quot;, &quot;id&quot;: &quot;ITEM-99395dc7-3112-55c2-b534-aefba14e6965&quot;, &quot;container-title-short&quot;: &quot;&quot;}, &quot;isTemporary&quot;: false}]}, {&quot;citationID&quot;: &quot;MENDELEY_CITATION_cfac2018-6df3-4920-9dad-8f265149d08f&quot;, &quot;properties&quot;: {&quot;noteIndex&quot;: 0}, &quot;isEdited&quot;: false, &quot;manualOverride&quot;: {&quot;isManuallyOverridden&quot;: false, &quot;citeprocText&quot;: &quot;(Fernández et al., 2025; Navarro Forero et al., 2025)&quot;, &quot;manualOverrideText&quot;: &quot;&quot;}, &quot;citationItems&quot;: [{&quot;id&quot;: &quot;ITEM-6e797b0e-8270-559d-850f-c5042d0b3d16&quot;, &quot;itemData&quot;: {&quot;author&quot;: [{&quot;family&quot;: &quot;Fernández&quot;, &quot;given&quot;: &quot;J. M.&quot;, &quot;parse-names&quot;: false, &quot;dropping-particle&quot;: &quot;&quot;, &quot;non-dropping-particle&quot;: &quot;&quot;}, {&quot;family&quot;: &quot;Petrocelli&quot;, &quot;given&quot;: &quot;D. M.&quot;, &quot;parse-names&quot;: false, &quot;dropping-particle&quot;: &quot;&quot;, &quot;non-dropping-particle&quot;: &quot;&quot;}, {&quot;family&quot;: &quot;Matuk&quot;, &quot;given&quot;: &quot;R.&quot;, &quot;parse-names&quot;: false, &quot;dropping-particle&quot;: &quot;&quot;, &quot;non-dropping-particle&quot;: &quot;&quot;}, {&quot;family&quot;: &quot;Lanson&quot;, &quot;given&quot;: &quot;D.&quot;, &quot;parse-names&quot;: false, &quot;dropping-particle&quot;: &quot;&quot;, &quot;non-dropping-particle&quot;: &quot;&quot;}, {&quot;family&quot;: &quot;Zamudio&quot;, &quot;given&quot;: &quot;E.&quot;, &quot;parse-names&quot;: false, &quot;dropping-particle&quot;: &quot;&quot;, &quot;non-dropping-particle&quot;: &quot;&quot;}, {&quot;family&quot;: &quot;Cagnina&quot;, &quot;given&quot;: &quot;L. C.&quot;, &quot;parse-names&quot;: false, &quot;dropping-particle&quot;: &quot;&quot;, &quot;non-dropping-particle&quot;: &quot;&quot;}, {&quot;family&quot;: &quot;Gil Costa&quot;, &quot;given&quot;: &quot;G. V.&quot;, &quot;parse-names&quot;: false, &quot;dropping-particle&quot;: &quot;&quot;, &quot;non-dropping-particle&quot;: &quot;&quot;}, {&quot;family&quot;: &quot;Errecalde&quot;, &quot;given&quot;: &quot;M. L.&quot;, &quot;parse-names&quot;: false, &quot;dropping-particle&quot;: &quot;&quot;, &quot;non-dropping-particle&quot;: &quot;&quot;}], &quot;issued&quot;: {&quot;date-parts&quot;: [[2025]]}, &quot;URL&quot;: &quot;http://sedici.unlp.edu.ar/handle/10915/183892&quot;, &quot;type&quot;: &quot;paper-conference&quot;, &quot;title&quot;: &quot;Fine-tuning y adaptación de modelos de lenguaje abiertos en infraestructura HPC para aplicaciones de dominio específico&quot;, &quot;container-title&quot;: &quot;Libro de actas del XXVII Workshop de Investigadores en Ciencias de la Computación&quot;, &quot;page&quot;: &quot;72-76&quot;, &quot;publisher&quot;: &quot;Red de Universidades con Carreras en Informática&quot;, &quot;id&quot;: &quot;ITEM-6e797b0e-8270-559d-850f-c5042d0b3d16&quot;, &quot;container-title-short&quot;: &quot;&quot;}, &quot;isTemporary&quot;: false}, {&quot;id&quot;: &quot;ITEM-559494bb-9754-5dfe-91e6-ccf0c9ae12dc&quot;, &quot;itemData&quot;: {&quot;author&quot;: [{&quot;family&quot;: &quot;Navarro Forero&quot;, &quot;given&quot;: &quot;C. A.&quot;, &quot;parse-names&quot;: false, &quot;dropping-particle&quot;: &quot;&quot;, &quot;non-dropping-particle&quot;: &quot;&quot;}, {&quot;family&quot;: &quot;Hernández&quot;, &quot;given&quot;: &quot;M. A.&quot;, &quot;parse-names&quot;: false, &quot;dropping-particle&quot;: &quot;&quot;, &quot;non-dropping-particle&quot;: &quot;&quot;}, {&quot;family&quot;: &quot;Viloria&quot;, &quot;given&quot;: &quot;K. T.&quot;, &quot;parse-names&quot;: false, &quot;dropping-particle&quot;: &quot;&quot;, &quot;non-dropping-particle&quot;: &quot;&quot;}], &quot;issued&quot;: {&quot;date-parts&quot;: [[2025]]}, &quot;DOI&quot;: &quot;10.26507/paper.4223&quot;, &quot;type&quot;: &quot;paper-conference&quot;, &quot;title&quot;: &quot;Nuevas rutas de aprendizaje: adaptación de contenidos académicos a formatos audiovisuales para mejorar la preparación de los estudiantes&quot;, &quot;container-title&quot;: &quot;Encuentro Internacional de Educación en Ingeniería&quot;, &quot;publisher&quot;: &quot;Asociación Colombiana de Facultades de Ingeniería&quot;, &quot;id&quot;: &quot;ITEM-559494bb-9754-5dfe-91e6-ccf0c9ae12dc&quot;, &quot;container-title-short&quot;: &quot;&quot;}, &quot;isTemporary&quot;: false}]}, {&quot;citationID&quot;: &quot;MENDELEY_CITATION_7d98613c-23ce-4701-a09f-addd0e41f5bd&quot;, &quot;properties&quot;: {&quot;noteIndex&quot;: 0}, &quot;isEdited&quot;: false, &quot;manualOverride&quot;: {&quot;isManuallyOverridden&quot;: true, &quot;citeprocText&quot;: &quot;(Cisneros-Bravo et al., 2023)&quot;, &quot;manualOverrideText&quot;: &quot;Cisneros-Bravo et al. (2023)&quot;}, &quot;citationItems&quot;: [{&quot;id&quot;: &quot;ITEM-2c1f70fd-8745-538a-b99f-18d256f44b4f&quot;, &quot;itemData&quot;: {&quot;author&quot;: [{&quot;family&quot;: &quot;Cisneros-Bravo&quot;, &quot;given&quot;: &quot;B. E.&quot;, &quot;parse-names&quot;: false, &quot;dropping-particle&quot;: &quot;&quot;, &quot;non-dropping-particle&quot;: &quot;&quot;}, {&quot;family&quot;: &quot;Rodríguez-Aguilar&quot;, &quot;given&quot;: &quot;R. M.&quot;, &quot;parse-names&quot;: false, &quot;dropping-particle&quot;: &quot;&quot;, &quot;non-dropping-particle&quot;: &quot;&quot;}, {&quot;family&quot;: &quot;Niño-Membrillo&quot;, &quot;given&quot;: &quot;Y. E.&quot;, &quot;parse-names&quot;: false, &quot;dropping-particle&quot;: &quot;&quot;, &quot;non-dropping-particle&quot;: &quot;&quot;}, {&quot;family&quot;: &quot;Cuevas-Rasgado&quot;, &quot;given&quot;: &quot;A. D.&quot;, &quot;parse-names&quot;: false, &quot;dropping-particle&quot;: &quot;&quot;, &quot;non-dropping-particle&quot;: &quot;&quot;}], &quot;issued&quot;: {&quot;date-parts&quot;: [[2023]]}, &quot;DOI&quot;: &quot;10.23913/ride.v14i27.1715&quot;, &quot;type&quot;: &quot;article-journal&quot;, &quot;title&quot;: &quot;Falta de orientación vocacional como factor en la deserción universitaria. Caso de estudio: zona Oriente del Estado de México&quot;, &quot;container-title&quot;: &quot;RIDE Revista Iberoamericana para la Investigación y el Desarrollo Educativo&quot;, &quot;volume&quot;: &quot;14&quot;, &quot;issue&quot;: &quot;27&quot;, &quot;id&quot;: &quot;ITEM-2c1f70fd-8745-538a-b99f-18d256f44b4f&quot;, &quot;container-title-short&quot;: &quot;&quot;}, &quot;isTemporary&quot;: false}]}, {&quot;citationID&quot;: &quot;MENDELEY_CITATION_9537810d-0339-454b-8610-59db2ef28063&quot;, &quot;properties&quot;: {&quot;noteIndex&quot;: 0}, &quot;isEdited&quot;: false, &quot;manualOverride&quot;: {&quot;isManuallyOverridden&quot;: true, &quot;citeprocText&quot;: &quot;(Alejandro Jaramillo, 2024)&quot;, &quot;manualOverrideText&quot;: &quot;Alejandro Jaramillo (2024)&quot;}, &quot;citationItems&quot;: [{&quot;id&quot;: &quot;ITEM-48bd420c-bbe4-5e36-8528-5e5a4a98c378&quot;, &quot;itemData&quot;: {&quot;author&quot;: [{&quot;family&quot;: &quot;Alejandro Jaramillo&quot;, &quot;given&quot;: &quot;S. Y.&quot;, &quot;parse-names&quot;: false, &quot;dropping-particle&quot;: &quot;&quot;, &quot;non-dropping-particle&quot;: &quot;&quot;}], &quot;issued&quot;: {&quot;date-parts&quot;: [[2024]]}, &quot;DOI&quot;: &quot;10.29394/scientific.issn.2542-2987.2024.9.34.13.285-300&quot;, &quot;type&quot;: &quot;article-journal&quot;, &quot;title&quot;: &quot;Orientación vocacional y profesional: la inteligencia artificial y su impacto en la educación&quot;, &quot;container-title&quot;: &quot;Revista Scientific&quot;, &quot;volume&quot;: &quot;9&quot;, &quot;issue&quot;: &quot;34&quot;, &quot;page&quot;: &quot;285-300&quot;, &quot;id&quot;: &quot;ITEM-48bd420c-bbe4-5e36-8528-5e5a4a98c378&quot;, &quot;container-title-short&quot;: &quot;&quot;}, &quot;isTemporary&quot;: false}]}, {&quot;citationID&quot;: &quot;MENDELEY_CITATION_ad14c52c-14f9-4514-b30b-679146e4e68b&quot;, &quot;properties&quot;: {&quot;noteIndex&quot;: 0}, &quot;isEdited&quot;: false, &quot;manualOverride&quot;: {&quot;isManuallyOverridden&quot;: false, &quot;citeprocText&quot;: &quot;(Flores Meléndez et al., 2020)&quot;, &quot;manualOverrideText&quot;: &quot;&quot;}, &quot;citationItems&quot;: [{&quot;id&quot;: &quot;ITEM-25516478-e44c-5fcc-bc7e-03c8c680ebf5&quot;, &quot;itemData&quot;: {&quot;author&quot;: [{&quot;family&quot;: &quot;Flores Meléndez&quot;, &quot;given&quot;: &quot;M.&quot;, &quot;parse-names&quot;: false, &quot;dropping-particle&quot;: &quot;&quot;, &quot;non-dropping-particle&quot;: &quot;&quot;}, {&quot;family&quot;: &quot;Góngora Cortés&quot;, &quot;given&quot;: &quot;J. J.&quot;, &quot;parse-names&quot;: false, &quot;dropping-particle&quot;: &quot;&quot;, &quot;non-dropping-particle&quot;: &quot;&quot;}, {&quot;family&quot;: &quot;López Cabrera&quot;, &quot;given&quot;: &quot;M. V.&quot;, &quot;parse-names&quot;: false, &quot;dropping-particle&quot;: &quot;&quot;, &quot;non-dropping-particle&quot;: &quot;&quot;}, {&quot;family&quot;: &quot;Eraña Rojas&quot;, &quot;given&quot;: &quot;I. E.&quot;, &quot;parse-names&quot;: false, &quot;dropping-particle&quot;: &quot;&quot;, &quot;non-dropping-particle&quot;: &quot;&quot;}], &quot;issued&quot;: {&quot;date-parts&quot;: [[2020]]}, &quot;DOI&quot;: &quot;10.1016/j.edumed.2018.11.008&quot;, &quot;type&quot;: &quot;article-journal&quot;, &quot;title&quot;: &quot;The «call» of medicine. Use of new mentoring models for vocational orientation&quot;, &quot;container-title&quot;: &quot;Educación Médica&quot;, &quot;volume&quot;: &quot;21&quot;, &quot;issue&quot;: &quot;2&quot;, &quot;page&quot;: &quot;145-148&quot;, &quot;id&quot;: &quot;ITEM-25516478-e44c-5fcc-bc7e-03c8c680ebf5&quot;, &quot;container-title-short&quot;: &quot;&quot;}, &quot;isTemporary&quot;: false}]}, {&quot;citationID&quot;: &quot;MENDELEY_CITATION_56df8b42-c652-4637-b419-53e6273e1e8c&quot;, &quot;properties&quot;: {&quot;noteIndex&quot;: 0}, &quot;isEdited&quot;: false, &quot;manualOverride&quot;: {&quot;isManuallyOverridden&quot;: false, &quot;citeprocText&quot;: &quot;(Yupanqui Sanchez, 2024)&quot;, &quot;manualOverrideText&quot;: &quot;&quot;}, &quot;citationItems&quot;: [{&quot;id&quot;: &quot;ITEM-41aff42e-02f9-5cf8-bac7-1a6378feb8f5&quot;, &quot;itemData&quot;: {&quot;author&quot;: [{&quot;family&quot;: &quot;Yupanqui Sanchez&quot;, &quot;given&quot;: &quot;L. A.&quot;, &quot;parse-names&quot;: false, &quot;dropping-particle&quot;: &quot;&quot;, &quot;non-dropping-particle&quot;: &quot;&quot;}], &quot;issued&quot;: {&quot;date-parts&quot;: [[2024]]}, &quot;URL&quot;: &quot;https://repositorio.une.edu.pe/server/api/core/bitstreams/0a198466-0baf-4299-897b-90a22a49c958/content&quot;, &quot;type&quot;: &quot;thesis&quot;, &quot;title&quot;: &quot;Perfil del egresado y la formación profesional en estudiantes del último año de arquitectura de la Universidad Femenina del Sagrado Corazón, 2020&quot;, &quot;genre&quot;: &quot;Tesis de maestría&quot;, &quot;publisher&quot;: &quot;Universidad Nacional de Educación Enrique Guzmán y Valle&quot;, &quot;id&quot;: &quot;ITEM-41aff42e-02f9-5cf8-bac7-1a6378feb8f5&quot;, &quot;container-title-short&quot;: &quot;&quot;}, &quot;isTemporary&quot;: false}]}, {&quot;citationID&quot;: &quot;MENDELEY_CITATION_9fca19a1-c0e8-45ab-b631-614ff82a11f4&quot;, &quot;properties&quot;: {&quot;noteIndex&quot;: 0}, &quot;isEdited&quot;: false, &quot;manualOverride&quot;: {&quot;isManuallyOverridden&quot;: false, &quot;citeprocText&quot;: &quot;(Aguilar-Reyes et al., 2025)&quot;, &quot;manualOverrideText&quot;: &quot;&quot;}, &quot;citationItems&quot;: [{&quot;id&quot;: &quot;ITEM-8c9c99df-1678-5fab-b737-85f1e9842ee2&quot;, &quot;itemData&quot;: {&quot;author&quot;: [{&quot;family&quot;: &quot;Aguilar-Reyes&quot;, &quot;given&quot;: &quot;J. E.&quot;, &quot;parse-names&quot;: false, &quot;dropping-particle&quot;: &quot;&quot;, &quot;non-dropping-particle&quot;: &quot;&quot;}, {&quot;family&quot;: &quot;Mejía-Peñafiel&quot;, &quot;given&quot;: &quot;E. F.&quot;, &quot;parse-names&quot;: false, &quot;dropping-particle&quot;: &quot;&quot;, &quot;non-dropping-particle&quot;: &quot;&quot;}, {&quot;family&quot;: &quot;Morocho-Barrionuevo&quot;, &quot;given&quot;: &quot;T. P.&quot;, &quot;parse-names&quot;: false, &quot;dropping-particle&quot;: &quot;&quot;, &quot;non-dropping-particle&quot;: &quot;&quot;}, {&quot;family&quot;: &quot;Velasco-Castelo&quot;, &quot;given&quot;: &quot;G.-M.&quot;, &quot;parse-names&quot;: false, &quot;dropping-particle&quot;: &quot;&quot;, &quot;non-dropping-particle&quot;: &quot;&quot;}], &quot;issued&quot;: {&quot;date-parts&quot;: [[2025]]}, &quot;DOI&quot;: &quot;10.36390/telos271.08&quot;, &quot;type&quot;: &quot;article-journal&quot;, &quot;title&quot;: &quot;Estudio del rendimiento académico mediante la comparación de modelos de regresión y árboles de clasificación&quot;, &quot;container-title&quot;: &quot;Telos: Revista de Estudios Interdisciplinarios en Ciencias Sociales&quot;, &quot;volume&quot;: &quot;27&quot;, &quot;issue&quot;: &quot;1&quot;, &quot;page&quot;: &quot;94-115&quot;, &quot;id&quot;: &quot;ITEM-8c9c99df-1678-5fab-b737-85f1e9842ee2&quot;, &quot;container-title-short&quot;: &quot;&quot;}, &quot;isTemporary&quot;: false}]}, {&quot;citationID&quot;: &quot;MENDELEY_CITATION_67ffa1a1-2566-48b6-9698-2d1cdd7750c0&quot;, &quot;properties&quot;: {&quot;noteIndex&quot;: 0}, &quot;isEdited&quot;: false, &quot;manualOverride&quot;: {&quot;isManuallyOverridden&quot;: false, &quot;citeprocText&quot;: &quot;(Muñoz Pilozo et al., 2024; Sabando Moreira y Zambrano Montenegro, 2024)&quot;, &quot;manualOverrideText&quot;: &quot;&quot;}, &quot;citationItems&quot;: [{&quot;id&quot;: &quot;ITEM-61284f77-93cc-5f63-a665-e96ce95b70b6&quot;, &quot;itemData&quot;: {&quot;author&quot;: [{&quot;family&quot;: &quot;Muñoz Pilozo&quot;, &quot;given&quot;: &quot;A. G.&quot;, &quot;parse-names&quot;: false, &quot;dropping-particle&quot;: &quot;&quot;, &quot;non-dropping-particle&quot;: &quot;&quot;}, {&quot;family&quot;: &quot;Villalva Pilozo&quot;, &quot;given&quot;: &quot;A. M.&quot;, &quot;parse-names&quot;: false, &quot;dropping-particle&quot;: &quot;&quot;, &quot;non-dropping-particle&quot;: &quot;&quot;}, {&quot;family&quot;: &quot;Medina Castro&quot;, &quot;given&quot;: &quot;A. R.&quot;, &quot;parse-names&quot;: false, &quot;dropping-particle&quot;: &quot;&quot;, &quot;non-dropping-particle&quot;: &quot;&quot;}, {&quot;family&quot;: &quot;Pilozo Mendoza&quot;, &quot;given&quot;: &quot;J. J.&quot;, &quot;parse-names&quot;: false, &quot;dropping-particle&quot;: &quot;&quot;, &quot;non-dropping-particle&quot;: &quot;&quot;}], &quot;issued&quot;: {&quot;date-parts&quot;: [[2024]]}, &quot;DOI&quot;: &quot;10.29394/scientific.issn.2542-2987.2024.9.33.2.45-63&quot;, &quot;type&quot;: &quot;article-journal&quot;, &quot;title&quot;: &quot;Factores determinantes en el éxito del proceso de enseñanza-aprendizaje&quot;, &quot;container-title&quot;: &quot;Revista Scientific&quot;, &quot;volume&quot;: &quot;9&quot;, &quot;issue&quot;: &quot;33&quot;, &quot;page&quot;: &quot;45-63&quot;, &quot;id&quot;: &quot;ITEM-61284f77-93cc-5f63-a665-e96ce95b70b6&quot;, &quot;container-title-short&quot;: &quot;&quot;}, &quot;isTemporary&quot;: false}, {&quot;id&quot;: &quot;ITEM-a0688692-4e9a-5603-b80c-d3a280f7095d&quot;, &quot;itemData&quot;: {&quot;author&quot;: [{&quot;family&quot;: &quot;Sabando Moreira&quot;, &quot;given&quot;: &quot;P. A.&quot;, &quot;parse-names&quot;: false, &quot;dropping-particle&quot;: &quot;&quot;, &quot;non-dropping-particle&quot;: &quot;&quot;}, {&quot;family&quot;: &quot;Zambrano Montenegro&quot;, &quot;given&quot;: &quot;D. F.&quot;, &quot;parse-names&quot;: false, &quot;dropping-particle&quot;: &quot;&quot;, &quot;non-dropping-particle&quot;: &quot;&quot;}], &quot;issued&quot;: {&quot;date-parts&quot;: [[2024]]}, &quot;DOI&quot;: &quot;10.60100/rcmg.v5i2.245&quot;, &quot;type&quot;: &quot;article-journal&quot;, &quot;title&quot;: &quot;Técnicas de machine learning para predecir la deserción estudiantil universitaria: una revisión sistemática de la literatura&quot;, &quot;container-title&quot;: &quot;Revista Científica Multidisciplinar G-nerando&quot;, &quot;volume&quot;: &quot;5&quot;, &quot;issue&quot;: &quot;2&quot;, &quot;page&quot;: &quot;997-1023&quot;, &quot;id&quot;: &quot;ITEM-a0688692-4e9a-5603-b80c-d3a280f7095d&quot;, &quot;container-title-short&quot;: &quot;&quot;}, &quot;isTemporary&quot;: false}]}, {&quot;citationID&quot;: &quot;MENDELEY_CITATION_08ad9150-0350-47dc-8cca-6469e9667af8&quot;, &quot;properties&quot;: {&quot;noteIndex&quot;: 0}, &quot;isEdited&quot;: false, &quot;manualOverride&quot;: {&quot;isManuallyOverridden&quot;: false, &quot;citeprocText&quot;: &quot;(Jardón Gallegos et al., 2024)&quot;, &quot;manualOverrideText&quot;: &quot;&quot;}, &quot;citationItems&quot;: [{&quot;id&quot;: &quot;ITEM-32cbb7b1-4322-555e-b4d5-de0a8016f45b&quot;, &quot;itemData&quot;: {&quot;author&quot;: [{&quot;family&quot;: &quot;Jardón Gallegos&quot;, &quot;given&quot;: &quot;M. del C.&quot;, &quot;parse-names&quot;: false, &quot;dropping-particle&quot;: &quot;&quot;, &quot;non-dropping-particle&quot;: &quot;&quot;}, {&quot;family&quot;: &quot;Granizo Malusin&quot;, &quot;given&quot;: &quot;J. H.&quot;, &quot;parse-names&quot;: false, &quot;dropping-particle&quot;: &quot;&quot;, &quot;non-dropping-particle&quot;: &quot;&quot;}, {&quot;family&quot;: &quot;Yaselga Auz&quot;, &quot;given&quot;: &quot;W. F.&quot;, &quot;parse-names&quot;: false, &quot;dropping-particle&quot;: &quot;&quot;, &quot;non-dropping-particle&quot;: &quot;&quot;}, {&quot;family&quot;: &quot;Cocha Telenchana&quot;, &quot;given&quot;: &quot;M. G.&quot;, &quot;parse-names&quot;: false, &quot;dropping-particle&quot;: &quot;&quot;, &quot;non-dropping-particle&quot;: &quot;&quot;}], &quot;issued&quot;: {&quot;date-parts&quot;: [[2024]]}, &quot;DOI&quot;: &quot;10.59814/resofro.2024.4(4)338&quot;, &quot;type&quot;: &quot;article-journal&quot;, &quot;title&quot;: &quot;Impacto de los asistentes virtuales de inteligencia artificial en el rendimiento académico de estudiantes universitarios&quot;, &quot;container-title&quot;: &quot;Revista Social Fronteriza&quot;, &quot;volume&quot;: &quot;4&quot;, &quot;issue&quot;: &quot;4&quot;, &quot;page&quot;: &quot;e44338&quot;, &quot;id&quot;: &quot;ITEM-32cbb7b1-4322-555e-b4d5-de0a8016f45b&quot;, &quot;container-title-short&quot;: &quot;&quot;}, &quot;isTemporary&quot;: false}]}, {&quot;citationID&quot;: &quot;MENDELEY_CITATION_1466bf9d-2e91-4d09-b858-c7de752be026&quot;, &quot;properties&quot;: {&quot;noteIndex&quot;: 0}, &quot;isEdited&quot;: false, &quot;manualOverride&quot;: {&quot;isManuallyOverridden&quot;: false, &quot;citeprocText&quot;: &quot;(Escalante López et al., 2023)&quot;, &quot;manualOverrideText&quot;: &quot;&quot;}, &quot;citationItems&quot;: [{&quot;id&quot;: &quot;ITEM-04a17615-a429-5a99-899e-3433dd572883&quot;, &quot;itemData&quot;: {&quot;author&quot;: [{&quot;family&quot;: &quot;Escalante López&quot;, &quot;given&quot;: &quot;J. I.&quot;, &quot;parse-names&quot;: false, &quot;dropping-particle&quot;: &quot;&quot;, &quot;non-dropping-particle&quot;: &quot;&quot;}, {&quot;family&quot;: &quot;Medina Valderrama&quot;, &quot;given&quot;: &quot;C. J.&quot;, &quot;parse-names&quot;: false, &quot;dropping-particle&quot;: &quot;&quot;, &quot;non-dropping-particle&quot;: &quot;&quot;}, {&quot;family&quot;: &quot;Vásquez Muñoz&quot;, &quot;given&quot;: &quot;A.&quot;, &quot;parse-names&quot;: false, &quot;dropping-particle&quot;: &quot;&quot;, &quot;non-dropping-particle&quot;: &quot;&quot;}], &quot;issued&quot;: {&quot;date-parts&quot;: [[2023]]}, &quot;DOI&quot;: &quot;10.26495/rch.v7i1.2421&quot;, &quot;type&quot;: &quot;article-journal&quot;, &quot;title&quot;: &quot;La deserción universitaria: un problema no resuelto en el Perú&quot;, &quot;container-title&quot;: &quot;Hacedor - AIAPÆC&quot;, &quot;volume&quot;: &quot;7&quot;, &quot;issue&quot;: &quot;1&quot;, &quot;page&quot;: &quot;60-72&quot;, &quot;id&quot;: &quot;ITEM-04a17615-a429-5a99-899e-3433dd572883&quot;, &quot;container-title-short&quot;: &quot;&quot;}, &quot;isTemporary&quot;: false}]}, {&quot;citationID&quot;: &quot;MENDELEY_CITATION_d4cb7e29-9a59-4f7a-8d04-6e9162666c1f&quot;, &quot;properties&quot;: {&quot;noteIndex&quot;: 0}, &quot;isEdited&quot;: false, &quot;manualOverride&quot;: {&quot;isManuallyOverridden&quot;: false, &quot;citeprocText&quot;: &quot;(Rodas Zegarra de Escalante, 2024)&quot;, &quot;manualOverrideText&quot;: &quot;&quot;}, &quot;citationItems&quot;: [{&quot;id&quot;: &quot;ITEM-297823cb-c975-5def-8698-5545884294cd&quot;, &quot;itemData&quot;: {&quot;author&quot;: [{&quot;family&quot;: &quot;Rodas Zegarra de Escalante&quot;, &quot;given&quot;: &quot;A.&quot;, &quot;parse-names&quot;: false, &quot;dropping-particle&quot;: &quot;&quot;, &quot;non-dropping-particle&quot;: &quot;&quot;}], &quot;issued&quot;: {&quot;date-parts&quot;: [[2024]]}, &quot;URL&quot;: &quot;https://hdl.handle.net/20.500.12692/150276&quot;, &quot;type&quot;: &quot;thesis&quot;, &quot;title&quot;: &quot;Orientación vocacional y deserción universitaria en una universidad de Lima - 2024&quot;, &quot;genre&quot;: &quot;Tesis de maestría&quot;, &quot;publisher&quot;: &quot;Universidad César Vallejo&quot;, &quot;id&quot;: &quot;ITEM-297823cb-c975-5def-8698-5545884294cd&quot;, &quot;container-title-short&quot;: &quot;&quot;}, &quot;isTemporary&quot;: false}]}, {&quot;citationID&quot;: &quot;MENDELEY_CITATION_abd12c62-34a0-4725-904c-512b8def440e&quot;, &quot;properties&quot;: {&quot;noteIndex&quot;: 0}, &quot;isEdited&quot;: false, &quot;manualOverride&quot;: {&quot;isManuallyOverridden&quot;: true, &quot;citeprocText&quot;: &quot;(Torres-Delgado et al., 2024)&quot;, &quot;manualOverrideText&quot;: &quot;Torres-Delgado et al. (2024)&quot;}, &quot;citationItems&quot;: [{&quot;id&quot;: &quot;ITEM-803eec7d-bbb2-5fea-bb8c-5ccdb2039b68&quot;, &quot;itemData&quot;: {&quot;author&quot;: [{&quot;family&quot;: &quot;Torres-Delgado&quot;, &quot;given&quot;: &quot;G.&quot;, &quot;parse-names&quot;: false, &quot;dropping-particle&quot;: &quot;&quot;, &quot;non-dropping-particle&quot;: &quot;&quot;}, {&quot;family&quot;: &quot;Ramos-Pulido&quot;, &quot;given&quot;: &quot;S.&quot;, &quot;parse-names&quot;: false, &quot;dropping-particle&quot;: &quot;&quot;, &quot;non-dropping-particle&quot;: &quot;&quot;}, {&quot;family&quot;: &quot;Hernández-Gress&quot;, &quot;given&quot;: &quot;N.&quot;, &quot;parse-names&quot;: false, &quot;dropping-particle&quot;: &quot;&quot;, &quot;non-dropping-particle&quot;: &quot;&quot;}], &quot;issued&quot;: {&quot;date-parts&quot;: [[2024]]}, &quot;DOI&quot;: &quot;10.3390/engproc2024074074&quot;, &quot;type&quot;: &quot;article-journal&quot;, &quot;title&quot;: &quot;Satisfaction with research-based learning and academic performance by big data analysis&quot;, &quot;container-title&quot;: &quot;Engineering Proceedings&quot;, &quot;volume&quot;: &quot;74&quot;, &quot;issue&quot;: &quot;1&quot;, &quot;page&quot;: &quot;74&quot;, &quot;id&quot;: &quot;ITEM-803eec7d-bbb2-5fea-bb8c-5ccdb2039b68&quot;, &quot;container-title-short&quot;: &quot;&quot;}, &quot;isTemporary&quot;: false}]}, {&quot;citationID&quot;: &quot;MENDELEY_CITATION_55d139cd-d17c-4295-aa64-ed6faffac319&quot;, &quot;properties&quot;: {&quot;noteIndex&quot;: 0}, &quot;isEdited&quot;: false, &quot;manualOverride&quot;: {&quot;isManuallyOverridden&quot;: false, &quot;citeprocText&quot;: &quot;(Ramos-Rivera et al., 2025; Sancho Escrivá et al., 2020)&quot;, &quot;manualOverrideText&quot;: &quot;&quot;}, &quot;citationItems&quot;: [{&quot;id&quot;: &quot;ITEM-9143f651-ed9a-563c-92fe-37d934b09213&quot;, &quot;itemData&quot;: {&quot;author&quot;: [{&quot;family&quot;: &quot;Ramos-Rivera&quot;, &quot;given&quot;: &quot;R. E.&quot;, &quot;parse-names&quot;: false, &quot;dropping-particle&quot;: &quot;&quot;, &quot;non-dropping-particle&quot;: &quot;&quot;}, {&quot;family&quot;: &quot;Santana Mancilla&quot;, &quot;given&quot;: &quot;P. C.&quot;, &quot;parse-names&quot;: false, &quot;dropping-particle&quot;: &quot;&quot;, &quot;non-dropping-particle&quot;: &quot;&quot;}, {&quot;family&quot;: &quot;García-Mancilla&quot;, &quot;given&quot;: &quot;J.&quot;, &quot;parse-names&quot;: false, &quot;dropping-particle&quot;: &quot;&quot;, &quot;non-dropping-particle&quot;: &quot;&quot;}, {&quot;family&quot;: &quot;Gaytán-Lugo&quot;, &quot;given&quot;: &quot;L. S.&quot;, &quot;parse-names&quot;: false, &quot;dropping-particle&quot;: &quot;&quot;, &quot;non-dropping-particle&quot;: &quot;&quot;}], &quot;issued&quot;: {&quot;date-parts&quot;: [[2025]]}, &quot;DOI&quot;: &quot;10.29105/innoacad.v1i2.36&quot;, &quot;type&quot;: &quot;article-journal&quot;, &quot;title&quot;: &quot;Modelos de lenguaje en educación: inteligencia artificial generativa para optimizar el análisis del desempeño docente&quot;, &quot;container-title&quot;: &quot;Innovación Académica, Universidad Autónoma de Nuevo León&quot;, &quot;volume&quot;: &quot;1&quot;, &quot;issue&quot;: &quot;2&quot;, &quot;page&quot;: &quot;70-81&quot;, &quot;id&quot;: &quot;ITEM-9143f651-ed9a-563c-92fe-37d934b09213&quot;, &quot;container-title-short&quot;: &quot;&quot;}, &quot;isTemporary&quot;: false}, {&quot;id&quot;: &quot;ITEM-4d9769b2-c234-511d-ab8b-ba773efe38ec&quot;, &quot;itemData&quot;: {&quot;author&quot;: [{&quot;family&quot;: &quot;Sancho Escrivá&quot;, &quot;given&quot;: &quot;J. V.&quot;, &quot;parse-names&quot;: false, &quot;dropping-particle&quot;: &quot;&quot;, &quot;non-dropping-particle&quot;: &quot;&quot;}, {&quot;family&quot;: &quot;Fanjul Peyró&quot;, &quot;given&quot;: &quot;C.&quot;, &quot;parse-names&quot;: false, &quot;dropping-particle&quot;: &quot;&quot;, &quot;non-dropping-particle&quot;: &quot;&quot;}, {&quot;family&quot;: &quot;De la Iglesia Vayá&quot;, &quot;given&quot;: &quot;M.&quot;, &quot;parse-names&quot;: false, &quot;dropping-particle&quot;: &quot;&quot;, &quot;non-dropping-particle&quot;: &quot;&quot;}, {&quot;family&quot;: &quot;Montell&quot;, &quot;given&quot;: &quot;J. A.&quot;, &quot;parse-names&quot;: false, &quot;dropping-particle&quot;: &quot;&quot;, &quot;non-dropping-particle&quot;: &quot;&quot;}, {&quot;family&quot;: &quot;Escartí Fabra&quot;, &quot;given&quot;: &quot;M. J.&quot;, &quot;parse-names&quot;: false, &quot;dropping-particle&quot;: &quot;&quot;, &quot;non-dropping-particle&quot;: &quot;&quot;}], &quot;issued&quot;: {&quot;date-parts&quot;: [[2020]]}, &quot;DOI&quot;: &quot;10.35669/rcys.2020.10(1).19-41&quot;, &quot;type&quot;: &quot;article-journal&quot;, &quot;title&quot;: &quot;Aplicación de la inteligencia artificial con procesamiento del lenguaje natural para textos de investigación cualitativa en la relación médico-paciente con enfermedad mental mediante el uso de tecnologías móviles&quot;, &quot;container-title&quot;: &quot;Revista de Comunicación y Salud&quot;, &quot;volume&quot;: &quot;10&quot;, &quot;issue&quot;: &quot;1&quot;, &quot;page&quot;: &quot;19-41&quot;, &quot;id&quot;: &quot;ITEM-4d9769b2-c234-511d-ab8b-ba773efe38ec&quot;, &quot;container-title-short&quot;: &quot;&quot;}, &quot;isTemporary&quot;: false}]}, {&quot;citationID&quot;: &quot;MENDELEY_CITATION_b021a8cb-2232-453f-bbf0-16f93c69029e&quot;, &quot;properties&quot;: {&quot;noteIndex&quot;: 0}, &quot;isEdited&quot;: false, &quot;manualOverride&quot;: {&quot;isManuallyOverridden&quot;: true, &quot;citeprocText&quot;: &quot;(García Subies, 2021)&quot;, &quot;manualOverrideText&quot;: &quot;García Subies (2021)&quot;}, &quot;citationItems&quot;: [{&quot;id&quot;: &quot;ITEM-b59eaab8-9775-53c0-8c97-7339b6d70afc&quot;, &quot;itemData&quot;: {&quot;author&quot;: [{&quot;family&quot;: &quot;García Subies&quot;, &quot;given&quot;: &quot;G.&quot;, &quot;parse-names&quot;: false, &quot;dropping-particle&quot;: &quot;&quot;, &quot;non-dropping-particle&quot;: &quot;&quot;}], &quot;issued&quot;: {&quot;date-parts&quot;: [[2021]]}, &quot;URL&quot;: &quot;https://oa.upm.es/68623/&quot;, &quot;type&quot;: &quot;thesis&quot;, &quot;title&quot;: &quot;Modelos de Transformers para la clasificación de texto&quot;, &quot;genre&quot;: &quot;Tesis de maestría&quot;, &quot;publisher&quot;: &quot;Universidad Politécnica de Madrid&quot;, &quot;id&quot;: &quot;ITEM-b59eaab8-9775-53c0-8c97-7339b6d70afc&quot;, &quot;container-title-short&quot;: &quot;&quot;}, &quot;isTemporary&quot;: false}]}, {&quot;citationID&quot;: &quot;MENDELEY_CITATION_8d71de44-25a4-431a-91bf-588847b30c06&quot;, &quot;properties&quot;: {&quot;noteIndex&quot;: 0}, &quot;isEdited&quot;: false, &quot;manualOverride&quot;: {&quot;isManuallyOverridden&quot;: true, &quot;citeprocText&quot;: &quot;(Mena Guitarra, 2023)&quot;, &quot;manualOverrideText&quot;: &quot;Mena Guitarra (2023)&quot;}, &quot;citationItems&quot;: [{&quot;id&quot;: &quot;ITEM-b7bc5309-1149-55a6-8b1f-3e0d4086c429&quot;, &quot;itemData&quot;: {&quot;author&quot;: [{&quot;family&quot;: &quot;Mena Guitarra&quot;, &quot;given&quot;: &quot;S. D.&quot;, &quot;parse-names&quot;: false, &quot;dropping-particle&quot;: &quot;&quot;, &quot;non-dropping-particle&quot;: &quot;&quot;}], &quot;issued&quot;: {&quot;date-parts&quot;: [[2023]]}, &quot;URL&quot;: &quot;https://repositorio.usfq.edu.ec/handle/23000/13665&quot;, &quot;type&quot;: &quot;thesis&quot;, &quot;title&quot;: &quot;Usos y aplicaciones de modelos de lenguaje masivos en español&quot;, &quot;genre&quot;: &quot;Trabajo de titulación de pregrado&quot;, &quot;publisher&quot;: &quot;Universidad San Francisco de Quito&quot;, &quot;id&quot;: &quot;ITEM-b7bc5309-1149-55a6-8b1f-3e0d4086c429&quot;, &quot;container-title-short&quot;: &quot;&quot;}, &quot;isTemporary&quot;: false}]}, {&quot;citationID&quot;: &quot;MENDELEY_CITATION_5f372bcb-8986-44ba-8dca-34590a7feddf&quot;, &quot;properties&quot;: {&quot;noteIndex&quot;: 0}, &quot;isEdited&quot;: false, &quot;manualOverride&quot;: {&quot;isManuallyOverridden&quot;: true, &quot;citeprocText&quot;: &quot;(Hu et al., 2021)&quot;, &quot;manualOverrideText&quot;: &quot;Hu et al. (2021)&quot;}, &quot;citationItems&quot;: [{&quot;id&quot;: &quot;ITEM-74d30536-939b-537f-bec0-b59afedae2e3&quot;, &quot;itemData&quot;: {&quot;author&quot;: [{&quot;family&quot;: &quot;Hu&quot;, &quot;given&quot;: &quot;E. J.&quot;, &quot;parse-names&quot;: false, &quot;dropping-particle&quot;: &quot;&quot;, &quot;non-dropping-particle&quot;: &quot;&quot;}, {&quot;family&quot;: &quot;Shen&quot;, &quot;given&quot;: &quot;Y.&quot;, &quot;parse-names&quot;: false, &quot;dropping-particle&quot;: &quot;&quot;, &quot;non-dropping-particle&quot;: &quot;&quot;}, {&quot;family&quot;: &quot;Wallis&quot;, &quot;given&quot;: &quot;P.&quot;, &quot;parse-names&quot;: false, &quot;dropping-particle&quot;: &quot;&quot;, &quot;non-dropping-particle&quot;: &quot;&quot;}, {&quot;family&quot;: &quot;Allen-Zhu&quot;, &quot;given&quot;: &quot;Z.&quot;, &quot;parse-names&quot;: false, &quot;dropping-particle&quot;: &quot;&quot;, &quot;non-dropping-particle&quot;: &quot;&quot;}, {&quot;family&quot;: &quot;Li&quot;, &quot;given&quot;: &quot;Y.&quot;, &quot;parse-names&quot;: false, &quot;dropping-particle&quot;: &quot;&quot;, &quot;non-dropping-particle&quot;: &quot;&quot;}, {&quot;family&quot;: &quot;Wang&quot;, &quot;given&quot;: &quot;S.&quot;, &quot;parse-names&quot;: false, &quot;dropping-particle&quot;: &quot;&quot;, &quot;non-dropping-particle&quot;: &quot;&quot;}, {&quot;family&quot;: &quot;Wang&quot;, &quot;given&quot;: &quot;L.&quot;, &quot;parse-names&quot;: false, &quot;dropping-particle&quot;: &quot;&quot;, &quot;non-dropping-particle&quot;: &quot;&quot;}, {&quot;family&quot;: &quot;Chen&quot;, &quot;given&quot;: &quot;W.&quot;, &quot;parse-names&quot;: false, &quot;dropping-particle&quot;: &quot;&quot;, &quot;non-dropping-particle&quot;: &quot;&quot;}], &quot;issued&quot;: {&quot;date-parts&quot;: [[2021]]}, &quot;DOI&quot;: &quot;10.48550/arXiv.2106.09685&quot;, &quot;type&quot;: &quot;book&quot;, &quot;title&quot;: &quot;LoRA: Low-rank adaptation of large language models&quot;, &quot;publisher&quot;: &quot;arXiv&quot;, &quot;id&quot;: &quot;ITEM-74d30536-939b-537f-bec0-b59afedae2e3&quot;, &quot;container-title-short&quot;: &quot;&quot;}, &quot;isTemporary&quot;: false}]}, {&quot;citationID&quot;: &quot;MENDELEY_CITATION_05b5e119-1118-458a-a21d-376849961423&quot;, &quot;properties&quot;: {&quot;noteIndex&quot;: 0}, &quot;isEdited&quot;: false, &quot;manualOverride&quot;: {&quot;isManuallyOverridden&quot;: true, &quot;citeprocText&quot;: &quot;(Dettmers et al., 2023)&quot;, &quot;manualOverrideText&quot;: &quot;Dettmers et al. (2023)&quot;}, &quot;citationItems&quot;: [{&quot;id&quot;: &quot;ITEM-66ff8277-e9ea-5605-b98c-71a6ac2aa4a6&quot;, &quot;itemData&quot;: {&quot;author&quot;: [{&quot;family&quot;: &quot;Dettmers&quot;, &quot;given&quot;: &quot;T.&quot;, &quot;parse-names&quot;: false, &quot;dropping-particle&quot;: &quot;&quot;, &quot;non-dropping-particle&quot;: &quot;&quot;}, {&quot;family&quot;: &quot;Pagnoni&quot;, &quot;given&quot;: &quot;A.&quot;, &quot;parse-names&quot;: false, &quot;dropping-particle&quot;: &quot;&quot;, &quot;non-dropping-particle&quot;: &quot;&quot;}, {&quot;family&quot;: &quot;Holtzman&quot;, &quot;given&quot;: &quot;A.&quot;, &quot;parse-names&quot;: false, &quot;dropping-particle&quot;: &quot;&quot;, &quot;non-dropping-particle&quot;: &quot;&quot;}, {&quot;family&quot;: &quot;Zettlemoyer&quot;, &quot;given&quot;: &quot;L.&quot;, &quot;parse-names&quot;: false, &quot;dropping-particle&quot;: &quot;&quot;, &quot;non-dropping-particle&quot;: &quot;&quot;}], &quot;issued&quot;: {&quot;date-parts&quot;: [[2023]]}, &quot;DOI&quot;: &quot;10.48550/arXiv.2305.14314&quot;, &quot;type&quot;: &quot;paper-conference&quot;, &quot;title&quot;: &quot;QLoRA: Efficient finetuning of quantized LLMs&quot;, &quot;container-title&quot;: &quot;Advances in Neural Information Processing Systems 36&quot;, &quot;id&quot;: &quot;ITEM-66ff8277-e9ea-5605-b98c-71a6ac2aa4a6&quot;, &quot;container-title-short&quot;: &quot;&quot;}, &quot;isTemporary&quot;: false}]}, {&quot;citationID&quot;: &quot;MENDELEY_CITATION_fb9323b2-76d6-46cd-8a48-08515ad50665&quot;, &quot;properties&quot;: {&quot;noteIndex&quot;: 0}, &quot;isEdited&quot;: false, &quot;manualOverride&quot;: {&quot;isManuallyOverridden&quot;: true, &quot;citeprocText&quot;: &quot;(León Caranqui, 2023)&quot;, &quot;manualOverrideText&quot;: &quot;León Caranqui (2023)&quot;}, &quot;citationItems&quot;: [{&quot;id&quot;: &quot;ITEM-d8e93493-d1e9-5c21-8fb9-fe318b95db8c&quot;, &quot;itemData&quot;: {&quot;author&quot;: [{&quot;family&quot;: &quot;León Caranqui&quot;, &quot;given&quot;: &quot;J. A.&quot;, &quot;parse-names&quot;: false, &quot;dropping-particle&quot;: &quot;&quot;, &quot;non-dropping-particle&quot;: &quot;&quot;}], &quot;issued&quot;: {&quot;date-parts&quot;: [[2023]]}, &quot;URL&quot;: &quot;https://repositorio.usfq.edu.ec/handle/23000/13497&quot;, &quot;type&quot;: &quot;thesis&quot;, &quot;title&quot;: &quot;URKU: Adaptación de LLaMA 2 para la generación de texto en kichwa usando técnicas de Low-Rank Adaptation (LoRA)&quot;, &quot;genre&quot;: &quot;Trabajo de titulación de pregrado&quot;, &quot;publisher&quot;: &quot;Universidad San Francisco de Quito&quot;, &quot;id&quot;: &quot;ITEM-d8e93493-d1e9-5c21-8fb9-fe318b95db8c&quot;, &quot;container-title-short&quot;: &quot;&quot;}, &quot;isTemporary&quot;: false}]}, {&quot;citationID&quot;: &quot;MENDELEY_CITATION_98e61d60-6026-40fc-9d32-96ad434d211c&quot;, &quot;properties&quot;: {&quot;noteIndex&quot;: 0}, &quot;isEdited&quot;: false, &quot;manualOverride&quot;: {&quot;isManuallyOverridden&quot;: true, &quot;citeprocText&quot;: &quot;(Castejón Lozano, 2025)&quot;, &quot;manualOverrideText&quot;: &quot;Castejón Lozano (2025)&quot;}, &quot;citationItems&quot;: [{&quot;id&quot;: &quot;ITEM-aa8f5a87-f00c-54b4-9f0b-476652320c5d&quot;, &quot;itemData&quot;: {&quot;author&quot;: [{&quot;family&quot;: &quot;Castejón Lozano&quot;, &quot;given&quot;: &quot;F.&quot;, &quot;parse-names&quot;: false, &quot;dropping-particle&quot;: &quot;&quot;, &quot;non-dropping-particle&quot;: &quot;&quot;}], &quot;issued&quot;: {&quot;date-parts&quot;: [[2025]]}, &quot;URL&quot;: &quot;https://oa.upm.es/90917/&quot;, &quot;type&quot;: &quot;thesis&quot;, &quot;title&quot;: &quot;SoroIA: Diseño e implementación de un sistema conversacional basado en modelos grandes de lenguaje para el Museo Sorolla&quot;, &quot;genre&quot;: &quot;Tesis de maestría&quot;, &quot;publisher&quot;: &quot;Universidad Politécnica de Madrid&quot;, &quot;id&quot;: &quot;ITEM-aa8f5a87-f00c-54b4-9f0b-476652320c5d&quot;, &quot;container-title-short&quot;: &quot;&quot;}, &quot;isTemporary&quot;: false}]}, {&quot;citationID&quot;: &quot;MENDELEY_CITATION_17e110ea-44c4-4b33-8bd7-9652ee453839&quot;, &quot;properties&quot;: {&quot;noteIndex&quot;: 0}, &quot;isEdited&quot;: false, &quot;manualOverride&quot;: {&quot;isManuallyOverridden&quot;: true, &quot;citeprocText&quot;: &quot;(Fang et al., 2024)&quot;, &quot;manualOverrideText&quot;: &quot;Fang et al. (2024)&quot;}, &quot;citationItems&quot;: [{&quot;id&quot;: &quot;ITEM-5007b438-b37f-541e-8fca-2748edacc281&quot;, &quot;itemData&quot;: {&quot;author&quot;: [{&quot;family&quot;: &quot;Fang&quot;, &quot;given&quot;: &quot;X.&quot;, &quot;parse-names&quot;: false, &quot;dropping-particle&quot;: &quot;&quot;, &quot;non-dropping-particle&quot;: &quot;&quot;}, {&quot;family&quot;: &quot;Xu&quot;, &quot;given&quot;: &quot;W.&quot;, &quot;parse-names&quot;: false, &quot;dropping-particle&quot;: &quot;&quot;, &quot;non-dropping-particle&quot;: &quot;&quot;}, {&quot;family&quot;: &quot;Tan&quot;, &quot;given&quot;: &quot;F. A.&quot;, &quot;parse-names&quot;: false, &quot;dropping-particle&quot;: &quot;&quot;, &quot;non-dropping-particle&quot;: &quot;&quot;}, {&quot;family&quot;: &quot;Zhang&quot;, &quot;given&quot;: &quot;J.&quot;, &quot;parse-names&quot;: false, &quot;dropping-particle&quot;: &quot;&quot;, &quot;non-dropping-particle&quot;: &quot;&quot;}, {&quot;family&quot;: &quot;Hu&quot;, &quot;given&quot;: &quot;Z.&quot;, &quot;parse-names&quot;: false, &quot;dropping-particle&quot;: &quot;&quot;, &quot;non-dropping-particle&quot;: &quot;&quot;}, {&quot;family&quot;: &quot;Qi&quot;, &quot;given&quot;: &quot;Y.&quot;, &quot;parse-names&quot;: false, &quot;dropping-particle&quot;: &quot;&quot;, &quot;non-dropping-particle&quot;: &quot;&quot;}, {&quot;family&quot;: &quot;Nickleach&quot;, &quot;given&quot;: &quot;S.&quot;, &quot;parse-names&quot;: false, &quot;dropping-particle&quot;: &quot;&quot;, &quot;non-dropping-particle&quot;: &quot;&quot;}, {&quot;family&quot;: &quot;Socolinsky&quot;, &quot;given&quot;: &quot;D.&quot;, &quot;parse-names&quot;: false, &quot;dropping-particle&quot;: &quot;&quot;, &quot;non-dropping-particle&quot;: &quot;&quot;}, {&quot;family&quot;: &quot;Sengamedu&quot;, &quot;given&quot;: &quot;S.&quot;, &quot;parse-names&quot;: false, &quot;dropping-particle&quot;: &quot;&quot;, &quot;non-dropping-particle&quot;: &quot;&quot;}, {&quot;family&quot;: &quot;Faloutsos&quot;, &quot;given&quot;: &quot;C.&quot;, &quot;parse-names&quot;: false, &quot;dropping-particle&quot;: &quot;&quot;, &quot;non-dropping-particle&quot;: &quot;&quot;}], &quot;issued&quot;: {&quot;date-parts&quot;: [[2024]]}, &quot;URL&quot;: &quot;http://arxiv.org/abs/2402.17944&quot;, &quot;type&quot;: &quot;article-journal&quot;, &quot;title&quot;: &quot;Large language models (LLMs) on tabular data: Prediction, generation, and understanding. A survey&quot;, &quot;container-title&quot;: &quot;Transactions on Machine Learning Research&quot;, &quot;id&quot;: &quot;ITEM-5007b438-b37f-541e-8fca-2748edacc281&quot;, &quot;container-title-short&quot;: &quot;&quot;}, &quot;isTemporary&quot;: false}]}, {&quot;citationID&quot;: &quot;MENDELEY_CITATION_b8a39a3f-a553-491e-8e13-626f7e96b658&quot;, &quot;properties&quot;: {&quot;noteIndex&quot;: 0}, &quot;isEdited&quot;: false, &quot;manualOverride&quot;: {&quot;isManuallyOverridden&quot;: true, &quot;citeprocText&quot;: &quot;(Fernández et al., 2025)&quot;, &quot;manualOverrideText&quot;: &quot;Fernández et al. (2025)&quot;}, &quot;citationItems&quot;: [{&quot;id&quot;: &quot;ITEM-6e797b0e-8270-559d-850f-c5042d0b3d16&quot;, &quot;itemData&quot;: {&quot;author&quot;: [{&quot;family&quot;: &quot;Fernández&quot;, &quot;given&quot;: &quot;J. M.&quot;, &quot;parse-names&quot;: false, &quot;dropping-particle&quot;: &quot;&quot;, &quot;non-dropping-particle&quot;: &quot;&quot;}, {&quot;family&quot;: &quot;Petrocelli&quot;, &quot;given&quot;: &quot;D. M.&quot;, &quot;parse-names&quot;: false, &quot;dropping-particle&quot;: &quot;&quot;, &quot;non-dropping-particle&quot;: &quot;&quot;}, {&quot;family&quot;: &quot;Matuk&quot;, &quot;given&quot;: &quot;R.&quot;, &quot;parse-names&quot;: false, &quot;dropping-particle&quot;: &quot;&quot;, &quot;non-dropping-particle&quot;: &quot;&quot;}, {&quot;family&quot;: &quot;Lanson&quot;, &quot;given&quot;: &quot;D.&quot;, &quot;parse-names&quot;: false, &quot;dropping-particle&quot;: &quot;&quot;, &quot;non-dropping-particle&quot;: &quot;&quot;}, {&quot;family&quot;: &quot;Zamudio&quot;, &quot;given&quot;: &quot;E.&quot;, &quot;parse-names&quot;: false, &quot;dropping-particle&quot;: &quot;&quot;, &quot;non-dropping-particle&quot;: &quot;&quot;}, {&quot;family&quot;: &quot;Cagnina&quot;, &quot;given&quot;: &quot;L. C.&quot;, &quot;parse-names&quot;: false, &quot;dropping-particle&quot;: &quot;&quot;, &quot;non-dropping-particle&quot;: &quot;&quot;}, {&quot;family&quot;: &quot;Gil Costa&quot;, &quot;given&quot;: &quot;G. V.&quot;, &quot;parse-names&quot;: false, &quot;dropping-particle&quot;: &quot;&quot;, &quot;non-dropping-particle&quot;: &quot;&quot;}, {&quot;family&quot;: &quot;Errecalde&quot;, &quot;given&quot;: &quot;M. L.&quot;, &quot;parse-names&quot;: false, &quot;dropping-particle&quot;: &quot;&quot;, &quot;non-dropping-particle&quot;: &quot;&quot;}], &quot;issued&quot;: {&quot;date-parts&quot;: [[2025]]}, &quot;URL&quot;: &quot;http://sedici.unlp.edu.ar/handle/10915/183892&quot;, &quot;type&quot;: &quot;paper-conference&quot;, &quot;title&quot;: &quot;Fine-tuning y adaptación de modelos de lenguaje abiertos en infraestructura HPC para aplicaciones de dominio específico&quot;, &quot;container-title&quot;: &quot;Libro de actas del XXVII Workshop de Investigadores en Ciencias de la Computación&quot;, &quot;page&quot;: &quot;72-76&quot;, &quot;publisher&quot;: &quot;Red de Universidades con Carreras en Informática&quot;, &quot;id&quot;: &quot;ITEM-6e797b0e-8270-559d-850f-c5042d0b3d16&quot;, &quot;container-title-short&quot;: &quot;&quot;}, &quot;isTemporary&quot;: false}]}, {&quot;citationID&quot;: &quot;MENDELEY_CITATION_5d59d7ae-a8e9-4621-a4a5-1dc7aac72b2e&quot;, &quot;properties&quot;: {&quot;noteIndex&quot;: 0}, &quot;isEdited&quot;: false, &quot;manualOverride&quot;: {&quot;isManuallyOverridden&quot;: true, &quot;citeprocText&quot;: &quot;(Fernández et al., 2025)&quot;, &quot;manualOverrideText&quot;: &quot;Fernández et al. (2025)&quot;}, &quot;citationItems&quot;: [{&quot;id&quot;: &quot;ITEM-6e797b0e-8270-559d-850f-c5042d0b3d16&quot;, &quot;itemData&quot;: {&quot;author&quot;: [{&quot;family&quot;: &quot;Fernández&quot;, &quot;given&quot;: &quot;J. M.&quot;, &quot;parse-names&quot;: false, &quot;dropping-particle&quot;: &quot;&quot;, &quot;non-dropping-particle&quot;: &quot;&quot;}, {&quot;family&quot;: &quot;Petrocelli&quot;, &quot;given&quot;: &quot;D. M.&quot;, &quot;parse-names&quot;: false, &quot;dropping-particle&quot;: &quot;&quot;, &quot;non-dropping-particle&quot;: &quot;&quot;}, {&quot;family&quot;: &quot;Matuk&quot;, &quot;given&quot;: &quot;R.&quot;, &quot;parse-names&quot;: false, &quot;dropping-particle&quot;: &quot;&quot;, &quot;non-dropping-particle&quot;: &quot;&quot;}, {&quot;family&quot;: &quot;Lanson&quot;, &quot;given&quot;: &quot;D.&quot;, &quot;parse-names&quot;: false, &quot;dropping-particle&quot;: &quot;&quot;, &quot;non-dropping-particle&quot;: &quot;&quot;}, {&quot;family&quot;: &quot;Zamudio&quot;, &quot;given&quot;: &quot;E.&quot;, &quot;parse-names&quot;: false, &quot;dropping-particle&quot;: &quot;&quot;, &quot;non-dropping-particle&quot;: &quot;&quot;}, {&quot;family&quot;: &quot;Cagnina&quot;, &quot;given&quot;: &quot;L. C.&quot;, &quot;parse-names&quot;: false, &quot;dropping-particle&quot;: &quot;&quot;, &quot;non-dropping-particle&quot;: &quot;&quot;}, {&quot;family&quot;: &quot;Gil Costa&quot;, &quot;given&quot;: &quot;G. V.&quot;, &quot;parse-names&quot;: false, &quot;dropping-particle&quot;: &quot;&quot;, &quot;non-dropping-particle&quot;: &quot;&quot;}, {&quot;family&quot;: &quot;Errecalde&quot;, &quot;given&quot;: &quot;M. L.&quot;, &quot;parse-names&quot;: false, &quot;dropping-particle&quot;: &quot;&quot;, &quot;non-dropping-particle&quot;: &quot;&quot;}], &quot;issued&quot;: {&quot;date-parts&quot;: [[2025]]}, &quot;URL&quot;: &quot;http://sedici.unlp.edu.ar/handle/10915/183892&quot;, &quot;type&quot;: &quot;paper-conference&quot;, &quot;title&quot;: &quot;Fine-tuning y adaptación de modelos de lenguaje abiertos en infraestructura HPC para aplicaciones de dominio específico&quot;, &quot;container-title&quot;: &quot;Libro de actas del XXVII Workshop de Investigadores en Ciencias de la Computación&quot;, &quot;page&quot;: &quot;72-76&quot;, &quot;publisher&quot;: &quot;Red de Universidades con Carreras en Informática&quot;, &quot;id&quot;: &quot;ITEM-6e797b0e-8270-559d-850f-c5042d0b3d16&quot;, &quot;container-title-short&quot;: &quot;&quot;}, &quot;isTemporary&quot;: false}]}, {&quot;citationID&quot;: &quot;MENDELEY_CITATION_5057babf-c197-4020-a344-785719ce3410&quot;, &quot;properties&quot;: {&quot;noteIndex&quot;: 0}, &quot;isEdited&quot;: false, &quot;manualOverride&quot;: {&quot;isManuallyOverridden&quot;: true, &quot;citeprocText&quot;: &quot;(Ramos-Rivera et al., 2025)&quot;, &quot;manualOverrideText&quot;: &quot;Ramos-Rivera et al. (2025)&quot;}, &quot;citationItems&quot;: [{&quot;id&quot;: &quot;ITEM-9143f651-ed9a-563c-92fe-37d934b09213&quot;, &quot;itemData&quot;: {&quot;author&quot;: [{&quot;family&quot;: &quot;Ramos-Rivera&quot;, &quot;given&quot;: &quot;R. E.&quot;, &quot;parse-names&quot;: false, &quot;dropping-particle&quot;: &quot;&quot;, &quot;non-dropping-particle&quot;: &quot;&quot;}, {&quot;family&quot;: &quot;Santana Mancilla&quot;, &quot;given&quot;: &quot;P. C.&quot;, &quot;parse-names&quot;: false, &quot;dropping-particle&quot;: &quot;&quot;, &quot;non-dropping-particle&quot;: &quot;&quot;}, {&quot;family&quot;: &quot;García-Mancilla&quot;, &quot;given&quot;: &quot;J.&quot;, &quot;parse-names&quot;: false, &quot;dropping-particle&quot;: &quot;&quot;, &quot;non-dropping-particle&quot;: &quot;&quot;}, {&quot;family&quot;: &quot;Gaytán-Lugo&quot;, &quot;given&quot;: &quot;L. S.&quot;, &quot;parse-names&quot;: false, &quot;dropping-particle&quot;: &quot;&quot;, &quot;non-dropping-particle&quot;: &quot;&quot;}], &quot;issued&quot;: {&quot;date-parts&quot;: [[2025]]}, &quot;DOI&quot;: &quot;10.29105/innoacad.v1i2.36&quot;, &quot;type&quot;: &quot;article-journal&quot;, &quot;title&quot;: &quot;Modelos de lenguaje en educación: inteligencia artificial generativa para optimizar el análisis del desempeño docente&quot;, &quot;container-title&quot;: &quot;Innovación Académica, Universidad Autónoma de Nuevo León&quot;, &quot;volume&quot;: &quot;1&quot;, &quot;issue&quot;: &quot;2&quot;, &quot;page&quot;: &quot;70-81&quot;, &quot;id&quot;: &quot;ITEM-9143f651-ed9a-563c-92fe-37d934b09213&quot;, &quot;container-title-short&quot;: &quot;&quot;}, &quot;isTemporary&quot;: false}]}, {&quot;citationID&quot;: &quot;MENDELEY_CITATION_fe44de18-ca0f-4d86-be0d-36f842a4ef9e&quot;, &quot;properties&quot;: {&quot;noteIndex&quot;: 0}, &quot;isEdited&quot;: false, &quot;manualOverride&quot;: {&quot;isManuallyOverridden&quot;: true, &quot;citeprocText&quot;: &quot;(Millán Gordillo, 2025)&quot;, &quot;manualOverrideText&quot;: &quot;Millán Gordillo (2025)&quot;}, &quot;citationItems&quot;: [{&quot;id&quot;: &quot;ITEM-d048a752-48c5-509f-92fd-95097e22963d&quot;, &quot;itemData&quot;: {&quot;author&quot;: [{&quot;family&quot;: &quot;Millán Gordillo&quot;, &quot;given&quot;: &quot;M.&quot;, &quot;parse-names&quot;: false, &quot;dropping-particle&quot;: &quot;&quot;, &quot;non-dropping-particle&quot;: &quot;&quot;}], &quot;issued&quot;: {&quot;date-parts&quot;: [[2025]]}, &quot;URL&quot;: &quot;https://repositorio.uloyola.es/bitstream/handle/20.500.12412/6735/TFM%20Mar%C3%ADa%20Mill%C3%A1n.pdf&quot;, &quot;type&quot;: &quot;thesis&quot;, &quot;title&quot;: &quot;Estudio comparativo de sistemas de recomendación mediante filtrado colaborativo, basado en contenido y propuestas híbridas&quot;, &quot;genre&quot;: &quot;Tesis de maestría&quot;, &quot;publisher&quot;: &quot;Universidad Loyola Andalucía&quot;, &quot;id&quot;: &quot;ITEM-d048a752-48c5-509f-92fd-95097e22963d&quot;, &quot;container-title-short&quot;: &quot;&quot;}, &quot;isTemporary&quot;: false}]}, {&quot;citationID&quot;: &quot;MENDELEY_CITATION_b6ac99a4-b72b-4490-b1d0-71781d5a99de&quot;, &quot;properties&quot;: {&quot;noteIndex&quot;: 0}, &quot;isEdited&quot;: false, &quot;manualOverride&quot;: {&quot;isManuallyOverridden&quot;: true, &quot;citeprocText&quot;: &quot;(Martínez Sixto et al., 2025)&quot;, &quot;manualOverrideText&quot;: &quot;Martínez Sixto et al. (2025)&quot;}, &quot;citationItems&quot;: [{&quot;id&quot;: &quot;ITEM-e9427164-f851-5ff7-a1c3-eb7ce5a7d720&quot;, &quot;itemData&quot;: {&quot;author&quot;: [{&quot;family&quot;: &quot;Martínez Sixto&quot;, &quot;given&quot;: &quot;L.&quot;, &quot;parse-names&quot;: false, &quot;dropping-particle&quot;: &quot;&quot;, &quot;non-dropping-particle&quot;: &quot;&quot;}, {&quot;family&quot;: &quot;Fernández y Fernández&quot;, &quot;given&quot;: &quot;C. A.&quot;, &quot;parse-names&quot;: false, &quot;dropping-particle&quot;: &quot;&quot;, &quot;non-dropping-particle&quot;: &quot;&quot;}, {&quot;family&quot;: &quot;Millán Hernández&quot;, &quot;given&quot;: &quot;C. E.&quot;, &quot;parse-names&quot;: false, &quot;dropping-particle&quot;: &quot;&quot;, &quot;non-dropping-particle&quot;: &quot;&quot;}], &quot;issued&quot;: {&quot;date-parts&quot;: [[2025]]}, &quot;DOI&quot;: &quot;10.36825/riti.13.31.007&quot;, &quot;type&quot;: &quot;article-journal&quot;, &quot;title&quot;: &quot;Comparación del desempeño de LLMs en la generación de diagramas de clases UML mediante un sistema RAG&quot;, &quot;container-title&quot;: &quot;Revista de Investigación en Tecnologías de la Información&quot;, &quot;volume&quot;: &quot;13&quot;, &quot;issue&quot;: &quot;31&quot;, &quot;page&quot;: &quot;64-79&quot;, &quot;id&quot;: &quot;ITEM-e9427164-f851-5ff7-a1c3-eb7ce5a7d720&quot;, &quot;container-title-short&quot;: &quot;&quot;}, &quot;isTemporary&quot;: false}]}, {&quot;citationID&quot;: &quot;MENDELEY_CITATION_fc15163a-a6ea-4921-9fd5-cf4fc4a94780&quot;, &quot;properties&quot;: {&quot;noteIndex&quot;: 0}, &quot;isEdited&quot;: false, &quot;manualOverride&quot;: {&quot;isManuallyOverridden&quot;: true, &quot;citeprocText&quot;: &quot;(Cisneros-Bravo et al., 2023)&quot;, &quot;manualOverrideText&quot;: &quot;Cisneros-Bravo et al. (2023)&quot;}, &quot;citationItems&quot;: [{&quot;id&quot;: &quot;ITEM-2c1f70fd-8745-538a-b99f-18d256f44b4f&quot;, &quot;itemData&quot;: {&quot;author&quot;: [{&quot;family&quot;: &quot;Cisneros-Bravo&quot;, &quot;given&quot;: &quot;B. E.&quot;, &quot;parse-names&quot;: false, &quot;dropping-particle&quot;: &quot;&quot;, &quot;non-dropping-particle&quot;: &quot;&quot;}, {&quot;family&quot;: &quot;Rodríguez-Aguilar&quot;, &quot;given&quot;: &quot;R. M.&quot;, &quot;parse-names&quot;: false, &quot;dropping-particle&quot;: &quot;&quot;, &quot;non-dropping-particle&quot;: &quot;&quot;}, {&quot;family&quot;: &quot;Niño-Membrillo&quot;, &quot;given&quot;: &quot;Y. E.&quot;, &quot;parse-names&quot;: false, &quot;dropping-particle&quot;: &quot;&quot;, &quot;non-dropping-particle&quot;: &quot;&quot;}, {&quot;family&quot;: &quot;Cuevas-Rasgado&quot;, &quot;given&quot;: &quot;A. D.&quot;, &quot;parse-names&quot;: false, &quot;dropping-particle&quot;: &quot;&quot;, &quot;non-dropping-particle&quot;: &quot;&quot;}], &quot;issued&quot;: {&quot;date-parts&quot;: [[2023]]}, &quot;DOI&quot;: &quot;10.23913/ride.v14i27.1715&quot;, &quot;type&quot;: &quot;article-journal&quot;, &quot;title&quot;: &quot;Falta de orientación vocacional como factor en la deserción universitaria. Caso de estudio: zona Oriente del Estado de México&quot;, &quot;container-title&quot;: &quot;RIDE Revista Iberoamericana para la Investigación y el Desarrollo Educativo&quot;, &quot;volume&quot;: &quot;14&quot;, &quot;issue&quot;: &quot;27&quot;, &quot;id&quot;: &quot;ITEM-2c1f70fd-8745-538a-b99f-18d256f44b4f&quot;, &quot;container-title-short&quot;: &quot;&quot;}, &quot;isTemporary&quot;: false}]}, {&quot;citationID&quot;: &quot;MENDELEY_CITATION_83753edf-b524-4bb6-89f3-c2b7e2876fac&quot;, &quot;properties&quot;: {&quot;noteIndex&quot;: 0}, &quot;isEdited&quot;: false, &quot;manualOverride&quot;: {&quot;isManuallyOverridden&quot;: true, &quot;citeprocText&quot;: &quot;(Carballo-Mendívil et al., 2025)&quot;, &quot;manualOverrideText&quot;: &quot;Carballo-Mendívil et al. (2025)&quot;}, &quot;citationItems&quot;: [{&quot;id&quot;: &quot;ITEM-4755bb51-baf5-5536-8cda-5af1c04a59c8&quot;, &quot;itemData&quot;: {&quot;author&quot;: [{&quot;family&quot;: &quot;Carballo-Mendívil&quot;, &quot;given&quot;: &quot;B.&quot;, &quot;parse-names&quot;: false, &quot;dropping-particle&quot;: &quot;&quot;, &quot;non-dropping-particle&quot;: &quot;&quot;}, {&quot;family&quot;: &quot;Arellano-González&quot;, &quot;given&quot;: &quot;A.&quot;, &quot;parse-names&quot;: false, &quot;dropping-particle&quot;: &quot;&quot;, &quot;non-dropping-particle&quot;: &quot;&quot;}, {&quot;family&quot;: &quot;Ríos-Vázquez&quot;, &quot;given&quot;: &quot;N. J.&quot;, &quot;parse-names&quot;: false, &quot;dropping-particle&quot;: &quot;&quot;, &quot;non-dropping-particle&quot;: &quot;&quot;}, {&quot;family&quot;: &quot;Lizardi-Duarte&quot;, &quot;given&quot;: &quot;M. del P.&quot;, &quot;parse-names&quot;: false, &quot;dropping-particle&quot;: &quot;&quot;, &quot;non-dropping-particle&quot;: &quot;&quot;}], &quot;issued&quot;: {&quot;date-parts&quot;: [[2025]]}, &quot;DOI&quot;: &quot;10.3390/app15169202&quot;, &quot;type&quot;: &quot;article-journal&quot;, &quot;title&quot;: &quot;Predicting student dropout from day one: XGBoost-based early warning system using pre-enrollment data&quot;, &quot;container-title&quot;: &quot;Applied Sciences&quot;, &quot;volume&quot;: &quot;15&quot;, &quot;issue&quot;: &quot;16&quot;, &quot;page&quot;: &quot;9202&quot;, &quot;id&quot;: &quot;ITEM-4755bb51-baf5-5536-8cda-5af1c04a59c8&quot;, &quot;container-title-short&quot;: &quot;&quot;}, &quot;isTemporary&quot;: false}]}, {&quot;citationID&quot;: &quot;MENDELEY_CITATION_634ce56f-62fe-49fa-bfeb-d6e2d736479b&quot;, &quot;properties&quot;: {&quot;noteIndex&quot;: 0}, &quot;isEdited&quot;: false, &quot;manualOverride&quot;: {&quot;isManuallyOverridden&quot;: true, &quot;citeprocText&quot;: &quot;(Marroquin Balarezo et al., 2024)&quot;, &quot;manualOverrideText&quot;: &quot;Marroquin Balarezo et al. (2024)&quot;}, &quot;citationItems&quot;: [{&quot;id&quot;: &quot;ITEM-134638ce-38e8-5ef9-b94c-3755a5e14dbc&quot;, &quot;itemData&quot;: {&quot;author&quot;: [{&quot;family&quot;: &quot;Marroquin Balarezo&quot;, &quot;given&quot;: &quot;M. P.&quot;, &quot;parse-names&quot;: false, &quot;dropping-particle&quot;: &quot;&quot;, &quot;non-dropping-particle&quot;: &quot;&quot;}, {&quot;family&quot;: &quot;Ambia Hurtado&quot;, &quot;given&quot;: &quot;W. A.&quot;, &quot;parse-names&quot;: false, &quot;dropping-particle&quot;: &quot;&quot;, &quot;non-dropping-particle&quot;: &quot;&quot;}, {&quot;family&quot;: &quot;Gutierrez Churata&quot;, &quot;given&quot;: &quot;H. F.&quot;, &quot;parse-names&quot;: false, &quot;dropping-particle&quot;: &quot;&quot;, &quot;non-dropping-particle&quot;: &quot;&quot;}, {&quot;family&quot;: &quot;Salcedo Atiquipa&quot;, &quot;given&quot;: &quot;E. F.&quot;, &quot;parse-names&quot;: false, &quot;dropping-particle&quot;: &quot;&quot;, &quot;non-dropping-particle&quot;: &quot;&quot;}, {&quot;family&quot;: &quot;Tipiana Felix&quot;, &quot;given&quot;: &quot;R. E.&quot;, &quot;parse-names&quot;: false, &quot;dropping-particle&quot;: &quot;&quot;, &quot;non-dropping-particle&quot;: &quot;&quot;}], &quot;issued&quot;: {&quot;date-parts&quot;: [[2024]]}, &quot;URL&quot;: &quot;http://hdl.handle.net/10757/684330&quot;, &quot;type&quot;: &quot;thesis&quot;, &quot;title&quot;: &quot;Diseño de un asistente inteligente RAG para la Comisión de Eliminación de Barreras Burocráticas de INDECOPI-2024&quot;, &quot;genre&quot;: &quot;Tesis de maestría&quot;, &quot;publisher&quot;: &quot;Universidad Peruana de Ciencias Aplicadas&quot;, &quot;id&quot;: &quot;ITEM-134638ce-38e8-5ef9-b94c-3755a5e14dbc&quot;, &quot;container-title-short&quot;: &quot;&quot;}, &quot;isTemporary&quot;: false}]}, {&quot;citationID&quot;: &quot;MENDELEY_CITATION_768d30fc-baeb-41e5-ae8a-7812792bbc66&quot;, &quot;properties&quot;: {&quot;noteIndex&quot;: 0}, &quot;isEdited&quot;: false, &quot;manualOverride&quot;: {&quot;isManuallyOverridden&quot;: true, &quot;citeprocText&quot;: &quot;(Yataco Cañari y Jacha Rojas, 2024)&quot;, &quot;manualOverrideText&quot;: &quot;Yataco Cañari y Jacha Rojas (2024)&quot;}, &quot;citationItems&quot;: [{&quot;id&quot;: &quot;ITEM-02ada8e7-47d2-5940-ab09-a30ce56e4fb6&quot;, &quot;itemData&quot;: {&quot;author&quot;: [{&quot;family&quot;: &quot;Yataco Cañari&quot;, &quot;given&quot;: &quot;W.&quot;, &quot;parse-names&quot;: false, &quot;dropping-particle&quot;: &quot;&quot;, &quot;non-dropping-particle&quot;: &quot;&quot;}, {&quot;family&quot;: &quot;Jacha Rojas&quot;, &quot;given&quot;: &quot;J. P.&quot;, &quot;parse-names&quot;: false, &quot;dropping-particle&quot;: &quot;&quot;, &quot;non-dropping-particle&quot;: &quot;&quot;}], &quot;issued&quot;: {&quot;date-parts&quot;: [[2024]]}, &quot;URL&quot;: &quot;https://hdl.handle.net/20.500.12840/7597&quot;, &quot;type&quot;: &quot;thesis&quot;, &quot;title&quot;: &quot;Modelo machine learning para predicción de deserción estudiantil&quot;, &quot;genre&quot;: &quot;Trabajo académico de segunda especialidad&quot;, &quot;publisher&quot;: &quot;Universidad Peruana Unión&quot;, &quot;id&quot;: &quot;ITEM-02ada8e7-47d2-5940-ab09-a30ce56e4fb6&quot;, &quot;container-title-short&quot;: &quot;&quot;}, &quot;isTemporary&quot;: false}]}, {&quot;citationID&quot;: &quot;MENDELEY_CITATION_1dfbd422-0869-4c95-beb4-73a8f13b9673&quot;, &quot;properties&quot;: {&quot;noteIndex&quot;: 0}, &quot;isEdited&quot;: false, &quot;manualOverride&quot;: {&quot;isManuallyOverridden&quot;: true, &quot;citeprocText&quot;: &quot;(Guadalupe Mori, 2025)&quot;, &quot;manualOverrideText&quot;: &quot;Guadalupe Mori (2025)&quot;}, &quot;citationItems&quot;: [{&quot;id&quot;: &quot;ITEM-745e87b9-5edd-56c2-99e9-42f2290e8c38&quot;, &quot;itemData&quot;: {&quot;author&quot;: [{&quot;family&quot;: &quot;Guadalupe Mori&quot;, &quot;given&quot;: &quot;V. H.&quot;, &quot;parse-names&quot;: false, &quot;dropping-particle&quot;: &quot;&quot;, &quot;non-dropping-particle&quot;: &quot;&quot;}], &quot;issued&quot;: {&quot;date-parts&quot;: [[2025]]}, &quot;URL&quot;: &quot;https://hdl.handle.net/20.500.13084/10839&quot;, &quot;type&quot;: &quot;thesis&quot;, &quot;title&quot;: &quot;Modelo predictivo basado en machine learning para la reducción de la deserción estudiantil en las universidades privadas del Perú: caso Universidad Privada San Juan Bautista&quot;, &quot;genre&quot;: &quot;Tesis doctoral&quot;, &quot;publisher&quot;: &quot;Universidad Nacional Federico Villarreal&quot;, &quot;id&quot;: &quot;ITEM-745e87b9-5edd-56c2-99e9-42f2290e8c38&quot;, &quot;container-title-short&quot;: &quot;&quot;}, &quot;isTemporary&quot;: false}]}, {&quot;citationID&quot;: &quot;MENDELEY_CITATION_05cd8854-7f1e-4fe8-bf6c-1f06cdd4fedf&quot;, &quot;properties&quot;: {&quot;noteIndex&quot;: 0}, &quot;isEdited&quot;: false, &quot;manualOverride&quot;: {&quot;isManuallyOverridden&quot;: true, &quot;citeprocText&quot;: &quot;(Rodas Zegarra de Escalante, 2024)&quot;, &quot;manualOverrideText&quot;: &quot;Rodas Zegarra de Escalante (2024)&quot;}, &quot;citationItems&quot;: [{&quot;id&quot;: &quot;ITEM-297823cb-c975-5def-8698-5545884294cd&quot;, &quot;itemData&quot;: {&quot;author&quot;: [{&quot;family&quot;: &quot;Rodas Zegarra de Escalante&quot;, &quot;given&quot;: &quot;A.&quot;, &quot;parse-names&quot;: false, &quot;dropping-particle&quot;: &quot;&quot;, &quot;non-dropping-particle&quot;: &quot;&quot;}], &quot;issued&quot;: {&quot;date-parts&quot;: [[2024]]}, &quot;URL&quot;: &quot;https://hdl.handle.net/20.500.12692/150276&quot;, &quot;type&quot;: &quot;thesis&quot;, &quot;title&quot;: &quot;Orientación vocacional y deserción universitaria en una universidad de Lima - 2024&quot;, &quot;genre&quot;: &quot;Tesis de maestría&quot;, &quot;publisher&quot;: &quot;Universidad César Vallejo&quot;, &quot;id&quot;: &quot;ITEM-297823cb-c975-5def-8698-5545884294cd&quot;, &quot;container-title-short&quot;: &quot;&quot;}, &quot;isTemporary&quot;: false}]}, {&quot;citationID&quot;: &quot;MENDELEY_CITATION_a124bf84-de92-4faa-9f8c-74102a36ef66&quot;, &quot;properties&quot;: {&quot;noteIndex&quot;: 0}, &quot;isEdited&quot;: false, &quot;manualOverride&quot;: {&quot;isManuallyOverridden&quot;: true, &quot;citeprocText&quot;: &quot;(Velasquez Velasquez, 2023)&quot;, &quot;manualOverrideText&quot;: &quot;Velasquez Velasquez (2023)&quot;}, &quot;citationItems&quot;: [{&quot;id&quot;: &quot;ITEM-051a1e9e-f6d9-5b1f-b8af-a7a21172dd72&quot;, &quot;itemData&quot;: {&quot;author&quot;: [{&quot;family&quot;: &quot;Velasquez Velasquez&quot;, &quot;given&quot;: &quot;S. D.&quot;, &quot;parse-names&quot;: false, &quot;dropping-particle&quot;: &quot;&quot;, &quot;non-dropping-particle&quot;: &quot;&quot;}], &quot;issued&quot;: {&quot;date-parts&quot;: [[2023]]}, &quot;URL&quot;: &quot;http://hdl.handle.net/20.500.12423/6921&quot;, &quot;type&quot;: &quot;thesis&quot;, &quot;title&quot;: &quot;La inteligencia artificial aplicada al sector educativo: una revisión sistemática de la literatura&quot;, &quot;genre&quot;: &quot;Trabajo de investigación de bachiller&quot;, &quot;publisher&quot;: &quot;Universidad Católica Santo Toribio de Mogrovejo&quot;, &quot;id&quot;: &quot;ITEM-051a1e9e-f6d9-5b1f-b8af-a7a21172dd72&quot;, &quot;container-title-short&quot;: &quot;&quot;}, &quot;isTemporary&quot;: false}]}, {&quot;citationID&quot;: &quot;MENDELEY_CITATION_2d0dd3e8-f997-4358-8825-0a35bacb1f5a&quot;, &quot;properties&quot;: {&quot;noteIndex&quot;: 0}, &quot;isEdited&quot;: false, &quot;manualOverride&quot;: {&quot;isManuallyOverridden&quot;: true, &quot;citeprocText&quot;: &quot;(Rodríguez Chipana, 2023)&quot;, &quot;manualOverrideText&quot;: &quot;Rodríguez Chipana (2023)&quot;}, &quot;citationItems&quot;: [{&quot;id&quot;: &quot;ITEM-58b6c010-e169-5596-822d-32c0b401cede&quot;, &quot;itemData&quot;: {&quot;author&quot;: [{&quot;family&quot;: &quot;Rodríguez Chipana&quot;, &quot;given&quot;: &quot;Y. M.&quot;, &quot;parse-names&quot;: false, &quot;dropping-particle&quot;: &quot;&quot;, &quot;non-dropping-particle&quot;: &quot;&quot;}], &quot;issued&quot;: {&quot;date-parts&quot;: [[2023]]}, &quot;URL&quot;: &quot;https://hdl.handle.net/20.500.12990/13324&quot;, &quot;type&quot;: &quot;thesis&quot;, &quot;title&quot;: &quot;Inteligencia artificial y rendimiento académico de los estudiantes de educación superior en la región Puno, 2022&quot;, &quot;genre&quot;: &quot;Tesis de maestría&quot;, &quot;publisher&quot;: &quot;Universidad Alas Peruanas&quot;, &quot;id&quot;: &quot;ITEM-58b6c010-e169-5596-822d-32c0b401cede&quot;, &quot;container-title-short&quot;: &quot;&quot;}, &quot;isTemporary&quot;: false}]}, {&quot;citationID&quot;: &quot;MENDELEY_CITATION_faa56043-f750-4248-a9fa-030814ae4d47&quot;, &quot;properties&quot;: {&quot;noteIndex&quot;: 0}, &quot;isEdited&quot;: false, &quot;manualOverride&quot;: {&quot;isManuallyOverridden&quot;: false, &quot;citeprocText&quot;: &quot;(Ferreyra et al., 2017)&quot;, &quot;manualOverrideText&quot;: &quot;&quot;}, &quot;citationItems&quot;: [{&quot;id&quot;: &quot;ITEM-a8f89f0e-10eb-5ccf-9b3b-e67a23b9a467&quot;, &quot;itemData&quot;: {&quot;author&quot;: [{&quot;family&quot;: &quot;Ferreyra&quot;, &quot;given&quot;: &quot;M. M.&quot;, &quot;parse-names&quot;: false, &quot;dropping-particle&quot;: &quot;&quot;, &quot;non-dropping-particle&quot;: &quot;&quot;}, {&quot;family&quot;: &quot;Avitabile&quot;, &quot;given&quot;: &quot;C.&quot;, &quot;parse-names&quot;: false, &quot;dropping-particle&quot;: &quot;&quot;, &quot;non-dropping-particle&quot;: &quot;&quot;}, {&quot;family&quot;: &quot;Botero Álvarez&quot;, &quot;given&quot;: &quot;J.&quot;, &quot;parse-names&quot;: false, &quot;dropping-particle&quot;: &quot;&quot;, &quot;non-dropping-particle&quot;: &quot;&quot;}, {&quot;family&quot;: &quot;Haimovich Paz&quot;, &quot;given&quot;: &quot;F.&quot;, &quot;parse-names&quot;: false, &quot;dropping-particle&quot;: &quot;&quot;, &quot;non-dropping-particle&quot;: &quot;&quot;}, {&quot;family&quot;: &quot;Urzúa&quot;, &quot;given&quot;: &quot;S.&quot;, &quot;parse-names&quot;: false, &quot;dropping-particle&quot;: &quot;&quot;, &quot;non-dropping-particle&quot;: &quot;&quot;}], &quot;issued&quot;: {&quot;date-parts&quot;: [[2017]]}, &quot;DOI&quot;: &quot;10.1596/978-1-4648-1014-5&quot;, &quot;type&quot;: &quot;book&quot;, &quot;title&quot;: &quot;Momento decisivo: la educación superior en América Latina y el Caribe&quot;, &quot;publisher&quot;: &quot;Banco Mundial&quot;, &quot;id&quot;: &quot;ITEM-a8f89f0e-10eb-5ccf-9b3b-e67a23b9a467&quot;, &quot;container-title-short&quot;: &quot;&quot;}, &quot;isTemporary&quot;: false}]}, {&quot;citationID&quot;: &quot;MENDELEY_CITATION_d9bf869c-6465-4dd0-b123-d42648734017&quot;, &quot;properties&quot;: {&quot;noteIndex&quot;: 0}, &quot;isEdited&quot;: false, &quot;manualOverride&quot;: {&quot;isManuallyOverridden&quot;: true, &quot;citeprocText&quot;: &quot;(Escalante López et al., 2023)&quot;, &quot;manualOverrideText&quot;: &quot;(Behr et al., 2020, como se citó en Escalante López et al., 2023)&quot;}, &quot;citationItems&quot;: [{&quot;id&quot;: &quot;ITEM-04a17615-a429-5a99-899e-3433dd572883&quot;, &quot;itemData&quot;: {&quot;author&quot;: [{&quot;family&quot;: &quot;Escalante López&quot;, &quot;given&quot;: &quot;J. I.&quot;, &quot;parse-names&quot;: false, &quot;dropping-particle&quot;: &quot;&quot;, &quot;non-dropping-particle&quot;: &quot;&quot;}, {&quot;family&quot;: &quot;Medina Valderrama&quot;, &quot;given&quot;: &quot;C. J.&quot;, &quot;parse-names&quot;: false, &quot;dropping-particle&quot;: &quot;&quot;, &quot;non-dropping-particle&quot;: &quot;&quot;}, {&quot;family&quot;: &quot;Vásquez Muñoz&quot;, &quot;given&quot;: &quot;A.&quot;, &quot;parse-names&quot;: false, &quot;dropping-particle&quot;: &quot;&quot;, &quot;non-dropping-particle&quot;: &quot;&quot;}], &quot;issued&quot;: {&quot;date-parts&quot;: [[2023]]}, &quot;DOI&quot;: &quot;10.26495/rch.v7i1.2421&quot;, &quot;type&quot;: &quot;article-journal&quot;, &quot;title&quot;: &quot;La deserción universitaria: un problema no resuelto en el Perú&quot;, &quot;container-title&quot;: &quot;Hacedor - AIAPÆC&quot;, &quot;volume&quot;: &quot;7&quot;, &quot;issue&quot;: &quot;1&quot;, &quot;page&quot;: &quot;60-72&quot;, &quot;id&quot;: &quot;ITEM-04a17615-a429-5a99-899e-3433dd572883&quot;, &quot;container-title-short&quot;: &quot;&quot;}, &quot;isTemporary&quot;: false}]}, {&quot;citationID&quot;: &quot;MENDELEY_CITATION_f78162d5-ad28-4739-84ac-771c1c2bf0e3&quot;, &quot;properties&quot;: {&quot;noteIndex&quot;: 0}, &quot;isEdited&quot;: false, &quot;manualOverride&quot;: {&quot;isManuallyOverridden&quot;: false, &quot;citeprocText&quot;: &quot;(Superintendencia Nacional de Educación Superior Universitaria, 2020)&quot;, &quot;manualOverrideText&quot;: &quot;&quot;}, &quot;citationItems&quot;: [{&quot;id&quot;: &quot;ITEM-a2cb132e-528c-5815-9af3-ec6970dc84a9&quot;, &quot;itemData&quot;: {&quot;author&quot;: [{&quot;literal&quot;: &quot;Superintendencia Nacional de Educación Superior Universitaria&quot;}], &quot;issued&quot;: {&quot;date-parts&quot;: [[2020]]}, &quot;URL&quot;: &quot;https://hdl.handle.net/20.500.12799/6911&quot;, &quot;type&quot;: &quot;book&quot;, &quot;title&quot;: &quot;II Informe bienal sobre la realidad universitaria en el Perú&quot;, &quot;publisher&quot;: &quot;SUNEDU&quot;, &quot;id&quot;: &quot;ITEM-a2cb132e-528c-5815-9af3-ec6970dc84a9&quot;, &quot;container-title-short&quot;: &quot;&quot;}, &quot;isTemporary&quot;: false}]}, {&quot;citationID&quot;: &quot;MENDELEY_CITATION_987b9027-1ddb-4903-b4de-3c907e4bdd17&quot;, &quot;properties&quot;: {&quot;noteIndex&quot;: 0}, &quot;isEdited&quot;: false, &quot;manualOverride&quot;: {&quot;isManuallyOverridden&quot;: true, &quot;citeprocText&quot;: &quot;(Escalante López et al., 2023)&quot;, &quot;manualOverrideText&quot;: &quot;Escalante López et al. (2023)&quot;}, &quot;citationItems&quot;: [{&quot;id&quot;: &quot;ITEM-04a17615-a429-5a99-899e-3433dd572883&quot;, &quot;itemData&quot;: {&quot;author&quot;: [{&quot;family&quot;: &quot;Escalante López&quot;, &quot;given&quot;: &quot;J. I.&quot;, &quot;parse-names&quot;: false, &quot;dropping-particle&quot;: &quot;&quot;, &quot;non-dropping-particle&quot;: &quot;&quot;}, {&quot;family&quot;: &quot;Medina Valderrama&quot;, &quot;given&quot;: &quot;C. J.&quot;, &quot;parse-names&quot;: false, &quot;dropping-particle&quot;: &quot;&quot;, &quot;non-dropping-particle&quot;: &quot;&quot;}, {&quot;family&quot;: &quot;Vásquez Muñoz&quot;, &quot;given&quot;: &quot;A.&quot;, &quot;parse-names&quot;: false, &quot;dropping-particle&quot;: &quot;&quot;, &quot;non-dropping-particle&quot;: &quot;&quot;}], &quot;issued&quot;: {&quot;date-parts&quot;: [[2023]]}, &quot;DOI&quot;: &quot;10.26495/rch.v7i1.2421&quot;, &quot;type&quot;: &quot;article-journal&quot;, &quot;title&quot;: &quot;La deserción universitaria: un problema no resuelto en el Perú&quot;, &quot;container-title&quot;: &quot;Hacedor - AIAPÆC&quot;, &quot;volume&quot;: &quot;7&quot;, &quot;issue&quot;: &quot;1&quot;, &quot;page&quot;: &quot;60-72&quot;, &quot;id&quot;: &quot;ITEM-04a17615-a429-5a99-899e-3433dd572883&quot;, &quot;container-title-short&quot;: &quot;&quot;}, &quot;isTemporary&quot;: false}]}, {&quot;citationID&quot;: &quot;MENDELEY_CITATION_4ddeaae7-9b96-4a9a-92bc-1e6747bca0b1&quot;, &quot;properties&quot;: {&quot;noteIndex&quot;: 0}, &quot;isEdited&quot;: false, &quot;manualOverride&quot;: {&quot;isManuallyOverridden&quot;: false, &quot;citeprocText&quot;: &quot;(Escobar-Mamani y Cuentas Yupanqui, 2024)&quot;, &quot;manualOverrideText&quot;: &quot;&quot;}, &quot;citationItems&quot;: [{&quot;id&quot;: &quot;ITEM-16534d55-37e8-5587-acfc-b1576f3e003e&quot;, &quot;itemData&quot;: {&quot;author&quot;: [{&quot;family&quot;: &quot;Escobar-Mamani&quot;, &quot;given&quot;: &quot;F.&quot;, &quot;parse-names&quot;: false, &quot;dropping-particle&quot;: &quot;&quot;, &quot;non-dropping-particle&quot;: &quot;&quot;}, {&quot;family&quot;: &quot;Cuentas Yupanqui&quot;, &quot;given&quot;: &quot;S. R.&quot;, &quot;parse-names&quot;: false, &quot;dropping-particle&quot;: &quot;&quot;, &quot;non-dropping-particle&quot;: &quot;&quot;}], &quot;issued&quot;: {&quot;date-parts&quot;: [[2024]]}, &quot;DOI&quot;: &quot;10.70123/jht.7&quot;, &quot;type&quot;: &quot;article-journal&quot;, &quot;title&quot;: &quot;Situación académica de estudiantes con matrícula regular y en riesgo académico en la Universidad Nacional del Altiplano, 2023-II&quot;, &quot;container-title&quot;: &quot;Journal of Humanities Titicaca&quot;, &quot;volume&quot;: &quot;2&quot;, &quot;issue&quot;: &quot;1&quot;, &quot;page&quot;: &quot;66-88&quot;, &quot;id&quot;: &quot;ITEM-16534d55-37e8-5587-acfc-b1576f3e003e&quot;, &quot;container-title-short&quot;: &quot;&quot;}, &quot;isTemporary&quot;: false}]}, {&quot;citationID&quot;: &quot;MENDELEY_CITATION_47dcb13e-bdd0-4722-adfa-0d327abc2daa&quot;, &quot;properties&quot;: {&quot;noteIndex&quot;: 0}, &quot;isEdited&quot;: false, &quot;manualOverride&quot;: {&quot;isManuallyOverridden&quot;: false, &quot;citeprocText&quot;: &quot;(Rodríguez Chipana, 2023)&quot;, &quot;manualOverrideText&quot;: &quot;&quot;}, &quot;citationItems&quot;: [{&quot;id&quot;: &quot;ITEM-58b6c010-e169-5596-822d-32c0b401cede&quot;, &quot;itemData&quot;: {&quot;author&quot;: [{&quot;family&quot;: &quot;Rodríguez Chipana&quot;, &quot;given&quot;: &quot;Y. M.&quot;, &quot;parse-names&quot;: false, &quot;dropping-particle&quot;: &quot;&quot;, &quot;non-dropping-particle&quot;: &quot;&quot;}], &quot;issued&quot;: {&quot;date-parts&quot;: [[2023]]}, &quot;URL&quot;: &quot;https://hdl.handle.net/20.500.12990/13324&quot;, &quot;type&quot;: &quot;thesis&quot;, &quot;title&quot;: &quot;Inteligencia artificial y rendimiento académico de los estudiantes de educación superior en la región Puno, 2022&quot;, &quot;genre&quot;: &quot;Tesis de maestría&quot;, &quot;publisher&quot;: &quot;Universidad Alas Peruanas&quot;, &quot;id&quot;: &quot;ITEM-58b6c010-e169-5596-822d-32c0b401cede&quot;, &quot;container-title-short&quot;: &quot;&quot;}, &quot;isTemporary&quot;: false}]}, {&quot;citationID&quot;: &quot;MENDELEY_CITATION_80a76817-4681-40b0-9225-2afdcb9d5324&quot;, &quot;properties&quot;: {&quot;noteIndex&quot;: 0}, &quot;isEdited&quot;: false, &quot;manualOverride&quot;: {&quot;isManuallyOverridden&quot;: false, &quot;citeprocText&quot;: &quot;(Rodas Zegarra de Escalante, 2024)&quot;, &quot;manualOverrideText&quot;: &quot;&quot;}, &quot;citationItems&quot;: [{&quot;id&quot;: &quot;ITEM-297823cb-c975-5def-8698-5545884294cd&quot;, &quot;itemData&quot;: {&quot;author&quot;: [{&quot;family&quot;: &quot;Rodas Zegarra de Escalante&quot;, &quot;given&quot;: &quot;A.&quot;, &quot;parse-names&quot;: false, &quot;dropping-particle&quot;: &quot;&quot;, &quot;non-dropping-particle&quot;: &quot;&quot;}], &quot;issued&quot;: {&quot;date-parts&quot;: [[2024]]}, &quot;URL&quot;: &quot;https://hdl.handle.net/20.500.12692/150276&quot;, &quot;type&quot;: &quot;thesis&quot;, &quot;title&quot;: &quot;Orientación vocacional y deserción universitaria en una universidad de Lima - 2024&quot;, &quot;genre&quot;: &quot;Tesis de maestría&quot;, &quot;publisher&quot;: &quot;Universidad César Vallejo&quot;, &quot;id&quot;: &quot;ITEM-297823cb-c975-5def-8698-5545884294cd&quot;, &quot;container-title-short&quot;: &quot;&quot;}, &quot;isTemporary&quot;: false}]}, {&quot;citationID&quot;: &quot;MENDELEY_CITATION_e04da67b-5c3a-4b5e-98df-b004280b1d90&quot;, &quot;properties&quot;: {&quot;noteIndex&quot;: 0}, &quot;isEdited&quot;: false, &quot;manualOverride&quot;: {&quot;isManuallyOverridden&quot;: false, &quot;citeprocText&quot;: &quot;(Mann y Whitney, 1947)&quot;, &quot;manualOverrideText&quot;: &quot;&quot;}, &quot;citationItems&quot;: [{&quot;id&quot;: &quot;ITEM-a0bf7f6d-c22f-50eb-b4cf-1a6eaba16e92&quot;, &quot;itemData&quot;: {&quot;author&quot;: [{&quot;family&quot;: &quot;Mann&quot;, &quot;given&quot;: &quot;H. B.&quot;, &quot;parse-names&quot;: false, &quot;dropping-particle&quot;: &quot;&quot;, &quot;non-dropping-particle&quot;: &quot;&quot;}, {&quot;family&quot;: &quot;Whitney&quot;, &quot;given&quot;: &quot;D. R.&quot;, &quot;parse-names&quot;: false, &quot;dropping-particle&quot;: &quot;&quot;, &quot;non-dropping-particle&quot;: &quot;&quot;}], &quot;issued&quot;: {&quot;date-parts&quot;: [[1947]]}, &quot;DOI&quot;: &quot;10.1214/aoms/1177730491&quot;, &quot;type&quot;: &quot;article-journal&quot;, &quot;title&quot;: &quot;On a test of whether one of two random variables is stochastically larger than the other&quot;, &quot;container-title&quot;: &quot;The Annals of Mathematical Statistics&quot;, &quot;volume&quot;: &quot;18&quot;, &quot;issue&quot;: &quot;1&quot;, &quot;page&quot;: &quot;50-60&quot;, &quot;id&quot;: &quot;ITEM-a0bf7f6d-c22f-50eb-b4cf-1a6eaba16e92&quot;, &quot;container-title-short&quot;: &quot;&quot;}, &quot;isTemporary&quot;: false}]}, {&quot;citationID&quot;: &quot;MENDELEY_CITATION_43e20c88-d260-4455-92b6-3d826dd8c189&quot;, &quot;properties&quot;: {&quot;noteIndex&quot;: 0}, &quot;isEdited&quot;: false, &quot;manualOverride&quot;: {&quot;isManuallyOverridden&quot;: false, &quot;citeprocText&quot;: &quot;(Cliff, 1993)&quot;, &quot;manualOverrideText&quot;: &quot;&quot;}, &quot;citationItems&quot;: [{&quot;id&quot;: &quot;ITEM-02d3d39e-1c5a-533a-844d-5bb46c2ecac4&quot;, &quot;itemData&quot;: {&quot;author&quot;: [{&quot;family&quot;: &quot;Cliff&quot;, &quot;given&quot;: &quot;N.&quot;, &quot;parse-names&quot;: false, &quot;dropping-particle&quot;: &quot;&quot;, &quot;non-dropping-particle&quot;: &quot;&quot;}], &quot;issued&quot;: {&quot;date-parts&quot;: [[1993]]}, &quot;DOI&quot;: &quot;10.1037/0033-2909.114.3.494&quot;, &quot;type&quot;: &quot;article-journal&quot;, &quot;title&quot;: &quot;Dominance statistics: Ordinal analyses to answer ordinal questions&quot;, &quot;container-title&quot;: &quot;Psychological Bulletin&quot;, &quot;volume&quot;: &quot;114&quot;, &quot;issue&quot;: &quot;3&quot;, &quot;page&quot;: &quot;494-509&quot;, &quot;id&quot;: &quot;ITEM-02d3d39e-1c5a-533a-844d-5bb46c2ecac4&quot;, &quot;container-title-short&quot;: &quot;&quot;}, &quot;isTemporary&quot;: false}]}, {&quot;citationID&quot;: &quot;MENDELEY_CITATION_6e4beefc-a7f1-4e91-9793-53dd68dd1ee8&quot;, &quot;properties&quot;: {&quot;noteIndex&quot;: 0}, &quot;isEdited&quot;: false, &quot;manualOverride&quot;: {&quot;isManuallyOverridden&quot;: false, &quot;citeprocText&quot;: &quot;(Cramér, 1946)&quot;, &quot;manualOverrideText&quot;: &quot;&quot;}, &quot;citationItems&quot;: [{&quot;id&quot;: &quot;ITEM-8c327639-514d-536d-95ba-80d06d096139&quot;, &quot;itemData&quot;: {&quot;author&quot;: [{&quot;family&quot;: &quot;Cramér&quot;, &quot;given&quot;: &quot;H.&quot;, &quot;parse-names&quot;: false, &quot;dropping-particle&quot;: &quot;&quot;, &quot;non-dropping-particle&quot;: &quot;&quot;}], &quot;issued&quot;: {&quot;date-parts&quot;: [[1946]]}, &quot;DOI&quot;: &quot;10.1515/9781400883868&quot;, &quot;type&quot;: &quot;book&quot;, &quot;title&quot;: &quot;Mathematical methods of statistics&quot;, &quot;publisher&quot;: &quot;Princeton University Press&quot;, &quot;id&quot;: &quot;ITEM-8c327639-514d-536d-95ba-80d06d096139&quot;, &quot;container-title-short&quot;: &quot;&quot;}, &quot;isTemporary&quot;: false}]}, {&quot;citationID&quot;: &quot;MENDELEY_CITATION_a9e8ce77-041e-4fbe-af3e-2901ed20741b&quot;, &quot;properties&quot;: {&quot;noteIndex&quot;: 0}, &quot;isEdited&quot;: false, &quot;manualOverride&quot;: {&quot;isManuallyOverridden&quot;: false, &quot;citeprocText&quot;: &quot;(Hanley y McNeil, 1982)&quot;, &quot;manualOverrideText&quot;: &quot;&quot;}, &quot;citationItems&quot;: [{&quot;id&quot;: &quot;ITEM-ba297aa3-b2fc-5a21-87eb-bc760183eab4&quot;, &quot;itemData&quot;: {&quot;author&quot;: [{&quot;family&quot;: &quot;Hanley&quot;, &quot;given&quot;: &quot;J. A.&quot;, &quot;parse-names&quot;: false, &quot;dropping-particle&quot;: &quot;&quot;, &quot;non-dropping-particle&quot;: &quot;&quot;}, {&quot;family&quot;: &quot;McNeil&quot;, &quot;given&quot;: &quot;B. J.&quot;, &quot;parse-names&quot;: false, &quot;dropping-particle&quot;: &quot;&quot;, &quot;non-dropping-particle&quot;: &quot;&quot;}], &quot;issued&quot;: {&quot;date-parts&quot;: [[1982]]}, &quot;DOI&quot;: &quot;10.1148/radiology.143.1.7063747&quot;, &quot;type&quot;: &quot;article-journal&quot;, &quot;title&quot;: &quot;The meaning and use of the area under a receiver operating characteristic (ROC) curve&quot;, &quot;container-title&quot;: &quot;Radiology&quot;, &quot;volume&quot;: &quot;143&quot;, &quot;issue&quot;: &quot;1&quot;, &quot;page&quot;: &quot;29-36&quot;, &quot;id&quot;: &quot;ITEM-ba297aa3-b2fc-5a21-87eb-bc760183eab4&quot;, &quot;container-title-short&quot;: &quot;&quot;}, &quot;isTemporary&quot;: false}]}, {&quot;citationID&quot;: &quot;MENDELEY_CITATION_c1a58538-8461-4ea1-b8fb-06b556fcfa6f&quot;, &quot;properties&quot;: {&quot;noteIndex&quot;: 0}, &quot;isEdited&quot;: false, &quot;manualOverride&quot;: {&quot;isManuallyOverridden&quot;: false, &quot;citeprocText&quot;: &quot;(Saito y Rehmsmeier, 2015)&quot;, &quot;manualOverrideText&quot;: &quot;&quot;}, &quot;citationItems&quot;: [{&quot;id&quot;: &quot;ITEM-bc916a3b-0d2f-54f4-bce7-658872a179e1&quot;, &quot;itemData&quot;: {&quot;author&quot;: [{&quot;family&quot;: &quot;Saito&quot;, &quot;given&quot;: &quot;T.&quot;, &quot;parse-names&quot;: false, &quot;dropping-particle&quot;: &quot;&quot;, &quot;non-dropping-particle&quot;: &quot;&quot;}, {&quot;family&quot;: &quot;Rehmsmeier&quot;, &quot;given&quot;: &quot;M.&quot;, &quot;parse-names&quot;: false, &quot;dropping-particle&quot;: &quot;&quot;, &quot;non-dropping-particle&quot;: &quot;&quot;}], &quot;issued&quot;: {&quot;date-parts&quot;: [[2015]]}, &quot;DOI&quot;: &quot;10.1371/journal.pone.0118432&quot;, &quot;type&quot;: &quot;article-journal&quot;, &quot;title&quot;: &quot;The precision-recall plot is more informative than the ROC plot when evaluating binary classifiers on imbalanced datasets&quot;, &quot;container-title&quot;: &quot;PLOS ONE&quot;, &quot;volume&quot;: &quot;10&quot;, &quot;issue&quot;: &quot;3&quot;, &quot;page&quot;: &quot;e0118432&quot;, &quot;id&quot;: &quot;ITEM-bc916a3b-0d2f-54f4-bce7-658872a179e1&quot;, &quot;container-title-short&quot;: &quot;&quot;}, &quot;isTemporary&quot;: false}]}, {&quot;citationID&quot;: &quot;MENDELEY_CITATION_fb250e9b-d9ce-40f3-93ad-a648c8b0ec9b&quot;, &quot;properties&quot;: {&quot;noteIndex&quot;: 0}, &quot;isEdited&quot;: false, &quot;manualOverride&quot;: {&quot;isManuallyOverridden&quot;: false, &quot;citeprocText&quot;: &quot;(Zadrozny y Elkan, 2002)&quot;, &quot;manualOverrideText&quot;: &quot;&quot;}, &quot;citationItems&quot;: [{&quot;id&quot;: &quot;ITEM-298cf3e0-fabe-51a7-a6b1-d18f99476527&quot;, &quot;itemData&quot;: {&quot;author&quot;: [{&quot;family&quot;: &quot;Zadrozny&quot;, &quot;given&quot;: &quot;B.&quot;, &quot;parse-names&quot;: false, &quot;dropping-particle&quot;: &quot;&quot;, &quot;non-dropping-particle&quot;: &quot;&quot;}, {&quot;family&quot;: &quot;Elkan&quot;, &quot;given&quot;: &quot;C.&quot;, &quot;parse-names&quot;: false, &quot;dropping-particle&quot;: &quot;&quot;, &quot;non-dropping-particle&quot;: &quot;&quot;}], &quot;issued&quot;: {&quot;date-parts&quot;: [[2002]]}, &quot;DOI&quot;: &quot;10.1145/775047.775151&quot;, &quot;type&quot;: &quot;paper-conference&quot;, &quot;title&quot;: &quot;Transforming classifier scores into accurate multiclass probability estimates&quot;, &quot;container-title&quot;: &quot;Proceedings of the Eighth ACM SIGKDD International Conference on Knowledge Discovery and Data Mining&quot;, &quot;page&quot;: &quot;694-699&quot;, &quot;id&quot;: &quot;ITEM-298cf3e0-fabe-51a7-a6b1-d18f99476527&quot;, &quot;container-title-short&quot;: &quot;&quot;}, &quot;isTemporary&quot;: false}]}, {&quot;citationID&quot;: &quot;MENDELEY_CITATION_618d91c3-1fd4-4f7b-b581-ebd7f0d308df&quot;, &quot;properties&quot;: {&quot;noteIndex&quot;: 0}, &quot;isEdited&quot;: false, &quot;manualOverride&quot;: {&quot;isManuallyOverridden&quot;: false, &quot;citeprocText&quot;: &quot;(Brier, 1950)&quot;, &quot;manualOverrideText&quot;: &quot;&quot;}, &quot;citationItems&quot;: [{&quot;id&quot;: &quot;ITEM-776f22b4-afe8-5194-a1b7-5e15e5c48ed3&quot;, &quot;itemData&quot;: {&quot;author&quot;: [{&quot;family&quot;: &quot;Brier&quot;, &quot;given&quot;: &quot;G. W.&quot;, &quot;parse-names&quot;: false, &quot;dropping-particle&quot;: &quot;&quot;, &quot;non-dropping-particle&quot;: &quot;&quot;}], &quot;issued&quot;: {&quot;date-parts&quot;: [[1950]]}, &quot;DOI&quot;: &quot;10.1175/1520-0493(1950)078&lt;0001:VOFEIT&gt;2.0.CO;2&quot;, &quot;type&quot;: &quot;article-journal&quot;, &quot;title&quot;: &quot;Verification of forecasts expressed in terms of probability&quot;, &quot;container-title&quot;: &quot;Monthly Weather Review&quot;, &quot;volume&quot;: &quot;78&quot;, &quot;issue&quot;: &quot;1&quot;, &quot;page&quot;: &quot;1-3&quot;, &quot;id&quot;: &quot;ITEM-776f22b4-afe8-5194-a1b7-5e15e5c48ed3&quot;, &quot;container-title-short&quot;: &quot;&quot;}, &quot;isTemporary&quot;: false}]}, {&quot;citationID&quot;: &quot;MENDELEY_CITATION_7bf239c8-2a92-4b28-9bb4-83cd84f3acf7&quot;, &quot;properties&quot;: {&quot;noteIndex&quot;: 0}, &quot;isEdited&quot;: false, &quot;manualOverride&quot;: {&quot;isManuallyOverridden&quot;: false, &quot;citeprocText&quot;: &quot;(Lin, 2004)&quot;, &quot;manualOverrideText&quot;: &quot;&quot;}, &quot;citationItems&quot;: [{&quot;id&quot;: &quot;ITEM-4c670ef2-d773-5121-82ef-8d74a63fa86e&quot;, &quot;itemData&quot;: {&quot;author&quot;: [{&quot;family&quot;: &quot;Lin&quot;, &quot;given&quot;: &quot;C.-Y.&quot;, &quot;parse-names&quot;: false, &quot;dropping-particle&quot;: &quot;&quot;, &quot;non-dropping-particle&quot;: &quot;&quot;}], &quot;issued&quot;: {&quot;date-parts&quot;: [[2004]]}, &quot;URL&quot;: &quot;https://aclanthology.org/W04-1013/&quot;, &quot;type&quot;: &quot;paper-conference&quot;, &quot;title&quot;: &quot;ROUGE: A package for automatic evaluation of summaries&quot;, &quot;container-title&quot;: &quot;Text Summarization Branches Out&quot;, &quot;page&quot;: &quot;74-81&quot;, &quot;publisher&quot;: &quot;Association for Computational Linguistics&quot;, &quot;id&quot;: &quot;ITEM-4c670ef2-d773-5121-82ef-8d74a63fa86e&quot;, &quot;container-title-short&quot;: &quot;&quot;}, &quot;isTemporary&quot;: false}]}, {&quot;citationID&quot;: &quot;MENDELEY_CITATION_a907b2cf-0b35-49be-b3fa-cd3c38666fd7&quot;, &quot;properties&quot;: {&quot;noteIndex&quot;: 0}, &quot;isEdited&quot;: false, &quot;manualOverride&quot;: {&quot;isManuallyOverridden&quot;: false, &quot;citeprocText&quot;: &quot;(Zhang et al., 2020)&quot;, &quot;manualOverrideText&quot;: &quot;&quot;}, &quot;citationItems&quot;: [{&quot;id&quot;: &quot;ITEM-b52ef349-b8ca-5686-84a5-ee1e80905b85&quot;, &quot;itemData&quot;: {&quot;author&quot;: [{&quot;family&quot;: &quot;Zhang&quot;, &quot;given&quot;: &quot;T.&quot;, &quot;parse-names&quot;: false, &quot;dropping-particle&quot;: &quot;&quot;, &quot;non-dropping-particle&quot;: &quot;&quot;}, {&quot;family&quot;: &quot;Kishore&quot;, &quot;given&quot;: &quot;V.&quot;, &quot;parse-names&quot;: false, &quot;dropping-particle&quot;: &quot;&quot;, &quot;non-dropping-particle&quot;: &quot;&quot;}, {&quot;family&quot;: &quot;Wu&quot;, &quot;given&quot;: &quot;F.&quot;, &quot;parse-names&quot;: false, &quot;dropping-particle&quot;: &quot;&quot;, &quot;non-dropping-particle&quot;: &quot;&quot;}, {&quot;family&quot;: &quot;Weinberger&quot;, &quot;given&quot;: &quot;K. Q.&quot;, &quot;parse-names&quot;: false, &quot;dropping-particle&quot;: &quot;&quot;, &quot;non-dropping-particle&quot;: &quot;&quot;}, {&quot;family&quot;: &quot;Artzi&quot;, &quot;given&quot;: &quot;Y.&quot;, &quot;parse-names&quot;: false, &quot;dropping-particle&quot;: &quot;&quot;, &quot;non-dropping-particle&quot;: &quot;&quot;}], &quot;issued&quot;: {&quot;date-parts&quot;: [[2020]]}, &quot;DOI&quot;: &quot;10.48550/arXiv.1904.09675&quot;, &quot;type&quot;: &quot;paper-conference&quot;, &quot;title&quot;: &quot;BERTScore: Evaluating text generation with BERT&quot;, &quot;container-title&quot;: &quot;International Conference on Learning Representations&quot;, &quot;id&quot;: &quot;ITEM-b52ef349-b8ca-5686-84a5-ee1e80905b85&quot;, &quot;container-title-short&quot;: &quot;&quot;}, &quot;isTemporary&quot;: false}]}, {&quot;citationID&quot;: &quot;MENDELEY_CITATION_4426d7b6-20ab-407f-93ed-f040abfd36e8&quot;, &quot;properties&quot;: {&quot;noteIndex&quot;: 0}, &quot;isEdited&quot;: false, &quot;manualOverride&quot;: {&quot;isManuallyOverridden&quot;: false, &quot;citeprocText&quot;: &quot;(Järvelin y Kekäläinen, 2002)&quot;, &quot;manualOverrideText&quot;: &quot;&quot;}, &quot;citationItems&quot;: [{&quot;id&quot;: &quot;ITEM-09731480-e571-5a92-baf1-09e43623c231&quot;, &quot;itemData&quot;: {&quot;author&quot;: [{&quot;family&quot;: &quot;Järvelin&quot;, &quot;given&quot;: &quot;K.&quot;, &quot;parse-names&quot;: false, &quot;dropping-particle&quot;: &quot;&quot;, &quot;non-dropping-particle&quot;: &quot;&quot;}, {&quot;family&quot;: &quot;Kekäläinen&quot;, &quot;given&quot;: &quot;J.&quot;, &quot;parse-names&quot;: false, &quot;dropping-particle&quot;: &quot;&quot;, &quot;non-dropping-particle&quot;: &quot;&quot;}], &quot;issued&quot;: {&quot;date-parts&quot;: [[2002]]}, &quot;DOI&quot;: &quot;10.1145/582415.582418&quot;, &quot;type&quot;: &quot;article-journal&quot;, &quot;title&quot;: &quot;Cumulated gain-based evaluation of IR techniques&quot;, &quot;container-title&quot;: &quot;ACM Transactions on Information Systems&quot;, &quot;volume&quot;: &quot;20&quot;, &quot;issue&quot;: &quot;4&quot;, &quot;page&quot;: &quot;422-446&quot;, &quot;id&quot;: &quot;ITEM-09731480-e571-5a92-baf1-09e43623c231&quot;, &quot;container-title-short&quot;: &quot;&quot;}, &quot;isTemporary&quot;: false}]}, {&quot;citationID&quot;: &quot;MENDELEY_CITATION_f2bb6ea9-420f-419b-9db0-726a229073ff&quot;, &quot;properties&quot;: {&quot;noteIndex&quot;: 0}, &quot;isEdited&quot;: false, &quot;manualOverride&quot;: {&quot;isManuallyOverridden&quot;: false, &quot;citeprocText&quot;: &quot;(Voorhees, 1999)&quot;, &quot;manualOverrideText&quot;: &quot;&quot;}, &quot;citationItems&quot;: [{&quot;id&quot;: &quot;ITEM-fa3f1674-ed35-5374-b5d7-e3539fabe107&quot;, &quot;itemData&quot;: {&quot;author&quot;: [{&quot;family&quot;: &quot;Voorhees&quot;, &quot;given&quot;: &quot;E. M.&quot;, &quot;parse-names&quot;: false, &quot;dropping-particle&quot;: &quot;&quot;, &quot;non-dropping-particle&quot;: &quot;&quot;}], &quot;issued&quot;: {&quot;date-parts&quot;: [[1999]]}, &quot;URL&quot;: &quot;https://trec.nist.gov/pubs/trec8/papers/qa_report.pdf&quot;, &quot;type&quot;: &quot;paper-conference&quot;, &quot;title&quot;: &quot;The TREC-8 question answering track report&quot;, &quot;container-title&quot;: &quot;Proceedings of the Eighth Text REtrieval Conference&quot;, &quot;page&quot;: &quot;77-82&quot;, &quot;publisher&quot;: &quot;National Institute of Standards and Technology&quot;, &quot;id&quot;: &quot;ITEM-fa3f1674-ed35-5374-b5d7-e3539fabe107&quot;, &quot;container-title-short&quot;: &quot;&quot;}, &quot;isTemporary&quot;: false}]}, {&quot;citationID&quot;: &quot;MENDELEY_CITATION_784047d3-4dcb-42e0-9e9f-47dec0616d5f&quot;, &quot;properties&quot;: {&quot;noteIndex&quot;: 0}, &quot;isEdited&quot;: false, &quot;manualOverride&quot;: {&quot;isManuallyOverridden&quot;: false, &quot;citeprocText&quot;: &quot;(Wilcoxon, 1945)&quot;, &quot;manualOverrideText&quot;: &quot;&quot;}, &quot;citationItems&quot;: [{&quot;id&quot;: &quot;ITEM-612bd905-97c5-5cb0-a005-be28dbc83ac1&quot;, &quot;itemData&quot;: {&quot;author&quot;: [{&quot;family&quot;: &quot;Wilcoxon&quot;, &quot;given&quot;: &quot;F.&quot;, &quot;parse-names&quot;: false, &quot;dropping-particle&quot;: &quot;&quot;, &quot;non-dropping-particle&quot;: &quot;&quot;}], &quot;issued&quot;: {&quot;date-parts&quot;: [[1945]]}, &quot;DOI&quot;: &quot;10.2307/3001968&quot;, &quot;type&quot;: &quot;article-journal&quot;, &quot;title&quot;: &quot;Individual comparisons by ranking methods&quot;, &quot;container-title&quot;: &quot;Biometrics Bulletin&quot;, &quot;volume&quot;: &quot;1&quot;, &quot;issue&quot;: &quot;6&quot;, &quot;page&quot;: &quot;80-83&quot;, &quot;id&quot;: &quot;ITEM-612bd905-97c5-5cb0-a005-be28dbc83ac1&quot;, &quot;container-title-short&quot;: &quot;&quot;}, &quot;isTemporary&quot;: false}]}, {&quot;citationID&quot;: &quot;MENDELEY_CITATION_872bc701-fcad-4d27-a7d4-8d407c880d63&quot;, &quot;properties&quot;: {&quot;noteIndex&quot;: 0}, &quot;isEdited&quot;: false, &quot;manualOverride&quot;: {&quot;isManuallyOverridden&quot;: true, &quot;citeprocText&quot;: &quot;(Carballo-Mendívil et al., 2025)&quot;, &quot;manualOverrideText&quot;: &quot;Carballo-Mendívil et al. (2025)&quot;}, &quot;citationItems&quot;: [{&quot;id&quot;: &quot;ITEM-4755bb51-baf5-5536-8cda-5af1c04a59c8&quot;, &quot;itemData&quot;: {&quot;author&quot;: [{&quot;family&quot;: &quot;Carballo-Mendívil&quot;, &quot;given&quot;: &quot;B.&quot;, &quot;parse-names&quot;: false, &quot;dropping-particle&quot;: &quot;&quot;, &quot;non-dropping-particle&quot;: &quot;&quot;}, {&quot;family&quot;: &quot;Arellano-González&quot;, &quot;given&quot;: &quot;A.&quot;, &quot;parse-names&quot;: false, &quot;dropping-particle&quot;: &quot;&quot;, &quot;non-dropping-particle&quot;: &quot;&quot;}, {&quot;family&quot;: &quot;Ríos-Vázquez&quot;, &quot;given&quot;: &quot;N. J.&quot;, &quot;parse-names&quot;: false, &quot;dropping-particle&quot;: &quot;&quot;, &quot;non-dropping-particle&quot;: &quot;&quot;}, {&quot;family&quot;: &quot;Lizardi-Duarte&quot;, &quot;given&quot;: &quot;M. del P.&quot;, &quot;parse-names&quot;: false, &quot;dropping-particle&quot;: &quot;&quot;, &quot;non-dropping-particle&quot;: &quot;&quot;}], &quot;issued&quot;: {&quot;date-parts&quot;: [[2025]]}, &quot;DOI&quot;: &quot;10.3390/app15169202&quot;, &quot;type&quot;: &quot;article-journal&quot;, &quot;title&quot;: &quot;Predicting student dropout from day one: XGBoost-based early warning system using pre-enrollment data&quot;, &quot;container-title&quot;: &quot;Applied Sciences&quot;, &quot;volume&quot;: &quot;15&quot;, &quot;issue&quot;: &quot;16&quot;, &quot;page&quot;: &quot;9202&quot;, &quot;id&quot;: &quot;ITEM-4755bb51-baf5-5536-8cda-5af1c04a59c8&quot;, &quot;container-title-short&quot;: &quot;&quot;}, &quot;isTemporary&quot;: false}]}, {&quot;citationID&quot;: &quot;MENDELEY_CITATION_931de423-1147-4c74-93e4-85807b659775&quot;, &quot;properties&quot;: {&quot;noteIndex&quot;: 0}, &quot;isEdited&quot;: false, &quot;manualOverride&quot;: {&quot;isManuallyOverridden&quot;: true, &quot;citeprocText&quot;: &quot;(Guadalupe Mori, 2025)&quot;, &quot;manualOverrideText&quot;: &quot;Guadalupe Mori (2025)&quot;}, &quot;citationItems&quot;: [{&quot;id&quot;: &quot;ITEM-745e87b9-5edd-56c2-99e9-42f2290e8c38&quot;, &quot;itemData&quot;: {&quot;author&quot;: [{&quot;family&quot;: &quot;Guadalupe Mori&quot;, &quot;given&quot;: &quot;V. H.&quot;, &quot;parse-names&quot;: false, &quot;dropping-particle&quot;: &quot;&quot;, &quot;non-dropping-particle&quot;: &quot;&quot;}], &quot;issued&quot;: {&quot;date-parts&quot;: [[2025]]}, &quot;URL&quot;: &quot;https://hdl.handle.net/20.500.13084/10839&quot;, &quot;type&quot;: &quot;thesis&quot;, &quot;title&quot;: &quot;Modelo predictivo basado en machine learning para la reducción de la deserción estudiantil en las universidades privadas del Perú: caso Universidad Privada San Juan Bautista&quot;, &quot;genre&quot;: &quot;Tesis doctoral&quot;, &quot;publisher&quot;: &quot;Universidad Nacional Federico Villarreal&quot;, &quot;id&quot;: &quot;ITEM-745e87b9-5edd-56c2-99e9-42f2290e8c38&quot;, &quot;container-title-short&quot;: &quot;&quot;}, &quot;isTemporary&quot;: false}]}, {&quot;citationID&quot;: &quot;MENDELEY_CITATION_e471fd14-d813-4d24-98e0-8f6884ace55e&quot;, &quot;properties&quot;: {&quot;noteIndex&quot;: 0}, &quot;isEdited&quot;: false, &quot;manualOverride&quot;: {&quot;isManuallyOverridden&quot;: true, &quot;citeprocText&quot;: &quot;(Carballo-Mendívil et al., 2025)&quot;, &quot;manualOverrideText&quot;: &quot;Carballo-Mendívil et al. (2025)&quot;}, &quot;citationItems&quot;: [{&quot;id&quot;: &quot;ITEM-4755bb51-baf5-5536-8cda-5af1c04a59c8&quot;, &quot;itemData&quot;: {&quot;author&quot;: [{&quot;family&quot;: &quot;Carballo-Mendívil&quot;, &quot;given&quot;: &quot;B.&quot;, &quot;parse-names&quot;: false, &quot;dropping-particle&quot;: &quot;&quot;, &quot;non-dropping-particle&quot;: &quot;&quot;}, {&quot;family&quot;: &quot;Arellano-González&quot;, &quot;given&quot;: &quot;A.&quot;, &quot;parse-names&quot;: false, &quot;dropping-particle&quot;: &quot;&quot;, &quot;non-dropping-particle&quot;: &quot;&quot;}, {&quot;family&quot;: &quot;Ríos-Vázquez&quot;, &quot;given&quot;: &quot;N. J.&quot;, &quot;parse-names&quot;: false, &quot;dropping-particle&quot;: &quot;&quot;, &quot;non-dropping-particle&quot;: &quot;&quot;}, {&quot;family&quot;: &quot;Lizardi-Duarte&quot;, &quot;given&quot;: &quot;M. del P.&quot;, &quot;parse-names&quot;: false, &quot;dropping-particle&quot;: &quot;&quot;, &quot;non-dropping-particle&quot;: &quot;&quot;}], &quot;issued&quot;: {&quot;date-parts&quot;: [[2025]]}, &quot;DOI&quot;: &quot;10.3390/app15169202&quot;, &quot;type&quot;: &quot;article-journal&quot;, &quot;title&quot;: &quot;Predicting student dropout from day one: XGBoost-based early warning system using pre-enrollment data&quot;, &quot;container-title&quot;: &quot;Applied Sciences&quot;, &quot;volume&quot;: &quot;15&quot;, &quot;issue&quot;: &quot;16&quot;, &quot;page&quot;: &quot;9202&quot;, &quot;id&quot;: &quot;ITEM-4755bb51-baf5-5536-8cda-5af1c04a59c8&quot;, &quot;container-title-short&quot;: &quot;&quot;}, &quot;isTemporary&quot;: false}]}, {&quot;citationID&quot;: &quot;MENDELEY_CITATION_959e1311-f2b7-402c-83f9-2be69e981725&quot;, &quot;properties&quot;: {&quot;noteIndex&quot;: 0}, &quot;isEdited&quot;: false, &quot;manualOverride&quot;: {&quot;isManuallyOverridden&quot;: true, &quot;citeprocText&quot;: &quot;(Yataco Cañari y Jacha Rojas, 2024)&quot;, &quot;manualOverrideText&quot;: &quot;Yataco Cañari y Jacha Rojas (2024)&quot;}, &quot;citationItems&quot;: [{&quot;id&quot;: &quot;ITEM-02ada8e7-47d2-5940-ab09-a30ce56e4fb6&quot;, &quot;itemData&quot;: {&quot;author&quot;: [{&quot;family&quot;: &quot;Yataco Cañari&quot;, &quot;given&quot;: &quot;W.&quot;, &quot;parse-names&quot;: false, &quot;dropping-particle&quot;: &quot;&quot;, &quot;non-dropping-particle&quot;: &quot;&quot;}, {&quot;family&quot;: &quot;Jacha Rojas&quot;, &quot;given&quot;: &quot;J. P.&quot;, &quot;parse-names&quot;: false, &quot;dropping-particle&quot;: &quot;&quot;, &quot;non-dropping-particle&quot;: &quot;&quot;}], &quot;issued&quot;: {&quot;date-parts&quot;: [[2024]]}, &quot;URL&quot;: &quot;https://hdl.handle.net/20.500.12840/7597&quot;, &quot;type&quot;: &quot;thesis&quot;, &quot;title&quot;: &quot;Modelo machine learning para predicción de deserción estudiantil&quot;, &quot;genre&quot;: &quot;Trabajo académico de segunda especialidad&quot;, &quot;publisher&quot;: &quot;Universidad Peruana Unión&quot;, &quot;id&quot;: &quot;ITEM-02ada8e7-47d2-5940-ab09-a30ce56e4fb6&quot;, &quot;container-title-short&quot;: &quot;&quot;}, &quot;isTemporary&quot;: false}]}, {&quot;citationID&quot;: &quot;MENDELEY_CITATION_df98d636-8404-4ebe-9b3d-d65035d0470c&quot;, &quot;properties&quot;: {&quot;noteIndex&quot;: 0}, &quot;isEdited&quot;: false, &quot;manualOverride&quot;: {&quot;isManuallyOverridden&quot;: true, &quot;citeprocText&quot;: &quot;(Aguilar-Reyes et al., 2025)&quot;, &quot;manualOverrideText&quot;: &quot;Aguilar-Reyes et al. (2025)&quot;}, &quot;citationItems&quot;: [{&quot;id&quot;: &quot;ITEM-8c9c99df-1678-5fab-b737-85f1e9842ee2&quot;, &quot;itemData&quot;: {&quot;author&quot;: [{&quot;family&quot;: &quot;Aguilar-Reyes&quot;, &quot;given&quot;: &quot;J. E.&quot;, &quot;parse-names&quot;: false, &quot;dropping-particle&quot;: &quot;&quot;, &quot;non-dropping-particle&quot;: &quot;&quot;}, {&quot;family&quot;: &quot;Mejía-Peñafiel&quot;, &quot;given&quot;: &quot;E. F.&quot;, &quot;parse-names&quot;: false, &quot;dropping-particle&quot;: &quot;&quot;, &quot;non-dropping-particle&quot;: &quot;&quot;}, {&quot;family&quot;: &quot;Morocho-Barrionuevo&quot;, &quot;given&quot;: &quot;T. P.&quot;, &quot;parse-names&quot;: false, &quot;dropping-particle&quot;: &quot;&quot;, &quot;non-dropping-particle&quot;: &quot;&quot;}, {&quot;family&quot;: &quot;Velasco-Castelo&quot;, &quot;given&quot;: &quot;G.-M.&quot;, &quot;parse-names&quot;: false, &quot;dropping-particle&quot;: &quot;&quot;, &quot;non-dropping-particle&quot;: &quot;&quot;}], &quot;issued&quot;: {&quot;date-parts&quot;: [[2025]]}, &quot;DOI&quot;: &quot;10.36390/telos271.08&quot;, &quot;type&quot;: &quot;article-journal&quot;, &quot;title&quot;: &quot;Estudio del rendimiento académico mediante la comparación de modelos de regresión y árboles de clasificación&quot;, &quot;container-title&quot;: &quot;Telos: Revista de Estudios Interdisciplinarios en Ciencias Sociales&quot;, &quot;volume&quot;: &quot;27&quot;, &quot;issue&quot;: &quot;1&quot;, &quot;page&quot;: &quot;94-115&quot;, &quot;id&quot;: &quot;ITEM-8c9c99df-1678-5fab-b737-85f1e9842ee2&quot;, &quot;container-title-short&quot;: &quot;&quot;}, &quot;isTemporary&quot;: false}]}, {&quot;citationID&quot;: &quot;MENDELEY_CITATION_de15630c-2613-462c-bd07-a80753ec0afe&quot;, &quot;properties&quot;: {&quot;noteIndex&quot;: 0}, &quot;isEdited&quot;: false, &quot;manualOverride&quot;: {&quot;isManuallyOverridden&quot;: true, &quot;citeprocText&quot;: &quot;(Fang et al., 2024)&quot;, &quot;manualOverrideText&quot;: &quot;Fang et al. (2024)&quot;}, &quot;citationItems&quot;: [{&quot;id&quot;: &quot;ITEM-5007b438-b37f-541e-8fca-2748edacc281&quot;, &quot;itemData&quot;: {&quot;author&quot;: [{&quot;family&quot;: &quot;Fang&quot;, &quot;given&quot;: &quot;X.&quot;, &quot;parse-names&quot;: false, &quot;dropping-particle&quot;: &quot;&quot;, &quot;non-dropping-particle&quot;: &quot;&quot;}, {&quot;family&quot;: &quot;Xu&quot;, &quot;given&quot;: &quot;W.&quot;, &quot;parse-names&quot;: false, &quot;dropping-particle&quot;: &quot;&quot;, &quot;non-dropping-particle&quot;: &quot;&quot;}, {&quot;family&quot;: &quot;Tan&quot;, &quot;given&quot;: &quot;F. A.&quot;, &quot;parse-names&quot;: false, &quot;dropping-particle&quot;: &quot;&quot;, &quot;non-dropping-particle&quot;: &quot;&quot;}, {&quot;family&quot;: &quot;Zhang&quot;, &quot;given&quot;: &quot;J.&quot;, &quot;parse-names&quot;: false, &quot;dropping-particle&quot;: &quot;&quot;, &quot;non-dropping-particle&quot;: &quot;&quot;}, {&quot;family&quot;: &quot;Hu&quot;, &quot;given&quot;: &quot;Z.&quot;, &quot;parse-names&quot;: false, &quot;dropping-particle&quot;: &quot;&quot;, &quot;non-dropping-particle&quot;: &quot;&quot;}, {&quot;family&quot;: &quot;Qi&quot;, &quot;given&quot;: &quot;Y.&quot;, &quot;parse-names&quot;: false, &quot;dropping-particle&quot;: &quot;&quot;, &quot;non-dropping-particle&quot;: &quot;&quot;}, {&quot;family&quot;: &quot;Nickleach&quot;, &quot;given&quot;: &quot;S.&quot;, &quot;parse-names&quot;: false, &quot;dropping-particle&quot;: &quot;&quot;, &quot;non-dropping-particle&quot;: &quot;&quot;}, {&quot;family&quot;: &quot;Socolinsky&quot;, &quot;given&quot;: &quot;D.&quot;, &quot;parse-names&quot;: false, &quot;dropping-particle&quot;: &quot;&quot;, &quot;non-dropping-particle&quot;: &quot;&quot;}, {&quot;family&quot;: &quot;Sengamedu&quot;, &quot;given&quot;: &quot;S.&quot;, &quot;parse-names&quot;: false, &quot;dropping-particle&quot;: &quot;&quot;, &quot;non-dropping-particle&quot;: &quot;&quot;}, {&quot;family&quot;: &quot;Faloutsos&quot;, &quot;given&quot;: &quot;C.&quot;, &quot;parse-names&quot;: false, &quot;dropping-particle&quot;: &quot;&quot;, &quot;non-dropping-particle&quot;: &quot;&quot;}], &quot;issued&quot;: {&quot;date-parts&quot;: [[2024]]}, &quot;URL&quot;: &quot;http://arxiv.org/abs/2402.17944&quot;, &quot;type&quot;: &quot;article-journal&quot;, &quot;title&quot;: &quot;Large language models (LLMs) on tabular data: Prediction, generation, and understanding. A survey&quot;, &quot;container-title&quot;: &quot;Transactions on Machine Learning Research&quot;, &quot;id&quot;: &quot;ITEM-5007b438-b37f-541e-8fca-2748edacc281&quot;, &quot;container-title-short&quot;: &quot;&quot;}, &quot;isTemporary&quot;: false}]}, {&quot;citationID&quot;: &quot;MENDELEY_CITATION_d8e70e3e-92ff-40b1-88da-f0df1c307282&quot;, &quot;properties&quot;: {&quot;noteIndex&quot;: 0}, &quot;isEdited&quot;: false, &quot;manualOverride&quot;: {&quot;isManuallyOverridden&quot;: false, &quot;citeprocText&quot;: &quot;(Cisneros-Bravo et al., 2023; Rodas Zegarra de Escalante, 2024)&quot;, &quot;manualOverrideText&quot;: &quot;&quot;}, &quot;citationItems&quot;: [{&quot;id&quot;: &quot;ITEM-2c1f70fd-8745-538a-b99f-18d256f44b4f&quot;, &quot;itemData&quot;: {&quot;author&quot;: [{&quot;family&quot;: &quot;Cisneros-Bravo&quot;, &quot;given&quot;: &quot;B. E.&quot;, &quot;parse-names&quot;: false, &quot;dropping-particle&quot;: &quot;&quot;, &quot;non-dropping-particle&quot;: &quot;&quot;}, {&quot;family&quot;: &quot;Rodríguez-Aguilar&quot;, &quot;given&quot;: &quot;R. M.&quot;, &quot;parse-names&quot;: false, &quot;dropping-particle&quot;: &quot;&quot;, &quot;non-dropping-particle&quot;: &quot;&quot;}, {&quot;family&quot;: &quot;Niño-Membrillo&quot;, &quot;given&quot;: &quot;Y. E.&quot;, &quot;parse-names&quot;: false, &quot;dropping-particle&quot;: &quot;&quot;, &quot;non-dropping-particle&quot;: &quot;&quot;}, {&quot;family&quot;: &quot;Cuevas-Rasgado&quot;, &quot;given&quot;: &quot;A. D.&quot;, &quot;parse-names&quot;: false, &quot;dropping-particle&quot;: &quot;&quot;, &quot;non-dropping-particle&quot;: &quot;&quot;}], &quot;issued&quot;: {&quot;date-parts&quot;: [[2023]]}, &quot;DOI&quot;: &quot;10.23913/ride.v14i27.1715&quot;, &quot;type&quot;: &quot;article-journal&quot;, &quot;title&quot;: &quot;Falta de orientación vocacional como factor en la deserción universitaria. Caso de estudio: zona Oriente del Estado de México&quot;, &quot;container-title&quot;: &quot;RIDE Revista Iberoamericana para la Investigación y el Desarrollo Educativo&quot;, &quot;volume&quot;: &quot;14&quot;, &quot;issue&quot;: &quot;27&quot;, &quot;id&quot;: &quot;ITEM-2c1f70fd-8745-538a-b99f-18d256f44b4f&quot;, &quot;container-title-short&quot;: &quot;&quot;}, &quot;isTemporary&quot;: false}, {&quot;id&quot;: &quot;ITEM-297823cb-c975-5def-8698-5545884294cd&quot;, &quot;itemData&quot;: {&quot;author&quot;: [{&quot;family&quot;: &quot;Rodas Zegarra de Escalante&quot;, &quot;given&quot;: &quot;A.&quot;, &quot;parse-names&quot;: false, &quot;dropping-particle&quot;: &quot;&quot;, &quot;non-dropping-particle&quot;: &quot;&quot;}], &quot;issued&quot;: {&quot;date-parts&quot;: [[2024]]}, &quot;URL&quot;: &quot;https://hdl.handle.net/20.500.12692/150276&quot;, &quot;type&quot;: &quot;thesis&quot;, &quot;title&quot;: &quot;Orientación vocacional y deserción universitaria en una universidad de Lima - 2024&quot;, &quot;genre&quot;: &quot;Tesis de maestría&quot;, &quot;publisher&quot;: &quot;Universidad César Vallejo&quot;, &quot;id&quot;: &quot;ITEM-297823cb-c975-5def-8698-5545884294cd&quot;, &quot;container-title-short&quot;: &quot;&quot;}, &quot;isTemporary&quot;: false}]}, {&quot;citationID&quot;: &quot;MENDELEY_CITATION_aa15840c-f0d0-425c-866b-9cd7194ab607&quot;, &quot;properties&quot;: {&quot;noteIndex&quot;: 0}, &quot;isEdited&quot;: false, &quot;manualOverride&quot;: {&quot;isManuallyOverridden&quot;: true, &quot;citeprocText&quot;: &quot;(Millán Gordillo, 2025)&quot;, &quot;manualOverrideText&quot;: &quot;Millán Gordillo (2025)&quot;}, &quot;citationItems&quot;: [{&quot;id&quot;: &quot;ITEM-d048a752-48c5-509f-92fd-95097e22963d&quot;, &quot;itemData&quot;: {&quot;author&quot;: [{&quot;family&quot;: &quot;Millán Gordillo&quot;, &quot;given&quot;: &quot;M.&quot;, &quot;parse-names&quot;: false, &quot;dropping-particle&quot;: &quot;&quot;, &quot;non-dropping-particle&quot;: &quot;&quot;}], &quot;issued&quot;: {&quot;date-parts&quot;: [[2025]]}, &quot;URL&quot;: &quot;https://repositorio.uloyola.es/bitstream/handle/20.500.12412/6735/TFM%20Mar%C3%ADa%20Mill%C3%A1n.pdf&quot;, &quot;type&quot;: &quot;thesis&quot;, &quot;title&quot;: &quot;Estudio comparativo de sistemas de recomendación mediante filtrado colaborativo, basado en contenido y propuestas híbridas&quot;, &quot;genre&quot;: &quot;Tesis de maestría&quot;, &quot;publisher&quot;: &quot;Universidad Loyola Andalucía&quot;, &quot;id&quot;: &quot;ITEM-d048a752-48c5-509f-92fd-95097e22963d&quot;, &quot;container-title-short&quot;: &quot;&quot;}, &quot;isTemporary&quot;: false}]}, {&quot;citationID&quot;: &quot;MENDELEY_CITATION_17018fda-4e5b-4f12-b6ff-0388dee5ed09&quot;, &quot;properties&quot;: {&quot;noteIndex&quot;: 0}, &quot;isEdited&quot;: false, &quot;manualOverride&quot;: {&quot;isManuallyOverridden&quot;: true, &quot;citeprocText&quot;: &quot;(León Caranqui, 2023)&quot;, &quot;manualOverrideText&quot;: &quot;León Caranqui (2023)&quot;}, &quot;citationItems&quot;: [{&quot;id&quot;: &quot;ITEM-d8e93493-d1e9-5c21-8fb9-fe318b95db8c&quot;, &quot;itemData&quot;: {&quot;author&quot;: [{&quot;family&quot;: &quot;León Caranqui&quot;, &quot;given&quot;: &quot;J. A.&quot;, &quot;parse-names&quot;: false, &quot;dropping-particle&quot;: &quot;&quot;, &quot;non-dropping-particle&quot;: &quot;&quot;}], &quot;issued&quot;: {&quot;date-parts&quot;: [[2023]]}, &quot;URL&quot;: &quot;https://repositorio.usfq.edu.ec/handle/23000/13497&quot;, &quot;type&quot;: &quot;thesis&quot;, &quot;title&quot;: &quot;URKU: Adaptación de LLaMA 2 para la generación de texto en kichwa usando técnicas de Low-Rank Adaptation (LoRA)&quot;, &quot;genre&quot;: &quot;Trabajo de titulación de pregrado&quot;, &quot;publisher&quot;: &quot;Universidad San Francisco de Quito&quot;, &quot;id&quot;: &quot;ITEM-d8e93493-d1e9-5c21-8fb9-fe318b95db8c&quot;, &quot;container-title-short&quot;: &quot;&quot;}, &quot;isTemporary&quot;: false}]}, {&quot;citationID&quot;: &quot;MENDELEY_CITATION_e156688a-9ccf-47df-a451-0576ae3281a9&quot;, &quot;properties&quot;: {&quot;noteIndex&quot;: 0}, &quot;isEdited&quot;: false, &quot;manualOverride&quot;: {&quot;isManuallyOverridden&quot;: true, &quot;citeprocText&quot;: &quot;(Mena Guitarra, 2023)&quot;, &quot;manualOverrideText&quot;: &quot;Mena Guitarra (2023)&quot;}, &quot;citationItems&quot;: [{&quot;id&quot;: &quot;ITEM-b7bc5309-1149-55a6-8b1f-3e0d4086c429&quot;, &quot;itemData&quot;: {&quot;author&quot;: [{&quot;family&quot;: &quot;Mena Guitarra&quot;, &quot;given&quot;: &quot;S. D.&quot;, &quot;parse-names&quot;: false, &quot;dropping-particle&quot;: &quot;&quot;, &quot;non-dropping-particle&quot;: &quot;&quot;}], &quot;issued&quot;: {&quot;date-parts&quot;: [[2023]]}, &quot;URL&quot;: &quot;https://repositorio.usfq.edu.ec/handle/23000/13665&quot;, &quot;type&quot;: &quot;thesis&quot;, &quot;title&quot;: &quot;Usos y aplicaciones de modelos de lenguaje masivos en español&quot;, &quot;genre&quot;: &quot;Trabajo de titulación de pregrado&quot;, &quot;publisher&quot;: &quot;Universidad San Francisco de Quito&quot;, &quot;id&quot;: &quot;ITEM-b7bc5309-1149-55a6-8b1f-3e0d4086c429&quot;, &quot;container-title-short&quot;: &quot;&quot;}, &quot;isTemporary&quot;: false}]}, {&quot;citationID&quot;: &quot;MENDELEY_CITATION_879f36a3-0d8d-4c77-9de0-b1c72c68f0fa&quot;, &quot;properties&quot;: {&quot;noteIndex&quot;: 0}, &quot;isEdited&quot;: false, &quot;manualOverride&quot;: {&quot;isManuallyOverridden&quot;: true, &quot;citeprocText&quot;: &quot;(Dettmers et al., 2023)&quot;, &quot;manualOverrideText&quot;: &quot;Dettmers et al. (2023)&quot;}, &quot;citationItems&quot;: [{&quot;id&quot;: &quot;ITEM-66ff8277-e9ea-5605-b98c-71a6ac2aa4a6&quot;, &quot;itemData&quot;: {&quot;author&quot;: [{&quot;family&quot;: &quot;Dettmers&quot;, &quot;given&quot;: &quot;T.&quot;, &quot;parse-names&quot;: false, &quot;dropping-particle&quot;: &quot;&quot;, &quot;non-dropping-particle&quot;: &quot;&quot;}, {&quot;family&quot;: &quot;Pagnoni&quot;, &quot;given&quot;: &quot;A.&quot;, &quot;parse-names&quot;: false, &quot;dropping-particle&quot;: &quot;&quot;, &quot;non-dropping-particle&quot;: &quot;&quot;}, {&quot;family&quot;: &quot;Holtzman&quot;, &quot;given&quot;: &quot;A.&quot;, &quot;parse-names&quot;: false, &quot;dropping-particle&quot;: &quot;&quot;, &quot;non-dropping-particle&quot;: &quot;&quot;}, {&quot;family&quot;: &quot;Zettlemoyer&quot;, &quot;given&quot;: &quot;L.&quot;, &quot;parse-names&quot;: false, &quot;dropping-particle&quot;: &quot;&quot;, &quot;non-dropping-particle&quot;: &quot;&quot;}], &quot;issued&quot;: {&quot;date-parts&quot;: [[2023]]}, &quot;DOI&quot;: &quot;10.48550/arXiv.2305.14314&quot;, &quot;type&quot;: &quot;paper-conference&quot;, &quot;title&quot;: &quot;QLoRA: Efficient finetuning of quantized LLMs&quot;, &quot;container-title&quot;: &quot;Advances in Neural Information Processing Systems 36&quot;, &quot;id&quot;: &quot;ITEM-66ff8277-e9ea-5605-b98c-71a6ac2aa4a6&quot;, &quot;container-title-short&quot;: &quot;&quot;}, &quot;isTemporary&quot;: false}]}, {&quot;citationID&quot;: &quot;MENDELEY_CITATION_eb90c2d4-0481-4ebc-b671-8e74ae34e385&quot;, &quot;properties&quot;: {&quot;noteIndex&quot;: 0}, &quot;isEdited&quot;: false, &quot;manualOverride&quot;: {&quot;isManuallyOverridden&quot;: true, &quot;citeprocText&quot;: &quot;(Hu et al., 2021)&quot;, &quot;manualOverrideText&quot;: &quot;Hu et al. (2021)&quot;}, &quot;citationItems&quot;: [{&quot;id&quot;: &quot;ITEM-74d30536-939b-537f-bec0-b59afedae2e3&quot;, &quot;itemData&quot;: {&quot;author&quot;: [{&quot;family&quot;: &quot;Hu&quot;, &quot;given&quot;: &quot;E. J.&quot;, &quot;parse-names&quot;: false, &quot;dropping-particle&quot;: &quot;&quot;, &quot;non-dropping-particle&quot;: &quot;&quot;}, {&quot;family&quot;: &quot;Shen&quot;, &quot;given&quot;: &quot;Y.&quot;, &quot;parse-names&quot;: false, &quot;dropping-particle&quot;: &quot;&quot;, &quot;non-dropping-particle&quot;: &quot;&quot;}, {&quot;family&quot;: &quot;Wallis&quot;, &quot;given&quot;: &quot;P.&quot;, &quot;parse-names&quot;: false, &quot;dropping-particle&quot;: &quot;&quot;, &quot;non-dropping-particle&quot;: &quot;&quot;}, {&quot;family&quot;: &quot;Allen-Zhu&quot;, &quot;given&quot;: &quot;Z.&quot;, &quot;parse-names&quot;: false, &quot;dropping-particle&quot;: &quot;&quot;, &quot;non-dropping-particle&quot;: &quot;&quot;}, {&quot;family&quot;: &quot;Li&quot;, &quot;given&quot;: &quot;Y.&quot;, &quot;parse-names&quot;: false, &quot;dropping-particle&quot;: &quot;&quot;, &quot;non-dropping-particle&quot;: &quot;&quot;}, {&quot;family&quot;: &quot;Wang&quot;, &quot;given&quot;: &quot;S.&quot;, &quot;parse-names&quot;: false, &quot;dropping-particle&quot;: &quot;&quot;, &quot;non-dropping-particle&quot;: &quot;&quot;}, {&quot;family&quot;: &quot;Wang&quot;, &quot;given&quot;: &quot;L.&quot;, &quot;parse-names&quot;: false, &quot;dropping-particle&quot;: &quot;&quot;, &quot;non-dropping-particle&quot;: &quot;&quot;}, {&quot;family&quot;: &quot;Chen&quot;, &quot;given&quot;: &quot;W.&quot;, &quot;parse-names&quot;: false, &quot;dropping-particle&quot;: &quot;&quot;, &quot;non-dropping-particle&quot;: &quot;&quot;}], &quot;issued&quot;: {&quot;date-parts&quot;: [[2021]]}, &quot;DOI&quot;: &quot;10.48550/arXiv.2106.09685&quot;, &quot;type&quot;: &quot;book&quot;, &quot;title&quot;: &quot;LoRA: Low-rank adaptation of large language models&quot;, &quot;publisher&quot;: &quot;arXiv&quot;, &quot;id&quot;: &quot;ITEM-74d30536-939b-537f-bec0-b59afedae2e3&quot;, &quot;container-title-short&quot;: &quot;&quot;}, &quot;isTemporary&quot;: false}]}, {&quot;citationID&quot;: &quot;MENDELEY_CITATION_09eaf23d-65e2-4b65-a101-d170549be459&quot;, &quot;properties&quot;: {&quot;noteIndex&quot;: 0}, &quot;isEdited&quot;: false, &quot;manualOverride&quot;: {&quot;isManuallyOverridden&quot;: true, &quot;citeprocText&quot;: &quot;(Dettmers et al., 2023)&quot;, &quot;manualOverrideText&quot;: &quot;Dettmers et al. (2023)&quot;}, &quot;citationItems&quot;: [{&quot;id&quot;: &quot;ITEM-66ff8277-e9ea-5605-b98c-71a6ac2aa4a6&quot;, &quot;itemData&quot;: {&quot;author&quot;: [{&quot;family&quot;: &quot;Dettmers&quot;, &quot;given&quot;: &quot;T.&quot;, &quot;parse-names&quot;: false, &quot;dropping-particle&quot;: &quot;&quot;, &quot;non-dropping-particle&quot;: &quot;&quot;}, {&quot;family&quot;: &quot;Pagnoni&quot;, &quot;given&quot;: &quot;A.&quot;, &quot;parse-names&quot;: false, &quot;dropping-particle&quot;: &quot;&quot;, &quot;non-dropping-particle&quot;: &quot;&quot;}, {&quot;family&quot;: &quot;Holtzman&quot;, &quot;given&quot;: &quot;A.&quot;, &quot;parse-names&quot;: false, &quot;dropping-particle&quot;: &quot;&quot;, &quot;non-dropping-particle&quot;: &quot;&quot;}, {&quot;family&quot;: &quot;Zettlemoyer&quot;, &quot;given&quot;: &quot;L.&quot;, &quot;parse-names&quot;: false, &quot;dropping-particle&quot;: &quot;&quot;, &quot;non-dropping-particle&quot;: &quot;&quot;}], &quot;issued&quot;: {&quot;date-parts&quot;: [[2023]]}, &quot;DOI&quot;: &quot;10.48550/arXiv.2305.14314&quot;, &quot;type&quot;: &quot;paper-conference&quot;, &quot;title&quot;: &quot;QLoRA: Efficient finetuning of quantized LLMs&quot;, &quot;container-title&quot;: &quot;Advances in Neural Information Processing Systems 36&quot;, &quot;id&quot;: &quot;ITEM-66ff8277-e9ea-5605-b98c-71a6ac2aa4a6&quot;, &quot;container-title-short&quot;: &quot;&quot;}, &quot;isTemporary&quot;: false}]}, {&quot;citationID&quot;: &quot;MENDELEY_CITATION_45b7e60b-5683-4f67-81a8-76bc18563673&quot;, &quot;properties&quot;: {&quot;noteIndex&quot;: 0}, &quot;isEdited&quot;: false, &quot;manualOverride&quot;: {&quot;isManuallyOverridden&quot;: true, &quot;citeprocText&quot;: &quot;(Mena Guitarra, 2023)&quot;, &quot;manualOverrideText&quot;: &quot;Mena Guitarra (2023)&quot;}, &quot;citationItems&quot;: [{&quot;id&quot;: &quot;ITEM-b7bc5309-1149-55a6-8b1f-3e0d4086c429&quot;, &quot;itemData&quot;: {&quot;author&quot;: [{&quot;family&quot;: &quot;Mena Guitarra&quot;, &quot;given&quot;: &quot;S. D.&quot;, &quot;parse-names&quot;: false, &quot;dropping-particle&quot;: &quot;&quot;, &quot;non-dropping-particle&quot;: &quot;&quot;}], &quot;issued&quot;: {&quot;date-parts&quot;: [[2023]]}, &quot;URL&quot;: &quot;https://repositorio.usfq.edu.ec/handle/23000/13665&quot;, &quot;type&quot;: &quot;thesis&quot;, &quot;title&quot;: &quot;Usos y aplicaciones de modelos de lenguaje masivos en español&quot;, &quot;genre&quot;: &quot;Trabajo de titulación de pregrado&quot;, &quot;publisher&quot;: &quot;Universidad San Francisco de Quito&quot;, &quot;id&quot;: &quot;ITEM-b7bc5309-1149-55a6-8b1f-3e0d4086c429&quot;, &quot;container-title-short&quot;: &quot;&quot;}, &quot;isTemporary&quot;: false}]}, {&quot;citationID&quot;: &quot;MENDELEY_CITATION_c6bdca53-14be-4a8b-ab91-847dc1f8799b&quot;, &quot;properties&quot;: {&quot;noteIndex&quot;: 0}, &quot;isEdited&quot;: false, &quot;manualOverride&quot;: {&quot;isManuallyOverridden&quot;: true, &quot;citeprocText&quot;: &quot;(Martínez Sixto et al., 2025)&quot;, &quot;manualOverrideText&quot;: &quot;Martínez Sixto et al. (2025)&quot;}, &quot;citationItems&quot;: [{&quot;id&quot;: &quot;ITEM-e9427164-f851-5ff7-a1c3-eb7ce5a7d720&quot;, &quot;itemData&quot;: {&quot;author&quot;: [{&quot;family&quot;: &quot;Martínez Sixto&quot;, &quot;given&quot;: &quot;L.&quot;, &quot;parse-names&quot;: false, &quot;dropping-particle&quot;: &quot;&quot;, &quot;non-dropping-particle&quot;: &quot;&quot;}, {&quot;family&quot;: &quot;Fernández y Fernández&quot;, &quot;given&quot;: &quot;C. A.&quot;, &quot;parse-names&quot;: false, &quot;dropping-particle&quot;: &quot;&quot;, &quot;non-dropping-particle&quot;: &quot;&quot;}, {&quot;family&quot;: &quot;Millán Hernández&quot;, &quot;given&quot;: &quot;C. E.&quot;, &quot;parse-names&quot;: false, &quot;dropping-particle&quot;: &quot;&quot;, &quot;non-dropping-particle&quot;: &quot;&quot;}], &quot;issued&quot;: {&quot;date-parts&quot;: [[2025]]}, &quot;DOI&quot;: &quot;10.36825/riti.13.31.007&quot;, &quot;type&quot;: &quot;article-journal&quot;, &quot;title&quot;: &quot;Comparación del desempeño de LLMs en la generación de diagramas de clases UML mediante un sistema RAG&quot;, &quot;container-title&quot;: &quot;Revista de Investigación en Tecnologías de la Información&quot;, &quot;volume&quot;: &quot;13&quot;, &quot;issue&quot;: &quot;31&quot;, &quot;page&quot;: &quot;64-79&quot;, &quot;id&quot;: &quot;ITEM-e9427164-f851-5ff7-a1c3-eb7ce5a7d720&quot;, &quot;container-title-short&quot;: &quot;&quot;}, &quot;isTemporary&quot;: false}]}, {&quot;citationID&quot;: &quot;MENDELEY_CITATION_ceb4894c-d8fb-41b6-a841-d63b5b6df821&quot;, &quot;properties&quot;: {&quot;noteIndex&quot;: 0}, &quot;isEdited&quot;: false, &quot;manualOverride&quot;: {&quot;isManuallyOverridden&quot;: true, &quot;citeprocText&quot;: &quot;(Millán Gordillo, 2025)&quot;, &quot;manualOverrideText&quot;: &quot;Millán Gordillo (2025)&quot;}, &quot;citationItems&quot;: [{&quot;id&quot;: &quot;ITEM-d048a752-48c5-509f-92fd-95097e22963d&quot;, &quot;itemData&quot;: {&quot;author&quot;: [{&quot;family&quot;: &quot;Millán Gordillo&quot;, &quot;given&quot;: &quot;M.&quot;, &quot;parse-names&quot;: false, &quot;dropping-particle&quot;: &quot;&quot;, &quot;non-dropping-particle&quot;: &quot;&quot;}], &quot;issued&quot;: {&quot;date-parts&quot;: [[2025]]}, &quot;URL&quot;: &quot;https://repositorio.uloyola.es/bitstream/handle/20.500.12412/6735/TFM%20Mar%C3%ADa%20Mill%C3%A1n.pdf&quot;, &quot;type&quot;: &quot;thesis&quot;, &quot;title&quot;: &quot;Estudio comparativo de sistemas de recomendación mediante filtrado colaborativo, basado en contenido y propuestas híbridas&quot;, &quot;genre&quot;: &quot;Tesis de maestría&quot;, &quot;publisher&quot;: &quot;Universidad Loyola Andalucía&quot;, &quot;id&quot;: &quot;ITEM-d048a752-48c5-509f-92fd-95097e22963d&quot;, &quot;container-title-short&quot;: &quot;&quot;}, &quot;isTemporary&quot;: false}]}, {&quot;citationID&quot;: &quot;MENDELEY_CITATION_3bde3d07-0e9b-44ac-a112-dd9dc4559f30&quot;, &quot;properties&quot;: {&quot;noteIndex&quot;: 0}, &quot;isEdited&quot;: false, &quot;manualOverride&quot;: {&quot;isManuallyOverridden&quot;: true, &quot;citeprocText&quot;: &quot;(Castejón Lozano, 2025)&quot;, &quot;manualOverrideText&quot;: &quot;Castejón Lozano (2025)&quot;}, &quot;citationItems&quot;: [{&quot;id&quot;: &quot;ITEM-aa8f5a87-f00c-54b4-9f0b-476652320c5d&quot;, &quot;itemData&quot;: {&quot;author&quot;: [{&quot;family&quot;: &quot;Castejón Lozano&quot;, &quot;given&quot;: &quot;F.&quot;, &quot;parse-names&quot;: false, &quot;dropping-particle&quot;: &quot;&quot;, &quot;non-dropping-particle&quot;: &quot;&quot;}], &quot;issued&quot;: {&quot;date-parts&quot;: [[2025]]}, &quot;URL&quot;: &quot;https://oa.upm.es/90917/&quot;, &quot;type&quot;: &quot;thesis&quot;, &quot;title&quot;: &quot;SoroIA: Diseño e implementación de un sistema conversacional basado en modelos grandes de lenguaje para el Museo Sorolla&quot;, &quot;genre&quot;: &quot;Tesis de maestría&quot;, &quot;publisher&quot;: &quot;Universidad Politécnica de Madrid&quot;, &quot;id&quot;: &quot;ITEM-aa8f5a87-f00c-54b4-9f0b-476652320c5d&quot;, &quot;container-title-short&quot;: &quot;&quot;}, &quot;isTemporary&quot;: false}]}, {&quot;citationID&quot;: &quot;MENDELEY_CITATION_518f2fe0-e911-426a-b9b8-28941886597e&quot;, &quot;properties&quot;: {&quot;noteIndex&quot;: 0}, &quot;isEdited&quot;: false, &quot;manualOverride&quot;: {&quot;isManuallyOverridden&quot;: true, &quot;citeprocText&quot;: &quot;(León Caranqui, 2023)&quot;, &quot;manualOverrideText&quot;: &quot;León Caranqui (2023)&quot;}, &quot;citationItems&quot;: [{&quot;id&quot;: &quot;ITEM-d8e93493-d1e9-5c21-8fb9-fe318b95db8c&quot;, &quot;itemData&quot;: {&quot;author&quot;: [{&quot;family&quot;: &quot;León Caranqui&quot;, &quot;given&quot;: &quot;J. A.&quot;, &quot;parse-names&quot;: false, &quot;dropping-particle&quot;: &quot;&quot;, &quot;non-dropping-particle&quot;: &quot;&quot;}], &quot;issued&quot;: {&quot;date-parts&quot;: [[2023]]}, &quot;URL&quot;: &quot;https://repositorio.usfq.edu.ec/handle/23000/13497&quot;, &quot;type&quot;: &quot;thesis&quot;, &quot;title&quot;: &quot;URKU: Adaptación de LLaMA 2 para la generación de texto en kichwa usando técnicas de Low-Rank Adaptation (LoRA)&quot;, &quot;genre&quot;: &quot;Trabajo de titulación de pregrado&quot;, &quot;publisher&quot;: &quot;Universidad San Francisco de Quito&quot;, &quot;id&quot;: &quot;ITEM-d8e93493-d1e9-5c21-8fb9-fe318b95db8c&quot;, &quot;container-title-short&quot;: &quot;&quot;}, &quot;isTemporary&quot;: false}]}]"/>
+    <we:property name="MENDELEY_BIBLIOGRAPHY_LAST_MODIFIED" value="1790948676660"/>
+    <we:property name="MENDELEY_CITATIONS" value="[{&quot;citationID&quot;: &quot;MENDELEY_CITATION_4d9d9951-3a60-46e3-8dea-0acfe7246d1c&quot;, &quot;properties&quot;: {&quot;noteIndex&quot;: 0}, &quot;isEdited&quot;: false, &quot;manualOverride&quot;: {&quot;isManuallyOverridden&quot;: false, &quot;citeprocText&quot;: &quot;(Millán Gordillo, 2025)&quot;, &quot;manualOverrideText&quot;: &quot;&quot;}, &quot;citationItems&quot;: [{&quot;id&quot;: &quot;ITEM-d048a752-48c5-509f-92fd-95097e22963d&quot;, &quot;itemData&quot;: {&quot;author&quot;: [{&quot;family&quot;: &quot;Millán Gordillo&quot;, &quot;given&quot;: &quot;M.&quot;, &quot;parse-names&quot;: false, &quot;dropping-particle&quot;: &quot;&quot;, &quot;non-dropping-particle&quot;: &quot;&quot;}], &quot;issued&quot;: {&quot;date-parts&quot;: [[2025]]}, &quot;URL&quot;: &quot;https://repositorio.uloyola.es/bitstream/handle/20.500.12412/6735/TFM%20Mar%C3%ADa%20Mill%C3%A1n.pdf&quot;, &quot;type&quot;: &quot;thesis&quot;, &quot;title&quot;: &quot;Estudio comparativo de sistemas de recomendación mediante filtrado colaborativo, basado en contenido y propuestas híbridas&quot;, &quot;genre&quot;: &quot;Tesis de maestría&quot;, &quot;publisher&quot;: &quot;Universidad Loyola Andalucía&quot;, &quot;id&quot;: &quot;ITEM-d048a752-48c5-509f-92fd-95097e22963d&quot;, &quot;container-title-short&quot;: &quot;&quot;}, &quot;isTemporary&quot;: false}]}, {&quot;citationID&quot;: &quot;MENDELEY_CITATION_90d68529-fe50-4fbe-b115-aecd5750bf3f&quot;, &quot;properties&quot;: {&quot;noteIndex&quot;: 0}, &quot;isEdited&quot;: false, &quot;manualOverride&quot;: {&quot;isManuallyOverridden&quot;: false, &quot;citeprocText&quot;: &quot;(Zheng et al., 2023)&quot;, &quot;manualOverrideText&quot;: &quot;&quot;}, &quot;citationItems&quot;: [{&quot;id&quot;: &quot;ITEM-658ab4b7-6469-5fa3-999a-4ffd7c7cd3d0&quot;, &quot;itemData&quot;: {&quot;author&quot;: [{&quot;family&quot;: &quot;Zheng&quot;, &quot;given&quot;: &quot;L.&quot;, &quot;parse-names&quot;: false, &quot;dropping-particle&quot;: &quot;&quot;, &quot;non-dropping-particle&quot;: &quot;&quot;}, {&quot;family&quot;: &quot;Chiang&quot;, &quot;given&quot;: &quot;W.-L.&quot;, &quot;parse-names&quot;: false, &quot;dropping-particle&quot;: &quot;&quot;, &quot;non-dropping-particle&quot;: &quot;&quot;}, {&quot;family&quot;: &quot;Sheng&quot;, &quot;given&quot;: &quot;Y.&quot;, &quot;parse-names&quot;: false, &quot;dropping-particle&quot;: &quot;&quot;, &quot;non-dropping-particle&quot;: &quot;&quot;}, {&quot;family&quot;: &quot;Zhuang&quot;, &quot;given&quot;: &quot;S.&quot;, &quot;parse-names&quot;: false, &quot;dropping-particle&quot;: &quot;&quot;, &quot;non-dropping-particle&quot;: &quot;&quot;}, {&quot;family&quot;: &quot;Wu&quot;, &quot;given&quot;: &quot;Z.&quot;, &quot;parse-names&quot;: false, &quot;dropping-particle&quot;: &quot;&quot;, &quot;non-dropping-particle&quot;: &quot;&quot;}, {&quot;family&quot;: &quot;Zhuang&quot;, &quot;given&quot;: &quot;Y.&quot;, &quot;parse-names&quot;: false, &quot;dropping-particle&quot;: &quot;&quot;, &quot;non-dropping-particle&quot;: &quot;&quot;}, {&quot;family&quot;: &quot;Lin&quot;, &quot;given&quot;: &quot;Z.&quot;, &quot;parse-names&quot;: false, &quot;dropping-particle&quot;: &quot;&quot;, &quot;non-dropping-particle&quot;: &quot;&quot;}, {&quot;family&quot;: &quot;Li&quot;, &quot;given&quot;: &quot;Z.&quot;, &quot;parse-names&quot;: false, &quot;dropping-particle&quot;: &quot;&quot;, &quot;non-dropping-particle&quot;: &quot;&quot;}, {&quot;family&quot;: &quot;Li&quot;, &quot;given&quot;: &quot;D.&quot;, &quot;parse-names&quot;: false, &quot;dropping-particle&quot;: &quot;&quot;, &quot;non-dropping-particle&quot;: &quot;&quot;}, {&quot;family&quot;: &quot;Xing&quot;, &quot;given&quot;: &quot;E. P.&quot;, &quot;parse-names&quot;: false, &quot;dropping-particle&quot;: &quot;&quot;, &quot;non-dropping-particle&quot;: &quot;&quot;}, {&quot;family&quot;: &quot;Zhang&quot;, &quot;given&quot;: &quot;H.&quot;, &quot;parse-names&quot;: false, &quot;dropping-particle&quot;: &quot;&quot;, &quot;non-dropping-particle&quot;: &quot;&quot;}, {&quot;family&quot;: &quot;Gonzalez&quot;, &quot;given&quot;: &quot;J. E.&quot;, &quot;parse-names&quot;: false, &quot;dropping-particle&quot;: &quot;&quot;, &quot;non-dropping-particle&quot;: &quot;&quot;}, {&quot;family&quot;: &quot;Stoica&quot;, &quot;given&quot;: &quot;I.&quot;, &quot;parse-names&quot;: false, &quot;dropping-particle&quot;: &quot;&quot;, &quot;non-dropping-particle&quot;: &quot;&quot;}], &quot;issued&quot;: {&quot;date-parts&quot;: [[2023]]}, &quot;DOI&quot;: &quot;10.48550/arXiv.2306.05685&quot;, &quot;type&quot;: &quot;book&quot;, &quot;title&quot;: &quot;Judging LLM-as-a-judge with MT-Bench and Chatbot Arena&quot;, &quot;publisher&quot;: &quot;arXiv&quot;, &quot;id&quot;: &quot;ITEM-658ab4b7-6469-5fa3-999a-4ffd7c7cd3d0&quot;, &quot;container-title-short&quot;: &quot;&quot;}, &quot;isTemporary&quot;: false}]}, {&quot;citationID&quot;: &quot;MENDELEY_CITATION_c5aafef5-f068-4c95-9b71-986127e11332&quot;, &quot;properties&quot;: {&quot;noteIndex&quot;: 0}, &quot;isEdited&quot;: false, &quot;manualOverride&quot;: {&quot;isManuallyOverridden&quot;: true, &quot;citeprocText&quot;: &quot;(Song et al., 2025)&quot;, &quot;manualOverrideText&quot;: &quot;Song et al. (2025)&quot;}, &quot;citationItems&quot;: [{&quot;id&quot;: &quot;ITEM-e0e22fed-4a06-55b1-8d82-b72075b7c2d9&quot;, &quot;itemData&quot;: {&quot;author&quot;: [{&quot;family&quot;: &quot;Song&quot;, &quot;given&quot;: &quot;Y.&quot;, &quot;parse-names&quot;: false, &quot;dropping-particle&quot;: &quot;&quot;, &quot;non-dropping-particle&quot;: &quot;&quot;}, {&quot;family&quot;: &quot;Lv&quot;, &quot;given&quot;: &quot;C.&quot;, &quot;parse-names&quot;: false, &quot;dropping-particle&quot;: &quot;&quot;, &quot;non-dropping-particle&quot;: &quot;&quot;}, {&quot;family&quot;: &quot;Zhu&quot;, &quot;given&quot;: &quot;K.&quot;, &quot;parse-names&quot;: false, &quot;dropping-particle&quot;: &quot;&quot;, &quot;non-dropping-particle&quot;: &quot;&quot;}, {&quot;family&quot;: &quot;Qiu&quot;, &quot;given&quot;: &quot;X.&quot;, &quot;parse-names&quot;: false, &quot;dropping-particle&quot;: &quot;&quot;, &quot;non-dropping-particle&quot;: &quot;&quot;}], &quot;issued&quot;: {&quot;date-parts&quot;: [[2025]]}, &quot;DOI&quot;: &quot;10.1007/s10791-025-09663-6&quot;, &quot;type&quot;: &quot;article-journal&quot;, &quot;title&quot;: &quot;LoRA fine-tuning of Llama3 large model for intelligent fishery field&quot;, &quot;container-title&quot;: &quot;Discover Computing&quot;, &quot;volume&quot;: &quot;28&quot;, &quot;issue&quot;: &quot;1&quot;, &quot;page&quot;: &quot;135&quot;, &quot;id&quot;: &quot;ITEM-e0e22fed-4a06-55b1-8d82-b72075b7c2d9&quot;, &quot;container-title-short&quot;: &quot;&quot;}, &quot;isTemporary&quot;: false}]}, {&quot;citationID&quot;: &quot;MENDELEY_CITATION_41fb303d-11f7-491b-b19c-010adea0e61f&quot;, &quot;properties&quot;: {&quot;noteIndex&quot;: 0}, &quot;isEdited&quot;: false, &quot;manualOverride&quot;: {&quot;isManuallyOverridden&quot;: true, &quot;citeprocText&quot;: &quot;(Zhang et al., 2025)&quot;, &quot;manualOverrideText&quot;: &quot;Zhang et al. (2025)&quot;}, &quot;citationItems&quot;: [{&quot;id&quot;: &quot;ITEM-1b18d17f-3a57-568c-a65a-b5824a81dd38&quot;, &quot;itemData&quot;: {&quot;author&quot;: [{&quot;family&quot;: &quot;Zhang&quot;, &quot;given&quot;: &quot;J. C.&quot;, &quot;parse-names&quot;: false, &quot;dropping-particle&quot;: &quot;&quot;, &quot;non-dropping-particle&quot;: &quot;&quot;}, {&quot;family&quot;: &quot;Xiong&quot;, &quot;given&quot;: &quot;Y. J.&quot;, &quot;parse-names&quot;: false, &quot;dropping-particle&quot;: &quot;&quot;, &quot;non-dropping-particle&quot;: &quot;&quot;}, {&quot;family&quot;: &quot;Xia&quot;, &quot;given&quot;: &quot;C. M.&quot;, &quot;parse-names&quot;: false, &quot;dropping-particle&quot;: &quot;&quot;, &quot;non-dropping-particle&quot;: &quot;&quot;}, {&quot;family&quot;: &quot;Zhu&quot;, &quot;given&quot;: &quot;D. H.&quot;, &quot;parse-names&quot;: false, &quot;dropping-particle&quot;: &quot;&quot;, &quot;non-dropping-particle&quot;: &quot;&quot;}, {&quot;family&quot;: &quot;Zhan&quot;, &quot;given&quot;: &quot;H. J.&quot;, &quot;parse-names&quot;: false, &quot;dropping-particle&quot;: &quot;&quot;, &quot;non-dropping-particle&quot;: &quot;&quot;}], &quot;issued&quot;: {&quot;date-parts&quot;: [[2025]]}, &quot;DOI&quot;: &quot;10.1016/j.neucom.2025.130859&quot;, &quot;type&quot;: &quot;article-journal&quot;, &quot;title&quot;: &quot;LoRA2: Multi-scale low-rank approximations for fine-tuning large language models&quot;, &quot;container-title&quot;: &quot;Neurocomputing&quot;, &quot;volume&quot;: &quot;650&quot;, &quot;page&quot;: &quot;130859&quot;, &quot;id&quot;: &quot;ITEM-1b18d17f-3a57-568c-a65a-b5824a81dd38&quot;, &quot;container-title-short&quot;: &quot;&quot;}, &quot;isTemporary&quot;: false}]}, {&quot;citationID&quot;: &quot;MENDELEY_CITATION_c76012b0-be3a-417e-897c-36cae6d3f0a9&quot;, &quot;properties&quot;: {&quot;noteIndex&quot;: 0}, &quot;isEdited&quot;: false, &quot;manualOverride&quot;: {&quot;isManuallyOverridden&quot;: false, &quot;citeprocText&quot;: &quot;(Gao et al., 2026; Liu et al., 2026)&quot;, &quot;manualOverrideText&quot;: &quot;&quot;}, &quot;citationItems&quot;: [{&quot;id&quot;: &quot;ITEM-d320fd95-a78e-5478-a293-ab29c9647d86&quot;, &quot;itemData&quot;: {&quot;author&quot;: [{&quot;family&quot;: &quot;Gao&quot;, &quot;given&quot;: &quot;D.&quot;, &quot;parse-names&quot;: false, &quot;dropping-particle&quot;: &quot;&quot;, &quot;non-dropping-particle&quot;: &quot;&quot;}, {&quot;family&quot;: &quot;Chen&quot;, &quot;given&quot;: &quot;S.&quot;, &quot;parse-names&quot;: false, &quot;dropping-particle&quot;: &quot;&quot;, &quot;non-dropping-particle&quot;: &quot;&quot;}, {&quot;family&quot;: &quot;Yang&quot;, &quot;given&quot;: &quot;Z.&quot;, &quot;parse-names&quot;: false, &quot;dropping-particle&quot;: &quot;&quot;, &quot;non-dropping-particle&quot;: &quot;&quot;}, {&quot;family&quot;: &quot;Yang&quot;, &quot;given&quot;: &quot;L.&quot;, &quot;parse-names&quot;: false, &quot;dropping-particle&quot;: &quot;&quot;, &quot;non-dropping-particle&quot;: &quot;&quot;}, {&quot;family&quot;: &quot;Gao&quot;, &quot;given&quot;: &quot;H.&quot;, &quot;parse-names&quot;: false, &quot;dropping-particle&quot;: &quot;&quot;, &quot;non-dropping-particle&quot;: &quot;&quot;}, {&quot;family&quot;: &quot;Wu&quot;, &quot;given&quot;: &quot;M.&quot;, &quot;parse-names&quot;: false, &quot;dropping-particle&quot;: &quot;&quot;, &quot;non-dropping-particle&quot;: &quot;&quot;}, {&quot;family&quot;: &quot;Yu&quot;, &quot;given&quot;: &quot;S.&quot;, &quot;parse-names&quot;: false, &quot;dropping-particle&quot;: &quot;&quot;, &quot;non-dropping-particle&quot;: &quot;&quot;}, {&quot;family&quot;: &quot;Xuan&quot;, &quot;given&quot;: &quot;Q.&quot;, &quot;parse-names&quot;: false, &quot;dropping-particle&quot;: &quot;&quot;, &quot;non-dropping-particle&quot;: &quot;&quot;}, {&quot;family&quot;: &quot;Zhang&quot;, &quot;given&quot;: &quot;W.&quot;, &quot;parse-names&quot;: false, &quot;dropping-particle&quot;: &quot;&quot;, &quot;non-dropping-particle&quot;: &quot;&quot;}, {&quot;family&quot;: &quot;Yang&quot;, &quot;given&quot;: &quot;L.&quot;, &quot;parse-names&quot;: false, &quot;dropping-particle&quot;: &quot;&quot;, &quot;non-dropping-particle&quot;: &quot;&quot;}, {&quot;family&quot;: &quot;Cai&quot;, &quot;given&quot;: &quot;X.&quot;, &quot;parse-names&quot;: false, &quot;dropping-particle&quot;: &quot;&quot;, &quot;non-dropping-particle&quot;: &quot;&quot;}], &quot;issued&quot;: {&quot;date-parts&quot;: [[2026]]}, &quot;DOI&quot;: &quot;10.1016/j.eswa.2025.129486&quot;, &quot;type&quot;: &quot;article-journal&quot;, &quot;title&quot;: &quot;MLoRA+: Transformer-fusion mixture-of-LoRA network for multi-domain click-through rate prediction&quot;, &quot;container-title&quot;: &quot;Expert Systems with Applications&quot;, &quot;volume&quot;: &quot;297&quot;, &quot;page&quot;: &quot;129486&quot;, &quot;id&quot;: &quot;ITEM-d320fd95-a78e-5478-a293-ab29c9647d86&quot;, &quot;container-title-short&quot;: &quot;&quot;}, &quot;isTemporary&quot;: false}, {&quot;id&quot;: &quot;ITEM-b4080137-1a47-52cd-9e37-0f8562cb0792&quot;, &quot;itemData&quot;: {&quot;author&quot;: [{&quot;family&quot;: &quot;Liu&quot;, &quot;given&quot;: &quot;Z.&quot;, &quot;parse-names&quot;: false, &quot;dropping-particle&quot;: &quot;&quot;, &quot;non-dropping-particle&quot;: &quot;&quot;}, {&quot;family&quot;: &quot;Liu&quot;, &quot;given&quot;: &quot;Z.&quot;, &quot;parse-names&quot;: false, &quot;dropping-particle&quot;: &quot;&quot;, &quot;non-dropping-particle&quot;: &quot;&quot;}, {&quot;family&quot;: &quot;Feng&quot;, &quot;given&quot;: &quot;R.&quot;, &quot;parse-names&quot;: false, &quot;dropping-particle&quot;: &quot;&quot;, &quot;non-dropping-particle&quot;: &quot;&quot;}, {&quot;family&quot;: &quot;Feng&quot;, &quot;given&quot;: &quot;P.&quot;, &quot;parse-names&quot;: false, &quot;dropping-particle&quot;: &quot;&quot;, &quot;non-dropping-particle&quot;: &quot;&quot;}, {&quot;family&quot;: &quot;Chu&quot;, &quot;given&quot;: &quot;J.&quot;, &quot;parse-names&quot;: false, &quot;dropping-particle&quot;: &quot;&quot;, &quot;non-dropping-particle&quot;: &quot;&quot;}, {&quot;family&quot;: &quot;Peng&quot;, &quot;given&quot;: &quot;X.&quot;, &quot;parse-names&quot;: false, &quot;dropping-particle&quot;: &quot;&quot;, &quot;non-dropping-particle&quot;: &quot;&quot;}], &quot;issued&quot;: {&quot;date-parts&quot;: [[2026]]}, &quot;DOI&quot;: &quot;10.1016/j.snb.2025.138644&quot;, &quot;type&quot;: &quot;article-journal&quot;, &quot;title&quot;: &quot;LoRA-TCN: A pre-trained/fine-tuning learning paradigm for drift adaptation&quot;, &quot;container-title&quot;: &quot;Sensors and Actuators B: Chemical&quot;, &quot;volume&quot;: &quot;446&quot;, &quot;page&quot;: &quot;138644&quot;, &quot;id&quot;: &quot;ITEM-b4080137-1a47-52cd-9e37-0f8562cb0792&quot;, &quot;container-title-short&quot;: &quot;&quot;}, &quot;isTemporary&quot;: false}]}, {&quot;citationID&quot;: &quot;MENDELEY_CITATION_a7e1f37e-8d02-40e4-9f42-21c011c49372&quot;, &quot;properties&quot;: {&quot;noteIndex&quot;: 0}, &quot;isEdited&quot;: false, &quot;manualOverride&quot;: {&quot;isManuallyOverridden&quot;: false, &quot;citeprocText&quot;: &quot;(Dettmers et al., 2023)&quot;, &quot;manualOverrideText&quot;: &quot;&quot;}, &quot;citationItems&quot;: [{&quot;id&quot;: &quot;ITEM-66ff8277-e9ea-5605-b98c-71a6ac2aa4a6&quot;, &quot;itemData&quot;: {&quot;author&quot;: [{&quot;family&quot;: &quot;Dettmers&quot;, &quot;given&quot;: &quot;T.&quot;, &quot;parse-names&quot;: false, &quot;dropping-particle&quot;: &quot;&quot;, &quot;non-dropping-particle&quot;: &quot;&quot;}, {&quot;family&quot;: &quot;Pagnoni&quot;, &quot;given&quot;: &quot;A.&quot;, &quot;parse-names&quot;: false, &quot;dropping-particle&quot;: &quot;&quot;, &quot;non-dropping-particle&quot;: &quot;&quot;}, {&quot;family&quot;: &quot;Holtzman&quot;, &quot;given&quot;: &quot;A.&quot;, &quot;parse-names&quot;: false, &quot;dropping-particle&quot;: &quot;&quot;, &quot;non-dropping-particle&quot;: &quot;&quot;}, {&quot;family&quot;: &quot;Zettlemoyer&quot;, &quot;given&quot;: &quot;L.&quot;, &quot;parse-names&quot;: false, &quot;dropping-particle&quot;: &quot;&quot;, &quot;non-dropping-particle&quot;: &quot;&quot;}], &quot;issued&quot;: {&quot;date-parts&quot;: [[2023]]}, &quot;DOI&quot;: &quot;10.48550/arXiv.2305.14314&quot;, &quot;type&quot;: &quot;paper-conference&quot;, &quot;title&quot;: &quot;QLoRA: Efficient finetuning of quantized LLMs&quot;, &quot;container-title&quot;: &quot;Advances in Neural Information Processing Systems 36&quot;, &quot;id&quot;: &quot;ITEM-66ff8277-e9ea-5605-b98c-71a6ac2aa4a6&quot;, &quot;container-title-short&quot;: &quot;&quot;}, &quot;isTemporary&quot;: false}]}, {&quot;citationID&quot;: &quot;MENDELEY_CITATION_29d39fd3-4d30-4aca-8ed5-f101723d189e&quot;, &quot;properties&quot;: {&quot;noteIndex&quot;: 0}, &quot;isEdited&quot;: false, &quot;manualOverride&quot;: {&quot;isManuallyOverridden&quot;: false, &quot;citeprocText&quot;: &quot;(Hu et al., 2021)&quot;, &quot;manualOverrideText&quot;: &quot;&quot;}, &quot;citationItems&quot;: [{&quot;id&quot;: &quot;ITEM-74d30536-939b-537f-bec0-b59afedae2e3&quot;, &quot;itemData&quot;: {&quot;author&quot;: [{&quot;family&quot;: &quot;Hu&quot;, &quot;given&quot;: &quot;E. J.&quot;, &quot;parse-names&quot;: false, &quot;dropping-particle&quot;: &quot;&quot;, &quot;non-dropping-particle&quot;: &quot;&quot;}, {&quot;family&quot;: &quot;Shen&quot;, &quot;given&quot;: &quot;Y.&quot;, &quot;parse-names&quot;: false, &quot;dropping-particle&quot;: &quot;&quot;, &quot;non-dropping-particle&quot;: &quot;&quot;}, {&quot;family&quot;: &quot;Wallis&quot;, &quot;given&quot;: &quot;P.&quot;, &quot;parse-names&quot;: false, &quot;dropping-particle&quot;: &quot;&quot;, &quot;non-dropping-particle&quot;: &quot;&quot;}, {&quot;family&quot;: &quot;Allen-Zhu&quot;, &quot;given&quot;: &quot;Z.&quot;, &quot;parse-names&quot;: false, &quot;dropping-particle&quot;: &quot;&quot;, &quot;non-dropping-particle&quot;: &quot;&quot;}, {&quot;family&quot;: &quot;Li&quot;, &quot;given&quot;: &quot;Y.&quot;, &quot;parse-names&quot;: false, &quot;dropping-particle&quot;: &quot;&quot;, &quot;non-dropping-particle&quot;: &quot;&quot;}, {&quot;family&quot;: &quot;Wang&quot;, &quot;given&quot;: &quot;S.&quot;, &quot;parse-names&quot;: false, &quot;dropping-particle&quot;: &quot;&quot;, &quot;non-dropping-particle&quot;: &quot;&quot;}, {&quot;family&quot;: &quot;Wang&quot;, &quot;given&quot;: &quot;L.&quot;, &quot;parse-names&quot;: false, &quot;dropping-particle&quot;: &quot;&quot;, &quot;non-dropping-particle&quot;: &quot;&quot;}, {&quot;family&quot;: &quot;Chen&quot;, &quot;given&quot;: &quot;W.&quot;, &quot;parse-names&quot;: false, &quot;dropping-particle&quot;: &quot;&quot;, &quot;non-dropping-particle&quot;: &quot;&quot;}], &quot;issued&quot;: {&quot;date-parts&quot;: [[2021]]}, &quot;DOI&quot;: &quot;10.48550/arXiv.2106.09685&quot;, &quot;type&quot;: &quot;book&quot;, &quot;title&quot;: &quot;LoRA: Low-rank adaptation of large language models&quot;, &quot;publisher&quot;: &quot;arXiv&quot;, &quot;id&quot;: &quot;ITEM-74d30536-939b-537f-bec0-b59afedae2e3&quot;, &quot;container-title-short&quot;: &quot;&quot;}, &quot;isTemporary&quot;: false}]}, {&quot;citationID&quot;: &quot;MENDELEY_CITATION_0d64de65-f9b9-4f14-9954-bafa327d85eb&quot;, &quot;properties&quot;: {&quot;noteIndex&quot;: 0}, &quot;isEdited&quot;: false, &quot;manualOverride&quot;: {&quot;isManuallyOverridden&quot;: true, &quot;citeprocText&quot;: &quot;(Hu et al., 2021)&quot;, &quot;manualOverrideText&quot;: &quot;Hu et al. (2021)&quot;}, &quot;citationItems&quot;: [{&quot;id&quot;: &quot;ITEM-74d30536-939b-537f-bec0-b59afedae2e3&quot;, &quot;itemData&quot;: {&quot;author&quot;: [{&quot;family&quot;: &quot;Hu&quot;, &quot;given&quot;: &quot;E. J.&quot;, &quot;parse-names&quot;: false, &quot;dropping-particle&quot;: &quot;&quot;, &quot;non-dropping-particle&quot;: &quot;&quot;}, {&quot;family&quot;: &quot;Shen&quot;, &quot;given&quot;: &quot;Y.&quot;, &quot;parse-names&quot;: false, &quot;dropping-particle&quot;: &quot;&quot;, &quot;non-dropping-particle&quot;: &quot;&quot;}, {&quot;family&quot;: &quot;Wallis&quot;, &quot;given&quot;: &quot;P.&quot;, &quot;parse-names&quot;: false, &quot;dropping-particle&quot;: &quot;&quot;, &quot;non-dropping-particle&quot;: &quot;&quot;}, {&quot;family&quot;: &quot;Allen-Zhu&quot;, &quot;given&quot;: &quot;Z.&quot;, &quot;parse-names&quot;: false, &quot;dropping-particle&quot;: &quot;&quot;, &quot;non-dropping-particle&quot;: &quot;&quot;}, {&quot;family&quot;: &quot;Li&quot;, &quot;given&quot;: &quot;Y.&quot;, &quot;parse-names&quot;: false, &quot;dropping-particle&quot;: &quot;&quot;, &quot;non-dropping-particle&quot;: &quot;&quot;}, {&quot;family&quot;: &quot;Wang&quot;, &quot;given&quot;: &quot;S.&quot;, &quot;parse-names&quot;: false, &quot;dropping-particle&quot;: &quot;&quot;, &quot;non-dropping-particle&quot;: &quot;&quot;}, {&quot;family&quot;: &quot;Wang&quot;, &quot;given&quot;: &quot;L.&quot;, &quot;parse-names&quot;: false, &quot;dropping-particle&quot;: &quot;&quot;, &quot;non-dropping-particle&quot;: &quot;&quot;}, {&quot;family&quot;: &quot;Chen&quot;, &quot;given&quot;: &quot;W.&quot;, &quot;parse-names&quot;: false, &quot;dropping-particle&quot;: &quot;&quot;, &quot;non-dropping-particle&quot;: &quot;&quot;}], &quot;issued&quot;: {&quot;date-parts&quot;: [[2021]]}, &quot;DOI&quot;: &quot;10.48550/arXiv.2106.09685&quot;, &quot;type&quot;: &quot;book&quot;, &quot;title&quot;: &quot;LoRA: Low-rank adaptation of large language models&quot;, &quot;publisher&quot;: &quot;arXiv&quot;, &quot;id&quot;: &quot;ITEM-74d30536-939b-537f-bec0-b59afedae2e3&quot;, &quot;container-title-short&quot;: &quot;&quot;}, &quot;isTemporary&quot;: false}]}, {&quot;citationID&quot;: &quot;MENDELEY_CITATION_598c6128-ca86-4ac5-8430-2e7e17f1c6c6&quot;, &quot;properties&quot;: {&quot;noteIndex&quot;: 0}, &quot;isEdited&quot;: false, &quot;manualOverride&quot;: {&quot;isManuallyOverridden&quot;: false, &quot;citeprocText&quot;: &quot;(Dettmers et al., 2023)&quot;, &quot;manualOverrideText&quot;: &quot;&quot;}, &quot;citationItems&quot;: [{&quot;id&quot;: &quot;ITEM-66ff8277-e9ea-5605-b98c-71a6ac2aa4a6&quot;, &quot;itemData&quot;: {&quot;author&quot;: [{&quot;family&quot;: &quot;Dettmers&quot;, &quot;given&quot;: &quot;T.&quot;, &quot;parse-names&quot;: false, &quot;dropping-particle&quot;: &quot;&quot;, &quot;non-dropping-particle&quot;: &quot;&quot;}, {&quot;family&quot;: &quot;Pagnoni&quot;, &quot;given&quot;: &quot;A.&quot;, &quot;parse-names&quot;: false, &quot;dropping-particle&quot;: &quot;&quot;, &quot;non-dropping-particle&quot;: &quot;&quot;}, {&quot;family&quot;: &quot;Holtzman&quot;, &quot;given&quot;: &quot;A.&quot;, &quot;parse-names&quot;: false, &quot;dropping-particle&quot;: &quot;&quot;, &quot;non-dropping-particle&quot;: &quot;&quot;}, {&quot;family&quot;: &quot;Zettlemoyer&quot;, &quot;given&quot;: &quot;L.&quot;, &quot;parse-names&quot;: false, &quot;dropping-particle&quot;: &quot;&quot;, &quot;non-dropping-particle&quot;: &quot;&quot;}], &quot;issued&quot;: {&quot;date-parts&quot;: [[2023]]}, &quot;DOI&quot;: &quot;10.48550/arXiv.2305.14314&quot;, &quot;type&quot;: &quot;paper-conference&quot;, &quot;title&quot;: &quot;QLoRA: Efficient finetuning of quantized LLMs&quot;, &quot;container-title&quot;: &quot;Advances in Neural Information Processing Systems 36&quot;, &quot;id&quot;: &quot;ITEM-66ff8277-e9ea-5605-b98c-71a6ac2aa4a6&quot;, &quot;container-title-short&quot;: &quot;&quot;}, &quot;isTemporary&quot;: false}]}, {&quot;citationID&quot;: &quot;MENDELEY_CITATION_c1016002-7112-44cd-b441-3f269cd27046&quot;, &quot;properties&quot;: {&quot;noteIndex&quot;: 0}, &quot;isEdited&quot;: false, &quot;manualOverride&quot;: {&quot;isManuallyOverridden&quot;: true, &quot;citeprocText&quot;: &quot;(Singhal et al., 2023)&quot;, &quot;manualOverrideText&quot;: &quot;Singhal et al. (2023)&quot;}, &quot;citationItems&quot;: [{&quot;id&quot;: &quot;ITEM-50da8b62-4567-5119-b691-5e46f77cae26&quot;, &quot;itemData&quot;: {&quot;author&quot;: [{&quot;family&quot;: &quot;Singhal&quot;, &quot;given&quot;: &quot;K.&quot;, &quot;parse-names&quot;: false, &quot;dropping-particle&quot;: &quot;&quot;, &quot;non-dropping-particle&quot;: &quot;&quot;}, {&quot;family&quot;: &quot;Azizi&quot;, &quot;given&quot;: &quot;S.&quot;, &quot;parse-names&quot;: false, &quot;dropping-particle&quot;: &quot;&quot;, &quot;non-dropping-particle&quot;: &quot;&quot;}, {&quot;family&quot;: &quot;Tu&quot;, &quot;given&quot;: &quot;T.&quot;, &quot;parse-names&quot;: false, &quot;dropping-particle&quot;: &quot;&quot;, &quot;non-dropping-particle&quot;: &quot;&quot;}, {&quot;family&quot;: &quot;Mahdavi&quot;, &quot;given&quot;: &quot;S. S.&quot;, &quot;parse-names&quot;: false, &quot;dropping-particle&quot;: &quot;&quot;, &quot;non-dropping-particle&quot;: &quot;&quot;}, {&quot;family&quot;: &quot;Wei&quot;, &quot;given&quot;: &quot;J.&quot;, &quot;parse-names&quot;: false, &quot;dropping-particle&quot;: &quot;&quot;, &quot;non-dropping-particle&quot;: &quot;&quot;}, {&quot;family&quot;: &quot;Chung&quot;, &quot;given&quot;: &quot;H. W.&quot;, &quot;parse-names&quot;: false, &quot;dropping-particle&quot;: &quot;&quot;, &quot;non-dropping-particle&quot;: &quot;&quot;}, {&quot;family&quot;: &quot;Scales&quot;, &quot;given&quot;: &quot;N.&quot;, &quot;parse-names&quot;: false, &quot;dropping-particle&quot;: &quot;&quot;, &quot;non-dropping-particle&quot;: &quot;&quot;}, {&quot;family&quot;: &quot;Tanwani&quot;, &quot;given&quot;: &quot;A.&quot;, &quot;parse-names&quot;: false, &quot;dropping-particle&quot;: &quot;&quot;, &quot;non-dropping-particle&quot;: &quot;&quot;}, {&quot;family&quot;: &quot;Cole-Lewis&quot;, &quot;given&quot;: &quot;H.&quot;, &quot;parse-names&quot;: false, &quot;dropping-particle&quot;: &quot;&quot;, &quot;non-dropping-particle&quot;: &quot;&quot;}, {&quot;family&quot;: &quot;Pfohl&quot;, &quot;given&quot;: &quot;S.&quot;, &quot;parse-names&quot;: false, &quot;dropping-particle&quot;: &quot;&quot;, &quot;non-dropping-particle&quot;: &quot;&quot;}, {&quot;family&quot;: &quot;Payne&quot;, &quot;given&quot;: &quot;P.&quot;, &quot;parse-names&quot;: false, &quot;dropping-particle&quot;: &quot;&quot;, &quot;non-dropping-particle&quot;: &quot;&quot;}, {&quot;family&quot;: &quot;Seneviratne&quot;, &quot;given&quot;: &quot;M.&quot;, &quot;parse-names&quot;: false, &quot;dropping-particle&quot;: &quot;&quot;, &quot;non-dropping-particle&quot;: &quot;&quot;}, {&quot;family&quot;: &quot;Gamble&quot;, &quot;given&quot;: &quot;P.&quot;, &quot;parse-names&quot;: false, &quot;dropping-particle&quot;: &quot;&quot;, &quot;non-dropping-particle&quot;: &quot;&quot;}, {&quot;family&quot;: &quot;Kelly&quot;, &quot;given&quot;: &quot;C.&quot;, &quot;parse-names&quot;: false, &quot;dropping-particle&quot;: &quot;&quot;, &quot;non-dropping-particle&quot;: &quot;&quot;}, {&quot;family&quot;: &quot;Babiker&quot;, &quot;given&quot;: &quot;A.&quot;, &quot;parse-names&quot;: false, &quot;dropping-particle&quot;: &quot;&quot;, &quot;non-dropping-particle&quot;: &quot;&quot;}, {&quot;family&quot;: &quot;Schärli&quot;, &quot;given&quot;: &quot;N.&quot;, &quot;parse-names&quot;: false, &quot;dropping-particle&quot;: &quot;&quot;, &quot;non-dropping-particle&quot;: &quot;&quot;}, {&quot;family&quot;: &quot;Chowdhery&quot;, &quot;given&quot;: &quot;A.&quot;, &quot;parse-names&quot;: false, &quot;dropping-particle&quot;: &quot;&quot;, &quot;non-dropping-particle&quot;: &quot;&quot;}, {&quot;family&quot;: &quot;Mansfield&quot;, &quot;given&quot;: &quot;P.&quot;, &quot;parse-names&quot;: false, &quot;dropping-particle&quot;: &quot;&quot;, &quot;non-dropping-particle&quot;: &quot;&quot;}, {&quot;family&quot;: &quot;Demner-Fushman&quot;, &quot;given&quot;: &quot;D.&quot;, &quot;parse-names&quot;: false, &quot;dropping-particle&quot;: &quot;&quot;, &quot;non-dropping-particle&quot;: &quot;&quot;}, {&quot;family&quot;: &quot;Natarajan&quot;, &quot;given&quot;: &quot;V.&quot;, &quot;parse-names&quot;: false, &quot;dropping-particle&quot;: &quot;&quot;, &quot;non-dropping-particle&quot;: &quot;&quot;}], &quot;issued&quot;: {&quot;date-parts&quot;: [[2023]]}, &quot;DOI&quot;: &quot;10.1038/s41586-023-06291-2&quot;, &quot;type&quot;: &quot;article-journal&quot;, &quot;title&quot;: &quot;Large language models encode clinical knowledge&quot;, &quot;container-title&quot;: &quot;Nature&quot;, &quot;volume&quot;: &quot;620&quot;, &quot;issue&quot;: &quot;7972&quot;, &quot;page&quot;: &quot;172-180&quot;, &quot;id&quot;: &quot;ITEM-50da8b62-4567-5119-b691-5e46f77cae26&quot;, &quot;container-title-short&quot;: &quot;&quot;}, &quot;isTemporary&quot;: false}]}, {&quot;citationID&quot;: &quot;MENDELEY_CITATION_6f201fd4-67e1-4150-87f8-8bb483f03a31&quot;, &quot;properties&quot;: {&quot;noteIndex&quot;: 0}, &quot;isEdited&quot;: false, &quot;manualOverride&quot;: {&quot;isManuallyOverridden&quot;: true, &quot;citeprocText&quot;: &quot;(Negueruela Gómez, 2024; Zhang et al., 2026)&quot;, &quot;manualOverrideText&quot;: &quot;(Negueruela Gómez, 2024; H. Zhang et al., 2026)&quot;}, &quot;citationItems&quot;: [{&quot;id&quot;: &quot;ITEM-99b80702-9513-57fc-b45d-6af1c9999632&quot;, &quot;itemData&quot;: {&quot;author&quot;: [{&quot;family&quot;: &quot;Negueruela Gómez&quot;, &quot;given&quot;: &quot;I.&quot;, &quot;parse-names&quot;: false, &quot;dropping-particle&quot;: &quot;&quot;, &quot;non-dropping-particle&quot;: &quot;&quot;}], &quot;issued&quot;: {&quot;date-parts&quot;: [[2024]]}, &quot;URL&quot;: &quot;https://repositorio.unican.es/xmlui/handle/10902/33837&quot;, &quot;type&quot;: &quot;thesis&quot;, &quot;title&quot;: &quot;Análisis y evaluación de LLMs con técnicas RAG para el desarrollo y despliegue de un asistente virtual&quot;, &quot;genre&quot;: &quot;Trabajo de fin de estudios&quot;, &quot;publisher&quot;: &quot;Universidad de Cantabria&quot;, &quot;id&quot;: &quot;ITEM-99b80702-9513-57fc-b45d-6af1c9999632&quot;, &quot;container-title-short&quot;: &quot;&quot;}, &quot;isTemporary&quot;: false}, {&quot;id&quot;: &quot;ITEM-c14394b5-5d79-565b-92c8-bcd30bfc44ad&quot;, &quot;itemData&quot;: {&quot;author&quot;: [{&quot;family&quot;: &quot;Zhang&quot;, &quot;given&quot;: &quot;H.&quot;, &quot;parse-names&quot;: false, &quot;dropping-particle&quot;: &quot;&quot;, &quot;non-dropping-particle&quot;: &quot;&quot;}, {&quot;family&quot;: &quot;Li&quot;, &quot;given&quot;: &quot;Z.&quot;, &quot;parse-names&quot;: false, &quot;dropping-particle&quot;: &quot;&quot;, &quot;non-dropping-particle&quot;: &quot;&quot;}, {&quot;family&quot;: &quot;Liu&quot;, &quot;given&quot;: &quot;J.&quot;, &quot;parse-names&quot;: false, &quot;dropping-particle&quot;: &quot;&quot;, &quot;non-dropping-particle&quot;: &quot;&quot;}], &quot;issued&quot;: {&quot;date-parts&quot;: [[2026]]}, &quot;DOI&quot;: &quot;10.1016/j.patcog.2025.111992&quot;, &quot;type&quot;: &quot;article-journal&quot;, &quot;title&quot;: &quot;SceneLLM: Implicit language reasoning in LLM for dynamic scene graph generation&quot;, &quot;container-title&quot;: &quot;Pattern Recognition&quot;, &quot;volume&quot;: &quot;170&quot;, &quot;page&quot;: &quot;111992&quot;, &quot;id&quot;: &quot;ITEM-c14394b5-5d79-565b-92c8-bcd30bfc44ad&quot;, &quot;container-title-short&quot;: &quot;&quot;}, &quot;isTemporary&quot;: false}]}, {&quot;citationID&quot;: &quot;MENDELEY_CITATION_fac390e3-e126-4dc8-949f-c73795b3dab0&quot;, &quot;properties&quot;: {&quot;noteIndex&quot;: 0}, &quot;isEdited&quot;: false, &quot;manualOverride&quot;: {&quot;isManuallyOverridden&quot;: false, &quot;citeprocText&quot;: &quot;(Vaswani et al., 2017)&quot;, &quot;manualOverrideText&quot;: &quot;&quot;}, &quot;citationItems&quot;: [{&quot;id&quot;: &quot;ITEM-17a82183-4067-5f24-9b07-243be6e2ad27&quot;, &quot;itemData&quot;: {&quot;author&quot;: [{&quot;family&quot;: &quot;Vaswani&quot;, &quot;given&quot;: &quot;A.&quot;, &quot;parse-names&quot;: false, &quot;dropping-particle&quot;: &quot;&quot;, &quot;non-dropping-particle&quot;: &quot;&quot;}, {&quot;family&quot;: &quot;Shazeer&quot;, &quot;given&quot;: &quot;N.&quot;, &quot;parse-names&quot;: false, &quot;dropping-particle&quot;: &quot;&quot;, &quot;non-dropping-particle&quot;: &quot;&quot;}, {&quot;family&quot;: &quot;Parmar&quot;, &quot;given&quot;: &quot;N.&quot;, &quot;parse-names&quot;: false, &quot;dropping-particle&quot;: &quot;&quot;, &quot;non-dropping-particle&quot;: &quot;&quot;}, {&quot;family&quot;: &quot;Uszkoreit&quot;, &quot;given&quot;: &quot;J.&quot;, &quot;parse-names&quot;: false, &quot;dropping-particle&quot;: &quot;&quot;, &quot;non-dropping-particle&quot;: &quot;&quot;}, {&quot;family&quot;: &quot;Jones&quot;, &quot;given&quot;: &quot;L.&quot;, &quot;parse-names&quot;: false, &quot;dropping-particle&quot;: &quot;&quot;, &quot;non-dropping-particle&quot;: &quot;&quot;}, {&quot;family&quot;: &quot;Gomez&quot;, &quot;given&quot;: &quot;A. N.&quot;, &quot;parse-names&quot;: false, &quot;dropping-particle&quot;: &quot;&quot;, &quot;non-dropping-particle&quot;: &quot;&quot;}, {&quot;family&quot;: &quot;Kaiser&quot;, &quot;given&quot;: &quot;Ł.&quot;, &quot;parse-names&quot;: false, &quot;dropping-particle&quot;: &quot;&quot;, &quot;non-dropping-particle&quot;: &quot;&quot;}, {&quot;family&quot;: &quot;Polosukhin&quot;, &quot;given&quot;: &quot;I.&quot;, &quot;parse-names&quot;: false, &quot;dropping-particle&quot;: &quot;&quot;, &quot;non-dropping-particle&quot;: &quot;&quot;}], &quot;issued&quot;: {&quot;date-parts&quot;: [[2017]]}, &quot;DOI&quot;: &quot;10.48550/arXiv.1706.03762&quot;, &quot;type&quot;: &quot;paper-conference&quot;, &quot;title&quot;: &quot;Attention is all you need&quot;, &quot;container-title&quot;: &quot;Advances in Neural Information Processing Systems 30&quot;, &quot;page&quot;: &quot;5998-6008&quot;, &quot;id&quot;: &quot;ITEM-17a82183-4067-5f24-9b07-243be6e2ad27&quot;, &quot;container-title-short&quot;: &quot;&quot;}, &quot;isTemporary&quot;: false}]}, {&quot;citationID&quot;: &quot;MENDELEY_CITATION_0c9adeb2-0da5-4edd-a7eb-b76284602eef&quot;, &quot;properties&quot;: {&quot;noteIndex&quot;: 0}, &quot;isEdited&quot;: false, &quot;manualOverride&quot;: {&quot;isManuallyOverridden&quot;: false, &quot;citeprocText&quot;: &quot;(Li et al., 2023)&quot;, &quot;manualOverrideText&quot;: &quot;&quot;}, &quot;citationItems&quot;: [{&quot;id&quot;: &quot;ITEM-ef62fa18-4b28-5ee1-a9e5-7cfba1f59cd4&quot;, &quot;itemData&quot;: {&quot;author&quot;: [{&quot;family&quot;: &quot;Li&quot;, &quot;given&quot;: &quot;Y.&quot;, &quot;parse-names&quot;: false, &quot;dropping-particle&quot;: &quot;&quot;, &quot;non-dropping-particle&quot;: &quot;&quot;}, {&quot;family&quot;: &quot;Li&quot;, &quot;given&quot;: &quot;Z.&quot;, &quot;parse-names&quot;: false, &quot;dropping-particle&quot;: &quot;&quot;, &quot;non-dropping-particle&quot;: &quot;&quot;}, {&quot;family&quot;: &quot;Zhang&quot;, &quot;given&quot;: &quot;K.&quot;, &quot;parse-names&quot;: false, &quot;dropping-particle&quot;: &quot;&quot;, &quot;non-dropping-particle&quot;: &quot;&quot;}, {&quot;family&quot;: &quot;Dan&quot;, &quot;given&quot;: &quot;R.&quot;, &quot;parse-names&quot;: false, &quot;dropping-particle&quot;: &quot;&quot;, &quot;non-dropping-particle&quot;: &quot;&quot;}, {&quot;family&quot;: &quot;Jiang&quot;, &quot;given&quot;: &quot;S.&quot;, &quot;parse-names&quot;: false, &quot;dropping-particle&quot;: &quot;&quot;, &quot;non-dropping-particle&quot;: &quot;&quot;}, {&quot;family&quot;: &quot;Zhang&quot;, &quot;given&quot;: &quot;Y.&quot;, &quot;parse-names&quot;: false, &quot;dropping-particle&quot;: &quot;&quot;, &quot;non-dropping-particle&quot;: &quot;&quot;}], &quot;issued&quot;: {&quot;date-parts&quot;: [[2023]]}, &quot;DOI&quot;: &quot;10.7759/cureus.40895&quot;, &quot;type&quot;: &quot;article-journal&quot;, &quot;title&quot;: &quot;ChatDoctor: A medical chat model fine-tuned on a large language model Meta-AI (LLaMA) using medical domain knowledge&quot;, &quot;container-title&quot;: &quot;Cureus&quot;, &quot;id&quot;: &quot;ITEM-ef62fa18-4b28-5ee1-a9e5-7cfba1f59cd4&quot;, &quot;container-title-short&quot;: &quot;&quot;}, &quot;isTemporary&quot;: false}]}, {&quot;citationID&quot;: &quot;MENDELEY_CITATION_fc446758-4f8d-432e-961d-a1d614578e94&quot;, &quot;properties&quot;: {&quot;noteIndex&quot;: 0}, &quot;isEdited&quot;: false, &quot;manualOverride&quot;: {&quot;isManuallyOverridden&quot;: false, &quot;citeprocText&quot;: &quot;(Zavala Guirado et al., 2024)&quot;, &quot;manualOverrideText&quot;: &quot;&quot;}, &quot;citationItems&quot;: [{&quot;id&quot;: &quot;ITEM-3f3a4849-619c-5059-b1e7-bedbf71c7f24&quot;, &quot;itemData&quot;: {&quot;author&quot;: [{&quot;family&quot;: &quot;Zavala Guirado&quot;, &quot;given&quot;: &quot;M. A.&quot;, &quot;parse-names&quot;: false, &quot;dropping-particle&quot;: &quot;&quot;, &quot;non-dropping-particle&quot;: &quot;&quot;}, {&quot;family&quot;: &quot;González Castro&quot;, &quot;given&quot;: &quot;I.&quot;, &quot;parse-names&quot;: false, &quot;dropping-particle&quot;: &quot;&quot;, &quot;non-dropping-particle&quot;: &quot;&quot;}, {&quot;family&quot;: &quot;Tapia Ruelas&quot;, &quot;given&quot;: &quot;C. S.&quot;, &quot;parse-names&quot;: false, &quot;dropping-particle&quot;: &quot;&quot;, &quot;non-dropping-particle&quot;: &quot;&quot;}, {&quot;family&quot;: &quot;Cota Valenzuela&quot;, &quot;given&quot;: &quot;L. V.&quot;, &quot;parse-names&quot;: false, &quot;dropping-particle&quot;: &quot;&quot;, &quot;non-dropping-particle&quot;: &quot;&quot;}, {&quot;family&quot;: &quot;Durón Ramos&quot;, &quot;given&quot;: &quot;M. F.&quot;, &quot;parse-names&quot;: false, &quot;dropping-particle&quot;: &quot;&quot;, &quot;non-dropping-particle&quot;: &quot;&quot;}], &quot;issued&quot;: {&quot;date-parts&quot;: [[2024]]}, &quot;DOI&quot;: &quot;10.23913/ride.v14i28.1878&quot;, &quot;type&quot;: &quot;article-journal&quot;, &quot;title&quot;: &quot;Propiedades psicométricas de una escala para medir la práctica docente universitaria en la modalidad híbrida&quot;, &quot;container-title&quot;: &quot;RIDE Revista Iberoamericana para la Investigación y el Desarrollo Educativo&quot;, &quot;volume&quot;: &quot;14&quot;, &quot;issue&quot;: &quot;28&quot;, &quot;id&quot;: &quot;ITEM-3f3a4849-619c-5059-b1e7-bedbf71c7f24&quot;, &quot;container-title-short&quot;: &quot;&quot;}, &quot;isTemporary&quot;: false}]}, {&quot;citationID&quot;: &quot;MENDELEY_CITATION_5fe8c468-e1ef-46b7-a490-1613d6ca4388&quot;, &quot;properties&quot;: {&quot;noteIndex&quot;: 0}, &quot;isEdited&quot;: false, &quot;manualOverride&quot;: {&quot;isManuallyOverridden&quot;: false, &quot;citeprocText&quot;: &quot;(Chen y Guestrin, 2016)&quot;, &quot;manualOverrideText&quot;: &quot;&quot;}, &quot;citationItems&quot;: [{&quot;id&quot;: &quot;ITEM-15e61581-e955-52e7-b4fe-e53c650c3a2c&quot;, &quot;itemData&quot;: {&quot;author&quot;: [{&quot;family&quot;: &quot;Chen&quot;, &quot;given&quot;: &quot;T.&quot;, &quot;parse-names&quot;: false, &quot;dropping-particle&quot;: &quot;&quot;, &quot;non-dropping-particle&quot;: &quot;&quot;}, {&quot;family&quot;: &quot;Guestrin&quot;, &quot;given&quot;: &quot;C.&quot;, &quot;parse-names&quot;: false, &quot;dropping-particle&quot;: &quot;&quot;, &quot;non-dropping-particle&quot;: &quot;&quot;}], &quot;issued&quot;: {&quot;date-parts&quot;: [[2016]]}, &quot;DOI&quot;: &quot;10.1145/2939672.2939785&quot;, &quot;type&quot;: &quot;paper-conference&quot;, &quot;title&quot;: &quot;XGBoost: A scalable tree boosting system&quot;, &quot;container-title&quot;: &quot;Proceedings of the 22nd ACM SIGKDD International Conference on Knowledge Discovery and Data Mining&quot;, &quot;page&quot;: &quot;785-794&quot;, &quot;id&quot;: &quot;ITEM-15e61581-e955-52e7-b4fe-e53c650c3a2c&quot;, &quot;container-title-short&quot;: &quot;&quot;}, &quot;isTemporary&quot;: false}]}, {&quot;citationID&quot;: &quot;MENDELEY_CITATION_86e40b25-a895-4d33-8237-332ea10408af&quot;, &quot;properties&quot;: {&quot;noteIndex&quot;: 0}, &quot;isEdited&quot;: false, &quot;manualOverride&quot;: {&quot;isManuallyOverridden&quot;: false, &quot;citeprocText&quot;: &quot;(Chen y Guestrin, 2016)&quot;, &quot;manualOverrideText&quot;: &quot;&quot;}, &quot;citationItems&quot;: [{&quot;id&quot;: &quot;ITEM-15e61581-e955-52e7-b4fe-e53c650c3a2c&quot;, &quot;itemData&quot;: {&quot;author&quot;: [{&quot;family&quot;: &quot;Chen&quot;, &quot;given&quot;: &quot;T.&quot;, &quot;parse-names&quot;: false, &quot;dropping-particle&quot;: &quot;&quot;, &quot;non-dropping-particle&quot;: &quot;&quot;}, {&quot;family&quot;: &quot;Guestrin&quot;, &quot;given&quot;: &quot;C.&quot;, &quot;parse-names&quot;: false, &quot;dropping-particle&quot;: &quot;&quot;, &quot;non-dropping-particle&quot;: &quot;&quot;}], &quot;issued&quot;: {&quot;date-parts&quot;: [[2016]]}, &quot;DOI&quot;: &quot;10.1145/2939672.2939785&quot;, &quot;type&quot;: &quot;paper-conference&quot;, &quot;title&quot;: &quot;XGBoost: A scalable tree boosting system&quot;, &quot;container-title&quot;: &quot;Proceedings of the 22nd ACM SIGKDD International Conference on Knowledge Discovery and Data Mining&quot;, &quot;page&quot;: &quot;785-794&quot;, &quot;id&quot;: &quot;ITEM-15e61581-e955-52e7-b4fe-e53c650c3a2c&quot;, &quot;container-title-short&quot;: &quot;&quot;}, &quot;isTemporary&quot;: false}]}, {&quot;citationID&quot;: &quot;MENDELEY_CITATION_d8aaf1be-556c-4ec0-8373-aa12ac48f71d&quot;, &quot;properties&quot;: {&quot;noteIndex&quot;: 0}, &quot;isEdited&quot;: false, &quot;manualOverride&quot;: {&quot;isManuallyOverridden&quot;: false, &quot;citeprocText&quot;: &quot;(Cen et al., 2024; Nass et al., 2023)&quot;, &quot;manualOverrideText&quot;: &quot;&quot;}, &quot;citationItems&quot;: [{&quot;id&quot;: &quot;ITEM-fbe93c5f-260c-5b04-b4bc-393ef536cf4b&quot;, &quot;itemData&quot;: {&quot;author&quot;: [{&quot;family&quot;: &quot;Cen&quot;, &quot;given&quot;: &quot;C.&quot;, &quot;parse-names&quot;: false, &quot;dropping-particle&quot;: &quot;&quot;, &quot;non-dropping-particle&quot;: &quot;&quot;}, {&quot;family&quot;: &quot;Luo&quot;, &quot;given&quot;: &quot;G.&quot;, &quot;parse-names&quot;: false, &quot;dropping-particle&quot;: &quot;&quot;, &quot;non-dropping-particle&quot;: &quot;&quot;}, {&quot;family&quot;: &quot;Tian&quot;, &quot;given&quot;: &quot;Y.&quot;, &quot;parse-names&quot;: false, &quot;dropping-particle&quot;: &quot;&quot;, &quot;non-dropping-particle&quot;: &quot;&quot;}, {&quot;family&quot;: &quot;Fu&quot;, &quot;given&quot;: &quot;B.&quot;, &quot;parse-names&quot;: false, &quot;dropping-particle&quot;: &quot;&quot;, &quot;non-dropping-particle&quot;: &quot;&quot;}, {&quot;family&quot;: &quot;Chen&quot;, &quot;given&quot;: &quot;Y.&quot;, &quot;parse-names&quot;: false, &quot;dropping-particle&quot;: &quot;&quot;, &quot;non-dropping-particle&quot;: &quot;&quot;}, {&quot;family&quot;: &quot;Huang&quot;, &quot;given&quot;: &quot;S.&quot;, &quot;parse-names&quot;: false, &quot;dropping-particle&quot;: &quot;&quot;, &quot;non-dropping-particle&quot;: &quot;&quot;}, {&quot;family&quot;: &quot;Jiang&quot;, &quot;given&quot;: &quot;T.&quot;, &quot;parse-names&quot;: false, &quot;dropping-particle&quot;: &quot;&quot;, &quot;non-dropping-particle&quot;: &quot;&quot;}, {&quot;family&quot;: &quot;Huang&quot;, &quot;given&quot;: &quot;G.&quot;, &quot;parse-names&quot;: false, &quot;dropping-particle&quot;: &quot;&quot;, &quot;non-dropping-particle&quot;: &quot;&quot;}], &quot;issued&quot;: {&quot;date-parts&quot;: [[2024]]}, &quot;DOI&quot;: &quot;10.1057/s41599-024-03537-w&quot;, &quot;type&quot;: &quot;article-journal&quot;, &quot;title&quot;: &quot;Enhancing the dissemination of Cantonese Opera among youth via Bilibili: A study on intangible cultural heritage transmission&quot;, &quot;container-title&quot;: &quot;Humanities and Social Sciences Communications&quot;, &quot;volume&quot;: &quot;11&quot;, &quot;issue&quot;: &quot;1&quot;, &quot;page&quot;: &quot;1038&quot;, &quot;id&quot;: &quot;ITEM-fbe93c5f-260c-5b04-b4bc-393ef536cf4b&quot;, &quot;container-title-short&quot;: &quot;&quot;}, &quot;isTemporary&quot;: false}, {&quot;id&quot;: &quot;ITEM-b9bb7734-2112-5534-b5a9-0ea79b3bd04f&quot;, &quot;itemData&quot;: {&quot;author&quot;: [{&quot;family&quot;: &quot;Nass&quot;, &quot;given&quot;: &quot;O.&quot;, &quot;parse-names&quot;: false, &quot;dropping-particle&quot;: &quot;&quot;, &quot;non-dropping-particle&quot;: &quot;&quot;}, {&quot;family&quot;: &quot;Skuliabina&quot;, &quot;given&quot;: &quot;O.&quot;, &quot;parse-names&quot;: false, &quot;dropping-particle&quot;: &quot;&quot;, &quot;non-dropping-particle&quot;: &quot;&quot;}, {&quot;family&quot;: &quot;Bapiyev&quot;, &quot;given&quot;: &quot;I.&quot;, &quot;parse-names&quot;: false, &quot;dropping-particle&quot;: &quot;&quot;, &quot;non-dropping-particle&quot;: &quot;&quot;}, {&quot;family&quot;: &quot;Dnekeshev&quot;, &quot;given&quot;: &quot;A.&quot;, &quot;parse-names&quot;: false, &quot;dropping-particle&quot;: &quot;&quot;, &quot;non-dropping-particle&quot;: &quot;&quot;}, {&quot;family&quot;: &quot;Bekenova&quot;, &quot;given&quot;: &quot;S.&quot;, &quot;parse-names&quot;: false, &quot;dropping-particle&quot;: &quot;&quot;, &quot;non-dropping-particle&quot;: &quot;&quot;}, {&quot;family&quot;: &quot;Bekenova&quot;, &quot;given&quot;: &quot;A.&quot;, &quot;parse-names&quot;: false, &quot;dropping-particle&quot;: &quot;&quot;, &quot;non-dropping-particle&quot;: &quot;&quot;}], &quot;issued&quot;: {&quot;date-parts&quot;: [[2023]]}, &quot;DOI&quot;: &quot;10.1051/e3sconf/202338908003&quot;, &quot;type&quot;: &quot;article-journal&quot;, &quot;title&quot;: &quot;Blended learning as a promising direction of informatization of higher education&quot;, &quot;container-title&quot;: &quot;E3S Web of Conferences&quot;, &quot;volume&quot;: &quot;389&quot;, &quot;page&quot;: &quot;08003&quot;, &quot;id&quot;: &quot;ITEM-b9bb7734-2112-5534-b5a9-0ea79b3bd04f&quot;, &quot;container-title-short&quot;: &quot;&quot;}, &quot;isTemporary&quot;: false}]}, {&quot;citationID&quot;: &quot;MENDELEY_CITATION_33e9e359-0389-4d77-9c11-a25f70065c68&quot;, &quot;properties&quot;: {&quot;noteIndex&quot;: 0}, &quot;isEdited&quot;: false, &quot;manualOverride&quot;: {&quot;isManuallyOverridden&quot;: false, &quot;citeprocText&quot;: &quot;(Kung et al., 2023)&quot;, &quot;manualOverrideText&quot;: &quot;&quot;}, &quot;citationItems&quot;: [{&quot;id&quot;: &quot;ITEM-99395dc7-3112-55c2-b534-aefba14e6965&quot;, &quot;itemData&quot;: {&quot;author&quot;: [{&quot;family&quot;: &quot;Kung&quot;, &quot;given&quot;: &quot;T. H.&quot;, &quot;parse-names&quot;: false, &quot;dropping-particle&quot;: &quot;&quot;, &quot;non-dropping-particle&quot;: &quot;&quot;}, {&quot;family&quot;: &quot;Cheatham&quot;, &quot;given&quot;: &quot;M.&quot;, &quot;parse-names&quot;: false, &quot;dropping-particle&quot;: &quot;&quot;, &quot;non-dropping-particle&quot;: &quot;&quot;}, {&quot;family&quot;: &quot;Medenilla&quot;, &quot;given&quot;: &quot;A.&quot;, &quot;parse-names&quot;: false, &quot;dropping-particle&quot;: &quot;&quot;, &quot;non-dropping-particle&quot;: &quot;&quot;}, {&quot;family&quot;: &quot;Sillos&quot;, &quot;given&quot;: &quot;C.&quot;, &quot;parse-names&quot;: false, &quot;dropping-particle&quot;: &quot;&quot;, &quot;non-dropping-particle&quot;: &quot;&quot;}, {&quot;family&quot;: &quot;De Leon&quot;, &quot;given&quot;: &quot;L.&quot;, &quot;parse-names&quot;: false, &quot;dropping-particle&quot;: &quot;&quot;, &quot;non-dropping-particle&quot;: &quot;&quot;}, {&quot;family&quot;: &quot;Elepaño&quot;, &quot;given&quot;: &quot;C.&quot;, &quot;parse-names&quot;: false, &quot;dropping-particle&quot;: &quot;&quot;, &quot;non-dropping-particle&quot;: &quot;&quot;}, {&quot;family&quot;: &quot;Madriaga&quot;, &quot;given&quot;: &quot;M.&quot;, &quot;parse-names&quot;: false, &quot;dropping-particle&quot;: &quot;&quot;, &quot;non-dropping-particle&quot;: &quot;&quot;}, {&quot;family&quot;: &quot;Aggabao&quot;, &quot;given&quot;: &quot;R.&quot;, &quot;parse-names&quot;: false, &quot;dropping-particle&quot;: &quot;&quot;, &quot;non-dropping-particle&quot;: &quot;&quot;}, {&quot;family&quot;: &quot;Diaz-Candido&quot;, &quot;given&quot;: &quot;G.&quot;, &quot;parse-names&quot;: false, &quot;dropping-particle&quot;: &quot;&quot;, &quot;non-dropping-particle&quot;: &quot;&quot;}, {&quot;family&quot;: &quot;Maningo&quot;, &quot;given&quot;: &quot;J.&quot;, &quot;parse-names&quot;: false, &quot;dropping-particle&quot;: &quot;&quot;, &quot;non-dropping-particle&quot;: &quot;&quot;}, {&quot;family&quot;: &quot;Tseng&quot;, &quot;given&quot;: &quot;V.&quot;, &quot;parse-names&quot;: false, &quot;dropping-particle&quot;: &quot;&quot;, &quot;non-dropping-particle&quot;: &quot;&quot;}], &quot;issued&quot;: {&quot;date-parts&quot;: [[2023]]}, &quot;DOI&quot;: &quot;10.1371/journal.pdig.0000198&quot;, &quot;type&quot;: &quot;article-journal&quot;, &quot;title&quot;: &quot;Performance of ChatGPT on USMLE: Potential for AI-assisted medical education using large language models&quot;, &quot;container-title&quot;: &quot;PLOS Digital Health&quot;, &quot;volume&quot;: &quot;2&quot;, &quot;issue&quot;: &quot;2&quot;, &quot;page&quot;: &quot;e0000198&quot;, &quot;id&quot;: &quot;ITEM-99395dc7-3112-55c2-b534-aefba14e6965&quot;, &quot;container-title-short&quot;: &quot;&quot;}, &quot;isTemporary&quot;: false}]}, {&quot;citationID&quot;: &quot;MENDELEY_CITATION_dfd3e635-8c18-4d17-8d35-192086db7444&quot;, &quot;properties&quot;: {&quot;noteIndex&quot;: 0}, &quot;isEdited&quot;: false, &quot;manualOverride&quot;: {&quot;isManuallyOverridden&quot;: false, &quot;citeprocText&quot;: &quot;(Fernández et al., 2025; Navarro Forero et al., 2025)&quot;, &quot;manualOverrideText&quot;: &quot;&quot;}, &quot;citationItems&quot;: [{&quot;id&quot;: &quot;ITEM-6e797b0e-8270-559d-850f-c5042d0b3d16&quot;, &quot;itemData&quot;: {&quot;author&quot;: [{&quot;family&quot;: &quot;Fernández&quot;, &quot;given&quot;: &quot;J. M.&quot;, &quot;parse-names&quot;: false, &quot;dropping-particle&quot;: &quot;&quot;, &quot;non-dropping-particle&quot;: &quot;&quot;}, {&quot;family&quot;: &quot;Petrocelli&quot;, &quot;given&quot;: &quot;D. M.&quot;, &quot;parse-names&quot;: false, &quot;dropping-particle&quot;: &quot;&quot;, &quot;non-dropping-particle&quot;: &quot;&quot;}, {&quot;family&quot;: &quot;Matuk&quot;, &quot;given&quot;: &quot;R.&quot;, &quot;parse-names&quot;: false, &quot;dropping-particle&quot;: &quot;&quot;, &quot;non-dropping-particle&quot;: &quot;&quot;}, {&quot;family&quot;: &quot;Lanson&quot;, &quot;given&quot;: &quot;D.&quot;, &quot;parse-names&quot;: false, &quot;dropping-particle&quot;: &quot;&quot;, &quot;non-dropping-particle&quot;: &quot;&quot;}, {&quot;family&quot;: &quot;Zamudio&quot;, &quot;given&quot;: &quot;E.&quot;, &quot;parse-names&quot;: false, &quot;dropping-particle&quot;: &quot;&quot;, &quot;non-dropping-particle&quot;: &quot;&quot;}, {&quot;family&quot;: &quot;Cagnina&quot;, &quot;given&quot;: &quot;L. C.&quot;, &quot;parse-names&quot;: false, &quot;dropping-particle&quot;: &quot;&quot;, &quot;non-dropping-particle&quot;: &quot;&quot;}, {&quot;family&quot;: &quot;Gil Costa&quot;, &quot;given&quot;: &quot;G. V.&quot;, &quot;parse-names&quot;: false, &quot;dropping-particle&quot;: &quot;&quot;, &quot;non-dropping-particle&quot;: &quot;&quot;}, {&quot;family&quot;: &quot;Errecalde&quot;, &quot;given&quot;: &quot;M. L.&quot;, &quot;parse-names&quot;: false, &quot;dropping-particle&quot;: &quot;&quot;, &quot;non-dropping-particle&quot;: &quot;&quot;}], &quot;issued&quot;: {&quot;date-parts&quot;: [[2025]]}, &quot;URL&quot;: &quot;http://sedici.unlp.edu.ar/handle/10915/183892&quot;, &quot;type&quot;: &quot;paper-conference&quot;, &quot;title&quot;: &quot;Fine-tuning y adaptación de modelos de lenguaje abiertos en infraestructura HPC para aplicaciones de dominio específico&quot;, &quot;container-title&quot;: &quot;Libro de actas del XXVII Workshop de Investigadores en Ciencias de la Computación&quot;, &quot;page&quot;: &quot;72-76&quot;, &quot;publisher&quot;: &quot;Red de Universidades con Carreras en Informática&quot;, &quot;id&quot;: &quot;ITEM-6e797b0e-8270-559d-850f-c5042d0b3d16&quot;, &quot;container-title-short&quot;: &quot;&quot;}, &quot;isTemporary&quot;: false}, {&quot;id&quot;: &quot;ITEM-559494bb-9754-5dfe-91e6-ccf0c9ae12dc&quot;, &quot;itemData&quot;: {&quot;author&quot;: [{&quot;family&quot;: &quot;Navarro Forero&quot;, &quot;given&quot;: &quot;C. A.&quot;, &quot;parse-names&quot;: false, &quot;dropping-particle&quot;: &quot;&quot;, &quot;non-dropping-particle&quot;: &quot;&quot;}, {&quot;family&quot;: &quot;Hernández&quot;, &quot;given&quot;: &quot;M. A.&quot;, &quot;parse-names&quot;: false, &quot;dropping-particle&quot;: &quot;&quot;, &quot;non-dropping-particle&quot;: &quot;&quot;}, {&quot;family&quot;: &quot;Viloria&quot;, &quot;given&quot;: &quot;K. T.&quot;, &quot;parse-names&quot;: false, &quot;dropping-particle&quot;: &quot;&quot;, &quot;non-dropping-particle&quot;: &quot;&quot;}], &quot;issued&quot;: {&quot;date-parts&quot;: [[2025]]}, &quot;DOI&quot;: &quot;10.26507/paper.4223&quot;, &quot;type&quot;: &quot;paper-conference&quot;, &quot;title&quot;: &quot;Nuevas rutas de aprendizaje: adaptación de contenidos académicos a formatos audiovisuales para mejorar la preparación de los estudiantes&quot;, &quot;container-title&quot;: &quot;Encuentro Internacional de Educación en Ingeniería&quot;, &quot;publisher&quot;: &quot;Asociación Colombiana de Facultades de Ingeniería&quot;, &quot;id&quot;: &quot;ITEM-559494bb-9754-5dfe-91e6-ccf0c9ae12dc&quot;, &quot;container-title-short&quot;: &quot;&quot;}, &quot;isTemporary&quot;: false}]}, {&quot;citationID&quot;: &quot;MENDELEY_CITATION_9ac5069c-5514-4cdd-8767-11668642561b&quot;, &quot;properties&quot;: {&quot;noteIndex&quot;: 0}, &quot;isEdited&quot;: false, &quot;manualOverride&quot;: {&quot;isManuallyOverridden&quot;: true, &quot;citeprocText&quot;: &quot;(Cisneros-Bravo et al., 2023)&quot;, &quot;manualOverrideText&quot;: &quot;Cisneros-Bravo et al. (2023)&quot;}, &quot;citationItems&quot;: [{&quot;id&quot;: &quot;ITEM-2c1f70fd-8745-538a-b99f-18d256f44b4f&quot;, &quot;itemData&quot;: {&quot;author&quot;: [{&quot;family&quot;: &quot;Cisneros-Bravo&quot;, &quot;given&quot;: &quot;B. E.&quot;, &quot;parse-names&quot;: false, &quot;dropping-particle&quot;: &quot;&quot;, &quot;non-dropping-particle&quot;: &quot;&quot;}, {&quot;family&quot;: &quot;Rodríguez-Aguilar&quot;, &quot;given&quot;: &quot;R. M.&quot;, &quot;parse-names&quot;: false, &quot;dropping-particle&quot;: &quot;&quot;, &quot;non-dropping-particle&quot;: &quot;&quot;}, {&quot;family&quot;: &quot;Niño-Membrillo&quot;, &quot;given&quot;: &quot;Y. E.&quot;, &quot;parse-names&quot;: false, &quot;dropping-particle&quot;: &quot;&quot;, &quot;non-dropping-particle&quot;: &quot;&quot;}, {&quot;family&quot;: &quot;Cuevas-Rasgado&quot;, &quot;given&quot;: &quot;A. D.&quot;, &quot;parse-names&quot;: false, &quot;dropping-particle&quot;: &quot;&quot;, &quot;non-dropping-particle&quot;: &quot;&quot;}], &quot;issued&quot;: {&quot;date-parts&quot;: [[2023]]}, &quot;DOI&quot;: &quot;10.23913/ride.v14i27.1715&quot;, &quot;type&quot;: &quot;article-journal&quot;, &quot;title&quot;: &quot;Falta de orientación vocacional como factor en la deserción universitaria. Caso de estudio: zona Oriente del Estado de México&quot;, &quot;container-title&quot;: &quot;RIDE Revista Iberoamericana para la Investigación y el Desarrollo Educativo&quot;, &quot;volume&quot;: &quot;14&quot;, &quot;issue&quot;: &quot;27&quot;, &quot;id&quot;: &quot;ITEM-2c1f70fd-8745-538a-b99f-18d256f44b4f&quot;, &quot;container-title-short&quot;: &quot;&quot;}, &quot;isTemporary&quot;: false}]}, {&quot;citationID&quot;: &quot;MENDELEY_CITATION_863ea348-01a2-4abc-96c2-6e518f66bed5&quot;, &quot;properties&quot;: {&quot;noteIndex&quot;: 0}, &quot;isEdited&quot;: false, &quot;manualOverride&quot;: {&quot;isManuallyOverridden&quot;: true, &quot;citeprocText&quot;: &quot;(Alejandro Jaramillo, 2024)&quot;, &quot;manualOverrideText&quot;: &quot;Alejandro Jaramillo (2024)&quot;}, &quot;citationItems&quot;: [{&quot;id&quot;: &quot;ITEM-48bd420c-bbe4-5e36-8528-5e5a4a98c378&quot;, &quot;itemData&quot;: {&quot;author&quot;: [{&quot;family&quot;: &quot;Alejandro Jaramillo&quot;, &quot;given&quot;: &quot;S. Y.&quot;, &quot;parse-names&quot;: false, &quot;dropping-particle&quot;: &quot;&quot;, &quot;non-dropping-particle&quot;: &quot;&quot;}], &quot;issued&quot;: {&quot;date-parts&quot;: [[2024]]}, &quot;DOI&quot;: &quot;10.29394/scientific.issn.2542-2987.2024.9.34.13.285-300&quot;, &quot;type&quot;: &quot;article-journal&quot;, &quot;title&quot;: &quot;Orientación vocacional y profesional: la inteligencia artificial y su impacto en la educación&quot;, &quot;container-title&quot;: &quot;Revista Scientific&quot;, &quot;volume&quot;: &quot;9&quot;, &quot;issue&quot;: &quot;34&quot;, &quot;page&quot;: &quot;285-300&quot;, &quot;id&quot;: &quot;ITEM-48bd420c-bbe4-5e36-8528-5e5a4a98c378&quot;, &quot;container-title-short&quot;: &quot;&quot;}, &quot;isTemporary&quot;: false}]}, {&quot;citationID&quot;: &quot;MENDELEY_CITATION_b8183091-299e-469e-b2c5-e1bc0fdfed98&quot;, &quot;properties&quot;: {&quot;noteIndex&quot;: 0}, &quot;isEdited&quot;: false, &quot;manualOverride&quot;: {&quot;isManuallyOverridden&quot;: false, &quot;citeprocText&quot;: &quot;(Flores Meléndez et al., 2020)&quot;, &quot;manualOverrideText&quot;: &quot;&quot;}, &quot;citationItems&quot;: [{&quot;id&quot;: &quot;ITEM-25516478-e44c-5fcc-bc7e-03c8c680ebf5&quot;, &quot;itemData&quot;: {&quot;author&quot;: [{&quot;family&quot;: &quot;Flores Meléndez&quot;, &quot;given&quot;: &quot;M.&quot;, &quot;parse-names&quot;: false, &quot;dropping-particle&quot;: &quot;&quot;, &quot;non-dropping-particle&quot;: &quot;&quot;}, {&quot;family&quot;: &quot;Góngora Cortés&quot;, &quot;given&quot;: &quot;J. J.&quot;, &quot;parse-names&quot;: false, &quot;dropping-particle&quot;: &quot;&quot;, &quot;non-dropping-particle&quot;: &quot;&quot;}, {&quot;family&quot;: &quot;López Cabrera&quot;, &quot;given&quot;: &quot;M. V.&quot;, &quot;parse-names&quot;: false, &quot;dropping-particle&quot;: &quot;&quot;, &quot;non-dropping-particle&quot;: &quot;&quot;}, {&quot;family&quot;: &quot;Eraña Rojas&quot;, &quot;given&quot;: &quot;I. E.&quot;, &quot;parse-names&quot;: false, &quot;dropping-particle&quot;: &quot;&quot;, &quot;non-dropping-particle&quot;: &quot;&quot;}], &quot;issued&quot;: {&quot;date-parts&quot;: [[2020]]}, &quot;DOI&quot;: &quot;10.1016/j.edumed.2018.11.008&quot;, &quot;type&quot;: &quot;article-journal&quot;, &quot;title&quot;: &quot;The «call» of medicine. Use of new mentoring models for vocational orientation&quot;, &quot;container-title&quot;: &quot;Educación Médica&quot;, &quot;volume&quot;: &quot;21&quot;, &quot;issue&quot;: &quot;2&quot;, &quot;page&quot;: &quot;145-148&quot;, &quot;id&quot;: &quot;ITEM-25516478-e44c-5fcc-bc7e-03c8c680ebf5&quot;, &quot;container-title-short&quot;: &quot;&quot;}, &quot;isTemporary&quot;: false}]}, {&quot;citationID&quot;: &quot;MENDELEY_CITATION_c2022c67-a947-435e-a54d-1639e734a4ac&quot;, &quot;properties&quot;: {&quot;noteIndex&quot;: 0}, &quot;isEdited&quot;: false, &quot;manualOverride&quot;: {&quot;isManuallyOverridden&quot;: false, &quot;citeprocText&quot;: &quot;(Yupanqui Sanchez, 2024)&quot;, &quot;manualOverrideText&quot;: &quot;&quot;}, &quot;citationItems&quot;: [{&quot;id&quot;: &quot;ITEM-41aff42e-02f9-5cf8-bac7-1a6378feb8f5&quot;, &quot;itemData&quot;: {&quot;author&quot;: [{&quot;family&quot;: &quot;Yupanqui Sanchez&quot;, &quot;given&quot;: &quot;L. A.&quot;, &quot;parse-names&quot;: false, &quot;dropping-particle&quot;: &quot;&quot;, &quot;non-dropping-particle&quot;: &quot;&quot;}], &quot;issued&quot;: {&quot;date-parts&quot;: [[2024]]}, &quot;URL&quot;: &quot;https://repositorio.une.edu.pe/server/api/core/bitstreams/0a198466-0baf-4299-897b-90a22a49c958/content&quot;, &quot;type&quot;: &quot;thesis&quot;, &quot;title&quot;: &quot;Perfil del egresado y la formación profesional en estudiantes del último año de arquitectura de la Universidad Femenina del Sagrado Corazón, 2020&quot;, &quot;genre&quot;: &quot;Tesis de maestría&quot;, &quot;publisher&quot;: &quot;Universidad Nacional de Educación Enrique Guzmán y Valle&quot;, &quot;id&quot;: &quot;ITEM-41aff42e-02f9-5cf8-bac7-1a6378feb8f5&quot;, &quot;container-title-short&quot;: &quot;&quot;}, &quot;isTemporary&quot;: false}]}, {&quot;citationID&quot;: &quot;MENDELEY_CITATION_6d1b16e0-b95e-4d5e-9eef-02edc69a5ff4&quot;, &quot;properties&quot;: {&quot;noteIndex&quot;: 0}, &quot;isEdited&quot;: false, &quot;manualOverride&quot;: {&quot;isManuallyOverridden&quot;: false, &quot;citeprocText&quot;: &quot;(Aguilar-Reyes et al., 2025)&quot;, &quot;manualOverrideText&quot;: &quot;&quot;}, &quot;citationItems&quot;: [{&quot;id&quot;: &quot;ITEM-8c9c99df-1678-5fab-b737-85f1e9842ee2&quot;, &quot;itemData&quot;: {&quot;author&quot;: [{&quot;family&quot;: &quot;Aguilar-Reyes&quot;, &quot;given&quot;: &quot;J. E.&quot;, &quot;parse-names&quot;: false, &quot;dropping-particle&quot;: &quot;&quot;, &quot;non-dropping-particle&quot;: &quot;&quot;}, {&quot;family&quot;: &quot;Mejía-Peñafiel&quot;, &quot;given&quot;: &quot;E. F.&quot;, &quot;parse-names&quot;: false, &quot;dropping-particle&quot;: &quot;&quot;, &quot;non-dropping-particle&quot;: &quot;&quot;}, {&quot;family&quot;: &quot;Morocho-Barrionuevo&quot;, &quot;given&quot;: &quot;T. P.&quot;, &quot;parse-names&quot;: false, &quot;dropping-particle&quot;: &quot;&quot;, &quot;non-dropping-particle&quot;: &quot;&quot;}, {&quot;family&quot;: &quot;Velasco-Castelo&quot;, &quot;given&quot;: &quot;G.-M.&quot;, &quot;parse-names&quot;: false, &quot;dropping-particle&quot;: &quot;&quot;, &quot;non-dropping-particle&quot;: &quot;&quot;}], &quot;issued&quot;: {&quot;date-parts&quot;: [[2025]]}, &quot;DOI&quot;: &quot;10.36390/telos271.08&quot;, &quot;type&quot;: &quot;article-journal&quot;, &quot;title&quot;: &quot;Estudio del rendimiento académico mediante la comparación de modelos de regresión y árboles de clasificación&quot;, &quot;container-title&quot;: &quot;Telos: Revista de Estudios Interdisciplinarios en Ciencias Sociales&quot;, &quot;volume&quot;: &quot;27&quot;, &quot;issue&quot;: &quot;1&quot;, &quot;page&quot;: &quot;94-115&quot;, &quot;id&quot;: &quot;ITEM-8c9c99df-1678-5fab-b737-85f1e9842ee2&quot;, &quot;container-title-short&quot;: &quot;&quot;}, &quot;isTemporary&quot;: false}]}, {&quot;citationID&quot;: &quot;MENDELEY_CITATION_7478018e-e259-465a-b05d-4ca8d424cceb&quot;, &quot;properties&quot;: {&quot;noteIndex&quot;: 0}, &quot;isEdited&quot;: false, &quot;manualOverride&quot;: {&quot;isManuallyOverridden&quot;: false, &quot;citeprocText&quot;: &quot;(Muñoz Pilozo et al., 2024; Sabando Moreira y Zambrano Montenegro, 2024)&quot;, &quot;manualOverrideText&quot;: &quot;&quot;}, &quot;citationItems&quot;: [{&quot;id&quot;: &quot;ITEM-61284f77-93cc-5f63-a665-e96ce95b70b6&quot;, &quot;itemData&quot;: {&quot;author&quot;: [{&quot;family&quot;: &quot;Muñoz Pilozo&quot;, &quot;given&quot;: &quot;A. G.&quot;, &quot;parse-names&quot;: false, &quot;dropping-particle&quot;: &quot;&quot;, &quot;non-dropping-particle&quot;: &quot;&quot;}, {&quot;family&quot;: &quot;Villalva Pilozo&quot;, &quot;given&quot;: &quot;A. M.&quot;, &quot;parse-names&quot;: false, &quot;dropping-particle&quot;: &quot;&quot;, &quot;non-dropping-particle&quot;: &quot;&quot;}, {&quot;family&quot;: &quot;Medina Castro&quot;, &quot;given&quot;: &quot;A. R.&quot;, &quot;parse-names&quot;: false, &quot;dropping-particle&quot;: &quot;&quot;, &quot;non-dropping-particle&quot;: &quot;&quot;}, {&quot;family&quot;: &quot;Pilozo Mendoza&quot;, &quot;given&quot;: &quot;J. J.&quot;, &quot;parse-names&quot;: false, &quot;dropping-particle&quot;: &quot;&quot;, &quot;non-dropping-particle&quot;: &quot;&quot;}], &quot;issued&quot;: {&quot;date-parts&quot;: [[2024]]}, &quot;DOI&quot;: &quot;10.29394/scientific.issn.2542-2987.2024.9.33.2.45-63&quot;, &quot;type&quot;: &quot;article-journal&quot;, &quot;title&quot;: &quot;Factores determinantes en el éxito del proceso de enseñanza-aprendizaje&quot;, &quot;container-title&quot;: &quot;Revista Scientific&quot;, &quot;volume&quot;: &quot;9&quot;, &quot;issue&quot;: &quot;33&quot;, &quot;page&quot;: &quot;45-63&quot;, &quot;id&quot;: &quot;ITEM-61284f77-93cc-5f63-a665-e96ce95b70b6&quot;, &quot;container-title-short&quot;: &quot;&quot;}, &quot;isTemporary&quot;: false}, {&quot;id&quot;: &quot;ITEM-a0688692-4e9a-5603-b80c-d3a280f7095d&quot;, &quot;itemData&quot;: {&quot;author&quot;: [{&quot;family&quot;: &quot;Sabando Moreira&quot;, &quot;given&quot;: &quot;P. A.&quot;, &quot;parse-names&quot;: false, &quot;dropping-particle&quot;: &quot;&quot;, &quot;non-dropping-particle&quot;: &quot;&quot;}, {&quot;family&quot;: &quot;Zambrano Montenegro&quot;, &quot;given&quot;: &quot;D. F.&quot;, &quot;parse-names&quot;: false, &quot;dropping-particle&quot;: &quot;&quot;, &quot;non-dropping-particle&quot;: &quot;&quot;}], &quot;issued&quot;: {&quot;date-parts&quot;: [[2024]]}, &quot;DOI&quot;: &quot;10.60100/rcmg.v5i2.245&quot;, &quot;type&quot;: &quot;article-journal&quot;, &quot;title&quot;: &quot;Técnicas de machine learning para predecir la deserción estudiantil universitaria: una revisión sistemática de la literatura&quot;, &quot;container-title&quot;: &quot;Revista Científica Multidisciplinar G-nerando&quot;, &quot;volume&quot;: &quot;5&quot;, &quot;issue&quot;: &quot;2&quot;, &quot;page&quot;: &quot;997-1023&quot;, &quot;id&quot;: &quot;ITEM-a0688692-4e9a-5603-b80c-d3a280f7095d&quot;, &quot;container-title-short&quot;: &quot;&quot;}, &quot;isTemporary&quot;: false}]}, {&quot;citationID&quot;: &quot;MENDELEY_CITATION_ff35c946-6e1b-4afe-bc3c-eb684e6b619a&quot;, &quot;properties&quot;: {&quot;noteIndex&quot;: 0}, &quot;isEdited&quot;: false, &quot;manualOverride&quot;: {&quot;isManuallyOverridden&quot;: false, &quot;citeprocText&quot;: &quot;(Jardón Gallegos et al., 2024)&quot;, &quot;manualOverrideText&quot;: &quot;&quot;}, &quot;citationItems&quot;: [{&quot;id&quot;: &quot;ITEM-32cbb7b1-4322-555e-b4d5-de0a8016f45b&quot;, &quot;itemData&quot;: {&quot;author&quot;: [{&quot;family&quot;: &quot;Jardón Gallegos&quot;, &quot;given&quot;: &quot;M. del C.&quot;, &quot;parse-names&quot;: false, &quot;dropping-particle&quot;: &quot;&quot;, &quot;non-dropping-particle&quot;: &quot;&quot;}, {&quot;family&quot;: &quot;Granizo Malusin&quot;, &quot;given&quot;: &quot;J. H.&quot;, &quot;parse-names&quot;: false, &quot;dropping-particle&quot;: &quot;&quot;, &quot;non-dropping-particle&quot;: &quot;&quot;}, {&quot;family&quot;: &quot;Yaselga Auz&quot;, &quot;given&quot;: &quot;W. F.&quot;, &quot;parse-names&quot;: false, &quot;dropping-particle&quot;: &quot;&quot;, &quot;non-dropping-particle&quot;: &quot;&quot;}, {&quot;family&quot;: &quot;Cocha Telenchana&quot;, &quot;given&quot;: &quot;M. G.&quot;, &quot;parse-names&quot;: false, &quot;dropping-particle&quot;: &quot;&quot;, &quot;non-dropping-particle&quot;: &quot;&quot;}], &quot;issued&quot;: {&quot;date-parts&quot;: [[2024]]}, &quot;DOI&quot;: &quot;10.59814/resofro.2024.4(4)338&quot;, &quot;type&quot;: &quot;article-journal&quot;, &quot;title&quot;: &quot;Impacto de los asistentes virtuales de inteligencia artificial en el rendimiento académico de estudiantes universitarios&quot;, &quot;container-title&quot;: &quot;Revista Social Fronteriza&quot;, &quot;volume&quot;: &quot;4&quot;, &quot;issue&quot;: &quot;4&quot;, &quot;page&quot;: &quot;e44338&quot;, &quot;id&quot;: &quot;ITEM-32cbb7b1-4322-555e-b4d5-de0a8016f45b&quot;, &quot;container-title-short&quot;: &quot;&quot;}, &quot;isTemporary&quot;: false}]}, {&quot;citationID&quot;: &quot;MENDELEY_CITATION_12f977eb-cef3-498b-a994-3799a53b8d60&quot;, &quot;properties&quot;: {&quot;noteIndex&quot;: 0}, &quot;isEdited&quot;: false, &quot;manualOverride&quot;: {&quot;isManuallyOverridden&quot;: false, &quot;citeprocText&quot;: &quot;(Escalante López et al., 2023)&quot;, &quot;manualOverrideText&quot;: &quot;&quot;}, &quot;citationItems&quot;: [{&quot;id&quot;: &quot;ITEM-04a17615-a429-5a99-899e-3433dd572883&quot;, &quot;itemData&quot;: {&quot;author&quot;: [{&quot;family&quot;: &quot;Escalante López&quot;, &quot;given&quot;: &quot;J. I.&quot;, &quot;parse-names&quot;: false, &quot;dropping-particle&quot;: &quot;&quot;, &quot;non-dropping-particle&quot;: &quot;&quot;}, {&quot;family&quot;: &quot;Medina Valderrama&quot;, &quot;given&quot;: &quot;C. J.&quot;, &quot;parse-names&quot;: false, &quot;dropping-particle&quot;: &quot;&quot;, &quot;non-dropping-particle&quot;: &quot;&quot;}, {&quot;family&quot;: &quot;Vásquez Muñoz&quot;, &quot;given&quot;: &quot;A.&quot;, &quot;parse-names&quot;: false, &quot;dropping-particle&quot;: &quot;&quot;, &quot;non-dropping-particle&quot;: &quot;&quot;}], &quot;issued&quot;: {&quot;date-parts&quot;: [[2023]]}, &quot;DOI&quot;: &quot;10.26495/rch.v7i1.2421&quot;, &quot;type&quot;: &quot;article-journal&quot;, &quot;title&quot;: &quot;La deserción universitaria: un problema no resuelto en el Perú&quot;, &quot;container-title&quot;: &quot;Hacedor - AIAPÆC&quot;, &quot;volume&quot;: &quot;7&quot;, &quot;issue&quot;: &quot;1&quot;, &quot;page&quot;: &quot;60-72&quot;, &quot;id&quot;: &quot;ITEM-04a17615-a429-5a99-899e-3433dd572883&quot;, &quot;container-title-short&quot;: &quot;&quot;}, &quot;isTemporary&quot;: false}]}, {&quot;citationID&quot;: &quot;MENDELEY_CITATION_d0f34e9e-62c6-4a76-a392-8b60cd36e016&quot;, &quot;properties&quot;: {&quot;noteIndex&quot;: 0}, &quot;isEdited&quot;: false, &quot;manualOverride&quot;: {&quot;isManuallyOverridden&quot;: false, &quot;citeprocText&quot;: &quot;(Rodas Zegarra de Escalante, 2024)&quot;, &quot;manualOverrideText&quot;: &quot;&quot;}, &quot;citationItems&quot;: [{&quot;id&quot;: &quot;ITEM-297823cb-c975-5def-8698-5545884294cd&quot;, &quot;itemData&quot;: {&quot;author&quot;: [{&quot;family&quot;: &quot;Rodas Zegarra de Escalante&quot;, &quot;given&quot;: &quot;A.&quot;, &quot;parse-names&quot;: false, &quot;dropping-particle&quot;: &quot;&quot;, &quot;non-dropping-particle&quot;: &quot;&quot;}], &quot;issued&quot;: {&quot;date-parts&quot;: [[2024]]}, &quot;URL&quot;: &quot;https://hdl.handle.net/20.500.12692/150276&quot;, &quot;type&quot;: &quot;thesis&quot;, &quot;title&quot;: &quot;Orientación vocacional y deserción universitaria en una universidad de Lima - 2024&quot;, &quot;genre&quot;: &quot;Tesis de maestría&quot;, &quot;publisher&quot;: &quot;Universidad César Vallejo&quot;, &quot;id&quot;: &quot;ITEM-297823cb-c975-5def-8698-5545884294cd&quot;, &quot;container-title-short&quot;: &quot;&quot;}, &quot;isTemporary&quot;: false}]}, {&quot;citationID&quot;: &quot;MENDELEY_CITATION_454e7a61-da78-4df7-a87e-7995b02257ec&quot;, &quot;properties&quot;: {&quot;noteIndex&quot;: 0}, &quot;isEdited&quot;: false, &quot;manualOverride&quot;: {&quot;isManuallyOverridden&quot;: true, &quot;citeprocText&quot;: &quot;(Torres-Delgado et al., 2024)&quot;, &quot;manualOverrideText&quot;: &quot;Torres-Delgado et al. (2024)&quot;}, &quot;citationItems&quot;: [{&quot;id&quot;: &quot;ITEM-803eec7d-bbb2-5fea-bb8c-5ccdb2039b68&quot;, &quot;itemData&quot;: {&quot;author&quot;: [{&quot;family&quot;: &quot;Torres-Delgado&quot;, &quot;given&quot;: &quot;G.&quot;, &quot;parse-names&quot;: false, &quot;dropping-particle&quot;: &quot;&quot;, &quot;non-dropping-particle&quot;: &quot;&quot;}, {&quot;family&quot;: &quot;Ramos-Pulido&quot;, &quot;given&quot;: &quot;S.&quot;, &quot;parse-names&quot;: false, &quot;dropping-particle&quot;: &quot;&quot;, &quot;non-dropping-particle&quot;: &quot;&quot;}, {&quot;family&quot;: &quot;Hernández-Gress&quot;, &quot;given&quot;: &quot;N.&quot;, &quot;parse-names&quot;: false, &quot;dropping-particle&quot;: &quot;&quot;, &quot;non-dropping-particle&quot;: &quot;&quot;}], &quot;issued&quot;: {&quot;date-parts&quot;: [[2024]]}, &quot;DOI&quot;: &quot;10.3390/engproc2024074074&quot;, &quot;type&quot;: &quot;article-journal&quot;, &quot;title&quot;: &quot;Satisfaction with research-based learning and academic performance by big data analysis&quot;, &quot;container-title&quot;: &quot;Engineering Proceedings&quot;, &quot;volume&quot;: &quot;74&quot;, &quot;issue&quot;: &quot;1&quot;, &quot;page&quot;: &quot;74&quot;, &quot;id&quot;: &quot;ITEM-803eec7d-bbb2-5fea-bb8c-5ccdb2039b68&quot;, &quot;container-title-short&quot;: &quot;&quot;}, &quot;isTemporary&quot;: false}]}, {&quot;citationID&quot;: &quot;MENDELEY_CITATION_d836eda9-029c-478a-8b03-ec20f201db96&quot;, &quot;properties&quot;: {&quot;noteIndex&quot;: 0}, &quot;isEdited&quot;: false, &quot;manualOverride&quot;: {&quot;isManuallyOverridden&quot;: false, &quot;citeprocText&quot;: &quot;(Ramos-Rivera et al., 2025; Sancho Escrivá et al., 2020)&quot;, &quot;manualOverrideText&quot;: &quot;&quot;}, &quot;citationItems&quot;: [{&quot;id&quot;: &quot;ITEM-9143f651-ed9a-563c-92fe-37d934b09213&quot;, &quot;itemData&quot;: {&quot;author&quot;: [{&quot;family&quot;: &quot;Ramos-Rivera&quot;, &quot;given&quot;: &quot;R. E.&quot;, &quot;parse-names&quot;: false, &quot;dropping-particle&quot;: &quot;&quot;, &quot;non-dropping-particle&quot;: &quot;&quot;}, {&quot;family&quot;: &quot;Santana Mancilla&quot;, &quot;given&quot;: &quot;P. C.&quot;, &quot;parse-names&quot;: false, &quot;dropping-particle&quot;: &quot;&quot;, &quot;non-dropping-particle&quot;: &quot;&quot;}, {&quot;family&quot;: &quot;García-Mancilla&quot;, &quot;given&quot;: &quot;J.&quot;, &quot;parse-names&quot;: false, &quot;dropping-particle&quot;: &quot;&quot;, &quot;non-dropping-particle&quot;: &quot;&quot;}, {&quot;family&quot;: &quot;Gaytán-Lugo&quot;, &quot;given&quot;: &quot;L. S.&quot;, &quot;parse-names&quot;: false, &quot;dropping-particle&quot;: &quot;&quot;, &quot;non-dropping-particle&quot;: &quot;&quot;}], &quot;issued&quot;: {&quot;date-parts&quot;: [[2025]]}, &quot;DOI&quot;: &quot;10.29105/innoacad.v1i2.36&quot;, &quot;type&quot;: &quot;article-journal&quot;, &quot;title&quot;: &quot;Modelos de lenguaje en educación: inteligencia artificial generativa para optimizar el análisis del desempeño docente&quot;, &quot;container-title&quot;: &quot;Innovación Académica, Universidad Autónoma de Nuevo León&quot;, &quot;volume&quot;: &quot;1&quot;, &quot;issue&quot;: &quot;2&quot;, &quot;page&quot;: &quot;70-81&quot;, &quot;id&quot;: &quot;ITEM-9143f651-ed9a-563c-92fe-37d934b09213&quot;, &quot;container-title-short&quot;: &quot;&quot;}, &quot;isTemporary&quot;: false}, {&quot;id&quot;: &quot;ITEM-4d9769b2-c234-511d-ab8b-ba773efe38ec&quot;, &quot;itemData&quot;: {&quot;author&quot;: [{&quot;family&quot;: &quot;Sancho Escrivá&quot;, &quot;given&quot;: &quot;J. V.&quot;, &quot;parse-names&quot;: false, &quot;dropping-particle&quot;: &quot;&quot;, &quot;non-dropping-particle&quot;: &quot;&quot;}, {&quot;family&quot;: &quot;Fanjul Peyró&quot;, &quot;given&quot;: &quot;C.&quot;, &quot;parse-names&quot;: false, &quot;dropping-particle&quot;: &quot;&quot;, &quot;non-dropping-particle&quot;: &quot;&quot;}, {&quot;family&quot;: &quot;De la Iglesia Vayá&quot;, &quot;given&quot;: &quot;M.&quot;, &quot;parse-names&quot;: false, &quot;dropping-particle&quot;: &quot;&quot;, &quot;non-dropping-particle&quot;: &quot;&quot;}, {&quot;family&quot;: &quot;Montell&quot;, &quot;given&quot;: &quot;J. A.&quot;, &quot;parse-names&quot;: false, &quot;dropping-particle&quot;: &quot;&quot;, &quot;non-dropping-particle&quot;: &quot;&quot;}, {&quot;family&quot;: &quot;Escartí Fabra&quot;, &quot;given&quot;: &quot;M. J.&quot;, &quot;parse-names&quot;: false, &quot;dropping-particle&quot;: &quot;&quot;, &quot;non-dropping-particle&quot;: &quot;&quot;}], &quot;issued&quot;: {&quot;date-parts&quot;: [[2020]]}, &quot;DOI&quot;: &quot;10.35669/rcys.2020.10(1).19-41&quot;, &quot;type&quot;: &quot;article-journal&quot;, &quot;title&quot;: &quot;Aplicación de la inteligencia artificial con procesamiento del lenguaje natural para textos de investigación cualitativa en la relación médico-paciente con enfermedad mental mediante el uso de tecnologías móviles&quot;, &quot;container-title&quot;: &quot;Revista de Comunicación y Salud&quot;, &quot;volume&quot;: &quot;10&quot;, &quot;issue&quot;: &quot;1&quot;, &quot;page&quot;: &quot;19-41&quot;, &quot;id&quot;: &quot;ITEM-4d9769b2-c234-511d-ab8b-ba773efe38ec&quot;, &quot;container-title-short&quot;: &quot;&quot;}, &quot;isTemporary&quot;: false}]}, {&quot;citationID&quot;: &quot;MENDELEY_CITATION_1427cbe2-370f-46f6-93d9-ad2c37e000e2&quot;, &quot;properties&quot;: {&quot;noteIndex&quot;: 0}, &quot;isEdited&quot;: false, &quot;manualOverride&quot;: {&quot;isManuallyOverridden&quot;: true, &quot;citeprocText&quot;: &quot;(García Subies, 2021)&quot;, &quot;manualOverrideText&quot;: &quot;García Subies (2021)&quot;}, &quot;citationItems&quot;: [{&quot;id&quot;: &quot;ITEM-b59eaab8-9775-53c0-8c97-7339b6d70afc&quot;, &quot;itemData&quot;: {&quot;author&quot;: [{&quot;family&quot;: &quot;García Subies&quot;, &quot;given&quot;: &quot;G.&quot;, &quot;parse-names&quot;: false, &quot;dropping-particle&quot;: &quot;&quot;, &quot;non-dropping-particle&quot;: &quot;&quot;}], &quot;issued&quot;: {&quot;date-parts&quot;: [[2021]]}, &quot;URL&quot;: &quot;https://oa.upm.es/68623/&quot;, &quot;type&quot;: &quot;thesis&quot;, &quot;title&quot;: &quot;Modelos de Transformers para la clasificación de texto&quot;, &quot;genre&quot;: &quot;Tesis de maestría&quot;, &quot;publisher&quot;: &quot;Universidad Politécnica de Madrid&quot;, &quot;id&quot;: &quot;ITEM-b59eaab8-9775-53c0-8c97-7339b6d70afc&quot;, &quot;container-title-short&quot;: &quot;&quot;}, &quot;isTemporary&quot;: false}]}, {&quot;citationID&quot;: &quot;MENDELEY_CITATION_612db3cb-bccd-4df9-b8d2-b099e537be5b&quot;, &quot;properties&quot;: {&quot;noteIndex&quot;: 0}, &quot;isEdited&quot;: false, &quot;manualOverride&quot;: {&quot;isManuallyOverridden&quot;: true, &quot;citeprocText&quot;: &quot;(Mena Guitarra, 2023)&quot;, &quot;manualOverrideText&quot;: &quot;Mena Guitarra (2023)&quot;}, &quot;citationItems&quot;: [{&quot;id&quot;: &quot;ITEM-b7bc5309-1149-55a6-8b1f-3e0d4086c429&quot;, &quot;itemData&quot;: {&quot;author&quot;: [{&quot;family&quot;: &quot;Mena Guitarra&quot;, &quot;given&quot;: &quot;S. D.&quot;, &quot;parse-names&quot;: false, &quot;dropping-particle&quot;: &quot;&quot;, &quot;non-dropping-particle&quot;: &quot;&quot;}], &quot;issued&quot;: {&quot;date-parts&quot;: [[2023]]}, &quot;URL&quot;: &quot;https://repositorio.usfq.edu.ec/handle/23000/13665&quot;, &quot;type&quot;: &quot;thesis&quot;, &quot;title&quot;: &quot;Usos y aplicaciones de modelos de lenguaje masivos en español&quot;, &quot;genre&quot;: &quot;Trabajo de titulación de pregrado&quot;, &quot;publisher&quot;: &quot;Universidad San Francisco de Quito&quot;, &quot;id&quot;: &quot;ITEM-b7bc5309-1149-55a6-8b1f-3e0d4086c429&quot;, &quot;container-title-short&quot;: &quot;&quot;}, &quot;isTemporary&quot;: false}]}, {&quot;citationID&quot;: &quot;MENDELEY_CITATION_dd425143-8be3-45e0-8245-13e23556ae52&quot;, &quot;properties&quot;: {&quot;noteIndex&quot;: 0}, &quot;isEdited&quot;: false, &quot;manualOverride&quot;: {&quot;isManuallyOverridden&quot;: true, &quot;citeprocText&quot;: &quot;(Hu et al., 2021)&quot;, &quot;manualOverrideText&quot;: &quot;Hu et al. (2021)&quot;}, &quot;citationItems&quot;: [{&quot;id&quot;: &quot;ITEM-74d30536-939b-537f-bec0-b59afedae2e3&quot;, &quot;itemData&quot;: {&quot;author&quot;: [{&quot;family&quot;: &quot;Hu&quot;, &quot;given&quot;: &quot;E. J.&quot;, &quot;parse-names&quot;: false, &quot;dropping-particle&quot;: &quot;&quot;, &quot;non-dropping-particle&quot;: &quot;&quot;}, {&quot;family&quot;: &quot;Shen&quot;, &quot;given&quot;: &quot;Y.&quot;, &quot;parse-names&quot;: false, &quot;dropping-particle&quot;: &quot;&quot;, &quot;non-dropping-particle&quot;: &quot;&quot;}, {&quot;family&quot;: &quot;Wallis&quot;, &quot;given&quot;: &quot;P.&quot;, &quot;parse-names&quot;: false, &quot;dropping-particle&quot;: &quot;&quot;, &quot;non-dropping-particle&quot;: &quot;&quot;}, {&quot;family&quot;: &quot;Allen-Zhu&quot;, &quot;given&quot;: &quot;Z.&quot;, &quot;parse-names&quot;: false, &quot;dropping-particle&quot;: &quot;&quot;, &quot;non-dropping-particle&quot;: &quot;&quot;}, {&quot;family&quot;: &quot;Li&quot;, &quot;given&quot;: &quot;Y.&quot;, &quot;parse-names&quot;: false, &quot;dropping-particle&quot;: &quot;&quot;, &quot;non-dropping-particle&quot;: &quot;&quot;}, {&quot;family&quot;: &quot;Wang&quot;, &quot;given&quot;: &quot;S.&quot;, &quot;parse-names&quot;: false, &quot;dropping-particle&quot;: &quot;&quot;, &quot;non-dropping-particle&quot;: &quot;&quot;}, {&quot;family&quot;: &quot;Wang&quot;, &quot;given&quot;: &quot;L.&quot;, &quot;parse-names&quot;: false, &quot;dropping-particle&quot;: &quot;&quot;, &quot;non-dropping-particle&quot;: &quot;&quot;}, {&quot;family&quot;: &quot;Chen&quot;, &quot;given&quot;: &quot;W.&quot;, &quot;parse-names&quot;: false, &quot;dropping-particle&quot;: &quot;&quot;, &quot;non-dropping-particle&quot;: &quot;&quot;}], &quot;issued&quot;: {&quot;date-parts&quot;: [[2021]]}, &quot;DOI&quot;: &quot;10.48550/arXiv.2106.09685&quot;, &quot;type&quot;: &quot;book&quot;, &quot;title&quot;: &quot;LoRA: Low-rank adaptation of large language models&quot;, &quot;publisher&quot;: &quot;arXiv&quot;, &quot;id&quot;: &quot;ITEM-74d30536-939b-537f-bec0-b59afedae2e3&quot;, &quot;container-title-short&quot;: &quot;&quot;}, &quot;isTemporary&quot;: false}]}, {&quot;citationID&quot;: &quot;MENDELEY_CITATION_8b47f982-5be0-4805-9724-cfcec46bf7c3&quot;, &quot;properties&quot;: {&quot;noteIndex&quot;: 0}, &quot;isEdited&quot;: false, &quot;manualOverride&quot;: {&quot;isManuallyOverridden&quot;: true, &quot;citeprocText&quot;: &quot;(Dettmers et al., 2023)&quot;, &quot;manualOverrideText&quot;: &quot;Dettmers et al. (2023)&quot;}, &quot;citationItems&quot;: [{&quot;id&quot;: &quot;ITEM-66ff8277-e9ea-5605-b98c-71a6ac2aa4a6&quot;, &quot;itemData&quot;: {&quot;author&quot;: [{&quot;family&quot;: &quot;Dettmers&quot;, &quot;given&quot;: &quot;T.&quot;, &quot;parse-names&quot;: false, &quot;dropping-particle&quot;: &quot;&quot;, &quot;non-dropping-particle&quot;: &quot;&quot;}, {&quot;family&quot;: &quot;Pagnoni&quot;, &quot;given&quot;: &quot;A.&quot;, &quot;parse-names&quot;: false, &quot;dropping-particle&quot;: &quot;&quot;, &quot;non-dropping-particle&quot;: &quot;&quot;}, {&quot;family&quot;: &quot;Holtzman&quot;, &quot;given&quot;: &quot;A.&quot;, &quot;parse-names&quot;: false, &quot;dropping-particle&quot;: &quot;&quot;, &quot;non-dropping-particle&quot;: &quot;&quot;}, {&quot;family&quot;: &quot;Zettlemoyer&quot;, &quot;given&quot;: &quot;L.&quot;, &quot;parse-names&quot;: false, &quot;dropping-particle&quot;: &quot;&quot;, &quot;non-dropping-particle&quot;: &quot;&quot;}], &quot;issued&quot;: {&quot;date-parts&quot;: [[2023]]}, &quot;DOI&quot;: &quot;10.48550/arXiv.2305.14314&quot;, &quot;type&quot;: &quot;paper-conference&quot;, &quot;title&quot;: &quot;QLoRA: Efficient finetuning of quantized LLMs&quot;, &quot;container-title&quot;: &quot;Advances in Neural Information Processing Systems 36&quot;, &quot;id&quot;: &quot;ITEM-66ff8277-e9ea-5605-b98c-71a6ac2aa4a6&quot;, &quot;container-title-short&quot;: &quot;&quot;}, &quot;isTemporary&quot;: false}]}, {&quot;citationID&quot;: &quot;MENDELEY_CITATION_2d47d8da-f01c-4163-9ef7-905acaa7cd77&quot;, &quot;properties&quot;: {&quot;noteIndex&quot;: 0}, &quot;isEdited&quot;: false, &quot;manualOverride&quot;: {&quot;isManuallyOverridden&quot;: true, &quot;citeprocText&quot;: &quot;(León Caranqui, 2023)&quot;, &quot;manualOverrideText&quot;: &quot;León Caranqui (2023)&quot;}, &quot;citationItems&quot;: [{&quot;id&quot;: &quot;ITEM-d8e93493-d1e9-5c21-8fb9-fe318b95db8c&quot;, &quot;itemData&quot;: {&quot;author&quot;: [{&quot;family&quot;: &quot;León Caranqui&quot;, &quot;given&quot;: &quot;J. A.&quot;, &quot;parse-names&quot;: false, &quot;dropping-particle&quot;: &quot;&quot;, &quot;non-dropping-particle&quot;: &quot;&quot;}], &quot;issued&quot;: {&quot;date-parts&quot;: [[2023]]}, &quot;URL&quot;: &quot;https://repositorio.usfq.edu.ec/handle/23000/13497&quot;, &quot;type&quot;: &quot;thesis&quot;, &quot;title&quot;: &quot;URKU: Adaptación de LLaMA 2 para la generación de texto en kichwa usando técnicas de Low-Rank Adaptation (LoRA)&quot;, &quot;genre&quot;: &quot;Trabajo de titulación de pregrado&quot;, &quot;publisher&quot;: &quot;Universidad San Francisco de Quito&quot;, &quot;id&quot;: &quot;ITEM-d8e93493-d1e9-5c21-8fb9-fe318b95db8c&quot;, &quot;container-title-short&quot;: &quot;&quot;}, &quot;isTemporary&quot;: false}]}, {&quot;citationID&quot;: &quot;MENDELEY_CITATION_3bac9b42-215b-4de2-b81b-fcb159902e41&quot;, &quot;properties&quot;: {&quot;noteIndex&quot;: 0}, &quot;isEdited&quot;: false, &quot;manualOverride&quot;: {&quot;isManuallyOverridden&quot;: true, &quot;citeprocText&quot;: &quot;(Castejón Lozano, 2025)&quot;, &quot;manualOverrideText&quot;: &quot;Castejón Lozano (2025)&quot;}, &quot;citationItems&quot;: [{&quot;id&quot;: &quot;ITEM-aa8f5a87-f00c-54b4-9f0b-476652320c5d&quot;, &quot;itemData&quot;: {&quot;author&quot;: [{&quot;family&quot;: &quot;Castejón Lozano&quot;, &quot;given&quot;: &quot;F.&quot;, &quot;parse-names&quot;: false, &quot;dropping-particle&quot;: &quot;&quot;, &quot;non-dropping-particle&quot;: &quot;&quot;}], &quot;issued&quot;: {&quot;date-parts&quot;: [[2025]]}, &quot;URL&quot;: &quot;https://oa.upm.es/90917/&quot;, &quot;type&quot;: &quot;thesis&quot;, &quot;title&quot;: &quot;SoroIA: Diseño e implementación de un sistema conversacional basado en modelos grandes de lenguaje para el Museo Sorolla&quot;, &quot;genre&quot;: &quot;Tesis de maestría&quot;, &quot;publisher&quot;: &quot;Universidad Politécnica de Madrid&quot;, &quot;id&quot;: &quot;ITEM-aa8f5a87-f00c-54b4-9f0b-476652320c5d&quot;, &quot;container-title-short&quot;: &quot;&quot;}, &quot;isTemporary&quot;: false}]}, {&quot;citationID&quot;: &quot;MENDELEY_CITATION_8157b53a-9304-4e85-8651-10dcf8aa5d12&quot;, &quot;properties&quot;: {&quot;noteIndex&quot;: 0}, &quot;isEdited&quot;: false, &quot;manualOverride&quot;: {&quot;isManuallyOverridden&quot;: true, &quot;citeprocText&quot;: &quot;(Fang et al., 2024)&quot;, &quot;manualOverrideText&quot;: &quot;Fang et al. (2024)&quot;}, &quot;citationItems&quot;: [{&quot;id&quot;: &quot;ITEM-5007b438-b37f-541e-8fca-2748edacc281&quot;, &quot;itemData&quot;: {&quot;author&quot;: [{&quot;family&quot;: &quot;Fang&quot;, &quot;given&quot;: &quot;X.&quot;, &quot;parse-names&quot;: false, &quot;dropping-particle&quot;: &quot;&quot;, &quot;non-dropping-particle&quot;: &quot;&quot;}, {&quot;family&quot;: &quot;Xu&quot;, &quot;given&quot;: &quot;W.&quot;, &quot;parse-names&quot;: false, &quot;dropping-particle&quot;: &quot;&quot;, &quot;non-dropping-particle&quot;: &quot;&quot;}, {&quot;family&quot;: &quot;Tan&quot;, &quot;given&quot;: &quot;F. A.&quot;, &quot;parse-names&quot;: false, &quot;dropping-particle&quot;: &quot;&quot;, &quot;non-dropping-particle&quot;: &quot;&quot;}, {&quot;family&quot;: &quot;Zhang&quot;, &quot;given&quot;: &quot;J.&quot;, &quot;parse-names&quot;: false, &quot;dropping-particle&quot;: &quot;&quot;, &quot;non-dropping-particle&quot;: &quot;&quot;}, {&quot;family&quot;: &quot;Hu&quot;, &quot;given&quot;: &quot;Z.&quot;, &quot;parse-names&quot;: false, &quot;dropping-particle&quot;: &quot;&quot;, &quot;non-dropping-particle&quot;: &quot;&quot;}, {&quot;family&quot;: &quot;Qi&quot;, &quot;given&quot;: &quot;Y.&quot;, &quot;parse-names&quot;: false, &quot;dropping-particle&quot;: &quot;&quot;, &quot;non-dropping-particle&quot;: &quot;&quot;}, {&quot;family&quot;: &quot;Nickleach&quot;, &quot;given&quot;: &quot;S.&quot;, &quot;parse-names&quot;: false, &quot;dropping-particle&quot;: &quot;&quot;, &quot;non-dropping-particle&quot;: &quot;&quot;}, {&quot;family&quot;: &quot;Socolinsky&quot;, &quot;given&quot;: &quot;D.&quot;, &quot;parse-names&quot;: false, &quot;dropping-particle&quot;: &quot;&quot;, &quot;non-dropping-particle&quot;: &quot;&quot;}, {&quot;family&quot;: &quot;Sengamedu&quot;, &quot;given&quot;: &quot;S.&quot;, &quot;parse-names&quot;: false, &quot;dropping-particle&quot;: &quot;&quot;, &quot;non-dropping-particle&quot;: &quot;&quot;}, {&quot;family&quot;: &quot;Faloutsos&quot;, &quot;given&quot;: &quot;C.&quot;, &quot;parse-names&quot;: false, &quot;dropping-particle&quot;: &quot;&quot;, &quot;non-dropping-particle&quot;: &quot;&quot;}], &quot;issued&quot;: {&quot;date-parts&quot;: [[2024]]}, &quot;URL&quot;: &quot;http://arxiv.org/abs/2402.17944&quot;, &quot;type&quot;: &quot;article-journal&quot;, &quot;title&quot;: &quot;Large language models (LLMs) on tabular data: Prediction, generation, and understanding. A survey&quot;, &quot;container-title&quot;: &quot;Transactions on Machine Learning Research&quot;, &quot;id&quot;: &quot;ITEM-5007b438-b37f-541e-8fca-2748edacc281&quot;, &quot;container-title-short&quot;: &quot;&quot;}, &quot;isTemporary&quot;: false}]}, {&quot;citationID&quot;: &quot;MENDELEY_CITATION_a2bd6a4b-2652-4330-affb-679351d57900&quot;, &quot;properties&quot;: {&quot;noteIndex&quot;: 0}, &quot;isEdited&quot;: false, &quot;manualOverride&quot;: {&quot;isManuallyOverridden&quot;: true, &quot;citeprocText&quot;: &quot;(Fernández et al., 2025)&quot;, &quot;manualOverrideText&quot;: &quot;Fernández et al. (2025)&quot;}, &quot;citationItems&quot;: [{&quot;id&quot;: &quot;ITEM-6e797b0e-8270-559d-850f-c5042d0b3d16&quot;, &quot;itemData&quot;: {&quot;author&quot;: [{&quot;family&quot;: &quot;Fernández&quot;, &quot;given&quot;: &quot;J. M.&quot;, &quot;parse-names&quot;: false, &quot;dropping-particle&quot;: &quot;&quot;, &quot;non-dropping-particle&quot;: &quot;&quot;}, {&quot;family&quot;: &quot;Petrocelli&quot;, &quot;given&quot;: &quot;D. M.&quot;, &quot;parse-names&quot;: false, &quot;dropping-particle&quot;: &quot;&quot;, &quot;non-dropping-particle&quot;: &quot;&quot;}, {&quot;family&quot;: &quot;Matuk&quot;, &quot;given&quot;: &quot;R.&quot;, &quot;parse-names&quot;: false, &quot;dropping-particle&quot;: &quot;&quot;, &quot;non-dropping-particle&quot;: &quot;&quot;}, {&quot;family&quot;: &quot;Lanson&quot;, &quot;given&quot;: &quot;D.&quot;, &quot;parse-names&quot;: false, &quot;dropping-particle&quot;: &quot;&quot;, &quot;non-dropping-particle&quot;: &quot;&quot;}, {&quot;family&quot;: &quot;Zamudio&quot;, &quot;given&quot;: &quot;E.&quot;, &quot;parse-names&quot;: false, &quot;dropping-particle&quot;: &quot;&quot;, &quot;non-dropping-particle&quot;: &quot;&quot;}, {&quot;family&quot;: &quot;Cagnina&quot;, &quot;given&quot;: &quot;L. C.&quot;, &quot;parse-names&quot;: false, &quot;dropping-particle&quot;: &quot;&quot;, &quot;non-dropping-particle&quot;: &quot;&quot;}, {&quot;family&quot;: &quot;Gil Costa&quot;, &quot;given&quot;: &quot;G. V.&quot;, &quot;parse-names&quot;: false, &quot;dropping-particle&quot;: &quot;&quot;, &quot;non-dropping-particle&quot;: &quot;&quot;}, {&quot;family&quot;: &quot;Errecalde&quot;, &quot;given&quot;: &quot;M. L.&quot;, &quot;parse-names&quot;: false, &quot;dropping-particle&quot;: &quot;&quot;, &quot;non-dropping-particle&quot;: &quot;&quot;}], &quot;issued&quot;: {&quot;date-parts&quot;: [[2025]]}, &quot;URL&quot;: &quot;http://sedici.unlp.edu.ar/handle/10915/183892&quot;, &quot;type&quot;: &quot;paper-conference&quot;, &quot;title&quot;: &quot;Fine-tuning y adaptación de modelos de lenguaje abiertos en infraestructura HPC para aplicaciones de dominio específico&quot;, &quot;container-title&quot;: &quot;Libro de actas del XXVII Workshop de Investigadores en Ciencias de la Computación&quot;, &quot;page&quot;: &quot;72-76&quot;, &quot;publisher&quot;: &quot;Red de Universidades con Carreras en Informática&quot;, &quot;id&quot;: &quot;ITEM-6e797b0e-8270-559d-850f-c5042d0b3d16&quot;, &quot;container-title-short&quot;: &quot;&quot;}, &quot;isTemporary&quot;: false}]}, {&quot;citationID&quot;: &quot;MENDELEY_CITATION_131f1bdf-7b7e-4889-8dc6-6e840537e4da&quot;, &quot;properties&quot;: {&quot;noteIndex&quot;: 0}, &quot;isEdited&quot;: false, &quot;manualOverride&quot;: {&quot;isManuallyOverridden&quot;: true, &quot;citeprocText&quot;: &quot;(Ramos-Rivera et al., 2025)&quot;, &quot;manualOverrideText&quot;: &quot;Ramos-Rivera et al. (2025)&quot;}, &quot;citationItems&quot;: [{&quot;id&quot;: &quot;ITEM-9143f651-ed9a-563c-92fe-37d934b09213&quot;, &quot;itemData&quot;: {&quot;author&quot;: [{&quot;family&quot;: &quot;Ramos-Rivera&quot;, &quot;given&quot;: &quot;R. E.&quot;, &quot;parse-names&quot;: false, &quot;dropping-particle&quot;: &quot;&quot;, &quot;non-dropping-particle&quot;: &quot;&quot;}, {&quot;family&quot;: &quot;Santana Mancilla&quot;, &quot;given&quot;: &quot;P. C.&quot;, &quot;parse-names&quot;: false, &quot;dropping-particle&quot;: &quot;&quot;, &quot;non-dropping-particle&quot;: &quot;&quot;}, {&quot;family&quot;: &quot;García-Mancilla&quot;, &quot;given&quot;: &quot;J.&quot;, &quot;parse-names&quot;: false, &quot;dropping-particle&quot;: &quot;&quot;, &quot;non-dropping-particle&quot;: &quot;&quot;}, {&quot;family&quot;: &quot;Gaytán-Lugo&quot;, &quot;given&quot;: &quot;L. S.&quot;, &quot;parse-names&quot;: false, &quot;dropping-particle&quot;: &quot;&quot;, &quot;non-dropping-particle&quot;: &quot;&quot;}], &quot;issued&quot;: {&quot;date-parts&quot;: [[2025]]}, &quot;DOI&quot;: &quot;10.29105/innoacad.v1i2.36&quot;, &quot;type&quot;: &quot;article-journal&quot;, &quot;title&quot;: &quot;Modelos de lenguaje en educación: inteligencia artificial generativa para optimizar el análisis del desempeño docente&quot;, &quot;container-title&quot;: &quot;Innovación Académica, Universidad Autónoma de Nuevo León&quot;, &quot;volume&quot;: &quot;1&quot;, &quot;issue&quot;: &quot;2&quot;, &quot;page&quot;: &quot;70-81&quot;, &quot;id&quot;: &quot;ITEM-9143f651-ed9a-563c-92fe-37d934b09213&quot;, &quot;container-title-short&quot;: &quot;&quot;}, &quot;isTemporary&quot;: false}]}, {&quot;citationID&quot;: &quot;MENDELEY_CITATION_1f6847c2-d7ee-498a-aa77-6911940b7ffe&quot;, &quot;properties&quot;: {&quot;noteIndex&quot;: 0}, &quot;isEdited&quot;: false, &quot;manualOverride&quot;: {&quot;isManuallyOverridden&quot;: true, &quot;citeprocText&quot;: &quot;(Millán Gordillo, 2025)&quot;, &quot;manualOverrideText&quot;: &quot;Millán Gordillo (2025)&quot;}, &quot;citationItems&quot;: [{&quot;id&quot;: &quot;ITEM-d048a752-48c5-509f-92fd-95097e22963d&quot;, &quot;itemData&quot;: {&quot;author&quot;: [{&quot;family&quot;: &quot;Millán Gordillo&quot;, &quot;given&quot;: &quot;M.&quot;, &quot;parse-names&quot;: false, &quot;dropping-particle&quot;: &quot;&quot;, &quot;non-dropping-particle&quot;: &quot;&quot;}], &quot;issued&quot;: {&quot;date-parts&quot;: [[2025]]}, &quot;URL&quot;: &quot;https://repositorio.uloyola.es/bitstream/handle/20.500.12412/6735/TFM%20Mar%C3%ADa%20Mill%C3%A1n.pdf&quot;, &quot;type&quot;: &quot;thesis&quot;, &quot;title&quot;: &quot;Estudio comparativo de sistemas de recomendación mediante filtrado colaborativo, basado en contenido y propuestas híbridas&quot;, &quot;genre&quot;: &quot;Tesis de maestría&quot;, &quot;publisher&quot;: &quot;Universidad Loyola Andalucía&quot;, &quot;id&quot;: &quot;ITEM-d048a752-48c5-509f-92fd-95097e22963d&quot;, &quot;container-title-short&quot;: &quot;&quot;}, &quot;isTemporary&quot;: false}]}, {&quot;citationID&quot;: &quot;MENDELEY_CITATION_ae475c3d-752e-4dfe-a537-b5abaeeed562&quot;, &quot;properties&quot;: {&quot;noteIndex&quot;: 0}, &quot;isEdited&quot;: false, &quot;manualOverride&quot;: {&quot;isManuallyOverridden&quot;: true, &quot;citeprocText&quot;: &quot;(Martínez Sixto et al., 2025)&quot;, &quot;manualOverrideText&quot;: &quot;Martínez Sixto et al. (2025)&quot;}, &quot;citationItems&quot;: [{&quot;id&quot;: &quot;ITEM-e9427164-f851-5ff7-a1c3-eb7ce5a7d720&quot;, &quot;itemData&quot;: {&quot;author&quot;: [{&quot;family&quot;: &quot;Martínez Sixto&quot;, &quot;given&quot;: &quot;L.&quot;, &quot;parse-names&quot;: false, &quot;dropping-particle&quot;: &quot;&quot;, &quot;non-dropping-particle&quot;: &quot;&quot;}, {&quot;family&quot;: &quot;Fernández y Fernández&quot;, &quot;given&quot;: &quot;C. A.&quot;, &quot;parse-names&quot;: false, &quot;dropping-particle&quot;: &quot;&quot;, &quot;non-dropping-particle&quot;: &quot;&quot;}, {&quot;family&quot;: &quot;Millán Hernández&quot;, &quot;given&quot;: &quot;C. E.&quot;, &quot;parse-names&quot;: false, &quot;dropping-particle&quot;: &quot;&quot;, &quot;non-dropping-particle&quot;: &quot;&quot;}], &quot;issued&quot;: {&quot;date-parts&quot;: [[2025]]}, &quot;DOI&quot;: &quot;10.36825/riti.13.31.007&quot;, &quot;type&quot;: &quot;article-journal&quot;, &quot;title&quot;: &quot;Comparación del desempeño de LLMs en la generación de diagramas de clases UML mediante un sistema RAG&quot;, &quot;container-title&quot;: &quot;Revista de Investigación en Tecnologías de la Información&quot;, &quot;volume&quot;: &quot;13&quot;, &quot;issue&quot;: &quot;31&quot;, &quot;page&quot;: &quot;64-79&quot;, &quot;id&quot;: &quot;ITEM-e9427164-f851-5ff7-a1c3-eb7ce5a7d720&quot;, &quot;container-title-short&quot;: &quot;&quot;}, &quot;isTemporary&quot;: false}]}, {&quot;citationID&quot;: &quot;MENDELEY_CITATION_d46eca23-95aa-4d8b-8428-d78ee5acc0d0&quot;, &quot;properties&quot;: {&quot;noteIndex&quot;: 0}, &quot;isEdited&quot;: false, &quot;manualOverride&quot;: {&quot;isManuallyOverridden&quot;: true, &quot;citeprocText&quot;: &quot;(Cisneros-Bravo et al., 2023)&quot;, &quot;manualOverrideText&quot;: &quot;Cisneros-Bravo et al. (2023)&quot;}, &quot;citationItems&quot;: [{&quot;id&quot;: &quot;ITEM-2c1f70fd-8745-538a-b99f-18d256f44b4f&quot;, &quot;itemData&quot;: {&quot;author&quot;: [{&quot;family&quot;: &quot;Cisneros-Bravo&quot;, &quot;given&quot;: &quot;B. E.&quot;, &quot;parse-names&quot;: false, &quot;dropping-particle&quot;: &quot;&quot;, &quot;non-dropping-particle&quot;: &quot;&quot;}, {&quot;family&quot;: &quot;Rodríguez-Aguilar&quot;, &quot;given&quot;: &quot;R. M.&quot;, &quot;parse-names&quot;: false, &quot;dropping-particle&quot;: &quot;&quot;, &quot;non-dropping-particle&quot;: &quot;&quot;}, {&quot;family&quot;: &quot;Niño-Membrillo&quot;, &quot;given&quot;: &quot;Y. E.&quot;, &quot;parse-names&quot;: false, &quot;dropping-particle&quot;: &quot;&quot;, &quot;non-dropping-particle&quot;: &quot;&quot;}, {&quot;family&quot;: &quot;Cuevas-Rasgado&quot;, &quot;given&quot;: &quot;A. D.&quot;, &quot;parse-names&quot;: false, &quot;dropping-particle&quot;: &quot;&quot;, &quot;non-dropping-particle&quot;: &quot;&quot;}], &quot;issued&quot;: {&quot;date-parts&quot;: [[2023]]}, &quot;DOI&quot;: &quot;10.23913/ride.v14i27.1715&quot;, &quot;type&quot;: &quot;article-journal&quot;, &quot;title&quot;: &quot;Falta de orientación vocacional como factor en la deserción universitaria. Caso de estudio: zona Oriente del Estado de México&quot;, &quot;container-title&quot;: &quot;RIDE Revista Iberoamericana para la Investigación y el Desarrollo Educativo&quot;, &quot;volume&quot;: &quot;14&quot;, &quot;issue&quot;: &quot;27&quot;, &quot;id&quot;: &quot;ITEM-2c1f70fd-8745-538a-b99f-18d256f44b4f&quot;, &quot;container-title-short&quot;: &quot;&quot;}, &quot;isTemporary&quot;: false}]}, {&quot;citationID&quot;: &quot;MENDELEY_CITATION_23d700e7-5b2c-4d1d-a307-349cf65b4db7&quot;, &quot;properties&quot;: {&quot;noteIndex&quot;: 0}, &quot;isEdited&quot;: false, &quot;manualOverride&quot;: {&quot;isManuallyOverridden&quot;: true, &quot;citeprocText&quot;: &quot;(Carballo-Mendívil et al., 2025)&quot;, &quot;manualOverrideText&quot;: &quot;Carballo-Mendívil et al. (2025)&quot;}, &quot;citationItems&quot;: [{&quot;id&quot;: &quot;ITEM-4755bb51-baf5-5536-8cda-5af1c04a59c8&quot;, &quot;itemData&quot;: {&quot;author&quot;: [{&quot;family&quot;: &quot;Carballo-Mendívil&quot;, &quot;given&quot;: &quot;B.&quot;, &quot;parse-names&quot;: false, &quot;dropping-particle&quot;: &quot;&quot;, &quot;non-dropping-particle&quot;: &quot;&quot;}, {&quot;family&quot;: &quot;Arellano-González&quot;, &quot;given&quot;: &quot;A.&quot;, &quot;parse-names&quot;: false, &quot;dropping-particle&quot;: &quot;&quot;, &quot;non-dropping-particle&quot;: &quot;&quot;}, {&quot;family&quot;: &quot;Ríos-Vázquez&quot;, &quot;given&quot;: &quot;N. J.&quot;, &quot;parse-names&quot;: false, &quot;dropping-particle&quot;: &quot;&quot;, &quot;non-dropping-particle&quot;: &quot;&quot;}, {&quot;family&quot;: &quot;Lizardi-Duarte&quot;, &quot;given&quot;: &quot;M. del P.&quot;, &quot;parse-names&quot;: false, &quot;dropping-particle&quot;: &quot;&quot;, &quot;non-dropping-particle&quot;: &quot;&quot;}], &quot;issued&quot;: {&quot;date-parts&quot;: [[2025]]}, &quot;DOI&quot;: &quot;10.3390/app15169202&quot;, &quot;type&quot;: &quot;article-journal&quot;, &quot;title&quot;: &quot;Predicting student dropout from day one: XGBoost-based early warning system using pre-enrollment data&quot;, &quot;container-title&quot;: &quot;Applied Sciences&quot;, &quot;volume&quot;: &quot;15&quot;, &quot;issue&quot;: &quot;16&quot;, &quot;page&quot;: &quot;9202&quot;, &quot;id&quot;: &quot;ITEM-4755bb51-baf5-5536-8cda-5af1c04a59c8&quot;, &quot;container-title-short&quot;: &quot;&quot;}, &quot;isTemporary&quot;: false}]}, {&quot;citationID&quot;: &quot;MENDELEY_CITATION_09c4a0ae-d53f-4977-a8c0-0b0fe778f465&quot;, &quot;properties&quot;: {&quot;noteIndex&quot;: 0}, &quot;isEdited&quot;: false, &quot;manualOverride&quot;: {&quot;isManuallyOverridden&quot;: true, &quot;citeprocText&quot;: &quot;(Marroquin Balarezo et al., 2024)&quot;, &quot;manualOverrideText&quot;: &quot;Marroquin Balarezo et al. (2024)&quot;}, &quot;citationItems&quot;: [{&quot;id&quot;: &quot;ITEM-134638ce-38e8-5ef9-b94c-3755a5e14dbc&quot;, &quot;itemData&quot;: {&quot;author&quot;: [{&quot;family&quot;: &quot;Marroquin Balarezo&quot;, &quot;given&quot;: &quot;M. P.&quot;, &quot;parse-names&quot;: false, &quot;dropping-particle&quot;: &quot;&quot;, &quot;non-dropping-particle&quot;: &quot;&quot;}, {&quot;family&quot;: &quot;Ambia Hurtado&quot;, &quot;given&quot;: &quot;W. A.&quot;, &quot;parse-names&quot;: false, &quot;dropping-particle&quot;: &quot;&quot;, &quot;non-dropping-particle&quot;: &quot;&quot;}, {&quot;family&quot;: &quot;Gutierrez Churata&quot;, &quot;given&quot;: &quot;H. F.&quot;, &quot;parse-names&quot;: false, &quot;dropping-particle&quot;: &quot;&quot;, &quot;non-dropping-particle&quot;: &quot;&quot;}, {&quot;family&quot;: &quot;Salcedo Atiquipa&quot;, &quot;given&quot;: &quot;E. F.&quot;, &quot;parse-names&quot;: false, &quot;dropping-particle&quot;: &quot;&quot;, &quot;non-dropping-particle&quot;: &quot;&quot;}, {&quot;family&quot;: &quot;Tipiana Felix&quot;, &quot;given&quot;: &quot;R. E.&quot;, &quot;parse-names&quot;: false, &quot;dropping-particle&quot;: &quot;&quot;, &quot;non-dropping-particle&quot;: &quot;&quot;}], &quot;issued&quot;: {&quot;date-parts&quot;: [[2024]]}, &quot;URL&quot;: &quot;http://hdl.handle.net/10757/684330&quot;, &quot;type&quot;: &quot;thesis&quot;, &quot;title&quot;: &quot;Diseño de un asistente inteligente RAG para la Comisión de Eliminación de Barreras Burocráticas de INDECOPI-2024&quot;, &quot;genre&quot;: &quot;Tesis de maestría&quot;, &quot;publisher&quot;: &quot;Universidad Peruana de Ciencias Aplicadas&quot;, &quot;id&quot;: &quot;ITEM-134638ce-38e8-5ef9-b94c-3755a5e14dbc&quot;, &quot;container-title-short&quot;: &quot;&quot;}, &quot;isTemporary&quot;: false}]}, {&quot;citationID&quot;: &quot;MENDELEY_CITATION_4f7028d7-0a74-49d8-9ed3-25e9aecc97c4&quot;, &quot;properties&quot;: {&quot;noteIndex&quot;: 0}, &quot;isEdited&quot;: false, &quot;manualOverride&quot;: {&quot;isManuallyOverridden&quot;: true, &quot;citeprocText&quot;: &quot;(Yataco Cañari y Jacha Rojas, 2024)&quot;, &quot;manualOverrideText&quot;: &quot;Yataco Cañari y Jacha Rojas (2024)&quot;}, &quot;citationItems&quot;: [{&quot;id&quot;: &quot;ITEM-02ada8e7-47d2-5940-ab09-a30ce56e4fb6&quot;, &quot;itemData&quot;: {&quot;author&quot;: [{&quot;family&quot;: &quot;Yataco Cañari&quot;, &quot;given&quot;: &quot;W.&quot;, &quot;parse-names&quot;: false, &quot;dropping-particle&quot;: &quot;&quot;, &quot;non-dropping-particle&quot;: &quot;&quot;}, {&quot;family&quot;: &quot;Jacha Rojas&quot;, &quot;given&quot;: &quot;J. P.&quot;, &quot;parse-names&quot;: false, &quot;dropping-particle&quot;: &quot;&quot;, &quot;non-dropping-particle&quot;: &quot;&quot;}], &quot;issued&quot;: {&quot;date-parts&quot;: [[2024]]}, &quot;URL&quot;: &quot;https://hdl.handle.net/20.500.12840/7597&quot;, &quot;type&quot;: &quot;thesis&quot;, &quot;title&quot;: &quot;Modelo machine learning para predicción de deserción estudiantil&quot;, &quot;genre&quot;: &quot;Trabajo académico de segunda especialidad&quot;, &quot;publisher&quot;: &quot;Universidad Peruana Unión&quot;, &quot;id&quot;: &quot;ITEM-02ada8e7-47d2-5940-ab09-a30ce56e4fb6&quot;, &quot;container-title-short&quot;: &quot;&quot;}, &quot;isTemporary&quot;: false}]}, {&quot;citationID&quot;: &quot;MENDELEY_CITATION_66e952e8-a5d4-4404-af16-05bf54bc379e&quot;, &quot;properties&quot;: {&quot;noteIndex&quot;: 0}, &quot;isEdited&quot;: false, &quot;manualOverride&quot;: {&quot;isManuallyOverridden&quot;: true, &quot;citeprocText&quot;: &quot;(Guadalupe Mori, 2025)&quot;, &quot;manualOverrideText&quot;: &quot;Guadalupe Mori (2025)&quot;}, &quot;citationItems&quot;: [{&quot;id&quot;: &quot;ITEM-745e87b9-5edd-56c2-99e9-42f2290e8c38&quot;, &quot;itemData&quot;: {&quot;author&quot;: [{&quot;family&quot;: &quot;Guadalupe Mori&quot;, &quot;given&quot;: &quot;V. H.&quot;, &quot;parse-names&quot;: false, &quot;dropping-particle&quot;: &quot;&quot;, &quot;non-dropping-particle&quot;: &quot;&quot;}], &quot;issued&quot;: {&quot;date-parts&quot;: [[2025]]}, &quot;URL&quot;: &quot;https://hdl.handle.net/20.500.13084/10839&quot;, &quot;type&quot;: &quot;thesis&quot;, &quot;title&quot;: &quot;Modelo predictivo basado en machine learning para la reducción de la deserción estudiantil en las universidades privadas del Perú: caso Universidad Privada San Juan Bautista&quot;, &quot;genre&quot;: &quot;Tesis doctoral&quot;, &quot;publisher&quot;: &quot;Universidad Nacional Federico Villarreal&quot;, &quot;id&quot;: &quot;ITEM-745e87b9-5edd-56c2-99e9-42f2290e8c38&quot;, &quot;container-title-short&quot;: &quot;&quot;}, &quot;isTemporary&quot;: false}]}, {&quot;citationID&quot;: &quot;MENDELEY_CITATION_649576b2-00b7-4fbf-b356-a428c7304742&quot;, &quot;properties&quot;: {&quot;noteIndex&quot;: 0}, &quot;isEdited&quot;: false, &quot;manualOverride&quot;: {&quot;isManuallyOverridden&quot;: true, &quot;citeprocText&quot;: &quot;(Rodas Zegarra de Escalante, 2024)&quot;, &quot;manualOverrideText&quot;: &quot;Rodas Zegarra de Escalante (2024)&quot;}, &quot;citationItems&quot;: [{&quot;id&quot;: &quot;ITEM-297823cb-c975-5def-8698-5545884294cd&quot;, &quot;itemData&quot;: {&quot;author&quot;: [{&quot;family&quot;: &quot;Rodas Zegarra de Escalante&quot;, &quot;given&quot;: &quot;A.&quot;, &quot;parse-names&quot;: false, &quot;dropping-particle&quot;: &quot;&quot;, &quot;non-dropping-particle&quot;: &quot;&quot;}], &quot;issued&quot;: {&quot;date-parts&quot;: [[2024]]}, &quot;URL&quot;: &quot;https://hdl.handle.net/20.500.12692/150276&quot;, &quot;type&quot;: &quot;thesis&quot;, &quot;title&quot;: &quot;Orientación vocacional y deserción universitaria en una universidad de Lima - 2024&quot;, &quot;genre&quot;: &quot;Tesis de maestría&quot;, &quot;publisher&quot;: &quot;Universidad César Vallejo&quot;, &quot;id&quot;: &quot;ITEM-297823cb-c975-5def-8698-5545884294cd&quot;, &quot;container-title-short&quot;: &quot;&quot;}, &quot;isTemporary&quot;: false}]}, {&quot;citationID&quot;: &quot;MENDELEY_CITATION_4a78aa74-43ee-4798-9126-ad5fd4419f2e&quot;, &quot;properties&quot;: {&quot;noteIndex&quot;: 0}, &quot;isEdited&quot;: false, &quot;manualOverride&quot;: {&quot;isManuallyOverridden&quot;: true, &quot;citeprocText&quot;: &quot;(Velasquez Velasquez, 2023)&quot;, &quot;manualOverrideText&quot;: &quot;Velasquez Velasquez (2023)&quot;}, &quot;citationItems&quot;: [{&quot;id&quot;: &quot;ITEM-051a1e9e-f6d9-5b1f-b8af-a7a21172dd72&quot;, &quot;itemData&quot;: {&quot;author&quot;: [{&quot;family&quot;: &quot;Velasquez Velasquez&quot;, &quot;given&quot;: &quot;S. D.&quot;, &quot;parse-names&quot;: false, &quot;dropping-particle&quot;: &quot;&quot;, &quot;non-dropping-particle&quot;: &quot;&quot;}], &quot;issued&quot;: {&quot;date-parts&quot;: [[2023]]}, &quot;URL&quot;: &quot;http://hdl.handle.net/20.500.12423/6921&quot;, &quot;type&quot;: &quot;thesis&quot;, &quot;title&quot;: &quot;La inteligencia artificial aplicada al sector educativo: una revisión sistemática de la literatura&quot;, &quot;genre&quot;: &quot;Trabajo de investigación de bachiller&quot;, &quot;publisher&quot;: &quot;Universidad Católica Santo Toribio de Mogrovejo&quot;, &quot;id&quot;: &quot;ITEM-051a1e9e-f6d9-5b1f-b8af-a7a21172dd72&quot;, &quot;container-title-short&quot;: &quot;&quot;}, &quot;isTemporary&quot;: false}]}, {&quot;citationID&quot;: &quot;MENDELEY_CITATION_5d3849a2-6976-4a69-b2db-ef83bdfc91bd&quot;, &quot;properties&quot;: {&quot;noteIndex&quot;: 0}, &quot;isEdited&quot;: false, &quot;manualOverride&quot;: {&quot;isManuallyOverridden&quot;: true, &quot;citeprocText&quot;: &quot;(Rodríguez Chipana, 2023)&quot;, &quot;manualOverrideText&quot;: &quot;Rodríguez Chipana (2023)&quot;}, &quot;citationItems&quot;: [{&quot;id&quot;: &quot;ITEM-58b6c010-e169-5596-822d-32c0b401cede&quot;, &quot;itemData&quot;: {&quot;author&quot;: [{&quot;family&quot;: &quot;Rodríguez Chipana&quot;, &quot;given&quot;: &quot;Y. M.&quot;, &quot;parse-names&quot;: false, &quot;dropping-particle&quot;: &quot;&quot;, &quot;non-dropping-particle&quot;: &quot;&quot;}], &quot;issued&quot;: {&quot;date-parts&quot;: [[2023]]}, &quot;URL&quot;: &quot;https://hdl.handle.net/20.500.12990/13324&quot;, &quot;type&quot;: &quot;thesis&quot;, &quot;title&quot;: &quot;Inteligencia artificial y rendimiento académico de los estudiantes de educación superior en la región Puno, 2022&quot;, &quot;genre&quot;: &quot;Tesis de maestría&quot;, &quot;publisher&quot;: &quot;Universidad Alas Peruanas&quot;, &quot;id&quot;: &quot;ITEM-58b6c010-e169-5596-822d-32c0b401cede&quot;, &quot;container-title-short&quot;: &quot;&quot;}, &quot;isTemporary&quot;: false}]}, {&quot;citationID&quot;: &quot;MENDELEY_CITATION_e3789c7d-fd7c-4847-9a9c-cdf216496df4&quot;, &quot;properties&quot;: {&quot;noteIndex&quot;: 0}, &quot;isEdited&quot;: false, &quot;manualOverride&quot;: {&quot;isManuallyOverridden&quot;: false, &quot;citeprocText&quot;: &quot;(Ferreyra et al., 2017)&quot;, &quot;manualOverrideText&quot;: &quot;&quot;}, &quot;citationItems&quot;: [{&quot;id&quot;: &quot;ITEM-a8f89f0e-10eb-5ccf-9b3b-e67a23b9a467&quot;, &quot;itemData&quot;: {&quot;author&quot;: [{&quot;family&quot;: &quot;Ferreyra&quot;, &quot;given&quot;: &quot;M. M.&quot;, &quot;parse-names&quot;: false, &quot;dropping-particle&quot;: &quot;&quot;, &quot;non-dropping-particle&quot;: &quot;&quot;}, {&quot;family&quot;: &quot;Avitabile&quot;, &quot;given&quot;: &quot;C.&quot;, &quot;parse-names&quot;: false, &quot;dropping-particle&quot;: &quot;&quot;, &quot;non-dropping-particle&quot;: &quot;&quot;}, {&quot;family&quot;: &quot;Botero Álvarez&quot;, &quot;given&quot;: &quot;J.&quot;, &quot;parse-names&quot;: false, &quot;dropping-particle&quot;: &quot;&quot;, &quot;non-dropping-particle&quot;: &quot;&quot;}, {&quot;family&quot;: &quot;Haimovich Paz&quot;, &quot;given&quot;: &quot;F.&quot;, &quot;parse-names&quot;: false, &quot;dropping-particle&quot;: &quot;&quot;, &quot;non-dropping-particle&quot;: &quot;&quot;}, {&quot;family&quot;: &quot;Urzúa&quot;, &quot;given&quot;: &quot;S.&quot;, &quot;parse-names&quot;: false, &quot;dropping-particle&quot;: &quot;&quot;, &quot;non-dropping-particle&quot;: &quot;&quot;}], &quot;issued&quot;: {&quot;date-parts&quot;: [[2017]]}, &quot;DOI&quot;: &quot;10.1596/978-1-4648-1014-5&quot;, &quot;type&quot;: &quot;book&quot;, &quot;title&quot;: &quot;Momento decisivo: la educación superior en América Latina y el Caribe&quot;, &quot;publisher&quot;: &quot;Banco Mundial&quot;, &quot;id&quot;: &quot;ITEM-a8f89f0e-10eb-5ccf-9b3b-e67a23b9a467&quot;, &quot;container-title-short&quot;: &quot;&quot;}, &quot;isTemporary&quot;: false}]}, {&quot;citationID&quot;: &quot;MENDELEY_CITATION_a3a4a206-5157-448b-b6d4-1da946d4d563&quot;, &quot;properties&quot;: {&quot;noteIndex&quot;: 0}, &quot;isEdited&quot;: false, &quot;manualOverride&quot;: {&quot;isManuallyOverridden&quot;: true, &quot;citeprocText&quot;: &quot;(Escalante López et al., 2023)&quot;, &quot;manualOverrideText&quot;: &quot;(Behr et al., 2020, como se citó en Escalante López et al., 2023)&quot;}, &quot;citationItems&quot;: [{&quot;id&quot;: &quot;ITEM-04a17615-a429-5a99-899e-3433dd572883&quot;, &quot;itemData&quot;: {&quot;author&quot;: [{&quot;family&quot;: &quot;Escalante López&quot;, &quot;given&quot;: &quot;J. I.&quot;, &quot;parse-names&quot;: false, &quot;dropping-particle&quot;: &quot;&quot;, &quot;non-dropping-particle&quot;: &quot;&quot;}, {&quot;family&quot;: &quot;Medina Valderrama&quot;, &quot;given&quot;: &quot;C. J.&quot;, &quot;parse-names&quot;: false, &quot;dropping-particle&quot;: &quot;&quot;, &quot;non-dropping-particle&quot;: &quot;&quot;}, {&quot;family&quot;: &quot;Vásquez Muñoz&quot;, &quot;given&quot;: &quot;A.&quot;, &quot;parse-names&quot;: false, &quot;dropping-particle&quot;: &quot;&quot;, &quot;non-dropping-particle&quot;: &quot;&quot;}], &quot;issued&quot;: {&quot;date-parts&quot;: [[2023]]}, &quot;DOI&quot;: &quot;10.26495/rch.v7i1.2421&quot;, &quot;type&quot;: &quot;article-journal&quot;, &quot;title&quot;: &quot;La deserción universitaria: un problema no resuelto en el Perú&quot;, &quot;container-title&quot;: &quot;Hacedor - AIAPÆC&quot;, &quot;volume&quot;: &quot;7&quot;, &quot;issue&quot;: &quot;1&quot;, &quot;page&quot;: &quot;60-72&quot;, &quot;id&quot;: &quot;ITEM-04a17615-a429-5a99-899e-3433dd572883&quot;, &quot;container-title-short&quot;: &quot;&quot;}, &quot;isTemporary&quot;: false}]}, {&quot;citationID&quot;: &quot;MENDELEY_CITATION_06d115db-46d3-4b57-9c8d-447e0c05a0ba&quot;, &quot;properties&quot;: {&quot;noteIndex&quot;: 0}, &quot;isEdited&quot;: false, &quot;manualOverride&quot;: {&quot;isManuallyOverridden&quot;: false, &quot;citeprocText&quot;: &quot;(Superintendencia Nacional de Educación Superior Universitaria, 2020)&quot;, &quot;manualOverrideText&quot;: &quot;&quot;}, &quot;citationItems&quot;: [{&quot;id&quot;: &quot;ITEM-a2cb132e-528c-5815-9af3-ec6970dc84a9&quot;, &quot;itemData&quot;: {&quot;author&quot;: [{&quot;literal&quot;: &quot;Superintendencia Nacional de Educación Superior Universitaria&quot;}], &quot;issued&quot;: {&quot;date-parts&quot;: [[2020]]}, &quot;URL&quot;: &quot;https://hdl.handle.net/20.500.12799/6911&quot;, &quot;type&quot;: &quot;book&quot;, &quot;title&quot;: &quot;II Informe bienal sobre la realidad universitaria en el Perú&quot;, &quot;publisher&quot;: &quot;SUNEDU&quot;, &quot;id&quot;: &quot;ITEM-a2cb132e-528c-5815-9af3-ec6970dc84a9&quot;, &quot;container-title-short&quot;: &quot;&quot;}, &quot;isTemporary&quot;: false}]}, {&quot;citationID&quot;: &quot;MENDELEY_CITATION_6ede9a5b-88e8-4475-ae75-f837af4e98c7&quot;, &quot;properties&quot;: {&quot;noteIndex&quot;: 0}, &quot;isEdited&quot;: false, &quot;manualOverride&quot;: {&quot;isManuallyOverridden&quot;: true, &quot;citeprocText&quot;: &quot;(Escalante López et al., 2023)&quot;, &quot;manualOverrideText&quot;: &quot;Escalante López et al. (2023)&quot;}, &quot;citationItems&quot;: [{&quot;id&quot;: &quot;ITEM-04a17615-a429-5a99-899e-3433dd572883&quot;, &quot;itemData&quot;: {&quot;author&quot;: [{&quot;family&quot;: &quot;Escalante López&quot;, &quot;given&quot;: &quot;J. I.&quot;, &quot;parse-names&quot;: false, &quot;dropping-particle&quot;: &quot;&quot;, &quot;non-dropping-particle&quot;: &quot;&quot;}, {&quot;family&quot;: &quot;Medina Valderrama&quot;, &quot;given&quot;: &quot;C. J.&quot;, &quot;parse-names&quot;: false, &quot;dropping-particle&quot;: &quot;&quot;, &quot;non-dropping-particle&quot;: &quot;&quot;}, {&quot;family&quot;: &quot;Vásquez Muñoz&quot;, &quot;given&quot;: &quot;A.&quot;, &quot;parse-names&quot;: false, &quot;dropping-particle&quot;: &quot;&quot;, &quot;non-dropping-particle&quot;: &quot;&quot;}], &quot;issued&quot;: {&quot;date-parts&quot;: [[2023]]}, &quot;DOI&quot;: &quot;10.26495/rch.v7i1.2421&quot;, &quot;type&quot;: &quot;article-journal&quot;, &quot;title&quot;: &quot;La deserción universitaria: un problema no resuelto en el Perú&quot;, &quot;container-title&quot;: &quot;Hacedor - AIAPÆC&quot;, &quot;volume&quot;: &quot;7&quot;, &quot;issue&quot;: &quot;1&quot;, &quot;page&quot;: &quot;60-72&quot;, &quot;id&quot;: &quot;ITEM-04a17615-a429-5a99-899e-3433dd572883&quot;, &quot;container-title-short&quot;: &quot;&quot;}, &quot;isTemporary&quot;: false}]}, {&quot;citationID&quot;: &quot;MENDELEY_CITATION_4b2568f0-f6da-4537-aea6-8654da07fa80&quot;, &quot;properties&quot;: {&quot;noteIndex&quot;: 0}, &quot;isEdited&quot;: false, &quot;manualOverride&quot;: {&quot;isManuallyOverridden&quot;: false, &quot;citeprocText&quot;: &quot;(Escobar-Mamani y Cuentas Yupanqui, 2024)&quot;, &quot;manualOverrideText&quot;: &quot;&quot;}, &quot;citationItems&quot;: [{&quot;id&quot;: &quot;ITEM-16534d55-37e8-5587-acfc-b1576f3e003e&quot;, &quot;itemData&quot;: {&quot;author&quot;: [{&quot;family&quot;: &quot;Escobar-Mamani&quot;, &quot;given&quot;: &quot;F.&quot;, &quot;parse-names&quot;: false, &quot;dropping-particle&quot;: &quot;&quot;, &quot;non-dropping-particle&quot;: &quot;&quot;}, {&quot;family&quot;: &quot;Cuentas Yupanqui&quot;, &quot;given&quot;: &quot;S. R.&quot;, &quot;parse-names&quot;: false, &quot;dropping-particle&quot;: &quot;&quot;, &quot;non-dropping-particle&quot;: &quot;&quot;}], &quot;issued&quot;: {&quot;date-parts&quot;: [[2024]]}, &quot;DOI&quot;: &quot;10.70123/jht.7&quot;, &quot;type&quot;: &quot;article-journal&quot;, &quot;title&quot;: &quot;Situación académica de estudiantes con matrícula regular y en riesgo académico en la Universidad Nacional del Altiplano, 2023-II&quot;, &quot;container-title&quot;: &quot;Journal of Humanities Titicaca&quot;, &quot;volume&quot;: &quot;2&quot;, &quot;issue&quot;: &quot;1&quot;, &quot;page&quot;: &quot;66-88&quot;, &quot;id&quot;: &quot;ITEM-16534d55-37e8-5587-acfc-b1576f3e003e&quot;, &quot;container-title-short&quot;: &quot;&quot;}, &quot;isTemporary&quot;: false}]}, {&quot;citationID&quot;: &quot;MENDELEY_CITATION_74d6c87c-b7c2-4fad-b0a4-ccd6ee8d9289&quot;, &quot;properties&quot;: {&quot;noteIndex&quot;: 0}, &quot;isEdited&quot;: false, &quot;manualOverride&quot;: {&quot;isManuallyOverridden&quot;: false, &quot;citeprocText&quot;: &quot;(Rodríguez Chipana, 2023)&quot;, &quot;manualOverrideText&quot;: &quot;&quot;}, &quot;citationItems&quot;: [{&quot;id&quot;: &quot;ITEM-58b6c010-e169-5596-822d-32c0b401cede&quot;, &quot;itemData&quot;: {&quot;author&quot;: [{&quot;family&quot;: &quot;Rodríguez Chipana&quot;, &quot;given&quot;: &quot;Y. M.&quot;, &quot;parse-names&quot;: false, &quot;dropping-particle&quot;: &quot;&quot;, &quot;non-dropping-particle&quot;: &quot;&quot;}], &quot;issued&quot;: {&quot;date-parts&quot;: [[2023]]}, &quot;URL&quot;: &quot;https://hdl.handle.net/20.500.12990/13324&quot;, &quot;type&quot;: &quot;thesis&quot;, &quot;title&quot;: &quot;Inteligencia artificial y rendimiento académico de los estudiantes de educación superior en la región Puno, 2022&quot;, &quot;genre&quot;: &quot;Tesis de maestría&quot;, &quot;publisher&quot;: &quot;Universidad Alas Peruanas&quot;, &quot;id&quot;: &quot;ITEM-58b6c010-e169-5596-822d-32c0b401cede&quot;, &quot;container-title-short&quot;: &quot;&quot;}, &quot;isTemporary&quot;: false}]}, {&quot;citationID&quot;: &quot;MENDELEY_CITATION_5eee6bbc-cf9e-449b-9faa-010c66e62f65&quot;, &quot;properties&quot;: {&quot;noteIndex&quot;: 0}, &quot;isEdited&quot;: false, &quot;manualOverride&quot;: {&quot;isManuallyOverridden&quot;: false, &quot;citeprocText&quot;: &quot;(Rodas Zegarra de Escalante, 2024)&quot;, &quot;manualOverrideText&quot;: &quot;&quot;}, &quot;citationItems&quot;: [{&quot;id&quot;: &quot;ITEM-297823cb-c975-5def-8698-5545884294cd&quot;, &quot;itemData&quot;: {&quot;author&quot;: [{&quot;family&quot;: &quot;Rodas Zegarra de Escalante&quot;, &quot;given&quot;: &quot;A.&quot;, &quot;parse-names&quot;: false, &quot;dropping-particle&quot;: &quot;&quot;, &quot;non-dropping-particle&quot;: &quot;&quot;}], &quot;issued&quot;: {&quot;date-parts&quot;: [[2024]]}, &quot;URL&quot;: &quot;https://hdl.handle.net/20.500.12692/150276&quot;, &quot;type&quot;: &quot;thesis&quot;, &quot;title&quot;: &quot;Orientación vocacional y deserción universitaria en una universidad de Lima - 2024&quot;, &quot;genre&quot;: &quot;Tesis de maestría&quot;, &quot;publisher&quot;: &quot;Universidad César Vallejo&quot;, &quot;id&quot;: &quot;ITEM-297823cb-c975-5def-8698-5545884294cd&quot;, &quot;container-title-short&quot;: &quot;&quot;}, &quot;isTemporary&quot;: false}]}, {&quot;citationID&quot;: &quot;MENDELEY_CITATION_93c10372-6cd4-481e-96ba-3e2be06f3cea&quot;, &quot;properties&quot;: {&quot;noteIndex&quot;: 0}, &quot;isEdited&quot;: false, &quot;manualOverride&quot;: {&quot;isManuallyOverridden&quot;: false, &quot;citeprocText&quot;: &quot;(Mann y Whitney, 1947)&quot;, &quot;manualOverrideText&quot;: &quot;&quot;}, &quot;citationItems&quot;: [{&quot;id&quot;: &quot;ITEM-a0bf7f6d-c22f-50eb-b4cf-1a6eaba16e92&quot;, &quot;itemData&quot;: {&quot;author&quot;: [{&quot;family&quot;: &quot;Mann&quot;, &quot;given&quot;: &quot;H. B.&quot;, &quot;parse-names&quot;: false, &quot;dropping-particle&quot;: &quot;&quot;, &quot;non-dropping-particle&quot;: &quot;&quot;}, {&quot;family&quot;: &quot;Whitney&quot;, &quot;given&quot;: &quot;D. R.&quot;, &quot;parse-names&quot;: false, &quot;dropping-particle&quot;: &quot;&quot;, &quot;non-dropping-particle&quot;: &quot;&quot;}], &quot;issued&quot;: {&quot;date-parts&quot;: [[1947]]}, &quot;DOI&quot;: &quot;10.1214/aoms/1177730491&quot;, &quot;type&quot;: &quot;article-journal&quot;, &quot;title&quot;: &quot;On a test of whether one of two random variables is stochastically larger than the other&quot;, &quot;container-title&quot;: &quot;The Annals of Mathematical Statistics&quot;, &quot;volume&quot;: &quot;18&quot;, &quot;issue&quot;: &quot;1&quot;, &quot;page&quot;: &quot;50-60&quot;, &quot;id&quot;: &quot;ITEM-a0bf7f6d-c22f-50eb-b4cf-1a6eaba16e92&quot;, &quot;container-title-short&quot;: &quot;&quot;}, &quot;isTemporary&quot;: false}]}, {&quot;citationID&quot;: &quot;MENDELEY_CITATION_7b9eb087-443a-43f7-95d3-7102bd2a5c0c&quot;, &quot;properties&quot;: {&quot;noteIndex&quot;: 0}, &quot;isEdited&quot;: false, &quot;manualOverride&quot;: {&quot;isManuallyOverridden&quot;: false, &quot;citeprocText&quot;: &quot;(Cliff, 1993)&quot;, &quot;manualOverrideText&quot;: &quot;&quot;}, &quot;citationItems&quot;: [{&quot;id&quot;: &quot;ITEM-02d3d39e-1c5a-533a-844d-5bb46c2ecac4&quot;, &quot;itemData&quot;: {&quot;author&quot;: [{&quot;family&quot;: &quot;Cliff&quot;, &quot;given&quot;: &quot;N.&quot;, &quot;parse-names&quot;: false, &quot;dropping-particle&quot;: &quot;&quot;, &quot;non-dropping-particle&quot;: &quot;&quot;}], &quot;issued&quot;: {&quot;date-parts&quot;: [[1993]]}, &quot;DOI&quot;: &quot;10.1037/0033-2909.114.3.494&quot;, &quot;type&quot;: &quot;article-journal&quot;, &quot;title&quot;: &quot;Dominance statistics: Ordinal analyses to answer ordinal questions&quot;, &quot;container-title&quot;: &quot;Psychological Bulletin&quot;, &quot;volume&quot;: &quot;114&quot;, &quot;issue&quot;: &quot;3&quot;, &quot;page&quot;: &quot;494-509&quot;, &quot;id&quot;: &quot;ITEM-02d3d39e-1c5a-533a-844d-5bb46c2ecac4&quot;, &quot;container-title-short&quot;: &quot;&quot;}, &quot;isTemporary&quot;: false}]}, {&quot;citationID&quot;: &quot;MENDELEY_CITATION_0aea4d97-d70e-4f68-bd49-ea940a5ff0f4&quot;, &quot;properties&quot;: {&quot;noteIndex&quot;: 0}, &quot;isEdited&quot;: false, &quot;manualOverride&quot;: {&quot;isManuallyOverridden&quot;: false, &quot;citeprocText&quot;: &quot;(Cramér, 1946)&quot;, &quot;manualOverrideText&quot;: &quot;&quot;}, &quot;citationItems&quot;: [{&quot;id&quot;: &quot;ITEM-8c327639-514d-536d-95ba-80d06d096139&quot;, &quot;itemData&quot;: {&quot;author&quot;: [{&quot;family&quot;: &quot;Cramér&quot;, &quot;given&quot;: &quot;H.&quot;, &quot;parse-names&quot;: false, &quot;dropping-particle&quot;: &quot;&quot;, &quot;non-dropping-particle&quot;: &quot;&quot;}], &quot;issued&quot;: {&quot;date-parts&quot;: [[1946]]}, &quot;DOI&quot;: &quot;10.1515/9781400883868&quot;, &quot;type&quot;: &quot;book&quot;, &quot;title&quot;: &quot;Mathematical methods of statistics&quot;, &quot;publisher&quot;: &quot;Princeton University Press&quot;, &quot;id&quot;: &quot;ITEM-8c327639-514d-536d-95ba-80d06d096139&quot;, &quot;container-title-short&quot;: &quot;&quot;}, &quot;isTemporary&quot;: false}]}, {&quot;citationID&quot;: &quot;MENDELEY_CITATION_5c65496c-cb51-4b5f-998b-a85b4a3e32c4&quot;, &quot;properties&quot;: {&quot;noteIndex&quot;: 0}, &quot;isEdited&quot;: false, &quot;manualOverride&quot;: {&quot;isManuallyOverridden&quot;: false, &quot;citeprocText&quot;: &quot;(Hanley y McNeil, 1982)&quot;, &quot;manualOverrideText&quot;: &quot;&quot;}, &quot;citationItems&quot;: [{&quot;id&quot;: &quot;ITEM-ba297aa3-b2fc-5a21-87eb-bc760183eab4&quot;, &quot;itemData&quot;: {&quot;author&quot;: [{&quot;family&quot;: &quot;Hanley&quot;, &quot;given&quot;: &quot;J. A.&quot;, &quot;parse-names&quot;: false, &quot;dropping-particle&quot;: &quot;&quot;, &quot;non-dropping-particle&quot;: &quot;&quot;}, {&quot;family&quot;: &quot;McNeil&quot;, &quot;given&quot;: &quot;B. J.&quot;, &quot;parse-names&quot;: false, &quot;dropping-particle&quot;: &quot;&quot;, &quot;non-dropping-particle&quot;: &quot;&quot;}], &quot;issued&quot;: {&quot;date-parts&quot;: [[1982]]}, &quot;DOI&quot;: &quot;10.1148/radiology.143.1.7063747&quot;, &quot;type&quot;: &quot;article-journal&quot;, &quot;title&quot;: &quot;The meaning and use of the area under a receiver operating characteristic (ROC) curve&quot;, &quot;container-title&quot;: &quot;Radiology&quot;, &quot;volume&quot;: &quot;143&quot;, &quot;issue&quot;: &quot;1&quot;, &quot;page&quot;: &quot;29-36&quot;, &quot;id&quot;: &quot;ITEM-ba297aa3-b2fc-5a21-87eb-bc760183eab4&quot;, &quot;container-title-short&quot;: &quot;&quot;}, &quot;isTemporary&quot;: false}]}, {&quot;citationID&quot;: &quot;MENDELEY_CITATION_014ac7f4-0eaf-41de-8255-5fbd3f017564&quot;, &quot;properties&quot;: {&quot;noteIndex&quot;: 0}, &quot;isEdited&quot;: false, &quot;manualOverride&quot;: {&quot;isManuallyOverridden&quot;: false, &quot;citeprocText&quot;: &quot;(Saito y Rehmsmeier, 2015)&quot;, &quot;manualOverrideText&quot;: &quot;&quot;}, &quot;citationItems&quot;: [{&quot;id&quot;: &quot;ITEM-bc916a3b-0d2f-54f4-bce7-658872a179e1&quot;, &quot;itemData&quot;: {&quot;author&quot;: [{&quot;family&quot;: &quot;Saito&quot;, &quot;given&quot;: &quot;T.&quot;, &quot;parse-names&quot;: false, &quot;dropping-particle&quot;: &quot;&quot;, &quot;non-dropping-particle&quot;: &quot;&quot;}, {&quot;family&quot;: &quot;Rehmsmeier&quot;, &quot;given&quot;: &quot;M.&quot;, &quot;parse-names&quot;: false, &quot;dropping-particle&quot;: &quot;&quot;, &quot;non-dropping-particle&quot;: &quot;&quot;}], &quot;issued&quot;: {&quot;date-parts&quot;: [[2015]]}, &quot;DOI&quot;: &quot;10.1371/journal.pone.0118432&quot;, &quot;type&quot;: &quot;article-journal&quot;, &quot;title&quot;: &quot;The precision-recall plot is more informative than the ROC plot when evaluating binary classifiers on imbalanced datasets&quot;, &quot;container-title&quot;: &quot;PLOS ONE&quot;, &quot;volume&quot;: &quot;10&quot;, &quot;issue&quot;: &quot;3&quot;, &quot;page&quot;: &quot;e0118432&quot;, &quot;id&quot;: &quot;ITEM-bc916a3b-0d2f-54f4-bce7-658872a179e1&quot;, &quot;container-title-short&quot;: &quot;&quot;}, &quot;isTemporary&quot;: false}]}, {&quot;citationID&quot;: &quot;MENDELEY_CITATION_27d48586-9b07-43e2-a917-8f323840bcfc&quot;, &quot;properties&quot;: {&quot;noteIndex&quot;: 0}, &quot;isEdited&quot;: false, &quot;manualOverride&quot;: {&quot;isManuallyOverridden&quot;: false, &quot;citeprocText&quot;: &quot;(Zadrozny y Elkan, 2002)&quot;, &quot;manualOverrideText&quot;: &quot;&quot;}, &quot;citationItems&quot;: [{&quot;id&quot;: &quot;ITEM-298cf3e0-fabe-51a7-a6b1-d18f99476527&quot;, &quot;itemData&quot;: {&quot;author&quot;: [{&quot;family&quot;: &quot;Zadrozny&quot;, &quot;given&quot;: &quot;B.&quot;, &quot;parse-names&quot;: false, &quot;dropping-particle&quot;: &quot;&quot;, &quot;non-dropping-particle&quot;: &quot;&quot;}, {&quot;family&quot;: &quot;Elkan&quot;, &quot;given&quot;: &quot;C.&quot;, &quot;parse-names&quot;: false, &quot;dropping-particle&quot;: &quot;&quot;, &quot;non-dropping-particle&quot;: &quot;&quot;}], &quot;issued&quot;: {&quot;date-parts&quot;: [[2002]]}, &quot;DOI&quot;: &quot;10.1145/775047.775151&quot;, &quot;type&quot;: &quot;paper-conference&quot;, &quot;title&quot;: &quot;Transforming classifier scores into accurate multiclass probability estimates&quot;, &quot;container-title&quot;: &quot;Proceedings of the Eighth ACM SIGKDD International Conference on Knowledge Discovery and Data Mining&quot;, &quot;page&quot;: &quot;694-699&quot;, &quot;id&quot;: &quot;ITEM-298cf3e0-fabe-51a7-a6b1-d18f99476527&quot;, &quot;container-title-short&quot;: &quot;&quot;}, &quot;isTemporary&quot;: false}]}, {&quot;citationID&quot;: &quot;MENDELEY_CITATION_8e7e7413-52da-421b-b1fc-02d8b98a4a9f&quot;, &quot;properties&quot;: {&quot;noteIndex&quot;: 0}, &quot;isEdited&quot;: false, &quot;manualOverride&quot;: {&quot;isManuallyOverridden&quot;: false, &quot;citeprocText&quot;: &quot;(Brier, 1950)&quot;, &quot;manualOverrideText&quot;: &quot;&quot;}, &quot;citationItems&quot;: [{&quot;id&quot;: &quot;ITEM-776f22b4-afe8-5194-a1b7-5e15e5c48ed3&quot;, &quot;itemData&quot;: {&quot;author&quot;: [{&quot;family&quot;: &quot;Brier&quot;, &quot;given&quot;: &quot;G. W.&quot;, &quot;parse-names&quot;: false, &quot;dropping-particle&quot;: &quot;&quot;, &quot;non-dropping-particle&quot;: &quot;&quot;}], &quot;issued&quot;: {&quot;date-parts&quot;: [[1950]]}, &quot;DOI&quot;: &quot;10.1175/1520-0493(1950)078&lt;0001:VOFEIT&gt;2.0.CO;2&quot;, &quot;type&quot;: &quot;article-journal&quot;, &quot;title&quot;: &quot;Verification of forecasts expressed in terms of probability&quot;, &quot;container-title&quot;: &quot;Monthly Weather Review&quot;, &quot;volume&quot;: &quot;78&quot;, &quot;issue&quot;: &quot;1&quot;, &quot;page&quot;: &quot;1-3&quot;, &quot;id&quot;: &quot;ITEM-776f22b4-afe8-5194-a1b7-5e15e5c48ed3&quot;, &quot;container-title-short&quot;: &quot;&quot;}, &quot;isTemporary&quot;: false}]}, {&quot;citationID&quot;: &quot;MENDELEY_CITATION_cd5eb98d-a947-4bd3-be6f-687ecce88319&quot;, &quot;properties&quot;: {&quot;noteIndex&quot;: 0}, &quot;isEdited&quot;: false, &quot;manualOverride&quot;: {&quot;isManuallyOverridden&quot;: false, &quot;citeprocText&quot;: &quot;(Lin, 2004)&quot;, &quot;manualOverrideText&quot;: &quot;&quot;}, &quot;citationItems&quot;: [{&quot;id&quot;: &quot;ITEM-4c670ef2-d773-5121-82ef-8d74a63fa86e&quot;, &quot;itemData&quot;: {&quot;author&quot;: [{&quot;family&quot;: &quot;Lin&quot;, &quot;given&quot;: &quot;C.-Y.&quot;, &quot;parse-names&quot;: false, &quot;dropping-particle&quot;: &quot;&quot;, &quot;non-dropping-particle&quot;: &quot;&quot;}], &quot;issued&quot;: {&quot;date-parts&quot;: [[2004]]}, &quot;URL&quot;: &quot;https://aclanthology.org/W04-1013/&quot;, &quot;type&quot;: &quot;paper-conference&quot;, &quot;title&quot;: &quot;ROUGE: A package for automatic evaluation of summaries&quot;, &quot;container-title&quot;: &quot;Text Summarization Branches Out&quot;, &quot;page&quot;: &quot;74-81&quot;, &quot;publisher&quot;: &quot;Association for Computational Linguistics&quot;, &quot;id&quot;: &quot;ITEM-4c670ef2-d773-5121-82ef-8d74a63fa86e&quot;, &quot;container-title-short&quot;: &quot;&quot;}, &quot;isTemporary&quot;: false}]}, {&quot;citationID&quot;: &quot;MENDELEY_CITATION_db783f09-0795-4857-adb0-fbb4774ff3d4&quot;, &quot;properties&quot;: {&quot;noteIndex&quot;: 0}, &quot;isEdited&quot;: false, &quot;manualOverride&quot;: {&quot;isManuallyOverridden&quot;: false, &quot;citeprocText&quot;: &quot;(Zhang et al., 2020)&quot;, &quot;manualOverrideText&quot;: &quot;&quot;}, &quot;citationItems&quot;: [{&quot;id&quot;: &quot;ITEM-b52ef349-b8ca-5686-84a5-ee1e80905b85&quot;, &quot;itemData&quot;: {&quot;author&quot;: [{&quot;family&quot;: &quot;Zhang&quot;, &quot;given&quot;: &quot;T.&quot;, &quot;parse-names&quot;: false, &quot;dropping-particle&quot;: &quot;&quot;, &quot;non-dropping-particle&quot;: &quot;&quot;}, {&quot;family&quot;: &quot;Kishore&quot;, &quot;given&quot;: &quot;V.&quot;, &quot;parse-names&quot;: false, &quot;dropping-particle&quot;: &quot;&quot;, &quot;non-dropping-particle&quot;: &quot;&quot;}, {&quot;family&quot;: &quot;Wu&quot;, &quot;given&quot;: &quot;F.&quot;, &quot;parse-names&quot;: false, &quot;dropping-particle&quot;: &quot;&quot;, &quot;non-dropping-particle&quot;: &quot;&quot;}, {&quot;family&quot;: &quot;Weinberger&quot;, &quot;given&quot;: &quot;K. Q.&quot;, &quot;parse-names&quot;: false, &quot;dropping-particle&quot;: &quot;&quot;, &quot;non-dropping-particle&quot;: &quot;&quot;}, {&quot;family&quot;: &quot;Artzi&quot;, &quot;given&quot;: &quot;Y.&quot;, &quot;parse-names&quot;: false, &quot;dropping-particle&quot;: &quot;&quot;, &quot;non-dropping-particle&quot;: &quot;&quot;}], &quot;issued&quot;: {&quot;date-parts&quot;: [[2020]]}, &quot;DOI&quot;: &quot;10.48550/arXiv.1904.09675&quot;, &quot;type&quot;: &quot;paper-conference&quot;, &quot;title&quot;: &quot;BERTScore: Evaluating text generation with BERT&quot;, &quot;container-title&quot;: &quot;International Conference on Learning Representations&quot;, &quot;id&quot;: &quot;ITEM-b52ef349-b8ca-5686-84a5-ee1e80905b85&quot;, &quot;container-title-short&quot;: &quot;&quot;}, &quot;isTemporary&quot;: false}]}, {&quot;citationID&quot;: &quot;MENDELEY_CITATION_afc86019-61de-4d51-8cf7-0dae59091f39&quot;, &quot;properties&quot;: {&quot;noteIndex&quot;: 0}, &quot;isEdited&quot;: false, &quot;manualOverride&quot;: {&quot;isManuallyOverridden&quot;: false, &quot;citeprocText&quot;: &quot;(Järvelin y Kekäläinen, 2002)&quot;, &quot;manualOverrideText&quot;: &quot;&quot;}, &quot;citationItems&quot;: [{&quot;id&quot;: &quot;ITEM-09731480-e571-5a92-baf1-09e43623c231&quot;, &quot;itemData&quot;: {&quot;author&quot;: [{&quot;family&quot;: &quot;Järvelin&quot;, &quot;given&quot;: &quot;K.&quot;, &quot;parse-names&quot;: false, &quot;dropping-particle&quot;: &quot;&quot;, &quot;non-dropping-particle&quot;: &quot;&quot;}, {&quot;family&quot;: &quot;Kekäläinen&quot;, &quot;given&quot;: &quot;J.&quot;, &quot;parse-names&quot;: false, &quot;dropping-particle&quot;: &quot;&quot;, &quot;non-dropping-particle&quot;: &quot;&quot;}], &quot;issued&quot;: {&quot;date-parts&quot;: [[2002]]}, &quot;DOI&quot;: &quot;10.1145/582415.582418&quot;, &quot;type&quot;: &quot;article-journal&quot;, &quot;title&quot;: &quot;Cumulated gain-based evaluation of IR techniques&quot;, &quot;container-title&quot;: &quot;ACM Transactions on Information Systems&quot;, &quot;volume&quot;: &quot;20&quot;, &quot;issue&quot;: &quot;4&quot;, &quot;page&quot;: &quot;422-446&quot;, &quot;id&quot;: &quot;ITEM-09731480-e571-5a92-baf1-09e43623c231&quot;, &quot;container-title-short&quot;: &quot;&quot;}, &quot;isTemporary&quot;: false}]}, {&quot;citationID&quot;: &quot;MENDELEY_CITATION_7416ec7e-f406-41e1-836c-42731f0f742f&quot;, &quot;properties&quot;: {&quot;noteIndex&quot;: 0}, &quot;isEdited&quot;: false, &quot;manualOverride&quot;: {&quot;isManuallyOverridden&quot;: false, &quot;citeprocText&quot;: &quot;(Voorhees, 1999)&quot;, &quot;manualOverrideText&quot;: &quot;&quot;}, &quot;citationItems&quot;: [{&quot;id&quot;: &quot;ITEM-fa3f1674-ed35-5374-b5d7-e3539fabe107&quot;, &quot;itemData&quot;: {&quot;author&quot;: [{&quot;family&quot;: &quot;Voorhees&quot;, &quot;given&quot;: &quot;E. M.&quot;, &quot;parse-names&quot;: false, &quot;dropping-particle&quot;: &quot;&quot;, &quot;non-dropping-particle&quot;: &quot;&quot;}], &quot;issued&quot;: {&quot;date-parts&quot;: [[1999]]}, &quot;URL&quot;: &quot;https://trec.nist.gov/pubs/trec8/papers/qa_report.pdf&quot;, &quot;type&quot;: &quot;paper-conference&quot;, &quot;title&quot;: &quot;The TREC-8 question answering track report&quot;, &quot;container-title&quot;: &quot;Proceedings of the Eighth Text REtrieval Conference&quot;, &quot;page&quot;: &quot;77-82&quot;, &quot;publisher&quot;: &quot;National Institute of Standards and Technology&quot;, &quot;id&quot;: &quot;ITEM-fa3f1674-ed35-5374-b5d7-e3539fabe107&quot;, &quot;container-title-short&quot;: &quot;&quot;}, &quot;isTemporary&quot;: false}]}, {&quot;citationID&quot;: &quot;MENDELEY_CITATION_f283cc57-fc37-44f8-9fa1-2ead98df6f25&quot;, &quot;properties&quot;: {&quot;noteIndex&quot;: 0}, &quot;isEdited&quot;: false, &quot;manualOverride&quot;: {&quot;isManuallyOverridden&quot;: false, &quot;citeprocText&quot;: &quot;(Wilcoxon, 1945)&quot;, &quot;manualOverrideText&quot;: &quot;&quot;}, &quot;citationItems&quot;: [{&quot;id&quot;: &quot;ITEM-612bd905-97c5-5cb0-a005-be28dbc83ac1&quot;, &quot;itemData&quot;: {&quot;author&quot;: [{&quot;family&quot;: &quot;Wilcoxon&quot;, &quot;given&quot;: &quot;F.&quot;, &quot;parse-names&quot;: false, &quot;dropping-particle&quot;: &quot;&quot;, &quot;non-dropping-particle&quot;: &quot;&quot;}], &quot;issued&quot;: {&quot;date-parts&quot;: [[1945]]}, &quot;DOI&quot;: &quot;10.2307/3001968&quot;, &quot;type&quot;: &quot;article-journal&quot;, &quot;title&quot;: &quot;Individual comparisons by ranking methods&quot;, &quot;container-title&quot;: &quot;Biometrics Bulletin&quot;, &quot;volume&quot;: &quot;1&quot;, &quot;issue&quot;: &quot;6&quot;, &quot;page&quot;: &quot;80-83&quot;, &quot;id&quot;: &quot;ITEM-612bd905-97c5-5cb0-a005-be28dbc83ac1&quot;, &quot;container-title-short&quot;: &quot;&quot;}, &quot;isTemporary&quot;: false}]}, {&quot;citationID&quot;: &quot;MENDELEY_CITATION_c74a254b-81ad-42af-9219-93f14e5c1140&quot;, &quot;properties&quot;: {&quot;noteIndex&quot;: 0}, &quot;isEdited&quot;: false, &quot;manualOverride&quot;: {&quot;isManuallyOverridden&quot;: true, &quot;citeprocText&quot;: &quot;(Carballo-Mendívil et al., 2025)&quot;, &quot;manualOverrideText&quot;: &quot;Carballo-Mendívil et al. (2025)&quot;}, &quot;citationItems&quot;: [{&quot;id&quot;: &quot;ITEM-4755bb51-baf5-5536-8cda-5af1c04a59c8&quot;, &quot;itemData&quot;: {&quot;author&quot;: [{&quot;family&quot;: &quot;Carballo-Mendívil&quot;, &quot;given&quot;: &quot;B.&quot;, &quot;parse-names&quot;: false, &quot;dropping-particle&quot;: &quot;&quot;, &quot;non-dropping-particle&quot;: &quot;&quot;}, {&quot;family&quot;: &quot;Arellano-González&quot;, &quot;given&quot;: &quot;A.&quot;, &quot;parse-names&quot;: false, &quot;dropping-particle&quot;: &quot;&quot;, &quot;non-dropping-particle&quot;: &quot;&quot;}, {&quot;family&quot;: &quot;Ríos-Vázquez&quot;, &quot;given&quot;: &quot;N. J.&quot;, &quot;parse-names&quot;: false, &quot;dropping-particle&quot;: &quot;&quot;, &quot;non-dropping-particle&quot;: &quot;&quot;}, {&quot;family&quot;: &quot;Lizardi-Duarte&quot;, &quot;given&quot;: &quot;M. del P.&quot;, &quot;parse-names&quot;: false, &quot;dropping-particle&quot;: &quot;&quot;, &quot;non-dropping-particle&quot;: &quot;&quot;}], &quot;issued&quot;: {&quot;date-parts&quot;: [[2025]]}, &quot;DOI&quot;: &quot;10.3390/app15169202&quot;, &quot;type&quot;: &quot;article-journal&quot;, &quot;title&quot;: &quot;Predicting student dropout from day one: XGBoost-based early warning system using pre-enrollment data&quot;, &quot;container-title&quot;: &quot;Applied Sciences&quot;, &quot;volume&quot;: &quot;15&quot;, &quot;issue&quot;: &quot;16&quot;, &quot;page&quot;: &quot;9202&quot;, &quot;id&quot;: &quot;ITEM-4755bb51-baf5-5536-8cda-5af1c04a59c8&quot;, &quot;container-title-short&quot;: &quot;&quot;}, &quot;isTemporary&quot;: false}]}, {&quot;citationID&quot;: &quot;MENDELEY_CITATION_06f1e104-b020-4c9e-8b43-aaeee3c5f11a&quot;, &quot;properties&quot;: {&quot;noteIndex&quot;: 0}, &quot;isEdited&quot;: false, &quot;manualOverride&quot;: {&quot;isManuallyOverridden&quot;: true, &quot;citeprocText&quot;: &quot;(Guadalupe Mori, 2025)&quot;, &quot;manualOverrideText&quot;: &quot;Guadalupe Mori (2025)&quot;}, &quot;citationItems&quot;: [{&quot;id&quot;: &quot;ITEM-745e87b9-5edd-56c2-99e9-42f2290e8c38&quot;, &quot;itemData&quot;: {&quot;author&quot;: [{&quot;family&quot;: &quot;Guadalupe Mori&quot;, &quot;given&quot;: &quot;V. H.&quot;, &quot;parse-names&quot;: false, &quot;dropping-particle&quot;: &quot;&quot;, &quot;non-dropping-particle&quot;: &quot;&quot;}], &quot;issued&quot;: {&quot;date-parts&quot;: [[2025]]}, &quot;URL&quot;: &quot;https://hdl.handle.net/20.500.13084/10839&quot;, &quot;type&quot;: &quot;thesis&quot;, &quot;title&quot;: &quot;Modelo predictivo basado en machine learning para la reducción de la deserción estudiantil en las universidades privadas del Perú: caso Universidad Privada San Juan Bautista&quot;, &quot;genre&quot;: &quot;Tesis doctoral&quot;, &quot;publisher&quot;: &quot;Universidad Nacional Federico Villarreal&quot;, &quot;id&quot;: &quot;ITEM-745e87b9-5edd-56c2-99e9-42f2290e8c38&quot;, &quot;container-title-short&quot;: &quot;&quot;}, &quot;isTemporary&quot;: false}]}, {&quot;citationID&quot;: &quot;MENDELEY_CITATION_20efa438-4e88-4651-9e9b-5edb3ae7c0c5&quot;, &quot;properties&quot;: {&quot;noteIndex&quot;: 0}, &quot;isEdited&quot;: false, &quot;manualOverride&quot;: {&quot;isManuallyOverridden&quot;: true, &quot;citeprocText&quot;: &quot;(Carballo-Mendívil et al., 2025)&quot;, &quot;manualOverrideText&quot;: &quot;Carballo-Mendívil et al. (2025)&quot;}, &quot;citationItems&quot;: [{&quot;id&quot;: &quot;ITEM-4755bb51-baf5-5536-8cda-5af1c04a59c8&quot;, &quot;itemData&quot;: {&quot;author&quot;: [{&quot;family&quot;: &quot;Carballo-Mendívil&quot;, &quot;given&quot;: &quot;B.&quot;, &quot;parse-names&quot;: false, &quot;dropping-particle&quot;: &quot;&quot;, &quot;non-dropping-particle&quot;: &quot;&quot;}, {&quot;family&quot;: &quot;Arellano-González&quot;, &quot;given&quot;: &quot;A.&quot;, &quot;parse-names&quot;: false, &quot;dropping-particle&quot;: &quot;&quot;, &quot;non-dropping-particle&quot;: &quot;&quot;}, {&quot;family&quot;: &quot;Ríos-Vázquez&quot;, &quot;given&quot;: &quot;N. J.&quot;, &quot;parse-names&quot;: false, &quot;dropping-particle&quot;: &quot;&quot;, &quot;non-dropping-particle&quot;: &quot;&quot;}, {&quot;family&quot;: &quot;Lizardi-Duarte&quot;, &quot;given&quot;: &quot;M. del P.&quot;, &quot;parse-names&quot;: false, &quot;dropping-particle&quot;: &quot;&quot;, &quot;non-dropping-particle&quot;: &quot;&quot;}], &quot;issued&quot;: {&quot;date-parts&quot;: [[2025]]}, &quot;DOI&quot;: &quot;10.3390/app15169202&quot;, &quot;type&quot;: &quot;article-journal&quot;, &quot;title&quot;: &quot;Predicting student dropout from day one: XGBoost-based early warning system using pre-enrollment data&quot;, &quot;container-title&quot;: &quot;Applied Sciences&quot;, &quot;volume&quot;: &quot;15&quot;, &quot;issue&quot;: &quot;16&quot;, &quot;page&quot;: &quot;9202&quot;, &quot;id&quot;: &quot;ITEM-4755bb51-baf5-5536-8cda-5af1c04a59c8&quot;, &quot;container-title-short&quot;: &quot;&quot;}, &quot;isTemporary&quot;: false}]}, {&quot;citationID&quot;: &quot;MENDELEY_CITATION_47d27e9f-22f9-4106-97b5-b429f8d6b18c&quot;, &quot;properties&quot;: {&quot;noteIndex&quot;: 0}, &quot;isEdited&quot;: false, &quot;manualOverride&quot;: {&quot;isManuallyOverridden&quot;: true, &quot;citeprocText&quot;: &quot;(Yataco Cañari y Jacha Rojas, 2024)&quot;, &quot;manualOverrideText&quot;: &quot;Yataco Cañari y Jacha Rojas (2024)&quot;}, &quot;citationItems&quot;: [{&quot;id&quot;: &quot;ITEM-02ada8e7-47d2-5940-ab09-a30ce56e4fb6&quot;, &quot;itemData&quot;: {&quot;author&quot;: [{&quot;family&quot;: &quot;Yataco Cañari&quot;, &quot;given&quot;: &quot;W.&quot;, &quot;parse-names&quot;: false, &quot;dropping-particle&quot;: &quot;&quot;, &quot;non-dropping-particle&quot;: &quot;&quot;}, {&quot;family&quot;: &quot;Jacha Rojas&quot;, &quot;given&quot;: &quot;J. P.&quot;, &quot;parse-names&quot;: false, &quot;dropping-particle&quot;: &quot;&quot;, &quot;non-dropping-particle&quot;: &quot;&quot;}], &quot;issued&quot;: {&quot;date-parts&quot;: [[2024]]}, &quot;URL&quot;: &quot;https://hdl.handle.net/20.500.12840/7597&quot;, &quot;type&quot;: &quot;thesis&quot;, &quot;title&quot;: &quot;Modelo machine learning para predicción de deserción estudiantil&quot;, &quot;genre&quot;: &quot;Trabajo académico de segunda especialidad&quot;, &quot;publisher&quot;: &quot;Universidad Peruana Unión&quot;, &quot;id&quot;: &quot;ITEM-02ada8e7-47d2-5940-ab09-a30ce56e4fb6&quot;, &quot;container-title-short&quot;: &quot;&quot;}, &quot;isTemporary&quot;: false}]}, {&quot;citationID&quot;: &quot;MENDELEY_CITATION_0985a2a1-e3d0-4c3a-aff7-12364abd5867&quot;, &quot;properties&quot;: {&quot;noteIndex&quot;: 0}, &quot;isEdited&quot;: false, &quot;manualOverride&quot;: {&quot;isManuallyOverridden&quot;: true, &quot;citeprocText&quot;: &quot;(Aguilar-Reyes et al., 2025)&quot;, &quot;manualOverrideText&quot;: &quot;Aguilar-Reyes et al. (2025)&quot;}, &quot;citationItems&quot;: [{&quot;id&quot;: &quot;ITEM-8c9c99df-1678-5fab-b737-85f1e9842ee2&quot;, &quot;itemData&quot;: {&quot;author&quot;: [{&quot;family&quot;: &quot;Aguilar-Reyes&quot;, &quot;given&quot;: &quot;J. E.&quot;, &quot;parse-names&quot;: false, &quot;dropping-particle&quot;: &quot;&quot;, &quot;non-dropping-particle&quot;: &quot;&quot;}, {&quot;family&quot;: &quot;Mejía-Peñafiel&quot;, &quot;given&quot;: &quot;E. F.&quot;, &quot;parse-names&quot;: false, &quot;dropping-particle&quot;: &quot;&quot;, &quot;non-dropping-particle&quot;: &quot;&quot;}, {&quot;family&quot;: &quot;Morocho-Barrionuevo&quot;, &quot;given&quot;: &quot;T. P.&quot;, &quot;parse-names&quot;: false, &quot;dropping-particle&quot;: &quot;&quot;, &quot;non-dropping-particle&quot;: &quot;&quot;}, {&quot;family&quot;: &quot;Velasco-Castelo&quot;, &quot;given&quot;: &quot;G.-M.&quot;, &quot;parse-names&quot;: false, &quot;dropping-particle&quot;: &quot;&quot;, &quot;non-dropping-particle&quot;: &quot;&quot;}], &quot;issued&quot;: {&quot;date-parts&quot;: [[2025]]}, &quot;DOI&quot;: &quot;10.36390/telos271.08&quot;, &quot;type&quot;: &quot;article-journal&quot;, &quot;title&quot;: &quot;Estudio del rendimiento académico mediante la comparación de modelos de regresión y árboles de clasificación&quot;, &quot;container-title&quot;: &quot;Telos: Revista de Estudios Interdisciplinarios en Ciencias Sociales&quot;, &quot;volume&quot;: &quot;27&quot;, &quot;issue&quot;: &quot;1&quot;, &quot;page&quot;: &quot;94-115&quot;, &quot;id&quot;: &quot;ITEM-8c9c99df-1678-5fab-b737-85f1e9842ee2&quot;, &quot;container-title-short&quot;: &quot;&quot;}, &quot;isTemporary&quot;: false}]}, {&quot;citationID&quot;: &quot;MENDELEY_CITATION_371a1432-89d7-4f48-94ef-931b34c54018&quot;, &quot;properties&quot;: {&quot;noteIndex&quot;: 0}, &quot;isEdited&quot;: false, &quot;manualOverride&quot;: {&quot;isManuallyOverridden&quot;: true, &quot;citeprocText&quot;: &quot;(Fang et al., 2024)&quot;, &quot;manualOverrideText&quot;: &quot;Fang et al. (2024)&quot;}, &quot;citationItems&quot;: [{&quot;id&quot;: &quot;ITEM-5007b438-b37f-541e-8fca-2748edacc281&quot;, &quot;itemData&quot;: {&quot;author&quot;: [{&quot;family&quot;: &quot;Fang&quot;, &quot;given&quot;: &quot;X.&quot;, &quot;parse-names&quot;: false, &quot;dropping-particle&quot;: &quot;&quot;, &quot;non-dropping-particle&quot;: &quot;&quot;}, {&quot;family&quot;: &quot;Xu&quot;, &quot;given&quot;: &quot;W.&quot;, &quot;parse-names&quot;: false, &quot;dropping-particle&quot;: &quot;&quot;, &quot;non-dropping-particle&quot;: &quot;&quot;}, {&quot;family&quot;: &quot;Tan&quot;, &quot;given&quot;: &quot;F. A.&quot;, &quot;parse-names&quot;: false, &quot;dropping-particle&quot;: &quot;&quot;, &quot;non-dropping-particle&quot;: &quot;&quot;}, {&quot;family&quot;: &quot;Zhang&quot;, &quot;given&quot;: &quot;J.&quot;, &quot;parse-names&quot;: false, &quot;dropping-particle&quot;: &quot;&quot;, &quot;non-dropping-particle&quot;: &quot;&quot;}, {&quot;family&quot;: &quot;Hu&quot;, &quot;given&quot;: &quot;Z.&quot;, &quot;parse-names&quot;: false, &quot;dropping-particle&quot;: &quot;&quot;, &quot;non-dropping-particle&quot;: &quot;&quot;}, {&quot;family&quot;: &quot;Qi&quot;, &quot;given&quot;: &quot;Y.&quot;, &quot;parse-names&quot;: false, &quot;dropping-particle&quot;: &quot;&quot;, &quot;non-dropping-particle&quot;: &quot;&quot;}, {&quot;family&quot;: &quot;Nickleach&quot;, &quot;given&quot;: &quot;S.&quot;, &quot;parse-names&quot;: false, &quot;dropping-particle&quot;: &quot;&quot;, &quot;non-dropping-particle&quot;: &quot;&quot;}, {&quot;family&quot;: &quot;Socolinsky&quot;, &quot;given&quot;: &quot;D.&quot;, &quot;parse-names&quot;: false, &quot;dropping-particle&quot;: &quot;&quot;, &quot;non-dropping-particle&quot;: &quot;&quot;}, {&quot;family&quot;: &quot;Sengamedu&quot;, &quot;given&quot;: &quot;S.&quot;, &quot;parse-names&quot;: false, &quot;dropping-particle&quot;: &quot;&quot;, &quot;non-dropping-particle&quot;: &quot;&quot;}, {&quot;family&quot;: &quot;Faloutsos&quot;, &quot;given&quot;: &quot;C.&quot;, &quot;parse-names&quot;: false, &quot;dropping-particle&quot;: &quot;&quot;, &quot;non-dropping-particle&quot;: &quot;&quot;}], &quot;issued&quot;: {&quot;date-parts&quot;: [[2024]]}, &quot;URL&quot;: &quot;http://arxiv.org/abs/2402.17944&quot;, &quot;type&quot;: &quot;article-journal&quot;, &quot;title&quot;: &quot;Large language models (LLMs) on tabular data: Prediction, generation, and understanding. A survey&quot;, &quot;container-title&quot;: &quot;Transactions on Machine Learning Research&quot;, &quot;id&quot;: &quot;ITEM-5007b438-b37f-541e-8fca-2748edacc281&quot;, &quot;container-title-short&quot;: &quot;&quot;}, &quot;isTemporary&quot;: false}]}, {&quot;citationID&quot;: &quot;MENDELEY_CITATION_6c2e20b8-77a6-4f5c-a69c-4155f0d007e9&quot;, &quot;properties&quot;: {&quot;noteIndex&quot;: 0}, &quot;isEdited&quot;: false, &quot;manualOverride&quot;: {&quot;isManuallyOverridden&quot;: false, &quot;citeprocText&quot;: &quot;(Cisneros-Bravo et al., 2023; Rodas Zegarra de Escalante, 2024)&quot;, &quot;manualOverrideText&quot;: &quot;&quot;}, &quot;citationItems&quot;: [{&quot;id&quot;: &quot;ITEM-2c1f70fd-8745-538a-b99f-18d256f44b4f&quot;, &quot;itemData&quot;: {&quot;author&quot;: [{&quot;family&quot;: &quot;Cisneros-Bravo&quot;, &quot;given&quot;: &quot;B. E.&quot;, &quot;parse-names&quot;: false, &quot;dropping-particle&quot;: &quot;&quot;, &quot;non-dropping-particle&quot;: &quot;&quot;}, {&quot;family&quot;: &quot;Rodríguez-Aguilar&quot;, &quot;given&quot;: &quot;R. M.&quot;, &quot;parse-names&quot;: false, &quot;dropping-particle&quot;: &quot;&quot;, &quot;non-dropping-particle&quot;: &quot;&quot;}, {&quot;family&quot;: &quot;Niño-Membrillo&quot;, &quot;given&quot;: &quot;Y. E.&quot;, &quot;parse-names&quot;: false, &quot;dropping-particle&quot;: &quot;&quot;, &quot;non-dropping-particle&quot;: &quot;&quot;}, {&quot;family&quot;: &quot;Cuevas-Rasgado&quot;, &quot;given&quot;: &quot;A. D.&quot;, &quot;parse-names&quot;: false, &quot;dropping-particle&quot;: &quot;&quot;, &quot;non-dropping-particle&quot;: &quot;&quot;}], &quot;issued&quot;: {&quot;date-parts&quot;: [[2023]]}, &quot;DOI&quot;: &quot;10.23913/ride.v14i27.1715&quot;, &quot;type&quot;: &quot;article-journal&quot;, &quot;title&quot;: &quot;Falta de orientación vocacional como factor en la deserción universitaria. Caso de estudio: zona Oriente del Estado de México&quot;, &quot;container-title&quot;: &quot;RIDE Revista Iberoamericana para la Investigación y el Desarrollo Educativo&quot;, &quot;volume&quot;: &quot;14&quot;, &quot;issue&quot;: &quot;27&quot;, &quot;id&quot;: &quot;ITEM-2c1f70fd-8745-538a-b99f-18d256f44b4f&quot;, &quot;container-title-short&quot;: &quot;&quot;}, &quot;isTemporary&quot;: false}, {&quot;id&quot;: &quot;ITEM-297823cb-c975-5def-8698-5545884294cd&quot;, &quot;itemData&quot;: {&quot;author&quot;: [{&quot;family&quot;: &quot;Rodas Zegarra de Escalante&quot;, &quot;given&quot;: &quot;A.&quot;, &quot;parse-names&quot;: false, &quot;dropping-particle&quot;: &quot;&quot;, &quot;non-dropping-particle&quot;: &quot;&quot;}], &quot;issued&quot;: {&quot;date-parts&quot;: [[2024]]}, &quot;URL&quot;: &quot;https://hdl.handle.net/20.500.12692/150276&quot;, &quot;type&quot;: &quot;thesis&quot;, &quot;title&quot;: &quot;Orientación vocacional y deserción universitaria en una universidad de Lima - 2024&quot;, &quot;genre&quot;: &quot;Tesis de maestría&quot;, &quot;publisher&quot;: &quot;Universidad César Vallejo&quot;, &quot;id&quot;: &quot;ITEM-297823cb-c975-5def-8698-5545884294cd&quot;, &quot;container-title-short&quot;: &quot;&quot;}, &quot;isTemporary&quot;: false}]}, {&quot;citationID&quot;: &quot;MENDELEY_CITATION_9c6916f0-b4f5-47bb-a210-90d5754d828c&quot;, &quot;properties&quot;: {&quot;noteIndex&quot;: 0}, &quot;isEdited&quot;: false, &quot;manualOverride&quot;: {&quot;isManuallyOverridden&quot;: true, &quot;citeprocText&quot;: &quot;(Millán Gordillo, 2025)&quot;, &quot;manualOverrideText&quot;: &quot;Millán Gordillo (2025)&quot;}, &quot;citationItems&quot;: [{&quot;id&quot;: &quot;ITEM-d048a752-48c5-509f-92fd-95097e22963d&quot;, &quot;itemData&quot;: {&quot;author&quot;: [{&quot;family&quot;: &quot;Millán Gordillo&quot;, &quot;given&quot;: &quot;M.&quot;, &quot;parse-names&quot;: false, &quot;dropping-particle&quot;: &quot;&quot;, &quot;non-dropping-particle&quot;: &quot;&quot;}], &quot;issued&quot;: {&quot;date-parts&quot;: [[2025]]}, &quot;URL&quot;: &quot;https://repositorio.uloyola.es/bitstream/handle/20.500.12412/6735/TFM%20Mar%C3%ADa%20Mill%C3%A1n.pdf&quot;, &quot;type&quot;: &quot;thesis&quot;, &quot;title&quot;: &quot;Estudio comparativo de sistemas de recomendación mediante filtrado colaborativo, basado en contenido y propuestas híbridas&quot;, &quot;genre&quot;: &quot;Tesis de maestría&quot;, &quot;publisher&quot;: &quot;Universidad Loyola Andalucía&quot;, &quot;id&quot;: &quot;ITEM-d048a752-48c5-509f-92fd-95097e22963d&quot;, &quot;container-title-short&quot;: &quot;&quot;}, &quot;isTemporary&quot;: false}]}, {&quot;citationID&quot;: &quot;MENDELEY_CITATION_95ef1da9-b0b7-44cb-a206-2a7fb0f5e457&quot;, &quot;properties&quot;: {&quot;noteIndex&quot;: 0}, &quot;isEdited&quot;: false, &quot;manualOverride&quot;: {&quot;isManuallyOverridden&quot;: true, &quot;citeprocText&quot;: &quot;(León Caranqui, 2023)&quot;, &quot;manualOverrideText&quot;: &quot;León Caranqui (2023)&quot;}, &quot;citationItems&quot;: [{&quot;id&quot;: &quot;ITEM-d8e93493-d1e9-5c21-8fb9-fe318b95db8c&quot;, &quot;itemData&quot;: {&quot;author&quot;: [{&quot;family&quot;: &quot;León Caranqui&quot;, &quot;given&quot;: &quot;J. A.&quot;, &quot;parse-names&quot;: false, &quot;dropping-particle&quot;: &quot;&quot;, &quot;non-dropping-particle&quot;: &quot;&quot;}], &quot;issued&quot;: {&quot;date-parts&quot;: [[2023]]}, &quot;URL&quot;: &quot;https://repositorio.usfq.edu.ec/handle/23000/13497&quot;, &quot;type&quot;: &quot;thesis&quot;, &quot;title&quot;: &quot;URKU: Adaptación de LLaMA 2 para la generación de texto en kichwa usando técnicas de Low-Rank Adaptation (LoRA)&quot;, &quot;genre&quot;: &quot;Trabajo de titulación de pregrado&quot;, &quot;publisher&quot;: &quot;Universidad San Francisco de Quito&quot;, &quot;id&quot;: &quot;ITEM-d8e93493-d1e9-5c21-8fb9-fe318b95db8c&quot;, &quot;container-title-short&quot;: &quot;&quot;}, &quot;isTemporary&quot;: false}]}, {&quot;citationID&quot;: &quot;MENDELEY_CITATION_7028bc9e-b031-4811-afee-93b932a90cd7&quot;, &quot;properties&quot;: {&quot;noteIndex&quot;: 0}, &quot;isEdited&quot;: false, &quot;manualOverride&quot;: {&quot;isManuallyOverridden&quot;: true, &quot;citeprocText&quot;: &quot;(Mena Guitarra, 2023)&quot;, &quot;manualOverrideText&quot;: &quot;Mena Guitarra (2023)&quot;}, &quot;citationItems&quot;: [{&quot;id&quot;: &quot;ITEM-b7bc5309-1149-55a6-8b1f-3e0d4086c429&quot;, &quot;itemData&quot;: {&quot;author&quot;: [{&quot;family&quot;: &quot;Mena Guitarra&quot;, &quot;given&quot;: &quot;S. D.&quot;, &quot;parse-names&quot;: false, &quot;dropping-particle&quot;: &quot;&quot;, &quot;non-dropping-particle&quot;: &quot;&quot;}], &quot;issued&quot;: {&quot;date-parts&quot;: [[2023]]}, &quot;URL&quot;: &quot;https://repositorio.usfq.edu.ec/handle/23000/13665&quot;, &quot;type&quot;: &quot;thesis&quot;, &quot;title&quot;: &quot;Usos y aplicaciones de modelos de lenguaje masivos en español&quot;, &quot;genre&quot;: &quot;Trabajo de titulación de pregrado&quot;, &quot;publisher&quot;: &quot;Universidad San Francisco de Quito&quot;, &quot;id&quot;: &quot;ITEM-b7bc5309-1149-55a6-8b1f-3e0d4086c429&quot;, &quot;container-title-short&quot;: &quot;&quot;}, &quot;isTemporary&quot;: false}]}, {&quot;citationID&quot;: &quot;MENDELEY_CITATION_4f2f9a5b-3dae-45c2-a33c-42cbfb775082&quot;, &quot;properties&quot;: {&quot;noteIndex&quot;: 0}, &quot;isEdited&quot;: false, &quot;manualOverride&quot;: {&quot;isManuallyOverridden&quot;: true, &quot;citeprocText&quot;: &quot;(Dettmers et al., 2023)&quot;, &quot;manualOverrideText&quot;: &quot;Dettmers et al. (2023)&quot;}, &quot;citationItems&quot;: [{&quot;id&quot;: &quot;ITEM-66ff8277-e9ea-5605-b98c-71a6ac2aa4a6&quot;, &quot;itemData&quot;: {&quot;author&quot;: [{&quot;family&quot;: &quot;Dettmers&quot;, &quot;given&quot;: &quot;T.&quot;, &quot;parse-names&quot;: false, &quot;dropping-particle&quot;: &quot;&quot;, &quot;non-dropping-particle&quot;: &quot;&quot;}, {&quot;family&quot;: &quot;Pagnoni&quot;, &quot;given&quot;: &quot;A.&quot;, &quot;parse-names&quot;: false, &quot;dropping-particle&quot;: &quot;&quot;, &quot;non-dropping-particle&quot;: &quot;&quot;}, {&quot;family&quot;: &quot;Holtzman&quot;, &quot;given&quot;: &quot;A.&quot;, &quot;parse-names&quot;: false, &quot;dropping-particle&quot;: &quot;&quot;, &quot;non-dropping-particle&quot;: &quot;&quot;}, {&quot;family&quot;: &quot;Zettlemoyer&quot;, &quot;given&quot;: &quot;L.&quot;, &quot;parse-names&quot;: false, &quot;dropping-particle&quot;: &quot;&quot;, &quot;non-dropping-particle&quot;: &quot;&quot;}], &quot;issued&quot;: {&quot;date-parts&quot;: [[2023]]}, &quot;DOI&quot;: &quot;10.48550/arXiv.2305.14314&quot;, &quot;type&quot;: &quot;paper-conference&quot;, &quot;title&quot;: &quot;QLoRA: Efficient finetuning of quantized LLMs&quot;, &quot;container-title&quot;: &quot;Advances in Neural Information Processing Systems 36&quot;, &quot;id&quot;: &quot;ITEM-66ff8277-e9ea-5605-b98c-71a6ac2aa4a6&quot;, &quot;container-title-short&quot;: &quot;&quot;}, &quot;isTemporary&quot;: false}]}, {&quot;citationID&quot;: &quot;MENDELEY_CITATION_ac8823f2-d085-41b5-a7e2-09a5e1436cf1&quot;, &quot;properties&quot;: {&quot;noteIndex&quot;: 0}, &quot;isEdited&quot;: false, &quot;manualOverride&quot;: {&quot;isManuallyOverridden&quot;: true, &quot;citeprocText&quot;: &quot;(Hu et al., 2021)&quot;, &quot;manualOverrideText&quot;: &quot;Hu et al. (2021)&quot;}, &quot;citationItems&quot;: [{&quot;id&quot;: &quot;ITEM-74d30536-939b-537f-bec0-b59afedae2e3&quot;, &quot;itemData&quot;: {&quot;author&quot;: [{&quot;family&quot;: &quot;Hu&quot;, &quot;given&quot;: &quot;E. J.&quot;, &quot;parse-names&quot;: false, &quot;dropping-particle&quot;: &quot;&quot;, &quot;non-dropping-particle&quot;: &quot;&quot;}, {&quot;family&quot;: &quot;Shen&quot;, &quot;given&quot;: &quot;Y.&quot;, &quot;parse-names&quot;: false, &quot;dropping-particle&quot;: &quot;&quot;, &quot;non-dropping-particle&quot;: &quot;&quot;}, {&quot;family&quot;: &quot;Wallis&quot;, &quot;given&quot;: &quot;P.&quot;, &quot;parse-names&quot;: false, &quot;dropping-particle&quot;: &quot;&quot;, &quot;non-dropping-particle&quot;: &quot;&quot;}, {&quot;family&quot;: &quot;Allen-Zhu&quot;, &quot;given&quot;: &quot;Z.&quot;, &quot;parse-names&quot;: false, &quot;dropping-particle&quot;: &quot;&quot;, &quot;non-dropping-particle&quot;: &quot;&quot;}, {&quot;family&quot;: &quot;Li&quot;, &quot;given&quot;: &quot;Y.&quot;, &quot;parse-names&quot;: false, &quot;dropping-particle&quot;: &quot;&quot;, &quot;non-dropping-particle&quot;: &quot;&quot;}, {&quot;family&quot;: &quot;Wang&quot;, &quot;given&quot;: &quot;S.&quot;, &quot;parse-names&quot;: false, &quot;dropping-particle&quot;: &quot;&quot;, &quot;non-dropping-particle&quot;: &quot;&quot;}, {&quot;family&quot;: &quot;Wang&quot;, &quot;given&quot;: &quot;L.&quot;, &quot;parse-names&quot;: false, &quot;dropping-particle&quot;: &quot;&quot;, &quot;non-dropping-particle&quot;: &quot;&quot;}, {&quot;family&quot;: &quot;Chen&quot;, &quot;given&quot;: &quot;W.&quot;, &quot;parse-names&quot;: false, &quot;dropping-particle&quot;: &quot;&quot;, &quot;non-dropping-particle&quot;: &quot;&quot;}], &quot;issued&quot;: {&quot;date-parts&quot;: [[2021]]}, &quot;DOI&quot;: &quot;10.48550/arXiv.2106.09685&quot;, &quot;type&quot;: &quot;book&quot;, &quot;title&quot;: &quot;LoRA: Low-rank adaptation of large language models&quot;, &quot;publisher&quot;: &quot;arXiv&quot;, &quot;id&quot;: &quot;ITEM-74d30536-939b-537f-bec0-b59afedae2e3&quot;, &quot;container-title-short&quot;: &quot;&quot;}, &quot;isTemporary&quot;: false}]}, {&quot;citationID&quot;: &quot;MENDELEY_CITATION_77339f91-0e06-47a4-811f-4013d4795451&quot;, &quot;properties&quot;: {&quot;noteIndex&quot;: 0}, &quot;isEdited&quot;: false, &quot;manualOverride&quot;: {&quot;isManuallyOverridden&quot;: true, &quot;citeprocText&quot;: &quot;(Dettmers et al., 2023)&quot;, &quot;manualOverrideText&quot;: &quot;Dettmers et al. (2023)&quot;}, &quot;citationItems&quot;: [{&quot;id&quot;: &quot;ITEM-66ff8277-e9ea-5605-b98c-71a6ac2aa4a6&quot;, &quot;itemData&quot;: {&quot;author&quot;: [{&quot;family&quot;: &quot;Dettmers&quot;, &quot;given&quot;: &quot;T.&quot;, &quot;parse-names&quot;: false, &quot;dropping-particle&quot;: &quot;&quot;, &quot;non-dropping-particle&quot;: &quot;&quot;}, {&quot;family&quot;: &quot;Pagnoni&quot;, &quot;given&quot;: &quot;A.&quot;, &quot;parse-names&quot;: false, &quot;dropping-particle&quot;: &quot;&quot;, &quot;non-dropping-particle&quot;: &quot;&quot;}, {&quot;family&quot;: &quot;Holtzman&quot;, &quot;given&quot;: &quot;A.&quot;, &quot;parse-names&quot;: false, &quot;dropping-particle&quot;: &quot;&quot;, &quot;non-dropping-particle&quot;: &quot;&quot;}, {&quot;family&quot;: &quot;Zettlemoyer&quot;, &quot;given&quot;: &quot;L.&quot;, &quot;parse-names&quot;: false, &quot;dropping-particle&quot;: &quot;&quot;, &quot;non-dropping-particle&quot;: &quot;&quot;}], &quot;issued&quot;: {&quot;date-parts&quot;: [[2023]]}, &quot;DOI&quot;: &quot;10.48550/arXiv.2305.14314&quot;, &quot;type&quot;: &quot;paper-conference&quot;, &quot;title&quot;: &quot;QLoRA: Efficient finetuning of quantized LLMs&quot;, &quot;container-title&quot;: &quot;Advances in Neural Information Processing Systems 36&quot;, &quot;id&quot;: &quot;ITEM-66ff8277-e9ea-5605-b98c-71a6ac2aa4a6&quot;, &quot;container-title-short&quot;: &quot;&quot;}, &quot;isTemporary&quot;: false}]}, {&quot;citationID&quot;: &quot;MENDELEY_CITATION_fd5ecdb6-587b-43b0-8495-503913cd630f&quot;, &quot;properties&quot;: {&quot;noteIndex&quot;: 0}, &quot;isEdited&quot;: false, &quot;manualOverride&quot;: {&quot;isManuallyOverridden&quot;: true, &quot;citeprocText&quot;: &quot;(Mena Guitarra, 2023)&quot;, &quot;manualOverrideText&quot;: &quot;Mena Guitarra (2023)&quot;}, &quot;citationItems&quot;: [{&quot;id&quot;: &quot;ITEM-b7bc5309-1149-55a6-8b1f-3e0d4086c429&quot;, &quot;itemData&quot;: {&quot;author&quot;: [{&quot;family&quot;: &quot;Mena Guitarra&quot;, &quot;given&quot;: &quot;S. D.&quot;, &quot;parse-names&quot;: false, &quot;dropping-particle&quot;: &quot;&quot;, &quot;non-dropping-particle&quot;: &quot;&quot;}], &quot;issued&quot;: {&quot;date-parts&quot;: [[2023]]}, &quot;URL&quot;: &quot;https://repositorio.usfq.edu.ec/handle/23000/13665&quot;, &quot;type&quot;: &quot;thesis&quot;, &quot;title&quot;: &quot;Usos y aplicaciones de modelos de lenguaje masivos en español&quot;, &quot;genre&quot;: &quot;Trabajo de titulación de pregrado&quot;, &quot;publisher&quot;: &quot;Universidad San Francisco de Quito&quot;, &quot;id&quot;: &quot;ITEM-b7bc5309-1149-55a6-8b1f-3e0d4086c429&quot;, &quot;container-title-short&quot;: &quot;&quot;}, &quot;isTemporary&quot;: false}]}, {&quot;citationID&quot;: &quot;MENDELEY_CITATION_7eaea414-7edb-412e-800f-a0462db35885&quot;, &quot;properties&quot;: {&quot;noteIndex&quot;: 0}, &quot;isEdited&quot;: false, &quot;manualOverride&quot;: {&quot;isManuallyOverridden&quot;: true, &quot;citeprocText&quot;: &quot;(Martínez Sixto et al., 2025)&quot;, &quot;manualOverrideText&quot;: &quot;Martínez Sixto et al. (2025)&quot;}, &quot;citationItems&quot;: [{&quot;id&quot;: &quot;ITEM-e9427164-f851-5ff7-a1c3-eb7ce5a7d720&quot;, &quot;itemData&quot;: {&quot;author&quot;: [{&quot;family&quot;: &quot;Martínez Sixto&quot;, &quot;given&quot;: &quot;L.&quot;, &quot;parse-names&quot;: false, &quot;dropping-particle&quot;: &quot;&quot;, &quot;non-dropping-particle&quot;: &quot;&quot;}, {&quot;family&quot;: &quot;Fernández y Fernández&quot;, &quot;given&quot;: &quot;C. A.&quot;, &quot;parse-names&quot;: false, &quot;dropping-particle&quot;: &quot;&quot;, &quot;non-dropping-particle&quot;: &quot;&quot;}, {&quot;family&quot;: &quot;Millán Hernández&quot;, &quot;given&quot;: &quot;C. E.&quot;, &quot;parse-names&quot;: false, &quot;dropping-particle&quot;: &quot;&quot;, &quot;non-dropping-particle&quot;: &quot;&quot;}], &quot;issued&quot;: {&quot;date-parts&quot;: [[2025]]}, &quot;DOI&quot;: &quot;10.36825/riti.13.31.007&quot;, &quot;type&quot;: &quot;article-journal&quot;, &quot;title&quot;: &quot;Comparación del desempeño de LLMs en la generación de diagramas de clases UML mediante un sistema RAG&quot;, &quot;container-title&quot;: &quot;Revista de Investigación en Tecnologías de la Información&quot;, &quot;volume&quot;: &quot;13&quot;, &quot;issue&quot;: &quot;31&quot;, &quot;page&quot;: &quot;64-79&quot;, &quot;id&quot;: &quot;ITEM-e9427164-f851-5ff7-a1c3-eb7ce5a7d720&quot;, &quot;container-title-short&quot;: &quot;&quot;}, &quot;isTemporary&quot;: false}]}, {&quot;citationID&quot;: &quot;MENDELEY_CITATION_49416d38-9de9-477a-971c-3b217d479c2e&quot;, &quot;properties&quot;: {&quot;noteIndex&quot;: 0}, &quot;isEdited&quot;: false, &quot;manualOverride&quot;: {&quot;isManuallyOverridden&quot;: true, &quot;citeprocText&quot;: &quot;(Millán Gordillo, 2025)&quot;, &quot;manualOverrideText&quot;: &quot;Millán Gordillo (2025)&quot;}, &quot;citationItems&quot;: [{&quot;id&quot;: &quot;ITEM-d048a752-48c5-509f-92fd-95097e22963d&quot;, &quot;itemData&quot;: {&quot;author&quot;: [{&quot;family&quot;: &quot;Millán Gordillo&quot;, &quot;given&quot;: &quot;M.&quot;, &quot;parse-names&quot;: false, &quot;dropping-particle&quot;: &quot;&quot;, &quot;non-dropping-particle&quot;: &quot;&quot;}], &quot;issued&quot;: {&quot;date-parts&quot;: [[2025]]}, &quot;URL&quot;: &quot;https://repositorio.uloyola.es/bitstream/handle/20.500.12412/6735/TFM%20Mar%C3%ADa%20Mill%C3%A1n.pdf&quot;, &quot;type&quot;: &quot;thesis&quot;, &quot;title&quot;: &quot;Estudio comparativo de sistemas de recomendación mediante filtrado colaborativo, basado en contenido y propuestas híbridas&quot;, &quot;genre&quot;: &quot;Tesis de maestría&quot;, &quot;publisher&quot;: &quot;Universidad Loyola Andalucía&quot;, &quot;id&quot;: &quot;ITEM-d048a752-48c5-509f-92fd-95097e22963d&quot;, &quot;container-title-short&quot;: &quot;&quot;}, &quot;isTemporary&quot;: false}]}, {&quot;citationID&quot;: &quot;MENDELEY_CITATION_7d6c860b-0599-4236-aef9-6cdfe5ebf715&quot;, &quot;properties&quot;: {&quot;noteIndex&quot;: 0}, &quot;isEdited&quot;: false, &quot;manualOverride&quot;: {&quot;isManuallyOverridden&quot;: true, &quot;citeprocText&quot;: &quot;(Castejón Lozano, 2025)&quot;, &quot;manualOverrideText&quot;: &quot;Castejón Lozano (2025)&quot;}, &quot;citationItems&quot;: [{&quot;id&quot;: &quot;ITEM-aa8f5a87-f00c-54b4-9f0b-476652320c5d&quot;, &quot;itemData&quot;: {&quot;author&quot;: [{&quot;family&quot;: &quot;Castejón Lozano&quot;, &quot;given&quot;: &quot;F.&quot;, &quot;parse-names&quot;: false, &quot;dropping-particle&quot;: &quot;&quot;, &quot;non-dropping-particle&quot;: &quot;&quot;}], &quot;issued&quot;: {&quot;date-parts&quot;: [[2025]]}, &quot;URL&quot;: &quot;https://oa.upm.es/90917/&quot;, &quot;type&quot;: &quot;thesis&quot;, &quot;title&quot;: &quot;SoroIA: Diseño e implementación de un sistema conversacional basado en modelos grandes de lenguaje para el Museo Sorolla&quot;, &quot;genre&quot;: &quot;Tesis de maestría&quot;, &quot;publisher&quot;: &quot;Universidad Politécnica de Madrid&quot;, &quot;id&quot;: &quot;ITEM-aa8f5a87-f00c-54b4-9f0b-476652320c5d&quot;, &quot;container-title-short&quot;: &quot;&quot;}, &quot;isTemporary&quot;: false}]}, {&quot;citationID&quot;: &quot;MENDELEY_CITATION_f37719d3-7833-4fbc-aca3-c80407f02ac8&quot;, &quot;properties&quot;: {&quot;noteIndex&quot;: 0}, &quot;isEdited&quot;: false, &quot;manualOverride&quot;: {&quot;isManuallyOverridden&quot;: true, &quot;citeprocText&quot;: &quot;(León Caranqui, 2023)&quot;, &quot;manualOverrideText&quot;: &quot;León Caranqui (2023)&quot;}, &quot;citationItems&quot;: [{&quot;id&quot;: &quot;ITEM-d8e93493-d1e9-5c21-8fb9-fe318b95db8c&quot;, &quot;itemData&quot;: {&quot;author&quot;: [{&quot;family&quot;: &quot;León Caranqui&quot;, &quot;given&quot;: &quot;J. A.&quot;, &quot;parse-names&quot;: false, &quot;dropping-particle&quot;: &quot;&quot;, &quot;non-dropping-particle&quot;: &quot;&quot;}], &quot;issued&quot;: {&quot;date-parts&quot;: [[2023]]}, &quot;URL&quot;: &quot;https://repositorio.usfq.edu.ec/handle/23000/13497&quot;, &quot;type&quot;: &quot;thesis&quot;, &quot;title&quot;: &quot;URKU: Adaptación de LLaMA 2 para la generación de texto en kichwa usando técnicas de Low-Rank Adaptation (LoRA)&quot;, &quot;genre&quot;: &quot;Trabajo de titulación de pregrado&quot;, &quot;publisher&quot;: &quot;Universidad San Francisco de Quito&quot;, &quot;id&quot;: &quot;ITEM-d8e93493-d1e9-5c21-8fb9-fe318b95db8c&quot;, &quot;container-title-short&quot;: &quot;&quot;}, &quot;isTemporary&quot;: false}]}]"/>
     <we:property name="MENDELEY_CITATIONS_LOCALE_CODE" value="&quot;es-ES&quot;"/>
     <we:property name="MENDELEY_CITATIONS_STYLE" value="{&quot;id&quot;: &quot;https://www.zotero.org/styles/apa-no-ampersand&quot;, &quot;title&quot;: &quot;American Psychological Association 7th edition (no ampersand)&quot;, &quot;format&quot;: &quot;author-date&quot;, &quot;defaultLocale&quot;: null, &quot;isLocaleCodeValid&quot;: true}"/>
   </we:properties>

</xml_diff>